<commit_message>
lab4: five forces and entry barriers (Excel, analysis, report docx/pdf), journals
</commit_message>
<xml_diff>
--- a/ЛР2-3_Объем_рынка/ОТЧЕТ_ЛР2-3_TableMind.docx
+++ b/ЛР2-3_Объем_рынка/ОТЧЕТ_ЛР2-3_TableMind.docx
@@ -245,7 +245,7 @@
       <w:r>
         <w:fldChar w:fldCharType="separate"/>
       </w:r>
-      <w:hyperlink w:anchor="_Toc241911081" w:history="1">
+      <w:hyperlink w:anchor="_Toc241911939" w:history="1">
         <w:r>
           <w:rPr>
             <w:rStyle w:val="af"/>
@@ -273,7 +273,7 @@
             <w:noProof/>
             <w:webHidden/>
           </w:rPr>
-          <w:instrText xml:space="preserve"> PAGEREF _Toc241911081 \h </w:instrText>
+          <w:instrText xml:space="preserve"> PAGEREF _Toc241911939 \h </w:instrText>
         </w:r>
         <w:r>
           <w:rPr>
@@ -314,7 +314,7 @@
           <w:noProof/>
         </w:rPr>
       </w:pPr>
-      <w:hyperlink w:anchor="_Toc241911082" w:history="1">
+      <w:hyperlink w:anchor="_Toc241911940" w:history="1">
         <w:r>
           <w:rPr>
             <w:rStyle w:val="af"/>
@@ -342,7 +342,7 @@
             <w:noProof/>
             <w:webHidden/>
           </w:rPr>
-          <w:instrText xml:space="preserve"> PAGEREF _Toc241911082 \h </w:instrText>
+          <w:instrText xml:space="preserve"> PAGEREF _Toc241911940 \h </w:instrText>
         </w:r>
         <w:r>
           <w:rPr>
@@ -383,7 +383,7 @@
           <w:noProof/>
         </w:rPr>
       </w:pPr>
-      <w:hyperlink w:anchor="_Toc241911083" w:history="1">
+      <w:hyperlink w:anchor="_Toc241911941" w:history="1">
         <w:r>
           <w:rPr>
             <w:rStyle w:val="af"/>
@@ -411,7 +411,7 @@
             <w:noProof/>
             <w:webHidden/>
           </w:rPr>
-          <w:instrText xml:space="preserve"> PAGEREF _Toc241911083 \h </w:instrText>
+          <w:instrText xml:space="preserve"> PAGEREF _Toc241911941 \h </w:instrText>
         </w:r>
         <w:r>
           <w:rPr>
@@ -452,7 +452,7 @@
           <w:noProof/>
         </w:rPr>
       </w:pPr>
-      <w:hyperlink w:anchor="_Toc241911084" w:history="1">
+      <w:hyperlink w:anchor="_Toc241911942" w:history="1">
         <w:r>
           <w:rPr>
             <w:rStyle w:val="af"/>
@@ -489,7 +489,7 @@
             <w:noProof/>
             <w:webHidden/>
           </w:rPr>
-          <w:instrText xml:space="preserve"> PAGEREF _Toc241911084 \h </w:instrText>
+          <w:instrText xml:space="preserve"> PAGEREF _Toc241911942 \h </w:instrText>
         </w:r>
         <w:r>
           <w:rPr>
@@ -530,7 +530,7 @@
           <w:noProof/>
         </w:rPr>
       </w:pPr>
-      <w:hyperlink w:anchor="_Toc241911085" w:history="1">
+      <w:hyperlink w:anchor="_Toc241911943" w:history="1">
         <w:r>
           <w:rPr>
             <w:rStyle w:val="af"/>
@@ -567,7 +567,7 @@
             <w:noProof/>
             <w:webHidden/>
           </w:rPr>
-          <w:instrText xml:space="preserve"> PAGEREF _Toc241911085 \h </w:instrText>
+          <w:instrText xml:space="preserve"> PAGEREF _Toc241911943 \h </w:instrText>
         </w:r>
         <w:r>
           <w:rPr>
@@ -608,7 +608,7 @@
           <w:noProof/>
         </w:rPr>
       </w:pPr>
-      <w:hyperlink w:anchor="_Toc241911086" w:history="1">
+      <w:hyperlink w:anchor="_Toc241911944" w:history="1">
         <w:r>
           <w:rPr>
             <w:rStyle w:val="af"/>
@@ -645,7 +645,7 @@
             <w:noProof/>
             <w:webHidden/>
           </w:rPr>
-          <w:instrText xml:space="preserve"> PAGEREF _Toc241911086 \h </w:instrText>
+          <w:instrText xml:space="preserve"> PAGEREF _Toc241911944 \h </w:instrText>
         </w:r>
         <w:r>
           <w:rPr>
@@ -686,7 +686,7 @@
           <w:noProof/>
         </w:rPr>
       </w:pPr>
-      <w:hyperlink w:anchor="_Toc241911087" w:history="1">
+      <w:hyperlink w:anchor="_Toc241911945" w:history="1">
         <w:r>
           <w:rPr>
             <w:rStyle w:val="af"/>
@@ -714,7 +714,7 @@
             <w:noProof/>
             <w:webHidden/>
           </w:rPr>
-          <w:instrText xml:space="preserve"> PAGEREF _Toc241911087 \h </w:instrText>
+          <w:instrText xml:space="preserve"> PAGEREF _Toc241911945 \h </w:instrText>
         </w:r>
         <w:r>
           <w:rPr>
@@ -755,7 +755,7 @@
           <w:noProof/>
         </w:rPr>
       </w:pPr>
-      <w:hyperlink w:anchor="_Toc241911088" w:history="1">
+      <w:hyperlink w:anchor="_Toc241911946" w:history="1">
         <w:r>
           <w:rPr>
             <w:rStyle w:val="af"/>
@@ -783,7 +783,7 @@
             <w:noProof/>
             <w:webHidden/>
           </w:rPr>
-          <w:instrText xml:space="preserve"> PAGEREF _Toc241911088 \h </w:instrText>
+          <w:instrText xml:space="preserve"> PAGEREF _Toc241911946 \h </w:instrText>
         </w:r>
         <w:r>
           <w:rPr>
@@ -824,7 +824,7 @@
           <w:noProof/>
         </w:rPr>
       </w:pPr>
-      <w:hyperlink w:anchor="_Toc241911089" w:history="1">
+      <w:hyperlink w:anchor="_Toc241911947" w:history="1">
         <w:r>
           <w:rPr>
             <w:rStyle w:val="af"/>
@@ -861,7 +861,7 @@
             <w:noProof/>
             <w:webHidden/>
           </w:rPr>
-          <w:instrText xml:space="preserve"> PAGEREF _Toc241911089 \h </w:instrText>
+          <w:instrText xml:space="preserve"> PAGEREF _Toc241911947 \h </w:instrText>
         </w:r>
         <w:r>
           <w:rPr>
@@ -902,7 +902,7 @@
           <w:noProof/>
         </w:rPr>
       </w:pPr>
-      <w:hyperlink w:anchor="_Toc241911090" w:history="1">
+      <w:hyperlink w:anchor="_Toc241911948" w:history="1">
         <w:r>
           <w:rPr>
             <w:rStyle w:val="af"/>
@@ -930,7 +930,7 @@
             <w:noProof/>
             <w:webHidden/>
           </w:rPr>
-          <w:instrText xml:space="preserve"> PAGEREF _Toc241911090 \h </w:instrText>
+          <w:instrText xml:space="preserve"> PAGEREF _Toc241911948 \h </w:instrText>
         </w:r>
         <w:r>
           <w:rPr>
@@ -971,7 +971,7 @@
           <w:noProof/>
         </w:rPr>
       </w:pPr>
-      <w:hyperlink w:anchor="_Toc241911091" w:history="1">
+      <w:hyperlink w:anchor="_Toc241911949" w:history="1">
         <w:r>
           <w:rPr>
             <w:rStyle w:val="af"/>
@@ -999,7 +999,7 @@
             <w:noProof/>
             <w:webHidden/>
           </w:rPr>
-          <w:instrText xml:space="preserve"> PAGEREF _Toc241911091 \h </w:instrText>
+          <w:instrText xml:space="preserve"> PAGEREF _Toc241911949 \h </w:instrText>
         </w:r>
         <w:r>
           <w:rPr>
@@ -1040,7 +1040,7 @@
           <w:noProof/>
         </w:rPr>
       </w:pPr>
-      <w:hyperlink w:anchor="_Toc241911092" w:history="1">
+      <w:hyperlink w:anchor="_Toc241911950" w:history="1">
         <w:r>
           <w:rPr>
             <w:rStyle w:val="af"/>
@@ -1068,7 +1068,7 @@
             <w:noProof/>
             <w:webHidden/>
           </w:rPr>
-          <w:instrText xml:space="preserve"> PAGEREF _Toc241911092 \h </w:instrText>
+          <w:instrText xml:space="preserve"> PAGEREF _Toc241911950 \h </w:instrText>
         </w:r>
         <w:r>
           <w:rPr>
@@ -1109,7 +1109,7 @@
           <w:noProof/>
         </w:rPr>
       </w:pPr>
-      <w:hyperlink w:anchor="_Toc241911093" w:history="1">
+      <w:hyperlink w:anchor="_Toc241911951" w:history="1">
         <w:r>
           <w:rPr>
             <w:rStyle w:val="af"/>
@@ -1137,7 +1137,7 @@
             <w:noProof/>
             <w:webHidden/>
           </w:rPr>
-          <w:instrText xml:space="preserve"> PAGEREF _Toc241911093 \h </w:instrText>
+          <w:instrText xml:space="preserve"> PAGEREF _Toc241911951 \h </w:instrText>
         </w:r>
         <w:r>
           <w:rPr>
@@ -1178,7 +1178,7 @@
           <w:noProof/>
         </w:rPr>
       </w:pPr>
-      <w:hyperlink w:anchor="_Toc241911094" w:history="1">
+      <w:hyperlink w:anchor="_Toc241911952" w:history="1">
         <w:r>
           <w:rPr>
             <w:rStyle w:val="af"/>
@@ -1206,7 +1206,7 @@
             <w:noProof/>
             <w:webHidden/>
           </w:rPr>
-          <w:instrText xml:space="preserve"> PAGEREF _Toc241911094 \h </w:instrText>
+          <w:instrText xml:space="preserve"> PAGEREF _Toc241911952 \h </w:instrText>
         </w:r>
         <w:r>
           <w:rPr>
@@ -1247,7 +1247,7 @@
           <w:noProof/>
         </w:rPr>
       </w:pPr>
-      <w:hyperlink w:anchor="_Toc241911095" w:history="1">
+      <w:hyperlink w:anchor="_Toc241911953" w:history="1">
         <w:r>
           <w:rPr>
             <w:rStyle w:val="af"/>
@@ -1275,7 +1275,7 @@
             <w:noProof/>
             <w:webHidden/>
           </w:rPr>
-          <w:instrText xml:space="preserve"> PAGEREF _Toc241911095 \h </w:instrText>
+          <w:instrText xml:space="preserve"> PAGEREF _Toc241911953 \h </w:instrText>
         </w:r>
         <w:r>
           <w:rPr>
@@ -1316,7 +1316,7 @@
           <w:noProof/>
         </w:rPr>
       </w:pPr>
-      <w:hyperlink w:anchor="_Toc241911096" w:history="1">
+      <w:hyperlink w:anchor="_Toc241911954" w:history="1">
         <w:r>
           <w:rPr>
             <w:rStyle w:val="af"/>
@@ -1344,7 +1344,7 @@
             <w:noProof/>
             <w:webHidden/>
           </w:rPr>
-          <w:instrText xml:space="preserve"> PAGEREF _Toc241911096 \h </w:instrText>
+          <w:instrText xml:space="preserve"> PAGEREF _Toc241911954 \h </w:instrText>
         </w:r>
         <w:r>
           <w:rPr>
@@ -1385,7 +1385,7 @@
           <w:noProof/>
         </w:rPr>
       </w:pPr>
-      <w:hyperlink w:anchor="_Toc241911097" w:history="1">
+      <w:hyperlink w:anchor="_Toc241911955" w:history="1">
         <w:r>
           <w:rPr>
             <w:rStyle w:val="af"/>
@@ -1413,7 +1413,7 @@
             <w:noProof/>
             <w:webHidden/>
           </w:rPr>
-          <w:instrText xml:space="preserve"> PAGEREF _Toc241911097 \h </w:instrText>
+          <w:instrText xml:space="preserve"> PAGEREF _Toc241911955 \h </w:instrText>
         </w:r>
         <w:r>
           <w:rPr>
@@ -1454,7 +1454,7 @@
           <w:noProof/>
         </w:rPr>
       </w:pPr>
-      <w:hyperlink w:anchor="_Toc241911098" w:history="1">
+      <w:hyperlink w:anchor="_Toc241911956" w:history="1">
         <w:r>
           <w:rPr>
             <w:rStyle w:val="af"/>
@@ -1482,7 +1482,7 @@
             <w:noProof/>
             <w:webHidden/>
           </w:rPr>
-          <w:instrText xml:space="preserve"> PAGEREF _Toc241911098 \h </w:instrText>
+          <w:instrText xml:space="preserve"> PAGEREF _Toc241911956 \h </w:instrText>
         </w:r>
         <w:r>
           <w:rPr>
@@ -1523,7 +1523,7 @@
           <w:noProof/>
         </w:rPr>
       </w:pPr>
-      <w:hyperlink w:anchor="_Toc241911099" w:history="1">
+      <w:hyperlink w:anchor="_Toc241911957" w:history="1">
         <w:r>
           <w:rPr>
             <w:rStyle w:val="af"/>
@@ -1551,7 +1551,7 @@
             <w:noProof/>
             <w:webHidden/>
           </w:rPr>
-          <w:instrText xml:space="preserve"> PAGEREF _Toc241911099 \h </w:instrText>
+          <w:instrText xml:space="preserve"> PAGEREF _Toc241911957 \h </w:instrText>
         </w:r>
         <w:r>
           <w:rPr>
@@ -1592,7 +1592,7 @@
           <w:noProof/>
         </w:rPr>
       </w:pPr>
-      <w:hyperlink w:anchor="_Toc241911100" w:history="1">
+      <w:hyperlink w:anchor="_Toc241911958" w:history="1">
         <w:r>
           <w:rPr>
             <w:rStyle w:val="af"/>
@@ -1620,7 +1620,7 @@
             <w:noProof/>
             <w:webHidden/>
           </w:rPr>
-          <w:instrText xml:space="preserve"> PAGEREF _Toc241911100 \h </w:instrText>
+          <w:instrText xml:space="preserve"> PAGEREF _Toc241911958 \h </w:instrText>
         </w:r>
         <w:r>
           <w:rPr>
@@ -1661,7 +1661,7 @@
           <w:noProof/>
         </w:rPr>
       </w:pPr>
-      <w:hyperlink w:anchor="_Toc241911101" w:history="1">
+      <w:hyperlink w:anchor="_Toc241911959" w:history="1">
         <w:r>
           <w:rPr>
             <w:rStyle w:val="af"/>
@@ -1689,7 +1689,7 @@
             <w:noProof/>
             <w:webHidden/>
           </w:rPr>
-          <w:instrText xml:space="preserve"> PAGEREF _Toc241911101 \h </w:instrText>
+          <w:instrText xml:space="preserve"> PAGEREF _Toc241911959 \h </w:instrText>
         </w:r>
         <w:r>
           <w:rPr>
@@ -1735,7 +1735,7 @@
         <w:spacing w:before="0" w:after="360" w:line="360" w:lineRule="exact"/>
         <w:ind w:firstLine="709"/>
       </w:pPr>
-      <w:bookmarkStart w:id="1" w:name="_Toc241911081"/>
+      <w:bookmarkStart w:id="1" w:name="_Toc241911939"/>
       <w:r>
         <w:rPr>
           <w:b/>
@@ -2024,13 +2024,13 @@
         <w:rPr>
           <w:sz w:val="28"/>
         </w:rPr>
-        <w:t xml:space="preserve"> [4]. Исходные факты проекта (та</w:t>
-      </w:r>
-      <w:r>
-        <w:rPr>
-          <w:sz w:val="28"/>
-        </w:rPr>
-        <w:t>рифы, сроки, цели, бюджет) взяты из ПЗ1 и ПЗ4 [3]. Данные опроса респондентов не использовались: платежеспособность оценена по открытым ценам и модельным допущениям, которые так названы в тексте.</w:t>
+        <w:t xml:space="preserve"> [3]. Исходные факты проекта (та</w:t>
+      </w:r>
+      <w:r>
+        <w:rPr>
+          <w:sz w:val="28"/>
+        </w:rPr>
+        <w:t>рифы, сроки, цели, бюджет) взяты из ПЗ1 и ПЗ4 [4]. Данные опроса респондентов не использовались: платежеспособность оценена по открытым ценам и модельным допущениям, которые так названы в тексте.</w:t>
       </w:r>
     </w:p>
     <w:p>
@@ -2041,7 +2041,7 @@
         <w:ind w:firstLine="709"/>
       </w:pPr>
       <w:bookmarkStart w:id="2" w:name="_b608aa976fc82a0faaf3b83f58c735968afd03b"/>
-      <w:bookmarkStart w:id="3" w:name="_Toc241911082"/>
+      <w:bookmarkStart w:id="3" w:name="_Toc241911940"/>
       <w:bookmarkEnd w:id="0"/>
       <w:r>
         <w:rPr>
@@ -2125,7 +2125,7 @@
         <w:ind w:firstLine="709"/>
       </w:pPr>
       <w:bookmarkStart w:id="4" w:name="_6ea6bf0a5ec92c733c53e44899cf0806bdc5e39"/>
-      <w:bookmarkStart w:id="5" w:name="_Toc241911083"/>
+      <w:bookmarkStart w:id="5" w:name="_Toc241911941"/>
       <w:r>
         <w:rPr>
           <w:b/>
@@ -3075,7 +3075,7 @@
         <w:ind w:firstLine="709"/>
       </w:pPr>
       <w:bookmarkStart w:id="6" w:name="_7a0c967539b5ef143597c37b0951dae8b296890"/>
-      <w:bookmarkStart w:id="7" w:name="_Toc241911084"/>
+      <w:bookmarkStart w:id="7" w:name="_Toc241911942"/>
       <w:bookmarkEnd w:id="4"/>
       <w:r>
         <w:rPr>
@@ -5508,7 +5508,7 @@
           <w:sz w:val="28"/>
         </w:rPr>
         <w:drawing>
-          <wp:inline distT="0" distB="0" distL="0" distR="0" wp14:anchorId="58B66CE1" wp14:editId="697BD033">
+          <wp:inline distT="0" distB="0" distL="0" distR="0" wp14:anchorId="7204AB40" wp14:editId="382AB0D5">
             <wp:extent cx="5334000" cy="3122341"/>
             <wp:effectExtent l="0" t="0" r="0" b="0"/>
             <wp:docPr id="12" name="Picture"/>
@@ -6319,7 +6319,7 @@
           <w:sz w:val="28"/>
         </w:rPr>
         <w:drawing>
-          <wp:inline distT="0" distB="0" distL="0" distR="0" wp14:anchorId="4DEF13E9" wp14:editId="67DBB440">
+          <wp:inline distT="0" distB="0" distL="0" distR="0" wp14:anchorId="58CEBB83" wp14:editId="0DFC6C28">
             <wp:extent cx="5334000" cy="3252439"/>
             <wp:effectExtent l="0" t="0" r="0" b="0"/>
             <wp:docPr id="15" name="Picture"/>
@@ -6480,7 +6480,7 @@
         <w:ind w:firstLine="709"/>
       </w:pPr>
       <w:bookmarkStart w:id="8" w:name="_da959056159f19dff160d665d57702b18af1ddd"/>
-      <w:bookmarkStart w:id="9" w:name="_Toc241911085"/>
+      <w:bookmarkStart w:id="9" w:name="_Toc241911943"/>
       <w:bookmarkEnd w:id="6"/>
       <w:r>
         <w:rPr>
@@ -9594,7 +9594,7 @@
         <w:ind w:firstLine="709"/>
       </w:pPr>
       <w:bookmarkStart w:id="10" w:name="_06e2001e7574ebc77f8406bc11ca3db76d00c2a"/>
-      <w:bookmarkStart w:id="11" w:name="_Toc241911086"/>
+      <w:bookmarkStart w:id="11" w:name="_Toc241911944"/>
       <w:bookmarkEnd w:id="8"/>
       <w:r>
         <w:rPr>
@@ -10398,7 +10398,7 @@
         <w:ind w:firstLine="709"/>
       </w:pPr>
       <w:bookmarkStart w:id="12" w:name="_606fa79e4d4f49d8da929021c2a978685b741ea"/>
-      <w:bookmarkStart w:id="13" w:name="_Toc241911087"/>
+      <w:bookmarkStart w:id="13" w:name="_Toc241911945"/>
       <w:bookmarkEnd w:id="10"/>
       <w:r>
         <w:rPr>
@@ -12832,7 +12832,7 @@
         <w:ind w:firstLine="709"/>
       </w:pPr>
       <w:bookmarkStart w:id="14" w:name="_2314d5998da626860a70184e0b470b0b8504694"/>
-      <w:bookmarkStart w:id="15" w:name="_Toc241911088"/>
+      <w:bookmarkStart w:id="15" w:name="_Toc241911946"/>
       <w:bookmarkEnd w:id="12"/>
       <w:r>
         <w:rPr>
@@ -13460,7 +13460,7 @@
         <w:ind w:firstLine="709"/>
       </w:pPr>
       <w:bookmarkStart w:id="16" w:name="_42bac9f10c820a94a4112d44417ea6b5d14bf7d"/>
-      <w:bookmarkStart w:id="17" w:name="_Toc241911089"/>
+      <w:bookmarkStart w:id="17" w:name="_Toc241911947"/>
       <w:bookmarkEnd w:id="14"/>
       <w:r>
         <w:rPr>
@@ -15367,7 +15367,7 @@
         <w:ind w:firstLine="709"/>
       </w:pPr>
       <w:bookmarkStart w:id="18" w:name="_62882a27ae1c57302eff280b02701a311900947"/>
-      <w:bookmarkStart w:id="19" w:name="_Toc241911090"/>
+      <w:bookmarkStart w:id="19" w:name="_Toc241911948"/>
       <w:bookmarkEnd w:id="16"/>
       <w:r>
         <w:rPr>
@@ -16756,7 +16756,7 @@
         <w:ind w:firstLine="709"/>
       </w:pPr>
       <w:bookmarkStart w:id="20" w:name="_2c7ec3ecf17663584d0d27e07e31cbd2a0948cf"/>
-      <w:bookmarkStart w:id="21" w:name="_Toc241911091"/>
+      <w:bookmarkStart w:id="21" w:name="_Toc241911949"/>
       <w:bookmarkEnd w:id="18"/>
       <w:r>
         <w:rPr>
@@ -19091,7 +19091,7 @@
         <w:ind w:firstLine="709"/>
       </w:pPr>
       <w:bookmarkStart w:id="22" w:name="_8d34778965163a5752bc27698d1f7e786ff5c87"/>
-      <w:bookmarkStart w:id="23" w:name="_Toc241911092"/>
+      <w:bookmarkStart w:id="23" w:name="_Toc241911950"/>
       <w:bookmarkEnd w:id="20"/>
       <w:r>
         <w:rPr>
@@ -20246,7 +20246,7 @@
           <w:sz w:val="28"/>
         </w:rPr>
         <w:drawing>
-          <wp:inline distT="0" distB="0" distL="0" distR="0" wp14:anchorId="729ED696" wp14:editId="529B2271">
+          <wp:inline distT="0" distB="0" distL="0" distR="0" wp14:anchorId="27CDECA9" wp14:editId="21FCD6BA">
             <wp:extent cx="5334000" cy="2992243"/>
             <wp:effectExtent l="0" t="0" r="0" b="0"/>
             <wp:docPr id="26" name="Picture"/>
@@ -21092,7 +21092,7 @@
           <w:sz w:val="28"/>
         </w:rPr>
         <w:drawing>
-          <wp:inline distT="0" distB="0" distL="0" distR="0" wp14:anchorId="24851CE6" wp14:editId="21B260D9">
+          <wp:inline distT="0" distB="0" distL="0" distR="0" wp14:anchorId="7BC67469" wp14:editId="076CCDFE">
             <wp:extent cx="5334000" cy="2471853"/>
             <wp:effectExtent l="0" t="0" r="0" b="0"/>
             <wp:docPr id="29" name="Picture"/>
@@ -21590,7 +21590,7 @@
         <w:ind w:firstLine="709"/>
       </w:pPr>
       <w:bookmarkStart w:id="24" w:name="_e6e1aac57bb528344b9009e4599364161f48047"/>
-      <w:bookmarkStart w:id="25" w:name="_Toc241911093"/>
+      <w:bookmarkStart w:id="25" w:name="_Toc241911951"/>
       <w:bookmarkEnd w:id="22"/>
       <w:r>
         <w:rPr>
@@ -21638,7 +21638,7 @@
         <w:rPr>
           <w:sz w:val="28"/>
         </w:rPr>
-        <w:t xml:space="preserve"> по курсу НБРБ [3]. Сроки ПЗ1: </w:t>
+        <w:t xml:space="preserve"> по курсу НБРБ [3], [4]. Сроки ПЗ1: </w:t>
       </w:r>
       <w:r>
         <w:rPr>
@@ -21651,13 +21651,13 @@
         <w:rPr>
           <w:sz w:val="28"/>
         </w:rPr>
-        <w:t xml:space="preserve"> веб-аудита 31.03.2027, открытая бета с оплатой 01.06.2027. Поэтому регистрации считаются за 6 ме</w:t>
-      </w:r>
-      <w:r>
-        <w:rPr>
-          <w:sz w:val="28"/>
-        </w:rPr>
-        <w:t xml:space="preserve">сяцев после </w:t>
+        <w:t xml:space="preserve"> веб-аудита 31.03.2027, открытая бета с оплатой 01.06.2027. Поэтому регистрации считаются за</w:t>
+      </w:r>
+      <w:r>
+        <w:rPr>
+          <w:sz w:val="28"/>
+        </w:rPr>
+        <w:t xml:space="preserve"> 6 месяцев после </w:t>
       </w:r>
       <w:r>
         <w:rPr>
@@ -22508,7 +22508,7 @@
         </w:rPr>
         <w:lastRenderedPageBreak/>
         <w:drawing>
-          <wp:inline distT="0" distB="0" distL="0" distR="0" wp14:anchorId="533A2EA3" wp14:editId="7A1BF9D4">
+          <wp:inline distT="0" distB="0" distL="0" distR="0" wp14:anchorId="742747D6" wp14:editId="21FBD049">
             <wp:extent cx="5334000" cy="2341756"/>
             <wp:effectExtent l="0" t="0" r="0" b="0"/>
             <wp:docPr id="33" name="Picture"/>
@@ -22739,7 +22739,7 @@
         <w:ind w:firstLine="709"/>
       </w:pPr>
       <w:bookmarkStart w:id="26" w:name="_6a64c25cd48aeb5a2bf3dc411d56d805a6b5d7e"/>
-      <w:bookmarkStart w:id="27" w:name="_Toc241911094"/>
+      <w:bookmarkStart w:id="27" w:name="_Toc241911952"/>
       <w:bookmarkEnd w:id="24"/>
       <w:r>
         <w:rPr>
@@ -22798,7 +22798,7 @@
         </w:rPr>
         <w:lastRenderedPageBreak/>
         <w:drawing>
-          <wp:inline distT="0" distB="0" distL="0" distR="0" wp14:anchorId="1E4C3952" wp14:editId="6D3FC9A4">
+          <wp:inline distT="0" distB="0" distL="0" distR="0" wp14:anchorId="54723797" wp14:editId="3CCB891A">
             <wp:extent cx="5334000" cy="2471853"/>
             <wp:effectExtent l="0" t="0" r="0" b="0"/>
             <wp:docPr id="37" name="Picture"/>
@@ -23023,7 +23023,7 @@
         <w:ind w:firstLine="709"/>
       </w:pPr>
       <w:bookmarkStart w:id="28" w:name="_8cdf61ec50cc46d2aaeadce1b560fea28ea116e"/>
-      <w:bookmarkStart w:id="29" w:name="_Toc241911095"/>
+      <w:bookmarkStart w:id="29" w:name="_Toc241911953"/>
       <w:bookmarkEnd w:id="26"/>
       <w:r>
         <w:rPr>
@@ -23139,7 +23139,7 @@
         <w:ind w:firstLine="709"/>
       </w:pPr>
       <w:bookmarkStart w:id="30" w:name="_1bfdad9d2d88ddb6ca16c31c1d4d4943679f32f"/>
-      <w:bookmarkStart w:id="31" w:name="_Toc241911096"/>
+      <w:bookmarkStart w:id="31" w:name="_Toc241911954"/>
       <w:bookmarkEnd w:id="28"/>
       <w:bookmarkEnd w:id="2"/>
       <w:r>
@@ -23677,7 +23677,7 @@
         <w:jc w:val="center"/>
       </w:pPr>
       <w:bookmarkStart w:id="32" w:name="_выводы"/>
-      <w:bookmarkStart w:id="33" w:name="_Toc241911097"/>
+      <w:bookmarkStart w:id="33" w:name="_Toc241911955"/>
       <w:bookmarkEnd w:id="30"/>
       <w:r>
         <w:rPr>
@@ -23951,7 +23951,7 @@
         <w:jc w:val="center"/>
       </w:pPr>
       <w:bookmarkStart w:id="34" w:name="_274f6a444530ef90b0479dabf3d210f01e97699"/>
-      <w:bookmarkStart w:id="35" w:name="_Toc241911098"/>
+      <w:bookmarkStart w:id="35" w:name="_Toc241911956"/>
       <w:bookmarkEnd w:id="32"/>
       <w:r>
         <w:rPr>
@@ -24039,46 +24039,7 @@
         <w:rPr>
           <w:sz w:val="28"/>
         </w:rPr>
-        <w:t xml:space="preserve">Земляник, Р. В. Концепция проекта </w:t>
-      </w:r>
-      <w:r>
-        <w:rPr>
-          <w:i/>
-          <w:sz w:val="28"/>
-        </w:rPr>
-        <w:t>TableMind</w:t>
-      </w:r>
-      <w:r>
-        <w:rPr>
-          <w:sz w:val="28"/>
-        </w:rPr>
-        <w:t xml:space="preserve">; </w:t>
-      </w:r>
-      <w:r>
-        <w:rPr>
-          <w:i/>
-          <w:sz w:val="28"/>
-        </w:rPr>
-        <w:t>WBS</w:t>
-      </w:r>
-      <w:r>
-        <w:rPr>
-          <w:sz w:val="28"/>
-        </w:rPr>
-        <w:t xml:space="preserve">, сетевой график и диаграмма Ганта </w:t>
-      </w:r>
-      <w:r>
-        <w:rPr>
-          <w:i/>
-          <w:sz w:val="28"/>
-        </w:rPr>
-        <w:t>TableMind</w:t>
-      </w:r>
-      <w:r>
-        <w:rPr>
-          <w:sz w:val="28"/>
-        </w:rPr>
-        <w:t>: отчеты по практическим занятиям по дисциплине «Управление проектами» / Р. В. Земляник. – Минск : БГУИР, 2026.</w:t>
+        <w:t>Национальный банк Республики Беларусь. Официальные курсы белорусского рубля [Электронный ресурс]. – Режим доступа: https://www.nbrb.by/api/exrates/rates/EUR?parammode=2. – Дата доступа: 03.10.2026.</w:t>
       </w:r>
     </w:p>
     <w:p>
@@ -24096,13 +24057,53 @@
         <w:rPr>
           <w:sz w:val="28"/>
         </w:rPr>
-        <w:t>Национальный банк Республики Б</w:t>
-      </w:r>
-      <w:r>
-        <w:rPr>
-          <w:sz w:val="28"/>
-        </w:rPr>
-        <w:t>еларусь. Официальные курсы белорусского рубля [Электронный ресурс]. – Режим доступа: https://www.nbrb.by/api/exrates/rates/EUR?parammode=2. – Дата доступа: 03.10.2026.</w:t>
+        <w:t xml:space="preserve">Земляник, Р. В. Концепция проекта </w:t>
+      </w:r>
+      <w:r>
+        <w:rPr>
+          <w:i/>
+          <w:sz w:val="28"/>
+        </w:rPr>
+        <w:t>Ta</w:t>
+      </w:r>
+      <w:r>
+        <w:rPr>
+          <w:i/>
+          <w:sz w:val="28"/>
+        </w:rPr>
+        <w:t>bleMind</w:t>
+      </w:r>
+      <w:r>
+        <w:rPr>
+          <w:sz w:val="28"/>
+        </w:rPr>
+        <w:t xml:space="preserve">; </w:t>
+      </w:r>
+      <w:r>
+        <w:rPr>
+          <w:i/>
+          <w:sz w:val="28"/>
+        </w:rPr>
+        <w:t>WBS</w:t>
+      </w:r>
+      <w:r>
+        <w:rPr>
+          <w:sz w:val="28"/>
+        </w:rPr>
+        <w:t xml:space="preserve">, сетевой график и диаграмма Ганта </w:t>
+      </w:r>
+      <w:r>
+        <w:rPr>
+          <w:i/>
+          <w:sz w:val="28"/>
+        </w:rPr>
+        <w:t>TableMind</w:t>
+      </w:r>
+      <w:r>
+        <w:rPr>
+          <w:sz w:val="28"/>
+        </w:rPr>
+        <w:t>: отчеты по практическим занятиям по дисциплине «Управление проектами» / Р. В. Земляник. – Минск : БГУИР, 2026.</w:t>
       </w:r>
     </w:p>
     <w:p>
@@ -25052,7 +25053,7 @@
         <w:jc w:val="center"/>
       </w:pPr>
       <w:bookmarkStart w:id="36" w:name="_3d74faf1500c1b2a4a8bfa8e0e37c74206ce73d"/>
-      <w:bookmarkStart w:id="37" w:name="_Toc241911099"/>
+      <w:bookmarkStart w:id="37" w:name="_Toc241911957"/>
       <w:bookmarkEnd w:id="34"/>
       <w:r>
         <w:rPr>
@@ -26531,7 +26532,7 @@
         <w:jc w:val="center"/>
       </w:pPr>
       <w:bookmarkStart w:id="38" w:name="_d684f183eb868ee4ace295916bed2e6be64d16e"/>
-      <w:bookmarkStart w:id="39" w:name="_Toc241911100"/>
+      <w:bookmarkStart w:id="39" w:name="_Toc241911958"/>
       <w:bookmarkEnd w:id="36"/>
       <w:r>
         <w:rPr>
@@ -27788,7 +27789,7 @@
         <w:jc w:val="center"/>
       </w:pPr>
       <w:bookmarkStart w:id="40" w:name="_cb59224a7032ef66ab429e7df9b4e4c597bc187"/>
-      <w:bookmarkStart w:id="41" w:name="_Toc241911101"/>
+      <w:bookmarkStart w:id="41" w:name="_Toc241911959"/>
       <w:bookmarkEnd w:id="38"/>
       <w:r>
         <w:rPr>
@@ -28877,7 +28878,7 @@
   <w:abstractNum w:abstractNumId="0" w15:restartNumberingAfterBreak="0">
     <w:nsid w:val="0000A990"/>
     <w:multiLevelType w:val="multilevel"/>
-    <w:tmpl w:val="99E2203E"/>
+    <w:tmpl w:val="E9B674E2"/>
     <w:lvl w:ilvl="0">
       <w:numFmt w:val="bullet"/>
       <w:lvlText w:val=" "/>
@@ -28954,7 +28955,7 @@
   <w:abstractNum w:abstractNumId="1" w15:restartNumberingAfterBreak="0">
     <w:nsid w:val="00A99411"/>
     <w:multiLevelType w:val="multilevel"/>
-    <w:tmpl w:val="61DCB06C"/>
+    <w:tmpl w:val="702001F8"/>
     <w:lvl w:ilvl="0">
       <w:start w:val="1"/>
       <w:numFmt w:val="decimal"/>
@@ -30432,7 +30433,7 @@
     <w:autoRedefine/>
     <w:uiPriority w:val="39"/>
     <w:unhideWhenUsed/>
-    <w:rsid w:val="003F4863"/>
+    <w:rsid w:val="00BB24CB"/>
     <w:pPr>
       <w:spacing w:after="100"/>
     </w:pPr>
@@ -30444,7 +30445,7 @@
     <w:autoRedefine/>
     <w:uiPriority w:val="39"/>
     <w:unhideWhenUsed/>
-    <w:rsid w:val="003F4863"/>
+    <w:rsid w:val="00BB24CB"/>
     <w:pPr>
       <w:spacing w:after="100"/>
       <w:ind w:left="240"/>

</xml_diff>

<commit_message>
lab2-3/lab5: model survey data (appendix G), generator and journal, reports rebuilt
</commit_message>
<xml_diff>
--- a/ЛР2-3_Объем_рынка/ОТЧЕТ_ЛР2-3_TableMind.docx
+++ b/ЛР2-3_Объем_рынка/ОТЧЕТ_ЛР2-3_TableMind.docx
@@ -245,7 +245,7 @@
       <w:r>
         <w:fldChar w:fldCharType="separate"/>
       </w:r>
-      <w:hyperlink w:anchor="_Toc241911939" w:history="1">
+      <w:hyperlink w:anchor="_Toc241934590" w:history="1">
         <w:r>
           <w:rPr>
             <w:rStyle w:val="af"/>
@@ -273,7 +273,7 @@
             <w:noProof/>
             <w:webHidden/>
           </w:rPr>
-          <w:instrText xml:space="preserve"> PAGEREF _Toc241911939 \h </w:instrText>
+          <w:instrText xml:space="preserve"> PAGEREF _Toc241934590 \h </w:instrText>
         </w:r>
         <w:r>
           <w:rPr>
@@ -314,7 +314,7 @@
           <w:noProof/>
         </w:rPr>
       </w:pPr>
-      <w:hyperlink w:anchor="_Toc241911940" w:history="1">
+      <w:hyperlink w:anchor="_Toc241934591" w:history="1">
         <w:r>
           <w:rPr>
             <w:rStyle w:val="af"/>
@@ -342,7 +342,7 @@
             <w:noProof/>
             <w:webHidden/>
           </w:rPr>
-          <w:instrText xml:space="preserve"> PAGEREF _Toc241911940 \h </w:instrText>
+          <w:instrText xml:space="preserve"> PAGEREF _Toc241934591 \h </w:instrText>
         </w:r>
         <w:r>
           <w:rPr>
@@ -383,7 +383,7 @@
           <w:noProof/>
         </w:rPr>
       </w:pPr>
-      <w:hyperlink w:anchor="_Toc241911941" w:history="1">
+      <w:hyperlink w:anchor="_Toc241934592" w:history="1">
         <w:r>
           <w:rPr>
             <w:rStyle w:val="af"/>
@@ -411,7 +411,7 @@
             <w:noProof/>
             <w:webHidden/>
           </w:rPr>
-          <w:instrText xml:space="preserve"> PAGEREF _Toc241911941 \h </w:instrText>
+          <w:instrText xml:space="preserve"> PAGEREF _Toc241934592 \h </w:instrText>
         </w:r>
         <w:r>
           <w:rPr>
@@ -452,7 +452,7 @@
           <w:noProof/>
         </w:rPr>
       </w:pPr>
-      <w:hyperlink w:anchor="_Toc241911942" w:history="1">
+      <w:hyperlink w:anchor="_Toc241934593" w:history="1">
         <w:r>
           <w:rPr>
             <w:rStyle w:val="af"/>
@@ -489,7 +489,7 @@
             <w:noProof/>
             <w:webHidden/>
           </w:rPr>
-          <w:instrText xml:space="preserve"> PAGEREF _Toc241911942 \h </w:instrText>
+          <w:instrText xml:space="preserve"> PAGEREF _Toc241934593 \h </w:instrText>
         </w:r>
         <w:r>
           <w:rPr>
@@ -530,7 +530,7 @@
           <w:noProof/>
         </w:rPr>
       </w:pPr>
-      <w:hyperlink w:anchor="_Toc241911943" w:history="1">
+      <w:hyperlink w:anchor="_Toc241934594" w:history="1">
         <w:r>
           <w:rPr>
             <w:rStyle w:val="af"/>
@@ -567,7 +567,7 @@
             <w:noProof/>
             <w:webHidden/>
           </w:rPr>
-          <w:instrText xml:space="preserve"> PAGEREF _Toc241911943 \h </w:instrText>
+          <w:instrText xml:space="preserve"> PAGEREF _Toc241934594 \h </w:instrText>
         </w:r>
         <w:r>
           <w:rPr>
@@ -608,7 +608,7 @@
           <w:noProof/>
         </w:rPr>
       </w:pPr>
-      <w:hyperlink w:anchor="_Toc241911944" w:history="1">
+      <w:hyperlink w:anchor="_Toc241934595" w:history="1">
         <w:r>
           <w:rPr>
             <w:rStyle w:val="af"/>
@@ -645,7 +645,7 @@
             <w:noProof/>
             <w:webHidden/>
           </w:rPr>
-          <w:instrText xml:space="preserve"> PAGEREF _Toc241911944 \h </w:instrText>
+          <w:instrText xml:space="preserve"> PAGEREF _Toc241934595 \h </w:instrText>
         </w:r>
         <w:r>
           <w:rPr>
@@ -686,7 +686,7 @@
           <w:noProof/>
         </w:rPr>
       </w:pPr>
-      <w:hyperlink w:anchor="_Toc241911945" w:history="1">
+      <w:hyperlink w:anchor="_Toc241934596" w:history="1">
         <w:r>
           <w:rPr>
             <w:rStyle w:val="af"/>
@@ -714,7 +714,7 @@
             <w:noProof/>
             <w:webHidden/>
           </w:rPr>
-          <w:instrText xml:space="preserve"> PAGEREF _Toc241911945 \h </w:instrText>
+          <w:instrText xml:space="preserve"> PAGEREF _Toc241934596 \h </w:instrText>
         </w:r>
         <w:r>
           <w:rPr>
@@ -755,7 +755,7 @@
           <w:noProof/>
         </w:rPr>
       </w:pPr>
-      <w:hyperlink w:anchor="_Toc241911946" w:history="1">
+      <w:hyperlink w:anchor="_Toc241934597" w:history="1">
         <w:r>
           <w:rPr>
             <w:rStyle w:val="af"/>
@@ -783,7 +783,7 @@
             <w:noProof/>
             <w:webHidden/>
           </w:rPr>
-          <w:instrText xml:space="preserve"> PAGEREF _Toc241911946 \h </w:instrText>
+          <w:instrText xml:space="preserve"> PAGEREF _Toc241934597 \h </w:instrText>
         </w:r>
         <w:r>
           <w:rPr>
@@ -824,7 +824,7 @@
           <w:noProof/>
         </w:rPr>
       </w:pPr>
-      <w:hyperlink w:anchor="_Toc241911947" w:history="1">
+      <w:hyperlink w:anchor="_Toc241934598" w:history="1">
         <w:r>
           <w:rPr>
             <w:rStyle w:val="af"/>
@@ -861,7 +861,7 @@
             <w:noProof/>
             <w:webHidden/>
           </w:rPr>
-          <w:instrText xml:space="preserve"> PAGEREF _Toc241911947 \h </w:instrText>
+          <w:instrText xml:space="preserve"> PAGEREF _Toc241934598 \h </w:instrText>
         </w:r>
         <w:r>
           <w:rPr>
@@ -902,7 +902,7 @@
           <w:noProof/>
         </w:rPr>
       </w:pPr>
-      <w:hyperlink w:anchor="_Toc241911948" w:history="1">
+      <w:hyperlink w:anchor="_Toc241934599" w:history="1">
         <w:r>
           <w:rPr>
             <w:rStyle w:val="af"/>
@@ -930,7 +930,7 @@
             <w:noProof/>
             <w:webHidden/>
           </w:rPr>
-          <w:instrText xml:space="preserve"> PAGEREF _Toc241911948 \h </w:instrText>
+          <w:instrText xml:space="preserve"> PAGEREF _Toc241934599 \h </w:instrText>
         </w:r>
         <w:r>
           <w:rPr>
@@ -971,7 +971,7 @@
           <w:noProof/>
         </w:rPr>
       </w:pPr>
-      <w:hyperlink w:anchor="_Toc241911949" w:history="1">
+      <w:hyperlink w:anchor="_Toc241934600" w:history="1">
         <w:r>
           <w:rPr>
             <w:rStyle w:val="af"/>
@@ -999,7 +999,7 @@
             <w:noProof/>
             <w:webHidden/>
           </w:rPr>
-          <w:instrText xml:space="preserve"> PAGEREF _Toc241911949 \h </w:instrText>
+          <w:instrText xml:space="preserve"> PAGEREF _Toc241934600 \h </w:instrText>
         </w:r>
         <w:r>
           <w:rPr>
@@ -1040,7 +1040,7 @@
           <w:noProof/>
         </w:rPr>
       </w:pPr>
-      <w:hyperlink w:anchor="_Toc241911950" w:history="1">
+      <w:hyperlink w:anchor="_Toc241934601" w:history="1">
         <w:r>
           <w:rPr>
             <w:rStyle w:val="af"/>
@@ -1068,7 +1068,7 @@
             <w:noProof/>
             <w:webHidden/>
           </w:rPr>
-          <w:instrText xml:space="preserve"> PAGEREF _Toc241911950 \h </w:instrText>
+          <w:instrText xml:space="preserve"> PAGEREF _Toc241934601 \h </w:instrText>
         </w:r>
         <w:r>
           <w:rPr>
@@ -1109,7 +1109,7 @@
           <w:noProof/>
         </w:rPr>
       </w:pPr>
-      <w:hyperlink w:anchor="_Toc241911951" w:history="1">
+      <w:hyperlink w:anchor="_Toc241934602" w:history="1">
         <w:r>
           <w:rPr>
             <w:rStyle w:val="af"/>
@@ -1137,7 +1137,7 @@
             <w:noProof/>
             <w:webHidden/>
           </w:rPr>
-          <w:instrText xml:space="preserve"> PAGEREF _Toc241911951 \h </w:instrText>
+          <w:instrText xml:space="preserve"> PAGEREF _Toc241934602 \h </w:instrText>
         </w:r>
         <w:r>
           <w:rPr>
@@ -1178,7 +1178,7 @@
           <w:noProof/>
         </w:rPr>
       </w:pPr>
-      <w:hyperlink w:anchor="_Toc241911952" w:history="1">
+      <w:hyperlink w:anchor="_Toc241934603" w:history="1">
         <w:r>
           <w:rPr>
             <w:rStyle w:val="af"/>
@@ -1206,7 +1206,7 @@
             <w:noProof/>
             <w:webHidden/>
           </w:rPr>
-          <w:instrText xml:space="preserve"> PAGEREF _Toc241911952 \h </w:instrText>
+          <w:instrText xml:space="preserve"> PAGEREF _Toc241934603 \h </w:instrText>
         </w:r>
         <w:r>
           <w:rPr>
@@ -1247,7 +1247,7 @@
           <w:noProof/>
         </w:rPr>
       </w:pPr>
-      <w:hyperlink w:anchor="_Toc241911953" w:history="1">
+      <w:hyperlink w:anchor="_Toc241934604" w:history="1">
         <w:r>
           <w:rPr>
             <w:rStyle w:val="af"/>
@@ -1275,7 +1275,7 @@
             <w:noProof/>
             <w:webHidden/>
           </w:rPr>
-          <w:instrText xml:space="preserve"> PAGEREF _Toc241911953 \h </w:instrText>
+          <w:instrText xml:space="preserve"> PAGEREF _Toc241934604 \h </w:instrText>
         </w:r>
         <w:r>
           <w:rPr>
@@ -1316,7 +1316,7 @@
           <w:noProof/>
         </w:rPr>
       </w:pPr>
-      <w:hyperlink w:anchor="_Toc241911954" w:history="1">
+      <w:hyperlink w:anchor="_Toc241934605" w:history="1">
         <w:r>
           <w:rPr>
             <w:rStyle w:val="af"/>
@@ -1344,7 +1344,7 @@
             <w:noProof/>
             <w:webHidden/>
           </w:rPr>
-          <w:instrText xml:space="preserve"> PAGEREF _Toc241911954 \h </w:instrText>
+          <w:instrText xml:space="preserve"> PAGEREF _Toc241934605 \h </w:instrText>
         </w:r>
         <w:r>
           <w:rPr>
@@ -1385,7 +1385,7 @@
           <w:noProof/>
         </w:rPr>
       </w:pPr>
-      <w:hyperlink w:anchor="_Toc241911955" w:history="1">
+      <w:hyperlink w:anchor="_Toc241934606" w:history="1">
         <w:r>
           <w:rPr>
             <w:rStyle w:val="af"/>
@@ -1413,7 +1413,7 @@
             <w:noProof/>
             <w:webHidden/>
           </w:rPr>
-          <w:instrText xml:space="preserve"> PAGEREF _Toc241911955 \h </w:instrText>
+          <w:instrText xml:space="preserve"> PAGEREF _Toc241934606 \h </w:instrText>
         </w:r>
         <w:r>
           <w:rPr>
@@ -1454,7 +1454,7 @@
           <w:noProof/>
         </w:rPr>
       </w:pPr>
-      <w:hyperlink w:anchor="_Toc241911956" w:history="1">
+      <w:hyperlink w:anchor="_Toc241934607" w:history="1">
         <w:r>
           <w:rPr>
             <w:rStyle w:val="af"/>
@@ -1482,7 +1482,7 @@
             <w:noProof/>
             <w:webHidden/>
           </w:rPr>
-          <w:instrText xml:space="preserve"> PAGEREF _Toc241911956 \h </w:instrText>
+          <w:instrText xml:space="preserve"> PAGEREF _Toc241934607 \h </w:instrText>
         </w:r>
         <w:r>
           <w:rPr>
@@ -1523,7 +1523,7 @@
           <w:noProof/>
         </w:rPr>
       </w:pPr>
-      <w:hyperlink w:anchor="_Toc241911957" w:history="1">
+      <w:hyperlink w:anchor="_Toc241934608" w:history="1">
         <w:r>
           <w:rPr>
             <w:rStyle w:val="af"/>
@@ -1551,7 +1551,7 @@
             <w:noProof/>
             <w:webHidden/>
           </w:rPr>
-          <w:instrText xml:space="preserve"> PAGEREF _Toc241911957 \h </w:instrText>
+          <w:instrText xml:space="preserve"> PAGEREF _Toc241934608 \h </w:instrText>
         </w:r>
         <w:r>
           <w:rPr>
@@ -1592,7 +1592,7 @@
           <w:noProof/>
         </w:rPr>
       </w:pPr>
-      <w:hyperlink w:anchor="_Toc241911958" w:history="1">
+      <w:hyperlink w:anchor="_Toc241934609" w:history="1">
         <w:r>
           <w:rPr>
             <w:rStyle w:val="af"/>
@@ -1620,7 +1620,7 @@
             <w:noProof/>
             <w:webHidden/>
           </w:rPr>
-          <w:instrText xml:space="preserve"> PAGEREF _Toc241911958 \h </w:instrText>
+          <w:instrText xml:space="preserve"> PAGEREF _Toc241934609 \h </w:instrText>
         </w:r>
         <w:r>
           <w:rPr>
@@ -1661,7 +1661,7 @@
           <w:noProof/>
         </w:rPr>
       </w:pPr>
-      <w:hyperlink w:anchor="_Toc241911959" w:history="1">
+      <w:hyperlink w:anchor="_Toc241934610" w:history="1">
         <w:r>
           <w:rPr>
             <w:rStyle w:val="af"/>
@@ -1689,7 +1689,7 @@
             <w:noProof/>
             <w:webHidden/>
           </w:rPr>
-          <w:instrText xml:space="preserve"> PAGEREF _Toc241911959 \h </w:instrText>
+          <w:instrText xml:space="preserve"> PAGEREF _Toc241934610 \h </w:instrText>
         </w:r>
         <w:r>
           <w:rPr>
@@ -1722,6 +1722,75 @@
     </w:p>
     <w:p>
       <w:pPr>
+        <w:pStyle w:val="12"/>
+        <w:tabs>
+          <w:tab w:val="right" w:leader="dot" w:pos="9345"/>
+        </w:tabs>
+        <w:rPr>
+          <w:noProof/>
+        </w:rPr>
+      </w:pPr>
+      <w:hyperlink w:anchor="_Toc241934611" w:history="1">
+        <w:r>
+          <w:rPr>
+            <w:rStyle w:val="af"/>
+            <w:b/>
+            <w:noProof/>
+          </w:rPr>
+          <w:t>ПРИЛОЖЕНИЕ Г</w:t>
+        </w:r>
+        <w:r>
+          <w:rPr>
+            <w:noProof/>
+            <w:webHidden/>
+          </w:rPr>
+          <w:tab/>
+        </w:r>
+        <w:r>
+          <w:rPr>
+            <w:noProof/>
+            <w:webHidden/>
+          </w:rPr>
+          <w:fldChar w:fldCharType="begin"/>
+        </w:r>
+        <w:r>
+          <w:rPr>
+            <w:noProof/>
+            <w:webHidden/>
+          </w:rPr>
+          <w:instrText xml:space="preserve"> PAGEREF _Toc241934611 \h </w:instrText>
+        </w:r>
+        <w:r>
+          <w:rPr>
+            <w:noProof/>
+            <w:webHidden/>
+          </w:rPr>
+        </w:r>
+        <w:r>
+          <w:rPr>
+            <w:noProof/>
+            <w:webHidden/>
+          </w:rPr>
+          <w:fldChar w:fldCharType="separate"/>
+        </w:r>
+        <w:r>
+          <w:rPr>
+            <w:noProof/>
+            <w:webHidden/>
+          </w:rPr>
+          <w:t>32</w:t>
+        </w:r>
+        <w:r>
+          <w:rPr>
+            <w:noProof/>
+            <w:webHidden/>
+          </w:rPr>
+          <w:fldChar w:fldCharType="end"/>
+        </w:r>
+      </w:hyperlink>
+    </w:p>
+    <w:p>
+      <w:pPr>
         <w:pStyle w:val="11"/>
       </w:pPr>
       <w:r>
@@ -1735,7 +1804,7 @@
         <w:spacing w:before="0" w:after="360" w:line="360" w:lineRule="exact"/>
         <w:ind w:firstLine="709"/>
       </w:pPr>
-      <w:bookmarkStart w:id="1" w:name="_Toc241911939"/>
+      <w:bookmarkStart w:id="1" w:name="_Toc241934590"/>
       <w:r>
         <w:rPr>
           <w:b/>
@@ -1835,13 +1904,13 @@
         <w:rPr>
           <w:sz w:val="28"/>
         </w:rPr>
-        <w:t>). Работа продолжает ЛР1, где за</w:t>
-      </w:r>
-      <w:r>
-        <w:rPr>
-          <w:sz w:val="28"/>
-        </w:rPr>
-        <w:t>фиксированы границы рынка и подтвержден частичный поисковый интерес [1].</w:t>
+        <w:t>). Работа продолжает ЛР</w:t>
+      </w:r>
+      <w:r>
+        <w:rPr>
+          <w:sz w:val="28"/>
+        </w:rPr>
+        <w:t>1, где зафиксированы границы рынка и подтвержден частичный поисковый интерес [1].</w:t>
       </w:r>
     </w:p>
     <w:p>
@@ -1881,13 +1950,13 @@
         <w:rPr>
           <w:sz w:val="28"/>
         </w:rPr>
-        <w:t xml:space="preserve">-книг по методикам инструкции </w:t>
-      </w:r>
-      <w:r>
-        <w:rPr>
-          <w:sz w:val="28"/>
-        </w:rPr>
-        <w:t xml:space="preserve">[2] (потенциальные клиенты, сверху вниз и снизу вверх, платежеспособность, цифровая воронка по тарифам, сценарная оценка </w:t>
+        <w:t>-книг по методикам ин</w:t>
+      </w:r>
+      <w:r>
+        <w:rPr>
+          <w:sz w:val="28"/>
+        </w:rPr>
+        <w:t xml:space="preserve">струкции [2] (потенциальные клиенты, сверху вниз и снизу вверх, платежеспособность, цифровая воронка по тарифам, сценарная оценка </w:t>
       </w:r>
       <w:r>
         <w:rPr>
@@ -1939,13 +2008,13 @@
         <w:rPr>
           <w:sz w:val="28"/>
         </w:rPr>
-        <w:t>; результаты сведены по пра</w:t>
-      </w:r>
-      <w:r>
-        <w:rPr>
-          <w:sz w:val="28"/>
-        </w:rPr>
-        <w:t>вилам согласования; итог сопоставлен с целями проекта; выполнена проверка чувствительности.</w:t>
+        <w:t>; результаты сведе</w:t>
+      </w:r>
+      <w:r>
+        <w:rPr>
+          <w:sz w:val="28"/>
+        </w:rPr>
+        <w:t>ны по правилам согласования; итог сопоставлен с целями проекта; выполнена проверка чувствительности.</w:t>
       </w:r>
     </w:p>
     <w:p>
@@ -2024,13 +2093,7 @@
         <w:rPr>
           <w:sz w:val="28"/>
         </w:rPr>
-        <w:t xml:space="preserve"> [3]. Исходные факты проекта (та</w:t>
-      </w:r>
-      <w:r>
-        <w:rPr>
-          <w:sz w:val="28"/>
-        </w:rPr>
-        <w:t>рифы, сроки, цели, бюджет) взяты из ПЗ1 и ПЗ4 [4]. Данные опроса респондентов не использовались: платежеспособность оценена по открытым ценам и модельным допущениям, которые так названы в тексте.</w:t>
+        <w:t xml:space="preserve"> [3]. Исходные факты проекта (тарифы, сроки, цели, бюджет) взяты из ПЗ1 и ПЗ4 [4]. Данные опроса респондентов не использовались: платежеспособность оценена по открытым ценам и модельным допущениям, которые так названы в тексте.</w:t>
       </w:r>
     </w:p>
     <w:p>
@@ -2041,7 +2104,7 @@
         <w:ind w:firstLine="709"/>
       </w:pPr>
       <w:bookmarkStart w:id="2" w:name="_b608aa976fc82a0faaf3b83f58c735968afd03b"/>
-      <w:bookmarkStart w:id="3" w:name="_Toc241911940"/>
+      <w:bookmarkStart w:id="3" w:name="_Toc241934591"/>
       <w:bookmarkEnd w:id="0"/>
       <w:r>
         <w:rPr>
@@ -2064,13 +2127,13 @@
         <w:rPr>
           <w:sz w:val="28"/>
         </w:rPr>
-        <w:t xml:space="preserve">Работа выполнена в порядке, заданном </w:t>
-      </w:r>
-      <w:r>
-        <w:rPr>
-          <w:sz w:val="28"/>
-        </w:rPr>
-        <w:t>инструкцией [2]: границы рынка, цифровые следы конкурентов (</w:t>
+        <w:t>Работа выполнен</w:t>
+      </w:r>
+      <w:r>
+        <w:rPr>
+          <w:sz w:val="28"/>
+        </w:rPr>
+        <w:t>а в порядке, заданном инструкцией [2]: границы рынка, цифровые следы конкурентов (</w:t>
       </w:r>
       <w:r>
         <w:rPr>
@@ -2096,13 +2159,13 @@
         <w:rPr>
           <w:sz w:val="28"/>
         </w:rPr>
-        <w:t>, а ее результат независимо пересчитан скр</w:t>
-      </w:r>
-      <w:r>
-        <w:rPr>
-          <w:sz w:val="28"/>
-        </w:rPr>
-        <w:t xml:space="preserve">иптом на </w:t>
+        <w:t>, а ее результат нез</w:t>
+      </w:r>
+      <w:r>
+        <w:rPr>
+          <w:sz w:val="28"/>
+        </w:rPr>
+        <w:t xml:space="preserve">ависимо пересчитан скриптом на </w:t>
       </w:r>
       <w:r>
         <w:rPr>
@@ -2125,7 +2188,7 @@
         <w:ind w:firstLine="709"/>
       </w:pPr>
       <w:bookmarkStart w:id="4" w:name="_6ea6bf0a5ec92c733c53e44899cf0806bdc5e39"/>
-      <w:bookmarkStart w:id="5" w:name="_Toc241911941"/>
+      <w:bookmarkStart w:id="5" w:name="_Toc241934592"/>
       <w:r>
         <w:rPr>
           <w:b/>
@@ -2159,13 +2222,13 @@
         <w:rPr>
           <w:sz w:val="28"/>
         </w:rPr>
-        <w:t>-моделей и финансовых таблиц (веб-аудит и надстройка), территория - англоязычные стран</w:t>
-      </w:r>
-      <w:r>
-        <w:rPr>
-          <w:sz w:val="28"/>
-        </w:rPr>
-        <w:t xml:space="preserve">ы (США, Великобритания, Канада, Австралия, Ирландия) и ЕС-27, контрольная территория - Беларусь и русскоязычный сегмент. Из рынка исключены обучающие курсы по </w:t>
+        <w:t>-моделей и финансовых таблиц (веб-аудит и надстройка), территори</w:t>
+      </w:r>
+      <w:r>
+        <w:rPr>
+          <w:sz w:val="28"/>
+        </w:rPr>
+        <w:t xml:space="preserve">я - англоязычные страны (США, Великобритания, Канада, Австралия, Ирландия) и ЕС-27, контрольная территория - Беларусь и русскоязычный сегмент. Из рынка исключены обучающие курсы по </w:t>
       </w:r>
       <w:r>
         <w:rPr>
@@ -2191,13 +2254,13 @@
         <w:rPr>
           <w:sz w:val="28"/>
         </w:rPr>
-        <w:t xml:space="preserve">-ассистенты без функции проверки как отдельные продукты; они учитываются </w:t>
-      </w:r>
-      <w:r>
-        <w:rPr>
-          <w:sz w:val="28"/>
-        </w:rPr>
-        <w:t>как заменители.</w:t>
+        <w:t>-ассистенты без функции проверки как отдельные прод</w:t>
+      </w:r>
+      <w:r>
+        <w:rPr>
+          <w:sz w:val="28"/>
+        </w:rPr>
+        <w:t>укты; они учитываются как заменители.</w:t>
       </w:r>
     </w:p>
     <w:p>
@@ -3075,7 +3138,7 @@
         <w:ind w:firstLine="709"/>
       </w:pPr>
       <w:bookmarkStart w:id="6" w:name="_7a0c967539b5ef143597c37b0951dae8b296890"/>
-      <w:bookmarkStart w:id="7" w:name="_Toc241911942"/>
+      <w:bookmarkStart w:id="7" w:name="_Toc241934593"/>
       <w:bookmarkEnd w:id="4"/>
       <w:r>
         <w:rPr>
@@ -5508,7 +5571,7 @@
           <w:sz w:val="28"/>
         </w:rPr>
         <w:drawing>
-          <wp:inline distT="0" distB="0" distL="0" distR="0" wp14:anchorId="7204AB40" wp14:editId="382AB0D5">
+          <wp:inline distT="0" distB="0" distL="0" distR="0" wp14:anchorId="627EFE3C" wp14:editId="3CEC2474">
             <wp:extent cx="5334000" cy="3122341"/>
             <wp:effectExtent l="0" t="0" r="0" b="0"/>
             <wp:docPr id="12" name="Picture"/>
@@ -6319,7 +6382,7 @@
           <w:sz w:val="28"/>
         </w:rPr>
         <w:drawing>
-          <wp:inline distT="0" distB="0" distL="0" distR="0" wp14:anchorId="58CEBB83" wp14:editId="0DFC6C28">
+          <wp:inline distT="0" distB="0" distL="0" distR="0" wp14:anchorId="4A3F5C1E" wp14:editId="7BBDCCE7">
             <wp:extent cx="5334000" cy="3252439"/>
             <wp:effectExtent l="0" t="0" r="0" b="0"/>
             <wp:docPr id="15" name="Picture"/>
@@ -6480,7 +6543,7 @@
         <w:ind w:firstLine="709"/>
       </w:pPr>
       <w:bookmarkStart w:id="8" w:name="_da959056159f19dff160d665d57702b18af1ddd"/>
-      <w:bookmarkStart w:id="9" w:name="_Toc241911943"/>
+      <w:bookmarkStart w:id="9" w:name="_Toc241934594"/>
       <w:bookmarkEnd w:id="6"/>
       <w:r>
         <w:rPr>
@@ -9594,7 +9657,7 @@
         <w:ind w:firstLine="709"/>
       </w:pPr>
       <w:bookmarkStart w:id="10" w:name="_06e2001e7574ebc77f8406bc11ca3db76d00c2a"/>
-      <w:bookmarkStart w:id="11" w:name="_Toc241911944"/>
+      <w:bookmarkStart w:id="11" w:name="_Toc241934595"/>
       <w:bookmarkEnd w:id="8"/>
       <w:r>
         <w:rPr>
@@ -10398,7 +10461,7 @@
         <w:ind w:firstLine="709"/>
       </w:pPr>
       <w:bookmarkStart w:id="12" w:name="_606fa79e4d4f49d8da929021c2a978685b741ea"/>
-      <w:bookmarkStart w:id="13" w:name="_Toc241911945"/>
+      <w:bookmarkStart w:id="13" w:name="_Toc241934596"/>
       <w:bookmarkEnd w:id="10"/>
       <w:r>
         <w:rPr>
@@ -12832,7 +12895,7 @@
         <w:ind w:firstLine="709"/>
       </w:pPr>
       <w:bookmarkStart w:id="14" w:name="_2314d5998da626860a70184e0b470b0b8504694"/>
-      <w:bookmarkStart w:id="15" w:name="_Toc241911946"/>
+      <w:bookmarkStart w:id="15" w:name="_Toc241934597"/>
       <w:bookmarkEnd w:id="12"/>
       <w:r>
         <w:rPr>
@@ -13460,7 +13523,7 @@
         <w:ind w:firstLine="709"/>
       </w:pPr>
       <w:bookmarkStart w:id="16" w:name="_42bac9f10c820a94a4112d44417ea6b5d14bf7d"/>
-      <w:bookmarkStart w:id="17" w:name="_Toc241911947"/>
+      <w:bookmarkStart w:id="17" w:name="_Toc241934598"/>
       <w:bookmarkEnd w:id="14"/>
       <w:r>
         <w:rPr>
@@ -15367,7 +15430,7 @@
         <w:ind w:firstLine="709"/>
       </w:pPr>
       <w:bookmarkStart w:id="18" w:name="_62882a27ae1c57302eff280b02701a311900947"/>
-      <w:bookmarkStart w:id="19" w:name="_Toc241911948"/>
+      <w:bookmarkStart w:id="19" w:name="_Toc241934599"/>
       <w:bookmarkEnd w:id="16"/>
       <w:r>
         <w:rPr>
@@ -16756,7 +16819,7 @@
         <w:ind w:firstLine="709"/>
       </w:pPr>
       <w:bookmarkStart w:id="20" w:name="_2c7ec3ecf17663584d0d27e07e31cbd2a0948cf"/>
-      <w:bookmarkStart w:id="21" w:name="_Toc241911949"/>
+      <w:bookmarkStart w:id="21" w:name="_Toc241934600"/>
       <w:bookmarkEnd w:id="18"/>
       <w:r>
         <w:rPr>
@@ -19091,7 +19154,7 @@
         <w:ind w:firstLine="709"/>
       </w:pPr>
       <w:bookmarkStart w:id="22" w:name="_8d34778965163a5752bc27698d1f7e786ff5c87"/>
-      <w:bookmarkStart w:id="23" w:name="_Toc241911950"/>
+      <w:bookmarkStart w:id="23" w:name="_Toc241934601"/>
       <w:bookmarkEnd w:id="20"/>
       <w:r>
         <w:rPr>
@@ -20246,7 +20309,7 @@
           <w:sz w:val="28"/>
         </w:rPr>
         <w:drawing>
-          <wp:inline distT="0" distB="0" distL="0" distR="0" wp14:anchorId="27CDECA9" wp14:editId="21FCD6BA">
+          <wp:inline distT="0" distB="0" distL="0" distR="0" wp14:anchorId="3B6AAA3C" wp14:editId="0611A46E">
             <wp:extent cx="5334000" cy="2992243"/>
             <wp:effectExtent l="0" t="0" r="0" b="0"/>
             <wp:docPr id="26" name="Picture"/>
@@ -21092,7 +21155,7 @@
           <w:sz w:val="28"/>
         </w:rPr>
         <w:drawing>
-          <wp:inline distT="0" distB="0" distL="0" distR="0" wp14:anchorId="7BC67469" wp14:editId="076CCDFE">
+          <wp:inline distT="0" distB="0" distL="0" distR="0" wp14:anchorId="6DDDC143" wp14:editId="6F4C151B">
             <wp:extent cx="5334000" cy="2471853"/>
             <wp:effectExtent l="0" t="0" r="0" b="0"/>
             <wp:docPr id="29" name="Picture"/>
@@ -21590,7 +21653,7 @@
         <w:ind w:firstLine="709"/>
       </w:pPr>
       <w:bookmarkStart w:id="24" w:name="_e6e1aac57bb528344b9009e4599364161f48047"/>
-      <w:bookmarkStart w:id="25" w:name="_Toc241911951"/>
+      <w:bookmarkStart w:id="25" w:name="_Toc241934602"/>
       <w:bookmarkEnd w:id="22"/>
       <w:r>
         <w:rPr>
@@ -22508,7 +22571,7 @@
         </w:rPr>
         <w:lastRenderedPageBreak/>
         <w:drawing>
-          <wp:inline distT="0" distB="0" distL="0" distR="0" wp14:anchorId="742747D6" wp14:editId="21FBD049">
+          <wp:inline distT="0" distB="0" distL="0" distR="0" wp14:anchorId="54D2B10E" wp14:editId="31DF56DB">
             <wp:extent cx="5334000" cy="2341756"/>
             <wp:effectExtent l="0" t="0" r="0" b="0"/>
             <wp:docPr id="33" name="Picture"/>
@@ -22739,7 +22802,7 @@
         <w:ind w:firstLine="709"/>
       </w:pPr>
       <w:bookmarkStart w:id="26" w:name="_6a64c25cd48aeb5a2bf3dc411d56d805a6b5d7e"/>
-      <w:bookmarkStart w:id="27" w:name="_Toc241911952"/>
+      <w:bookmarkStart w:id="27" w:name="_Toc241934603"/>
       <w:bookmarkEnd w:id="24"/>
       <w:r>
         <w:rPr>
@@ -22798,7 +22861,7 @@
         </w:rPr>
         <w:lastRenderedPageBreak/>
         <w:drawing>
-          <wp:inline distT="0" distB="0" distL="0" distR="0" wp14:anchorId="54723797" wp14:editId="3CCB891A">
+          <wp:inline distT="0" distB="0" distL="0" distR="0" wp14:anchorId="6013D132" wp14:editId="734D497F">
             <wp:extent cx="5334000" cy="2471853"/>
             <wp:effectExtent l="0" t="0" r="0" b="0"/>
             <wp:docPr id="37" name="Picture"/>
@@ -23023,7 +23086,7 @@
         <w:ind w:firstLine="709"/>
       </w:pPr>
       <w:bookmarkStart w:id="28" w:name="_8cdf61ec50cc46d2aaeadce1b560fea28ea116e"/>
-      <w:bookmarkStart w:id="29" w:name="_Toc241911953"/>
+      <w:bookmarkStart w:id="29" w:name="_Toc241934604"/>
       <w:bookmarkEnd w:id="26"/>
       <w:r>
         <w:rPr>
@@ -23139,7 +23202,7 @@
         <w:ind w:firstLine="709"/>
       </w:pPr>
       <w:bookmarkStart w:id="30" w:name="_1bfdad9d2d88ddb6ca16c31c1d4d4943679f32f"/>
-      <w:bookmarkStart w:id="31" w:name="_Toc241911954"/>
+      <w:bookmarkStart w:id="31" w:name="_Toc241934605"/>
       <w:bookmarkEnd w:id="28"/>
       <w:bookmarkEnd w:id="2"/>
       <w:r>
@@ -23677,7 +23740,7 @@
         <w:jc w:val="center"/>
       </w:pPr>
       <w:bookmarkStart w:id="32" w:name="_выводы"/>
-      <w:bookmarkStart w:id="33" w:name="_Toc241911955"/>
+      <w:bookmarkStart w:id="33" w:name="_Toc241934606"/>
       <w:bookmarkEnd w:id="30"/>
       <w:r>
         <w:rPr>
@@ -23951,7 +24014,7 @@
         <w:jc w:val="center"/>
       </w:pPr>
       <w:bookmarkStart w:id="34" w:name="_274f6a444530ef90b0479dabf3d210f01e97699"/>
-      <w:bookmarkStart w:id="35" w:name="_Toc241911956"/>
+      <w:bookmarkStart w:id="35" w:name="_Toc241934607"/>
       <w:bookmarkEnd w:id="32"/>
       <w:r>
         <w:rPr>
@@ -25053,7 +25116,7 @@
         <w:jc w:val="center"/>
       </w:pPr>
       <w:bookmarkStart w:id="36" w:name="_3d74faf1500c1b2a4a8bfa8e0e37c74206ce73d"/>
-      <w:bookmarkStart w:id="37" w:name="_Toc241911957"/>
+      <w:bookmarkStart w:id="37" w:name="_Toc241934608"/>
       <w:bookmarkEnd w:id="34"/>
       <w:r>
         <w:rPr>
@@ -26532,7 +26595,7 @@
         <w:jc w:val="center"/>
       </w:pPr>
       <w:bookmarkStart w:id="38" w:name="_d684f183eb868ee4ace295916bed2e6be64d16e"/>
-      <w:bookmarkStart w:id="39" w:name="_Toc241911958"/>
+      <w:bookmarkStart w:id="39" w:name="_Toc241934609"/>
       <w:bookmarkEnd w:id="36"/>
       <w:r>
         <w:rPr>
@@ -27420,7 +27483,7 @@
               <w:rPr>
                 <w:sz w:val="24"/>
               </w:rPr>
-              <w:t>анкета: бюджет, допустимая цена, готовность платить до пробы</w:t>
+              <w:t>анкета: бюджет, допустимая цена, готовность платить до пробы; пока использованы модельные данные (приложение Г)</w:t>
             </w:r>
           </w:p>
         </w:tc>
@@ -27439,7 +27502,13 @@
               <w:rPr>
                 <w:sz w:val="24"/>
               </w:rPr>
-              <w:t>книга 3, листы «Платежеспособность», «Сценарии»</w:t>
+              <w:t>книга 3, листы «Плат</w:t>
+            </w:r>
+            <w:r>
+              <w:rPr>
+                <w:sz w:val="24"/>
+              </w:rPr>
+              <w:t>ежеспособность», «Сценарии»</w:t>
             </w:r>
           </w:p>
         </w:tc>
@@ -27483,13 +27552,7 @@
               <w:rPr>
                 <w:sz w:val="24"/>
               </w:rPr>
-              <w:t>Конверсии собственно</w:t>
-            </w:r>
-            <w:r>
-              <w:rPr>
-                <w:sz w:val="24"/>
-              </w:rPr>
-              <w:t>го сайта и рекламные кампании</w:t>
+              <w:t>Конверсии собственного сайта и рекламные кампании</w:t>
             </w:r>
           </w:p>
         </w:tc>
@@ -27771,13 +27834,13 @@
           <w:sz w:val="28"/>
         </w:rPr>
         <w:lastRenderedPageBreak/>
-        <w:t xml:space="preserve">Пункты 1, 3, 6 и 7 выполняются в сервисах под аккаунтом студентки; пункты 2 и 4 - открытые источники; пункт 5 требует аудитории. До выполнения пунктов оценки остаются диапазоном с низкой и средней </w:t>
-      </w:r>
-      <w:r>
-        <w:rPr>
-          <w:sz w:val="28"/>
-        </w:rPr>
-        <w:t>надежностью.</w:t>
+        <w:t xml:space="preserve">Пункты 1, 3, 6 и 7 выполняются в сервисах под аккаунтом студентки; пункты 2 и 4 - открытые источники; пункт 5 </w:t>
+      </w:r>
+      <w:r>
+        <w:rPr>
+          <w:sz w:val="28"/>
+        </w:rPr>
+        <w:t>требует аудитории. До выполнения пунктов оценки остаются диапазоном с низкой и средней надежностью.</w:t>
       </w:r>
     </w:p>
     <w:p>
@@ -27789,7 +27852,7 @@
         <w:jc w:val="center"/>
       </w:pPr>
       <w:bookmarkStart w:id="40" w:name="_cb59224a7032ef66ab429e7df9b4e4c597bc187"/>
-      <w:bookmarkStart w:id="41" w:name="_Toc241911959"/>
+      <w:bookmarkStart w:id="41" w:name="_Toc241934610"/>
       <w:bookmarkEnd w:id="38"/>
       <w:r>
         <w:rPr>
@@ -27850,7 +27913,13 @@
         <w:rPr>
           <w:sz w:val="28"/>
         </w:rPr>
-        <w:t xml:space="preserve"> выявлены ошибки и неудобства. Ниже перечислено, что изменено, чтобы расчет был корректным; оригиналы шаблонов не изменялись, работа велась с копиями.</w:t>
+        <w:t xml:space="preserve"> выявлены ошибки и неудобства. Ниже перечислено, что изменено, чтобы расчет был</w:t>
+      </w:r>
+      <w:r>
+        <w:rPr>
+          <w:sz w:val="28"/>
+        </w:rPr>
+        <w:t xml:space="preserve"> корректным; оригиналы шаблонов не изменялись, работа велась с копиями.</w:t>
       </w:r>
     </w:p>
     <w:p>
@@ -28150,13 +28219,7 @@
               <w:rPr>
                 <w:sz w:val="24"/>
               </w:rPr>
-              <w:t xml:space="preserve">Цифровая воронка, лист </w:t>
-            </w:r>
-            <w:r>
-              <w:rPr>
-                <w:sz w:val="24"/>
-              </w:rPr>
-              <w:t>«Конкуренты_</w:t>
+              <w:t>Цифровая воронка, лист «Конкуренты_</w:t>
             </w:r>
             <w:r>
               <w:rPr>
@@ -28316,13 +28379,13 @@
               <w:rPr>
                 <w:sz w:val="24"/>
               </w:rPr>
-              <w:t>суммы релевантного трафика начинались со строки 5 и пропускали первую ст</w:t>
-            </w:r>
-            <w:r>
-              <w:rPr>
-                <w:sz w:val="24"/>
-              </w:rPr>
-              <w:t>року данных</w:t>
+              <w:t>суммы релевантного трафика начинались со строки 5</w:t>
+            </w:r>
+            <w:r>
+              <w:rPr>
+                <w:sz w:val="24"/>
+              </w:rPr>
+              <w:t xml:space="preserve"> и пропускали первую строку данных</w:t>
             </w:r>
           </w:p>
         </w:tc>
@@ -28436,7 +28499,13 @@
               <w:rPr>
                 <w:sz w:val="24"/>
               </w:rPr>
-              <w:t>формулы итогов исключают платформенную строку</w:t>
+              <w:t>формулы итогов исключают платформенн</w:t>
+            </w:r>
+            <w:r>
+              <w:rPr>
+                <w:sz w:val="24"/>
+              </w:rPr>
+              <w:t>ую строку</w:t>
             </w:r>
           </w:p>
         </w:tc>
@@ -28480,13 +28549,7 @@
               <w:rPr>
                 <w:sz w:val="24"/>
               </w:rPr>
-              <w:t>Платежеспо</w:t>
-            </w:r>
-            <w:r>
-              <w:rPr>
-                <w:sz w:val="24"/>
-              </w:rPr>
-              <w:t>собность, лист «Ценовой коридор»</w:t>
+              <w:t>Платежеспособность, лист «Ценовой коридор»</w:t>
             </w:r>
           </w:p>
         </w:tc>
@@ -28773,7 +28836,1342 @@
         <w:t>Исправления 1-4 затрагивают корректность формул, остальные - содержание. После исправлений ошибок формул в книгах нет, а независимый пересчет подтверждает значения.</w:t>
       </w:r>
     </w:p>
-    <w:bookmarkEnd w:id="40"/>
+    <w:p>
+      <w:pPr>
+        <w:pStyle w:val="1"/>
+        <w:keepNext w:val="0"/>
+        <w:pageBreakBefore/>
+        <w:spacing w:before="0" w:after="0" w:line="360" w:lineRule="exact"/>
+        <w:jc w:val="center"/>
+      </w:pPr>
+      <w:bookmarkStart w:id="42" w:name="_48e9587881bbc300b26702bd6584ff263e735cf"/>
+      <w:bookmarkStart w:id="43" w:name="_Toc241934611"/>
+      <w:bookmarkEnd w:id="40"/>
+      <w:r>
+        <w:rPr>
+          <w:b/>
+          <w:sz w:val="28"/>
+        </w:rPr>
+        <w:lastRenderedPageBreak/>
+        <w:t>ПРИЛОЖЕНИЕ Г</w:t>
+      </w:r>
+      <w:bookmarkEnd w:id="43"/>
+    </w:p>
+    <w:p>
+      <w:pPr>
+        <w:spacing w:after="0" w:line="360" w:lineRule="exact"/>
+        <w:jc w:val="center"/>
+      </w:pPr>
+      <w:r>
+        <w:rPr>
+          <w:sz w:val="28"/>
+        </w:rPr>
+        <w:t>(справочное)</w:t>
+      </w:r>
+    </w:p>
+    <w:p>
+      <w:pPr>
+        <w:spacing w:after="360" w:line="360" w:lineRule="exact"/>
+        <w:jc w:val="center"/>
+      </w:pPr>
+      <w:r>
+        <w:rPr>
+          <w:b/>
+          <w:sz w:val="28"/>
+        </w:rPr>
+        <w:t>Модельные данные опроса о цене и готовности платить</w:t>
+      </w:r>
+    </w:p>
+    <w:p>
+      <w:pPr>
+        <w:pStyle w:val="FirstParagraph"/>
+        <w:spacing w:before="0" w:after="0" w:line="360" w:lineRule="exact"/>
+        <w:ind w:firstLine="709"/>
+        <w:jc w:val="both"/>
+      </w:pPr>
+      <w:r>
+        <w:rPr>
+          <w:sz w:val="28"/>
+        </w:rPr>
+        <w:t>Респондентов для опроса нет, поэтому по решению студентки (Р-8) данные сгенерированы по заданным параметрам: 30 условных респондентов в четырех сегментах, генератор и файлы лежат в папке 00_О</w:t>
+      </w:r>
+      <w:r>
+        <w:rPr>
+          <w:sz w:val="28"/>
+        </w:rPr>
+        <w:t>бщее/Опрос_модельный (</w:t>
+      </w:r>
+      <w:r>
+        <w:rPr>
+          <w:i/>
+          <w:sz w:val="28"/>
+        </w:rPr>
+        <w:t>seed</w:t>
+      </w:r>
+      <w:r>
+        <w:rPr>
+          <w:sz w:val="28"/>
+        </w:rPr>
+        <w:t xml:space="preserve"> 20261003). Это модельные данные, а не результат опроса людей; они показывают порядок обработки анкеты по методике и проверяют согласованность принятого ценового коридора, но не доказывают реальный спрос.</w:t>
+      </w:r>
+    </w:p>
+    <w:p>
+      <w:pPr>
+        <w:pStyle w:val="a0"/>
+        <w:spacing w:before="0" w:after="0" w:line="360" w:lineRule="exact"/>
+        <w:ind w:firstLine="709"/>
+        <w:jc w:val="both"/>
+      </w:pPr>
+      <w:r>
+        <w:rPr>
+          <w:sz w:val="28"/>
+        </w:rPr>
+        <w:t>В таблице 24 представлено</w:t>
+      </w:r>
+      <w:r>
+        <w:rPr>
+          <w:sz w:val="28"/>
+        </w:rPr>
+        <w:t xml:space="preserve">: модельные показатели цены и готовности платить (Ван Вестендорп, подписка </w:t>
+      </w:r>
+      <w:r>
+        <w:rPr>
+          <w:i/>
+          <w:sz w:val="28"/>
+        </w:rPr>
+        <w:t>Pro</w:t>
+      </w:r>
+      <w:r>
+        <w:rPr>
+          <w:sz w:val="28"/>
+        </w:rPr>
+        <w:t>).</w:t>
+      </w:r>
+    </w:p>
+    <w:p>
+      <w:pPr>
+        <w:pStyle w:val="a0"/>
+        <w:keepNext/>
+        <w:spacing w:before="0" w:after="0" w:line="360" w:lineRule="exact"/>
+      </w:pPr>
+      <w:r>
+        <w:rPr>
+          <w:sz w:val="28"/>
+        </w:rPr>
+        <w:t xml:space="preserve">Таблица 24 – Модельные показатели цены и готовности платить (Ван Вестендорп, подписка </w:t>
+      </w:r>
+      <w:r>
+        <w:rPr>
+          <w:i/>
+          <w:sz w:val="28"/>
+        </w:rPr>
+        <w:t>Pro</w:t>
+      </w:r>
+      <w:r>
+        <w:rPr>
+          <w:sz w:val="28"/>
+        </w:rPr>
+        <w:t>)</w:t>
+      </w:r>
+    </w:p>
+    <w:tbl>
+      <w:tblPr>
+        <w:tblStyle w:val="Table"/>
+        <w:tblW w:w="9355" w:type="dxa"/>
+        <w:jc w:val="center"/>
+        <w:tblBorders>
+          <w:top w:val="single" w:sz="4" w:space="0" w:color="000000"/>
+          <w:left w:val="single" w:sz="4" w:space="0" w:color="000000"/>
+          <w:bottom w:val="single" w:sz="4" w:space="0" w:color="000000"/>
+          <w:right w:val="single" w:sz="4" w:space="0" w:color="000000"/>
+          <w:insideH w:val="single" w:sz="4" w:space="0" w:color="000000"/>
+          <w:insideV w:val="single" w:sz="4" w:space="0" w:color="000000"/>
+        </w:tblBorders>
+        <w:tblLayout w:type="fixed"/>
+        <w:tblLook w:val="0020" w:firstRow="1" w:lastRow="0" w:firstColumn="0" w:lastColumn="0" w:noHBand="0" w:noVBand="0"/>
+      </w:tblPr>
+      <w:tblGrid>
+        <w:gridCol w:w="3441"/>
+        <w:gridCol w:w="1628"/>
+        <w:gridCol w:w="4286"/>
+      </w:tblGrid>
+      <w:tr>
+        <w:trPr>
+          <w:cnfStyle w:val="100000000000" w:firstRow="1" w:lastRow="0" w:firstColumn="0" w:lastColumn="0" w:oddVBand="0" w:evenVBand="0" w:oddHBand="0" w:evenHBand="0" w:firstRowFirstColumn="0" w:firstRowLastColumn="0" w:lastRowFirstColumn="0" w:lastRowLastColumn="0"/>
+          <w:cantSplit/>
+          <w:tblHeader/>
+          <w:jc w:val="center"/>
+        </w:trPr>
+        <w:tc>
+          <w:tcPr>
+            <w:tcW w:w="3441" w:type="dxa"/>
+            <w:vAlign w:val="center"/>
+          </w:tcPr>
+          <w:p>
+            <w:pPr>
+              <w:pStyle w:val="Compact"/>
+              <w:spacing w:before="0" w:after="0" w:line="280" w:lineRule="exact"/>
+              <w:jc w:val="center"/>
+            </w:pPr>
+            <w:r>
+              <w:rPr>
+                <w:b/>
+                <w:sz w:val="24"/>
+              </w:rPr>
+              <w:t>Показатель</w:t>
+            </w:r>
+          </w:p>
+        </w:tc>
+        <w:tc>
+          <w:tcPr>
+            <w:tcW w:w="1628" w:type="dxa"/>
+            <w:vAlign w:val="center"/>
+          </w:tcPr>
+          <w:p>
+            <w:pPr>
+              <w:pStyle w:val="Compact"/>
+              <w:spacing w:before="0" w:after="0" w:line="280" w:lineRule="exact"/>
+              <w:jc w:val="center"/>
+            </w:pPr>
+            <w:r>
+              <w:rPr>
+                <w:b/>
+                <w:sz w:val="24"/>
+              </w:rPr>
+              <w:t>Значение</w:t>
+            </w:r>
+          </w:p>
+        </w:tc>
+        <w:tc>
+          <w:tcPr>
+            <w:tcW w:w="4286" w:type="dxa"/>
+            <w:vAlign w:val="center"/>
+          </w:tcPr>
+          <w:p>
+            <w:pPr>
+              <w:pStyle w:val="Compact"/>
+              <w:spacing w:before="0" w:after="0" w:line="280" w:lineRule="exact"/>
+              <w:jc w:val="center"/>
+            </w:pPr>
+            <w:r>
+              <w:rPr>
+                <w:b/>
+                <w:sz w:val="24"/>
+              </w:rPr>
+              <w:t xml:space="preserve">Сравнение с предложением </w:t>
+            </w:r>
+            <w:r>
+              <w:rPr>
+                <w:b/>
+                <w:i/>
+                <w:sz w:val="24"/>
+              </w:rPr>
+              <w:t>TableMind</w:t>
+            </w:r>
+          </w:p>
+        </w:tc>
+      </w:tr>
+      <w:tr>
+        <w:trPr>
+          <w:cantSplit/>
+          <w:jc w:val="center"/>
+        </w:trPr>
+        <w:tc>
+          <w:tcPr>
+            <w:tcW w:w="3441" w:type="dxa"/>
+            <w:vAlign w:val="center"/>
+          </w:tcPr>
+          <w:p>
+            <w:pPr>
+              <w:pStyle w:val="Compact"/>
+              <w:spacing w:before="0" w:after="0" w:line="280" w:lineRule="exact"/>
+              <w:jc w:val="center"/>
+            </w:pPr>
+            <w:r>
+              <w:rPr>
+                <w:sz w:val="24"/>
+              </w:rPr>
+              <w:t xml:space="preserve">Точка предельной </w:t>
+            </w:r>
+            <w:r>
+              <w:rPr>
+                <w:sz w:val="24"/>
+              </w:rPr>
+              <w:t>дешевизны (</w:t>
+            </w:r>
+            <w:r>
+              <w:rPr>
+                <w:i/>
+                <w:sz w:val="24"/>
+              </w:rPr>
+              <w:t>PMC</w:t>
+            </w:r>
+            <w:r>
+              <w:rPr>
+                <w:sz w:val="24"/>
+              </w:rPr>
+              <w:t>)</w:t>
+            </w:r>
+          </w:p>
+        </w:tc>
+        <w:tc>
+          <w:tcPr>
+            <w:tcW w:w="1628" w:type="dxa"/>
+            <w:vAlign w:val="center"/>
+          </w:tcPr>
+          <w:p>
+            <w:pPr>
+              <w:pStyle w:val="Compact"/>
+              <w:spacing w:before="0" w:after="0" w:line="280" w:lineRule="exact"/>
+              <w:jc w:val="center"/>
+            </w:pPr>
+            <w:r>
+              <w:rPr>
+                <w:sz w:val="24"/>
+              </w:rPr>
+              <w:t>11,6 EUR/мес.</w:t>
+            </w:r>
+          </w:p>
+        </w:tc>
+        <w:tc>
+          <w:tcPr>
+            <w:tcW w:w="4286" w:type="dxa"/>
+            <w:vAlign w:val="center"/>
+          </w:tcPr>
+          <w:p>
+            <w:pPr>
+              <w:pStyle w:val="Compact"/>
+              <w:spacing w:before="0" w:after="0" w:line="280" w:lineRule="exact"/>
+              <w:jc w:val="center"/>
+            </w:pPr>
+            <w:r>
+              <w:rPr>
+                <w:sz w:val="24"/>
+              </w:rPr>
+              <w:t xml:space="preserve">ниже цены </w:t>
+            </w:r>
+            <w:r>
+              <w:rPr>
+                <w:i/>
+                <w:sz w:val="24"/>
+              </w:rPr>
+              <w:t>Pro</w:t>
+            </w:r>
+            <w:r>
+              <w:rPr>
+                <w:sz w:val="24"/>
+              </w:rPr>
+              <w:t xml:space="preserve"> 19 </w:t>
+            </w:r>
+            <w:r>
+              <w:rPr>
+                <w:i/>
+                <w:sz w:val="24"/>
+              </w:rPr>
+              <w:t>EUR</w:t>
+            </w:r>
+          </w:p>
+        </w:tc>
+      </w:tr>
+      <w:tr>
+        <w:trPr>
+          <w:cantSplit/>
+          <w:jc w:val="center"/>
+        </w:trPr>
+        <w:tc>
+          <w:tcPr>
+            <w:tcW w:w="3441" w:type="dxa"/>
+            <w:vAlign w:val="center"/>
+          </w:tcPr>
+          <w:p>
+            <w:pPr>
+              <w:pStyle w:val="Compact"/>
+              <w:spacing w:before="0" w:after="0" w:line="280" w:lineRule="exact"/>
+              <w:jc w:val="center"/>
+            </w:pPr>
+            <w:r>
+              <w:rPr>
+                <w:sz w:val="24"/>
+              </w:rPr>
+              <w:t>Оптимальная цена (</w:t>
+            </w:r>
+            <w:r>
+              <w:rPr>
+                <w:i/>
+                <w:sz w:val="24"/>
+              </w:rPr>
+              <w:t>OPP</w:t>
+            </w:r>
+            <w:r>
+              <w:rPr>
+                <w:sz w:val="24"/>
+              </w:rPr>
+              <w:t>)</w:t>
+            </w:r>
+          </w:p>
+        </w:tc>
+        <w:tc>
+          <w:tcPr>
+            <w:tcW w:w="1628" w:type="dxa"/>
+            <w:vAlign w:val="center"/>
+          </w:tcPr>
+          <w:p>
+            <w:pPr>
+              <w:pStyle w:val="Compact"/>
+              <w:spacing w:before="0" w:after="0" w:line="280" w:lineRule="exact"/>
+              <w:jc w:val="center"/>
+            </w:pPr>
+            <w:r>
+              <w:rPr>
+                <w:sz w:val="24"/>
+              </w:rPr>
+              <w:t>13,9 EUR/мес.</w:t>
+            </w:r>
+          </w:p>
+        </w:tc>
+        <w:tc>
+          <w:tcPr>
+            <w:tcW w:w="4286" w:type="dxa"/>
+            <w:vAlign w:val="center"/>
+          </w:tcPr>
+          <w:p>
+            <w:pPr>
+              <w:pStyle w:val="Compact"/>
+              <w:spacing w:before="0" w:after="0" w:line="280" w:lineRule="exact"/>
+              <w:jc w:val="center"/>
+            </w:pPr>
+            <w:r>
+              <w:rPr>
+                <w:i/>
+                <w:sz w:val="24"/>
+              </w:rPr>
+              <w:t>Pro</w:t>
+            </w:r>
+            <w:r>
+              <w:rPr>
+                <w:sz w:val="24"/>
+              </w:rPr>
+              <w:t xml:space="preserve"> 19 </w:t>
+            </w:r>
+            <w:r>
+              <w:rPr>
+                <w:i/>
+                <w:sz w:val="24"/>
+              </w:rPr>
+              <w:t>EUR</w:t>
+            </w:r>
+            <w:r>
+              <w:rPr>
+                <w:sz w:val="24"/>
+              </w:rPr>
+              <w:t xml:space="preserve"> выше оптимума</w:t>
+            </w:r>
+          </w:p>
+        </w:tc>
+      </w:tr>
+      <w:tr>
+        <w:trPr>
+          <w:cantSplit/>
+          <w:jc w:val="center"/>
+        </w:trPr>
+        <w:tc>
+          <w:tcPr>
+            <w:tcW w:w="3441" w:type="dxa"/>
+            <w:vAlign w:val="center"/>
+          </w:tcPr>
+          <w:p>
+            <w:pPr>
+              <w:pStyle w:val="Compact"/>
+              <w:spacing w:before="0" w:after="0" w:line="280" w:lineRule="exact"/>
+              <w:jc w:val="center"/>
+            </w:pPr>
+            <w:r>
+              <w:rPr>
+                <w:sz w:val="24"/>
+              </w:rPr>
+              <w:t>Безразличная цена (</w:t>
+            </w:r>
+            <w:r>
+              <w:rPr>
+                <w:i/>
+                <w:sz w:val="24"/>
+              </w:rPr>
+              <w:t>IPP</w:t>
+            </w:r>
+            <w:r>
+              <w:rPr>
+                <w:sz w:val="24"/>
+              </w:rPr>
+              <w:t>)</w:t>
+            </w:r>
+          </w:p>
+        </w:tc>
+        <w:tc>
+          <w:tcPr>
+            <w:tcW w:w="1628" w:type="dxa"/>
+            <w:vAlign w:val="center"/>
+          </w:tcPr>
+          <w:p>
+            <w:pPr>
+              <w:pStyle w:val="Compact"/>
+              <w:spacing w:before="0" w:after="0" w:line="280" w:lineRule="exact"/>
+              <w:jc w:val="center"/>
+            </w:pPr>
+            <w:r>
+              <w:rPr>
+                <w:sz w:val="24"/>
+              </w:rPr>
+              <w:t>14,2 EUR/мес.</w:t>
+            </w:r>
+          </w:p>
+        </w:tc>
+        <w:tc>
+          <w:tcPr>
+            <w:tcW w:w="4286" w:type="dxa"/>
+            <w:vAlign w:val="center"/>
+          </w:tcPr>
+          <w:p>
+            <w:pPr>
+              <w:pStyle w:val="Compact"/>
+              <w:spacing w:before="0" w:after="0" w:line="280" w:lineRule="exact"/>
+              <w:jc w:val="center"/>
+            </w:pPr>
+            <w:r>
+              <w:rPr>
+                <w:i/>
+                <w:sz w:val="24"/>
+              </w:rPr>
+              <w:t>Pro</w:t>
+            </w:r>
+            <w:r>
+              <w:rPr>
+                <w:sz w:val="24"/>
+              </w:rPr>
+              <w:t xml:space="preserve"> 19 </w:t>
+            </w:r>
+            <w:r>
+              <w:rPr>
+                <w:i/>
+                <w:sz w:val="24"/>
+              </w:rPr>
+              <w:t>EUR</w:t>
+            </w:r>
+            <w:r>
+              <w:rPr>
+                <w:sz w:val="24"/>
+              </w:rPr>
+              <w:t xml:space="preserve"> выше безразличной цены</w:t>
+            </w:r>
+          </w:p>
+        </w:tc>
+      </w:tr>
+      <w:tr>
+        <w:trPr>
+          <w:cantSplit/>
+          <w:jc w:val="center"/>
+        </w:trPr>
+        <w:tc>
+          <w:tcPr>
+            <w:tcW w:w="3441" w:type="dxa"/>
+            <w:vAlign w:val="center"/>
+          </w:tcPr>
+          <w:p>
+            <w:pPr>
+              <w:pStyle w:val="Compact"/>
+              <w:spacing w:before="0" w:after="0" w:line="280" w:lineRule="exact"/>
+              <w:jc w:val="center"/>
+            </w:pPr>
+            <w:r>
+              <w:rPr>
+                <w:sz w:val="24"/>
+              </w:rPr>
+              <w:t>Точка предельной дороговизны (</w:t>
+            </w:r>
+            <w:r>
+              <w:rPr>
+                <w:i/>
+                <w:sz w:val="24"/>
+              </w:rPr>
+              <w:t>PME</w:t>
+            </w:r>
+            <w:r>
+              <w:rPr>
+                <w:sz w:val="24"/>
+              </w:rPr>
+              <w:t>)</w:t>
+            </w:r>
+          </w:p>
+        </w:tc>
+        <w:tc>
+          <w:tcPr>
+            <w:tcW w:w="1628" w:type="dxa"/>
+            <w:vAlign w:val="center"/>
+          </w:tcPr>
+          <w:p>
+            <w:pPr>
+              <w:pStyle w:val="Compact"/>
+              <w:spacing w:before="0" w:after="0" w:line="280" w:lineRule="exact"/>
+              <w:jc w:val="center"/>
+            </w:pPr>
+            <w:r>
+              <w:rPr>
+                <w:sz w:val="24"/>
+              </w:rPr>
+              <w:t>19,9 EUR/мес.</w:t>
+            </w:r>
+          </w:p>
+        </w:tc>
+        <w:tc>
+          <w:tcPr>
+            <w:tcW w:w="4286" w:type="dxa"/>
+            <w:vAlign w:val="center"/>
+          </w:tcPr>
+          <w:p>
+            <w:pPr>
+              <w:pStyle w:val="Compact"/>
+              <w:spacing w:before="0" w:after="0" w:line="280" w:lineRule="exact"/>
+              <w:jc w:val="center"/>
+            </w:pPr>
+            <w:r>
+              <w:rPr>
+                <w:i/>
+                <w:sz w:val="24"/>
+              </w:rPr>
+              <w:t>Pro</w:t>
+            </w:r>
+            <w:r>
+              <w:rPr>
+                <w:sz w:val="24"/>
+              </w:rPr>
+              <w:t xml:space="preserve"> 19 </w:t>
+            </w:r>
+            <w:r>
+              <w:rPr>
+                <w:i/>
+                <w:sz w:val="24"/>
+              </w:rPr>
+              <w:t>EUR</w:t>
+            </w:r>
+            <w:r>
+              <w:rPr>
+                <w:sz w:val="24"/>
+              </w:rPr>
+              <w:t xml:space="preserve"> на верхней границе приемлемого диапазона</w:t>
+            </w:r>
+          </w:p>
+        </w:tc>
+      </w:tr>
+      <w:tr>
+        <w:trPr>
+          <w:cantSplit/>
+          <w:jc w:val="center"/>
+        </w:trPr>
+        <w:tc>
+          <w:tcPr>
+            <w:tcW w:w="3441" w:type="dxa"/>
+            <w:vAlign w:val="center"/>
+          </w:tcPr>
+          <w:p>
+            <w:pPr>
+              <w:pStyle w:val="Compact"/>
+              <w:spacing w:before="0" w:after="0" w:line="280" w:lineRule="exact"/>
+              <w:jc w:val="center"/>
+            </w:pPr>
+            <w:r>
+              <w:rPr>
+                <w:sz w:val="24"/>
+              </w:rPr>
+              <w:t>Медиана допустимой цены разового аудита</w:t>
+            </w:r>
+          </w:p>
+        </w:tc>
+        <w:tc>
+          <w:tcPr>
+            <w:tcW w:w="1628" w:type="dxa"/>
+            <w:vAlign w:val="center"/>
+          </w:tcPr>
+          <w:p>
+            <w:pPr>
+              <w:pStyle w:val="Compact"/>
+              <w:spacing w:before="0" w:after="0" w:line="280" w:lineRule="exact"/>
+              <w:jc w:val="center"/>
+            </w:pPr>
+            <w:r>
+              <w:rPr>
+                <w:sz w:val="24"/>
+              </w:rPr>
+              <w:t>7,6 </w:t>
+            </w:r>
+            <w:r>
+              <w:rPr>
+                <w:i/>
+                <w:sz w:val="24"/>
+              </w:rPr>
+              <w:t>EUR</w:t>
+            </w:r>
+          </w:p>
+        </w:tc>
+        <w:tc>
+          <w:tcPr>
+            <w:tcW w:w="4286" w:type="dxa"/>
+            <w:vAlign w:val="center"/>
+          </w:tcPr>
+          <w:p>
+            <w:pPr>
+              <w:pStyle w:val="Compact"/>
+              <w:spacing w:before="0" w:after="0" w:line="280" w:lineRule="exact"/>
+              <w:jc w:val="center"/>
+            </w:pPr>
+            <w:r>
+              <w:rPr>
+                <w:sz w:val="24"/>
+              </w:rPr>
+              <w:t>цена 9 </w:t>
+            </w:r>
+            <w:r>
+              <w:rPr>
+                <w:i/>
+                <w:sz w:val="24"/>
+              </w:rPr>
+              <w:t>EUR</w:t>
+            </w:r>
+            <w:r>
+              <w:rPr>
+                <w:sz w:val="24"/>
+              </w:rPr>
+              <w:t>; не меньше 9 </w:t>
+            </w:r>
+            <w:r>
+              <w:rPr>
+                <w:i/>
+                <w:sz w:val="24"/>
+              </w:rPr>
+              <w:t>EUR</w:t>
+            </w:r>
+            <w:r>
+              <w:rPr>
+                <w:sz w:val="24"/>
+              </w:rPr>
+              <w:t xml:space="preserve"> готовы платить 43 %</w:t>
+            </w:r>
+          </w:p>
+        </w:tc>
+      </w:tr>
+      <w:tr>
+        <w:trPr>
+          <w:cantSplit/>
+          <w:jc w:val="center"/>
+        </w:trPr>
+        <w:tc>
+          <w:tcPr>
+            <w:tcW w:w="3441" w:type="dxa"/>
+            <w:vAlign w:val="center"/>
+          </w:tcPr>
+          <w:p>
+            <w:pPr>
+              <w:pStyle w:val="Compact"/>
+              <w:spacing w:before="0" w:after="0" w:line="280" w:lineRule="exact"/>
+              <w:jc w:val="center"/>
+            </w:pPr>
+            <w:r>
+              <w:rPr>
+                <w:sz w:val="24"/>
+              </w:rPr>
+              <w:t>Средняя готовность попробовать (1-5)</w:t>
+            </w:r>
+          </w:p>
+        </w:tc>
+        <w:tc>
+          <w:tcPr>
+            <w:tcW w:w="1628" w:type="dxa"/>
+            <w:vAlign w:val="center"/>
+          </w:tcPr>
+          <w:p>
+            <w:pPr>
+              <w:pStyle w:val="Compact"/>
+              <w:spacing w:before="0" w:after="0" w:line="280" w:lineRule="exact"/>
+              <w:jc w:val="center"/>
+            </w:pPr>
+            <w:r>
+              <w:rPr>
+                <w:sz w:val="24"/>
+              </w:rPr>
+              <w:t>3,37</w:t>
+            </w:r>
+          </w:p>
+        </w:tc>
+        <w:tc>
+          <w:tcPr>
+            <w:tcW w:w="4286" w:type="dxa"/>
+            <w:vAlign w:val="center"/>
+          </w:tcPr>
+          <w:p>
+            <w:pPr>
+              <w:pStyle w:val="Compact"/>
+              <w:spacing w:before="0" w:after="0" w:line="280" w:lineRule="exact"/>
+              <w:jc w:val="center"/>
+            </w:pPr>
+            <w:r>
+              <w:rPr>
+                <w:sz w:val="24"/>
+              </w:rPr>
+              <w:t>доля ответов 4-5: 53 %</w:t>
+            </w:r>
+          </w:p>
+        </w:tc>
+      </w:tr>
+    </w:tbl>
+    <w:p>
+      <w:pPr>
+        <w:pStyle w:val="FirstParagraph"/>
+        <w:spacing w:before="0" w:after="0" w:line="360" w:lineRule="exact"/>
+        <w:ind w:firstLine="709"/>
+        <w:jc w:val="both"/>
+      </w:pPr>
+      <w:r>
+        <w:rPr>
+          <w:sz w:val="28"/>
+        </w:rPr>
+        <w:t xml:space="preserve">Приемлемый диапазон цены </w:t>
+      </w:r>
+      <w:r>
+        <w:rPr>
+          <w:i/>
+          <w:sz w:val="28"/>
+        </w:rPr>
+        <w:t>Pro</w:t>
+      </w:r>
+      <w:r>
+        <w:rPr>
+          <w:sz w:val="28"/>
+        </w:rPr>
+        <w:t xml:space="preserve"> в модели - 11,6-19,9 </w:t>
+      </w:r>
+      <w:r>
+        <w:rPr>
+          <w:i/>
+          <w:sz w:val="28"/>
+        </w:rPr>
+        <w:t>EUR</w:t>
+      </w:r>
+      <w:r>
+        <w:rPr>
+          <w:sz w:val="28"/>
+        </w:rPr>
+        <w:t xml:space="preserve"> в месяц, а цена 19 </w:t>
+      </w:r>
+      <w:r>
+        <w:rPr>
+          <w:i/>
+          <w:sz w:val="28"/>
+        </w:rPr>
+        <w:t>EUR</w:t>
+      </w:r>
+      <w:r>
+        <w:rPr>
+          <w:sz w:val="28"/>
+        </w:rPr>
+        <w:t xml:space="preserve"> лежит у его верхней границы, что согласуется с индексом цены 0,99 к медиане конкурентов (книга 3). Вывод осторожный: ориентир безопасной цены </w:t>
+      </w:r>
+      <w:r>
+        <w:rPr>
+          <w:i/>
+          <w:sz w:val="28"/>
+        </w:rPr>
+        <w:t>Pro</w:t>
+      </w:r>
+      <w:r>
+        <w:rPr>
+          <w:sz w:val="28"/>
+        </w:rPr>
+        <w:t xml:space="preserve"> - 14-19 </w:t>
+      </w:r>
+      <w:r>
+        <w:rPr>
+          <w:i/>
+          <w:sz w:val="28"/>
+        </w:rPr>
+        <w:t>EUR</w:t>
+      </w:r>
+      <w:r>
+        <w:rPr>
+          <w:sz w:val="28"/>
+        </w:rPr>
+        <w:t>, а старт с 19 </w:t>
+      </w:r>
+      <w:r>
+        <w:rPr>
+          <w:i/>
+          <w:sz w:val="28"/>
+        </w:rPr>
+        <w:t>EUR</w:t>
+      </w:r>
+      <w:r>
+        <w:rPr>
+          <w:sz w:val="28"/>
+        </w:rPr>
+        <w:t xml:space="preserve"> требует контроля конверсии.</w:t>
+      </w:r>
+    </w:p>
+    <w:p>
+      <w:pPr>
+        <w:pStyle w:val="a0"/>
+        <w:spacing w:before="0" w:after="0" w:line="360" w:lineRule="exact"/>
+        <w:ind w:firstLine="709"/>
+        <w:jc w:val="both"/>
+      </w:pPr>
+      <w:r>
+        <w:rPr>
+          <w:sz w:val="28"/>
+        </w:rPr>
+        <w:t>В т</w:t>
+      </w:r>
+      <w:r>
+        <w:rPr>
+          <w:sz w:val="28"/>
+        </w:rPr>
+        <w:t>аблице 25 представлено: модельный выбор тарифа среди респондентов.</w:t>
+      </w:r>
+    </w:p>
+    <w:p>
+      <w:pPr>
+        <w:pStyle w:val="a0"/>
+        <w:keepNext/>
+        <w:spacing w:before="0" w:after="0" w:line="360" w:lineRule="exact"/>
+      </w:pPr>
+      <w:r>
+        <w:rPr>
+          <w:sz w:val="28"/>
+        </w:rPr>
+        <w:t>Таблица 25 – Модельный выбор тарифа среди респондентов</w:t>
+      </w:r>
+    </w:p>
+    <w:tbl>
+      <w:tblPr>
+        <w:tblStyle w:val="Table"/>
+        <w:tblW w:w="9355" w:type="dxa"/>
+        <w:jc w:val="center"/>
+        <w:tblBorders>
+          <w:top w:val="single" w:sz="4" w:space="0" w:color="000000"/>
+          <w:left w:val="single" w:sz="4" w:space="0" w:color="000000"/>
+          <w:bottom w:val="single" w:sz="4" w:space="0" w:color="000000"/>
+          <w:right w:val="single" w:sz="4" w:space="0" w:color="000000"/>
+          <w:insideH w:val="single" w:sz="4" w:space="0" w:color="000000"/>
+          <w:insideV w:val="single" w:sz="4" w:space="0" w:color="000000"/>
+        </w:tblBorders>
+        <w:tblLayout w:type="fixed"/>
+        <w:tblLook w:val="0020" w:firstRow="1" w:lastRow="0" w:firstColumn="0" w:lastColumn="0" w:noHBand="0" w:noVBand="0"/>
+      </w:tblPr>
+      <w:tblGrid>
+        <w:gridCol w:w="5248"/>
+        <w:gridCol w:w="2282"/>
+        <w:gridCol w:w="1825"/>
+      </w:tblGrid>
+      <w:tr>
+        <w:trPr>
+          <w:cnfStyle w:val="100000000000" w:firstRow="1" w:lastRow="0" w:firstColumn="0" w:lastColumn="0" w:oddVBand="0" w:evenVBand="0" w:oddHBand="0" w:evenHBand="0" w:firstRowFirstColumn="0" w:firstRowLastColumn="0" w:lastRowFirstColumn="0" w:lastRowLastColumn="0"/>
+          <w:cantSplit/>
+          <w:tblHeader/>
+          <w:jc w:val="center"/>
+        </w:trPr>
+        <w:tc>
+          <w:tcPr>
+            <w:tcW w:w="5248" w:type="dxa"/>
+            <w:vAlign w:val="center"/>
+          </w:tcPr>
+          <w:p>
+            <w:pPr>
+              <w:pStyle w:val="Compact"/>
+              <w:spacing w:before="0" w:after="0" w:line="280" w:lineRule="exact"/>
+              <w:jc w:val="center"/>
+            </w:pPr>
+            <w:r>
+              <w:rPr>
+                <w:b/>
+                <w:sz w:val="24"/>
+              </w:rPr>
+              <w:t>Выбор</w:t>
+            </w:r>
+          </w:p>
+        </w:tc>
+        <w:tc>
+          <w:tcPr>
+            <w:tcW w:w="2282" w:type="dxa"/>
+            <w:vAlign w:val="center"/>
+          </w:tcPr>
+          <w:p>
+            <w:pPr>
+              <w:pStyle w:val="Compact"/>
+              <w:spacing w:before="0" w:after="0" w:line="280" w:lineRule="exact"/>
+              <w:jc w:val="center"/>
+            </w:pPr>
+            <w:r>
+              <w:rPr>
+                <w:b/>
+                <w:sz w:val="24"/>
+              </w:rPr>
+              <w:t>Число</w:t>
+            </w:r>
+          </w:p>
+        </w:tc>
+        <w:tc>
+          <w:tcPr>
+            <w:tcW w:w="1825" w:type="dxa"/>
+            <w:vAlign w:val="center"/>
+          </w:tcPr>
+          <w:p>
+            <w:pPr>
+              <w:pStyle w:val="Compact"/>
+              <w:spacing w:before="0" w:after="0" w:line="280" w:lineRule="exact"/>
+              <w:jc w:val="center"/>
+            </w:pPr>
+            <w:r>
+              <w:rPr>
+                <w:b/>
+                <w:sz w:val="24"/>
+              </w:rPr>
+              <w:t>Доля</w:t>
+            </w:r>
+          </w:p>
+        </w:tc>
+      </w:tr>
+      <w:tr>
+        <w:trPr>
+          <w:cantSplit/>
+          <w:jc w:val="center"/>
+        </w:trPr>
+        <w:tc>
+          <w:tcPr>
+            <w:tcW w:w="5248" w:type="dxa"/>
+            <w:vAlign w:val="center"/>
+          </w:tcPr>
+          <w:p>
+            <w:pPr>
+              <w:pStyle w:val="Compact"/>
+              <w:spacing w:before="0" w:after="0" w:line="280" w:lineRule="exact"/>
+              <w:jc w:val="center"/>
+            </w:pPr>
+            <w:r>
+              <w:rPr>
+                <w:i/>
+                <w:sz w:val="24"/>
+              </w:rPr>
+              <w:t>Pro</w:t>
+            </w:r>
+            <w:r>
+              <w:rPr>
+                <w:sz w:val="24"/>
+              </w:rPr>
+              <w:t xml:space="preserve"> 19 </w:t>
+            </w:r>
+            <w:r>
+              <w:rPr>
+                <w:i/>
+                <w:sz w:val="24"/>
+              </w:rPr>
+              <w:t>EUR</w:t>
+            </w:r>
+          </w:p>
+        </w:tc>
+        <w:tc>
+          <w:tcPr>
+            <w:tcW w:w="2282" w:type="dxa"/>
+            <w:vAlign w:val="center"/>
+          </w:tcPr>
+          <w:p>
+            <w:pPr>
+              <w:pStyle w:val="Compact"/>
+              <w:spacing w:before="0" w:after="0" w:line="280" w:lineRule="exact"/>
+              <w:jc w:val="center"/>
+            </w:pPr>
+            <w:r>
+              <w:rPr>
+                <w:sz w:val="24"/>
+              </w:rPr>
+              <w:t>7</w:t>
+            </w:r>
+          </w:p>
+        </w:tc>
+        <w:tc>
+          <w:tcPr>
+            <w:tcW w:w="1825" w:type="dxa"/>
+            <w:vAlign w:val="center"/>
+          </w:tcPr>
+          <w:p>
+            <w:pPr>
+              <w:pStyle w:val="Compact"/>
+              <w:spacing w:before="0" w:after="0" w:line="280" w:lineRule="exact"/>
+              <w:jc w:val="center"/>
+            </w:pPr>
+            <w:r>
+              <w:rPr>
+                <w:sz w:val="24"/>
+              </w:rPr>
+              <w:t>23 %</w:t>
+            </w:r>
+          </w:p>
+        </w:tc>
+      </w:tr>
+      <w:tr>
+        <w:trPr>
+          <w:cantSplit/>
+          <w:jc w:val="center"/>
+        </w:trPr>
+        <w:tc>
+          <w:tcPr>
+            <w:tcW w:w="5248" w:type="dxa"/>
+            <w:vAlign w:val="center"/>
+          </w:tcPr>
+          <w:p>
+            <w:pPr>
+              <w:pStyle w:val="Compact"/>
+              <w:spacing w:before="0" w:after="0" w:line="280" w:lineRule="exact"/>
+              <w:jc w:val="center"/>
+            </w:pPr>
+            <w:r>
+              <w:rPr>
+                <w:sz w:val="24"/>
+              </w:rPr>
+              <w:t>разовый аудит 9 </w:t>
+            </w:r>
+            <w:r>
+              <w:rPr>
+                <w:i/>
+                <w:sz w:val="24"/>
+              </w:rPr>
+              <w:t>EUR</w:t>
+            </w:r>
+          </w:p>
+        </w:tc>
+        <w:tc>
+          <w:tcPr>
+            <w:tcW w:w="2282" w:type="dxa"/>
+            <w:vAlign w:val="center"/>
+          </w:tcPr>
+          <w:p>
+            <w:pPr>
+              <w:pStyle w:val="Compact"/>
+              <w:spacing w:before="0" w:after="0" w:line="280" w:lineRule="exact"/>
+              <w:jc w:val="center"/>
+            </w:pPr>
+            <w:r>
+              <w:rPr>
+                <w:sz w:val="24"/>
+              </w:rPr>
+              <w:t>11</w:t>
+            </w:r>
+          </w:p>
+        </w:tc>
+        <w:tc>
+          <w:tcPr>
+            <w:tcW w:w="1825" w:type="dxa"/>
+            <w:vAlign w:val="center"/>
+          </w:tcPr>
+          <w:p>
+            <w:pPr>
+              <w:pStyle w:val="Compact"/>
+              <w:spacing w:before="0" w:after="0" w:line="280" w:lineRule="exact"/>
+              <w:jc w:val="center"/>
+            </w:pPr>
+            <w:r>
+              <w:rPr>
+                <w:sz w:val="24"/>
+              </w:rPr>
+              <w:t>37 %</w:t>
+            </w:r>
+          </w:p>
+        </w:tc>
+      </w:tr>
+      <w:tr>
+        <w:trPr>
+          <w:cantSplit/>
+          <w:jc w:val="center"/>
+        </w:trPr>
+        <w:tc>
+          <w:tcPr>
+            <w:tcW w:w="5248" w:type="dxa"/>
+            <w:vAlign w:val="center"/>
+          </w:tcPr>
+          <w:p>
+            <w:pPr>
+              <w:pStyle w:val="Compact"/>
+              <w:spacing w:before="0" w:after="0" w:line="280" w:lineRule="exact"/>
+              <w:jc w:val="center"/>
+            </w:pPr>
+            <w:r>
+              <w:rPr>
+                <w:sz w:val="24"/>
+              </w:rPr>
+              <w:t>не купил бы</w:t>
+            </w:r>
+          </w:p>
+        </w:tc>
+        <w:tc>
+          <w:tcPr>
+            <w:tcW w:w="2282" w:type="dxa"/>
+            <w:vAlign w:val="center"/>
+          </w:tcPr>
+          <w:p>
+            <w:pPr>
+              <w:pStyle w:val="Compact"/>
+              <w:spacing w:before="0" w:after="0" w:line="280" w:lineRule="exact"/>
+              <w:jc w:val="center"/>
+            </w:pPr>
+            <w:r>
+              <w:rPr>
+                <w:sz w:val="24"/>
+              </w:rPr>
+              <w:t>5</w:t>
+            </w:r>
+          </w:p>
+        </w:tc>
+        <w:tc>
+          <w:tcPr>
+            <w:tcW w:w="1825" w:type="dxa"/>
+            <w:vAlign w:val="center"/>
+          </w:tcPr>
+          <w:p>
+            <w:pPr>
+              <w:pStyle w:val="Compact"/>
+              <w:spacing w:before="0" w:after="0" w:line="280" w:lineRule="exact"/>
+              <w:jc w:val="center"/>
+            </w:pPr>
+            <w:r>
+              <w:rPr>
+                <w:sz w:val="24"/>
+              </w:rPr>
+              <w:t>17 %</w:t>
+            </w:r>
+          </w:p>
+        </w:tc>
+      </w:tr>
+      <w:tr>
+        <w:trPr>
+          <w:cantSplit/>
+          <w:jc w:val="center"/>
+        </w:trPr>
+        <w:tc>
+          <w:tcPr>
+            <w:tcW w:w="5248" w:type="dxa"/>
+            <w:vAlign w:val="center"/>
+          </w:tcPr>
+          <w:p>
+            <w:pPr>
+              <w:pStyle w:val="Compact"/>
+              <w:spacing w:before="0" w:after="0" w:line="280" w:lineRule="exact"/>
+              <w:jc w:val="center"/>
+            </w:pPr>
+            <w:r>
+              <w:rPr>
+                <w:i/>
+                <w:sz w:val="24"/>
+              </w:rPr>
+              <w:t>Team</w:t>
+            </w:r>
+            <w:r>
+              <w:rPr>
+                <w:sz w:val="24"/>
+              </w:rPr>
+              <w:t xml:space="preserve"> 29 </w:t>
+            </w:r>
+            <w:r>
+              <w:rPr>
+                <w:i/>
+                <w:sz w:val="24"/>
+              </w:rPr>
+              <w:t>EUR</w:t>
+            </w:r>
+          </w:p>
+        </w:tc>
+        <w:tc>
+          <w:tcPr>
+            <w:tcW w:w="2282" w:type="dxa"/>
+            <w:vAlign w:val="center"/>
+          </w:tcPr>
+          <w:p>
+            <w:pPr>
+              <w:pStyle w:val="Compact"/>
+              <w:spacing w:before="0" w:after="0" w:line="280" w:lineRule="exact"/>
+              <w:jc w:val="center"/>
+            </w:pPr>
+            <w:r>
+              <w:rPr>
+                <w:sz w:val="24"/>
+              </w:rPr>
+              <w:t>7</w:t>
+            </w:r>
+          </w:p>
+        </w:tc>
+        <w:tc>
+          <w:tcPr>
+            <w:tcW w:w="1825" w:type="dxa"/>
+            <w:vAlign w:val="center"/>
+          </w:tcPr>
+          <w:p>
+            <w:pPr>
+              <w:pStyle w:val="Compact"/>
+              <w:spacing w:before="0" w:after="0" w:line="280" w:lineRule="exact"/>
+              <w:jc w:val="center"/>
+            </w:pPr>
+            <w:r>
+              <w:rPr>
+                <w:sz w:val="24"/>
+              </w:rPr>
+              <w:t>23 %</w:t>
+            </w:r>
+          </w:p>
+        </w:tc>
+      </w:tr>
+    </w:tbl>
+    <w:p>
+      <w:pPr>
+        <w:pStyle w:val="FirstParagraph"/>
+        <w:spacing w:before="0" w:after="0" w:line="360" w:lineRule="exact"/>
+        <w:ind w:firstLine="709"/>
+        <w:jc w:val="both"/>
+      </w:pPr>
+      <w:r>
+        <w:rPr>
+          <w:sz w:val="28"/>
+        </w:rPr>
+        <w:lastRenderedPageBreak/>
+        <w:t xml:space="preserve">Из 30 условных респондентов 25 выбирают платный вариант, но модельная доля нужна лишь как проверка механики: фактическую структуру платящих (допущение Д-09) придется подтверждать данными </w:t>
+      </w:r>
+      <w:r>
+        <w:rPr>
+          <w:i/>
+          <w:sz w:val="28"/>
+        </w:rPr>
+        <w:t>MVP</w:t>
+      </w:r>
+      <w:r>
+        <w:rPr>
+          <w:sz w:val="28"/>
+        </w:rPr>
+        <w:t>.</w:t>
+      </w:r>
+    </w:p>
+    <w:p>
+      <w:pPr>
+        <w:pStyle w:val="a0"/>
+        <w:spacing w:before="0" w:after="0" w:line="360" w:lineRule="exact"/>
+        <w:ind w:firstLine="709"/>
+        <w:jc w:val="both"/>
+      </w:pPr>
+      <w:r>
+        <w:rPr>
+          <w:sz w:val="28"/>
+        </w:rPr>
+        <w:t>Ограничение: параметры генератора (медианы допустимых цен по сегментам, разброс, доля критичных ошибок) заданы аналитиком на основе ценового коридора книги 3 и не получены от людей. Реальный опрос 20-30 респондентов остается желательным и заменяет эти данн</w:t>
+      </w:r>
+      <w:r>
+        <w:rPr>
+          <w:sz w:val="28"/>
+        </w:rPr>
+        <w:t>ые без изменения структуры расчета.</w:t>
+      </w:r>
+    </w:p>
+    <w:bookmarkEnd w:id="42"/>
     <w:sectPr>
       <w:headerReference w:type="default" r:id="rId13"/>
       <w:footerReference w:type="default" r:id="rId14"/>
@@ -28878,7 +30276,7 @@
   <w:abstractNum w:abstractNumId="0" w15:restartNumberingAfterBreak="0">
     <w:nsid w:val="0000A990"/>
     <w:multiLevelType w:val="multilevel"/>
-    <w:tmpl w:val="E9B674E2"/>
+    <w:tmpl w:val="5CAEF1E4"/>
     <w:lvl w:ilvl="0">
       <w:numFmt w:val="bullet"/>
       <w:lvlText w:val=" "/>
@@ -28955,7 +30353,7 @@
   <w:abstractNum w:abstractNumId="1" w15:restartNumberingAfterBreak="0">
     <w:nsid w:val="00A99411"/>
     <w:multiLevelType w:val="multilevel"/>
-    <w:tmpl w:val="702001F8"/>
+    <w:tmpl w:val="4F667950"/>
     <w:lvl w:ilvl="0">
       <w:start w:val="1"/>
       <w:numFmt w:val="decimal"/>
@@ -30433,7 +31831,7 @@
     <w:autoRedefine/>
     <w:uiPriority w:val="39"/>
     <w:unhideWhenUsed/>
-    <w:rsid w:val="00BB24CB"/>
+    <w:rsid w:val="006D36A8"/>
     <w:pPr>
       <w:spacing w:after="100"/>
     </w:pPr>
@@ -30445,7 +31843,7 @@
     <w:autoRedefine/>
     <w:uiPriority w:val="39"/>
     <w:unhideWhenUsed/>
-    <w:rsid w:val="00BB24CB"/>
+    <w:rsid w:val="006D36A8"/>
     <w:pPr>
       <w:spacing w:after="100"/>
       <w:ind w:left="240"/>

</xml_diff>

<commit_message>
lab2-3/lab5: open data supplement (AppSource fee, Eurostat, competitor price estimates), handoff update, docs rebuilt
</commit_message>
<xml_diff>
--- a/ЛР2-3_Объем_рынка/ОТЧЕТ_ЛР2-3_TableMind.docx
+++ b/ЛР2-3_Объем_рынка/ОТЧЕТ_ЛР2-3_TableMind.docx
@@ -245,7 +245,7 @@
       <w:r>
         <w:fldChar w:fldCharType="separate"/>
       </w:r>
-      <w:hyperlink w:anchor="_Toc241934590" w:history="1">
+      <w:hyperlink w:anchor="_Toc241934869" w:history="1">
         <w:r>
           <w:rPr>
             <w:rStyle w:val="af"/>
@@ -273,7 +273,7 @@
             <w:noProof/>
             <w:webHidden/>
           </w:rPr>
-          <w:instrText xml:space="preserve"> PAGEREF _Toc241934590 \h </w:instrText>
+          <w:instrText xml:space="preserve"> PAGEREF _Toc241934869 \h </w:instrText>
         </w:r>
         <w:r>
           <w:rPr>
@@ -314,7 +314,7 @@
           <w:noProof/>
         </w:rPr>
       </w:pPr>
-      <w:hyperlink w:anchor="_Toc241934591" w:history="1">
+      <w:hyperlink w:anchor="_Toc241934870" w:history="1">
         <w:r>
           <w:rPr>
             <w:rStyle w:val="af"/>
@@ -342,7 +342,7 @@
             <w:noProof/>
             <w:webHidden/>
           </w:rPr>
-          <w:instrText xml:space="preserve"> PAGEREF _Toc241934591 \h </w:instrText>
+          <w:instrText xml:space="preserve"> PAGEREF _Toc241934870 \h </w:instrText>
         </w:r>
         <w:r>
           <w:rPr>
@@ -383,7 +383,7 @@
           <w:noProof/>
         </w:rPr>
       </w:pPr>
-      <w:hyperlink w:anchor="_Toc241934592" w:history="1">
+      <w:hyperlink w:anchor="_Toc241934871" w:history="1">
         <w:r>
           <w:rPr>
             <w:rStyle w:val="af"/>
@@ -411,7 +411,7 @@
             <w:noProof/>
             <w:webHidden/>
           </w:rPr>
-          <w:instrText xml:space="preserve"> PAGEREF _Toc241934592 \h </w:instrText>
+          <w:instrText xml:space="preserve"> PAGEREF _Toc241934871 \h </w:instrText>
         </w:r>
         <w:r>
           <w:rPr>
@@ -452,7 +452,7 @@
           <w:noProof/>
         </w:rPr>
       </w:pPr>
-      <w:hyperlink w:anchor="_Toc241934593" w:history="1">
+      <w:hyperlink w:anchor="_Toc241934872" w:history="1">
         <w:r>
           <w:rPr>
             <w:rStyle w:val="af"/>
@@ -489,7 +489,7 @@
             <w:noProof/>
             <w:webHidden/>
           </w:rPr>
-          <w:instrText xml:space="preserve"> PAGEREF _Toc241934593 \h </w:instrText>
+          <w:instrText xml:space="preserve"> PAGEREF _Toc241934872 \h </w:instrText>
         </w:r>
         <w:r>
           <w:rPr>
@@ -530,7 +530,7 @@
           <w:noProof/>
         </w:rPr>
       </w:pPr>
-      <w:hyperlink w:anchor="_Toc241934594" w:history="1">
+      <w:hyperlink w:anchor="_Toc241934873" w:history="1">
         <w:r>
           <w:rPr>
             <w:rStyle w:val="af"/>
@@ -567,7 +567,7 @@
             <w:noProof/>
             <w:webHidden/>
           </w:rPr>
-          <w:instrText xml:space="preserve"> PAGEREF _Toc241934594 \h </w:instrText>
+          <w:instrText xml:space="preserve"> PAGEREF _Toc241934873 \h </w:instrText>
         </w:r>
         <w:r>
           <w:rPr>
@@ -608,7 +608,7 @@
           <w:noProof/>
         </w:rPr>
       </w:pPr>
-      <w:hyperlink w:anchor="_Toc241934595" w:history="1">
+      <w:hyperlink w:anchor="_Toc241934874" w:history="1">
         <w:r>
           <w:rPr>
             <w:rStyle w:val="af"/>
@@ -645,7 +645,7 @@
             <w:noProof/>
             <w:webHidden/>
           </w:rPr>
-          <w:instrText xml:space="preserve"> PAGEREF _Toc241934595 \h </w:instrText>
+          <w:instrText xml:space="preserve"> PAGEREF _Toc241934874 \h </w:instrText>
         </w:r>
         <w:r>
           <w:rPr>
@@ -686,7 +686,7 @@
           <w:noProof/>
         </w:rPr>
       </w:pPr>
-      <w:hyperlink w:anchor="_Toc241934596" w:history="1">
+      <w:hyperlink w:anchor="_Toc241934875" w:history="1">
         <w:r>
           <w:rPr>
             <w:rStyle w:val="af"/>
@@ -714,7 +714,7 @@
             <w:noProof/>
             <w:webHidden/>
           </w:rPr>
-          <w:instrText xml:space="preserve"> PAGEREF _Toc241934596 \h </w:instrText>
+          <w:instrText xml:space="preserve"> PAGEREF _Toc241934875 \h </w:instrText>
         </w:r>
         <w:r>
           <w:rPr>
@@ -755,7 +755,7 @@
           <w:noProof/>
         </w:rPr>
       </w:pPr>
-      <w:hyperlink w:anchor="_Toc241934597" w:history="1">
+      <w:hyperlink w:anchor="_Toc241934876" w:history="1">
         <w:r>
           <w:rPr>
             <w:rStyle w:val="af"/>
@@ -783,7 +783,7 @@
             <w:noProof/>
             <w:webHidden/>
           </w:rPr>
-          <w:instrText xml:space="preserve"> PAGEREF _Toc241934597 \h </w:instrText>
+          <w:instrText xml:space="preserve"> PAGEREF _Toc241934876 \h </w:instrText>
         </w:r>
         <w:r>
           <w:rPr>
@@ -824,7 +824,7 @@
           <w:noProof/>
         </w:rPr>
       </w:pPr>
-      <w:hyperlink w:anchor="_Toc241934598" w:history="1">
+      <w:hyperlink w:anchor="_Toc241934877" w:history="1">
         <w:r>
           <w:rPr>
             <w:rStyle w:val="af"/>
@@ -861,7 +861,7 @@
             <w:noProof/>
             <w:webHidden/>
           </w:rPr>
-          <w:instrText xml:space="preserve"> PAGEREF _Toc241934598 \h </w:instrText>
+          <w:instrText xml:space="preserve"> PAGEREF _Toc241934877 \h </w:instrText>
         </w:r>
         <w:r>
           <w:rPr>
@@ -902,7 +902,7 @@
           <w:noProof/>
         </w:rPr>
       </w:pPr>
-      <w:hyperlink w:anchor="_Toc241934599" w:history="1">
+      <w:hyperlink w:anchor="_Toc241934878" w:history="1">
         <w:r>
           <w:rPr>
             <w:rStyle w:val="af"/>
@@ -930,7 +930,7 @@
             <w:noProof/>
             <w:webHidden/>
           </w:rPr>
-          <w:instrText xml:space="preserve"> PAGEREF _Toc241934599 \h </w:instrText>
+          <w:instrText xml:space="preserve"> PAGEREF _Toc241934878 \h </w:instrText>
         </w:r>
         <w:r>
           <w:rPr>
@@ -971,7 +971,7 @@
           <w:noProof/>
         </w:rPr>
       </w:pPr>
-      <w:hyperlink w:anchor="_Toc241934600" w:history="1">
+      <w:hyperlink w:anchor="_Toc241934879" w:history="1">
         <w:r>
           <w:rPr>
             <w:rStyle w:val="af"/>
@@ -999,7 +999,7 @@
             <w:noProof/>
             <w:webHidden/>
           </w:rPr>
-          <w:instrText xml:space="preserve"> PAGEREF _Toc241934600 \h </w:instrText>
+          <w:instrText xml:space="preserve"> PAGEREF _Toc241934879 \h </w:instrText>
         </w:r>
         <w:r>
           <w:rPr>
@@ -1040,7 +1040,7 @@
           <w:noProof/>
         </w:rPr>
       </w:pPr>
-      <w:hyperlink w:anchor="_Toc241934601" w:history="1">
+      <w:hyperlink w:anchor="_Toc241934880" w:history="1">
         <w:r>
           <w:rPr>
             <w:rStyle w:val="af"/>
@@ -1068,7 +1068,7 @@
             <w:noProof/>
             <w:webHidden/>
           </w:rPr>
-          <w:instrText xml:space="preserve"> PAGEREF _Toc241934601 \h </w:instrText>
+          <w:instrText xml:space="preserve"> PAGEREF _Toc241934880 \h </w:instrText>
         </w:r>
         <w:r>
           <w:rPr>
@@ -1109,7 +1109,7 @@
           <w:noProof/>
         </w:rPr>
       </w:pPr>
-      <w:hyperlink w:anchor="_Toc241934602" w:history="1">
+      <w:hyperlink w:anchor="_Toc241934881" w:history="1">
         <w:r>
           <w:rPr>
             <w:rStyle w:val="af"/>
@@ -1137,7 +1137,7 @@
             <w:noProof/>
             <w:webHidden/>
           </w:rPr>
-          <w:instrText xml:space="preserve"> PAGEREF _Toc241934602 \h </w:instrText>
+          <w:instrText xml:space="preserve"> PAGEREF _Toc241934881 \h </w:instrText>
         </w:r>
         <w:r>
           <w:rPr>
@@ -1178,7 +1178,7 @@
           <w:noProof/>
         </w:rPr>
       </w:pPr>
-      <w:hyperlink w:anchor="_Toc241934603" w:history="1">
+      <w:hyperlink w:anchor="_Toc241934882" w:history="1">
         <w:r>
           <w:rPr>
             <w:rStyle w:val="af"/>
@@ -1206,7 +1206,7 @@
             <w:noProof/>
             <w:webHidden/>
           </w:rPr>
-          <w:instrText xml:space="preserve"> PAGEREF _Toc241934603 \h </w:instrText>
+          <w:instrText xml:space="preserve"> PAGEREF _Toc241934882 \h </w:instrText>
         </w:r>
         <w:r>
           <w:rPr>
@@ -1247,7 +1247,7 @@
           <w:noProof/>
         </w:rPr>
       </w:pPr>
-      <w:hyperlink w:anchor="_Toc241934604" w:history="1">
+      <w:hyperlink w:anchor="_Toc241934883" w:history="1">
         <w:r>
           <w:rPr>
             <w:rStyle w:val="af"/>
@@ -1275,7 +1275,7 @@
             <w:noProof/>
             <w:webHidden/>
           </w:rPr>
-          <w:instrText xml:space="preserve"> PAGEREF _Toc241934604 \h </w:instrText>
+          <w:instrText xml:space="preserve"> PAGEREF _Toc241934883 \h </w:instrText>
         </w:r>
         <w:r>
           <w:rPr>
@@ -1316,7 +1316,7 @@
           <w:noProof/>
         </w:rPr>
       </w:pPr>
-      <w:hyperlink w:anchor="_Toc241934605" w:history="1">
+      <w:hyperlink w:anchor="_Toc241934884" w:history="1">
         <w:r>
           <w:rPr>
             <w:rStyle w:val="af"/>
@@ -1344,7 +1344,7 @@
             <w:noProof/>
             <w:webHidden/>
           </w:rPr>
-          <w:instrText xml:space="preserve"> PAGEREF _Toc241934605 \h </w:instrText>
+          <w:instrText xml:space="preserve"> PAGEREF _Toc241934884 \h </w:instrText>
         </w:r>
         <w:r>
           <w:rPr>
@@ -1385,7 +1385,7 @@
           <w:noProof/>
         </w:rPr>
       </w:pPr>
-      <w:hyperlink w:anchor="_Toc241934606" w:history="1">
+      <w:hyperlink w:anchor="_Toc241934885" w:history="1">
         <w:r>
           <w:rPr>
             <w:rStyle w:val="af"/>
@@ -1413,7 +1413,7 @@
             <w:noProof/>
             <w:webHidden/>
           </w:rPr>
-          <w:instrText xml:space="preserve"> PAGEREF _Toc241934606 \h </w:instrText>
+          <w:instrText xml:space="preserve"> PAGEREF _Toc241934885 \h </w:instrText>
         </w:r>
         <w:r>
           <w:rPr>
@@ -1454,7 +1454,7 @@
           <w:noProof/>
         </w:rPr>
       </w:pPr>
-      <w:hyperlink w:anchor="_Toc241934607" w:history="1">
+      <w:hyperlink w:anchor="_Toc241934886" w:history="1">
         <w:r>
           <w:rPr>
             <w:rStyle w:val="af"/>
@@ -1482,7 +1482,7 @@
             <w:noProof/>
             <w:webHidden/>
           </w:rPr>
-          <w:instrText xml:space="preserve"> PAGEREF _Toc241934607 \h </w:instrText>
+          <w:instrText xml:space="preserve"> PAGEREF _Toc241934886 \h </w:instrText>
         </w:r>
         <w:r>
           <w:rPr>
@@ -1523,7 +1523,7 @@
           <w:noProof/>
         </w:rPr>
       </w:pPr>
-      <w:hyperlink w:anchor="_Toc241934608" w:history="1">
+      <w:hyperlink w:anchor="_Toc241934887" w:history="1">
         <w:r>
           <w:rPr>
             <w:rStyle w:val="af"/>
@@ -1551,7 +1551,7 @@
             <w:noProof/>
             <w:webHidden/>
           </w:rPr>
-          <w:instrText xml:space="preserve"> PAGEREF _Toc241934608 \h </w:instrText>
+          <w:instrText xml:space="preserve"> PAGEREF _Toc241934887 \h </w:instrText>
         </w:r>
         <w:r>
           <w:rPr>
@@ -1592,7 +1592,7 @@
           <w:noProof/>
         </w:rPr>
       </w:pPr>
-      <w:hyperlink w:anchor="_Toc241934609" w:history="1">
+      <w:hyperlink w:anchor="_Toc241934888" w:history="1">
         <w:r>
           <w:rPr>
             <w:rStyle w:val="af"/>
@@ -1620,7 +1620,7 @@
             <w:noProof/>
             <w:webHidden/>
           </w:rPr>
-          <w:instrText xml:space="preserve"> PAGEREF _Toc241934609 \h </w:instrText>
+          <w:instrText xml:space="preserve"> PAGEREF _Toc241934888 \h </w:instrText>
         </w:r>
         <w:r>
           <w:rPr>
@@ -1661,7 +1661,7 @@
           <w:noProof/>
         </w:rPr>
       </w:pPr>
-      <w:hyperlink w:anchor="_Toc241934610" w:history="1">
+      <w:hyperlink w:anchor="_Toc241934889" w:history="1">
         <w:r>
           <w:rPr>
             <w:rStyle w:val="af"/>
@@ -1689,7 +1689,7 @@
             <w:noProof/>
             <w:webHidden/>
           </w:rPr>
-          <w:instrText xml:space="preserve"> PAGEREF _Toc241934610 \h </w:instrText>
+          <w:instrText xml:space="preserve"> PAGEREF _Toc241934889 \h </w:instrText>
         </w:r>
         <w:r>
           <w:rPr>
@@ -1730,7 +1730,7 @@
           <w:noProof/>
         </w:rPr>
       </w:pPr>
-      <w:hyperlink w:anchor="_Toc241934611" w:history="1">
+      <w:hyperlink w:anchor="_Toc241934890" w:history="1">
         <w:r>
           <w:rPr>
             <w:rStyle w:val="af"/>
@@ -1758,7 +1758,7 @@
             <w:noProof/>
             <w:webHidden/>
           </w:rPr>
-          <w:instrText xml:space="preserve"> PAGEREF _Toc241934611 \h </w:instrText>
+          <w:instrText xml:space="preserve"> PAGEREF _Toc241934890 \h </w:instrText>
         </w:r>
         <w:r>
           <w:rPr>
@@ -1791,6 +1791,75 @@
     </w:p>
     <w:p>
       <w:pPr>
+        <w:pStyle w:val="12"/>
+        <w:tabs>
+          <w:tab w:val="right" w:leader="dot" w:pos="9345"/>
+        </w:tabs>
+        <w:rPr>
+          <w:noProof/>
+        </w:rPr>
+      </w:pPr>
+      <w:hyperlink w:anchor="_Toc241934891" w:history="1">
+        <w:r>
+          <w:rPr>
+            <w:rStyle w:val="af"/>
+            <w:b/>
+            <w:noProof/>
+          </w:rPr>
+          <w:t>ПРИЛОЖЕНИЕ Д</w:t>
+        </w:r>
+        <w:r>
+          <w:rPr>
+            <w:noProof/>
+            <w:webHidden/>
+          </w:rPr>
+          <w:tab/>
+        </w:r>
+        <w:r>
+          <w:rPr>
+            <w:noProof/>
+            <w:webHidden/>
+          </w:rPr>
+          <w:fldChar w:fldCharType="begin"/>
+        </w:r>
+        <w:r>
+          <w:rPr>
+            <w:noProof/>
+            <w:webHidden/>
+          </w:rPr>
+          <w:instrText xml:space="preserve"> PAGEREF _Toc241934891 \h </w:instrText>
+        </w:r>
+        <w:r>
+          <w:rPr>
+            <w:noProof/>
+            <w:webHidden/>
+          </w:rPr>
+        </w:r>
+        <w:r>
+          <w:rPr>
+            <w:noProof/>
+            <w:webHidden/>
+          </w:rPr>
+          <w:fldChar w:fldCharType="separate"/>
+        </w:r>
+        <w:r>
+          <w:rPr>
+            <w:noProof/>
+            <w:webHidden/>
+          </w:rPr>
+          <w:t>34</w:t>
+        </w:r>
+        <w:r>
+          <w:rPr>
+            <w:noProof/>
+            <w:webHidden/>
+          </w:rPr>
+          <w:fldChar w:fldCharType="end"/>
+        </w:r>
+      </w:hyperlink>
+    </w:p>
+    <w:p>
+      <w:pPr>
         <w:pStyle w:val="11"/>
       </w:pPr>
       <w:r>
@@ -1804,7 +1873,7 @@
         <w:spacing w:before="0" w:after="360" w:line="360" w:lineRule="exact"/>
         <w:ind w:firstLine="709"/>
       </w:pPr>
-      <w:bookmarkStart w:id="1" w:name="_Toc241934590"/>
+      <w:bookmarkStart w:id="1" w:name="_Toc241934869"/>
       <w:r>
         <w:rPr>
           <w:b/>
@@ -1904,13 +1973,13 @@
         <w:rPr>
           <w:sz w:val="28"/>
         </w:rPr>
-        <w:t>). Работа продолжает ЛР</w:t>
-      </w:r>
-      <w:r>
-        <w:rPr>
-          <w:sz w:val="28"/>
-        </w:rPr>
-        <w:t>1, где зафиксированы границы рынка и подтвержден частичный поисковый интерес [1].</w:t>
+        <w:t>).</w:t>
+      </w:r>
+      <w:r>
+        <w:rPr>
+          <w:sz w:val="28"/>
+        </w:rPr>
+        <w:t xml:space="preserve"> Работа продолжает ЛР1, где зафиксированы границы рынка и подтвержден частичный поисковый интерес [1].</w:t>
       </w:r>
     </w:p>
     <w:p>
@@ -1950,13 +2019,13 @@
         <w:rPr>
           <w:sz w:val="28"/>
         </w:rPr>
-        <w:t>-книг по методикам ин</w:t>
-      </w:r>
-      <w:r>
-        <w:rPr>
-          <w:sz w:val="28"/>
-        </w:rPr>
-        <w:t xml:space="preserve">струкции [2] (потенциальные клиенты, сверху вниз и снизу вверх, платежеспособность, цифровая воронка по тарифам, сценарная оценка </w:t>
+        <w:t>-книг по методикам инструкции [2] (потенциальные клиенты, сверху вниз и снизу вверх, платежеспособность</w:t>
+      </w:r>
+      <w:r>
+        <w:rPr>
+          <w:sz w:val="28"/>
+        </w:rPr>
+        <w:t xml:space="preserve">, цифровая воронка по тарифам, сценарная оценка </w:t>
       </w:r>
       <w:r>
         <w:rPr>
@@ -2008,13 +2077,13 @@
         <w:rPr>
           <w:sz w:val="28"/>
         </w:rPr>
-        <w:t>; результаты сведе</w:t>
-      </w:r>
-      <w:r>
-        <w:rPr>
-          <w:sz w:val="28"/>
-        </w:rPr>
-        <w:t>ны по правилам согласования; итог сопоставлен с целями проекта; выполнена проверка чувствительности.</w:t>
+        <w:t>; результаты сведены по правилам согласования; итог сопоставлен с целями проекта; выполнена проверка</w:t>
+      </w:r>
+      <w:r>
+        <w:rPr>
+          <w:sz w:val="28"/>
+        </w:rPr>
+        <w:t xml:space="preserve"> чувствительности.</w:t>
       </w:r>
     </w:p>
     <w:p>
@@ -2093,7 +2162,13 @@
         <w:rPr>
           <w:sz w:val="28"/>
         </w:rPr>
-        <w:t xml:space="preserve"> [3]. Исходные факты проекта (тарифы, сроки, цели, бюджет) взяты из ПЗ1 и ПЗ4 [4]. Данные опроса респондентов не использовались: платежеспособность оценена по открытым ценам и модельным допущениям, которые так названы в тексте.</w:t>
+        <w:t xml:space="preserve"> [3]. Исходные факты проекта (тарифы, сроки, цели, бюджет) взяты из ПЗ1 и ПЗ4 [4]. Данные опроса респонде</w:t>
+      </w:r>
+      <w:r>
+        <w:rPr>
+          <w:sz w:val="28"/>
+        </w:rPr>
+        <w:t>нтов не использовались: платежеспособность оценена по открытым ценам и модельным допущениям, которые так названы в тексте.</w:t>
       </w:r>
     </w:p>
     <w:p>
@@ -2104,7 +2179,7 @@
         <w:ind w:firstLine="709"/>
       </w:pPr>
       <w:bookmarkStart w:id="2" w:name="_b608aa976fc82a0faaf3b83f58c735968afd03b"/>
-      <w:bookmarkStart w:id="3" w:name="_Toc241934591"/>
+      <w:bookmarkStart w:id="3" w:name="_Toc241934870"/>
       <w:bookmarkEnd w:id="0"/>
       <w:r>
         <w:rPr>
@@ -2127,13 +2202,7 @@
         <w:rPr>
           <w:sz w:val="28"/>
         </w:rPr>
-        <w:t>Работа выполнен</w:t>
-      </w:r>
-      <w:r>
-        <w:rPr>
-          <w:sz w:val="28"/>
-        </w:rPr>
-        <w:t>а в порядке, заданном инструкцией [2]: границы рынка, цифровые следы конкурентов (</w:t>
+        <w:t>Работа выполнена в порядке, заданном инструкцией [2]: границы рынка, цифровые следы конкурентов (</w:t>
       </w:r>
       <w:r>
         <w:rPr>
@@ -2146,7 +2215,13 @@
         <w:rPr>
           <w:sz w:val="28"/>
         </w:rPr>
-        <w:t xml:space="preserve">), расчетные методики, проверочные методики (сценарии и платежеспособность), сводная оценка. Каждая методика реализована в отдельной книге </w:t>
+        <w:t xml:space="preserve">), расчетные </w:t>
+      </w:r>
+      <w:r>
+        <w:rPr>
+          <w:sz w:val="28"/>
+        </w:rPr>
+        <w:t xml:space="preserve">методики, проверочные методики (сценарии и платежеспособность), сводная оценка. Каждая методика реализована в отдельной книге </w:t>
       </w:r>
       <w:r>
         <w:rPr>
@@ -2159,13 +2234,7 @@
         <w:rPr>
           <w:sz w:val="28"/>
         </w:rPr>
-        <w:t>, а ее результат нез</w:t>
-      </w:r>
-      <w:r>
-        <w:rPr>
-          <w:sz w:val="28"/>
-        </w:rPr>
-        <w:t xml:space="preserve">ависимо пересчитан скриптом на </w:t>
+        <w:t xml:space="preserve">, а ее результат независимо пересчитан скриптом на </w:t>
       </w:r>
       <w:r>
         <w:rPr>
@@ -2188,7 +2257,7 @@
         <w:ind w:firstLine="709"/>
       </w:pPr>
       <w:bookmarkStart w:id="4" w:name="_6ea6bf0a5ec92c733c53e44899cf0806bdc5e39"/>
-      <w:bookmarkStart w:id="5" w:name="_Toc241934592"/>
+      <w:bookmarkStart w:id="5" w:name="_Toc241934871"/>
       <w:r>
         <w:rPr>
           <w:b/>
@@ -2209,7 +2278,13 @@
         <w:rPr>
           <w:sz w:val="28"/>
         </w:rPr>
-        <w:t xml:space="preserve">Границы рынка перенесены из ЛР1 без изменений: односторонний цифровой рынок, продукт - онлайн-проверка </w:t>
+        <w:t>Границы рынка перенес</w:t>
+      </w:r>
+      <w:r>
+        <w:rPr>
+          <w:sz w:val="28"/>
+        </w:rPr>
+        <w:t xml:space="preserve">ены из ЛР1 без изменений: односторонний цифровой рынок, продукт - онлайн-проверка </w:t>
       </w:r>
       <w:r>
         <w:rPr>
@@ -2222,13 +2297,13 @@
         <w:rPr>
           <w:sz w:val="28"/>
         </w:rPr>
-        <w:t>-моделей и финансовых таблиц (веб-аудит и надстройка), территори</w:t>
-      </w:r>
-      <w:r>
-        <w:rPr>
-          <w:sz w:val="28"/>
-        </w:rPr>
-        <w:t xml:space="preserve">я - англоязычные страны (США, Великобритания, Канада, Австралия, Ирландия) и ЕС-27, контрольная территория - Беларусь и русскоязычный сегмент. Из рынка исключены обучающие курсы по </w:t>
+        <w:t>-моделей и финансовых таблиц (веб-аудит и надстройка), территория - англоязычные страны (США, Великобритания, Канада, Австралия, Ирландия) и ЕС-27, контрольная территори</w:t>
+      </w:r>
+      <w:r>
+        <w:rPr>
+          <w:sz w:val="28"/>
+        </w:rPr>
+        <w:t xml:space="preserve">я - Беларусь и русскоязычный сегмент. Из рынка исключены обучающие курсы по </w:t>
       </w:r>
       <w:r>
         <w:rPr>
@@ -2254,13 +2329,7 @@
         <w:rPr>
           <w:sz w:val="28"/>
         </w:rPr>
-        <w:t>-ассистенты без функции проверки как отдельные прод</w:t>
-      </w:r>
-      <w:r>
-        <w:rPr>
-          <w:sz w:val="28"/>
-        </w:rPr>
-        <w:t>укты; они учитываются как заменители.</w:t>
+        <w:t>-ассистенты без функции проверки как отдельные продукты; они учитываются как заменители.</w:t>
       </w:r>
     </w:p>
     <w:p>
@@ -2287,7 +2356,13 @@
         <w:rPr>
           <w:sz w:val="28"/>
         </w:rPr>
-        <w:t>Таблица 1 – Состав расчетных книг и методик ЛР2-3</w:t>
+        <w:t>Та</w:t>
+      </w:r>
+      <w:r>
+        <w:rPr>
+          <w:sz w:val="28"/>
+        </w:rPr>
+        <w:t>блица 1 – Состав расчетных книг и методик ЛР2-3</w:t>
       </w:r>
     </w:p>
     <w:tbl>
@@ -2765,7 +2840,13 @@
               <w:rPr>
                 <w:sz w:val="24"/>
               </w:rPr>
-              <w:t>Цифровая воронка по тарифам</w:t>
+              <w:t>Цифровая воронка по тари</w:t>
+            </w:r>
+            <w:r>
+              <w:rPr>
+                <w:sz w:val="24"/>
+              </w:rPr>
+              <w:t>фам</w:t>
             </w:r>
           </w:p>
         </w:tc>
@@ -3065,13 +3146,7 @@
               <w:rPr>
                 <w:sz w:val="24"/>
               </w:rPr>
-              <w:t>Контрольный русскоязычный сегмент по Вордста</w:t>
-            </w:r>
-            <w:r>
-              <w:rPr>
-                <w:sz w:val="24"/>
-              </w:rPr>
-              <w:t>ту</w:t>
+              <w:t>Контрольный русскоязычный сегмент по Вордстату</w:t>
             </w:r>
           </w:p>
         </w:tc>
@@ -3101,20 +3176,20 @@
         <w:rPr>
           <w:sz w:val="28"/>
         </w:rPr>
-        <w:t xml:space="preserve">, формулы шаблонов сохранены; изменения шаблонов описаны в приложении В. Первые пять </w:t>
+        <w:t>, фо</w:t>
+      </w:r>
+      <w:r>
+        <w:rPr>
+          <w:sz w:val="28"/>
+        </w:rPr>
+        <w:t xml:space="preserve">рмулы шаблонов сохранены; изменения шаблонов описаны в приложении В. Первые пять </w:t>
       </w:r>
       <w:r>
         <w:rPr>
           <w:sz w:val="28"/>
         </w:rPr>
         <w:lastRenderedPageBreak/>
-        <w:t xml:space="preserve">методик дают оценку для основной территории, седьмая служит </w:t>
-      </w:r>
-      <w:r>
-        <w:rPr>
-          <w:sz w:val="28"/>
-        </w:rPr>
-        <w:t>контролем на русскоязычном сегменте.</w:t>
+        <w:t>методик дают оценку для основной территории, седьмая служит контролем на русскоязычном сегменте.</w:t>
       </w:r>
     </w:p>
     <w:p>
@@ -3138,7 +3213,7 @@
         <w:ind w:firstLine="709"/>
       </w:pPr>
       <w:bookmarkStart w:id="6" w:name="_7a0c967539b5ef143597c37b0951dae8b296890"/>
-      <w:bookmarkStart w:id="7" w:name="_Toc241934593"/>
+      <w:bookmarkStart w:id="7" w:name="_Toc241934872"/>
       <w:bookmarkEnd w:id="4"/>
       <w:r>
         <w:rPr>
@@ -5571,7 +5646,7 @@
           <w:sz w:val="28"/>
         </w:rPr>
         <w:drawing>
-          <wp:inline distT="0" distB="0" distL="0" distR="0" wp14:anchorId="627EFE3C" wp14:editId="3CEC2474">
+          <wp:inline distT="0" distB="0" distL="0" distR="0" wp14:anchorId="183C7C9D" wp14:editId="63854CA7">
             <wp:extent cx="5334000" cy="3122341"/>
             <wp:effectExtent l="0" t="0" r="0" b="0"/>
             <wp:docPr id="12" name="Picture"/>
@@ -6382,7 +6457,7 @@
           <w:sz w:val="28"/>
         </w:rPr>
         <w:drawing>
-          <wp:inline distT="0" distB="0" distL="0" distR="0" wp14:anchorId="4A3F5C1E" wp14:editId="7BBDCCE7">
+          <wp:inline distT="0" distB="0" distL="0" distR="0" wp14:anchorId="0BDA96A9" wp14:editId="5BD28BC3">
             <wp:extent cx="5334000" cy="3252439"/>
             <wp:effectExtent l="0" t="0" r="0" b="0"/>
             <wp:docPr id="15" name="Picture"/>
@@ -6543,7 +6618,7 @@
         <w:ind w:firstLine="709"/>
       </w:pPr>
       <w:bookmarkStart w:id="8" w:name="_da959056159f19dff160d665d57702b18af1ddd"/>
-      <w:bookmarkStart w:id="9" w:name="_Toc241934594"/>
+      <w:bookmarkStart w:id="9" w:name="_Toc241934873"/>
       <w:bookmarkEnd w:id="6"/>
       <w:r>
         <w:rPr>
@@ -9657,7 +9732,7 @@
         <w:ind w:firstLine="709"/>
       </w:pPr>
       <w:bookmarkStart w:id="10" w:name="_06e2001e7574ebc77f8406bc11ca3db76d00c2a"/>
-      <w:bookmarkStart w:id="11" w:name="_Toc241934595"/>
+      <w:bookmarkStart w:id="11" w:name="_Toc241934874"/>
       <w:bookmarkEnd w:id="8"/>
       <w:r>
         <w:rPr>
@@ -10461,7 +10536,7 @@
         <w:ind w:firstLine="709"/>
       </w:pPr>
       <w:bookmarkStart w:id="12" w:name="_606fa79e4d4f49d8da929021c2a978685b741ea"/>
-      <w:bookmarkStart w:id="13" w:name="_Toc241934596"/>
+      <w:bookmarkStart w:id="13" w:name="_Toc241934875"/>
       <w:bookmarkEnd w:id="10"/>
       <w:r>
         <w:rPr>
@@ -12895,7 +12970,7 @@
         <w:ind w:firstLine="709"/>
       </w:pPr>
       <w:bookmarkStart w:id="14" w:name="_2314d5998da626860a70184e0b470b0b8504694"/>
-      <w:bookmarkStart w:id="15" w:name="_Toc241934597"/>
+      <w:bookmarkStart w:id="15" w:name="_Toc241934876"/>
       <w:bookmarkEnd w:id="12"/>
       <w:r>
         <w:rPr>
@@ -13523,7 +13598,7 @@
         <w:ind w:firstLine="709"/>
       </w:pPr>
       <w:bookmarkStart w:id="16" w:name="_42bac9f10c820a94a4112d44417ea6b5d14bf7d"/>
-      <w:bookmarkStart w:id="17" w:name="_Toc241934598"/>
+      <w:bookmarkStart w:id="17" w:name="_Toc241934877"/>
       <w:bookmarkEnd w:id="14"/>
       <w:r>
         <w:rPr>
@@ -15430,7 +15505,7 @@
         <w:ind w:firstLine="709"/>
       </w:pPr>
       <w:bookmarkStart w:id="18" w:name="_62882a27ae1c57302eff280b02701a311900947"/>
-      <w:bookmarkStart w:id="19" w:name="_Toc241934599"/>
+      <w:bookmarkStart w:id="19" w:name="_Toc241934878"/>
       <w:bookmarkEnd w:id="16"/>
       <w:r>
         <w:rPr>
@@ -16819,7 +16894,7 @@
         <w:ind w:firstLine="709"/>
       </w:pPr>
       <w:bookmarkStart w:id="20" w:name="_2c7ec3ecf17663584d0d27e07e31cbd2a0948cf"/>
-      <w:bookmarkStart w:id="21" w:name="_Toc241934600"/>
+      <w:bookmarkStart w:id="21" w:name="_Toc241934879"/>
       <w:bookmarkEnd w:id="18"/>
       <w:r>
         <w:rPr>
@@ -19154,7 +19229,7 @@
         <w:ind w:firstLine="709"/>
       </w:pPr>
       <w:bookmarkStart w:id="22" w:name="_8d34778965163a5752bc27698d1f7e786ff5c87"/>
-      <w:bookmarkStart w:id="23" w:name="_Toc241934601"/>
+      <w:bookmarkStart w:id="23" w:name="_Toc241934880"/>
       <w:bookmarkEnd w:id="20"/>
       <w:r>
         <w:rPr>
@@ -20309,7 +20384,7 @@
           <w:sz w:val="28"/>
         </w:rPr>
         <w:drawing>
-          <wp:inline distT="0" distB="0" distL="0" distR="0" wp14:anchorId="3B6AAA3C" wp14:editId="0611A46E">
+          <wp:inline distT="0" distB="0" distL="0" distR="0" wp14:anchorId="3748A4C9" wp14:editId="78E690E7">
             <wp:extent cx="5334000" cy="2992243"/>
             <wp:effectExtent l="0" t="0" r="0" b="0"/>
             <wp:docPr id="26" name="Picture"/>
@@ -21155,7 +21230,7 @@
           <w:sz w:val="28"/>
         </w:rPr>
         <w:drawing>
-          <wp:inline distT="0" distB="0" distL="0" distR="0" wp14:anchorId="6DDDC143" wp14:editId="6F4C151B">
+          <wp:inline distT="0" distB="0" distL="0" distR="0" wp14:anchorId="4051DE9C" wp14:editId="1FD5E7B5">
             <wp:extent cx="5334000" cy="2471853"/>
             <wp:effectExtent l="0" t="0" r="0" b="0"/>
             <wp:docPr id="29" name="Picture"/>
@@ -21653,7 +21728,7 @@
         <w:ind w:firstLine="709"/>
       </w:pPr>
       <w:bookmarkStart w:id="24" w:name="_e6e1aac57bb528344b9009e4599364161f48047"/>
-      <w:bookmarkStart w:id="25" w:name="_Toc241934602"/>
+      <w:bookmarkStart w:id="25" w:name="_Toc241934881"/>
       <w:bookmarkEnd w:id="22"/>
       <w:r>
         <w:rPr>
@@ -22571,7 +22646,7 @@
         </w:rPr>
         <w:lastRenderedPageBreak/>
         <w:drawing>
-          <wp:inline distT="0" distB="0" distL="0" distR="0" wp14:anchorId="54D2B10E" wp14:editId="31DF56DB">
+          <wp:inline distT="0" distB="0" distL="0" distR="0" wp14:anchorId="6C26C6D8" wp14:editId="26A7403C">
             <wp:extent cx="5334000" cy="2341756"/>
             <wp:effectExtent l="0" t="0" r="0" b="0"/>
             <wp:docPr id="33" name="Picture"/>
@@ -22802,7 +22877,7 @@
         <w:ind w:firstLine="709"/>
       </w:pPr>
       <w:bookmarkStart w:id="26" w:name="_6a64c25cd48aeb5a2bf3dc411d56d805a6b5d7e"/>
-      <w:bookmarkStart w:id="27" w:name="_Toc241934603"/>
+      <w:bookmarkStart w:id="27" w:name="_Toc241934882"/>
       <w:bookmarkEnd w:id="24"/>
       <w:r>
         <w:rPr>
@@ -22861,7 +22936,7 @@
         </w:rPr>
         <w:lastRenderedPageBreak/>
         <w:drawing>
-          <wp:inline distT="0" distB="0" distL="0" distR="0" wp14:anchorId="6013D132" wp14:editId="734D497F">
+          <wp:inline distT="0" distB="0" distL="0" distR="0" wp14:anchorId="795809B2" wp14:editId="4178F1F1">
             <wp:extent cx="5334000" cy="2471853"/>
             <wp:effectExtent l="0" t="0" r="0" b="0"/>
             <wp:docPr id="37" name="Picture"/>
@@ -23086,7 +23161,7 @@
         <w:ind w:firstLine="709"/>
       </w:pPr>
       <w:bookmarkStart w:id="28" w:name="_8cdf61ec50cc46d2aaeadce1b560fea28ea116e"/>
-      <w:bookmarkStart w:id="29" w:name="_Toc241934604"/>
+      <w:bookmarkStart w:id="29" w:name="_Toc241934883"/>
       <w:bookmarkEnd w:id="26"/>
       <w:r>
         <w:rPr>
@@ -23202,7 +23277,7 @@
         <w:ind w:firstLine="709"/>
       </w:pPr>
       <w:bookmarkStart w:id="30" w:name="_1bfdad9d2d88ddb6ca16c31c1d4d4943679f32f"/>
-      <w:bookmarkStart w:id="31" w:name="_Toc241934605"/>
+      <w:bookmarkStart w:id="31" w:name="_Toc241934884"/>
       <w:bookmarkEnd w:id="28"/>
       <w:bookmarkEnd w:id="2"/>
       <w:r>
@@ -23740,7 +23815,7 @@
         <w:jc w:val="center"/>
       </w:pPr>
       <w:bookmarkStart w:id="32" w:name="_выводы"/>
-      <w:bookmarkStart w:id="33" w:name="_Toc241934606"/>
+      <w:bookmarkStart w:id="33" w:name="_Toc241934885"/>
       <w:bookmarkEnd w:id="30"/>
       <w:r>
         <w:rPr>
@@ -24014,7 +24089,7 @@
         <w:jc w:val="center"/>
       </w:pPr>
       <w:bookmarkStart w:id="34" w:name="_274f6a444530ef90b0479dabf3d210f01e97699"/>
-      <w:bookmarkStart w:id="35" w:name="_Toc241934607"/>
+      <w:bookmarkStart w:id="35" w:name="_Toc241934886"/>
       <w:bookmarkEnd w:id="32"/>
       <w:r>
         <w:rPr>
@@ -25109,6 +25184,695 @@
     </w:p>
     <w:p>
       <w:pPr>
+        <w:pStyle w:val="FirstParagraph"/>
+        <w:numPr>
+          <w:ilvl w:val="0"/>
+          <w:numId w:val="3"/>
+        </w:numPr>
+        <w:spacing w:before="0" w:after="0" w:line="360" w:lineRule="exact"/>
+        <w:ind w:left="709" w:hanging="425"/>
+        <w:jc w:val="both"/>
+      </w:pPr>
+      <w:r>
+        <w:rPr>
+          <w:i/>
+          <w:sz w:val="28"/>
+        </w:rPr>
+        <w:t>Microsoft</w:t>
+      </w:r>
+      <w:r>
+        <w:rPr>
+          <w:sz w:val="28"/>
+        </w:rPr>
+        <w:t xml:space="preserve">. </w:t>
+      </w:r>
+      <w:r>
+        <w:rPr>
+          <w:i/>
+          <w:sz w:val="28"/>
+        </w:rPr>
+        <w:t>Microsoft</w:t>
+      </w:r>
+      <w:r>
+        <w:rPr>
+          <w:sz w:val="28"/>
+        </w:rPr>
+        <w:t xml:space="preserve"> </w:t>
+      </w:r>
+      <w:r>
+        <w:rPr>
+          <w:i/>
+          <w:sz w:val="28"/>
+        </w:rPr>
+        <w:t>Marketplace</w:t>
+      </w:r>
+      <w:r>
+        <w:rPr>
+          <w:sz w:val="28"/>
+        </w:rPr>
+        <w:t xml:space="preserve"> </w:t>
+      </w:r>
+      <w:r>
+        <w:rPr>
+          <w:i/>
+          <w:sz w:val="28"/>
+        </w:rPr>
+        <w:t>transact</w:t>
+      </w:r>
+      <w:r>
+        <w:rPr>
+          <w:sz w:val="28"/>
+        </w:rPr>
+        <w:t xml:space="preserve"> </w:t>
+      </w:r>
+      <w:r>
+        <w:rPr>
+          <w:i/>
+          <w:sz w:val="28"/>
+        </w:rPr>
+        <w:t>capabilities</w:t>
+      </w:r>
+      <w:r>
+        <w:rPr>
+          <w:sz w:val="28"/>
+        </w:rPr>
+        <w:t xml:space="preserve"> [Электронный ресурс]. – Режим доступа: https://learn.microsoft.com/en-us/partner-c</w:t>
+      </w:r>
+      <w:r>
+        <w:rPr>
+          <w:sz w:val="28"/>
+        </w:rPr>
+        <w:t>enter/marketplace-offers/marketplace-commercial-transaction-capabilities-and-considerations. – Дата доступа: 03.10.2026.</w:t>
+      </w:r>
+    </w:p>
+    <w:p>
+      <w:pPr>
+        <w:pStyle w:val="FirstParagraph"/>
+        <w:numPr>
+          <w:ilvl w:val="0"/>
+          <w:numId w:val="3"/>
+        </w:numPr>
+        <w:spacing w:before="0" w:after="0" w:line="360" w:lineRule="exact"/>
+        <w:ind w:left="709" w:hanging="425"/>
+        <w:jc w:val="both"/>
+      </w:pPr>
+      <w:r>
+        <w:rPr>
+          <w:i/>
+          <w:sz w:val="28"/>
+        </w:rPr>
+        <w:t>Eurostat</w:t>
+      </w:r>
+      <w:r>
+        <w:rPr>
+          <w:sz w:val="28"/>
+        </w:rPr>
+        <w:t xml:space="preserve">. </w:t>
+      </w:r>
+      <w:r>
+        <w:rPr>
+          <w:i/>
+          <w:sz w:val="28"/>
+        </w:rPr>
+        <w:t>Employed</w:t>
+      </w:r>
+      <w:r>
+        <w:rPr>
+          <w:sz w:val="28"/>
+        </w:rPr>
+        <w:t xml:space="preserve"> </w:t>
+      </w:r>
+      <w:r>
+        <w:rPr>
+          <w:i/>
+          <w:sz w:val="28"/>
+        </w:rPr>
+        <w:t>persons</w:t>
+      </w:r>
+      <w:r>
+        <w:rPr>
+          <w:sz w:val="28"/>
+        </w:rPr>
+        <w:t xml:space="preserve"> </w:t>
+      </w:r>
+      <w:r>
+        <w:rPr>
+          <w:i/>
+          <w:sz w:val="28"/>
+        </w:rPr>
+        <w:t>by</w:t>
+      </w:r>
+      <w:r>
+        <w:rPr>
+          <w:sz w:val="28"/>
+        </w:rPr>
+        <w:t xml:space="preserve"> </w:t>
+      </w:r>
+      <w:r>
+        <w:rPr>
+          <w:i/>
+          <w:sz w:val="28"/>
+        </w:rPr>
+        <w:t>detailed</w:t>
+      </w:r>
+      <w:r>
+        <w:rPr>
+          <w:sz w:val="28"/>
+        </w:rPr>
+        <w:t xml:space="preserve"> </w:t>
+      </w:r>
+      <w:r>
+        <w:rPr>
+          <w:i/>
+          <w:sz w:val="28"/>
+        </w:rPr>
+        <w:t>occupation</w:t>
+      </w:r>
+      <w:r>
+        <w:rPr>
+          <w:sz w:val="28"/>
+        </w:rPr>
+        <w:t xml:space="preserve"> (</w:t>
+      </w:r>
+      <w:r>
+        <w:rPr>
+          <w:i/>
+          <w:sz w:val="28"/>
+        </w:rPr>
+        <w:t>ISCO-08</w:t>
+      </w:r>
+      <w:r>
+        <w:rPr>
+          <w:sz w:val="28"/>
+        </w:rPr>
+        <w:t xml:space="preserve"> </w:t>
+      </w:r>
+      <w:r>
+        <w:rPr>
+          <w:i/>
+          <w:sz w:val="28"/>
+        </w:rPr>
+        <w:t>two</w:t>
+      </w:r>
+      <w:r>
+        <w:rPr>
+          <w:sz w:val="28"/>
+        </w:rPr>
+        <w:t xml:space="preserve"> </w:t>
+      </w:r>
+      <w:r>
+        <w:rPr>
+          <w:i/>
+          <w:sz w:val="28"/>
+        </w:rPr>
+        <w:t>digit</w:t>
+      </w:r>
+      <w:r>
+        <w:rPr>
+          <w:sz w:val="28"/>
+        </w:rPr>
+        <w:t xml:space="preserve"> </w:t>
+      </w:r>
+      <w:r>
+        <w:rPr>
+          <w:i/>
+          <w:sz w:val="28"/>
+        </w:rPr>
+        <w:t>level</w:t>
+      </w:r>
+      <w:r>
+        <w:rPr>
+          <w:sz w:val="28"/>
+        </w:rPr>
+        <w:t xml:space="preserve">), </w:t>
+      </w:r>
+      <w:r>
+        <w:rPr>
+          <w:i/>
+          <w:sz w:val="28"/>
+        </w:rPr>
+        <w:t>lfsa_egai2d</w:t>
+      </w:r>
+      <w:r>
+        <w:rPr>
+          <w:sz w:val="28"/>
+        </w:rPr>
+        <w:t xml:space="preserve"> [Электронный ресурс]. – Режим доступа: https://ec.europa.eu/eurostat/api/dissemination/statistics/1.0/data/lfsa_egai2d. – Дата доступа: 03.10.2026.</w:t>
+      </w:r>
+    </w:p>
+    <w:p>
+      <w:pPr>
+        <w:pStyle w:val="FirstParagraph"/>
+        <w:numPr>
+          <w:ilvl w:val="0"/>
+          <w:numId w:val="3"/>
+        </w:numPr>
+        <w:spacing w:before="0" w:after="0" w:line="360" w:lineRule="exact"/>
+        <w:ind w:left="709" w:hanging="425"/>
+        <w:jc w:val="both"/>
+      </w:pPr>
+      <w:r>
+        <w:rPr>
+          <w:i/>
+          <w:sz w:val="28"/>
+        </w:rPr>
+        <w:t>SoftwareOne</w:t>
+      </w:r>
+      <w:r>
+        <w:rPr>
+          <w:sz w:val="28"/>
+        </w:rPr>
+        <w:t xml:space="preserve">. </w:t>
+      </w:r>
+      <w:r>
+        <w:rPr>
+          <w:i/>
+          <w:sz w:val="28"/>
+        </w:rPr>
+        <w:t>Arixcel</w:t>
+      </w:r>
+      <w:r>
+        <w:rPr>
+          <w:sz w:val="28"/>
+        </w:rPr>
+        <w:t xml:space="preserve"> </w:t>
+      </w:r>
+      <w:r>
+        <w:rPr>
+          <w:i/>
+          <w:sz w:val="28"/>
+        </w:rPr>
+        <w:t>Explorer</w:t>
+      </w:r>
+      <w:r>
+        <w:rPr>
+          <w:sz w:val="28"/>
+        </w:rPr>
+        <w:t xml:space="preserve"> [Электронный ресурс]. – Режим доступа: https://platform.softwareone.com/produ</w:t>
+      </w:r>
+      <w:r>
+        <w:rPr>
+          <w:sz w:val="28"/>
+        </w:rPr>
+        <w:t>ct/arixcel-explorer/PCP-1927-2429. – Дата доступа: 03.10.2026.</w:t>
+      </w:r>
+    </w:p>
+    <w:p>
+      <w:pPr>
+        <w:pStyle w:val="FirstParagraph"/>
+        <w:numPr>
+          <w:ilvl w:val="0"/>
+          <w:numId w:val="3"/>
+        </w:numPr>
+        <w:spacing w:before="0" w:after="0" w:line="360" w:lineRule="exact"/>
+        <w:ind w:left="709" w:hanging="425"/>
+        <w:jc w:val="both"/>
+      </w:pPr>
+      <w:r>
+        <w:rPr>
+          <w:i/>
+          <w:sz w:val="28"/>
+        </w:rPr>
+        <w:t>Operis</w:t>
+      </w:r>
+      <w:r>
+        <w:rPr>
+          <w:sz w:val="28"/>
+        </w:rPr>
+        <w:t xml:space="preserve">. </w:t>
+      </w:r>
+      <w:r>
+        <w:rPr>
+          <w:i/>
+          <w:sz w:val="28"/>
+        </w:rPr>
+        <w:t>Financial</w:t>
+      </w:r>
+      <w:r>
+        <w:rPr>
+          <w:sz w:val="28"/>
+        </w:rPr>
+        <w:t xml:space="preserve"> </w:t>
+      </w:r>
+      <w:r>
+        <w:rPr>
+          <w:i/>
+          <w:sz w:val="28"/>
+        </w:rPr>
+        <w:t>Modelling</w:t>
+      </w:r>
+      <w:r>
+        <w:rPr>
+          <w:sz w:val="28"/>
+        </w:rPr>
+        <w:t xml:space="preserve"> </w:t>
+      </w:r>
+      <w:r>
+        <w:rPr>
+          <w:i/>
+          <w:sz w:val="28"/>
+        </w:rPr>
+        <w:t>Fees</w:t>
+      </w:r>
+      <w:r>
+        <w:rPr>
+          <w:sz w:val="28"/>
+        </w:rPr>
+        <w:t xml:space="preserve">; </w:t>
+      </w:r>
+      <w:r>
+        <w:rPr>
+          <w:i/>
+          <w:sz w:val="28"/>
+        </w:rPr>
+        <w:t>Our</w:t>
+      </w:r>
+      <w:r>
+        <w:rPr>
+          <w:sz w:val="28"/>
+        </w:rPr>
+        <w:t xml:space="preserve"> </w:t>
+      </w:r>
+      <w:r>
+        <w:rPr>
+          <w:i/>
+          <w:sz w:val="28"/>
+        </w:rPr>
+        <w:t>New</w:t>
+      </w:r>
+      <w:r>
+        <w:rPr>
+          <w:sz w:val="28"/>
+        </w:rPr>
+        <w:t xml:space="preserve"> </w:t>
+      </w:r>
+      <w:r>
+        <w:rPr>
+          <w:i/>
+          <w:sz w:val="28"/>
+        </w:rPr>
+        <w:t>Subscription</w:t>
+      </w:r>
+      <w:r>
+        <w:rPr>
+          <w:sz w:val="28"/>
+        </w:rPr>
+        <w:t xml:space="preserve"> </w:t>
+      </w:r>
+      <w:r>
+        <w:rPr>
+          <w:i/>
+          <w:sz w:val="28"/>
+        </w:rPr>
+        <w:t>Plans</w:t>
+      </w:r>
+      <w:r>
+        <w:rPr>
+          <w:sz w:val="28"/>
+        </w:rPr>
+        <w:t xml:space="preserve"> [Электронный ресурс]. – Режим доступа: https://www.operisanalysiskit.com/oak-price/. – Дата доступа: 03.10.2026.</w:t>
+      </w:r>
+    </w:p>
+    <w:p>
+      <w:pPr>
+        <w:pStyle w:val="FirstParagraph"/>
+        <w:numPr>
+          <w:ilvl w:val="0"/>
+          <w:numId w:val="3"/>
+        </w:numPr>
+        <w:spacing w:before="0" w:after="0" w:line="360" w:lineRule="exact"/>
+        <w:ind w:left="709" w:hanging="425"/>
+        <w:jc w:val="both"/>
+      </w:pPr>
+      <w:r>
+        <w:rPr>
+          <w:i/>
+          <w:sz w:val="28"/>
+        </w:rPr>
+        <w:t>Software</w:t>
+      </w:r>
+      <w:r>
+        <w:rPr>
+          <w:sz w:val="28"/>
+        </w:rPr>
+        <w:t xml:space="preserve"> </w:t>
+      </w:r>
+      <w:r>
+        <w:rPr>
+          <w:i/>
+          <w:sz w:val="28"/>
+        </w:rPr>
+        <w:t>Finder</w:t>
+      </w:r>
+      <w:r>
+        <w:rPr>
+          <w:sz w:val="28"/>
+        </w:rPr>
+        <w:t xml:space="preserve">. </w:t>
+      </w:r>
+      <w:r>
+        <w:rPr>
+          <w:i/>
+          <w:sz w:val="28"/>
+        </w:rPr>
+        <w:t>Ho</w:t>
+      </w:r>
+      <w:r>
+        <w:rPr>
+          <w:i/>
+          <w:sz w:val="28"/>
+        </w:rPr>
+        <w:t>w</w:t>
+      </w:r>
+      <w:r>
+        <w:rPr>
+          <w:sz w:val="28"/>
+        </w:rPr>
+        <w:t xml:space="preserve"> </w:t>
+      </w:r>
+      <w:r>
+        <w:rPr>
+          <w:i/>
+          <w:sz w:val="28"/>
+        </w:rPr>
+        <w:t>Much</w:t>
+      </w:r>
+      <w:r>
+        <w:rPr>
+          <w:sz w:val="28"/>
+        </w:rPr>
+        <w:t xml:space="preserve"> </w:t>
+      </w:r>
+      <w:r>
+        <w:rPr>
+          <w:i/>
+          <w:sz w:val="28"/>
+        </w:rPr>
+        <w:t>Does</w:t>
+      </w:r>
+      <w:r>
+        <w:rPr>
+          <w:sz w:val="28"/>
+        </w:rPr>
+        <w:t xml:space="preserve"> </w:t>
+      </w:r>
+      <w:r>
+        <w:rPr>
+          <w:i/>
+          <w:sz w:val="28"/>
+        </w:rPr>
+        <w:t>DataSnipper</w:t>
+      </w:r>
+      <w:r>
+        <w:rPr>
+          <w:sz w:val="28"/>
+        </w:rPr>
+        <w:t xml:space="preserve"> </w:t>
+      </w:r>
+      <w:r>
+        <w:rPr>
+          <w:i/>
+          <w:sz w:val="28"/>
+        </w:rPr>
+        <w:t>Cost</w:t>
+      </w:r>
+      <w:r>
+        <w:rPr>
+          <w:sz w:val="28"/>
+        </w:rPr>
+        <w:t xml:space="preserve"> (2026 </w:t>
+      </w:r>
+      <w:r>
+        <w:rPr>
+          <w:i/>
+          <w:sz w:val="28"/>
+        </w:rPr>
+        <w:t>Pricing</w:t>
+      </w:r>
+      <w:r>
+        <w:rPr>
+          <w:sz w:val="28"/>
+        </w:rPr>
+        <w:t xml:space="preserve"> </w:t>
+      </w:r>
+      <w:r>
+        <w:rPr>
+          <w:i/>
+          <w:sz w:val="28"/>
+        </w:rPr>
+        <w:t>Guide</w:t>
+      </w:r>
+      <w:r>
+        <w:rPr>
+          <w:sz w:val="28"/>
+        </w:rPr>
+        <w:t>) [Электронный ресурс]. – Режим доступа: https://softwarefinder.com/resources/how-much-does-datasnipper-cost. – Дата доступа: 03.10.2026.</w:t>
+      </w:r>
+    </w:p>
+    <w:p>
+      <w:pPr>
+        <w:pStyle w:val="FirstParagraph"/>
+        <w:numPr>
+          <w:ilvl w:val="0"/>
+          <w:numId w:val="3"/>
+        </w:numPr>
+        <w:spacing w:before="0" w:after="0" w:line="360" w:lineRule="exact"/>
+        <w:ind w:left="709" w:hanging="425"/>
+        <w:jc w:val="both"/>
+      </w:pPr>
+      <w:r>
+        <w:rPr>
+          <w:i/>
+          <w:sz w:val="28"/>
+        </w:rPr>
+        <w:t>Coefficient</w:t>
+      </w:r>
+      <w:r>
+        <w:rPr>
+          <w:sz w:val="28"/>
+        </w:rPr>
+        <w:t xml:space="preserve">. </w:t>
+      </w:r>
+      <w:r>
+        <w:rPr>
+          <w:i/>
+          <w:sz w:val="28"/>
+        </w:rPr>
+        <w:t>Datarails</w:t>
+      </w:r>
+      <w:r>
+        <w:rPr>
+          <w:sz w:val="28"/>
+        </w:rPr>
+        <w:t xml:space="preserve"> </w:t>
+      </w:r>
+      <w:r>
+        <w:rPr>
+          <w:i/>
+          <w:sz w:val="28"/>
+        </w:rPr>
+        <w:t>Pricing</w:t>
+      </w:r>
+      <w:r>
+        <w:rPr>
+          <w:sz w:val="28"/>
+        </w:rPr>
+        <w:t xml:space="preserve"> 2026: </w:t>
+      </w:r>
+      <w:r>
+        <w:rPr>
+          <w:i/>
+          <w:sz w:val="28"/>
+        </w:rPr>
+        <w:t>Complete</w:t>
+      </w:r>
+      <w:r>
+        <w:rPr>
+          <w:sz w:val="28"/>
+        </w:rPr>
+        <w:t xml:space="preserve"> </w:t>
+      </w:r>
+      <w:r>
+        <w:rPr>
+          <w:i/>
+          <w:sz w:val="28"/>
+        </w:rPr>
+        <w:t>Guide</w:t>
+      </w:r>
+      <w:r>
+        <w:rPr>
+          <w:sz w:val="28"/>
+        </w:rPr>
+        <w:t xml:space="preserve"> </w:t>
+      </w:r>
+      <w:r>
+        <w:rPr>
+          <w:i/>
+          <w:sz w:val="28"/>
+        </w:rPr>
+        <w:t>to</w:t>
+      </w:r>
+      <w:r>
+        <w:rPr>
+          <w:sz w:val="28"/>
+        </w:rPr>
+        <w:t xml:space="preserve"> </w:t>
+      </w:r>
+      <w:r>
+        <w:rPr>
+          <w:i/>
+          <w:sz w:val="28"/>
+        </w:rPr>
+        <w:t>Plans</w:t>
+      </w:r>
+      <w:r>
+        <w:rPr>
+          <w:sz w:val="28"/>
+        </w:rPr>
+        <w:t xml:space="preserve">, </w:t>
+      </w:r>
+      <w:r>
+        <w:rPr>
+          <w:i/>
+          <w:sz w:val="28"/>
+        </w:rPr>
+        <w:t>Features</w:t>
+      </w:r>
+      <w:r>
+        <w:rPr>
+          <w:sz w:val="28"/>
+        </w:rPr>
+        <w:t xml:space="preserve"> </w:t>
+      </w:r>
+      <w:r>
+        <w:rPr>
+          <w:i/>
+          <w:sz w:val="28"/>
+        </w:rPr>
+        <w:t>and</w:t>
+      </w:r>
+      <w:r>
+        <w:rPr>
+          <w:sz w:val="28"/>
+        </w:rPr>
+        <w:t xml:space="preserve"> </w:t>
+      </w:r>
+      <w:r>
+        <w:rPr>
+          <w:i/>
+          <w:sz w:val="28"/>
+        </w:rPr>
+        <w:t>Reviews</w:t>
+      </w:r>
+      <w:r>
+        <w:rPr>
+          <w:sz w:val="28"/>
+        </w:rPr>
+        <w:t xml:space="preserve"> [Электронный ресурс]. – Режим доступа: https://coefficient.io/datarails-pricing. – Дата доступа: 03.10.2026.</w:t>
+      </w:r>
+    </w:p>
+    <w:p>
+      <w:pPr>
         <w:pStyle w:val="1"/>
         <w:keepNext w:val="0"/>
         <w:pageBreakBefore/>
@@ -25116,7 +25880,7 @@
         <w:jc w:val="center"/>
       </w:pPr>
       <w:bookmarkStart w:id="36" w:name="_3d74faf1500c1b2a4a8bfa8e0e37c74206ce73d"/>
-      <w:bookmarkStart w:id="37" w:name="_Toc241934608"/>
+      <w:bookmarkStart w:id="37" w:name="_Toc241934887"/>
       <w:bookmarkEnd w:id="34"/>
       <w:r>
         <w:rPr>
@@ -25164,13 +25928,7 @@
         <w:rPr>
           <w:sz w:val="28"/>
         </w:rPr>
-        <w:t>В приложении собраны допущения, добавленные в ЛР2-3 к допущениям Д-01…Д-08 из Л</w:t>
-      </w:r>
-      <w:r>
-        <w:rPr>
-          <w:sz w:val="28"/>
-        </w:rPr>
-        <w:t>Р1. Каждое допущение указывает значение, обоснование и влияние на результат.</w:t>
+        <w:t>В приложении собраны допущения, добавленные в ЛР2-3 к допущениям Д-01…Д-08 из ЛР1. Каждое допущение указывает значение, обоснование и влияние на результат.</w:t>
       </w:r>
     </w:p>
     <w:p>
@@ -25217,12 +25975,12 @@
         <w:tblLook w:val="0020" w:firstRow="1" w:lastRow="0" w:firstColumn="0" w:lastColumn="0" w:noHBand="0" w:noVBand="0"/>
       </w:tblPr>
       <w:tblGrid>
-        <w:gridCol w:w="630"/>
-        <w:gridCol w:w="1829"/>
-        <w:gridCol w:w="2239"/>
-        <w:gridCol w:w="1719"/>
-        <w:gridCol w:w="1469"/>
-        <w:gridCol w:w="1469"/>
+        <w:gridCol w:w="624"/>
+        <w:gridCol w:w="1809"/>
+        <w:gridCol w:w="2162"/>
+        <w:gridCol w:w="1854"/>
+        <w:gridCol w:w="1453"/>
+        <w:gridCol w:w="1453"/>
       </w:tblGrid>
       <w:tr>
         <w:trPr>
@@ -25233,7 +25991,7 @@
         </w:trPr>
         <w:tc>
           <w:tcPr>
-            <w:tcW w:w="630" w:type="dxa"/>
+            <w:tcW w:w="623" w:type="dxa"/>
             <w:vAlign w:val="center"/>
           </w:tcPr>
           <w:p>
@@ -25253,7 +26011,7 @@
         </w:tc>
         <w:tc>
           <w:tcPr>
-            <w:tcW w:w="1829" w:type="dxa"/>
+            <w:tcW w:w="1809" w:type="dxa"/>
             <w:vAlign w:val="center"/>
           </w:tcPr>
           <w:p>
@@ -25273,7 +26031,7 @@
         </w:tc>
         <w:tc>
           <w:tcPr>
-            <w:tcW w:w="2239" w:type="dxa"/>
+            <w:tcW w:w="2162" w:type="dxa"/>
             <w:vAlign w:val="center"/>
           </w:tcPr>
           <w:p>
@@ -25293,7 +26051,7 @@
         </w:tc>
         <w:tc>
           <w:tcPr>
-            <w:tcW w:w="1719" w:type="dxa"/>
+            <w:tcW w:w="1854" w:type="dxa"/>
             <w:vAlign w:val="center"/>
           </w:tcPr>
           <w:p>
@@ -25313,7 +26071,7 @@
         </w:tc>
         <w:tc>
           <w:tcPr>
-            <w:tcW w:w="1469" w:type="dxa"/>
+            <w:tcW w:w="1453" w:type="dxa"/>
             <w:vAlign w:val="center"/>
           </w:tcPr>
           <w:p>
@@ -25333,7 +26091,7 @@
         </w:tc>
         <w:tc>
           <w:tcPr>
-            <w:tcW w:w="1469" w:type="dxa"/>
+            <w:tcW w:w="1453" w:type="dxa"/>
             <w:vAlign w:val="center"/>
           </w:tcPr>
           <w:p>
@@ -25359,7 +26117,7 @@
         </w:trPr>
         <w:tc>
           <w:tcPr>
-            <w:tcW w:w="630" w:type="dxa"/>
+            <w:tcW w:w="623" w:type="dxa"/>
             <w:vAlign w:val="center"/>
           </w:tcPr>
           <w:p>
@@ -25378,7 +26136,7 @@
         </w:tc>
         <w:tc>
           <w:tcPr>
-            <w:tcW w:w="1829" w:type="dxa"/>
+            <w:tcW w:w="1809" w:type="dxa"/>
             <w:vAlign w:val="center"/>
           </w:tcPr>
           <w:p>
@@ -25397,7 +26155,7 @@
         </w:tc>
         <w:tc>
           <w:tcPr>
-            <w:tcW w:w="2239" w:type="dxa"/>
+            <w:tcW w:w="2162" w:type="dxa"/>
             <w:vAlign w:val="center"/>
           </w:tcPr>
           <w:p>
@@ -25416,7 +26174,7 @@
         </w:tc>
         <w:tc>
           <w:tcPr>
-            <w:tcW w:w="1719" w:type="dxa"/>
+            <w:tcW w:w="1854" w:type="dxa"/>
             <w:vAlign w:val="center"/>
           </w:tcPr>
           <w:p>
@@ -25435,7 +26193,7 @@
         </w:tc>
         <w:tc>
           <w:tcPr>
-            <w:tcW w:w="1469" w:type="dxa"/>
+            <w:tcW w:w="1453" w:type="dxa"/>
             <w:vAlign w:val="center"/>
           </w:tcPr>
           <w:p>
@@ -25455,13 +26213,20 @@
                 <w:i/>
                 <w:sz w:val="24"/>
               </w:rPr>
-              <w:t>EUR</w:t>
-            </w:r>
-          </w:p>
-        </w:tc>
-        <w:tc>
-          <w:tcPr>
-            <w:tcW w:w="1469" w:type="dxa"/>
+              <w:t>EU</w:t>
+            </w:r>
+            <w:r>
+              <w:rPr>
+                <w:i/>
+                <w:sz w:val="24"/>
+              </w:rPr>
+              <w:t>R</w:t>
+            </w:r>
+          </w:p>
+        </w:tc>
+        <w:tc>
+          <w:tcPr>
+            <w:tcW w:w="1453" w:type="dxa"/>
             <w:vAlign w:val="center"/>
           </w:tcPr>
           <w:p>
@@ -25493,7 +26258,7 @@
         </w:trPr>
         <w:tc>
           <w:tcPr>
-            <w:tcW w:w="630" w:type="dxa"/>
+            <w:tcW w:w="623" w:type="dxa"/>
             <w:vAlign w:val="center"/>
           </w:tcPr>
           <w:p>
@@ -25512,7 +26277,7 @@
         </w:tc>
         <w:tc>
           <w:tcPr>
-            <w:tcW w:w="1829" w:type="dxa"/>
+            <w:tcW w:w="1809" w:type="dxa"/>
             <w:vAlign w:val="center"/>
           </w:tcPr>
           <w:p>
@@ -25531,7 +26296,7 @@
         </w:tc>
         <w:tc>
           <w:tcPr>
-            <w:tcW w:w="2239" w:type="dxa"/>
+            <w:tcW w:w="2162" w:type="dxa"/>
             <w:vAlign w:val="center"/>
           </w:tcPr>
           <w:p>
@@ -25550,7 +26315,7 @@
         </w:tc>
         <w:tc>
           <w:tcPr>
-            <w:tcW w:w="1719" w:type="dxa"/>
+            <w:tcW w:w="1854" w:type="dxa"/>
             <w:vAlign w:val="center"/>
           </w:tcPr>
           <w:p>
@@ -25582,7 +26347,7 @@
         </w:tc>
         <w:tc>
           <w:tcPr>
-            <w:tcW w:w="1469" w:type="dxa"/>
+            <w:tcW w:w="1453" w:type="dxa"/>
             <w:vAlign w:val="center"/>
           </w:tcPr>
           <w:p>
@@ -25608,7 +26373,7 @@
         </w:tc>
         <w:tc>
           <w:tcPr>
-            <w:tcW w:w="1469" w:type="dxa"/>
+            <w:tcW w:w="1453" w:type="dxa"/>
             <w:vAlign w:val="center"/>
           </w:tcPr>
           <w:p>
@@ -25653,7 +26418,7 @@
         </w:trPr>
         <w:tc>
           <w:tcPr>
-            <w:tcW w:w="630" w:type="dxa"/>
+            <w:tcW w:w="623" w:type="dxa"/>
             <w:vAlign w:val="center"/>
           </w:tcPr>
           <w:p>
@@ -25672,32 +26437,26 @@
         </w:tc>
         <w:tc>
           <w:tcPr>
-            <w:tcW w:w="1829" w:type="dxa"/>
-            <w:vAlign w:val="center"/>
-          </w:tcPr>
-          <w:p>
-            <w:pPr>
-              <w:pStyle w:val="Compact"/>
-              <w:spacing w:before="0" w:after="0" w:line="280" w:lineRule="exact"/>
-              <w:jc w:val="center"/>
-            </w:pPr>
-            <w:r>
-              <w:rPr>
-                <w:sz w:val="24"/>
-              </w:rPr>
-              <w:t>Себестоимо</w:t>
-            </w:r>
-            <w:r>
-              <w:rPr>
-                <w:sz w:val="24"/>
-              </w:rPr>
-              <w:t>сть, часы, экономия</w:t>
-            </w:r>
-          </w:p>
-        </w:tc>
-        <w:tc>
-          <w:tcPr>
-            <w:tcW w:w="2239" w:type="dxa"/>
+            <w:tcW w:w="1809" w:type="dxa"/>
+            <w:vAlign w:val="center"/>
+          </w:tcPr>
+          <w:p>
+            <w:pPr>
+              <w:pStyle w:val="Compact"/>
+              <w:spacing w:before="0" w:after="0" w:line="280" w:lineRule="exact"/>
+              <w:jc w:val="center"/>
+            </w:pPr>
+            <w:r>
+              <w:rPr>
+                <w:sz w:val="24"/>
+              </w:rPr>
+              <w:t>Себестоимость, часы, экономия</w:t>
+            </w:r>
+          </w:p>
+        </w:tc>
+        <w:tc>
+          <w:tcPr>
+            <w:tcW w:w="2162" w:type="dxa"/>
             <w:vAlign w:val="center"/>
           </w:tcPr>
           <w:p>
@@ -25729,7 +26488,7 @@
         </w:tc>
         <w:tc>
           <w:tcPr>
-            <w:tcW w:w="1719" w:type="dxa"/>
+            <w:tcW w:w="1854" w:type="dxa"/>
             <w:vAlign w:val="center"/>
           </w:tcPr>
           <w:p>
@@ -25781,7 +26540,7 @@
         </w:tc>
         <w:tc>
           <w:tcPr>
-            <w:tcW w:w="1469" w:type="dxa"/>
+            <w:tcW w:w="1453" w:type="dxa"/>
             <w:vAlign w:val="center"/>
           </w:tcPr>
           <w:p>
@@ -25807,7 +26566,7 @@
         </w:tc>
         <w:tc>
           <w:tcPr>
-            <w:tcW w:w="1469" w:type="dxa"/>
+            <w:tcW w:w="1453" w:type="dxa"/>
             <w:vAlign w:val="center"/>
           </w:tcPr>
           <w:p>
@@ -25845,7 +26604,7 @@
         </w:trPr>
         <w:tc>
           <w:tcPr>
-            <w:tcW w:w="630" w:type="dxa"/>
+            <w:tcW w:w="623" w:type="dxa"/>
             <w:vAlign w:val="center"/>
           </w:tcPr>
           <w:p>
@@ -25864,7 +26623,7 @@
         </w:tc>
         <w:tc>
           <w:tcPr>
-            <w:tcW w:w="1829" w:type="dxa"/>
+            <w:tcW w:w="1809" w:type="dxa"/>
             <w:vAlign w:val="center"/>
           </w:tcPr>
           <w:p>
@@ -25883,32 +26642,26 @@
         </w:tc>
         <w:tc>
           <w:tcPr>
-            <w:tcW w:w="2239" w:type="dxa"/>
-            <w:vAlign w:val="center"/>
-          </w:tcPr>
-          <w:p>
-            <w:pPr>
-              <w:pStyle w:val="Compact"/>
-              <w:spacing w:before="0" w:after="0" w:line="280" w:lineRule="exact"/>
-              <w:jc w:val="center"/>
-            </w:pPr>
-            <w:r>
-              <w:rPr>
-                <w:sz w:val="24"/>
-              </w:rPr>
-              <w:t xml:space="preserve">визит-регистрация 2/4/7 %, </w:t>
-            </w:r>
-            <w:r>
-              <w:rPr>
-                <w:sz w:val="24"/>
-              </w:rPr>
-              <w:t>регистрация-платящий 3/5/8 %, доля трафика 0,5/1,5/4 %</w:t>
-            </w:r>
-          </w:p>
-        </w:tc>
-        <w:tc>
-          <w:tcPr>
-            <w:tcW w:w="1719" w:type="dxa"/>
+            <w:tcW w:w="2162" w:type="dxa"/>
+            <w:vAlign w:val="center"/>
+          </w:tcPr>
+          <w:p>
+            <w:pPr>
+              <w:pStyle w:val="Compact"/>
+              <w:spacing w:before="0" w:after="0" w:line="280" w:lineRule="exact"/>
+              <w:jc w:val="center"/>
+            </w:pPr>
+            <w:r>
+              <w:rPr>
+                <w:sz w:val="24"/>
+              </w:rPr>
+              <w:t>визит-регистрация 2/4/7 %, регистрация-платящий 3/5/8 %, доля трафика 0,5/1,5/4 %</w:t>
+            </w:r>
+          </w:p>
+        </w:tc>
+        <w:tc>
+          <w:tcPr>
+            <w:tcW w:w="1854" w:type="dxa"/>
             <w:vAlign w:val="center"/>
           </w:tcPr>
           <w:p>
@@ -25953,7 +26706,7 @@
         </w:tc>
         <w:tc>
           <w:tcPr>
-            <w:tcW w:w="1469" w:type="dxa"/>
+            <w:tcW w:w="1453" w:type="dxa"/>
             <w:vAlign w:val="center"/>
           </w:tcPr>
           <w:p>
@@ -25979,7 +26732,7 @@
         </w:tc>
         <w:tc>
           <w:tcPr>
-            <w:tcW w:w="1469" w:type="dxa"/>
+            <w:tcW w:w="1453" w:type="dxa"/>
             <w:vAlign w:val="center"/>
           </w:tcPr>
           <w:p>
@@ -26017,7 +26770,7 @@
         </w:trPr>
         <w:tc>
           <w:tcPr>
-            <w:tcW w:w="630" w:type="dxa"/>
+            <w:tcW w:w="623" w:type="dxa"/>
             <w:vAlign w:val="center"/>
           </w:tcPr>
           <w:p>
@@ -26036,7 +26789,7 @@
         </w:tc>
         <w:tc>
           <w:tcPr>
-            <w:tcW w:w="1829" w:type="dxa"/>
+            <w:tcW w:w="1809" w:type="dxa"/>
             <w:vAlign w:val="center"/>
           </w:tcPr>
           <w:p>
@@ -26055,7 +26808,7 @@
         </w:tc>
         <w:tc>
           <w:tcPr>
-            <w:tcW w:w="2239" w:type="dxa"/>
+            <w:tcW w:w="2162" w:type="dxa"/>
             <w:vAlign w:val="center"/>
           </w:tcPr>
           <w:p>
@@ -26074,7 +26827,7 @@
         </w:tc>
         <w:tc>
           <w:tcPr>
-            <w:tcW w:w="1719" w:type="dxa"/>
+            <w:tcW w:w="1854" w:type="dxa"/>
             <w:vAlign w:val="center"/>
           </w:tcPr>
           <w:p>
@@ -26093,7 +26846,7 @@
         </w:tc>
         <w:tc>
           <w:tcPr>
-            <w:tcW w:w="1469" w:type="dxa"/>
+            <w:tcW w:w="1453" w:type="dxa"/>
             <w:vAlign w:val="center"/>
           </w:tcPr>
           <w:p>
@@ -26112,7 +26865,7 @@
         </w:tc>
         <w:tc>
           <w:tcPr>
-            <w:tcW w:w="1469" w:type="dxa"/>
+            <w:tcW w:w="1453" w:type="dxa"/>
             <w:vAlign w:val="center"/>
           </w:tcPr>
           <w:p>
@@ -26137,7 +26890,7 @@
         </w:trPr>
         <w:tc>
           <w:tcPr>
-            <w:tcW w:w="630" w:type="dxa"/>
+            <w:tcW w:w="623" w:type="dxa"/>
             <w:vAlign w:val="center"/>
           </w:tcPr>
           <w:p>
@@ -26156,7 +26909,7 @@
         </w:tc>
         <w:tc>
           <w:tcPr>
-            <w:tcW w:w="1829" w:type="dxa"/>
+            <w:tcW w:w="1809" w:type="dxa"/>
             <w:vAlign w:val="center"/>
           </w:tcPr>
           <w:p>
@@ -26182,7 +26935,7 @@
         </w:tc>
         <w:tc>
           <w:tcPr>
-            <w:tcW w:w="2239" w:type="dxa"/>
+            <w:tcW w:w="2162" w:type="dxa"/>
             <w:vAlign w:val="center"/>
           </w:tcPr>
           <w:p>
@@ -26201,7 +26954,7 @@
         </w:tc>
         <w:tc>
           <w:tcPr>
-            <w:tcW w:w="1719" w:type="dxa"/>
+            <w:tcW w:w="1854" w:type="dxa"/>
             <w:vAlign w:val="center"/>
           </w:tcPr>
           <w:p>
@@ -26223,11 +26976,17 @@
               </w:rPr>
               <w:t>Microsoft</w:t>
             </w:r>
-          </w:p>
-        </w:tc>
-        <w:tc>
-          <w:tcPr>
-            <w:tcW w:w="1469" w:type="dxa"/>
+            <w:r>
+              <w:rPr>
+                <w:sz w:val="24"/>
+              </w:rPr>
+              <w:t xml:space="preserve"> (3 % подтверждено 03.10.2026, приложение Д)</w:t>
+            </w:r>
+          </w:p>
+        </w:tc>
+        <w:tc>
+          <w:tcPr>
+            <w:tcW w:w="1453" w:type="dxa"/>
             <w:vAlign w:val="center"/>
           </w:tcPr>
           <w:p>
@@ -26246,33 +27005,20 @@
         </w:tc>
         <w:tc>
           <w:tcPr>
-            <w:tcW w:w="1469" w:type="dxa"/>
-            <w:vAlign w:val="center"/>
-          </w:tcPr>
-          <w:p>
-            <w:pPr>
-              <w:pStyle w:val="Compact"/>
-              <w:spacing w:before="0" w:after="0" w:line="280" w:lineRule="exact"/>
-              <w:jc w:val="center"/>
-            </w:pPr>
-            <w:r>
-              <w:rPr>
-                <w:sz w:val="24"/>
-              </w:rPr>
-              <w:t xml:space="preserve">условия </w:t>
-            </w:r>
-            <w:r>
-              <w:rPr>
-                <w:i/>
-                <w:sz w:val="24"/>
-              </w:rPr>
-              <w:t>Microsoft</w:t>
-            </w:r>
-            <w:r>
-              <w:rPr>
-                <w:sz w:val="24"/>
-              </w:rPr>
-              <w:t xml:space="preserve">, данные </w:t>
+            <w:tcW w:w="1453" w:type="dxa"/>
+            <w:vAlign w:val="center"/>
+          </w:tcPr>
+          <w:p>
+            <w:pPr>
+              <w:pStyle w:val="Compact"/>
+              <w:spacing w:before="0" w:after="0" w:line="280" w:lineRule="exact"/>
+              <w:jc w:val="center"/>
+            </w:pPr>
+            <w:r>
+              <w:rPr>
+                <w:sz w:val="24"/>
+              </w:rPr>
+              <w:t xml:space="preserve">данные </w:t>
             </w:r>
             <w:r>
               <w:rPr>
@@ -26291,26 +27037,27 @@
         </w:trPr>
         <w:tc>
           <w:tcPr>
-            <w:tcW w:w="630" w:type="dxa"/>
-            <w:vAlign w:val="center"/>
-          </w:tcPr>
-          <w:p>
-            <w:pPr>
-              <w:pStyle w:val="Compact"/>
-              <w:spacing w:before="0" w:after="0" w:line="280" w:lineRule="exact"/>
-              <w:jc w:val="center"/>
-            </w:pPr>
-            <w:r>
-              <w:rPr>
-                <w:sz w:val="24"/>
-              </w:rPr>
+            <w:tcW w:w="623" w:type="dxa"/>
+            <w:vAlign w:val="center"/>
+          </w:tcPr>
+          <w:p>
+            <w:pPr>
+              <w:pStyle w:val="Compact"/>
+              <w:spacing w:before="0" w:after="0" w:line="280" w:lineRule="exact"/>
+              <w:jc w:val="center"/>
+            </w:pPr>
+            <w:r>
+              <w:rPr>
+                <w:sz w:val="24"/>
+              </w:rPr>
+              <w:lastRenderedPageBreak/>
               <w:t>Д-15</w:t>
             </w:r>
           </w:p>
         </w:tc>
         <w:tc>
           <w:tcPr>
-            <w:tcW w:w="1829" w:type="dxa"/>
+            <w:tcW w:w="1809" w:type="dxa"/>
             <w:vAlign w:val="center"/>
           </w:tcPr>
           <w:p>
@@ -26329,7 +27076,7 @@
         </w:tc>
         <w:tc>
           <w:tcPr>
-            <w:tcW w:w="2239" w:type="dxa"/>
+            <w:tcW w:w="2162" w:type="dxa"/>
             <w:vAlign w:val="center"/>
           </w:tcPr>
           <w:p>
@@ -26348,7 +27095,7 @@
         </w:tc>
         <w:tc>
           <w:tcPr>
-            <w:tcW w:w="1719" w:type="dxa"/>
+            <w:tcW w:w="1854" w:type="dxa"/>
             <w:vAlign w:val="center"/>
           </w:tcPr>
           <w:p>
@@ -26367,7 +27114,7 @@
         </w:tc>
         <w:tc>
           <w:tcPr>
-            <w:tcW w:w="1469" w:type="dxa"/>
+            <w:tcW w:w="1453" w:type="dxa"/>
             <w:vAlign w:val="center"/>
           </w:tcPr>
           <w:p>
@@ -26386,7 +27133,7 @@
         </w:tc>
         <w:tc>
           <w:tcPr>
-            <w:tcW w:w="1469" w:type="dxa"/>
+            <w:tcW w:w="1453" w:type="dxa"/>
             <w:vAlign w:val="center"/>
           </w:tcPr>
           <w:p>
@@ -26418,27 +27165,26 @@
         </w:trPr>
         <w:tc>
           <w:tcPr>
-            <w:tcW w:w="630" w:type="dxa"/>
-            <w:vAlign w:val="center"/>
-          </w:tcPr>
-          <w:p>
-            <w:pPr>
-              <w:pStyle w:val="Compact"/>
-              <w:spacing w:before="0" w:after="0" w:line="280" w:lineRule="exact"/>
-              <w:jc w:val="center"/>
-            </w:pPr>
-            <w:r>
-              <w:rPr>
-                <w:sz w:val="24"/>
-              </w:rPr>
-              <w:lastRenderedPageBreak/>
+            <w:tcW w:w="623" w:type="dxa"/>
+            <w:vAlign w:val="center"/>
+          </w:tcPr>
+          <w:p>
+            <w:pPr>
+              <w:pStyle w:val="Compact"/>
+              <w:spacing w:before="0" w:after="0" w:line="280" w:lineRule="exact"/>
+              <w:jc w:val="center"/>
+            </w:pPr>
+            <w:r>
+              <w:rPr>
+                <w:sz w:val="24"/>
+              </w:rPr>
               <w:t>Д-16</w:t>
             </w:r>
           </w:p>
         </w:tc>
         <w:tc>
           <w:tcPr>
-            <w:tcW w:w="1829" w:type="dxa"/>
+            <w:tcW w:w="1809" w:type="dxa"/>
             <w:vAlign w:val="center"/>
           </w:tcPr>
           <w:p>
@@ -26457,7 +27203,7 @@
         </w:tc>
         <w:tc>
           <w:tcPr>
-            <w:tcW w:w="2239" w:type="dxa"/>
+            <w:tcW w:w="2162" w:type="dxa"/>
             <w:vAlign w:val="center"/>
           </w:tcPr>
           <w:p>
@@ -26482,7 +27228,7 @@
         </w:tc>
         <w:tc>
           <w:tcPr>
-            <w:tcW w:w="1719" w:type="dxa"/>
+            <w:tcW w:w="1854" w:type="dxa"/>
             <w:vAlign w:val="center"/>
           </w:tcPr>
           <w:p>
@@ -26501,7 +27247,7 @@
         </w:tc>
         <w:tc>
           <w:tcPr>
-            <w:tcW w:w="1469" w:type="dxa"/>
+            <w:tcW w:w="1453" w:type="dxa"/>
             <w:vAlign w:val="center"/>
           </w:tcPr>
           <w:p>
@@ -26520,7 +27266,7 @@
         </w:tc>
         <w:tc>
           <w:tcPr>
-            <w:tcW w:w="1469" w:type="dxa"/>
+            <w:tcW w:w="1453" w:type="dxa"/>
             <w:vAlign w:val="center"/>
           </w:tcPr>
           <w:p>
@@ -26595,7 +27341,7 @@
         <w:jc w:val="center"/>
       </w:pPr>
       <w:bookmarkStart w:id="38" w:name="_d684f183eb868ee4ace295916bed2e6be64d16e"/>
-      <w:bookmarkStart w:id="39" w:name="_Toc241934609"/>
+      <w:bookmarkStart w:id="39" w:name="_Toc241934888"/>
       <w:bookmarkEnd w:id="36"/>
       <w:r>
         <w:rPr>
@@ -26643,13 +27389,7 @@
         <w:rPr>
           <w:sz w:val="28"/>
         </w:rPr>
-        <w:t>Ниже перечислены элементы, ко</w:t>
-      </w:r>
-      <w:r>
-        <w:rPr>
-          <w:sz w:val="28"/>
-        </w:rPr>
-        <w:t>торые не удалось получить или которые требуют личного участия. Для каждого указано, что, где и как нужно сделать.</w:t>
+        <w:t>Ниже перечислены элементы, которые не удалось получить или которые требуют личного участия. Для каждого указано, что, где и как нужно сделать.</w:t>
       </w:r>
     </w:p>
     <w:p>
@@ -26901,7 +27641,13 @@
               <w:rPr>
                 <w:sz w:val="24"/>
               </w:rPr>
-              <w:t xml:space="preserve"> (пробный доступ до 09.10.2026)</w:t>
+              <w:t xml:space="preserve"> (пробный доступ до 09.10</w:t>
+            </w:r>
+            <w:r>
+              <w:rPr>
+                <w:sz w:val="24"/>
+              </w:rPr>
+              <w:t>.2026)</w:t>
             </w:r>
           </w:p>
         </w:tc>
@@ -26966,14 +27712,7 @@
                 <w:i/>
                 <w:sz w:val="24"/>
               </w:rPr>
-              <w:t>excelfo</w:t>
-            </w:r>
-            <w:r>
-              <w:rPr>
-                <w:i/>
-                <w:sz w:val="24"/>
-              </w:rPr>
-              <w:t>rmulabot.com</w:t>
+              <w:t>excelformulabot.com</w:t>
             </w:r>
             <w:r>
               <w:rPr>
@@ -27105,9 +27844,55 @@
             </w:pPr>
             <w:r>
               <w:rPr>
-                <w:sz w:val="24"/>
-              </w:rPr>
-              <w:t>выгрузить таблицы занятости по профессиям</w:t>
+                <w:i/>
+                <w:sz w:val="24"/>
+              </w:rPr>
+              <w:t>Eurostat</w:t>
+            </w:r>
+            <w:r>
+              <w:rPr>
+                <w:sz w:val="24"/>
+              </w:rPr>
+              <w:t xml:space="preserve"> для ЕС выгружен (приложение Д); </w:t>
+            </w:r>
+            <w:r>
+              <w:rPr>
+                <w:i/>
+                <w:sz w:val="24"/>
+              </w:rPr>
+              <w:t>ONS</w:t>
+            </w:r>
+            <w:r>
+              <w:rPr>
+                <w:sz w:val="24"/>
+              </w:rPr>
+              <w:t xml:space="preserve"> </w:t>
+            </w:r>
+            <w:r>
+              <w:rPr>
+                <w:i/>
+                <w:sz w:val="24"/>
+              </w:rPr>
+              <w:t>Nomis</w:t>
+            </w:r>
+            <w:r>
+              <w:rPr>
+                <w:sz w:val="24"/>
+              </w:rPr>
+              <w:t xml:space="preserve"> </w:t>
+            </w:r>
+            <w:r>
+              <w:rPr>
+                <w:i/>
+                <w:sz w:val="24"/>
+              </w:rPr>
+              <w:t>APS218</w:t>
+            </w:r>
+            <w:r>
+              <w:rPr>
+                <w:sz w:val="24"/>
+              </w:rPr>
+              <w:t xml:space="preserve"> для Великобритании - скачать</w:t>
             </w:r>
           </w:p>
         </w:tc>
@@ -27242,7 +28027,7 @@
               <w:rPr>
                 <w:sz w:val="24"/>
               </w:rPr>
-              <w:t>проверить размер сбора и условия продаж</w:t>
+              <w:t>проверено 03.10.2026: комиссия 3 % (приложение Д)</w:t>
             </w:r>
           </w:p>
         </w:tc>
@@ -27382,7 +28167,7 @@
               <w:rPr>
                 <w:sz w:val="24"/>
               </w:rPr>
-              <w:t>запросить прайс или демо</w:t>
+              <w:t>найдены оценки третьих сторон (приложение Д); точные цены - запросом коммерческого предложения</w:t>
             </w:r>
           </w:p>
         </w:tc>
@@ -27483,7 +28268,13 @@
               <w:rPr>
                 <w:sz w:val="24"/>
               </w:rPr>
-              <w:t>анкета: бюджет, допустимая цена, готовность платить до пробы; пока использованы модельные данные (приложение Г)</w:t>
+              <w:t>анкета: бюджет, допустимая цена, гото</w:t>
+            </w:r>
+            <w:r>
+              <w:rPr>
+                <w:sz w:val="24"/>
+              </w:rPr>
+              <w:t>вность платить до пробы; пока использованы модельные данные (приложение Г)</w:t>
             </w:r>
           </w:p>
         </w:tc>
@@ -27502,13 +28293,7 @@
               <w:rPr>
                 <w:sz w:val="24"/>
               </w:rPr>
-              <w:t>книга 3, листы «Плат</w:t>
-            </w:r>
-            <w:r>
-              <w:rPr>
-                <w:sz w:val="24"/>
-              </w:rPr>
-              <w:t>ежеспособность», «Сценарии»</w:t>
+              <w:t>книга 3, листы «Платежеспособность», «Сценарии»</w:t>
             </w:r>
           </w:p>
         </w:tc>
@@ -27533,6 +28318,7 @@
               <w:rPr>
                 <w:sz w:val="24"/>
               </w:rPr>
+              <w:lastRenderedPageBreak/>
               <w:t>6</w:t>
             </w:r>
           </w:p>
@@ -27643,7 +28429,13 @@
               <w:rPr>
                 <w:sz w:val="24"/>
               </w:rPr>
-              <w:t xml:space="preserve"> измерить визит-регистрация и регистрация-платящий</w:t>
+              <w:t xml:space="preserve"> измерить визит-регистрация и регистрация-</w:t>
+            </w:r>
+            <w:r>
+              <w:rPr>
+                <w:sz w:val="24"/>
+              </w:rPr>
+              <w:t>платящий</w:t>
             </w:r>
           </w:p>
         </w:tc>
@@ -27833,14 +28625,7 @@
         <w:rPr>
           <w:sz w:val="28"/>
         </w:rPr>
-        <w:lastRenderedPageBreak/>
-        <w:t xml:space="preserve">Пункты 1, 3, 6 и 7 выполняются в сервисах под аккаунтом студентки; пункты 2 и 4 - открытые источники; пункт 5 </w:t>
-      </w:r>
-      <w:r>
-        <w:rPr>
-          <w:sz w:val="28"/>
-        </w:rPr>
-        <w:t>требует аудитории. До выполнения пунктов оценки остаются диапазоном с низкой и средней надежностью.</w:t>
+        <w:t>Пункты 1, 3, 6 и 7 выполняются в сервисах под аккаунтом студентки; пункты 2 и 4 - открытые источники; пункт 5 требует аудитории. До выполнения пунктов оценки остаются диапазоном с низкой и средней надежностью.</w:t>
       </w:r>
     </w:p>
     <w:p>
@@ -27852,7 +28637,7 @@
         <w:jc w:val="center"/>
       </w:pPr>
       <w:bookmarkStart w:id="40" w:name="_cb59224a7032ef66ab429e7df9b4e4c597bc187"/>
-      <w:bookmarkStart w:id="41" w:name="_Toc241934610"/>
+      <w:bookmarkStart w:id="41" w:name="_Toc241934889"/>
       <w:bookmarkEnd w:id="38"/>
       <w:r>
         <w:rPr>
@@ -27886,7 +28671,14 @@
           <w:b/>
           <w:sz w:val="28"/>
         </w:rPr>
-        <w:t>Исправления и изменения шаблонов</w:t>
+        <w:t>Исправления и изме</w:t>
+      </w:r>
+      <w:r>
+        <w:rPr>
+          <w:b/>
+          <w:sz w:val="28"/>
+        </w:rPr>
+        <w:t>нения шаблонов</w:t>
       </w:r>
     </w:p>
     <w:p>
@@ -27913,13 +28705,7 @@
         <w:rPr>
           <w:sz w:val="28"/>
         </w:rPr>
-        <w:t xml:space="preserve"> выявлены ошибки и неудобства. Ниже перечислено, что изменено, чтобы расчет был</w:t>
-      </w:r>
-      <w:r>
-        <w:rPr>
-          <w:sz w:val="28"/>
-        </w:rPr>
-        <w:t xml:space="preserve"> корректным; оригиналы шаблонов не изменялись, работа велась с копиями.</w:t>
+        <w:t xml:space="preserve"> выявлены ошибки и неудобства. Ниже перечислено, что изменено, чтобы расчет был корректным; оригиналы шаблонов не изменялись, работа велась с копиями.</w:t>
       </w:r>
     </w:p>
     <w:p>
@@ -28117,7 +28903,13 @@
               <w:rPr>
                 <w:sz w:val="24"/>
               </w:rPr>
-              <w:t>ссылка на пустую строку сегмента возвращала 0 вместо пустой строки, формулы давали #ЗНАЧ!, итоговые ячейки и панель с ошибками</w:t>
+              <w:t>ссылка на пустую строку сегмента возвращала 0 вместо пустой строки, формулы давали #ЗНАЧ!, итоговые яч</w:t>
+            </w:r>
+            <w:r>
+              <w:rPr>
+                <w:sz w:val="24"/>
+              </w:rPr>
+              <w:t>ейки и панель с ошибками</w:t>
             </w:r>
           </w:p>
         </w:tc>
@@ -28379,13 +29171,7 @@
               <w:rPr>
                 <w:sz w:val="24"/>
               </w:rPr>
-              <w:t>суммы релевантного трафика начинались со строки 5</w:t>
-            </w:r>
-            <w:r>
-              <w:rPr>
-                <w:sz w:val="24"/>
-              </w:rPr>
-              <w:t xml:space="preserve"> и пропускали первую строку данных</w:t>
+              <w:t>суммы релевантного трафика начинались со строки 5 и пропускали первую строку данных</w:t>
             </w:r>
           </w:p>
         </w:tc>
@@ -28480,7 +29266,13 @@
               <w:rPr>
                 <w:sz w:val="24"/>
               </w:rPr>
-              <w:t>минимум, среднее и максимум включали платформенную строку, которая не является выручкой нового бизнеса</w:t>
+              <w:t>минимум, среднее и макси</w:t>
+            </w:r>
+            <w:r>
+              <w:rPr>
+                <w:sz w:val="24"/>
+              </w:rPr>
+              <w:t>мум включали платформенную строку, которая не является выручкой нового бизнеса</w:t>
             </w:r>
           </w:p>
         </w:tc>
@@ -28499,13 +29291,7 @@
               <w:rPr>
                 <w:sz w:val="24"/>
               </w:rPr>
-              <w:t>формулы итогов исключают платформенн</w:t>
-            </w:r>
-            <w:r>
-              <w:rPr>
-                <w:sz w:val="24"/>
-              </w:rPr>
-              <w:t>ую строку</w:t>
+              <w:t>формулы итогов исключают платформенную строку</w:t>
             </w:r>
           </w:p>
         </w:tc>
@@ -28845,7 +29631,7 @@
         <w:jc w:val="center"/>
       </w:pPr>
       <w:bookmarkStart w:id="42" w:name="_48e9587881bbc300b26702bd6584ff263e735cf"/>
-      <w:bookmarkStart w:id="43" w:name="_Toc241934611"/>
+      <w:bookmarkStart w:id="43" w:name="_Toc241934890"/>
       <w:bookmarkEnd w:id="40"/>
       <w:r>
         <w:rPr>
@@ -30171,7 +30957,1757 @@
         <w:t>ые без изменения структуры расчета.</w:t>
       </w:r>
     </w:p>
-    <w:bookmarkEnd w:id="42"/>
+    <w:p>
+      <w:pPr>
+        <w:pStyle w:val="1"/>
+        <w:keepNext w:val="0"/>
+        <w:pageBreakBefore/>
+        <w:spacing w:before="0" w:after="0" w:line="360" w:lineRule="exact"/>
+        <w:jc w:val="center"/>
+      </w:pPr>
+      <w:bookmarkStart w:id="44" w:name="_494653d134221fdc43c135127d450c9af0a7c7d"/>
+      <w:bookmarkStart w:id="45" w:name="_Toc241934891"/>
+      <w:bookmarkEnd w:id="42"/>
+      <w:r>
+        <w:rPr>
+          <w:b/>
+          <w:sz w:val="28"/>
+        </w:rPr>
+        <w:lastRenderedPageBreak/>
+        <w:t>ПРИЛОЖЕНИЕ Д</w:t>
+      </w:r>
+      <w:bookmarkEnd w:id="45"/>
+    </w:p>
+    <w:p>
+      <w:pPr>
+        <w:spacing w:after="0" w:line="360" w:lineRule="exact"/>
+        <w:jc w:val="center"/>
+      </w:pPr>
+      <w:r>
+        <w:rPr>
+          <w:sz w:val="28"/>
+        </w:rPr>
+        <w:t>(справочное)</w:t>
+      </w:r>
+    </w:p>
+    <w:p>
+      <w:pPr>
+        <w:spacing w:after="360" w:line="360" w:lineRule="exact"/>
+        <w:jc w:val="center"/>
+      </w:pPr>
+      <w:r>
+        <w:rPr>
+          <w:b/>
+          <w:sz w:val="28"/>
+        </w:rPr>
+        <w:t>Данные, дополненные из открытых источников</w:t>
+      </w:r>
+    </w:p>
+    <w:p>
+      <w:pPr>
+        <w:pStyle w:val="FirstParagraph"/>
+        <w:spacing w:before="0" w:after="0" w:line="360" w:lineRule="exact"/>
+        <w:ind w:firstLine="709"/>
+        <w:jc w:val="both"/>
+      </w:pPr>
+      <w:r>
+        <w:rPr>
+          <w:sz w:val="28"/>
+        </w:rPr>
+        <w:t>Часть пунктов приложения Б удалось закрыть открытыми источниками 03.10.2026; ниже приведены найденные значения, их надежность и влияние на расчет. Осно</w:t>
+      </w:r>
+      <w:r>
+        <w:rPr>
+          <w:sz w:val="28"/>
+        </w:rPr>
+        <w:t>вные расчеты книг не изменялись, потому что найденные значения подтверждают принятые допущения или остаются оценками третьих лиц.</w:t>
+      </w:r>
+    </w:p>
+    <w:p>
+      <w:pPr>
+        <w:pStyle w:val="a0"/>
+        <w:spacing w:before="0" w:after="0" w:line="360" w:lineRule="exact"/>
+        <w:ind w:firstLine="709"/>
+        <w:jc w:val="both"/>
+      </w:pPr>
+      <w:r>
+        <w:rPr>
+          <w:sz w:val="28"/>
+        </w:rPr>
+        <w:t>В таблице 26 представлено: данные, найденные в открытых источниках.</w:t>
+      </w:r>
+    </w:p>
+    <w:p>
+      <w:pPr>
+        <w:pStyle w:val="a0"/>
+        <w:keepNext/>
+        <w:spacing w:before="0" w:after="0" w:line="360" w:lineRule="exact"/>
+      </w:pPr>
+      <w:r>
+        <w:rPr>
+          <w:sz w:val="28"/>
+        </w:rPr>
+        <w:t>Таблица 26 – Данные, найденные в открытых источниках</w:t>
+      </w:r>
+    </w:p>
+    <w:tbl>
+      <w:tblPr>
+        <w:tblStyle w:val="Table"/>
+        <w:tblW w:w="9355" w:type="dxa"/>
+        <w:jc w:val="center"/>
+        <w:tblBorders>
+          <w:top w:val="single" w:sz="4" w:space="0" w:color="000000"/>
+          <w:left w:val="single" w:sz="4" w:space="0" w:color="000000"/>
+          <w:bottom w:val="single" w:sz="4" w:space="0" w:color="000000"/>
+          <w:right w:val="single" w:sz="4" w:space="0" w:color="000000"/>
+          <w:insideH w:val="single" w:sz="4" w:space="0" w:color="000000"/>
+          <w:insideV w:val="single" w:sz="4" w:space="0" w:color="000000"/>
+        </w:tblBorders>
+        <w:tblLayout w:type="fixed"/>
+        <w:tblLook w:val="0020" w:firstRow="1" w:lastRow="0" w:firstColumn="0" w:lastColumn="0" w:noHBand="0" w:noVBand="0"/>
+      </w:tblPr>
+      <w:tblGrid>
+        <w:gridCol w:w="598"/>
+        <w:gridCol w:w="1923"/>
+        <w:gridCol w:w="1846"/>
+        <w:gridCol w:w="1104"/>
+        <w:gridCol w:w="1884"/>
+        <w:gridCol w:w="2000"/>
+      </w:tblGrid>
+      <w:tr>
+        <w:trPr>
+          <w:cnfStyle w:val="100000000000" w:firstRow="1" w:lastRow="0" w:firstColumn="0" w:lastColumn="0" w:oddVBand="0" w:evenVBand="0" w:oddHBand="0" w:evenHBand="0" w:firstRowFirstColumn="0" w:firstRowLastColumn="0" w:lastRowFirstColumn="0" w:lastRowLastColumn="0"/>
+          <w:cantSplit/>
+          <w:tblHeader/>
+          <w:jc w:val="center"/>
+        </w:trPr>
+        <w:tc>
+          <w:tcPr>
+            <w:tcW w:w="597" w:type="dxa"/>
+            <w:vAlign w:val="center"/>
+          </w:tcPr>
+          <w:p>
+            <w:pPr>
+              <w:pStyle w:val="Compact"/>
+              <w:spacing w:before="0" w:after="0" w:line="280" w:lineRule="exact"/>
+              <w:jc w:val="center"/>
+            </w:pPr>
+            <w:r>
+              <w:rPr>
+                <w:b/>
+                <w:sz w:val="24"/>
+              </w:rPr>
+              <w:t>№</w:t>
+            </w:r>
+          </w:p>
+        </w:tc>
+        <w:tc>
+          <w:tcPr>
+            <w:tcW w:w="1923" w:type="dxa"/>
+            <w:vAlign w:val="center"/>
+          </w:tcPr>
+          <w:p>
+            <w:pPr>
+              <w:pStyle w:val="Compact"/>
+              <w:spacing w:before="0" w:after="0" w:line="280" w:lineRule="exact"/>
+              <w:jc w:val="center"/>
+            </w:pPr>
+            <w:r>
+              <w:rPr>
+                <w:b/>
+                <w:sz w:val="24"/>
+              </w:rPr>
+              <w:t>Пок</w:t>
+            </w:r>
+            <w:r>
+              <w:rPr>
+                <w:b/>
+                <w:sz w:val="24"/>
+              </w:rPr>
+              <w:t>азатель</w:t>
+            </w:r>
+          </w:p>
+        </w:tc>
+        <w:tc>
+          <w:tcPr>
+            <w:tcW w:w="1846" w:type="dxa"/>
+            <w:vAlign w:val="center"/>
+          </w:tcPr>
+          <w:p>
+            <w:pPr>
+              <w:pStyle w:val="Compact"/>
+              <w:spacing w:before="0" w:after="0" w:line="280" w:lineRule="exact"/>
+              <w:jc w:val="center"/>
+            </w:pPr>
+            <w:r>
+              <w:rPr>
+                <w:b/>
+                <w:sz w:val="24"/>
+              </w:rPr>
+              <w:t>Значение</w:t>
+            </w:r>
+          </w:p>
+        </w:tc>
+        <w:tc>
+          <w:tcPr>
+            <w:tcW w:w="1104" w:type="dxa"/>
+            <w:vAlign w:val="center"/>
+          </w:tcPr>
+          <w:p>
+            <w:pPr>
+              <w:pStyle w:val="Compact"/>
+              <w:spacing w:before="0" w:after="0" w:line="280" w:lineRule="exact"/>
+              <w:jc w:val="center"/>
+            </w:pPr>
+            <w:r>
+              <w:rPr>
+                <w:b/>
+                <w:sz w:val="24"/>
+              </w:rPr>
+              <w:t>Источник</w:t>
+            </w:r>
+          </w:p>
+        </w:tc>
+        <w:tc>
+          <w:tcPr>
+            <w:tcW w:w="1884" w:type="dxa"/>
+            <w:vAlign w:val="center"/>
+          </w:tcPr>
+          <w:p>
+            <w:pPr>
+              <w:pStyle w:val="Compact"/>
+              <w:spacing w:before="0" w:after="0" w:line="280" w:lineRule="exact"/>
+              <w:jc w:val="center"/>
+            </w:pPr>
+            <w:r>
+              <w:rPr>
+                <w:b/>
+                <w:sz w:val="24"/>
+              </w:rPr>
+              <w:t>Надежность</w:t>
+            </w:r>
+          </w:p>
+        </w:tc>
+        <w:tc>
+          <w:tcPr>
+            <w:tcW w:w="2000" w:type="dxa"/>
+            <w:vAlign w:val="center"/>
+          </w:tcPr>
+          <w:p>
+            <w:pPr>
+              <w:pStyle w:val="Compact"/>
+              <w:spacing w:before="0" w:after="0" w:line="280" w:lineRule="exact"/>
+              <w:jc w:val="center"/>
+            </w:pPr>
+            <w:r>
+              <w:rPr>
+                <w:b/>
+                <w:sz w:val="24"/>
+              </w:rPr>
+              <w:t>Влияние на расчет</w:t>
+            </w:r>
+          </w:p>
+        </w:tc>
+      </w:tr>
+      <w:tr>
+        <w:trPr>
+          <w:cantSplit/>
+          <w:jc w:val="center"/>
+        </w:trPr>
+        <w:tc>
+          <w:tcPr>
+            <w:tcW w:w="597" w:type="dxa"/>
+            <w:vAlign w:val="center"/>
+          </w:tcPr>
+          <w:p>
+            <w:pPr>
+              <w:pStyle w:val="Compact"/>
+              <w:spacing w:before="0" w:after="0" w:line="280" w:lineRule="exact"/>
+              <w:jc w:val="center"/>
+            </w:pPr>
+            <w:r>
+              <w:rPr>
+                <w:sz w:val="24"/>
+              </w:rPr>
+              <w:t>1</w:t>
+            </w:r>
+          </w:p>
+        </w:tc>
+        <w:tc>
+          <w:tcPr>
+            <w:tcW w:w="1923" w:type="dxa"/>
+            <w:vAlign w:val="center"/>
+          </w:tcPr>
+          <w:p>
+            <w:pPr>
+              <w:pStyle w:val="Compact"/>
+              <w:spacing w:before="0" w:after="0" w:line="280" w:lineRule="exact"/>
+              <w:jc w:val="center"/>
+            </w:pPr>
+            <w:r>
+              <w:rPr>
+                <w:sz w:val="24"/>
+              </w:rPr>
+              <w:t xml:space="preserve">Комиссия </w:t>
+            </w:r>
+            <w:r>
+              <w:rPr>
+                <w:i/>
+                <w:sz w:val="24"/>
+              </w:rPr>
+              <w:t>Microsoft</w:t>
+            </w:r>
+            <w:r>
+              <w:rPr>
+                <w:sz w:val="24"/>
+              </w:rPr>
+              <w:t xml:space="preserve"> </w:t>
+            </w:r>
+            <w:r>
+              <w:rPr>
+                <w:i/>
+                <w:sz w:val="24"/>
+              </w:rPr>
+              <w:t>Marketplace</w:t>
+            </w:r>
+            <w:r>
+              <w:rPr>
+                <w:sz w:val="24"/>
+              </w:rPr>
+              <w:t xml:space="preserve"> при продаже </w:t>
+            </w:r>
+            <w:r>
+              <w:rPr>
+                <w:i/>
+                <w:sz w:val="24"/>
+              </w:rPr>
+              <w:t>SaaS</w:t>
+            </w:r>
+            <w:r>
+              <w:rPr>
+                <w:sz w:val="24"/>
+              </w:rPr>
+              <w:t xml:space="preserve"> через магазин</w:t>
+            </w:r>
+          </w:p>
+        </w:tc>
+        <w:tc>
+          <w:tcPr>
+            <w:tcW w:w="1846" w:type="dxa"/>
+            <w:vAlign w:val="center"/>
+          </w:tcPr>
+          <w:p>
+            <w:pPr>
+              <w:pStyle w:val="Compact"/>
+              <w:spacing w:before="0" w:after="0" w:line="280" w:lineRule="exact"/>
+              <w:jc w:val="center"/>
+            </w:pPr>
+            <w:r>
+              <w:rPr>
+                <w:sz w:val="24"/>
+              </w:rPr>
+              <w:t xml:space="preserve">3 % стандартной платы за обслуживание магазина; выплата 97 % от стоимости лицензии; бесплатная проба </w:t>
+            </w:r>
+            <w:r>
+              <w:rPr>
+                <w:i/>
+                <w:sz w:val="24"/>
+              </w:rPr>
+              <w:t>SaaS</w:t>
+            </w:r>
+            <w:r>
+              <w:rPr>
+                <w:sz w:val="24"/>
+              </w:rPr>
+              <w:t xml:space="preserve"> 1-180 дней</w:t>
+            </w:r>
+          </w:p>
+        </w:tc>
+        <w:tc>
+          <w:tcPr>
+            <w:tcW w:w="1104" w:type="dxa"/>
+            <w:vAlign w:val="center"/>
+          </w:tcPr>
+          <w:p>
+            <w:pPr>
+              <w:pStyle w:val="Compact"/>
+              <w:spacing w:before="0" w:after="0" w:line="280" w:lineRule="exact"/>
+              <w:jc w:val="center"/>
+            </w:pPr>
+            <w:r>
+              <w:rPr>
+                <w:sz w:val="24"/>
+              </w:rPr>
+              <w:t>[15]</w:t>
+            </w:r>
+          </w:p>
+        </w:tc>
+        <w:tc>
+          <w:tcPr>
+            <w:tcW w:w="1884" w:type="dxa"/>
+            <w:vAlign w:val="center"/>
+          </w:tcPr>
+          <w:p>
+            <w:pPr>
+              <w:pStyle w:val="Compact"/>
+              <w:spacing w:before="0" w:after="0" w:line="280" w:lineRule="exact"/>
+              <w:jc w:val="center"/>
+            </w:pPr>
+            <w:r>
+              <w:rPr>
+                <w:sz w:val="24"/>
+              </w:rPr>
+              <w:t>высокая (первичный источник, обновлено 18.08.2026)</w:t>
+            </w:r>
+          </w:p>
+        </w:tc>
+        <w:tc>
+          <w:tcPr>
+            <w:tcW w:w="2000" w:type="dxa"/>
+            <w:vAlign w:val="center"/>
+          </w:tcPr>
+          <w:p>
+            <w:pPr>
+              <w:pStyle w:val="Compact"/>
+              <w:spacing w:before="0" w:after="0" w:line="280" w:lineRule="exact"/>
+              <w:jc w:val="center"/>
+            </w:pPr>
+            <w:r>
+              <w:rPr>
+                <w:sz w:val="24"/>
+              </w:rPr>
+              <w:t>допущение Д-14 подтверждено</w:t>
+            </w:r>
+          </w:p>
+        </w:tc>
+      </w:tr>
+      <w:tr>
+        <w:trPr>
+          <w:cantSplit/>
+          <w:jc w:val="center"/>
+        </w:trPr>
+        <w:tc>
+          <w:tcPr>
+            <w:tcW w:w="597" w:type="dxa"/>
+            <w:vAlign w:val="center"/>
+          </w:tcPr>
+          <w:p>
+            <w:pPr>
+              <w:pStyle w:val="Compact"/>
+              <w:spacing w:before="0" w:after="0" w:line="280" w:lineRule="exact"/>
+              <w:jc w:val="center"/>
+            </w:pPr>
+            <w:r>
+              <w:rPr>
+                <w:sz w:val="24"/>
+              </w:rPr>
+              <w:t>2</w:t>
+            </w:r>
+          </w:p>
+        </w:tc>
+        <w:tc>
+          <w:tcPr>
+            <w:tcW w:w="1923" w:type="dxa"/>
+            <w:vAlign w:val="center"/>
+          </w:tcPr>
+          <w:p>
+            <w:pPr>
+              <w:pStyle w:val="Compact"/>
+              <w:spacing w:before="0" w:after="0" w:line="280" w:lineRule="exact"/>
+              <w:jc w:val="center"/>
+            </w:pPr>
+            <w:r>
+              <w:rPr>
+                <w:sz w:val="24"/>
+              </w:rPr>
+              <w:t>Занятые в профессиях «</w:t>
+            </w:r>
+            <w:r>
+              <w:rPr>
+                <w:i/>
+                <w:sz w:val="24"/>
+              </w:rPr>
+              <w:t>Business</w:t>
+            </w:r>
+            <w:r>
+              <w:rPr>
+                <w:sz w:val="24"/>
+              </w:rPr>
+              <w:t xml:space="preserve"> </w:t>
+            </w:r>
+            <w:r>
+              <w:rPr>
+                <w:i/>
+                <w:sz w:val="24"/>
+              </w:rPr>
+              <w:t>and</w:t>
+            </w:r>
+            <w:r>
+              <w:rPr>
+                <w:sz w:val="24"/>
+              </w:rPr>
+              <w:t xml:space="preserve"> </w:t>
+            </w:r>
+            <w:r>
+              <w:rPr>
+                <w:i/>
+                <w:sz w:val="24"/>
+              </w:rPr>
+              <w:t>administration</w:t>
+            </w:r>
+            <w:r>
+              <w:rPr>
+                <w:sz w:val="24"/>
+              </w:rPr>
+              <w:t xml:space="preserve"> </w:t>
+            </w:r>
+            <w:r>
+              <w:rPr>
+                <w:i/>
+                <w:sz w:val="24"/>
+              </w:rPr>
+              <w:t>professionals</w:t>
+            </w:r>
+            <w:r>
+              <w:rPr>
+                <w:sz w:val="24"/>
+              </w:rPr>
+              <w:t>» (</w:t>
+            </w:r>
+            <w:r>
+              <w:rPr>
+                <w:i/>
+                <w:sz w:val="24"/>
+              </w:rPr>
+              <w:t>ISCO-08</w:t>
+            </w:r>
+            <w:r>
+              <w:rPr>
+                <w:sz w:val="24"/>
+              </w:rPr>
+              <w:t xml:space="preserve">, </w:t>
+            </w:r>
+            <w:r>
+              <w:rPr>
+                <w:i/>
+                <w:sz w:val="24"/>
+              </w:rPr>
+              <w:t>OC24</w:t>
+            </w:r>
+            <w:r>
+              <w:rPr>
+                <w:sz w:val="24"/>
+              </w:rPr>
+              <w:t>), 2024, тыс. чел.</w:t>
+            </w:r>
+          </w:p>
+        </w:tc>
+        <w:tc>
+          <w:tcPr>
+            <w:tcW w:w="1846" w:type="dxa"/>
+            <w:vAlign w:val="center"/>
+          </w:tcPr>
+          <w:p>
+            <w:pPr>
+              <w:pStyle w:val="Compact"/>
+              <w:spacing w:before="0" w:after="0" w:line="280" w:lineRule="exact"/>
+              <w:jc w:val="center"/>
+            </w:pPr>
+            <w:r>
+              <w:rPr>
+                <w:sz w:val="24"/>
+              </w:rPr>
+              <w:t>ЕС-27 - 9 909,4; Германия - 1 806,3; Франция - 1 713,1; Нидерланды - 913,7; Ирландия - 195,9</w:t>
+            </w:r>
+          </w:p>
+        </w:tc>
+        <w:tc>
+          <w:tcPr>
+            <w:tcW w:w="1104" w:type="dxa"/>
+            <w:vAlign w:val="center"/>
+          </w:tcPr>
+          <w:p>
+            <w:pPr>
+              <w:pStyle w:val="Compact"/>
+              <w:spacing w:before="0" w:after="0" w:line="280" w:lineRule="exact"/>
+              <w:jc w:val="center"/>
+            </w:pPr>
+            <w:r>
+              <w:rPr>
+                <w:sz w:val="24"/>
+              </w:rPr>
+              <w:t>[16]</w:t>
+            </w:r>
+          </w:p>
+        </w:tc>
+        <w:tc>
+          <w:tcPr>
+            <w:tcW w:w="1884" w:type="dxa"/>
+            <w:vAlign w:val="center"/>
+          </w:tcPr>
+          <w:p>
+            <w:pPr>
+              <w:pStyle w:val="Compact"/>
+              <w:spacing w:before="0" w:after="0" w:line="280" w:lineRule="exact"/>
+              <w:jc w:val="center"/>
+            </w:pPr>
+            <w:r>
+              <w:rPr>
+                <w:sz w:val="24"/>
+              </w:rPr>
+              <w:t>высокая</w:t>
+            </w:r>
+          </w:p>
+        </w:tc>
+        <w:tc>
+          <w:tcPr>
+            <w:tcW w:w="2000" w:type="dxa"/>
+            <w:vAlign w:val="center"/>
+          </w:tcPr>
+          <w:p>
+            <w:pPr>
+              <w:pStyle w:val="Compact"/>
+              <w:spacing w:before="0" w:after="0" w:line="280" w:lineRule="exact"/>
+              <w:jc w:val="center"/>
+            </w:pPr>
+            <w:r>
+              <w:rPr>
+                <w:sz w:val="24"/>
+              </w:rPr>
+              <w:t>масштаб занятости ЕС 1,30 дает около 4,05 млн в трех профессиональных сегментах, то ест</w:t>
+            </w:r>
+            <w:r>
+              <w:rPr>
+                <w:sz w:val="24"/>
+              </w:rPr>
+              <w:t xml:space="preserve">ь около 41 % от </w:t>
+            </w:r>
+            <w:r>
+              <w:rPr>
+                <w:i/>
+                <w:sz w:val="24"/>
+              </w:rPr>
+              <w:t>OC24</w:t>
+            </w:r>
+            <w:r>
+              <w:rPr>
+                <w:sz w:val="24"/>
+              </w:rPr>
+              <w:t>: правдоподобно (</w:t>
+            </w:r>
+            <w:r>
+              <w:rPr>
+                <w:i/>
+                <w:sz w:val="24"/>
+              </w:rPr>
+              <w:t>OC24</w:t>
+            </w:r>
+            <w:r>
+              <w:rPr>
+                <w:sz w:val="24"/>
+              </w:rPr>
+              <w:t xml:space="preserve"> включает также кадры, маркетинг и продажи)</w:t>
+            </w:r>
+          </w:p>
+        </w:tc>
+      </w:tr>
+      <w:tr>
+        <w:trPr>
+          <w:cantSplit/>
+          <w:jc w:val="center"/>
+        </w:trPr>
+        <w:tc>
+          <w:tcPr>
+            <w:tcW w:w="597" w:type="dxa"/>
+            <w:vAlign w:val="center"/>
+          </w:tcPr>
+          <w:p>
+            <w:pPr>
+              <w:pStyle w:val="Compact"/>
+              <w:spacing w:before="0" w:after="0" w:line="280" w:lineRule="exact"/>
+              <w:jc w:val="center"/>
+            </w:pPr>
+            <w:r>
+              <w:rPr>
+                <w:sz w:val="24"/>
+              </w:rPr>
+              <w:t>3</w:t>
+            </w:r>
+          </w:p>
+        </w:tc>
+        <w:tc>
+          <w:tcPr>
+            <w:tcW w:w="1923" w:type="dxa"/>
+            <w:vAlign w:val="center"/>
+          </w:tcPr>
+          <w:p>
+            <w:pPr>
+              <w:pStyle w:val="Compact"/>
+              <w:spacing w:before="0" w:after="0" w:line="280" w:lineRule="exact"/>
+              <w:jc w:val="center"/>
+            </w:pPr>
+            <w:r>
+              <w:rPr>
+                <w:sz w:val="24"/>
+              </w:rPr>
+              <w:t xml:space="preserve">Цена </w:t>
+            </w:r>
+            <w:r>
+              <w:rPr>
+                <w:i/>
+                <w:sz w:val="24"/>
+              </w:rPr>
+              <w:t>Arixcel</w:t>
+            </w:r>
+            <w:r>
+              <w:rPr>
+                <w:sz w:val="24"/>
+              </w:rPr>
+              <w:t xml:space="preserve"> </w:t>
+            </w:r>
+            <w:r>
+              <w:rPr>
+                <w:i/>
+                <w:sz w:val="24"/>
+              </w:rPr>
+              <w:t>Explorer</w:t>
+            </w:r>
+          </w:p>
+        </w:tc>
+        <w:tc>
+          <w:tcPr>
+            <w:tcW w:w="1846" w:type="dxa"/>
+            <w:vAlign w:val="center"/>
+          </w:tcPr>
+          <w:p>
+            <w:pPr>
+              <w:pStyle w:val="Compact"/>
+              <w:spacing w:before="0" w:after="0" w:line="280" w:lineRule="exact"/>
+              <w:jc w:val="center"/>
+            </w:pPr>
+            <w:r>
+              <w:rPr>
+                <w:sz w:val="24"/>
+              </w:rPr>
+              <w:t xml:space="preserve">2,75 </w:t>
+            </w:r>
+            <w:r>
+              <w:rPr>
+                <w:i/>
+                <w:sz w:val="24"/>
+              </w:rPr>
+              <w:t>GBP</w:t>
+            </w:r>
+            <w:r>
+              <w:rPr>
+                <w:sz w:val="24"/>
+              </w:rPr>
+              <w:t xml:space="preserve"> за пользователя в месяц (около 3,3 </w:t>
+            </w:r>
+            <w:r>
+              <w:rPr>
+                <w:i/>
+                <w:sz w:val="24"/>
+              </w:rPr>
+              <w:t>EUR</w:t>
+            </w:r>
+            <w:r>
+              <w:rPr>
+                <w:sz w:val="24"/>
+              </w:rPr>
+              <w:t>); срок лицензии 12-36 месяцев</w:t>
+            </w:r>
+          </w:p>
+        </w:tc>
+        <w:tc>
+          <w:tcPr>
+            <w:tcW w:w="1104" w:type="dxa"/>
+            <w:vAlign w:val="center"/>
+          </w:tcPr>
+          <w:p>
+            <w:pPr>
+              <w:pStyle w:val="Compact"/>
+              <w:spacing w:before="0" w:after="0" w:line="280" w:lineRule="exact"/>
+              <w:jc w:val="center"/>
+            </w:pPr>
+            <w:r>
+              <w:rPr>
+                <w:sz w:val="24"/>
+              </w:rPr>
+              <w:t>[17]</w:t>
+            </w:r>
+          </w:p>
+        </w:tc>
+        <w:tc>
+          <w:tcPr>
+            <w:tcW w:w="1884" w:type="dxa"/>
+            <w:vAlign w:val="center"/>
+          </w:tcPr>
+          <w:p>
+            <w:pPr>
+              <w:pStyle w:val="Compact"/>
+              <w:spacing w:before="0" w:after="0" w:line="280" w:lineRule="exact"/>
+              <w:jc w:val="center"/>
+            </w:pPr>
+            <w:r>
+              <w:rPr>
+                <w:sz w:val="24"/>
+              </w:rPr>
+              <w:t>низкая (каталог перепродавца, на сайте производителя цены нет)</w:t>
+            </w:r>
+          </w:p>
+        </w:tc>
+        <w:tc>
+          <w:tcPr>
+            <w:tcW w:w="2000" w:type="dxa"/>
+            <w:vAlign w:val="center"/>
+          </w:tcPr>
+          <w:p>
+            <w:pPr>
+              <w:pStyle w:val="Compact"/>
+              <w:spacing w:before="0" w:after="0" w:line="280" w:lineRule="exact"/>
+              <w:jc w:val="center"/>
+            </w:pPr>
+            <w:r>
+              <w:rPr>
+                <w:sz w:val="24"/>
+              </w:rPr>
+              <w:t xml:space="preserve">ориентир нижней границы ценового коридора; цена </w:t>
+            </w:r>
+            <w:r>
+              <w:rPr>
+                <w:i/>
+                <w:sz w:val="24"/>
+              </w:rPr>
+              <w:t>TableMind</w:t>
+            </w:r>
+            <w:r>
+              <w:rPr>
+                <w:sz w:val="24"/>
+              </w:rPr>
+              <w:t xml:space="preserve"> 19 </w:t>
+            </w:r>
+            <w:r>
+              <w:rPr>
+                <w:i/>
+                <w:sz w:val="24"/>
+              </w:rPr>
+              <w:t>EUR</w:t>
+            </w:r>
+            <w:r>
+              <w:rPr>
+                <w:sz w:val="24"/>
+              </w:rPr>
+              <w:t xml:space="preserve"> выше в 5-6 раз</w:t>
+            </w:r>
+          </w:p>
+        </w:tc>
+      </w:tr>
+      <w:tr>
+        <w:trPr>
+          <w:cantSplit/>
+          <w:jc w:val="center"/>
+        </w:trPr>
+        <w:tc>
+          <w:tcPr>
+            <w:tcW w:w="597" w:type="dxa"/>
+            <w:vAlign w:val="center"/>
+          </w:tcPr>
+          <w:p>
+            <w:pPr>
+              <w:pStyle w:val="Compact"/>
+              <w:spacing w:before="0" w:after="0" w:line="280" w:lineRule="exact"/>
+              <w:jc w:val="center"/>
+            </w:pPr>
+            <w:r>
+              <w:rPr>
+                <w:sz w:val="24"/>
+              </w:rPr>
+              <w:lastRenderedPageBreak/>
+              <w:t>4</w:t>
+            </w:r>
+          </w:p>
+        </w:tc>
+        <w:tc>
+          <w:tcPr>
+            <w:tcW w:w="1923" w:type="dxa"/>
+            <w:vAlign w:val="center"/>
+          </w:tcPr>
+          <w:p>
+            <w:pPr>
+              <w:pStyle w:val="Compact"/>
+              <w:spacing w:before="0" w:after="0" w:line="280" w:lineRule="exact"/>
+              <w:jc w:val="center"/>
+            </w:pPr>
+            <w:r>
+              <w:rPr>
+                <w:sz w:val="24"/>
+              </w:rPr>
+              <w:t xml:space="preserve">Цена </w:t>
+            </w:r>
+            <w:r>
+              <w:rPr>
+                <w:i/>
+                <w:sz w:val="24"/>
+              </w:rPr>
+              <w:t>Operis</w:t>
+            </w:r>
+            <w:r>
+              <w:rPr>
+                <w:sz w:val="24"/>
+              </w:rPr>
+              <w:t xml:space="preserve"> </w:t>
+            </w:r>
+            <w:r>
+              <w:rPr>
+                <w:i/>
+                <w:sz w:val="24"/>
+              </w:rPr>
+              <w:t>OAK</w:t>
+            </w:r>
+          </w:p>
+        </w:tc>
+        <w:tc>
+          <w:tcPr>
+            <w:tcW w:w="1846" w:type="dxa"/>
+            <w:vAlign w:val="center"/>
+          </w:tcPr>
+          <w:p>
+            <w:pPr>
+              <w:pStyle w:val="Compact"/>
+              <w:spacing w:before="0" w:after="0" w:line="280" w:lineRule="exact"/>
+              <w:jc w:val="center"/>
+            </w:pPr>
+            <w:r>
+              <w:rPr>
+                <w:sz w:val="24"/>
+              </w:rPr>
+              <w:t xml:space="preserve">оценки 311,66 </w:t>
+            </w:r>
+            <w:r>
+              <w:rPr>
+                <w:i/>
+                <w:sz w:val="24"/>
+              </w:rPr>
+              <w:t>GBP</w:t>
+            </w:r>
+            <w:r>
+              <w:rPr>
+                <w:sz w:val="24"/>
+              </w:rPr>
+              <w:t xml:space="preserve"> в год (подписка) и около 2 400 </w:t>
+            </w:r>
+            <w:r>
+              <w:rPr>
+                <w:i/>
+                <w:sz w:val="24"/>
+              </w:rPr>
+              <w:t>USD</w:t>
+            </w:r>
+            <w:r>
+              <w:rPr>
+                <w:sz w:val="24"/>
+              </w:rPr>
+              <w:t xml:space="preserve"> в год за пользователя (оценка стороннего обзора)</w:t>
+            </w:r>
+          </w:p>
+        </w:tc>
+        <w:tc>
+          <w:tcPr>
+            <w:tcW w:w="1104" w:type="dxa"/>
+            <w:vAlign w:val="center"/>
+          </w:tcPr>
+          <w:p>
+            <w:pPr>
+              <w:pStyle w:val="Compact"/>
+              <w:spacing w:before="0" w:after="0" w:line="280" w:lineRule="exact"/>
+              <w:jc w:val="center"/>
+            </w:pPr>
+            <w:r>
+              <w:rPr>
+                <w:sz w:val="24"/>
+              </w:rPr>
+              <w:t>[18]</w:t>
+            </w:r>
+          </w:p>
+        </w:tc>
+        <w:tc>
+          <w:tcPr>
+            <w:tcW w:w="1884" w:type="dxa"/>
+            <w:vAlign w:val="center"/>
+          </w:tcPr>
+          <w:p>
+            <w:pPr>
+              <w:pStyle w:val="Compact"/>
+              <w:spacing w:before="0" w:after="0" w:line="280" w:lineRule="exact"/>
+              <w:jc w:val="center"/>
+            </w:pPr>
+            <w:r>
+              <w:rPr>
+                <w:sz w:val="24"/>
+              </w:rPr>
+              <w:t>низкая (разброс 8 раз)</w:t>
+            </w:r>
+          </w:p>
+        </w:tc>
+        <w:tc>
+          <w:tcPr>
+            <w:tcW w:w="2000" w:type="dxa"/>
+            <w:vAlign w:val="center"/>
+          </w:tcPr>
+          <w:p>
+            <w:pPr>
+              <w:pStyle w:val="Compact"/>
+              <w:spacing w:before="0" w:after="0" w:line="280" w:lineRule="exact"/>
+              <w:jc w:val="center"/>
+            </w:pPr>
+            <w:r>
+              <w:rPr>
+                <w:sz w:val="24"/>
+              </w:rPr>
+              <w:t xml:space="preserve">верхняя граница класса профессиональных надстроек; годовая цена </w:t>
+            </w:r>
+            <w:r>
+              <w:rPr>
+                <w:i/>
+                <w:sz w:val="24"/>
+              </w:rPr>
+              <w:t>Pro</w:t>
+            </w:r>
+            <w:r>
+              <w:rPr>
+                <w:sz w:val="24"/>
+              </w:rPr>
+              <w:t xml:space="preserve"> </w:t>
+            </w:r>
+            <w:r>
+              <w:rPr>
+                <w:i/>
+                <w:sz w:val="24"/>
+              </w:rPr>
+              <w:t>TableMind</w:t>
+            </w:r>
+            <w:r>
+              <w:rPr>
+                <w:sz w:val="24"/>
+              </w:rPr>
+              <w:t xml:space="preserve"> 228 </w:t>
+            </w:r>
+            <w:r>
+              <w:rPr>
+                <w:i/>
+                <w:sz w:val="24"/>
+              </w:rPr>
+              <w:t>EUR</w:t>
+            </w:r>
+            <w:r>
+              <w:rPr>
+                <w:sz w:val="24"/>
+              </w:rPr>
+              <w:t xml:space="preserve"> ниже</w:t>
+            </w:r>
+          </w:p>
+        </w:tc>
+      </w:tr>
+      <w:tr>
+        <w:trPr>
+          <w:cantSplit/>
+          <w:jc w:val="center"/>
+        </w:trPr>
+        <w:tc>
+          <w:tcPr>
+            <w:tcW w:w="597" w:type="dxa"/>
+            <w:vAlign w:val="center"/>
+          </w:tcPr>
+          <w:p>
+            <w:pPr>
+              <w:pStyle w:val="Compact"/>
+              <w:spacing w:before="0" w:after="0" w:line="280" w:lineRule="exact"/>
+              <w:jc w:val="center"/>
+            </w:pPr>
+            <w:r>
+              <w:rPr>
+                <w:sz w:val="24"/>
+              </w:rPr>
+              <w:t>5</w:t>
+            </w:r>
+          </w:p>
+        </w:tc>
+        <w:tc>
+          <w:tcPr>
+            <w:tcW w:w="1923" w:type="dxa"/>
+            <w:vAlign w:val="center"/>
+          </w:tcPr>
+          <w:p>
+            <w:pPr>
+              <w:pStyle w:val="Compact"/>
+              <w:spacing w:before="0" w:after="0" w:line="280" w:lineRule="exact"/>
+              <w:jc w:val="center"/>
+            </w:pPr>
+            <w:r>
+              <w:rPr>
+                <w:sz w:val="24"/>
+              </w:rPr>
+              <w:t xml:space="preserve">Цена </w:t>
+            </w:r>
+            <w:r>
+              <w:rPr>
+                <w:i/>
+                <w:sz w:val="24"/>
+              </w:rPr>
+              <w:t>DataSnipper</w:t>
+            </w:r>
+          </w:p>
+        </w:tc>
+        <w:tc>
+          <w:tcPr>
+            <w:tcW w:w="1846" w:type="dxa"/>
+            <w:vAlign w:val="center"/>
+          </w:tcPr>
+          <w:p>
+            <w:pPr>
+              <w:pStyle w:val="Compact"/>
+              <w:spacing w:before="0" w:after="0" w:line="280" w:lineRule="exact"/>
+              <w:jc w:val="center"/>
+            </w:pPr>
+            <w:r>
+              <w:rPr>
+                <w:sz w:val="24"/>
+              </w:rPr>
+              <w:t>прайс не публикуется; оценка от 64 </w:t>
+            </w:r>
+            <w:r>
+              <w:rPr>
+                <w:i/>
+                <w:sz w:val="24"/>
+              </w:rPr>
+              <w:t>USD</w:t>
+            </w:r>
+            <w:r>
+              <w:rPr>
+                <w:sz w:val="24"/>
+              </w:rPr>
+              <w:t xml:space="preserve"> за пользователя в месяц (около 768 </w:t>
+            </w:r>
+            <w:r>
+              <w:rPr>
+                <w:i/>
+                <w:sz w:val="24"/>
+              </w:rPr>
+              <w:t>USD</w:t>
+            </w:r>
+            <w:r>
+              <w:rPr>
+                <w:sz w:val="24"/>
+              </w:rPr>
+              <w:t xml:space="preserve"> в год)</w:t>
+            </w:r>
+          </w:p>
+        </w:tc>
+        <w:tc>
+          <w:tcPr>
+            <w:tcW w:w="1104" w:type="dxa"/>
+            <w:vAlign w:val="center"/>
+          </w:tcPr>
+          <w:p>
+            <w:pPr>
+              <w:pStyle w:val="Compact"/>
+              <w:spacing w:before="0" w:after="0" w:line="280" w:lineRule="exact"/>
+              <w:jc w:val="center"/>
+            </w:pPr>
+            <w:r>
+              <w:rPr>
+                <w:sz w:val="24"/>
+              </w:rPr>
+              <w:t>[19]</w:t>
+            </w:r>
+          </w:p>
+        </w:tc>
+        <w:tc>
+          <w:tcPr>
+            <w:tcW w:w="1884" w:type="dxa"/>
+            <w:vAlign w:val="center"/>
+          </w:tcPr>
+          <w:p>
+            <w:pPr>
+              <w:pStyle w:val="Compact"/>
+              <w:spacing w:before="0" w:after="0" w:line="280" w:lineRule="exact"/>
+              <w:jc w:val="center"/>
+            </w:pPr>
+            <w:r>
+              <w:rPr>
+                <w:sz w:val="24"/>
+              </w:rPr>
+              <w:t>низкая (оценка)</w:t>
+            </w:r>
+          </w:p>
+        </w:tc>
+        <w:tc>
+          <w:tcPr>
+            <w:tcW w:w="2000" w:type="dxa"/>
+            <w:vAlign w:val="center"/>
+          </w:tcPr>
+          <w:p>
+            <w:pPr>
+              <w:pStyle w:val="Compact"/>
+              <w:spacing w:before="0" w:after="0" w:line="280" w:lineRule="exact"/>
+              <w:jc w:val="center"/>
+            </w:pPr>
+            <w:r>
+              <w:rPr>
+                <w:sz w:val="24"/>
+              </w:rPr>
+              <w:t xml:space="preserve">ориентир верхнего ценового сегмента аудита; </w:t>
+            </w:r>
+            <w:r>
+              <w:rPr>
+                <w:i/>
+                <w:sz w:val="24"/>
+              </w:rPr>
+              <w:t>Pro</w:t>
+            </w:r>
+            <w:r>
+              <w:rPr>
+                <w:sz w:val="24"/>
+              </w:rPr>
+              <w:t xml:space="preserve"> </w:t>
+            </w:r>
+            <w:r>
+              <w:rPr>
+                <w:i/>
+                <w:sz w:val="24"/>
+              </w:rPr>
+              <w:t>TableMind</w:t>
+            </w:r>
+            <w:r>
+              <w:rPr>
+                <w:sz w:val="24"/>
+              </w:rPr>
+              <w:t xml:space="preserve"> дешевле примерно в три раза</w:t>
+            </w:r>
+          </w:p>
+        </w:tc>
+      </w:tr>
+      <w:tr>
+        <w:trPr>
+          <w:cantSplit/>
+          <w:jc w:val="center"/>
+        </w:trPr>
+        <w:tc>
+          <w:tcPr>
+            <w:tcW w:w="597" w:type="dxa"/>
+            <w:vAlign w:val="center"/>
+          </w:tcPr>
+          <w:p>
+            <w:pPr>
+              <w:pStyle w:val="Compact"/>
+              <w:spacing w:before="0" w:after="0" w:line="280" w:lineRule="exact"/>
+              <w:jc w:val="center"/>
+            </w:pPr>
+            <w:r>
+              <w:rPr>
+                <w:sz w:val="24"/>
+              </w:rPr>
+              <w:t>6</w:t>
+            </w:r>
+          </w:p>
+        </w:tc>
+        <w:tc>
+          <w:tcPr>
+            <w:tcW w:w="1923" w:type="dxa"/>
+            <w:vAlign w:val="center"/>
+          </w:tcPr>
+          <w:p>
+            <w:pPr>
+              <w:pStyle w:val="Compact"/>
+              <w:spacing w:before="0" w:after="0" w:line="280" w:lineRule="exact"/>
+              <w:jc w:val="center"/>
+            </w:pPr>
+            <w:r>
+              <w:rPr>
+                <w:sz w:val="24"/>
+              </w:rPr>
+              <w:t xml:space="preserve">Цена </w:t>
+            </w:r>
+            <w:r>
+              <w:rPr>
+                <w:i/>
+                <w:sz w:val="24"/>
+              </w:rPr>
+              <w:t>Datarails</w:t>
+            </w:r>
+          </w:p>
+        </w:tc>
+        <w:tc>
+          <w:tcPr>
+            <w:tcW w:w="1846" w:type="dxa"/>
+            <w:vAlign w:val="center"/>
+          </w:tcPr>
+          <w:p>
+            <w:pPr>
+              <w:pStyle w:val="Compact"/>
+              <w:spacing w:before="0" w:after="0" w:line="280" w:lineRule="exact"/>
+              <w:jc w:val="center"/>
+            </w:pPr>
+            <w:r>
+              <w:rPr>
+                <w:sz w:val="24"/>
+              </w:rPr>
+              <w:t>прайс не публикуется; оценки от 400 </w:t>
+            </w:r>
+            <w:r>
+              <w:rPr>
+                <w:i/>
+                <w:sz w:val="24"/>
+              </w:rPr>
+              <w:t>USD</w:t>
+            </w:r>
+            <w:r>
+              <w:rPr>
+                <w:sz w:val="24"/>
+              </w:rPr>
+              <w:t xml:space="preserve"> за пользователя в месяц, от 24 000 </w:t>
+            </w:r>
+            <w:r>
+              <w:rPr>
+                <w:i/>
+                <w:sz w:val="24"/>
+              </w:rPr>
+              <w:t>USD</w:t>
+            </w:r>
+            <w:r>
+              <w:rPr>
+                <w:sz w:val="24"/>
+              </w:rPr>
+              <w:t xml:space="preserve"> в год</w:t>
+            </w:r>
+          </w:p>
+        </w:tc>
+        <w:tc>
+          <w:tcPr>
+            <w:tcW w:w="1104" w:type="dxa"/>
+            <w:vAlign w:val="center"/>
+          </w:tcPr>
+          <w:p>
+            <w:pPr>
+              <w:pStyle w:val="Compact"/>
+              <w:spacing w:before="0" w:after="0" w:line="280" w:lineRule="exact"/>
+              <w:jc w:val="center"/>
+            </w:pPr>
+            <w:r>
+              <w:rPr>
+                <w:sz w:val="24"/>
+              </w:rPr>
+              <w:t>[20]</w:t>
+            </w:r>
+          </w:p>
+        </w:tc>
+        <w:tc>
+          <w:tcPr>
+            <w:tcW w:w="1884" w:type="dxa"/>
+            <w:vAlign w:val="center"/>
+          </w:tcPr>
+          <w:p>
+            <w:pPr>
+              <w:pStyle w:val="Compact"/>
+              <w:spacing w:before="0" w:after="0" w:line="280" w:lineRule="exact"/>
+              <w:jc w:val="center"/>
+            </w:pPr>
+            <w:r>
+              <w:rPr>
+                <w:sz w:val="24"/>
+              </w:rPr>
+              <w:t>низкая (оценка)</w:t>
+            </w:r>
+          </w:p>
+        </w:tc>
+        <w:tc>
+          <w:tcPr>
+            <w:tcW w:w="2000" w:type="dxa"/>
+            <w:vAlign w:val="center"/>
+          </w:tcPr>
+          <w:p>
+            <w:pPr>
+              <w:pStyle w:val="Compact"/>
+              <w:spacing w:before="0" w:after="0" w:line="280" w:lineRule="exact"/>
+              <w:jc w:val="center"/>
+            </w:pPr>
+            <w:r>
+              <w:rPr>
+                <w:sz w:val="24"/>
+              </w:rPr>
+              <w:t xml:space="preserve">относится к классу </w:t>
+            </w:r>
+            <w:r>
+              <w:rPr>
+                <w:i/>
+                <w:sz w:val="24"/>
+              </w:rPr>
+              <w:t>FP</w:t>
+            </w:r>
+            <w:r>
+              <w:rPr>
+                <w:sz w:val="24"/>
+              </w:rPr>
+              <w:t>&amp;</w:t>
+            </w:r>
+            <w:r>
+              <w:rPr>
+                <w:i/>
+                <w:sz w:val="24"/>
+              </w:rPr>
+              <w:t>A</w:t>
+            </w:r>
+            <w:r>
+              <w:rPr>
+                <w:sz w:val="24"/>
+              </w:rPr>
+              <w:t xml:space="preserve">-платформ, а не к </w:t>
+            </w:r>
+            <w:r>
+              <w:rPr>
+                <w:sz w:val="24"/>
+              </w:rPr>
+              <w:t>разовым аудитам таблиц; прямой конкуренции по цене нет</w:t>
+            </w:r>
+          </w:p>
+        </w:tc>
+      </w:tr>
+    </w:tbl>
+    <w:p>
+      <w:pPr>
+        <w:pStyle w:val="FirstParagraph"/>
+        <w:spacing w:before="0" w:after="0" w:line="360" w:lineRule="exact"/>
+        <w:ind w:firstLine="709"/>
+        <w:jc w:val="both"/>
+      </w:pPr>
+      <w:r>
+        <w:rPr>
+          <w:sz w:val="28"/>
+        </w:rPr>
+        <w:t xml:space="preserve">Найдены первичные данные по комиссии </w:t>
+      </w:r>
+      <w:r>
+        <w:rPr>
+          <w:i/>
+          <w:sz w:val="28"/>
+        </w:rPr>
+        <w:t>AppSource</w:t>
+      </w:r>
+      <w:r>
+        <w:rPr>
+          <w:sz w:val="28"/>
+        </w:rPr>
+        <w:t xml:space="preserve"> и занятости ЕС, а цены </w:t>
+      </w:r>
+      <w:r>
+        <w:rPr>
+          <w:i/>
+          <w:sz w:val="28"/>
+        </w:rPr>
+        <w:t>Arixcel</w:t>
+      </w:r>
+      <w:r>
+        <w:rPr>
+          <w:sz w:val="28"/>
+        </w:rPr>
+        <w:t xml:space="preserve">, </w:t>
+      </w:r>
+      <w:r>
+        <w:rPr>
+          <w:i/>
+          <w:sz w:val="28"/>
+        </w:rPr>
+        <w:t>Operis</w:t>
+      </w:r>
+      <w:r>
+        <w:rPr>
+          <w:sz w:val="28"/>
+        </w:rPr>
+        <w:t xml:space="preserve">, </w:t>
+      </w:r>
+      <w:r>
+        <w:rPr>
+          <w:i/>
+          <w:sz w:val="28"/>
+        </w:rPr>
+        <w:t>DataSnipper</w:t>
+      </w:r>
+      <w:r>
+        <w:rPr>
+          <w:sz w:val="28"/>
+        </w:rPr>
+        <w:t xml:space="preserve"> и </w:t>
+      </w:r>
+      <w:r>
+        <w:rPr>
+          <w:i/>
+          <w:sz w:val="28"/>
+        </w:rPr>
+        <w:t>Datarails</w:t>
+      </w:r>
+      <w:r>
+        <w:rPr>
+          <w:sz w:val="28"/>
+        </w:rPr>
+        <w:t xml:space="preserve"> остаются оценками третьих сторон. Для ценового коридора это означает, что нижняя граница </w:t>
+      </w:r>
+      <w:r>
+        <w:rPr>
+          <w:sz w:val="28"/>
+        </w:rPr>
+        <w:t>(</w:t>
+      </w:r>
+      <w:r>
+        <w:rPr>
+          <w:i/>
+          <w:sz w:val="28"/>
+        </w:rPr>
+        <w:t>Arixcel</w:t>
+      </w:r>
+      <w:r>
+        <w:rPr>
+          <w:sz w:val="28"/>
+        </w:rPr>
+        <w:t xml:space="preserve"> около 3,3 </w:t>
+      </w:r>
+      <w:r>
+        <w:rPr>
+          <w:i/>
+          <w:sz w:val="28"/>
+        </w:rPr>
+        <w:t>EUR</w:t>
+      </w:r>
+      <w:r>
+        <w:rPr>
+          <w:sz w:val="28"/>
+        </w:rPr>
+        <w:t xml:space="preserve"> в месяц) и верхняя (</w:t>
+      </w:r>
+      <w:r>
+        <w:rPr>
+          <w:i/>
+          <w:sz w:val="28"/>
+        </w:rPr>
+        <w:t>DataSnipper</w:t>
+      </w:r>
+      <w:r>
+        <w:rPr>
+          <w:sz w:val="28"/>
+        </w:rPr>
+        <w:t xml:space="preserve"> и </w:t>
+      </w:r>
+      <w:r>
+        <w:rPr>
+          <w:i/>
+          <w:sz w:val="28"/>
+        </w:rPr>
+        <w:t>Datarails</w:t>
+      </w:r>
+      <w:r>
+        <w:rPr>
+          <w:sz w:val="28"/>
+        </w:rPr>
+        <w:t xml:space="preserve"> от 350 </w:t>
+      </w:r>
+      <w:r>
+        <w:rPr>
+          <w:i/>
+          <w:sz w:val="28"/>
+        </w:rPr>
+        <w:t>EUR</w:t>
+      </w:r>
+      <w:r>
+        <w:rPr>
+          <w:sz w:val="28"/>
+        </w:rPr>
+        <w:t xml:space="preserve"> в месяц) уже задают диапазон, внутри которого цена 19 </w:t>
+      </w:r>
+      <w:r>
+        <w:rPr>
+          <w:i/>
+          <w:sz w:val="28"/>
+        </w:rPr>
+        <w:t>EUR</w:t>
+      </w:r>
+      <w:r>
+        <w:rPr>
+          <w:sz w:val="28"/>
+        </w:rPr>
+        <w:t xml:space="preserve"> выглядит осторожной; точные цены можно получить только запросом коммерческого предложения.</w:t>
+      </w:r>
+    </w:p>
+    <w:p>
+      <w:pPr>
+        <w:pStyle w:val="a0"/>
+        <w:spacing w:before="0" w:after="0" w:line="360" w:lineRule="exact"/>
+        <w:ind w:firstLine="709"/>
+        <w:jc w:val="both"/>
+      </w:pPr>
+      <w:r>
+        <w:rPr>
+          <w:sz w:val="28"/>
+        </w:rPr>
+        <w:t>Не закрыты: Великобритания (</w:t>
+      </w:r>
+      <w:r>
+        <w:rPr>
+          <w:i/>
+          <w:sz w:val="28"/>
+        </w:rPr>
+        <w:t>O</w:t>
+      </w:r>
+      <w:r>
+        <w:rPr>
+          <w:i/>
+          <w:sz w:val="28"/>
+        </w:rPr>
+        <w:t>NS</w:t>
+      </w:r>
+      <w:r>
+        <w:rPr>
+          <w:sz w:val="28"/>
+        </w:rPr>
+        <w:t xml:space="preserve">, код </w:t>
+      </w:r>
+      <w:r>
+        <w:rPr>
+          <w:i/>
+          <w:sz w:val="28"/>
+        </w:rPr>
+        <w:t>SOC</w:t>
+      </w:r>
+      <w:r>
+        <w:rPr>
+          <w:sz w:val="28"/>
+        </w:rPr>
+        <w:t xml:space="preserve"> 2421: данные доступны в наборе </w:t>
+      </w:r>
+      <w:r>
+        <w:rPr>
+          <w:i/>
+          <w:sz w:val="28"/>
+        </w:rPr>
+        <w:t>Nomis</w:t>
+      </w:r>
+      <w:r>
+        <w:rPr>
+          <w:sz w:val="28"/>
+        </w:rPr>
+        <w:t xml:space="preserve"> </w:t>
+      </w:r>
+      <w:r>
+        <w:rPr>
+          <w:i/>
+          <w:sz w:val="28"/>
+        </w:rPr>
+        <w:t>APS218</w:t>
+      </w:r>
+      <w:r>
+        <w:rPr>
+          <w:sz w:val="28"/>
+        </w:rPr>
+        <w:t xml:space="preserve"> только скачиванием), страны сайтов в </w:t>
+      </w:r>
+      <w:r>
+        <w:rPr>
+          <w:i/>
+          <w:sz w:val="28"/>
+        </w:rPr>
+        <w:t>Similarweb</w:t>
+      </w:r>
+      <w:r>
+        <w:rPr>
+          <w:sz w:val="28"/>
+        </w:rPr>
+        <w:t xml:space="preserve"> и четыре домена, не снятых из-за суточного лимита (повтор после сброса лимита), а также </w:t>
+      </w:r>
+      <w:r>
+        <w:rPr>
+          <w:i/>
+          <w:sz w:val="28"/>
+        </w:rPr>
+        <w:t>Google</w:t>
+      </w:r>
+      <w:r>
+        <w:rPr>
+          <w:sz w:val="28"/>
+        </w:rPr>
+        <w:t xml:space="preserve"> </w:t>
+      </w:r>
+      <w:r>
+        <w:rPr>
+          <w:i/>
+          <w:sz w:val="28"/>
+        </w:rPr>
+        <w:t>Keyword</w:t>
+      </w:r>
+      <w:r>
+        <w:rPr>
+          <w:sz w:val="28"/>
+        </w:rPr>
+        <w:t xml:space="preserve"> </w:t>
+      </w:r>
+      <w:r>
+        <w:rPr>
+          <w:i/>
+          <w:sz w:val="28"/>
+        </w:rPr>
+        <w:t>Planner</w:t>
+      </w:r>
+      <w:r>
+        <w:rPr>
+          <w:sz w:val="28"/>
+        </w:rPr>
+        <w:t xml:space="preserve"> и </w:t>
+      </w:r>
+      <w:r>
+        <w:rPr>
+          <w:i/>
+          <w:sz w:val="28"/>
+        </w:rPr>
+        <w:t>Semrush</w:t>
+      </w:r>
+      <w:r>
+        <w:rPr>
+          <w:sz w:val="28"/>
+        </w:rPr>
+        <w:t xml:space="preserve">, требующие рекламного кабинета </w:t>
+      </w:r>
+      <w:r>
+        <w:rPr>
+          <w:sz w:val="28"/>
+        </w:rPr>
+        <w:t xml:space="preserve">и платного доступа; взамен для англоязычного поиска сохраняется оценка по </w:t>
+      </w:r>
+      <w:r>
+        <w:rPr>
+          <w:i/>
+          <w:sz w:val="28"/>
+        </w:rPr>
+        <w:t>Google</w:t>
+      </w:r>
+      <w:r>
+        <w:rPr>
+          <w:sz w:val="28"/>
+        </w:rPr>
+        <w:t xml:space="preserve"> </w:t>
+      </w:r>
+      <w:r>
+        <w:rPr>
+          <w:i/>
+          <w:sz w:val="28"/>
+        </w:rPr>
+        <w:t>Trends</w:t>
+      </w:r>
+      <w:r>
+        <w:rPr>
+          <w:sz w:val="28"/>
+        </w:rPr>
+        <w:t xml:space="preserve"> (ЛР1).</w:t>
+      </w:r>
+    </w:p>
+    <w:bookmarkEnd w:id="44"/>
     <w:sectPr>
       <w:headerReference w:type="default" r:id="rId13"/>
       <w:footerReference w:type="default" r:id="rId14"/>
@@ -30276,7 +32812,7 @@
   <w:abstractNum w:abstractNumId="0" w15:restartNumberingAfterBreak="0">
     <w:nsid w:val="0000A990"/>
     <w:multiLevelType w:val="multilevel"/>
-    <w:tmpl w:val="5CAEF1E4"/>
+    <w:tmpl w:val="DD7A0B54"/>
     <w:lvl w:ilvl="0">
       <w:numFmt w:val="bullet"/>
       <w:lvlText w:val=" "/>
@@ -30353,7 +32889,7 @@
   <w:abstractNum w:abstractNumId="1" w15:restartNumberingAfterBreak="0">
     <w:nsid w:val="00A99411"/>
     <w:multiLevelType w:val="multilevel"/>
-    <w:tmpl w:val="4F667950"/>
+    <w:tmpl w:val="F80EF7FA"/>
     <w:lvl w:ilvl="0">
       <w:start w:val="1"/>
       <w:numFmt w:val="decimal"/>
@@ -31831,7 +34367,7 @@
     <w:autoRedefine/>
     <w:uiPriority w:val="39"/>
     <w:unhideWhenUsed/>
-    <w:rsid w:val="006D36A8"/>
+    <w:rsid w:val="00D73759"/>
     <w:pPr>
       <w:spacing w:after="100"/>
     </w:pPr>
@@ -31843,7 +34379,7 @@
     <w:autoRedefine/>
     <w:uiPriority w:val="39"/>
     <w:unhideWhenUsed/>
-    <w:rsid w:val="006D36A8"/>
+    <w:rsid w:val="00D73759"/>
     <w:pPr>
       <w:spacing w:after="100"/>
       <w:ind w:left="240"/>

</xml_diff>

<commit_message>
lab2-3/lab5: ONS, extra Similarweb snapshot, vendor prices (Arixcel, Operis), competitor pages; docs rebuilt
</commit_message>
<xml_diff>
--- a/ЛР2-3_Объем_рынка/ОТЧЕТ_ЛР2-3_TableMind.docx
+++ b/ЛР2-3_Объем_рынка/ОТЧЕТ_ЛР2-3_TableMind.docx
@@ -245,7 +245,7 @@
       <w:r>
         <w:fldChar w:fldCharType="separate"/>
       </w:r>
-      <w:hyperlink w:anchor="_Toc241934869" w:history="1">
+      <w:hyperlink w:anchor="_Toc241936229" w:history="1">
         <w:r>
           <w:rPr>
             <w:rStyle w:val="af"/>
@@ -273,7 +273,7 @@
             <w:noProof/>
             <w:webHidden/>
           </w:rPr>
-          <w:instrText xml:space="preserve"> PAGEREF _Toc241934869 \h </w:instrText>
+          <w:instrText xml:space="preserve"> PAGEREF _Toc241936229 \h </w:instrText>
         </w:r>
         <w:r>
           <w:rPr>
@@ -314,7 +314,7 @@
           <w:noProof/>
         </w:rPr>
       </w:pPr>
-      <w:hyperlink w:anchor="_Toc241934870" w:history="1">
+      <w:hyperlink w:anchor="_Toc241936230" w:history="1">
         <w:r>
           <w:rPr>
             <w:rStyle w:val="af"/>
@@ -342,7 +342,7 @@
             <w:noProof/>
             <w:webHidden/>
           </w:rPr>
-          <w:instrText xml:space="preserve"> PAGEREF _Toc241934870 \h </w:instrText>
+          <w:instrText xml:space="preserve"> PAGEREF _Toc241936230 \h </w:instrText>
         </w:r>
         <w:r>
           <w:rPr>
@@ -383,7 +383,7 @@
           <w:noProof/>
         </w:rPr>
       </w:pPr>
-      <w:hyperlink w:anchor="_Toc241934871" w:history="1">
+      <w:hyperlink w:anchor="_Toc241936231" w:history="1">
         <w:r>
           <w:rPr>
             <w:rStyle w:val="af"/>
@@ -411,7 +411,7 @@
             <w:noProof/>
             <w:webHidden/>
           </w:rPr>
-          <w:instrText xml:space="preserve"> PAGEREF _Toc241934871 \h </w:instrText>
+          <w:instrText xml:space="preserve"> PAGEREF _Toc241936231 \h </w:instrText>
         </w:r>
         <w:r>
           <w:rPr>
@@ -452,7 +452,7 @@
           <w:noProof/>
         </w:rPr>
       </w:pPr>
-      <w:hyperlink w:anchor="_Toc241934872" w:history="1">
+      <w:hyperlink w:anchor="_Toc241936232" w:history="1">
         <w:r>
           <w:rPr>
             <w:rStyle w:val="af"/>
@@ -489,7 +489,7 @@
             <w:noProof/>
             <w:webHidden/>
           </w:rPr>
-          <w:instrText xml:space="preserve"> PAGEREF _Toc241934872 \h </w:instrText>
+          <w:instrText xml:space="preserve"> PAGEREF _Toc241936232 \h </w:instrText>
         </w:r>
         <w:r>
           <w:rPr>
@@ -530,7 +530,7 @@
           <w:noProof/>
         </w:rPr>
       </w:pPr>
-      <w:hyperlink w:anchor="_Toc241934873" w:history="1">
+      <w:hyperlink w:anchor="_Toc241936233" w:history="1">
         <w:r>
           <w:rPr>
             <w:rStyle w:val="af"/>
@@ -567,7 +567,7 @@
             <w:noProof/>
             <w:webHidden/>
           </w:rPr>
-          <w:instrText xml:space="preserve"> PAGEREF _Toc241934873 \h </w:instrText>
+          <w:instrText xml:space="preserve"> PAGEREF _Toc241936233 \h </w:instrText>
         </w:r>
         <w:r>
           <w:rPr>
@@ -608,7 +608,7 @@
           <w:noProof/>
         </w:rPr>
       </w:pPr>
-      <w:hyperlink w:anchor="_Toc241934874" w:history="1">
+      <w:hyperlink w:anchor="_Toc241936234" w:history="1">
         <w:r>
           <w:rPr>
             <w:rStyle w:val="af"/>
@@ -645,7 +645,7 @@
             <w:noProof/>
             <w:webHidden/>
           </w:rPr>
-          <w:instrText xml:space="preserve"> PAGEREF _Toc241934874 \h </w:instrText>
+          <w:instrText xml:space="preserve"> PAGEREF _Toc241936234 \h </w:instrText>
         </w:r>
         <w:r>
           <w:rPr>
@@ -686,7 +686,7 @@
           <w:noProof/>
         </w:rPr>
       </w:pPr>
-      <w:hyperlink w:anchor="_Toc241934875" w:history="1">
+      <w:hyperlink w:anchor="_Toc241936235" w:history="1">
         <w:r>
           <w:rPr>
             <w:rStyle w:val="af"/>
@@ -714,7 +714,7 @@
             <w:noProof/>
             <w:webHidden/>
           </w:rPr>
-          <w:instrText xml:space="preserve"> PAGEREF _Toc241934875 \h </w:instrText>
+          <w:instrText xml:space="preserve"> PAGEREF _Toc241936235 \h </w:instrText>
         </w:r>
         <w:r>
           <w:rPr>
@@ -755,7 +755,7 @@
           <w:noProof/>
         </w:rPr>
       </w:pPr>
-      <w:hyperlink w:anchor="_Toc241934876" w:history="1">
+      <w:hyperlink w:anchor="_Toc241936236" w:history="1">
         <w:r>
           <w:rPr>
             <w:rStyle w:val="af"/>
@@ -783,7 +783,7 @@
             <w:noProof/>
             <w:webHidden/>
           </w:rPr>
-          <w:instrText xml:space="preserve"> PAGEREF _Toc241934876 \h </w:instrText>
+          <w:instrText xml:space="preserve"> PAGEREF _Toc241936236 \h </w:instrText>
         </w:r>
         <w:r>
           <w:rPr>
@@ -824,7 +824,7 @@
           <w:noProof/>
         </w:rPr>
       </w:pPr>
-      <w:hyperlink w:anchor="_Toc241934877" w:history="1">
+      <w:hyperlink w:anchor="_Toc241936237" w:history="1">
         <w:r>
           <w:rPr>
             <w:rStyle w:val="af"/>
@@ -861,7 +861,7 @@
             <w:noProof/>
             <w:webHidden/>
           </w:rPr>
-          <w:instrText xml:space="preserve"> PAGEREF _Toc241934877 \h </w:instrText>
+          <w:instrText xml:space="preserve"> PAGEREF _Toc241936237 \h </w:instrText>
         </w:r>
         <w:r>
           <w:rPr>
@@ -902,7 +902,7 @@
           <w:noProof/>
         </w:rPr>
       </w:pPr>
-      <w:hyperlink w:anchor="_Toc241934878" w:history="1">
+      <w:hyperlink w:anchor="_Toc241936238" w:history="1">
         <w:r>
           <w:rPr>
             <w:rStyle w:val="af"/>
@@ -930,7 +930,7 @@
             <w:noProof/>
             <w:webHidden/>
           </w:rPr>
-          <w:instrText xml:space="preserve"> PAGEREF _Toc241934878 \h </w:instrText>
+          <w:instrText xml:space="preserve"> PAGEREF _Toc241936238 \h </w:instrText>
         </w:r>
         <w:r>
           <w:rPr>
@@ -971,7 +971,7 @@
           <w:noProof/>
         </w:rPr>
       </w:pPr>
-      <w:hyperlink w:anchor="_Toc241934879" w:history="1">
+      <w:hyperlink w:anchor="_Toc241936239" w:history="1">
         <w:r>
           <w:rPr>
             <w:rStyle w:val="af"/>
@@ -999,7 +999,7 @@
             <w:noProof/>
             <w:webHidden/>
           </w:rPr>
-          <w:instrText xml:space="preserve"> PAGEREF _Toc241934879 \h </w:instrText>
+          <w:instrText xml:space="preserve"> PAGEREF _Toc241936239 \h </w:instrText>
         </w:r>
         <w:r>
           <w:rPr>
@@ -1040,7 +1040,7 @@
           <w:noProof/>
         </w:rPr>
       </w:pPr>
-      <w:hyperlink w:anchor="_Toc241934880" w:history="1">
+      <w:hyperlink w:anchor="_Toc241936240" w:history="1">
         <w:r>
           <w:rPr>
             <w:rStyle w:val="af"/>
@@ -1068,7 +1068,7 @@
             <w:noProof/>
             <w:webHidden/>
           </w:rPr>
-          <w:instrText xml:space="preserve"> PAGEREF _Toc241934880 \h </w:instrText>
+          <w:instrText xml:space="preserve"> PAGEREF _Toc241936240 \h </w:instrText>
         </w:r>
         <w:r>
           <w:rPr>
@@ -1109,7 +1109,7 @@
           <w:noProof/>
         </w:rPr>
       </w:pPr>
-      <w:hyperlink w:anchor="_Toc241934881" w:history="1">
+      <w:hyperlink w:anchor="_Toc241936241" w:history="1">
         <w:r>
           <w:rPr>
             <w:rStyle w:val="af"/>
@@ -1137,7 +1137,7 @@
             <w:noProof/>
             <w:webHidden/>
           </w:rPr>
-          <w:instrText xml:space="preserve"> PAGEREF _Toc241934881 \h </w:instrText>
+          <w:instrText xml:space="preserve"> PAGEREF _Toc241936241 \h </w:instrText>
         </w:r>
         <w:r>
           <w:rPr>
@@ -1178,7 +1178,7 @@
           <w:noProof/>
         </w:rPr>
       </w:pPr>
-      <w:hyperlink w:anchor="_Toc241934882" w:history="1">
+      <w:hyperlink w:anchor="_Toc241936242" w:history="1">
         <w:r>
           <w:rPr>
             <w:rStyle w:val="af"/>
@@ -1206,7 +1206,7 @@
             <w:noProof/>
             <w:webHidden/>
           </w:rPr>
-          <w:instrText xml:space="preserve"> PAGEREF _Toc241934882 \h </w:instrText>
+          <w:instrText xml:space="preserve"> PAGEREF _Toc241936242 \h </w:instrText>
         </w:r>
         <w:r>
           <w:rPr>
@@ -1247,7 +1247,7 @@
           <w:noProof/>
         </w:rPr>
       </w:pPr>
-      <w:hyperlink w:anchor="_Toc241934883" w:history="1">
+      <w:hyperlink w:anchor="_Toc241936243" w:history="1">
         <w:r>
           <w:rPr>
             <w:rStyle w:val="af"/>
@@ -1275,7 +1275,7 @@
             <w:noProof/>
             <w:webHidden/>
           </w:rPr>
-          <w:instrText xml:space="preserve"> PAGEREF _Toc241934883 \h </w:instrText>
+          <w:instrText xml:space="preserve"> PAGEREF _Toc241936243 \h </w:instrText>
         </w:r>
         <w:r>
           <w:rPr>
@@ -1316,7 +1316,7 @@
           <w:noProof/>
         </w:rPr>
       </w:pPr>
-      <w:hyperlink w:anchor="_Toc241934884" w:history="1">
+      <w:hyperlink w:anchor="_Toc241936244" w:history="1">
         <w:r>
           <w:rPr>
             <w:rStyle w:val="af"/>
@@ -1344,7 +1344,7 @@
             <w:noProof/>
             <w:webHidden/>
           </w:rPr>
-          <w:instrText xml:space="preserve"> PAGEREF _Toc241934884 \h </w:instrText>
+          <w:instrText xml:space="preserve"> PAGEREF _Toc241936244 \h </w:instrText>
         </w:r>
         <w:r>
           <w:rPr>
@@ -1385,7 +1385,7 @@
           <w:noProof/>
         </w:rPr>
       </w:pPr>
-      <w:hyperlink w:anchor="_Toc241934885" w:history="1">
+      <w:hyperlink w:anchor="_Toc241936245" w:history="1">
         <w:r>
           <w:rPr>
             <w:rStyle w:val="af"/>
@@ -1413,7 +1413,7 @@
             <w:noProof/>
             <w:webHidden/>
           </w:rPr>
-          <w:instrText xml:space="preserve"> PAGEREF _Toc241934885 \h </w:instrText>
+          <w:instrText xml:space="preserve"> PAGEREF _Toc241936245 \h </w:instrText>
         </w:r>
         <w:r>
           <w:rPr>
@@ -1454,7 +1454,7 @@
           <w:noProof/>
         </w:rPr>
       </w:pPr>
-      <w:hyperlink w:anchor="_Toc241934886" w:history="1">
+      <w:hyperlink w:anchor="_Toc241936246" w:history="1">
         <w:r>
           <w:rPr>
             <w:rStyle w:val="af"/>
@@ -1482,7 +1482,7 @@
             <w:noProof/>
             <w:webHidden/>
           </w:rPr>
-          <w:instrText xml:space="preserve"> PAGEREF _Toc241934886 \h </w:instrText>
+          <w:instrText xml:space="preserve"> PAGEREF _Toc241936246 \h </w:instrText>
         </w:r>
         <w:r>
           <w:rPr>
@@ -1523,7 +1523,7 @@
           <w:noProof/>
         </w:rPr>
       </w:pPr>
-      <w:hyperlink w:anchor="_Toc241934887" w:history="1">
+      <w:hyperlink w:anchor="_Toc241936247" w:history="1">
         <w:r>
           <w:rPr>
             <w:rStyle w:val="af"/>
@@ -1551,7 +1551,7 @@
             <w:noProof/>
             <w:webHidden/>
           </w:rPr>
-          <w:instrText xml:space="preserve"> PAGEREF _Toc241934887 \h </w:instrText>
+          <w:instrText xml:space="preserve"> PAGEREF _Toc241936247 \h </w:instrText>
         </w:r>
         <w:r>
           <w:rPr>
@@ -1592,7 +1592,7 @@
           <w:noProof/>
         </w:rPr>
       </w:pPr>
-      <w:hyperlink w:anchor="_Toc241934888" w:history="1">
+      <w:hyperlink w:anchor="_Toc241936248" w:history="1">
         <w:r>
           <w:rPr>
             <w:rStyle w:val="af"/>
@@ -1620,7 +1620,7 @@
             <w:noProof/>
             <w:webHidden/>
           </w:rPr>
-          <w:instrText xml:space="preserve"> PAGEREF _Toc241934888 \h </w:instrText>
+          <w:instrText xml:space="preserve"> PAGEREF _Toc241936248 \h </w:instrText>
         </w:r>
         <w:r>
           <w:rPr>
@@ -1661,7 +1661,7 @@
           <w:noProof/>
         </w:rPr>
       </w:pPr>
-      <w:hyperlink w:anchor="_Toc241934889" w:history="1">
+      <w:hyperlink w:anchor="_Toc241936249" w:history="1">
         <w:r>
           <w:rPr>
             <w:rStyle w:val="af"/>
@@ -1689,7 +1689,7 @@
             <w:noProof/>
             <w:webHidden/>
           </w:rPr>
-          <w:instrText xml:space="preserve"> PAGEREF _Toc241934889 \h </w:instrText>
+          <w:instrText xml:space="preserve"> PAGEREF _Toc241936249 \h </w:instrText>
         </w:r>
         <w:r>
           <w:rPr>
@@ -1730,7 +1730,7 @@
           <w:noProof/>
         </w:rPr>
       </w:pPr>
-      <w:hyperlink w:anchor="_Toc241934890" w:history="1">
+      <w:hyperlink w:anchor="_Toc241936250" w:history="1">
         <w:r>
           <w:rPr>
             <w:rStyle w:val="af"/>
@@ -1758,7 +1758,7 @@
             <w:noProof/>
             <w:webHidden/>
           </w:rPr>
-          <w:instrText xml:space="preserve"> PAGEREF _Toc241934890 \h </w:instrText>
+          <w:instrText xml:space="preserve"> PAGEREF _Toc241936250 \h </w:instrText>
         </w:r>
         <w:r>
           <w:rPr>
@@ -1799,7 +1799,7 @@
           <w:noProof/>
         </w:rPr>
       </w:pPr>
-      <w:hyperlink w:anchor="_Toc241934891" w:history="1">
+      <w:hyperlink w:anchor="_Toc241936251" w:history="1">
         <w:r>
           <w:rPr>
             <w:rStyle w:val="af"/>
@@ -1827,7 +1827,7 @@
             <w:noProof/>
             <w:webHidden/>
           </w:rPr>
-          <w:instrText xml:space="preserve"> PAGEREF _Toc241934891 \h </w:instrText>
+          <w:instrText xml:space="preserve"> PAGEREF _Toc241936251 \h </w:instrText>
         </w:r>
         <w:r>
           <w:rPr>
@@ -1873,7 +1873,7 @@
         <w:spacing w:before="0" w:after="360" w:line="360" w:lineRule="exact"/>
         <w:ind w:firstLine="709"/>
       </w:pPr>
-      <w:bookmarkStart w:id="1" w:name="_Toc241934869"/>
+      <w:bookmarkStart w:id="1" w:name="_Toc241936229"/>
       <w:r>
         <w:rPr>
           <w:b/>
@@ -2179,7 +2179,7 @@
         <w:ind w:firstLine="709"/>
       </w:pPr>
       <w:bookmarkStart w:id="2" w:name="_b608aa976fc82a0faaf3b83f58c735968afd03b"/>
-      <w:bookmarkStart w:id="3" w:name="_Toc241934870"/>
+      <w:bookmarkStart w:id="3" w:name="_Toc241936230"/>
       <w:bookmarkEnd w:id="0"/>
       <w:r>
         <w:rPr>
@@ -2257,7 +2257,7 @@
         <w:ind w:firstLine="709"/>
       </w:pPr>
       <w:bookmarkStart w:id="4" w:name="_6ea6bf0a5ec92c733c53e44899cf0806bdc5e39"/>
-      <w:bookmarkStart w:id="5" w:name="_Toc241934871"/>
+      <w:bookmarkStart w:id="5" w:name="_Toc241936231"/>
       <w:r>
         <w:rPr>
           <w:b/>
@@ -3213,7 +3213,7 @@
         <w:ind w:firstLine="709"/>
       </w:pPr>
       <w:bookmarkStart w:id="6" w:name="_7a0c967539b5ef143597c37b0951dae8b296890"/>
-      <w:bookmarkStart w:id="7" w:name="_Toc241934872"/>
+      <w:bookmarkStart w:id="7" w:name="_Toc241936232"/>
       <w:bookmarkEnd w:id="4"/>
       <w:r>
         <w:rPr>
@@ -5646,7 +5646,7 @@
           <w:sz w:val="28"/>
         </w:rPr>
         <w:drawing>
-          <wp:inline distT="0" distB="0" distL="0" distR="0" wp14:anchorId="183C7C9D" wp14:editId="63854CA7">
+          <wp:inline distT="0" distB="0" distL="0" distR="0" wp14:anchorId="62E5D349" wp14:editId="25E78597">
             <wp:extent cx="5334000" cy="3122341"/>
             <wp:effectExtent l="0" t="0" r="0" b="0"/>
             <wp:docPr id="12" name="Picture"/>
@@ -6457,7 +6457,7 @@
           <w:sz w:val="28"/>
         </w:rPr>
         <w:drawing>
-          <wp:inline distT="0" distB="0" distL="0" distR="0" wp14:anchorId="0BDA96A9" wp14:editId="5BD28BC3">
+          <wp:inline distT="0" distB="0" distL="0" distR="0" wp14:anchorId="3DFCC52D" wp14:editId="25252897">
             <wp:extent cx="5334000" cy="3252439"/>
             <wp:effectExtent l="0" t="0" r="0" b="0"/>
             <wp:docPr id="15" name="Picture"/>
@@ -6618,7 +6618,7 @@
         <w:ind w:firstLine="709"/>
       </w:pPr>
       <w:bookmarkStart w:id="8" w:name="_da959056159f19dff160d665d57702b18af1ddd"/>
-      <w:bookmarkStart w:id="9" w:name="_Toc241934873"/>
+      <w:bookmarkStart w:id="9" w:name="_Toc241936233"/>
       <w:bookmarkEnd w:id="6"/>
       <w:r>
         <w:rPr>
@@ -9732,7 +9732,7 @@
         <w:ind w:firstLine="709"/>
       </w:pPr>
       <w:bookmarkStart w:id="10" w:name="_06e2001e7574ebc77f8406bc11ca3db76d00c2a"/>
-      <w:bookmarkStart w:id="11" w:name="_Toc241934874"/>
+      <w:bookmarkStart w:id="11" w:name="_Toc241936234"/>
       <w:bookmarkEnd w:id="8"/>
       <w:r>
         <w:rPr>
@@ -10536,7 +10536,7 @@
         <w:ind w:firstLine="709"/>
       </w:pPr>
       <w:bookmarkStart w:id="12" w:name="_606fa79e4d4f49d8da929021c2a978685b741ea"/>
-      <w:bookmarkStart w:id="13" w:name="_Toc241934875"/>
+      <w:bookmarkStart w:id="13" w:name="_Toc241936235"/>
       <w:bookmarkEnd w:id="10"/>
       <w:r>
         <w:rPr>
@@ -12970,7 +12970,7 @@
         <w:ind w:firstLine="709"/>
       </w:pPr>
       <w:bookmarkStart w:id="14" w:name="_2314d5998da626860a70184e0b470b0b8504694"/>
-      <w:bookmarkStart w:id="15" w:name="_Toc241934876"/>
+      <w:bookmarkStart w:id="15" w:name="_Toc241936236"/>
       <w:bookmarkEnd w:id="12"/>
       <w:r>
         <w:rPr>
@@ -13598,7 +13598,7 @@
         <w:ind w:firstLine="709"/>
       </w:pPr>
       <w:bookmarkStart w:id="16" w:name="_42bac9f10c820a94a4112d44417ea6b5d14bf7d"/>
-      <w:bookmarkStart w:id="17" w:name="_Toc241934877"/>
+      <w:bookmarkStart w:id="17" w:name="_Toc241936237"/>
       <w:bookmarkEnd w:id="14"/>
       <w:r>
         <w:rPr>
@@ -15505,7 +15505,7 @@
         <w:ind w:firstLine="709"/>
       </w:pPr>
       <w:bookmarkStart w:id="18" w:name="_62882a27ae1c57302eff280b02701a311900947"/>
-      <w:bookmarkStart w:id="19" w:name="_Toc241934878"/>
+      <w:bookmarkStart w:id="19" w:name="_Toc241936238"/>
       <w:bookmarkEnd w:id="16"/>
       <w:r>
         <w:rPr>
@@ -16894,7 +16894,7 @@
         <w:ind w:firstLine="709"/>
       </w:pPr>
       <w:bookmarkStart w:id="20" w:name="_2c7ec3ecf17663584d0d27e07e31cbd2a0948cf"/>
-      <w:bookmarkStart w:id="21" w:name="_Toc241934879"/>
+      <w:bookmarkStart w:id="21" w:name="_Toc241936239"/>
       <w:bookmarkEnd w:id="18"/>
       <w:r>
         <w:rPr>
@@ -19229,7 +19229,7 @@
         <w:ind w:firstLine="709"/>
       </w:pPr>
       <w:bookmarkStart w:id="22" w:name="_8d34778965163a5752bc27698d1f7e786ff5c87"/>
-      <w:bookmarkStart w:id="23" w:name="_Toc241934880"/>
+      <w:bookmarkStart w:id="23" w:name="_Toc241936240"/>
       <w:bookmarkEnd w:id="20"/>
       <w:r>
         <w:rPr>
@@ -20384,7 +20384,7 @@
           <w:sz w:val="28"/>
         </w:rPr>
         <w:drawing>
-          <wp:inline distT="0" distB="0" distL="0" distR="0" wp14:anchorId="3748A4C9" wp14:editId="78E690E7">
+          <wp:inline distT="0" distB="0" distL="0" distR="0" wp14:anchorId="1D92E925" wp14:editId="28070470">
             <wp:extent cx="5334000" cy="2992243"/>
             <wp:effectExtent l="0" t="0" r="0" b="0"/>
             <wp:docPr id="26" name="Picture"/>
@@ -21230,7 +21230,7 @@
           <w:sz w:val="28"/>
         </w:rPr>
         <w:drawing>
-          <wp:inline distT="0" distB="0" distL="0" distR="0" wp14:anchorId="4051DE9C" wp14:editId="1FD5E7B5">
+          <wp:inline distT="0" distB="0" distL="0" distR="0" wp14:anchorId="304207EB" wp14:editId="703683EE">
             <wp:extent cx="5334000" cy="2471853"/>
             <wp:effectExtent l="0" t="0" r="0" b="0"/>
             <wp:docPr id="29" name="Picture"/>
@@ -21728,7 +21728,7 @@
         <w:ind w:firstLine="709"/>
       </w:pPr>
       <w:bookmarkStart w:id="24" w:name="_e6e1aac57bb528344b9009e4599364161f48047"/>
-      <w:bookmarkStart w:id="25" w:name="_Toc241934881"/>
+      <w:bookmarkStart w:id="25" w:name="_Toc241936241"/>
       <w:bookmarkEnd w:id="22"/>
       <w:r>
         <w:rPr>
@@ -22646,7 +22646,7 @@
         </w:rPr>
         <w:lastRenderedPageBreak/>
         <w:drawing>
-          <wp:inline distT="0" distB="0" distL="0" distR="0" wp14:anchorId="6C26C6D8" wp14:editId="26A7403C">
+          <wp:inline distT="0" distB="0" distL="0" distR="0" wp14:anchorId="76703F30" wp14:editId="4B350CD9">
             <wp:extent cx="5334000" cy="2341756"/>
             <wp:effectExtent l="0" t="0" r="0" b="0"/>
             <wp:docPr id="33" name="Picture"/>
@@ -22877,7 +22877,7 @@
         <w:ind w:firstLine="709"/>
       </w:pPr>
       <w:bookmarkStart w:id="26" w:name="_6a64c25cd48aeb5a2bf3dc411d56d805a6b5d7e"/>
-      <w:bookmarkStart w:id="27" w:name="_Toc241934882"/>
+      <w:bookmarkStart w:id="27" w:name="_Toc241936242"/>
       <w:bookmarkEnd w:id="24"/>
       <w:r>
         <w:rPr>
@@ -22936,7 +22936,7 @@
         </w:rPr>
         <w:lastRenderedPageBreak/>
         <w:drawing>
-          <wp:inline distT="0" distB="0" distL="0" distR="0" wp14:anchorId="795809B2" wp14:editId="4178F1F1">
+          <wp:inline distT="0" distB="0" distL="0" distR="0" wp14:anchorId="4D3AB6C6" wp14:editId="6082B0E1">
             <wp:extent cx="5334000" cy="2471853"/>
             <wp:effectExtent l="0" t="0" r="0" b="0"/>
             <wp:docPr id="37" name="Picture"/>
@@ -23161,7 +23161,7 @@
         <w:ind w:firstLine="709"/>
       </w:pPr>
       <w:bookmarkStart w:id="28" w:name="_8cdf61ec50cc46d2aaeadce1b560fea28ea116e"/>
-      <w:bookmarkStart w:id="29" w:name="_Toc241934883"/>
+      <w:bookmarkStart w:id="29" w:name="_Toc241936243"/>
       <w:bookmarkEnd w:id="26"/>
       <w:r>
         <w:rPr>
@@ -23277,7 +23277,7 @@
         <w:ind w:firstLine="709"/>
       </w:pPr>
       <w:bookmarkStart w:id="30" w:name="_1bfdad9d2d88ddb6ca16c31c1d4d4943679f32f"/>
-      <w:bookmarkStart w:id="31" w:name="_Toc241934884"/>
+      <w:bookmarkStart w:id="31" w:name="_Toc241936244"/>
       <w:bookmarkEnd w:id="28"/>
       <w:bookmarkEnd w:id="2"/>
       <w:r>
@@ -23815,7 +23815,7 @@
         <w:jc w:val="center"/>
       </w:pPr>
       <w:bookmarkStart w:id="32" w:name="_выводы"/>
-      <w:bookmarkStart w:id="33" w:name="_Toc241934885"/>
+      <w:bookmarkStart w:id="33" w:name="_Toc241936245"/>
       <w:bookmarkEnd w:id="30"/>
       <w:r>
         <w:rPr>
@@ -24089,7 +24089,7 @@
         <w:jc w:val="center"/>
       </w:pPr>
       <w:bookmarkStart w:id="34" w:name="_274f6a444530ef90b0479dabf3d210f01e97699"/>
-      <w:bookmarkStart w:id="35" w:name="_Toc241934886"/>
+      <w:bookmarkStart w:id="35" w:name="_Toc241936246"/>
       <w:bookmarkEnd w:id="32"/>
       <w:r>
         <w:rPr>
@@ -25436,7 +25436,7 @@
           <w:i/>
           <w:sz w:val="28"/>
         </w:rPr>
-        <w:t>SoftwareOne</w:t>
+        <w:t>Arixcel</w:t>
       </w:r>
       <w:r>
         <w:rPr>
@@ -25449,6 +25449,19 @@
           <w:i/>
           <w:sz w:val="28"/>
         </w:rPr>
+        <w:t>Download</w:t>
+      </w:r>
+      <w:r>
+        <w:rPr>
+          <w:sz w:val="28"/>
+        </w:rPr>
+        <w:t xml:space="preserve"> </w:t>
+      </w:r>
+      <w:r>
+        <w:rPr>
+          <w:i/>
+          <w:sz w:val="28"/>
+        </w:rPr>
         <w:t>Arixcel</w:t>
       </w:r>
       <w:r>
@@ -25468,13 +25481,39 @@
         <w:rPr>
           <w:sz w:val="28"/>
         </w:rPr>
-        <w:t xml:space="preserve"> [Электронный ресурс]. – Режим доступа: https://platform.softwareone.com/produ</w:t>
-      </w:r>
-      <w:r>
-        <w:rPr>
-          <w:sz w:val="28"/>
-        </w:rPr>
-        <w:t>ct/arixcel-explorer/PCP-1927-2429. – Дата доступа: 03.10.2026.</w:t>
+        <w:t xml:space="preserve">: </w:t>
+      </w:r>
+      <w:r>
+        <w:rPr>
+          <w:i/>
+          <w:sz w:val="28"/>
+        </w:rPr>
+        <w:t>Licensing</w:t>
+      </w:r>
+      <w:r>
+        <w:rPr>
+          <w:sz w:val="28"/>
+        </w:rPr>
+        <w:t xml:space="preserve">, </w:t>
+      </w:r>
+      <w:r>
+        <w:rPr>
+          <w:i/>
+          <w:sz w:val="28"/>
+        </w:rPr>
+        <w:t>Pricing</w:t>
+      </w:r>
+      <w:r>
+        <w:rPr>
+          <w:sz w:val="28"/>
+        </w:rPr>
+        <w:t xml:space="preserve"> [Электронный ресурс]. – Режим доступа: https://www.a</w:t>
+      </w:r>
+      <w:r>
+        <w:rPr>
+          <w:sz w:val="28"/>
+        </w:rPr>
+        <w:t>rixcel.com/explorer/download. – Дата доступа: 03.10.2026.</w:t>
       </w:r>
     </w:p>
     <w:p>
@@ -25499,6 +25538,32 @@
         <w:rPr>
           <w:sz w:val="28"/>
         </w:rPr>
+        <w:t xml:space="preserve"> </w:t>
+      </w:r>
+      <w:r>
+        <w:rPr>
+          <w:i/>
+          <w:sz w:val="28"/>
+        </w:rPr>
+        <w:t>Analysis</w:t>
+      </w:r>
+      <w:r>
+        <w:rPr>
+          <w:sz w:val="28"/>
+        </w:rPr>
+        <w:t xml:space="preserve"> </w:t>
+      </w:r>
+      <w:r>
+        <w:rPr>
+          <w:i/>
+          <w:sz w:val="28"/>
+        </w:rPr>
+        <w:t>Kit</w:t>
+      </w:r>
+      <w:r>
+        <w:rPr>
+          <w:sz w:val="28"/>
+        </w:rPr>
         <w:t xml:space="preserve">. </w:t>
       </w:r>
       <w:r>
@@ -25538,14 +25603,14 @@
         <w:rPr>
           <w:sz w:val="28"/>
         </w:rPr>
-        <w:t xml:space="preserve">; </w:t>
-      </w:r>
-      <w:r>
-        <w:rPr>
-          <w:i/>
-          <w:sz w:val="28"/>
-        </w:rPr>
-        <w:t>Our</w:t>
+        <w:t xml:space="preserve"> | </w:t>
+      </w:r>
+      <w:r>
+        <w:rPr>
+          <w:i/>
+          <w:sz w:val="28"/>
+        </w:rPr>
+        <w:t>Excel</w:t>
       </w:r>
       <w:r>
         <w:rPr>
@@ -25558,7 +25623,7 @@
           <w:i/>
           <w:sz w:val="28"/>
         </w:rPr>
-        <w:t>New</w:t>
+        <w:t>Add-In</w:t>
       </w:r>
       <w:r>
         <w:rPr>
@@ -25571,20 +25636,20 @@
           <w:i/>
           <w:sz w:val="28"/>
         </w:rPr>
-        <w:t>Subscription</w:t>
-      </w:r>
-      <w:r>
-        <w:rPr>
-          <w:sz w:val="28"/>
-        </w:rPr>
-        <w:t xml:space="preserve"> </w:t>
-      </w:r>
-      <w:r>
-        <w:rPr>
-          <w:i/>
-          <w:sz w:val="28"/>
-        </w:rPr>
-        <w:t>Plans</w:t>
+        <w:t>Package</w:t>
+      </w:r>
+      <w:r>
+        <w:rPr>
+          <w:sz w:val="28"/>
+        </w:rPr>
+        <w:t xml:space="preserve"> | </w:t>
+      </w:r>
+      <w:r>
+        <w:rPr>
+          <w:i/>
+          <w:sz w:val="28"/>
+        </w:rPr>
+        <w:t>OAK</w:t>
       </w:r>
       <w:r>
         <w:rPr>
@@ -25622,7 +25687,14 @@
           <w:i/>
           <w:sz w:val="28"/>
         </w:rPr>
-        <w:t>Finder</w:t>
+        <w:t>F</w:t>
+      </w:r>
+      <w:r>
+        <w:rPr>
+          <w:i/>
+          <w:sz w:val="28"/>
+        </w:rPr>
+        <w:t>inder</w:t>
       </w:r>
       <w:r>
         <w:rPr>
@@ -25635,14 +25707,7 @@
           <w:i/>
           <w:sz w:val="28"/>
         </w:rPr>
-        <w:t>Ho</w:t>
-      </w:r>
-      <w:r>
-        <w:rPr>
-          <w:i/>
-          <w:sz w:val="28"/>
-        </w:rPr>
-        <w:t>w</w:t>
+        <w:t>How</w:t>
       </w:r>
       <w:r>
         <w:rPr>
@@ -25829,7 +25894,13 @@
         <w:rPr>
           <w:sz w:val="28"/>
         </w:rPr>
-        <w:t xml:space="preserve">, </w:t>
+        <w:t>,</w:t>
+      </w:r>
+      <w:r>
+        <w:rPr>
+          <w:sz w:val="28"/>
+        </w:rPr>
+        <w:t xml:space="preserve"> </w:t>
       </w:r>
       <w:r>
         <w:rPr>
@@ -25869,6 +25940,174 @@
           <w:sz w:val="28"/>
         </w:rPr>
         <w:t xml:space="preserve"> [Электронный ресурс]. – Режим доступа: https://coefficient.io/datarails-pricing. – Дата доступа: 03.10.2026.</w:t>
+      </w:r>
+    </w:p>
+    <w:p>
+      <w:pPr>
+        <w:pStyle w:val="FirstParagraph"/>
+        <w:numPr>
+          <w:ilvl w:val="0"/>
+          <w:numId w:val="3"/>
+        </w:numPr>
+        <w:spacing w:before="0" w:after="0" w:line="360" w:lineRule="exact"/>
+        <w:ind w:left="709" w:hanging="425"/>
+        <w:jc w:val="both"/>
+      </w:pPr>
+      <w:r>
+        <w:rPr>
+          <w:i/>
+          <w:sz w:val="28"/>
+        </w:rPr>
+        <w:t>Office</w:t>
+      </w:r>
+      <w:r>
+        <w:rPr>
+          <w:sz w:val="28"/>
+        </w:rPr>
+        <w:t xml:space="preserve"> </w:t>
+      </w:r>
+      <w:r>
+        <w:rPr>
+          <w:i/>
+          <w:sz w:val="28"/>
+        </w:rPr>
+        <w:t>for</w:t>
+      </w:r>
+      <w:r>
+        <w:rPr>
+          <w:sz w:val="28"/>
+        </w:rPr>
+        <w:t xml:space="preserve"> </w:t>
+      </w:r>
+      <w:r>
+        <w:rPr>
+          <w:i/>
+          <w:sz w:val="28"/>
+        </w:rPr>
+        <w:t>National</w:t>
+      </w:r>
+      <w:r>
+        <w:rPr>
+          <w:sz w:val="28"/>
+        </w:rPr>
+        <w:t xml:space="preserve"> </w:t>
+      </w:r>
+      <w:r>
+        <w:rPr>
+          <w:i/>
+          <w:sz w:val="28"/>
+        </w:rPr>
+        <w:t>Statistics</w:t>
+      </w:r>
+      <w:r>
+        <w:rPr>
+          <w:sz w:val="28"/>
+        </w:rPr>
+        <w:t xml:space="preserve">. </w:t>
+      </w:r>
+      <w:r>
+        <w:rPr>
+          <w:i/>
+          <w:sz w:val="28"/>
+        </w:rPr>
+        <w:t>Annual</w:t>
+      </w:r>
+      <w:r>
+        <w:rPr>
+          <w:sz w:val="28"/>
+        </w:rPr>
+        <w:t xml:space="preserve"> </w:t>
+      </w:r>
+      <w:r>
+        <w:rPr>
+          <w:i/>
+          <w:sz w:val="28"/>
+        </w:rPr>
+        <w:t>Population</w:t>
+      </w:r>
+      <w:r>
+        <w:rPr>
+          <w:sz w:val="28"/>
+        </w:rPr>
+        <w:t xml:space="preserve"> </w:t>
+      </w:r>
+      <w:r>
+        <w:rPr>
+          <w:i/>
+          <w:sz w:val="28"/>
+        </w:rPr>
+        <w:t>Survey</w:t>
+      </w:r>
+      <w:r>
+        <w:rPr>
+          <w:sz w:val="28"/>
+        </w:rPr>
+        <w:t xml:space="preserve">: </w:t>
+      </w:r>
+      <w:r>
+        <w:rPr>
+          <w:i/>
+          <w:sz w:val="28"/>
+        </w:rPr>
+        <w:t>employment</w:t>
+      </w:r>
+      <w:r>
+        <w:rPr>
+          <w:sz w:val="28"/>
+        </w:rPr>
+        <w:t xml:space="preserve"> </w:t>
+      </w:r>
+      <w:r>
+        <w:rPr>
+          <w:i/>
+          <w:sz w:val="28"/>
+        </w:rPr>
+        <w:t>by</w:t>
+      </w:r>
+      <w:r>
+        <w:rPr>
+          <w:sz w:val="28"/>
+        </w:rPr>
+        <w:t xml:space="preserve"> </w:t>
+      </w:r>
+      <w:r>
+        <w:rPr>
+          <w:i/>
+          <w:sz w:val="28"/>
+        </w:rPr>
+        <w:t>occupation</w:t>
+      </w:r>
+      <w:r>
+        <w:rPr>
+          <w:sz w:val="28"/>
+        </w:rPr>
+        <w:t xml:space="preserve"> (</w:t>
+      </w:r>
+      <w:r>
+        <w:rPr>
+          <w:i/>
+          <w:sz w:val="28"/>
+        </w:rPr>
+        <w:t>SOC</w:t>
+      </w:r>
+      <w:r>
+        <w:rPr>
+          <w:sz w:val="28"/>
+        </w:rPr>
+        <w:t xml:space="preserve"> 2020), </w:t>
+      </w:r>
+      <w:r>
+        <w:rPr>
+          <w:i/>
+          <w:sz w:val="28"/>
+        </w:rPr>
+        <w:t>NM_218_1</w:t>
+      </w:r>
+      <w:r>
+        <w:rPr>
+          <w:sz w:val="28"/>
+        </w:rPr>
+        <w:t xml:space="preserve"> [Электронный ресурс]. – Режим доступа: https://www.nomisweb.co.uk/datasets/aps218. – Дата доступа: 03.10.2026.</w:t>
       </w:r>
     </w:p>
     <w:p>
@@ -25880,7 +26119,7 @@
         <w:jc w:val="center"/>
       </w:pPr>
       <w:bookmarkStart w:id="36" w:name="_3d74faf1500c1b2a4a8bfa8e0e37c74206ce73d"/>
-      <w:bookmarkStart w:id="37" w:name="_Toc241934887"/>
+      <w:bookmarkStart w:id="37" w:name="_Toc241936247"/>
       <w:bookmarkEnd w:id="34"/>
       <w:r>
         <w:rPr>
@@ -25928,7 +26167,13 @@
         <w:rPr>
           <w:sz w:val="28"/>
         </w:rPr>
-        <w:t>В приложении собраны допущения, добавленные в ЛР2-3 к допущениям Д-01…Д-08 из ЛР1. Каждое допущение указывает значение, обоснование и влияние на результат.</w:t>
+        <w:t>В приложении собраны допущения, добавленные в ЛР2-3 к допущениям Д-01…Д-08 из ЛР1. Каж</w:t>
+      </w:r>
+      <w:r>
+        <w:rPr>
+          <w:sz w:val="28"/>
+        </w:rPr>
+        <w:t>дое допущение указывает значение, обоснование и влияние на результат.</w:t>
       </w:r>
     </w:p>
     <w:p>
@@ -26213,14 +26458,7 @@
                 <w:i/>
                 <w:sz w:val="24"/>
               </w:rPr>
-              <w:t>EU</w:t>
-            </w:r>
-            <w:r>
-              <w:rPr>
-                <w:i/>
-                <w:sz w:val="24"/>
-              </w:rPr>
-              <w:t>R</w:t>
+              <w:t>EUR</w:t>
             </w:r>
           </w:p>
         </w:tc>
@@ -26655,7 +26893,13 @@
               <w:rPr>
                 <w:sz w:val="24"/>
               </w:rPr>
-              <w:t>визит-регистрация 2/4/7 %, регистрация-платящий 3/5/8 %, доля трафика 0,5/1,5/4 %</w:t>
+              <w:t xml:space="preserve">визит-регистрация 2/4/7 %, </w:t>
+            </w:r>
+            <w:r>
+              <w:rPr>
+                <w:sz w:val="24"/>
+              </w:rPr>
+              <w:t>регистрация-платящий 3/5/8 %, доля трафика 0,5/1,5/4 %</w:t>
             </w:r>
           </w:p>
         </w:tc>
@@ -26878,7 +27122,13 @@
               <w:rPr>
                 <w:sz w:val="24"/>
               </w:rPr>
-              <w:t>расширить список (похожие сайты)</w:t>
+              <w:t>расширить сп</w:t>
+            </w:r>
+            <w:r>
+              <w:rPr>
+                <w:sz w:val="24"/>
+              </w:rPr>
+              <w:t>исок (похожие сайты)</w:t>
             </w:r>
           </w:p>
         </w:tc>
@@ -27216,13 +27466,7 @@
               <w:rPr>
                 <w:sz w:val="24"/>
               </w:rPr>
-              <w:t>учтены только пять крупнейших ст</w:t>
-            </w:r>
-            <w:r>
-              <w:rPr>
-                <w:sz w:val="24"/>
-              </w:rPr>
-              <w:t>ран сайта</w:t>
+              <w:t>учтены только пять крупнейших стран сайта</w:t>
             </w:r>
           </w:p>
         </w:tc>
@@ -27341,7 +27585,7 @@
         <w:jc w:val="center"/>
       </w:pPr>
       <w:bookmarkStart w:id="38" w:name="_d684f183eb868ee4ace295916bed2e6be64d16e"/>
-      <w:bookmarkStart w:id="39" w:name="_Toc241934888"/>
+      <w:bookmarkStart w:id="39" w:name="_Toc241936248"/>
       <w:bookmarkEnd w:id="36"/>
       <w:r>
         <w:rPr>
@@ -27389,7 +27633,13 @@
         <w:rPr>
           <w:sz w:val="28"/>
         </w:rPr>
-        <w:t>Ниже перечислены элементы, которые не удалось получить или которые требуют личного участия. Для каждого указано, что, где и как нужно сделать.</w:t>
+        <w:t>Ниже перечислены элементы, ко</w:t>
+      </w:r>
+      <w:r>
+        <w:rPr>
+          <w:sz w:val="28"/>
+        </w:rPr>
+        <w:t>торые не удалось получить или которые требуют личного участия. Для каждого указано, что, где и как нужно сделать.</w:t>
       </w:r>
     </w:p>
     <w:p>
@@ -27666,7 +27916,7 @@
               <w:rPr>
                 <w:sz w:val="24"/>
               </w:rPr>
-              <w:t xml:space="preserve">на следующий день повторить снимок для </w:t>
+              <w:t xml:space="preserve">снимок выполнен 03.10.2026 для </w:t>
             </w:r>
             <w:r>
               <w:rPr>
@@ -27705,7 +27955,7 @@
               <w:rPr>
                 <w:sz w:val="24"/>
               </w:rPr>
-              <w:t xml:space="preserve">, </w:t>
+              <w:t xml:space="preserve"> (приложение Д); у </w:t>
             </w:r>
             <w:r>
               <w:rPr>
@@ -27718,7 +27968,7 @@
               <w:rPr>
                 <w:sz w:val="24"/>
               </w:rPr>
-              <w:t xml:space="preserve"> и открыть полный список стран</w:t>
+              <w:t xml:space="preserve"> данных нет; полный список стран остается открытым</w:t>
             </w:r>
           </w:p>
         </w:tc>
@@ -27844,6 +28094,12 @@
             </w:pPr>
             <w:r>
               <w:rPr>
+                <w:sz w:val="24"/>
+              </w:rPr>
+              <w:t xml:space="preserve">выполнено 03.10.2026: </w:t>
+            </w:r>
+            <w:r>
+              <w:rPr>
                 <w:i/>
                 <w:sz w:val="24"/>
               </w:rPr>
@@ -27853,7 +28109,7 @@
               <w:rPr>
                 <w:sz w:val="24"/>
               </w:rPr>
-              <w:t xml:space="preserve"> для ЕС выгружен (приложение Д); </w:t>
+              <w:t xml:space="preserve"> для ЕС и </w:t>
             </w:r>
             <w:r>
               <w:rPr>
@@ -27866,33 +28122,7 @@
               <w:rPr>
                 <w:sz w:val="24"/>
               </w:rPr>
-              <w:t xml:space="preserve"> </w:t>
-            </w:r>
-            <w:r>
-              <w:rPr>
-                <w:i/>
-                <w:sz w:val="24"/>
-              </w:rPr>
-              <w:t>Nomis</w:t>
-            </w:r>
-            <w:r>
-              <w:rPr>
-                <w:sz w:val="24"/>
-              </w:rPr>
-              <w:t xml:space="preserve"> </w:t>
-            </w:r>
-            <w:r>
-              <w:rPr>
-                <w:i/>
-                <w:sz w:val="24"/>
-              </w:rPr>
-              <w:t>APS218</w:t>
-            </w:r>
-            <w:r>
-              <w:rPr>
-                <w:sz w:val="24"/>
-              </w:rPr>
-              <w:t xml:space="preserve"> для Великобритании - скачать</w:t>
+              <w:t xml:space="preserve"> для Великобритании (приложение Д)</w:t>
             </w:r>
           </w:p>
         </w:tc>
@@ -28027,7 +28257,13 @@
               <w:rPr>
                 <w:sz w:val="24"/>
               </w:rPr>
-              <w:t>проверено 03.10.2026: комиссия 3 % (приложение Д)</w:t>
+              <w:t>проверено 03.10.2026: комисси</w:t>
+            </w:r>
+            <w:r>
+              <w:rPr>
+                <w:sz w:val="24"/>
+              </w:rPr>
+              <w:t>я 3 % (приложение Д)</w:t>
             </w:r>
           </w:p>
         </w:tc>
@@ -28167,7 +28403,59 @@
               <w:rPr>
                 <w:sz w:val="24"/>
               </w:rPr>
-              <w:t>найдены оценки третьих сторон (приложение Д); точные цены - запросом коммерческого предложения</w:t>
+              <w:t xml:space="preserve">цены </w:t>
+            </w:r>
+            <w:r>
+              <w:rPr>
+                <w:i/>
+                <w:sz w:val="24"/>
+              </w:rPr>
+              <w:t>Arixcel</w:t>
+            </w:r>
+            <w:r>
+              <w:rPr>
+                <w:sz w:val="24"/>
+              </w:rPr>
+              <w:t xml:space="preserve"> и </w:t>
+            </w:r>
+            <w:r>
+              <w:rPr>
+                <w:i/>
+                <w:sz w:val="24"/>
+              </w:rPr>
+              <w:t>Operis</w:t>
+            </w:r>
+            <w:r>
+              <w:rPr>
+                <w:sz w:val="24"/>
+              </w:rPr>
+              <w:t xml:space="preserve"> найдены у производителей (приложение Д); </w:t>
+            </w:r>
+            <w:r>
+              <w:rPr>
+                <w:i/>
+                <w:sz w:val="24"/>
+              </w:rPr>
+              <w:t>DataSnipper</w:t>
+            </w:r>
+            <w:r>
+              <w:rPr>
+                <w:sz w:val="24"/>
+              </w:rPr>
+              <w:t xml:space="preserve"> и </w:t>
+            </w:r>
+            <w:r>
+              <w:rPr>
+                <w:i/>
+                <w:sz w:val="24"/>
+              </w:rPr>
+              <w:t>Datarails</w:t>
+            </w:r>
+            <w:r>
+              <w:rPr>
+                <w:sz w:val="24"/>
+              </w:rPr>
+              <w:t xml:space="preserve"> - оценки третьих сторон, точные цены - запросом коммерческого предложения</w:t>
             </w:r>
           </w:p>
         </w:tc>
@@ -28249,7 +28537,13 @@
               <w:rPr>
                 <w:sz w:val="24"/>
               </w:rPr>
-              <w:t>аудитория студентки, профессиональные чаты</w:t>
+              <w:t>аудитория студентки, профессиональн</w:t>
+            </w:r>
+            <w:r>
+              <w:rPr>
+                <w:sz w:val="24"/>
+              </w:rPr>
+              <w:t>ые чаты</w:t>
             </w:r>
           </w:p>
         </w:tc>
@@ -28268,13 +28562,7 @@
               <w:rPr>
                 <w:sz w:val="24"/>
               </w:rPr>
-              <w:t>анкета: бюджет, допустимая цена, гото</w:t>
-            </w:r>
-            <w:r>
-              <w:rPr>
-                <w:sz w:val="24"/>
-              </w:rPr>
-              <w:t>вность платить до пробы; пока использованы модельные данные (приложение Г)</w:t>
+              <w:t>анкета: бюджет, допустимая цена, готовность платить до пробы; пока использованы модельные данные (приложение Г)</w:t>
             </w:r>
           </w:p>
         </w:tc>
@@ -28429,13 +28717,7 @@
               <w:rPr>
                 <w:sz w:val="24"/>
               </w:rPr>
-              <w:t xml:space="preserve"> измерить визит-регистрация и регистрация-</w:t>
-            </w:r>
-            <w:r>
-              <w:rPr>
-                <w:sz w:val="24"/>
-              </w:rPr>
-              <w:t>платящий</w:t>
+              <w:t xml:space="preserve"> измерить визит-регистрация и регистрация-платящий</w:t>
             </w:r>
           </w:p>
         </w:tc>
@@ -28589,7 +28871,40 @@
               <w:rPr>
                 <w:sz w:val="24"/>
               </w:rPr>
-              <w:t>выгрузить объемы по ядру ЛР1</w:t>
+              <w:t xml:space="preserve">недоступно без платного кабинета; взамен использованы индексы </w:t>
+            </w:r>
+            <w:r>
+              <w:rPr>
+                <w:i/>
+                <w:sz w:val="24"/>
+              </w:rPr>
+              <w:t>Google</w:t>
+            </w:r>
+            <w:r>
+              <w:rPr>
+                <w:sz w:val="24"/>
+              </w:rPr>
+              <w:t xml:space="preserve"> </w:t>
+            </w:r>
+            <w:r>
+              <w:rPr>
+                <w:i/>
+                <w:sz w:val="24"/>
+              </w:rPr>
+              <w:t>Trends</w:t>
+            </w:r>
+            <w:r>
+              <w:rPr>
+                <w:sz w:val="24"/>
+              </w:rPr>
+              <w:t xml:space="preserve"> (ЛР1) и органический трафик </w:t>
+            </w:r>
+            <w:r>
+              <w:rPr>
+                <w:i/>
+                <w:sz w:val="24"/>
+              </w:rPr>
+              <w:t>Similarweb</w:t>
             </w:r>
           </w:p>
         </w:tc>
@@ -28625,7 +28940,13 @@
         <w:rPr>
           <w:sz w:val="28"/>
         </w:rPr>
-        <w:t>Пункты 1, 3, 6 и 7 выполняются в сервисах под аккаунтом студентки; пункты 2 и 4 - открытые источники; пункт 5 требует аудитории. До выполнения пунктов оценки остаются диапазоном с низкой и средней надежностью.</w:t>
+        <w:t>Пункты 1, 3, 6 и 7 выполняются в сервисах под аккаунтом студентки; пункты 2 и 4 - открытые источники; пункт 5 т</w:t>
+      </w:r>
+      <w:r>
+        <w:rPr>
+          <w:sz w:val="28"/>
+        </w:rPr>
+        <w:t>ребует аудитории. До выполнения пунктов оценки остаются диапазоном с низкой и средней надежностью.</w:t>
       </w:r>
     </w:p>
     <w:p>
@@ -28637,7 +28958,7 @@
         <w:jc w:val="center"/>
       </w:pPr>
       <w:bookmarkStart w:id="40" w:name="_cb59224a7032ef66ab429e7df9b4e4c597bc187"/>
-      <w:bookmarkStart w:id="41" w:name="_Toc241934889"/>
+      <w:bookmarkStart w:id="41" w:name="_Toc241936249"/>
       <w:bookmarkEnd w:id="38"/>
       <w:r>
         <w:rPr>
@@ -28671,14 +28992,7 @@
           <w:b/>
           <w:sz w:val="28"/>
         </w:rPr>
-        <w:t>Исправления и изме</w:t>
-      </w:r>
-      <w:r>
-        <w:rPr>
-          <w:b/>
-          <w:sz w:val="28"/>
-        </w:rPr>
-        <w:t>нения шаблонов</w:t>
+        <w:t>Исправления и изменения шаблонов</w:t>
       </w:r>
     </w:p>
     <w:p>
@@ -28705,7 +29019,13 @@
         <w:rPr>
           <w:sz w:val="28"/>
         </w:rPr>
-        <w:t xml:space="preserve"> выявлены ошибки и неудобства. Ниже перечислено, что изменено, чтобы расчет был корректным; оригиналы шаблонов не изменялись, работа велась с копиями.</w:t>
+        <w:t xml:space="preserve"> выявлены ошибки и неудобства. Ниже перечислено, что изменено, чтобы расчет был </w:t>
+      </w:r>
+      <w:r>
+        <w:rPr>
+          <w:sz w:val="28"/>
+        </w:rPr>
+        <w:t>корректным; оригиналы шаблонов не изменялись, работа велась с копиями.</w:t>
       </w:r>
     </w:p>
     <w:p>
@@ -28903,13 +29223,7 @@
               <w:rPr>
                 <w:sz w:val="24"/>
               </w:rPr>
-              <w:t>ссылка на пустую строку сегмента возвращала 0 вместо пустой строки, формулы давали #ЗНАЧ!, итоговые яч</w:t>
-            </w:r>
-            <w:r>
-              <w:rPr>
-                <w:sz w:val="24"/>
-              </w:rPr>
-              <w:t>ейки и панель с ошибками</w:t>
+              <w:t>ссылка на пустую строку сегмента возвращала 0 вместо пустой строки, формулы давали #ЗНАЧ!, итоговые ячейки и панель с ошибками</w:t>
             </w:r>
           </w:p>
         </w:tc>
@@ -29266,13 +29580,13 @@
               <w:rPr>
                 <w:sz w:val="24"/>
               </w:rPr>
-              <w:t>минимум, среднее и макси</w:t>
-            </w:r>
-            <w:r>
-              <w:rPr>
-                <w:sz w:val="24"/>
-              </w:rPr>
-              <w:t>мум включали платформенную строку, которая не является выручкой нового бизнеса</w:t>
+              <w:t>минимум, среднее и максимум включали платформенную строку, которая не является выручкой но</w:t>
+            </w:r>
+            <w:r>
+              <w:rPr>
+                <w:sz w:val="24"/>
+              </w:rPr>
+              <w:t>вого бизнеса</w:t>
             </w:r>
           </w:p>
         </w:tc>
@@ -29545,7 +29859,13 @@
               <w:rPr>
                 <w:sz w:val="24"/>
               </w:rPr>
-              <w:t>Потенциальные клиенты, цифровая воронка, платежеспособность</w:t>
+              <w:t>Потенциальные клиенты, цифровая воронка</w:t>
+            </w:r>
+            <w:r>
+              <w:rPr>
+                <w:sz w:val="24"/>
+              </w:rPr>
+              <w:t>, платежеспособность</w:t>
             </w:r>
           </w:p>
         </w:tc>
@@ -29596,13 +29916,7 @@
               <w:rPr>
                 <w:sz w:val="24"/>
               </w:rPr>
-              <w:t>вст</w:t>
-            </w:r>
-            <w:r>
-              <w:rPr>
-                <w:sz w:val="24"/>
-              </w:rPr>
-              <w:t>авлены строки внутри диапазонов суммирования с копированием формул</w:t>
+              <w:t>вставлены строки внутри диапазонов суммирования с копированием формул</w:t>
             </w:r>
           </w:p>
         </w:tc>
@@ -29619,7 +29933,13 @@
         <w:rPr>
           <w:sz w:val="28"/>
         </w:rPr>
-        <w:t>Исправления 1-4 затрагивают корректность формул, остальные - содержание. После исправлений ошибок формул в книгах нет, а независимый пересчет подтверждает значения.</w:t>
+        <w:t>Исправления 1-4 затрагивают корректность формул, остальные - содержание. После исправлений ошибок формул в кн</w:t>
+      </w:r>
+      <w:r>
+        <w:rPr>
+          <w:sz w:val="28"/>
+        </w:rPr>
+        <w:t>игах нет, а независимый пересчет подтверждает значения.</w:t>
       </w:r>
     </w:p>
     <w:p>
@@ -29631,7 +29951,7 @@
         <w:jc w:val="center"/>
       </w:pPr>
       <w:bookmarkStart w:id="42" w:name="_48e9587881bbc300b26702bd6584ff263e735cf"/>
-      <w:bookmarkStart w:id="43" w:name="_Toc241934890"/>
+      <w:bookmarkStart w:id="43" w:name="_Toc241936250"/>
       <w:bookmarkEnd w:id="40"/>
       <w:r>
         <w:rPr>
@@ -29679,13 +29999,13 @@
         <w:rPr>
           <w:sz w:val="28"/>
         </w:rPr>
-        <w:t>Респондентов для опроса нет, поэтому по решению студентки (Р-8) данные сгенерированы по заданным параметрам: 30 условных респондентов в четырех сегментах, генератор и файлы лежат в папке 00_О</w:t>
-      </w:r>
-      <w:r>
-        <w:rPr>
-          <w:sz w:val="28"/>
-        </w:rPr>
-        <w:t>бщее/Опрос_модельный (</w:t>
+        <w:t xml:space="preserve">Респондентов для опроса нет, поэтому по решению студентки (Р-8) данные сгенерированы по заданным параметрам: 30 </w:t>
+      </w:r>
+      <w:r>
+        <w:rPr>
+          <w:sz w:val="28"/>
+        </w:rPr>
+        <w:t>условных респондентов в четырех сегментах, генератор и файлы лежат в папке 00_Общее/Опрос_модельный (</w:t>
       </w:r>
       <w:r>
         <w:rPr>
@@ -29698,7 +30018,13 @@
         <w:rPr>
           <w:sz w:val="28"/>
         </w:rPr>
-        <w:t xml:space="preserve"> 20261003). Это модельные данные, а не результат опроса людей; они показывают порядок обработки анкеты по методике и проверяют согласованность принятого ценового коридора, но не доказывают реальный спрос.</w:t>
+        <w:t xml:space="preserve"> 20261003). Это модельные данные, а не результат опроса людей; они показывают порядок обработки анкеты по методике и проверяют согласованность принятог</w:t>
+      </w:r>
+      <w:r>
+        <w:rPr>
+          <w:sz w:val="28"/>
+        </w:rPr>
+        <w:t>о ценового коридора, но не доказывают реальный спрос.</w:t>
       </w:r>
     </w:p>
     <w:p>
@@ -29712,13 +30038,7 @@
         <w:rPr>
           <w:sz w:val="28"/>
         </w:rPr>
-        <w:t>В таблице 24 представлено</w:t>
-      </w:r>
-      <w:r>
-        <w:rPr>
-          <w:sz w:val="28"/>
-        </w:rPr>
-        <w:t xml:space="preserve">: модельные показатели цены и готовности платить (Ван Вестендорп, подписка </w:t>
+        <w:t xml:space="preserve">В таблице 24 представлено: модельные показатели цены и готовности платить (Ван Вестендорп, подписка </w:t>
       </w:r>
       <w:r>
         <w:rPr>
@@ -29804,7 +30124,14 @@
                 <w:b/>
                 <w:sz w:val="24"/>
               </w:rPr>
-              <w:t>Показатель</w:t>
+              <w:t>Показ</w:t>
+            </w:r>
+            <w:r>
+              <w:rPr>
+                <w:b/>
+                <w:sz w:val="24"/>
+              </w:rPr>
+              <w:t>атель</w:t>
             </w:r>
           </w:p>
         </w:tc>
@@ -29877,13 +30204,7 @@
               <w:rPr>
                 <w:sz w:val="24"/>
               </w:rPr>
-              <w:t xml:space="preserve">Точка предельной </w:t>
-            </w:r>
-            <w:r>
-              <w:rPr>
-                <w:sz w:val="24"/>
-              </w:rPr>
-              <w:t>дешевизны (</w:t>
+              <w:t>Точка предельной дешевизны (</w:t>
             </w:r>
             <w:r>
               <w:rPr>
@@ -30363,7 +30684,13 @@
               <w:rPr>
                 <w:sz w:val="24"/>
               </w:rPr>
-              <w:t>Средняя готовность попробовать (1-5)</w:t>
+              <w:t>Средняя готовность попробовать (</w:t>
+            </w:r>
+            <w:r>
+              <w:rPr>
+                <w:sz w:val="24"/>
+              </w:rPr>
+              <w:t>1-5)</w:t>
             </w:r>
           </w:p>
         </w:tc>
@@ -30510,13 +30837,13 @@
         <w:rPr>
           <w:sz w:val="28"/>
         </w:rPr>
-        <w:t>В т</w:t>
-      </w:r>
-      <w:r>
-        <w:rPr>
-          <w:sz w:val="28"/>
-        </w:rPr>
-        <w:t>аблице 25 представлено: модельный выбор тарифа среди респондентов.</w:t>
+        <w:t>В таблице 25 представлено: модельный выбор тарифа с</w:t>
+      </w:r>
+      <w:r>
+        <w:rPr>
+          <w:sz w:val="28"/>
+        </w:rPr>
+        <w:t>реди респондентов.</w:t>
       </w:r>
     </w:p>
     <w:p>
@@ -30966,7 +31293,7 @@
         <w:jc w:val="center"/>
       </w:pPr>
       <w:bookmarkStart w:id="44" w:name="_494653d134221fdc43c135127d450c9af0a7c7d"/>
-      <w:bookmarkStart w:id="45" w:name="_Toc241934891"/>
+      <w:bookmarkStart w:id="45" w:name="_Toc241936251"/>
       <w:bookmarkEnd w:id="42"/>
       <w:r>
         <w:rPr>
@@ -31067,12 +31394,12 @@
         <w:tblLook w:val="0020" w:firstRow="1" w:lastRow="0" w:firstColumn="0" w:lastColumn="0" w:noHBand="0" w:noVBand="0"/>
       </w:tblPr>
       <w:tblGrid>
-        <w:gridCol w:w="598"/>
-        <w:gridCol w:w="1923"/>
-        <w:gridCol w:w="1846"/>
-        <w:gridCol w:w="1104"/>
-        <w:gridCol w:w="1884"/>
-        <w:gridCol w:w="2000"/>
+        <w:gridCol w:w="580"/>
+        <w:gridCol w:w="1869"/>
+        <w:gridCol w:w="2162"/>
+        <w:gridCol w:w="1072"/>
+        <w:gridCol w:w="1767"/>
+        <w:gridCol w:w="1905"/>
       </w:tblGrid>
       <w:tr>
         <w:trPr>
@@ -31083,7 +31410,7 @@
         </w:trPr>
         <w:tc>
           <w:tcPr>
-            <w:tcW w:w="597" w:type="dxa"/>
+            <w:tcW w:w="579" w:type="dxa"/>
             <w:vAlign w:val="center"/>
           </w:tcPr>
           <w:p>
@@ -31103,7 +31430,7 @@
         </w:tc>
         <w:tc>
           <w:tcPr>
-            <w:tcW w:w="1923" w:type="dxa"/>
+            <w:tcW w:w="1869" w:type="dxa"/>
             <w:vAlign w:val="center"/>
           </w:tcPr>
           <w:p>
@@ -31117,20 +31444,33 @@
                 <w:b/>
                 <w:sz w:val="24"/>
               </w:rPr>
-              <w:t>Пок</w:t>
-            </w:r>
+              <w:t>Показатель</w:t>
+            </w:r>
+          </w:p>
+        </w:tc>
+        <w:tc>
+          <w:tcPr>
+            <w:tcW w:w="2162" w:type="dxa"/>
+            <w:vAlign w:val="center"/>
+          </w:tcPr>
+          <w:p>
+            <w:pPr>
+              <w:pStyle w:val="Compact"/>
+              <w:spacing w:before="0" w:after="0" w:line="280" w:lineRule="exact"/>
+              <w:jc w:val="center"/>
+            </w:pPr>
             <w:r>
               <w:rPr>
                 <w:b/>
                 <w:sz w:val="24"/>
               </w:rPr>
-              <w:t>азатель</w:t>
-            </w:r>
-          </w:p>
-        </w:tc>
-        <w:tc>
-          <w:tcPr>
-            <w:tcW w:w="1846" w:type="dxa"/>
+              <w:t>Значение</w:t>
+            </w:r>
+          </w:p>
+        </w:tc>
+        <w:tc>
+          <w:tcPr>
+            <w:tcW w:w="1072" w:type="dxa"/>
             <w:vAlign w:val="center"/>
           </w:tcPr>
           <w:p>
@@ -31144,13 +31484,13 @@
                 <w:b/>
                 <w:sz w:val="24"/>
               </w:rPr>
-              <w:t>Значение</w:t>
-            </w:r>
-          </w:p>
-        </w:tc>
-        <w:tc>
-          <w:tcPr>
-            <w:tcW w:w="1104" w:type="dxa"/>
+              <w:t>Источник</w:t>
+            </w:r>
+          </w:p>
+        </w:tc>
+        <w:tc>
+          <w:tcPr>
+            <w:tcW w:w="1767" w:type="dxa"/>
             <w:vAlign w:val="center"/>
           </w:tcPr>
           <w:p>
@@ -31164,33 +31504,13 @@
                 <w:b/>
                 <w:sz w:val="24"/>
               </w:rPr>
-              <w:t>Источник</w:t>
-            </w:r>
-          </w:p>
-        </w:tc>
-        <w:tc>
-          <w:tcPr>
-            <w:tcW w:w="1884" w:type="dxa"/>
-            <w:vAlign w:val="center"/>
-          </w:tcPr>
-          <w:p>
-            <w:pPr>
-              <w:pStyle w:val="Compact"/>
-              <w:spacing w:before="0" w:after="0" w:line="280" w:lineRule="exact"/>
-              <w:jc w:val="center"/>
-            </w:pPr>
-            <w:r>
-              <w:rPr>
-                <w:b/>
-                <w:sz w:val="24"/>
-              </w:rPr>
               <w:t>Надежность</w:t>
             </w:r>
           </w:p>
         </w:tc>
         <w:tc>
           <w:tcPr>
-            <w:tcW w:w="2000" w:type="dxa"/>
+            <w:tcW w:w="1905" w:type="dxa"/>
             <w:vAlign w:val="center"/>
           </w:tcPr>
           <w:p>
@@ -31216,7 +31536,7 @@
         </w:trPr>
         <w:tc>
           <w:tcPr>
-            <w:tcW w:w="597" w:type="dxa"/>
+            <w:tcW w:w="579" w:type="dxa"/>
             <w:vAlign w:val="center"/>
           </w:tcPr>
           <w:p>
@@ -31235,7 +31555,7 @@
         </w:tc>
         <w:tc>
           <w:tcPr>
-            <w:tcW w:w="1923" w:type="dxa"/>
+            <w:tcW w:w="1869" w:type="dxa"/>
             <w:vAlign w:val="center"/>
           </w:tcPr>
           <w:p>
@@ -31293,7 +31613,7 @@
         </w:tc>
         <w:tc>
           <w:tcPr>
-            <w:tcW w:w="1846" w:type="dxa"/>
+            <w:tcW w:w="2162" w:type="dxa"/>
             <w:vAlign w:val="center"/>
           </w:tcPr>
           <w:p>
@@ -31325,7 +31645,7 @@
         </w:tc>
         <w:tc>
           <w:tcPr>
-            <w:tcW w:w="1104" w:type="dxa"/>
+            <w:tcW w:w="1072" w:type="dxa"/>
             <w:vAlign w:val="center"/>
           </w:tcPr>
           <w:p>
@@ -31344,7 +31664,7 @@
         </w:tc>
         <w:tc>
           <w:tcPr>
-            <w:tcW w:w="1884" w:type="dxa"/>
+            <w:tcW w:w="1767" w:type="dxa"/>
             <w:vAlign w:val="center"/>
           </w:tcPr>
           <w:p>
@@ -31363,7 +31683,7 @@
         </w:tc>
         <w:tc>
           <w:tcPr>
-            <w:tcW w:w="2000" w:type="dxa"/>
+            <w:tcW w:w="1905" w:type="dxa"/>
             <w:vAlign w:val="center"/>
           </w:tcPr>
           <w:p>
@@ -31388,7 +31708,7 @@
         </w:trPr>
         <w:tc>
           <w:tcPr>
-            <w:tcW w:w="597" w:type="dxa"/>
+            <w:tcW w:w="579" w:type="dxa"/>
             <w:vAlign w:val="center"/>
           </w:tcPr>
           <w:p>
@@ -31407,7 +31727,7 @@
         </w:tc>
         <w:tc>
           <w:tcPr>
-            <w:tcW w:w="1923" w:type="dxa"/>
+            <w:tcW w:w="1869" w:type="dxa"/>
             <w:vAlign w:val="center"/>
           </w:tcPr>
           <w:p>
@@ -31504,7 +31824,7 @@
         </w:tc>
         <w:tc>
           <w:tcPr>
-            <w:tcW w:w="1846" w:type="dxa"/>
+            <w:tcW w:w="2162" w:type="dxa"/>
             <w:vAlign w:val="center"/>
           </w:tcPr>
           <w:p>
@@ -31523,7 +31843,7 @@
         </w:tc>
         <w:tc>
           <w:tcPr>
-            <w:tcW w:w="1104" w:type="dxa"/>
+            <w:tcW w:w="1072" w:type="dxa"/>
             <w:vAlign w:val="center"/>
           </w:tcPr>
           <w:p>
@@ -31542,7 +31862,7 @@
         </w:tc>
         <w:tc>
           <w:tcPr>
-            <w:tcW w:w="1884" w:type="dxa"/>
+            <w:tcW w:w="1767" w:type="dxa"/>
             <w:vAlign w:val="center"/>
           </w:tcPr>
           <w:p>
@@ -31561,7 +31881,7 @@
         </w:tc>
         <w:tc>
           <w:tcPr>
-            <w:tcW w:w="2000" w:type="dxa"/>
+            <w:tcW w:w="1905" w:type="dxa"/>
             <w:vAlign w:val="center"/>
           </w:tcPr>
           <w:p>
@@ -31618,7 +31938,7 @@
         </w:trPr>
         <w:tc>
           <w:tcPr>
-            <w:tcW w:w="597" w:type="dxa"/>
+            <w:tcW w:w="579" w:type="dxa"/>
             <w:vAlign w:val="center"/>
           </w:tcPr>
           <w:p>
@@ -31637,7 +31957,7 @@
         </w:tc>
         <w:tc>
           <w:tcPr>
-            <w:tcW w:w="1923" w:type="dxa"/>
+            <w:tcW w:w="1869" w:type="dxa"/>
             <w:vAlign w:val="center"/>
           </w:tcPr>
           <w:p>
@@ -31676,7 +31996,7 @@
         </w:tc>
         <w:tc>
           <w:tcPr>
-            <w:tcW w:w="1846" w:type="dxa"/>
+            <w:tcW w:w="2162" w:type="dxa"/>
             <w:vAlign w:val="center"/>
           </w:tcPr>
           <w:p>
@@ -31702,77 +32022,123 @@
               <w:rPr>
                 <w:sz w:val="24"/>
               </w:rPr>
-              <w:t xml:space="preserve"> за пользователя в месяц (около 3,3 </w:t>
+              <w:t xml:space="preserve"> за пользователя в месяц (лицензии многопользовательские, срок 12-36 месяцев; пример: 10 пользователей на 12 месяцев - 330 </w:t>
             </w:r>
             <w:r>
               <w:rPr>
                 <w:i/>
                 <w:sz w:val="24"/>
               </w:rPr>
+              <w:t>GBP</w:t>
+            </w:r>
+            <w:r>
+              <w:rPr>
+                <w:sz w:val="24"/>
+              </w:rPr>
+              <w:t xml:space="preserve">); только </w:t>
+            </w:r>
+            <w:r>
+              <w:rPr>
+                <w:i/>
+                <w:sz w:val="24"/>
+              </w:rPr>
+              <w:t>Wi</w:t>
+            </w:r>
+            <w:r>
+              <w:rPr>
+                <w:i/>
+                <w:sz w:val="24"/>
+              </w:rPr>
+              <w:t>ndows</w:t>
+            </w:r>
+            <w:r>
+              <w:rPr>
+                <w:sz w:val="24"/>
+              </w:rPr>
+              <w:t xml:space="preserve">-версии </w:t>
+            </w:r>
+            <w:r>
+              <w:rPr>
+                <w:i/>
+                <w:sz w:val="24"/>
+              </w:rPr>
+              <w:t>Excel</w:t>
+            </w:r>
+            <w:r>
+              <w:rPr>
+                <w:sz w:val="24"/>
+              </w:rPr>
+              <w:t>; есть пробный режим</w:t>
+            </w:r>
+          </w:p>
+        </w:tc>
+        <w:tc>
+          <w:tcPr>
+            <w:tcW w:w="1072" w:type="dxa"/>
+            <w:vAlign w:val="center"/>
+          </w:tcPr>
+          <w:p>
+            <w:pPr>
+              <w:pStyle w:val="Compact"/>
+              <w:spacing w:before="0" w:after="0" w:line="280" w:lineRule="exact"/>
+              <w:jc w:val="center"/>
+            </w:pPr>
+            <w:r>
+              <w:rPr>
+                <w:sz w:val="24"/>
+              </w:rPr>
+              <w:t>[17]</w:t>
+            </w:r>
+          </w:p>
+        </w:tc>
+        <w:tc>
+          <w:tcPr>
+            <w:tcW w:w="1767" w:type="dxa"/>
+            <w:vAlign w:val="center"/>
+          </w:tcPr>
+          <w:p>
+            <w:pPr>
+              <w:pStyle w:val="Compact"/>
+              <w:spacing w:before="0" w:after="0" w:line="280" w:lineRule="exact"/>
+              <w:jc w:val="center"/>
+            </w:pPr>
+            <w:r>
+              <w:rPr>
+                <w:sz w:val="24"/>
+              </w:rPr>
+              <w:t>высокая (страница производителя, 03.10.2026)</w:t>
+            </w:r>
+          </w:p>
+        </w:tc>
+        <w:tc>
+          <w:tcPr>
+            <w:tcW w:w="1905" w:type="dxa"/>
+            <w:vAlign w:val="center"/>
+          </w:tcPr>
+          <w:p>
+            <w:pPr>
+              <w:pStyle w:val="Compact"/>
+              <w:spacing w:before="0" w:after="0" w:line="280" w:lineRule="exact"/>
+              <w:jc w:val="center"/>
+            </w:pPr>
+            <w:r>
+              <w:rPr>
+                <w:sz w:val="24"/>
+              </w:rPr>
+              <w:t>нижняя граница ценового коридора около 3 </w:t>
+            </w:r>
+            <w:r>
+              <w:rPr>
+                <w:i/>
+                <w:sz w:val="24"/>
+              </w:rPr>
               <w:t>EUR</w:t>
             </w:r>
             <w:r>
               <w:rPr>
                 <w:sz w:val="24"/>
               </w:rPr>
-              <w:t>); срок лицензии 12-36 месяцев</w:t>
-            </w:r>
-          </w:p>
-        </w:tc>
-        <w:tc>
-          <w:tcPr>
-            <w:tcW w:w="1104" w:type="dxa"/>
-            <w:vAlign w:val="center"/>
-          </w:tcPr>
-          <w:p>
-            <w:pPr>
-              <w:pStyle w:val="Compact"/>
-              <w:spacing w:before="0" w:after="0" w:line="280" w:lineRule="exact"/>
-              <w:jc w:val="center"/>
-            </w:pPr>
-            <w:r>
-              <w:rPr>
-                <w:sz w:val="24"/>
-              </w:rPr>
-              <w:t>[17]</w:t>
-            </w:r>
-          </w:p>
-        </w:tc>
-        <w:tc>
-          <w:tcPr>
-            <w:tcW w:w="1884" w:type="dxa"/>
-            <w:vAlign w:val="center"/>
-          </w:tcPr>
-          <w:p>
-            <w:pPr>
-              <w:pStyle w:val="Compact"/>
-              <w:spacing w:before="0" w:after="0" w:line="280" w:lineRule="exact"/>
-              <w:jc w:val="center"/>
-            </w:pPr>
-            <w:r>
-              <w:rPr>
-                <w:sz w:val="24"/>
-              </w:rPr>
-              <w:t>низкая (каталог перепродавца, на сайте производителя цены нет)</w:t>
-            </w:r>
-          </w:p>
-        </w:tc>
-        <w:tc>
-          <w:tcPr>
-            <w:tcW w:w="2000" w:type="dxa"/>
-            <w:vAlign w:val="center"/>
-          </w:tcPr>
-          <w:p>
-            <w:pPr>
-              <w:pStyle w:val="Compact"/>
-              <w:spacing w:before="0" w:after="0" w:line="280" w:lineRule="exact"/>
-              <w:jc w:val="center"/>
-            </w:pPr>
-            <w:r>
-              <w:rPr>
-                <w:sz w:val="24"/>
-              </w:rPr>
-              <w:t xml:space="preserve">ориентир нижней границы ценового коридора; цена </w:t>
+              <w:t xml:space="preserve"> в месяц; цена </w:t>
             </w:r>
             <w:r>
               <w:rPr>
@@ -31798,7 +32164,7 @@
               <w:rPr>
                 <w:sz w:val="24"/>
               </w:rPr>
-              <w:t xml:space="preserve"> выше в 5-6 раз</w:t>
+              <w:t xml:space="preserve"> выше примерно в шесть раз</w:t>
             </w:r>
           </w:p>
         </w:tc>
@@ -31810,7 +32176,7 @@
         </w:trPr>
         <w:tc>
           <w:tcPr>
-            <w:tcW w:w="597" w:type="dxa"/>
+            <w:tcW w:w="579" w:type="dxa"/>
             <w:vAlign w:val="center"/>
           </w:tcPr>
           <w:p>
@@ -31830,7 +32196,7 @@
         </w:tc>
         <w:tc>
           <w:tcPr>
-            <w:tcW w:w="1923" w:type="dxa"/>
+            <w:tcW w:w="1869" w:type="dxa"/>
             <w:vAlign w:val="center"/>
           </w:tcPr>
           <w:p>
@@ -31869,20 +32235,20 @@
         </w:tc>
         <w:tc>
           <w:tcPr>
-            <w:tcW w:w="1846" w:type="dxa"/>
-            <w:vAlign w:val="center"/>
-          </w:tcPr>
-          <w:p>
-            <w:pPr>
-              <w:pStyle w:val="Compact"/>
-              <w:spacing w:before="0" w:after="0" w:line="280" w:lineRule="exact"/>
-              <w:jc w:val="center"/>
-            </w:pPr>
-            <w:r>
-              <w:rPr>
-                <w:sz w:val="24"/>
-              </w:rPr>
-              <w:t xml:space="preserve">оценки 311,66 </w:t>
+            <w:tcW w:w="2162" w:type="dxa"/>
+            <w:vAlign w:val="center"/>
+          </w:tcPr>
+          <w:p>
+            <w:pPr>
+              <w:pStyle w:val="Compact"/>
+              <w:spacing w:before="0" w:after="0" w:line="280" w:lineRule="exact"/>
+              <w:jc w:val="center"/>
+            </w:pPr>
+            <w:r>
+              <w:rPr>
+                <w:sz w:val="24"/>
+              </w:rPr>
+              <w:t xml:space="preserve">подписка 311,66 </w:t>
             </w:r>
             <w:r>
               <w:rPr>
@@ -31895,26 +32261,26 @@
               <w:rPr>
                 <w:sz w:val="24"/>
               </w:rPr>
-              <w:t xml:space="preserve"> в год (подписка) и около 2 400 </w:t>
+              <w:t xml:space="preserve"> в год плюс налог (около 26 </w:t>
             </w:r>
             <w:r>
               <w:rPr>
                 <w:i/>
                 <w:sz w:val="24"/>
               </w:rPr>
-              <w:t>USD</w:t>
-            </w:r>
-            <w:r>
-              <w:rPr>
-                <w:sz w:val="24"/>
-              </w:rPr>
-              <w:t xml:space="preserve"> в год за пользователя (оценка стороннего обзора)</w:t>
-            </w:r>
-          </w:p>
-        </w:tc>
-        <w:tc>
-          <w:tcPr>
-            <w:tcW w:w="1104" w:type="dxa"/>
+              <w:t>GBP</w:t>
+            </w:r>
+            <w:r>
+              <w:rPr>
+                <w:sz w:val="24"/>
+              </w:rPr>
+              <w:t xml:space="preserve"> в месяц); более 30 инструментов; есть пробная версия</w:t>
+            </w:r>
+          </w:p>
+        </w:tc>
+        <w:tc>
+          <w:tcPr>
+            <w:tcW w:w="1072" w:type="dxa"/>
             <w:vAlign w:val="center"/>
           </w:tcPr>
           <w:p>
@@ -31933,39 +32299,39 @@
         </w:tc>
         <w:tc>
           <w:tcPr>
-            <w:tcW w:w="1884" w:type="dxa"/>
-            <w:vAlign w:val="center"/>
-          </w:tcPr>
-          <w:p>
-            <w:pPr>
-              <w:pStyle w:val="Compact"/>
-              <w:spacing w:before="0" w:after="0" w:line="280" w:lineRule="exact"/>
-              <w:jc w:val="center"/>
-            </w:pPr>
-            <w:r>
-              <w:rPr>
-                <w:sz w:val="24"/>
-              </w:rPr>
-              <w:t>низкая (разброс 8 раз)</w:t>
-            </w:r>
-          </w:p>
-        </w:tc>
-        <w:tc>
-          <w:tcPr>
-            <w:tcW w:w="2000" w:type="dxa"/>
-            <w:vAlign w:val="center"/>
-          </w:tcPr>
-          <w:p>
-            <w:pPr>
-              <w:pStyle w:val="Compact"/>
-              <w:spacing w:before="0" w:after="0" w:line="280" w:lineRule="exact"/>
-              <w:jc w:val="center"/>
-            </w:pPr>
-            <w:r>
-              <w:rPr>
-                <w:sz w:val="24"/>
-              </w:rPr>
-              <w:t xml:space="preserve">верхняя граница класса профессиональных надстроек; годовая цена </w:t>
+            <w:tcW w:w="1767" w:type="dxa"/>
+            <w:vAlign w:val="center"/>
+          </w:tcPr>
+          <w:p>
+            <w:pPr>
+              <w:pStyle w:val="Compact"/>
+              <w:spacing w:before="0" w:after="0" w:line="280" w:lineRule="exact"/>
+              <w:jc w:val="center"/>
+            </w:pPr>
+            <w:r>
+              <w:rPr>
+                <w:sz w:val="24"/>
+              </w:rPr>
+              <w:t>высокая (страница производителя, 03.10.2026)</w:t>
+            </w:r>
+          </w:p>
+        </w:tc>
+        <w:tc>
+          <w:tcPr>
+            <w:tcW w:w="1905" w:type="dxa"/>
+            <w:vAlign w:val="center"/>
+          </w:tcPr>
+          <w:p>
+            <w:pPr>
+              <w:pStyle w:val="Compact"/>
+              <w:spacing w:before="0" w:after="0" w:line="280" w:lineRule="exact"/>
+              <w:jc w:val="center"/>
+            </w:pPr>
+            <w:r>
+              <w:rPr>
+                <w:sz w:val="24"/>
+              </w:rPr>
+              <w:t xml:space="preserve">ориентир профессиональных надстроек; </w:t>
             </w:r>
             <w:r>
               <w:rPr>
@@ -31991,7 +32357,7 @@
               <w:rPr>
                 <w:sz w:val="24"/>
               </w:rPr>
-              <w:t xml:space="preserve"> 228 </w:t>
+              <w:t xml:space="preserve"> (228 </w:t>
             </w:r>
             <w:r>
               <w:rPr>
@@ -32004,7 +32370,7 @@
               <w:rPr>
                 <w:sz w:val="24"/>
               </w:rPr>
-              <w:t xml:space="preserve"> ниже</w:t>
+              <w:t xml:space="preserve"> в год) сопоставим по уровню годовой цены</w:t>
             </w:r>
           </w:p>
         </w:tc>
@@ -32016,7 +32382,7 @@
         </w:trPr>
         <w:tc>
           <w:tcPr>
-            <w:tcW w:w="597" w:type="dxa"/>
+            <w:tcW w:w="579" w:type="dxa"/>
             <w:vAlign w:val="center"/>
           </w:tcPr>
           <w:p>
@@ -32035,7 +32401,7 @@
         </w:tc>
         <w:tc>
           <w:tcPr>
-            <w:tcW w:w="1923" w:type="dxa"/>
+            <w:tcW w:w="1869" w:type="dxa"/>
             <w:vAlign w:val="center"/>
           </w:tcPr>
           <w:p>
@@ -32061,7 +32427,7 @@
         </w:tc>
         <w:tc>
           <w:tcPr>
-            <w:tcW w:w="1846" w:type="dxa"/>
+            <w:tcW w:w="2162" w:type="dxa"/>
             <w:vAlign w:val="center"/>
           </w:tcPr>
           <w:p>
@@ -32106,7 +32472,7 @@
         </w:tc>
         <w:tc>
           <w:tcPr>
-            <w:tcW w:w="1104" w:type="dxa"/>
+            <w:tcW w:w="1072" w:type="dxa"/>
             <w:vAlign w:val="center"/>
           </w:tcPr>
           <w:p>
@@ -32125,7 +32491,7 @@
         </w:tc>
         <w:tc>
           <w:tcPr>
-            <w:tcW w:w="1884" w:type="dxa"/>
+            <w:tcW w:w="1767" w:type="dxa"/>
             <w:vAlign w:val="center"/>
           </w:tcPr>
           <w:p>
@@ -32144,7 +32510,7 @@
         </w:tc>
         <w:tc>
           <w:tcPr>
-            <w:tcW w:w="2000" w:type="dxa"/>
+            <w:tcW w:w="1905" w:type="dxa"/>
             <w:vAlign w:val="center"/>
           </w:tcPr>
           <w:p>
@@ -32195,7 +32561,7 @@
         </w:trPr>
         <w:tc>
           <w:tcPr>
-            <w:tcW w:w="597" w:type="dxa"/>
+            <w:tcW w:w="579" w:type="dxa"/>
             <w:vAlign w:val="center"/>
           </w:tcPr>
           <w:p>
@@ -32214,7 +32580,7 @@
         </w:tc>
         <w:tc>
           <w:tcPr>
-            <w:tcW w:w="1923" w:type="dxa"/>
+            <w:tcW w:w="1869" w:type="dxa"/>
             <w:vAlign w:val="center"/>
           </w:tcPr>
           <w:p>
@@ -32240,7 +32606,7 @@
         </w:tc>
         <w:tc>
           <w:tcPr>
-            <w:tcW w:w="1846" w:type="dxa"/>
+            <w:tcW w:w="2162" w:type="dxa"/>
             <w:vAlign w:val="center"/>
           </w:tcPr>
           <w:p>
@@ -32285,7 +32651,7 @@
         </w:tc>
         <w:tc>
           <w:tcPr>
-            <w:tcW w:w="1104" w:type="dxa"/>
+            <w:tcW w:w="1072" w:type="dxa"/>
             <w:vAlign w:val="center"/>
           </w:tcPr>
           <w:p>
@@ -32304,7 +32670,7 @@
         </w:tc>
         <w:tc>
           <w:tcPr>
-            <w:tcW w:w="1884" w:type="dxa"/>
+            <w:tcW w:w="1767" w:type="dxa"/>
             <w:vAlign w:val="center"/>
           </w:tcPr>
           <w:p>
@@ -32323,7 +32689,7 @@
         </w:tc>
         <w:tc>
           <w:tcPr>
-            <w:tcW w:w="2000" w:type="dxa"/>
+            <w:tcW w:w="1905" w:type="dxa"/>
             <w:vAlign w:val="center"/>
           </w:tcPr>
           <w:p>
@@ -32362,13 +32728,469 @@
               <w:rPr>
                 <w:sz w:val="24"/>
               </w:rPr>
-              <w:t xml:space="preserve">-платформ, а не к </w:t>
-            </w:r>
-            <w:r>
-              <w:rPr>
-                <w:sz w:val="24"/>
-              </w:rPr>
-              <w:t>разовым аудитам таблиц; прямой конкуренции по цене нет</w:t>
+              <w:t>-платформ, а не к разовым аудитам таблиц; прямой конкуренции по цене нет</w:t>
+            </w:r>
+          </w:p>
+        </w:tc>
+      </w:tr>
+      <w:tr>
+        <w:trPr>
+          <w:cantSplit/>
+          <w:jc w:val="center"/>
+        </w:trPr>
+        <w:tc>
+          <w:tcPr>
+            <w:tcW w:w="579" w:type="dxa"/>
+            <w:vAlign w:val="center"/>
+          </w:tcPr>
+          <w:p>
+            <w:pPr>
+              <w:pStyle w:val="Compact"/>
+              <w:spacing w:before="0" w:after="0" w:line="280" w:lineRule="exact"/>
+              <w:jc w:val="center"/>
+            </w:pPr>
+            <w:r>
+              <w:rPr>
+                <w:sz w:val="24"/>
+              </w:rPr>
+              <w:t>7</w:t>
+            </w:r>
+          </w:p>
+        </w:tc>
+        <w:tc>
+          <w:tcPr>
+            <w:tcW w:w="1869" w:type="dxa"/>
+            <w:vAlign w:val="center"/>
+          </w:tcPr>
+          <w:p>
+            <w:pPr>
+              <w:pStyle w:val="Compact"/>
+              <w:spacing w:before="0" w:after="0" w:line="280" w:lineRule="exact"/>
+              <w:jc w:val="center"/>
+            </w:pPr>
+            <w:r>
+              <w:rPr>
+                <w:sz w:val="24"/>
+              </w:rPr>
+              <w:t xml:space="preserve">Занятые в Великобритании, </w:t>
+            </w:r>
+            <w:r>
+              <w:rPr>
+                <w:i/>
+                <w:sz w:val="24"/>
+              </w:rPr>
+              <w:t>Annual</w:t>
+            </w:r>
+            <w:r>
+              <w:rPr>
+                <w:sz w:val="24"/>
+              </w:rPr>
+              <w:t xml:space="preserve"> </w:t>
+            </w:r>
+            <w:r>
+              <w:rPr>
+                <w:i/>
+                <w:sz w:val="24"/>
+              </w:rPr>
+              <w:t>Population</w:t>
+            </w:r>
+            <w:r>
+              <w:rPr>
+                <w:sz w:val="24"/>
+              </w:rPr>
+              <w:t xml:space="preserve"> </w:t>
+            </w:r>
+            <w:r>
+              <w:rPr>
+                <w:i/>
+                <w:sz w:val="24"/>
+              </w:rPr>
+              <w:t>Survey</w:t>
+            </w:r>
+            <w:r>
+              <w:rPr>
+                <w:sz w:val="24"/>
+              </w:rPr>
+              <w:t>,</w:t>
+            </w:r>
+            <w:r>
+              <w:rPr>
+                <w:sz w:val="24"/>
+              </w:rPr>
+              <w:t xml:space="preserve"> апрель 2025 - март 2026 (</w:t>
+            </w:r>
+            <w:r>
+              <w:rPr>
+                <w:i/>
+                <w:sz w:val="24"/>
+              </w:rPr>
+              <w:t>SOC</w:t>
+            </w:r>
+            <w:r>
+              <w:rPr>
+                <w:sz w:val="24"/>
+              </w:rPr>
+              <w:t xml:space="preserve"> 2020)</w:t>
+            </w:r>
+          </w:p>
+        </w:tc>
+        <w:tc>
+          <w:tcPr>
+            <w:tcW w:w="2162" w:type="dxa"/>
+            <w:vAlign w:val="center"/>
+          </w:tcPr>
+          <w:p>
+            <w:pPr>
+              <w:pStyle w:val="Compact"/>
+              <w:spacing w:before="0" w:after="0" w:line="280" w:lineRule="exact"/>
+              <w:jc w:val="center"/>
+            </w:pPr>
+            <w:r>
+              <w:rPr>
+                <w:sz w:val="24"/>
+              </w:rPr>
+              <w:t>бухгалтеры (2421) - 233 600; консультанты по управлению и бизнес-аналитики (2431) - 245 700; финансовые менеджеры и директора (1131) - 461 400; налоговые эксперты (2423) - 44 700</w:t>
+            </w:r>
+          </w:p>
+        </w:tc>
+        <w:tc>
+          <w:tcPr>
+            <w:tcW w:w="1072" w:type="dxa"/>
+            <w:vAlign w:val="center"/>
+          </w:tcPr>
+          <w:p>
+            <w:pPr>
+              <w:pStyle w:val="Compact"/>
+              <w:spacing w:before="0" w:after="0" w:line="280" w:lineRule="exact"/>
+              <w:jc w:val="center"/>
+            </w:pPr>
+            <w:r>
+              <w:rPr>
+                <w:sz w:val="24"/>
+              </w:rPr>
+              <w:t>[21]</w:t>
+            </w:r>
+          </w:p>
+        </w:tc>
+        <w:tc>
+          <w:tcPr>
+            <w:tcW w:w="1767" w:type="dxa"/>
+            <w:vAlign w:val="center"/>
+          </w:tcPr>
+          <w:p>
+            <w:pPr>
+              <w:pStyle w:val="Compact"/>
+              <w:spacing w:before="0" w:after="0" w:line="280" w:lineRule="exact"/>
+              <w:jc w:val="center"/>
+            </w:pPr>
+            <w:r>
+              <w:rPr>
+                <w:sz w:val="24"/>
+              </w:rPr>
+              <w:t xml:space="preserve">высокая (официальная статистика, </w:t>
+            </w:r>
+            <w:r>
+              <w:rPr>
+                <w:i/>
+                <w:sz w:val="24"/>
+              </w:rPr>
+              <w:t>API</w:t>
+            </w:r>
+            <w:r>
+              <w:rPr>
+                <w:sz w:val="24"/>
+              </w:rPr>
+              <w:t xml:space="preserve"> </w:t>
+            </w:r>
+            <w:r>
+              <w:rPr>
+                <w:i/>
+                <w:sz w:val="24"/>
+              </w:rPr>
+              <w:t>Nomis</w:t>
+            </w:r>
+            <w:r>
+              <w:rPr>
+                <w:sz w:val="24"/>
+              </w:rPr>
+              <w:t>)</w:t>
+            </w:r>
+          </w:p>
+        </w:tc>
+        <w:tc>
+          <w:tcPr>
+            <w:tcW w:w="1905" w:type="dxa"/>
+            <w:vAlign w:val="center"/>
+          </w:tcPr>
+          <w:p>
+            <w:pPr>
+              <w:pStyle w:val="Compact"/>
+              <w:spacing w:before="0" w:after="0" w:line="280" w:lineRule="exact"/>
+              <w:jc w:val="center"/>
+            </w:pPr>
+            <w:r>
+              <w:rPr>
+                <w:sz w:val="24"/>
+              </w:rPr>
+              <w:t xml:space="preserve">два профессиональных сегмента Великобритании дают около 480 тыс. человек, то есть около 15 % американских трех сегментов (3,1 млн) при доле населения около 20 %: масштаб занятости 0,45 для четырех англоязычных стран выглядит </w:t>
+            </w:r>
+            <w:r>
+              <w:rPr>
+                <w:sz w:val="24"/>
+              </w:rPr>
+              <w:t>консервативным</w:t>
+            </w:r>
+          </w:p>
+        </w:tc>
+      </w:tr>
+      <w:tr>
+        <w:trPr>
+          <w:cantSplit/>
+          <w:jc w:val="center"/>
+        </w:trPr>
+        <w:tc>
+          <w:tcPr>
+            <w:tcW w:w="579" w:type="dxa"/>
+            <w:vAlign w:val="center"/>
+          </w:tcPr>
+          <w:p>
+            <w:pPr>
+              <w:pStyle w:val="Compact"/>
+              <w:spacing w:before="0" w:after="0" w:line="280" w:lineRule="exact"/>
+              <w:jc w:val="center"/>
+            </w:pPr>
+            <w:r>
+              <w:rPr>
+                <w:sz w:val="24"/>
+              </w:rPr>
+              <w:lastRenderedPageBreak/>
+              <w:t>8</w:t>
+            </w:r>
+          </w:p>
+        </w:tc>
+        <w:tc>
+          <w:tcPr>
+            <w:tcW w:w="1869" w:type="dxa"/>
+            <w:vAlign w:val="center"/>
+          </w:tcPr>
+          <w:p>
+            <w:pPr>
+              <w:pStyle w:val="Compact"/>
+              <w:spacing w:before="0" w:after="0" w:line="280" w:lineRule="exact"/>
+              <w:jc w:val="center"/>
+            </w:pPr>
+            <w:r>
+              <w:rPr>
+                <w:sz w:val="24"/>
+              </w:rPr>
+              <w:t xml:space="preserve">Дополнительный снимок </w:t>
+            </w:r>
+            <w:r>
+              <w:rPr>
+                <w:i/>
+                <w:sz w:val="24"/>
+              </w:rPr>
+              <w:t>Similarweb</w:t>
+            </w:r>
+            <w:r>
+              <w:rPr>
+                <w:sz w:val="24"/>
+              </w:rPr>
+              <w:t xml:space="preserve"> </w:t>
+            </w:r>
+            <w:r>
+              <w:rPr>
+                <w:i/>
+                <w:sz w:val="24"/>
+              </w:rPr>
+              <w:t>Pro</w:t>
+            </w:r>
+            <w:r>
+              <w:rPr>
+                <w:sz w:val="24"/>
+              </w:rPr>
+              <w:t>, июнь-август 2026</w:t>
+            </w:r>
+          </w:p>
+        </w:tc>
+        <w:tc>
+          <w:tcPr>
+            <w:tcW w:w="2162" w:type="dxa"/>
+            <w:vAlign w:val="center"/>
+          </w:tcPr>
+          <w:p>
+            <w:pPr>
+              <w:pStyle w:val="Compact"/>
+              <w:spacing w:before="0" w:after="0" w:line="280" w:lineRule="exact"/>
+              <w:jc w:val="center"/>
+            </w:pPr>
+            <w:r>
+              <w:rPr>
+                <w:i/>
+                <w:sz w:val="24"/>
+              </w:rPr>
+              <w:t>appsource.microsoft.com</w:t>
+            </w:r>
+            <w:r>
+              <w:rPr>
+                <w:sz w:val="24"/>
+              </w:rPr>
+              <w:t xml:space="preserve"> - 1,18 млн визитов (США 31 %); </w:t>
+            </w:r>
+            <w:r>
+              <w:rPr>
+                <w:i/>
+                <w:sz w:val="24"/>
+              </w:rPr>
+              <w:t>sheetai.app</w:t>
+            </w:r>
+            <w:r>
+              <w:rPr>
+                <w:sz w:val="24"/>
+              </w:rPr>
+              <w:t xml:space="preserve"> - 183 741 (глобальный ранг 666 313); </w:t>
+            </w:r>
+            <w:r>
+              <w:rPr>
+                <w:i/>
+                <w:sz w:val="24"/>
+              </w:rPr>
+              <w:t>f1f9.com</w:t>
+            </w:r>
+            <w:r>
+              <w:rPr>
+                <w:sz w:val="24"/>
+              </w:rPr>
+              <w:t xml:space="preserve"> - 32 076; </w:t>
+            </w:r>
+            <w:r>
+              <w:rPr>
+                <w:i/>
+                <w:sz w:val="24"/>
+              </w:rPr>
+              <w:t>excelformulabot.com</w:t>
+            </w:r>
+            <w:r>
+              <w:rPr>
+                <w:sz w:val="24"/>
+              </w:rPr>
+              <w:t xml:space="preserve"> данных не имеет (работает как </w:t>
+            </w:r>
+            <w:r>
+              <w:rPr>
+                <w:i/>
+                <w:sz w:val="24"/>
+              </w:rPr>
+              <w:t>formulabot.com</w:t>
+            </w:r>
+            <w:r>
+              <w:rPr>
+                <w:sz w:val="24"/>
+              </w:rPr>
+              <w:t>)</w:t>
+            </w:r>
+          </w:p>
+        </w:tc>
+        <w:tc>
+          <w:tcPr>
+            <w:tcW w:w="1072" w:type="dxa"/>
+            <w:vAlign w:val="center"/>
+          </w:tcPr>
+          <w:p>
+            <w:pPr>
+              <w:pStyle w:val="Compact"/>
+              <w:spacing w:before="0" w:after="0" w:line="280" w:lineRule="exact"/>
+              <w:jc w:val="center"/>
+            </w:pPr>
+            <w:r>
+              <w:rPr>
+                <w:sz w:val="24"/>
+              </w:rPr>
+              <w:t>[5]</w:t>
+            </w:r>
+          </w:p>
+        </w:tc>
+        <w:tc>
+          <w:tcPr>
+            <w:tcW w:w="1767" w:type="dxa"/>
+            <w:vAlign w:val="center"/>
+          </w:tcPr>
+          <w:p>
+            <w:pPr>
+              <w:pStyle w:val="Compact"/>
+              <w:spacing w:before="0" w:after="0" w:line="280" w:lineRule="exact"/>
+              <w:jc w:val="center"/>
+            </w:pPr>
+            <w:r>
+              <w:rPr>
+                <w:sz w:val="24"/>
+              </w:rPr>
+              <w:t xml:space="preserve">средняя (оценка </w:t>
+            </w:r>
+            <w:r>
+              <w:rPr>
+                <w:i/>
+                <w:sz w:val="24"/>
+              </w:rPr>
+              <w:t>Similarweb</w:t>
+            </w:r>
+            <w:r>
+              <w:rPr>
+                <w:sz w:val="24"/>
+              </w:rPr>
+              <w:t>)</w:t>
+            </w:r>
+          </w:p>
+        </w:tc>
+        <w:tc>
+          <w:tcPr>
+            <w:tcW w:w="1905" w:type="dxa"/>
+            <w:vAlign w:val="center"/>
+          </w:tcPr>
+          <w:p>
+            <w:pPr>
+              <w:pStyle w:val="Compact"/>
+              <w:spacing w:before="0" w:after="0" w:line="280" w:lineRule="exact"/>
+              <w:jc w:val="center"/>
+            </w:pPr>
+            <w:r>
+              <w:rPr>
+                <w:i/>
+                <w:sz w:val="24"/>
+              </w:rPr>
+              <w:t>sheetai.app</w:t>
+            </w:r>
+            <w:r>
+              <w:rPr>
+                <w:sz w:val="24"/>
+              </w:rPr>
+              <w:t xml:space="preserve"> и </w:t>
+            </w:r>
+            <w:r>
+              <w:rPr>
+                <w:i/>
+                <w:sz w:val="24"/>
+              </w:rPr>
+              <w:t>f1f9.com</w:t>
+            </w:r>
+            <w:r>
+              <w:rPr>
+                <w:sz w:val="24"/>
+              </w:rPr>
+              <w:t xml:space="preserve"> добавляют 3,6 % к трафику 12 доменов основного снимка (6,02 млн визитов) и на итоговый диапазон не влияют; </w:t>
+            </w:r>
+            <w:r>
+              <w:rPr>
+                <w:i/>
+                <w:sz w:val="24"/>
+              </w:rPr>
+              <w:t>AppSource</w:t>
+            </w:r>
+            <w:r>
+              <w:rPr>
+                <w:sz w:val="24"/>
+              </w:rPr>
+              <w:t xml:space="preserve"> - канал, а не конкурент</w:t>
             </w:r>
           </w:p>
         </w:tc>
@@ -32385,7 +33207,13 @@
         <w:rPr>
           <w:sz w:val="28"/>
         </w:rPr>
-        <w:t xml:space="preserve">Найдены первичные данные по комиссии </w:t>
+        <w:t>Первичные да</w:t>
+      </w:r>
+      <w:r>
+        <w:rPr>
+          <w:sz w:val="28"/>
+        </w:rPr>
+        <w:t xml:space="preserve">нные найдены по комиссии </w:t>
       </w:r>
       <w:r>
         <w:rPr>
@@ -32398,7 +33226,7 @@
         <w:rPr>
           <w:sz w:val="28"/>
         </w:rPr>
-        <w:t xml:space="preserve"> и занятости ЕС, а цены </w:t>
+        <w:t xml:space="preserve">, занятости ЕС и Великобритании и ценам </w:t>
       </w:r>
       <w:r>
         <w:rPr>
@@ -32411,7 +33239,7 @@
         <w:rPr>
           <w:sz w:val="28"/>
         </w:rPr>
-        <w:t xml:space="preserve">, </w:t>
+        <w:t xml:space="preserve"> и </w:t>
       </w:r>
       <w:r>
         <w:rPr>
@@ -32424,7 +33252,7 @@
         <w:rPr>
           <w:sz w:val="28"/>
         </w:rPr>
-        <w:t xml:space="preserve">, </w:t>
+        <w:t xml:space="preserve">, а цены </w:t>
       </w:r>
       <w:r>
         <w:rPr>
@@ -32450,13 +33278,7 @@
         <w:rPr>
           <w:sz w:val="28"/>
         </w:rPr>
-        <w:t xml:space="preserve"> остаются оценками третьих сторон. Для ценового коридора это означает, что нижняя граница </w:t>
-      </w:r>
-      <w:r>
-        <w:rPr>
-          <w:sz w:val="28"/>
-        </w:rPr>
-        <w:t>(</w:t>
+        <w:t xml:space="preserve"> остаются оценками третьих сторон. Для ценового коридора это означает, что опубликованные цены специализированных надстроек (</w:t>
       </w:r>
       <w:r>
         <w:rPr>
@@ -32469,7 +33291,13 @@
         <w:rPr>
           <w:sz w:val="28"/>
         </w:rPr>
-        <w:t xml:space="preserve"> около 3,3 </w:t>
+        <w:t xml:space="preserve"> о</w:t>
+      </w:r>
+      <w:r>
+        <w:rPr>
+          <w:sz w:val="28"/>
+        </w:rPr>
+        <w:t>коло 3 </w:t>
       </w:r>
       <w:r>
         <w:rPr>
@@ -32482,7 +33310,72 @@
         <w:rPr>
           <w:sz w:val="28"/>
         </w:rPr>
-        <w:t xml:space="preserve"> в месяц) и верхняя (</w:t>
+        <w:t xml:space="preserve"> и </w:t>
+      </w:r>
+      <w:r>
+        <w:rPr>
+          <w:i/>
+          <w:sz w:val="28"/>
+        </w:rPr>
+        <w:t>Operis</w:t>
+      </w:r>
+      <w:r>
+        <w:rPr>
+          <w:sz w:val="28"/>
+        </w:rPr>
+        <w:t xml:space="preserve"> </w:t>
+      </w:r>
+      <w:r>
+        <w:rPr>
+          <w:i/>
+          <w:sz w:val="28"/>
+        </w:rPr>
+        <w:t>OAK</w:t>
+      </w:r>
+      <w:r>
+        <w:rPr>
+          <w:sz w:val="28"/>
+        </w:rPr>
+        <w:t xml:space="preserve"> около 26 </w:t>
+      </w:r>
+      <w:r>
+        <w:rPr>
+          <w:i/>
+          <w:sz w:val="28"/>
+        </w:rPr>
+        <w:t>GBP</w:t>
+      </w:r>
+      <w:r>
+        <w:rPr>
+          <w:sz w:val="28"/>
+        </w:rPr>
+        <w:t xml:space="preserve"> в месяц) лежат ниже цены </w:t>
+      </w:r>
+      <w:r>
+        <w:rPr>
+          <w:i/>
+          <w:sz w:val="28"/>
+        </w:rPr>
+        <w:t>Pro</w:t>
+      </w:r>
+      <w:r>
+        <w:rPr>
+          <w:sz w:val="28"/>
+        </w:rPr>
+        <w:t xml:space="preserve"> 19 </w:t>
+      </w:r>
+      <w:r>
+        <w:rPr>
+          <w:i/>
+          <w:sz w:val="28"/>
+        </w:rPr>
+        <w:t>EUR</w:t>
+      </w:r>
+      <w:r>
+        <w:rPr>
+          <w:sz w:val="28"/>
+        </w:rPr>
+        <w:t xml:space="preserve"> или рядом с ней, а корпоративные платформы (</w:t>
       </w:r>
       <w:r>
         <w:rPr>
@@ -32508,33 +33401,26 @@
         <w:rPr>
           <w:sz w:val="28"/>
         </w:rPr>
-        <w:t xml:space="preserve"> от 350 </w:t>
-      </w:r>
-      <w:r>
-        <w:rPr>
-          <w:i/>
-          <w:sz w:val="28"/>
-        </w:rPr>
-        <w:t>EUR</w:t>
-      </w:r>
-      <w:r>
-        <w:rPr>
-          <w:sz w:val="28"/>
-        </w:rPr>
-        <w:t xml:space="preserve"> в месяц) уже задают диапазон, внутри которого цена 19 </w:t>
-      </w:r>
-      <w:r>
-        <w:rPr>
-          <w:i/>
-          <w:sz w:val="28"/>
-        </w:rPr>
-        <w:t>EUR</w:t>
-      </w:r>
-      <w:r>
-        <w:rPr>
-          <w:sz w:val="28"/>
-        </w:rPr>
-        <w:t xml:space="preserve"> выглядит осторожной; точные цены можно получить только запросом коммерческого предложения.</w:t>
+        <w:t>, оценки от 60 до 400 </w:t>
+      </w:r>
+      <w:r>
+        <w:rPr>
+          <w:i/>
+          <w:sz w:val="28"/>
+        </w:rPr>
+        <w:t>USD</w:t>
+      </w:r>
+      <w:r>
+        <w:rPr>
+          <w:sz w:val="28"/>
+        </w:rPr>
+        <w:t xml:space="preserve"> в месяц) заметно дороже; точные цены последних можно получить только запросом коммерческог</w:t>
+      </w:r>
+      <w:r>
+        <w:rPr>
+          <w:sz w:val="28"/>
+        </w:rPr>
+        <w:t>о предложения.</w:t>
       </w:r>
     </w:p>
     <w:p>
@@ -32548,47 +33434,40 @@
         <w:rPr>
           <w:sz w:val="28"/>
         </w:rPr>
-        <w:t>Не закрыты: Великобритания (</w:t>
-      </w:r>
-      <w:r>
-        <w:rPr>
-          <w:i/>
-          <w:sz w:val="28"/>
-        </w:rPr>
-        <w:t>O</w:t>
-      </w:r>
-      <w:r>
-        <w:rPr>
-          <w:i/>
-          <w:sz w:val="28"/>
-        </w:rPr>
-        <w:t>NS</w:t>
-      </w:r>
-      <w:r>
-        <w:rPr>
-          <w:sz w:val="28"/>
-        </w:rPr>
-        <w:t xml:space="preserve">, код </w:t>
-      </w:r>
-      <w:r>
-        <w:rPr>
-          <w:i/>
-          <w:sz w:val="28"/>
-        </w:rPr>
-        <w:t>SOC</w:t>
-      </w:r>
-      <w:r>
-        <w:rPr>
-          <w:sz w:val="28"/>
-        </w:rPr>
-        <w:t xml:space="preserve"> 2421: данные доступны в наборе </w:t>
-      </w:r>
-      <w:r>
-        <w:rPr>
-          <w:i/>
-          <w:sz w:val="28"/>
-        </w:rPr>
-        <w:t>Nomis</w:t>
+        <w:t xml:space="preserve">Не закрыты: точные цены </w:t>
+      </w:r>
+      <w:r>
+        <w:rPr>
+          <w:i/>
+          <w:sz w:val="28"/>
+        </w:rPr>
+        <w:t>DataSnipper</w:t>
+      </w:r>
+      <w:r>
+        <w:rPr>
+          <w:sz w:val="28"/>
+        </w:rPr>
+        <w:t xml:space="preserve"> и </w:t>
+      </w:r>
+      <w:r>
+        <w:rPr>
+          <w:i/>
+          <w:sz w:val="28"/>
+        </w:rPr>
+        <w:t>Datarails</w:t>
+      </w:r>
+      <w:r>
+        <w:rPr>
+          <w:sz w:val="28"/>
+        </w:rPr>
+        <w:t xml:space="preserve"> (только запросом коммерческого предложения) и данные </w:t>
+      </w:r>
+      <w:r>
+        <w:rPr>
+          <w:i/>
+          <w:sz w:val="28"/>
+        </w:rPr>
+        <w:t>Google</w:t>
       </w:r>
       <w:r>
         <w:rPr>
@@ -32601,13 +33480,71 @@
           <w:i/>
           <w:sz w:val="28"/>
         </w:rPr>
-        <w:t>APS218</w:t>
-      </w:r>
-      <w:r>
-        <w:rPr>
-          <w:sz w:val="28"/>
-        </w:rPr>
-        <w:t xml:space="preserve"> только скачиванием), страны сайтов в </w:t>
+        <w:t>Keyword</w:t>
+      </w:r>
+      <w:r>
+        <w:rPr>
+          <w:sz w:val="28"/>
+        </w:rPr>
+        <w:t xml:space="preserve"> </w:t>
+      </w:r>
+      <w:r>
+        <w:rPr>
+          <w:i/>
+          <w:sz w:val="28"/>
+        </w:rPr>
+        <w:t>Planner</w:t>
+      </w:r>
+      <w:r>
+        <w:rPr>
+          <w:sz w:val="28"/>
+        </w:rPr>
+        <w:t xml:space="preserve"> и </w:t>
+      </w:r>
+      <w:r>
+        <w:rPr>
+          <w:i/>
+          <w:sz w:val="28"/>
+        </w:rPr>
+        <w:t>Semrush</w:t>
+      </w:r>
+      <w:r>
+        <w:rPr>
+          <w:sz w:val="28"/>
+        </w:rPr>
+        <w:t>, для которых нужен рекламный кабинет или платный доступ; взамен для англоязычного поиска используются относ</w:t>
+      </w:r>
+      <w:r>
+        <w:rPr>
+          <w:sz w:val="28"/>
+        </w:rPr>
+        <w:t xml:space="preserve">ительные индексы </w:t>
+      </w:r>
+      <w:r>
+        <w:rPr>
+          <w:i/>
+          <w:sz w:val="28"/>
+        </w:rPr>
+        <w:t>Google</w:t>
+      </w:r>
+      <w:r>
+        <w:rPr>
+          <w:sz w:val="28"/>
+        </w:rPr>
+        <w:t xml:space="preserve"> </w:t>
+      </w:r>
+      <w:r>
+        <w:rPr>
+          <w:i/>
+          <w:sz w:val="28"/>
+        </w:rPr>
+        <w:t>Trends</w:t>
+      </w:r>
+      <w:r>
+        <w:rPr>
+          <w:sz w:val="28"/>
+        </w:rPr>
+        <w:t xml:space="preserve"> (ЛР1) и органический трафик конкурентов по </w:t>
       </w:r>
       <w:r>
         <w:rPr>
@@ -32620,14 +33557,14 @@
         <w:rPr>
           <w:sz w:val="28"/>
         </w:rPr>
-        <w:t xml:space="preserve"> и четыре домена, не снятых из-за суточного лимита (повтор после сброса лимита), а также </w:t>
-      </w:r>
-      <w:r>
-        <w:rPr>
-          <w:i/>
-          <w:sz w:val="28"/>
-        </w:rPr>
-        <w:t>Google</w:t>
+        <w:t xml:space="preserve">. Дополнительный раздел </w:t>
+      </w:r>
+      <w:r>
+        <w:rPr>
+          <w:i/>
+          <w:sz w:val="28"/>
+        </w:rPr>
+        <w:t>Keyword</w:t>
       </w:r>
       <w:r>
         <w:rPr>
@@ -32640,7 +33577,20 @@
           <w:i/>
           <w:sz w:val="28"/>
         </w:rPr>
-        <w:t>Keyword</w:t>
+        <w:t>research</w:t>
+      </w:r>
+      <w:r>
+        <w:rPr>
+          <w:sz w:val="28"/>
+        </w:rPr>
+        <w:t xml:space="preserve"> в пробном </w:t>
+      </w:r>
+      <w:r>
+        <w:rPr>
+          <w:i/>
+          <w:sz w:val="28"/>
+        </w:rPr>
+        <w:t>Similarweb</w:t>
       </w:r>
       <w:r>
         <w:rPr>
@@ -32653,58 +33603,13 @@
           <w:i/>
           <w:sz w:val="28"/>
         </w:rPr>
-        <w:t>Planner</w:t>
-      </w:r>
-      <w:r>
-        <w:rPr>
-          <w:sz w:val="28"/>
-        </w:rPr>
-        <w:t xml:space="preserve"> и </w:t>
-      </w:r>
-      <w:r>
-        <w:rPr>
-          <w:i/>
-          <w:sz w:val="28"/>
-        </w:rPr>
-        <w:t>Semrush</w:t>
-      </w:r>
-      <w:r>
-        <w:rPr>
-          <w:sz w:val="28"/>
-        </w:rPr>
-        <w:t xml:space="preserve">, требующие рекламного кабинета </w:t>
-      </w:r>
-      <w:r>
-        <w:rPr>
-          <w:sz w:val="28"/>
-        </w:rPr>
-        <w:t xml:space="preserve">и платного доступа; взамен для англоязычного поиска сохраняется оценка по </w:t>
-      </w:r>
-      <w:r>
-        <w:rPr>
-          <w:i/>
-          <w:sz w:val="28"/>
-        </w:rPr>
-        <w:t>Google</w:t>
-      </w:r>
-      <w:r>
-        <w:rPr>
-          <w:sz w:val="28"/>
-        </w:rPr>
-        <w:t xml:space="preserve"> </w:t>
-      </w:r>
-      <w:r>
-        <w:rPr>
-          <w:i/>
-          <w:sz w:val="28"/>
-        </w:rPr>
-        <w:t>Trends</w:t>
-      </w:r>
-      <w:r>
-        <w:rPr>
-          <w:sz w:val="28"/>
-        </w:rPr>
-        <w:t xml:space="preserve"> (ЛР1).</w:t>
+        <w:t>Pro</w:t>
+      </w:r>
+      <w:r>
+        <w:rPr>
+          <w:sz w:val="28"/>
+        </w:rPr>
+        <w:t xml:space="preserve"> не использован из-за нестабильной работы интерфейса при автоматизации.</w:t>
       </w:r>
     </w:p>
     <w:bookmarkEnd w:id="44"/>
@@ -32812,7 +33717,7 @@
   <w:abstractNum w:abstractNumId="0" w15:restartNumberingAfterBreak="0">
     <w:nsid w:val="0000A990"/>
     <w:multiLevelType w:val="multilevel"/>
-    <w:tmpl w:val="DD7A0B54"/>
+    <w:tmpl w:val="EA58CBB6"/>
     <w:lvl w:ilvl="0">
       <w:numFmt w:val="bullet"/>
       <w:lvlText w:val=" "/>
@@ -32889,7 +33794,7 @@
   <w:abstractNum w:abstractNumId="1" w15:restartNumberingAfterBreak="0">
     <w:nsid w:val="00A99411"/>
     <w:multiLevelType w:val="multilevel"/>
-    <w:tmpl w:val="F80EF7FA"/>
+    <w:tmpl w:val="A48E4D10"/>
     <w:lvl w:ilvl="0">
       <w:start w:val="1"/>
       <w:numFmt w:val="decimal"/>
@@ -34367,7 +35272,7 @@
     <w:autoRedefine/>
     <w:uiPriority w:val="39"/>
     <w:unhideWhenUsed/>
-    <w:rsid w:val="00D73759"/>
+    <w:rsid w:val="005F1F74"/>
     <w:pPr>
       <w:spacing w:after="100"/>
     </w:pPr>
@@ -34379,7 +35284,7 @@
     <w:autoRedefine/>
     <w:uiPriority w:val="39"/>
     <w:unhideWhenUsed/>
-    <w:rsid w:val="00D73759"/>
+    <w:rsid w:val="005F1F74"/>
     <w:pPr>
       <w:spacing w:after="100"/>
       <w:ind w:left="240"/>

</xml_diff>

<commit_message>
docs: rebuild lab4, lab6, final; remaining-tasks list linked in handoff
</commit_message>
<xml_diff>
--- a/ЛР2-3_Объем_рынка/ОТЧЕТ_ЛР2-3_TableMind.docx
+++ b/ЛР2-3_Объем_рынка/ОТЧЕТ_ЛР2-3_TableMind.docx
@@ -245,7 +245,7 @@
       <w:r>
         <w:fldChar w:fldCharType="separate"/>
       </w:r>
-      <w:hyperlink w:anchor="_Toc241936229" w:history="1">
+      <w:hyperlink w:anchor="_Toc241937908" w:history="1">
         <w:r>
           <w:rPr>
             <w:rStyle w:val="af"/>
@@ -273,7 +273,7 @@
             <w:noProof/>
             <w:webHidden/>
           </w:rPr>
-          <w:instrText xml:space="preserve"> PAGEREF _Toc241936229 \h </w:instrText>
+          <w:instrText xml:space="preserve"> PAGEREF _Toc241937908 \h </w:instrText>
         </w:r>
         <w:r>
           <w:rPr>
@@ -314,7 +314,7 @@
           <w:noProof/>
         </w:rPr>
       </w:pPr>
-      <w:hyperlink w:anchor="_Toc241936230" w:history="1">
+      <w:hyperlink w:anchor="_Toc241937909" w:history="1">
         <w:r>
           <w:rPr>
             <w:rStyle w:val="af"/>
@@ -342,7 +342,7 @@
             <w:noProof/>
             <w:webHidden/>
           </w:rPr>
-          <w:instrText xml:space="preserve"> PAGEREF _Toc241936230 \h </w:instrText>
+          <w:instrText xml:space="preserve"> PAGEREF _Toc241937909 \h </w:instrText>
         </w:r>
         <w:r>
           <w:rPr>
@@ -383,7 +383,7 @@
           <w:noProof/>
         </w:rPr>
       </w:pPr>
-      <w:hyperlink w:anchor="_Toc241936231" w:history="1">
+      <w:hyperlink w:anchor="_Toc241937910" w:history="1">
         <w:r>
           <w:rPr>
             <w:rStyle w:val="af"/>
@@ -411,7 +411,7 @@
             <w:noProof/>
             <w:webHidden/>
           </w:rPr>
-          <w:instrText xml:space="preserve"> PAGEREF _Toc241936231 \h </w:instrText>
+          <w:instrText xml:space="preserve"> PAGEREF _Toc241937910 \h </w:instrText>
         </w:r>
         <w:r>
           <w:rPr>
@@ -452,7 +452,7 @@
           <w:noProof/>
         </w:rPr>
       </w:pPr>
-      <w:hyperlink w:anchor="_Toc241936232" w:history="1">
+      <w:hyperlink w:anchor="_Toc241937911" w:history="1">
         <w:r>
           <w:rPr>
             <w:rStyle w:val="af"/>
@@ -489,7 +489,7 @@
             <w:noProof/>
             <w:webHidden/>
           </w:rPr>
-          <w:instrText xml:space="preserve"> PAGEREF _Toc241936232 \h </w:instrText>
+          <w:instrText xml:space="preserve"> PAGEREF _Toc241937911 \h </w:instrText>
         </w:r>
         <w:r>
           <w:rPr>
@@ -530,7 +530,7 @@
           <w:noProof/>
         </w:rPr>
       </w:pPr>
-      <w:hyperlink w:anchor="_Toc241936233" w:history="1">
+      <w:hyperlink w:anchor="_Toc241937912" w:history="1">
         <w:r>
           <w:rPr>
             <w:rStyle w:val="af"/>
@@ -567,7 +567,7 @@
             <w:noProof/>
             <w:webHidden/>
           </w:rPr>
-          <w:instrText xml:space="preserve"> PAGEREF _Toc241936233 \h </w:instrText>
+          <w:instrText xml:space="preserve"> PAGEREF _Toc241937912 \h </w:instrText>
         </w:r>
         <w:r>
           <w:rPr>
@@ -608,7 +608,7 @@
           <w:noProof/>
         </w:rPr>
       </w:pPr>
-      <w:hyperlink w:anchor="_Toc241936234" w:history="1">
+      <w:hyperlink w:anchor="_Toc241937913" w:history="1">
         <w:r>
           <w:rPr>
             <w:rStyle w:val="af"/>
@@ -645,7 +645,7 @@
             <w:noProof/>
             <w:webHidden/>
           </w:rPr>
-          <w:instrText xml:space="preserve"> PAGEREF _Toc241936234 \h </w:instrText>
+          <w:instrText xml:space="preserve"> PAGEREF _Toc241937913 \h </w:instrText>
         </w:r>
         <w:r>
           <w:rPr>
@@ -686,7 +686,7 @@
           <w:noProof/>
         </w:rPr>
       </w:pPr>
-      <w:hyperlink w:anchor="_Toc241936235" w:history="1">
+      <w:hyperlink w:anchor="_Toc241937914" w:history="1">
         <w:r>
           <w:rPr>
             <w:rStyle w:val="af"/>
@@ -714,7 +714,7 @@
             <w:noProof/>
             <w:webHidden/>
           </w:rPr>
-          <w:instrText xml:space="preserve"> PAGEREF _Toc241936235 \h </w:instrText>
+          <w:instrText xml:space="preserve"> PAGEREF _Toc241937914 \h </w:instrText>
         </w:r>
         <w:r>
           <w:rPr>
@@ -755,7 +755,7 @@
           <w:noProof/>
         </w:rPr>
       </w:pPr>
-      <w:hyperlink w:anchor="_Toc241936236" w:history="1">
+      <w:hyperlink w:anchor="_Toc241937915" w:history="1">
         <w:r>
           <w:rPr>
             <w:rStyle w:val="af"/>
@@ -783,7 +783,7 @@
             <w:noProof/>
             <w:webHidden/>
           </w:rPr>
-          <w:instrText xml:space="preserve"> PAGEREF _Toc241936236 \h </w:instrText>
+          <w:instrText xml:space="preserve"> PAGEREF _Toc241937915 \h </w:instrText>
         </w:r>
         <w:r>
           <w:rPr>
@@ -824,7 +824,7 @@
           <w:noProof/>
         </w:rPr>
       </w:pPr>
-      <w:hyperlink w:anchor="_Toc241936237" w:history="1">
+      <w:hyperlink w:anchor="_Toc241937916" w:history="1">
         <w:r>
           <w:rPr>
             <w:rStyle w:val="af"/>
@@ -861,7 +861,7 @@
             <w:noProof/>
             <w:webHidden/>
           </w:rPr>
-          <w:instrText xml:space="preserve"> PAGEREF _Toc241936237 \h </w:instrText>
+          <w:instrText xml:space="preserve"> PAGEREF _Toc241937916 \h </w:instrText>
         </w:r>
         <w:r>
           <w:rPr>
@@ -902,7 +902,7 @@
           <w:noProof/>
         </w:rPr>
       </w:pPr>
-      <w:hyperlink w:anchor="_Toc241936238" w:history="1">
+      <w:hyperlink w:anchor="_Toc241937917" w:history="1">
         <w:r>
           <w:rPr>
             <w:rStyle w:val="af"/>
@@ -930,7 +930,7 @@
             <w:noProof/>
             <w:webHidden/>
           </w:rPr>
-          <w:instrText xml:space="preserve"> PAGEREF _Toc241936238 \h </w:instrText>
+          <w:instrText xml:space="preserve"> PAGEREF _Toc241937917 \h </w:instrText>
         </w:r>
         <w:r>
           <w:rPr>
@@ -971,7 +971,7 @@
           <w:noProof/>
         </w:rPr>
       </w:pPr>
-      <w:hyperlink w:anchor="_Toc241936239" w:history="1">
+      <w:hyperlink w:anchor="_Toc241937918" w:history="1">
         <w:r>
           <w:rPr>
             <w:rStyle w:val="af"/>
@@ -999,7 +999,7 @@
             <w:noProof/>
             <w:webHidden/>
           </w:rPr>
-          <w:instrText xml:space="preserve"> PAGEREF _Toc241936239 \h </w:instrText>
+          <w:instrText xml:space="preserve"> PAGEREF _Toc241937918 \h </w:instrText>
         </w:r>
         <w:r>
           <w:rPr>
@@ -1040,7 +1040,7 @@
           <w:noProof/>
         </w:rPr>
       </w:pPr>
-      <w:hyperlink w:anchor="_Toc241936240" w:history="1">
+      <w:hyperlink w:anchor="_Toc241937919" w:history="1">
         <w:r>
           <w:rPr>
             <w:rStyle w:val="af"/>
@@ -1068,7 +1068,7 @@
             <w:noProof/>
             <w:webHidden/>
           </w:rPr>
-          <w:instrText xml:space="preserve"> PAGEREF _Toc241936240 \h </w:instrText>
+          <w:instrText xml:space="preserve"> PAGEREF _Toc241937919 \h </w:instrText>
         </w:r>
         <w:r>
           <w:rPr>
@@ -1109,7 +1109,7 @@
           <w:noProof/>
         </w:rPr>
       </w:pPr>
-      <w:hyperlink w:anchor="_Toc241936241" w:history="1">
+      <w:hyperlink w:anchor="_Toc241937920" w:history="1">
         <w:r>
           <w:rPr>
             <w:rStyle w:val="af"/>
@@ -1137,7 +1137,7 @@
             <w:noProof/>
             <w:webHidden/>
           </w:rPr>
-          <w:instrText xml:space="preserve"> PAGEREF _Toc241936241 \h </w:instrText>
+          <w:instrText xml:space="preserve"> PAGEREF _Toc241937920 \h </w:instrText>
         </w:r>
         <w:r>
           <w:rPr>
@@ -1178,7 +1178,7 @@
           <w:noProof/>
         </w:rPr>
       </w:pPr>
-      <w:hyperlink w:anchor="_Toc241936242" w:history="1">
+      <w:hyperlink w:anchor="_Toc241937921" w:history="1">
         <w:r>
           <w:rPr>
             <w:rStyle w:val="af"/>
@@ -1206,7 +1206,7 @@
             <w:noProof/>
             <w:webHidden/>
           </w:rPr>
-          <w:instrText xml:space="preserve"> PAGEREF _Toc241936242 \h </w:instrText>
+          <w:instrText xml:space="preserve"> PAGEREF _Toc241937921 \h </w:instrText>
         </w:r>
         <w:r>
           <w:rPr>
@@ -1247,7 +1247,7 @@
           <w:noProof/>
         </w:rPr>
       </w:pPr>
-      <w:hyperlink w:anchor="_Toc241936243" w:history="1">
+      <w:hyperlink w:anchor="_Toc241937922" w:history="1">
         <w:r>
           <w:rPr>
             <w:rStyle w:val="af"/>
@@ -1275,7 +1275,7 @@
             <w:noProof/>
             <w:webHidden/>
           </w:rPr>
-          <w:instrText xml:space="preserve"> PAGEREF _Toc241936243 \h </w:instrText>
+          <w:instrText xml:space="preserve"> PAGEREF _Toc241937922 \h </w:instrText>
         </w:r>
         <w:r>
           <w:rPr>
@@ -1316,7 +1316,7 @@
           <w:noProof/>
         </w:rPr>
       </w:pPr>
-      <w:hyperlink w:anchor="_Toc241936244" w:history="1">
+      <w:hyperlink w:anchor="_Toc241937923" w:history="1">
         <w:r>
           <w:rPr>
             <w:rStyle w:val="af"/>
@@ -1344,7 +1344,7 @@
             <w:noProof/>
             <w:webHidden/>
           </w:rPr>
-          <w:instrText xml:space="preserve"> PAGEREF _Toc241936244 \h </w:instrText>
+          <w:instrText xml:space="preserve"> PAGEREF _Toc241937923 \h </w:instrText>
         </w:r>
         <w:r>
           <w:rPr>
@@ -1385,7 +1385,7 @@
           <w:noProof/>
         </w:rPr>
       </w:pPr>
-      <w:hyperlink w:anchor="_Toc241936245" w:history="1">
+      <w:hyperlink w:anchor="_Toc241937924" w:history="1">
         <w:r>
           <w:rPr>
             <w:rStyle w:val="af"/>
@@ -1413,7 +1413,7 @@
             <w:noProof/>
             <w:webHidden/>
           </w:rPr>
-          <w:instrText xml:space="preserve"> PAGEREF _Toc241936245 \h </w:instrText>
+          <w:instrText xml:space="preserve"> PAGEREF _Toc241937924 \h </w:instrText>
         </w:r>
         <w:r>
           <w:rPr>
@@ -1454,7 +1454,7 @@
           <w:noProof/>
         </w:rPr>
       </w:pPr>
-      <w:hyperlink w:anchor="_Toc241936246" w:history="1">
+      <w:hyperlink w:anchor="_Toc241937925" w:history="1">
         <w:r>
           <w:rPr>
             <w:rStyle w:val="af"/>
@@ -1482,7 +1482,7 @@
             <w:noProof/>
             <w:webHidden/>
           </w:rPr>
-          <w:instrText xml:space="preserve"> PAGEREF _Toc241936246 \h </w:instrText>
+          <w:instrText xml:space="preserve"> PAGEREF _Toc241937925 \h </w:instrText>
         </w:r>
         <w:r>
           <w:rPr>
@@ -1523,7 +1523,7 @@
           <w:noProof/>
         </w:rPr>
       </w:pPr>
-      <w:hyperlink w:anchor="_Toc241936247" w:history="1">
+      <w:hyperlink w:anchor="_Toc241937926" w:history="1">
         <w:r>
           <w:rPr>
             <w:rStyle w:val="af"/>
@@ -1551,7 +1551,7 @@
             <w:noProof/>
             <w:webHidden/>
           </w:rPr>
-          <w:instrText xml:space="preserve"> PAGEREF _Toc241936247 \h </w:instrText>
+          <w:instrText xml:space="preserve"> PAGEREF _Toc241937926 \h </w:instrText>
         </w:r>
         <w:r>
           <w:rPr>
@@ -1592,7 +1592,7 @@
           <w:noProof/>
         </w:rPr>
       </w:pPr>
-      <w:hyperlink w:anchor="_Toc241936248" w:history="1">
+      <w:hyperlink w:anchor="_Toc241937927" w:history="1">
         <w:r>
           <w:rPr>
             <w:rStyle w:val="af"/>
@@ -1620,7 +1620,7 @@
             <w:noProof/>
             <w:webHidden/>
           </w:rPr>
-          <w:instrText xml:space="preserve"> PAGEREF _Toc241936248 \h </w:instrText>
+          <w:instrText xml:space="preserve"> PAGEREF _Toc241937927 \h </w:instrText>
         </w:r>
         <w:r>
           <w:rPr>
@@ -1661,7 +1661,7 @@
           <w:noProof/>
         </w:rPr>
       </w:pPr>
-      <w:hyperlink w:anchor="_Toc241936249" w:history="1">
+      <w:hyperlink w:anchor="_Toc241937928" w:history="1">
         <w:r>
           <w:rPr>
             <w:rStyle w:val="af"/>
@@ -1689,7 +1689,7 @@
             <w:noProof/>
             <w:webHidden/>
           </w:rPr>
-          <w:instrText xml:space="preserve"> PAGEREF _Toc241936249 \h </w:instrText>
+          <w:instrText xml:space="preserve"> PAGEREF _Toc241937928 \h </w:instrText>
         </w:r>
         <w:r>
           <w:rPr>
@@ -1730,7 +1730,7 @@
           <w:noProof/>
         </w:rPr>
       </w:pPr>
-      <w:hyperlink w:anchor="_Toc241936250" w:history="1">
+      <w:hyperlink w:anchor="_Toc241937929" w:history="1">
         <w:r>
           <w:rPr>
             <w:rStyle w:val="af"/>
@@ -1758,7 +1758,7 @@
             <w:noProof/>
             <w:webHidden/>
           </w:rPr>
-          <w:instrText xml:space="preserve"> PAGEREF _Toc241936250 \h </w:instrText>
+          <w:instrText xml:space="preserve"> PAGEREF _Toc241937929 \h </w:instrText>
         </w:r>
         <w:r>
           <w:rPr>
@@ -1799,7 +1799,7 @@
           <w:noProof/>
         </w:rPr>
       </w:pPr>
-      <w:hyperlink w:anchor="_Toc241936251" w:history="1">
+      <w:hyperlink w:anchor="_Toc241937930" w:history="1">
         <w:r>
           <w:rPr>
             <w:rStyle w:val="af"/>
@@ -1827,7 +1827,7 @@
             <w:noProof/>
             <w:webHidden/>
           </w:rPr>
-          <w:instrText xml:space="preserve"> PAGEREF _Toc241936251 \h </w:instrText>
+          <w:instrText xml:space="preserve"> PAGEREF _Toc241937930 \h </w:instrText>
         </w:r>
         <w:r>
           <w:rPr>
@@ -1873,7 +1873,7 @@
         <w:spacing w:before="0" w:after="360" w:line="360" w:lineRule="exact"/>
         <w:ind w:firstLine="709"/>
       </w:pPr>
-      <w:bookmarkStart w:id="1" w:name="_Toc241936229"/>
+      <w:bookmarkStart w:id="1" w:name="_Toc241937908"/>
       <w:r>
         <w:rPr>
           <w:b/>
@@ -2179,7 +2179,7 @@
         <w:ind w:firstLine="709"/>
       </w:pPr>
       <w:bookmarkStart w:id="2" w:name="_b608aa976fc82a0faaf3b83f58c735968afd03b"/>
-      <w:bookmarkStart w:id="3" w:name="_Toc241936230"/>
+      <w:bookmarkStart w:id="3" w:name="_Toc241937909"/>
       <w:bookmarkEnd w:id="0"/>
       <w:r>
         <w:rPr>
@@ -2257,7 +2257,7 @@
         <w:ind w:firstLine="709"/>
       </w:pPr>
       <w:bookmarkStart w:id="4" w:name="_6ea6bf0a5ec92c733c53e44899cf0806bdc5e39"/>
-      <w:bookmarkStart w:id="5" w:name="_Toc241936231"/>
+      <w:bookmarkStart w:id="5" w:name="_Toc241937910"/>
       <w:r>
         <w:rPr>
           <w:b/>
@@ -3213,7 +3213,7 @@
         <w:ind w:firstLine="709"/>
       </w:pPr>
       <w:bookmarkStart w:id="6" w:name="_7a0c967539b5ef143597c37b0951dae8b296890"/>
-      <w:bookmarkStart w:id="7" w:name="_Toc241936232"/>
+      <w:bookmarkStart w:id="7" w:name="_Toc241937911"/>
       <w:bookmarkEnd w:id="4"/>
       <w:r>
         <w:rPr>
@@ -5646,7 +5646,7 @@
           <w:sz w:val="28"/>
         </w:rPr>
         <w:drawing>
-          <wp:inline distT="0" distB="0" distL="0" distR="0" wp14:anchorId="62E5D349" wp14:editId="25E78597">
+          <wp:inline distT="0" distB="0" distL="0" distR="0" wp14:anchorId="090B348F" wp14:editId="0DEBFA44">
             <wp:extent cx="5334000" cy="3122341"/>
             <wp:effectExtent l="0" t="0" r="0" b="0"/>
             <wp:docPr id="12" name="Picture"/>
@@ -6457,7 +6457,7 @@
           <w:sz w:val="28"/>
         </w:rPr>
         <w:drawing>
-          <wp:inline distT="0" distB="0" distL="0" distR="0" wp14:anchorId="3DFCC52D" wp14:editId="25252897">
+          <wp:inline distT="0" distB="0" distL="0" distR="0" wp14:anchorId="30ECAB8A" wp14:editId="027DA6C0">
             <wp:extent cx="5334000" cy="3252439"/>
             <wp:effectExtent l="0" t="0" r="0" b="0"/>
             <wp:docPr id="15" name="Picture"/>
@@ -6618,7 +6618,7 @@
         <w:ind w:firstLine="709"/>
       </w:pPr>
       <w:bookmarkStart w:id="8" w:name="_da959056159f19dff160d665d57702b18af1ddd"/>
-      <w:bookmarkStart w:id="9" w:name="_Toc241936233"/>
+      <w:bookmarkStart w:id="9" w:name="_Toc241937912"/>
       <w:bookmarkEnd w:id="6"/>
       <w:r>
         <w:rPr>
@@ -9732,7 +9732,7 @@
         <w:ind w:firstLine="709"/>
       </w:pPr>
       <w:bookmarkStart w:id="10" w:name="_06e2001e7574ebc77f8406bc11ca3db76d00c2a"/>
-      <w:bookmarkStart w:id="11" w:name="_Toc241936234"/>
+      <w:bookmarkStart w:id="11" w:name="_Toc241937913"/>
       <w:bookmarkEnd w:id="8"/>
       <w:r>
         <w:rPr>
@@ -10536,7 +10536,7 @@
         <w:ind w:firstLine="709"/>
       </w:pPr>
       <w:bookmarkStart w:id="12" w:name="_606fa79e4d4f49d8da929021c2a978685b741ea"/>
-      <w:bookmarkStart w:id="13" w:name="_Toc241936235"/>
+      <w:bookmarkStart w:id="13" w:name="_Toc241937914"/>
       <w:bookmarkEnd w:id="10"/>
       <w:r>
         <w:rPr>
@@ -12970,7 +12970,7 @@
         <w:ind w:firstLine="709"/>
       </w:pPr>
       <w:bookmarkStart w:id="14" w:name="_2314d5998da626860a70184e0b470b0b8504694"/>
-      <w:bookmarkStart w:id="15" w:name="_Toc241936236"/>
+      <w:bookmarkStart w:id="15" w:name="_Toc241937915"/>
       <w:bookmarkEnd w:id="12"/>
       <w:r>
         <w:rPr>
@@ -13598,7 +13598,7 @@
         <w:ind w:firstLine="709"/>
       </w:pPr>
       <w:bookmarkStart w:id="16" w:name="_42bac9f10c820a94a4112d44417ea6b5d14bf7d"/>
-      <w:bookmarkStart w:id="17" w:name="_Toc241936237"/>
+      <w:bookmarkStart w:id="17" w:name="_Toc241937916"/>
       <w:bookmarkEnd w:id="14"/>
       <w:r>
         <w:rPr>
@@ -15505,7 +15505,7 @@
         <w:ind w:firstLine="709"/>
       </w:pPr>
       <w:bookmarkStart w:id="18" w:name="_62882a27ae1c57302eff280b02701a311900947"/>
-      <w:bookmarkStart w:id="19" w:name="_Toc241936238"/>
+      <w:bookmarkStart w:id="19" w:name="_Toc241937917"/>
       <w:bookmarkEnd w:id="16"/>
       <w:r>
         <w:rPr>
@@ -16894,7 +16894,7 @@
         <w:ind w:firstLine="709"/>
       </w:pPr>
       <w:bookmarkStart w:id="20" w:name="_2c7ec3ecf17663584d0d27e07e31cbd2a0948cf"/>
-      <w:bookmarkStart w:id="21" w:name="_Toc241936239"/>
+      <w:bookmarkStart w:id="21" w:name="_Toc241937918"/>
       <w:bookmarkEnd w:id="18"/>
       <w:r>
         <w:rPr>
@@ -19229,7 +19229,7 @@
         <w:ind w:firstLine="709"/>
       </w:pPr>
       <w:bookmarkStart w:id="22" w:name="_8d34778965163a5752bc27698d1f7e786ff5c87"/>
-      <w:bookmarkStart w:id="23" w:name="_Toc241936240"/>
+      <w:bookmarkStart w:id="23" w:name="_Toc241937919"/>
       <w:bookmarkEnd w:id="20"/>
       <w:r>
         <w:rPr>
@@ -20384,7 +20384,7 @@
           <w:sz w:val="28"/>
         </w:rPr>
         <w:drawing>
-          <wp:inline distT="0" distB="0" distL="0" distR="0" wp14:anchorId="1D92E925" wp14:editId="28070470">
+          <wp:inline distT="0" distB="0" distL="0" distR="0" wp14:anchorId="2972D085" wp14:editId="34B63DB6">
             <wp:extent cx="5334000" cy="2992243"/>
             <wp:effectExtent l="0" t="0" r="0" b="0"/>
             <wp:docPr id="26" name="Picture"/>
@@ -21230,7 +21230,7 @@
           <w:sz w:val="28"/>
         </w:rPr>
         <w:drawing>
-          <wp:inline distT="0" distB="0" distL="0" distR="0" wp14:anchorId="304207EB" wp14:editId="703683EE">
+          <wp:inline distT="0" distB="0" distL="0" distR="0" wp14:anchorId="4E6A2CDC" wp14:editId="5A47C12C">
             <wp:extent cx="5334000" cy="2471853"/>
             <wp:effectExtent l="0" t="0" r="0" b="0"/>
             <wp:docPr id="29" name="Picture"/>
@@ -21728,7 +21728,7 @@
         <w:ind w:firstLine="709"/>
       </w:pPr>
       <w:bookmarkStart w:id="24" w:name="_e6e1aac57bb528344b9009e4599364161f48047"/>
-      <w:bookmarkStart w:id="25" w:name="_Toc241936241"/>
+      <w:bookmarkStart w:id="25" w:name="_Toc241937920"/>
       <w:bookmarkEnd w:id="22"/>
       <w:r>
         <w:rPr>
@@ -22646,7 +22646,7 @@
         </w:rPr>
         <w:lastRenderedPageBreak/>
         <w:drawing>
-          <wp:inline distT="0" distB="0" distL="0" distR="0" wp14:anchorId="76703F30" wp14:editId="4B350CD9">
+          <wp:inline distT="0" distB="0" distL="0" distR="0" wp14:anchorId="0DCA993E" wp14:editId="30659459">
             <wp:extent cx="5334000" cy="2341756"/>
             <wp:effectExtent l="0" t="0" r="0" b="0"/>
             <wp:docPr id="33" name="Picture"/>
@@ -22877,7 +22877,7 @@
         <w:ind w:firstLine="709"/>
       </w:pPr>
       <w:bookmarkStart w:id="26" w:name="_6a64c25cd48aeb5a2bf3dc411d56d805a6b5d7e"/>
-      <w:bookmarkStart w:id="27" w:name="_Toc241936242"/>
+      <w:bookmarkStart w:id="27" w:name="_Toc241937921"/>
       <w:bookmarkEnd w:id="24"/>
       <w:r>
         <w:rPr>
@@ -22936,7 +22936,7 @@
         </w:rPr>
         <w:lastRenderedPageBreak/>
         <w:drawing>
-          <wp:inline distT="0" distB="0" distL="0" distR="0" wp14:anchorId="4D3AB6C6" wp14:editId="6082B0E1">
+          <wp:inline distT="0" distB="0" distL="0" distR="0" wp14:anchorId="43F8F658" wp14:editId="410F69E8">
             <wp:extent cx="5334000" cy="2471853"/>
             <wp:effectExtent l="0" t="0" r="0" b="0"/>
             <wp:docPr id="37" name="Picture"/>
@@ -23161,7 +23161,7 @@
         <w:ind w:firstLine="709"/>
       </w:pPr>
       <w:bookmarkStart w:id="28" w:name="_8cdf61ec50cc46d2aaeadce1b560fea28ea116e"/>
-      <w:bookmarkStart w:id="29" w:name="_Toc241936243"/>
+      <w:bookmarkStart w:id="29" w:name="_Toc241937922"/>
       <w:bookmarkEnd w:id="26"/>
       <w:r>
         <w:rPr>
@@ -23277,7 +23277,7 @@
         <w:ind w:firstLine="709"/>
       </w:pPr>
       <w:bookmarkStart w:id="30" w:name="_1bfdad9d2d88ddb6ca16c31c1d4d4943679f32f"/>
-      <w:bookmarkStart w:id="31" w:name="_Toc241936244"/>
+      <w:bookmarkStart w:id="31" w:name="_Toc241937923"/>
       <w:bookmarkEnd w:id="28"/>
       <w:bookmarkEnd w:id="2"/>
       <w:r>
@@ -23815,7 +23815,7 @@
         <w:jc w:val="center"/>
       </w:pPr>
       <w:bookmarkStart w:id="32" w:name="_выводы"/>
-      <w:bookmarkStart w:id="33" w:name="_Toc241936245"/>
+      <w:bookmarkStart w:id="33" w:name="_Toc241937924"/>
       <w:bookmarkEnd w:id="30"/>
       <w:r>
         <w:rPr>
@@ -24089,7 +24089,7 @@
         <w:jc w:val="center"/>
       </w:pPr>
       <w:bookmarkStart w:id="34" w:name="_274f6a444530ef90b0479dabf3d210f01e97699"/>
-      <w:bookmarkStart w:id="35" w:name="_Toc241936246"/>
+      <w:bookmarkStart w:id="35" w:name="_Toc241937925"/>
       <w:bookmarkEnd w:id="32"/>
       <w:r>
         <w:rPr>
@@ -26119,7 +26119,7 @@
         <w:jc w:val="center"/>
       </w:pPr>
       <w:bookmarkStart w:id="36" w:name="_3d74faf1500c1b2a4a8bfa8e0e37c74206ce73d"/>
-      <w:bookmarkStart w:id="37" w:name="_Toc241936247"/>
+      <w:bookmarkStart w:id="37" w:name="_Toc241937926"/>
       <w:bookmarkEnd w:id="34"/>
       <w:r>
         <w:rPr>
@@ -27585,7 +27585,7 @@
         <w:jc w:val="center"/>
       </w:pPr>
       <w:bookmarkStart w:id="38" w:name="_d684f183eb868ee4ace295916bed2e6be64d16e"/>
-      <w:bookmarkStart w:id="39" w:name="_Toc241936248"/>
+      <w:bookmarkStart w:id="39" w:name="_Toc241937927"/>
       <w:bookmarkEnd w:id="36"/>
       <w:r>
         <w:rPr>
@@ -27955,7 +27955,7 @@
               <w:rPr>
                 <w:sz w:val="24"/>
               </w:rPr>
-              <w:t xml:space="preserve"> (приложение Д); у </w:t>
+              <w:t xml:space="preserve"> (приложение Д); </w:t>
             </w:r>
             <w:r>
               <w:rPr>
@@ -27968,7 +27968,7 @@
               <w:rPr>
                 <w:sz w:val="24"/>
               </w:rPr>
-              <w:t xml:space="preserve"> данных нет; полный список стран остается открытым</w:t>
+              <w:t xml:space="preserve"> не получен (нет совпадений); полный список стран и новые домены после сброса суточного лимита остаются открытыми</w:t>
             </w:r>
           </w:p>
         </w:tc>
@@ -28257,13 +28257,13 @@
               <w:rPr>
                 <w:sz w:val="24"/>
               </w:rPr>
-              <w:t>проверено 03.10.2026: комисси</w:t>
-            </w:r>
-            <w:r>
-              <w:rPr>
-                <w:sz w:val="24"/>
-              </w:rPr>
-              <w:t>я 3 % (приложение Д)</w:t>
+              <w:t xml:space="preserve">проверено </w:t>
+            </w:r>
+            <w:r>
+              <w:rPr>
+                <w:sz w:val="24"/>
+              </w:rPr>
+              <w:t>03.10.2026: комиссия 3 % (приложение Д)</w:t>
             </w:r>
           </w:p>
         </w:tc>
@@ -28958,7 +28958,7 @@
         <w:jc w:val="center"/>
       </w:pPr>
       <w:bookmarkStart w:id="40" w:name="_cb59224a7032ef66ab429e7df9b4e4c597bc187"/>
-      <w:bookmarkStart w:id="41" w:name="_Toc241936249"/>
+      <w:bookmarkStart w:id="41" w:name="_Toc241937928"/>
       <w:bookmarkEnd w:id="38"/>
       <w:r>
         <w:rPr>
@@ -29951,7 +29951,7 @@
         <w:jc w:val="center"/>
       </w:pPr>
       <w:bookmarkStart w:id="42" w:name="_48e9587881bbc300b26702bd6584ff263e735cf"/>
-      <w:bookmarkStart w:id="43" w:name="_Toc241936250"/>
+      <w:bookmarkStart w:id="43" w:name="_Toc241937929"/>
       <w:bookmarkEnd w:id="40"/>
       <w:r>
         <w:rPr>
@@ -31293,7 +31293,7 @@
         <w:jc w:val="center"/>
       </w:pPr>
       <w:bookmarkStart w:id="44" w:name="_494653d134221fdc43c135127d450c9af0a7c7d"/>
-      <w:bookmarkStart w:id="45" w:name="_Toc241936251"/>
+      <w:bookmarkStart w:id="45" w:name="_Toc241937930"/>
       <w:bookmarkEnd w:id="42"/>
       <w:r>
         <w:rPr>
@@ -33074,14 +33074,65 @@
               <w:rPr>
                 <w:sz w:val="24"/>
               </w:rPr>
-              <w:t xml:space="preserve"> данных не имеет (работает как </w:t>
+              <w:t xml:space="preserve"> </w:t>
             </w:r>
             <w:r>
               <w:rPr>
                 <w:i/>
                 <w:sz w:val="24"/>
               </w:rPr>
-              <w:t>formulabot.com</w:t>
+              <w:t>Similarweb</w:t>
+            </w:r>
+            <w:r>
+              <w:rPr>
+                <w:sz w:val="24"/>
+              </w:rPr>
+              <w:t xml:space="preserve"> ответил «нет совпадений» (данных нет или исчерпан суточный лимит запросов)</w:t>
+            </w:r>
+          </w:p>
+        </w:tc>
+        <w:tc>
+          <w:tcPr>
+            <w:tcW w:w="1072" w:type="dxa"/>
+            <w:vAlign w:val="center"/>
+          </w:tcPr>
+          <w:p>
+            <w:pPr>
+              <w:pStyle w:val="Compact"/>
+              <w:spacing w:before="0" w:after="0" w:line="280" w:lineRule="exact"/>
+              <w:jc w:val="center"/>
+            </w:pPr>
+            <w:r>
+              <w:rPr>
+                <w:sz w:val="24"/>
+              </w:rPr>
+              <w:t>[5]</w:t>
+            </w:r>
+          </w:p>
+        </w:tc>
+        <w:tc>
+          <w:tcPr>
+            <w:tcW w:w="1767" w:type="dxa"/>
+            <w:vAlign w:val="center"/>
+          </w:tcPr>
+          <w:p>
+            <w:pPr>
+              <w:pStyle w:val="Compact"/>
+              <w:spacing w:before="0" w:after="0" w:line="280" w:lineRule="exact"/>
+              <w:jc w:val="center"/>
+            </w:pPr>
+            <w:r>
+              <w:rPr>
+                <w:sz w:val="24"/>
+              </w:rPr>
+              <w:t xml:space="preserve">средняя (оценка </w:t>
+            </w:r>
+            <w:r>
+              <w:rPr>
+                <w:i/>
+                <w:sz w:val="24"/>
+              </w:rPr>
+              <w:t>Similarweb</w:t>
             </w:r>
             <w:r>
               <w:rPr>
@@ -33093,104 +33144,59 @@
         </w:tc>
         <w:tc>
           <w:tcPr>
-            <w:tcW w:w="1072" w:type="dxa"/>
-            <w:vAlign w:val="center"/>
-          </w:tcPr>
-          <w:p>
-            <w:pPr>
-              <w:pStyle w:val="Compact"/>
-              <w:spacing w:before="0" w:after="0" w:line="280" w:lineRule="exact"/>
-              <w:jc w:val="center"/>
-            </w:pPr>
-            <w:r>
-              <w:rPr>
-                <w:sz w:val="24"/>
-              </w:rPr>
-              <w:t>[5]</w:t>
-            </w:r>
-          </w:p>
-        </w:tc>
-        <w:tc>
-          <w:tcPr>
-            <w:tcW w:w="1767" w:type="dxa"/>
-            <w:vAlign w:val="center"/>
-          </w:tcPr>
-          <w:p>
-            <w:pPr>
-              <w:pStyle w:val="Compact"/>
-              <w:spacing w:before="0" w:after="0" w:line="280" w:lineRule="exact"/>
-              <w:jc w:val="center"/>
-            </w:pPr>
-            <w:r>
-              <w:rPr>
-                <w:sz w:val="24"/>
-              </w:rPr>
-              <w:t xml:space="preserve">средняя (оценка </w:t>
-            </w:r>
+            <w:tcW w:w="1905" w:type="dxa"/>
+            <w:vAlign w:val="center"/>
+          </w:tcPr>
+          <w:p>
+            <w:pPr>
+              <w:pStyle w:val="Compact"/>
+              <w:spacing w:before="0" w:after="0" w:line="280" w:lineRule="exact"/>
+              <w:jc w:val="center"/>
+            </w:pPr>
             <w:r>
               <w:rPr>
                 <w:i/>
                 <w:sz w:val="24"/>
               </w:rPr>
-              <w:t>Similarweb</w:t>
-            </w:r>
-            <w:r>
-              <w:rPr>
-                <w:sz w:val="24"/>
-              </w:rPr>
-              <w:t>)</w:t>
-            </w:r>
-          </w:p>
-        </w:tc>
-        <w:tc>
-          <w:tcPr>
-            <w:tcW w:w="1905" w:type="dxa"/>
-            <w:vAlign w:val="center"/>
-          </w:tcPr>
-          <w:p>
-            <w:pPr>
-              <w:pStyle w:val="Compact"/>
-              <w:spacing w:before="0" w:after="0" w:line="280" w:lineRule="exact"/>
-              <w:jc w:val="center"/>
-            </w:pPr>
+              <w:t>sheetai.app</w:t>
+            </w:r>
+            <w:r>
+              <w:rPr>
+                <w:sz w:val="24"/>
+              </w:rPr>
+              <w:t xml:space="preserve"> и </w:t>
+            </w:r>
             <w:r>
               <w:rPr>
                 <w:i/>
                 <w:sz w:val="24"/>
               </w:rPr>
-              <w:t>sheetai.app</w:t>
-            </w:r>
-            <w:r>
-              <w:rPr>
-                <w:sz w:val="24"/>
-              </w:rPr>
-              <w:t xml:space="preserve"> и </w:t>
+              <w:t>f1f9.com</w:t>
+            </w:r>
+            <w:r>
+              <w:rPr>
+                <w:sz w:val="24"/>
+              </w:rPr>
+              <w:t xml:space="preserve"> добавляют 3,6 % к трафику 12 доменов основного снимка (6,02 млн визитов) и на итоговый диапазон не влияют; </w:t>
             </w:r>
             <w:r>
               <w:rPr>
                 <w:i/>
                 <w:sz w:val="24"/>
               </w:rPr>
-              <w:t>f1f9.com</w:t>
-            </w:r>
-            <w:r>
-              <w:rPr>
-                <w:sz w:val="24"/>
-              </w:rPr>
-              <w:t xml:space="preserve"> добавляют 3,6 % к трафику 12 доменов основного снимка (6,02 млн визитов) и на итоговый диапазон не влияют; </w:t>
-            </w:r>
-            <w:r>
-              <w:rPr>
-                <w:i/>
-                <w:sz w:val="24"/>
-              </w:rPr>
               <w:t>AppSource</w:t>
             </w:r>
             <w:r>
               <w:rPr>
                 <w:sz w:val="24"/>
               </w:rPr>
-              <w:t xml:space="preserve"> - канал, а не конкурент</w:t>
+              <w:t xml:space="preserve"> - канал,</w:t>
+            </w:r>
+            <w:r>
+              <w:rPr>
+                <w:sz w:val="24"/>
+              </w:rPr>
+              <w:t xml:space="preserve"> а не конкурент</w:t>
             </w:r>
           </w:p>
         </w:tc>
@@ -33207,13 +33213,7 @@
         <w:rPr>
           <w:sz w:val="28"/>
         </w:rPr>
-        <w:t>Первичные да</w:t>
-      </w:r>
-      <w:r>
-        <w:rPr>
-          <w:sz w:val="28"/>
-        </w:rPr>
-        <w:t xml:space="preserve">нные найдены по комиссии </w:t>
+        <w:t xml:space="preserve">Первичные данные найдены по комиссии </w:t>
       </w:r>
       <w:r>
         <w:rPr>
@@ -33278,7 +33278,13 @@
         <w:rPr>
           <w:sz w:val="28"/>
         </w:rPr>
-        <w:t xml:space="preserve"> остаются оценками третьих сторон. Для ценового коридора это означает, что опубликованные цены специализированных надстроек (</w:t>
+        <w:t xml:space="preserve"> остаются оценками третьих сторон. Для ценового коридора это означает, что опубликованные цены специализи</w:t>
+      </w:r>
+      <w:r>
+        <w:rPr>
+          <w:sz w:val="28"/>
+        </w:rPr>
+        <w:t>рованных надстроек (</w:t>
       </w:r>
       <w:r>
         <w:rPr>
@@ -33291,13 +33297,7 @@
         <w:rPr>
           <w:sz w:val="28"/>
         </w:rPr>
-        <w:t xml:space="preserve"> о</w:t>
-      </w:r>
-      <w:r>
-        <w:rPr>
-          <w:sz w:val="28"/>
-        </w:rPr>
-        <w:t>коло 3 </w:t>
+        <w:t xml:space="preserve"> около 3 </w:t>
       </w:r>
       <w:r>
         <w:rPr>
@@ -33414,13 +33414,13 @@
         <w:rPr>
           <w:sz w:val="28"/>
         </w:rPr>
-        <w:t xml:space="preserve"> в месяц) заметно дороже; точные цены последних можно получить только запросом коммерческог</w:t>
-      </w:r>
-      <w:r>
-        <w:rPr>
-          <w:sz w:val="28"/>
-        </w:rPr>
-        <w:t>о предложения.</w:t>
+        <w:t xml:space="preserve"> в месяц) заметно дороже; точные цены последних можно получить</w:t>
+      </w:r>
+      <w:r>
+        <w:rPr>
+          <w:sz w:val="28"/>
+        </w:rPr>
+        <w:t xml:space="preserve"> только запросом коммерческого предложения.</w:t>
       </w:r>
     </w:p>
     <w:p>
@@ -33512,13 +33512,13 @@
         <w:rPr>
           <w:sz w:val="28"/>
         </w:rPr>
-        <w:t>, для которых нужен рекламный кабинет или платный доступ; взамен для англоязычного поиска используются относ</w:t>
-      </w:r>
-      <w:r>
-        <w:rPr>
-          <w:sz w:val="28"/>
-        </w:rPr>
-        <w:t xml:space="preserve">ительные индексы </w:t>
+        <w:t>, для которых нужен рекламный кабинет или платный доступ; взамен для англоязычн</w:t>
+      </w:r>
+      <w:r>
+        <w:rPr>
+          <w:sz w:val="28"/>
+        </w:rPr>
+        <w:t xml:space="preserve">ого поиска используются относительные индексы </w:t>
       </w:r>
       <w:r>
         <w:rPr>
@@ -33717,7 +33717,7 @@
   <w:abstractNum w:abstractNumId="0" w15:restartNumberingAfterBreak="0">
     <w:nsid w:val="0000A990"/>
     <w:multiLevelType w:val="multilevel"/>
-    <w:tmpl w:val="EA58CBB6"/>
+    <w:tmpl w:val="12FCC0BA"/>
     <w:lvl w:ilvl="0">
       <w:numFmt w:val="bullet"/>
       <w:lvlText w:val=" "/>
@@ -33794,7 +33794,7 @@
   <w:abstractNum w:abstractNumId="1" w15:restartNumberingAfterBreak="0">
     <w:nsid w:val="00A99411"/>
     <w:multiLevelType w:val="multilevel"/>
-    <w:tmpl w:val="A48E4D10"/>
+    <w:tmpl w:val="225C9AD2"/>
     <w:lvl w:ilvl="0">
       <w:start w:val="1"/>
       <w:numFmt w:val="decimal"/>
@@ -35272,7 +35272,7 @@
     <w:autoRedefine/>
     <w:uiPriority w:val="39"/>
     <w:unhideWhenUsed/>
-    <w:rsid w:val="005F1F74"/>
+    <w:rsid w:val="002964A8"/>
     <w:pPr>
       <w:spacing w:after="100"/>
     </w:pPr>
@@ -35284,7 +35284,7 @@
     <w:autoRedefine/>
     <w:uiPriority w:val="39"/>
     <w:unhideWhenUsed/>
-    <w:rsid w:val="005F1F74"/>
+    <w:rsid w:val="002964A8"/>
     <w:pPr>
       <w:spacing w:after="100"/>
       <w:ind w:left="240"/>

</xml_diff>

<commit_message>
title from UP reports (gr. 60121), competitor screenshots, modeled MVP metrics and search/ads data, reports rebuilt
</commit_message>
<xml_diff>
--- a/ЛР2-3_Объем_рынка/ОТЧЕТ_ЛР2-3_TableMind.docx
+++ b/ЛР2-3_Объем_рынка/ОТЧЕТ_ЛР2-3_TableMind.docx
@@ -36,7 +36,7 @@
         <w:rPr>
           <w:sz w:val="28"/>
         </w:rPr>
-        <w:t>БЕЛОРУССКИЙ ГОСУДАРСТВЕННЫЙ УНИВЕРСИТЕТ</w:t>
+        <w:t>«Белорусский государственный университет</w:t>
       </w:r>
     </w:p>
     <w:p>
@@ -48,7 +48,19 @@
         <w:rPr>
           <w:sz w:val="28"/>
         </w:rPr>
-        <w:t>ИНФОРМАТИКИ И РАДИОЭЛЕКТРОНИКИ</w:t>
+        <w:t>информатики и радиоэлектроники»</w:t>
+      </w:r>
+    </w:p>
+    <w:p>
+      <w:pPr>
+        <w:spacing w:after="0" w:line="360" w:lineRule="exact"/>
+        <w:jc w:val="center"/>
+      </w:pPr>
+      <w:r>
+        <w:rPr>
+          <w:sz w:val="28"/>
+        </w:rPr>
+        <w:t>Обособленное подразделение «Институт информационных технологий БГУИР»</w:t>
       </w:r>
     </w:p>
     <w:p>
@@ -60,7 +72,13 @@
         <w:rPr>
           <w:sz w:val="28"/>
         </w:rPr>
-        <w:t>Факультет повышения квалификации и переподготовки</w:t>
+        <w:t xml:space="preserve">Факультет повышения квалификации и </w:t>
+      </w:r>
+      <w:r>
+        <w:rPr>
+          <w:sz w:val="28"/>
+        </w:rPr>
+        <w:t>переподготовки</w:t>
       </w:r>
     </w:p>
     <w:p>
@@ -97,13 +115,7 @@
         <w:rPr>
           <w:sz w:val="28"/>
         </w:rPr>
-        <w:t xml:space="preserve">по </w:t>
-      </w:r>
-      <w:r>
-        <w:rPr>
-          <w:sz w:val="28"/>
-        </w:rPr>
-        <w:t>лабораторным работам №2–3</w:t>
+        <w:t>по лабораторным работам №2–3</w:t>
       </w:r>
     </w:p>
     <w:p>
@@ -153,14 +165,14 @@
         <w:rPr>
           <w:sz w:val="28"/>
         </w:rPr>
-        <w:t>Выполнила:</w:t>
+        <w:t>Слушатель</w:t>
       </w:r>
       <w:r>
         <w:rPr>
           <w:sz w:val="28"/>
         </w:rPr>
         <w:tab/>
-        <w:t>ст. гр. 60131</w:t>
+        <w:t>гр. 60121</w:t>
       </w:r>
     </w:p>
     <w:p>
@@ -189,14 +201,14 @@
         <w:rPr>
           <w:sz w:val="28"/>
         </w:rPr>
-        <w:t>Проверила:</w:t>
+        <w:t>Руководитель:</w:t>
       </w:r>
       <w:r>
         <w:rPr>
           <w:sz w:val="28"/>
         </w:rPr>
         <w:tab/>
-        <w:t>Т. Н. Беляцкая</w:t>
+        <w:t>И. В. Кашникова</w:t>
       </w:r>
     </w:p>
     <w:p>
@@ -208,6 +220,7 @@
         <w:rPr>
           <w:sz w:val="28"/>
         </w:rPr>
+        <w:lastRenderedPageBreak/>
         <w:t>Минск 2026</w:t>
       </w:r>
     </w:p>
@@ -223,7 +236,14 @@
           <w:sz w:val="28"/>
         </w:rPr>
         <w:lastRenderedPageBreak/>
-        <w:t>СОДЕРЖАНИЕ</w:t>
+        <w:t>СО</w:t>
+      </w:r>
+      <w:r>
+        <w:rPr>
+          <w:b/>
+          <w:sz w:val="28"/>
+        </w:rPr>
+        <w:t>ДЕРЖАНИЕ</w:t>
       </w:r>
     </w:p>
     <w:p>
@@ -245,7 +265,7 @@
       <w:r>
         <w:fldChar w:fldCharType="separate"/>
       </w:r>
-      <w:hyperlink w:anchor="_Toc241937908" w:history="1">
+      <w:hyperlink w:anchor="_Toc241938590" w:history="1">
         <w:r>
           <w:rPr>
             <w:rStyle w:val="af"/>
@@ -273,76 +293,7 @@
             <w:noProof/>
             <w:webHidden/>
           </w:rPr>
-          <w:instrText xml:space="preserve"> PAGEREF _Toc241937908 \h </w:instrText>
-        </w:r>
-        <w:r>
-          <w:rPr>
-            <w:noProof/>
-            <w:webHidden/>
-          </w:rPr>
-        </w:r>
-        <w:r>
-          <w:rPr>
-            <w:noProof/>
-            <w:webHidden/>
-          </w:rPr>
-          <w:fldChar w:fldCharType="separate"/>
-        </w:r>
-        <w:r>
-          <w:rPr>
-            <w:noProof/>
-            <w:webHidden/>
-          </w:rPr>
-          <w:t>3</w:t>
-        </w:r>
-        <w:r>
-          <w:rPr>
-            <w:noProof/>
-            <w:webHidden/>
-          </w:rPr>
-          <w:fldChar w:fldCharType="end"/>
-        </w:r>
-      </w:hyperlink>
-    </w:p>
-    <w:p>
-      <w:pPr>
-        <w:pStyle w:val="12"/>
-        <w:tabs>
-          <w:tab w:val="right" w:leader="dot" w:pos="9345"/>
-        </w:tabs>
-        <w:rPr>
-          <w:noProof/>
-        </w:rPr>
-      </w:pPr>
-      <w:hyperlink w:anchor="_Toc241937909" w:history="1">
-        <w:r>
-          <w:rPr>
-            <w:rStyle w:val="af"/>
-            <w:b/>
-            <w:noProof/>
-          </w:rPr>
-          <w:t>2 ХОД РАБОТЫ</w:t>
-        </w:r>
-        <w:r>
-          <w:rPr>
-            <w:noProof/>
-            <w:webHidden/>
-          </w:rPr>
-          <w:tab/>
-        </w:r>
-        <w:r>
-          <w:rPr>
-            <w:noProof/>
-            <w:webHidden/>
-          </w:rPr>
-          <w:fldChar w:fldCharType="begin"/>
-        </w:r>
-        <w:r>
-          <w:rPr>
-            <w:noProof/>
-            <w:webHidden/>
-          </w:rPr>
-          <w:instrText xml:space="preserve"> PAGEREF _Toc241937909 \h </w:instrText>
+          <w:instrText xml:space="preserve"> PAGEREF _Toc241938590 \h </w:instrText>
         </w:r>
         <w:r>
           <w:rPr>
@@ -375,6 +326,75 @@
     </w:p>
     <w:p>
       <w:pPr>
+        <w:pStyle w:val="12"/>
+        <w:tabs>
+          <w:tab w:val="right" w:leader="dot" w:pos="9345"/>
+        </w:tabs>
+        <w:rPr>
+          <w:noProof/>
+        </w:rPr>
+      </w:pPr>
+      <w:hyperlink w:anchor="_Toc241938591" w:history="1">
+        <w:r>
+          <w:rPr>
+            <w:rStyle w:val="af"/>
+            <w:b/>
+            <w:noProof/>
+          </w:rPr>
+          <w:t>2 ХОД РАБОТЫ</w:t>
+        </w:r>
+        <w:r>
+          <w:rPr>
+            <w:noProof/>
+            <w:webHidden/>
+          </w:rPr>
+          <w:tab/>
+        </w:r>
+        <w:r>
+          <w:rPr>
+            <w:noProof/>
+            <w:webHidden/>
+          </w:rPr>
+          <w:fldChar w:fldCharType="begin"/>
+        </w:r>
+        <w:r>
+          <w:rPr>
+            <w:noProof/>
+            <w:webHidden/>
+          </w:rPr>
+          <w:instrText xml:space="preserve"> PAGEREF _Toc241938591 \h </w:instrText>
+        </w:r>
+        <w:r>
+          <w:rPr>
+            <w:noProof/>
+            <w:webHidden/>
+          </w:rPr>
+        </w:r>
+        <w:r>
+          <w:rPr>
+            <w:noProof/>
+            <w:webHidden/>
+          </w:rPr>
+          <w:fldChar w:fldCharType="separate"/>
+        </w:r>
+        <w:r>
+          <w:rPr>
+            <w:noProof/>
+            <w:webHidden/>
+          </w:rPr>
+          <w:t>5</w:t>
+        </w:r>
+        <w:r>
+          <w:rPr>
+            <w:noProof/>
+            <w:webHidden/>
+          </w:rPr>
+          <w:fldChar w:fldCharType="end"/>
+        </w:r>
+      </w:hyperlink>
+    </w:p>
+    <w:p>
+      <w:pPr>
         <w:pStyle w:val="22"/>
         <w:tabs>
           <w:tab w:val="right" w:leader="dot" w:pos="9345"/>
@@ -383,7 +403,7 @@
           <w:noProof/>
         </w:rPr>
       </w:pPr>
-      <w:hyperlink w:anchor="_Toc241937910" w:history="1">
+      <w:hyperlink w:anchor="_Toc241938592" w:history="1">
         <w:r>
           <w:rPr>
             <w:rStyle w:val="af"/>
@@ -411,7 +431,7 @@
             <w:noProof/>
             <w:webHidden/>
           </w:rPr>
-          <w:instrText xml:space="preserve"> PAGEREF _Toc241937910 \h </w:instrText>
+          <w:instrText xml:space="preserve"> PAGEREF _Toc241938592 \h </w:instrText>
         </w:r>
         <w:r>
           <w:rPr>
@@ -431,7 +451,7 @@
             <w:noProof/>
             <w:webHidden/>
           </w:rPr>
-          <w:t>4</w:t>
+          <w:t>5</w:t>
         </w:r>
         <w:r>
           <w:rPr>
@@ -452,7 +472,7 @@
           <w:noProof/>
         </w:rPr>
       </w:pPr>
-      <w:hyperlink w:anchor="_Toc241937911" w:history="1">
+      <w:hyperlink w:anchor="_Toc241938593" w:history="1">
         <w:r>
           <w:rPr>
             <w:rStyle w:val="af"/>
@@ -489,7 +509,7 @@
             <w:noProof/>
             <w:webHidden/>
           </w:rPr>
-          <w:instrText xml:space="preserve"> PAGEREF _Toc241937911 \h </w:instrText>
+          <w:instrText xml:space="preserve"> PAGEREF _Toc241938593 \h </w:instrText>
         </w:r>
         <w:r>
           <w:rPr>
@@ -509,7 +529,7 @@
             <w:noProof/>
             <w:webHidden/>
           </w:rPr>
-          <w:t>5</w:t>
+          <w:t>6</w:t>
         </w:r>
         <w:r>
           <w:rPr>
@@ -530,7 +550,7 @@
           <w:noProof/>
         </w:rPr>
       </w:pPr>
-      <w:hyperlink w:anchor="_Toc241937912" w:history="1">
+      <w:hyperlink w:anchor="_Toc241938594" w:history="1">
         <w:r>
           <w:rPr>
             <w:rStyle w:val="af"/>
@@ -567,7 +587,7 @@
             <w:noProof/>
             <w:webHidden/>
           </w:rPr>
-          <w:instrText xml:space="preserve"> PAGEREF _Toc241937912 \h </w:instrText>
+          <w:instrText xml:space="preserve"> PAGEREF _Toc241938594 \h </w:instrText>
         </w:r>
         <w:r>
           <w:rPr>
@@ -587,7 +607,7 @@
             <w:noProof/>
             <w:webHidden/>
           </w:rPr>
-          <w:t>7</w:t>
+          <w:t>8</w:t>
         </w:r>
         <w:r>
           <w:rPr>
@@ -608,7 +628,7 @@
           <w:noProof/>
         </w:rPr>
       </w:pPr>
-      <w:hyperlink w:anchor="_Toc241937913" w:history="1">
+      <w:hyperlink w:anchor="_Toc241938595" w:history="1">
         <w:r>
           <w:rPr>
             <w:rStyle w:val="af"/>
@@ -645,76 +665,7 @@
             <w:noProof/>
             <w:webHidden/>
           </w:rPr>
-          <w:instrText xml:space="preserve"> PAGEREF _Toc241937913 \h </w:instrText>
-        </w:r>
-        <w:r>
-          <w:rPr>
-            <w:noProof/>
-            <w:webHidden/>
-          </w:rPr>
-        </w:r>
-        <w:r>
-          <w:rPr>
-            <w:noProof/>
-            <w:webHidden/>
-          </w:rPr>
-          <w:fldChar w:fldCharType="separate"/>
-        </w:r>
-        <w:r>
-          <w:rPr>
-            <w:noProof/>
-            <w:webHidden/>
-          </w:rPr>
-          <w:t>9</w:t>
-        </w:r>
-        <w:r>
-          <w:rPr>
-            <w:noProof/>
-            <w:webHidden/>
-          </w:rPr>
-          <w:fldChar w:fldCharType="end"/>
-        </w:r>
-      </w:hyperlink>
-    </w:p>
-    <w:p>
-      <w:pPr>
-        <w:pStyle w:val="22"/>
-        <w:tabs>
-          <w:tab w:val="right" w:leader="dot" w:pos="9345"/>
-        </w:tabs>
-        <w:rPr>
-          <w:noProof/>
-        </w:rPr>
-      </w:pPr>
-      <w:hyperlink w:anchor="_Toc241937914" w:history="1">
-        <w:r>
-          <w:rPr>
-            <w:rStyle w:val="af"/>
-            <w:b/>
-            <w:noProof/>
-          </w:rPr>
-          <w:t>2.5 Число потенциальных клиентов</w:t>
-        </w:r>
-        <w:r>
-          <w:rPr>
-            <w:noProof/>
-            <w:webHidden/>
-          </w:rPr>
-          <w:tab/>
-        </w:r>
-        <w:r>
-          <w:rPr>
-            <w:noProof/>
-            <w:webHidden/>
-          </w:rPr>
-          <w:fldChar w:fldCharType="begin"/>
-        </w:r>
-        <w:r>
-          <w:rPr>
-            <w:noProof/>
-            <w:webHidden/>
-          </w:rPr>
-          <w:instrText xml:space="preserve"> PAGEREF _Toc241937914 \h </w:instrText>
+          <w:instrText xml:space="preserve"> PAGEREF _Toc241938595 \h </w:instrText>
         </w:r>
         <w:r>
           <w:rPr>
@@ -755,14 +706,14 @@
           <w:noProof/>
         </w:rPr>
       </w:pPr>
-      <w:hyperlink w:anchor="_Toc241937915" w:history="1">
+      <w:hyperlink w:anchor="_Toc241938596" w:history="1">
         <w:r>
           <w:rPr>
             <w:rStyle w:val="af"/>
             <w:b/>
             <w:noProof/>
           </w:rPr>
-          <w:t>2.6 Методики «сверху вниз» и «снизу вверх»</w:t>
+          <w:t>2.5 Число потенциальных клиентов</w:t>
         </w:r>
         <w:r>
           <w:rPr>
@@ -783,7 +734,7 @@
             <w:noProof/>
             <w:webHidden/>
           </w:rPr>
-          <w:instrText xml:space="preserve"> PAGEREF _Toc241937915 \h </w:instrText>
+          <w:instrText xml:space="preserve"> PAGEREF _Toc241938596 \h </w:instrText>
         </w:r>
         <w:r>
           <w:rPr>
@@ -824,7 +775,76 @@
           <w:noProof/>
         </w:rPr>
       </w:pPr>
-      <w:hyperlink w:anchor="_Toc241937916" w:history="1">
+      <w:hyperlink w:anchor="_Toc241938597" w:history="1">
+        <w:r>
+          <w:rPr>
+            <w:rStyle w:val="af"/>
+            <w:b/>
+            <w:noProof/>
+          </w:rPr>
+          <w:t>2.6 Методики «сверху вниз» и «снизу вверх»</w:t>
+        </w:r>
+        <w:r>
+          <w:rPr>
+            <w:noProof/>
+            <w:webHidden/>
+          </w:rPr>
+          <w:tab/>
+        </w:r>
+        <w:r>
+          <w:rPr>
+            <w:noProof/>
+            <w:webHidden/>
+          </w:rPr>
+          <w:fldChar w:fldCharType="begin"/>
+        </w:r>
+        <w:r>
+          <w:rPr>
+            <w:noProof/>
+            <w:webHidden/>
+          </w:rPr>
+          <w:instrText xml:space="preserve"> PAGEREF _Toc241938597 \h </w:instrText>
+        </w:r>
+        <w:r>
+          <w:rPr>
+            <w:noProof/>
+            <w:webHidden/>
+          </w:rPr>
+        </w:r>
+        <w:r>
+          <w:rPr>
+            <w:noProof/>
+            <w:webHidden/>
+          </w:rPr>
+          <w:fldChar w:fldCharType="separate"/>
+        </w:r>
+        <w:r>
+          <w:rPr>
+            <w:noProof/>
+            <w:webHidden/>
+          </w:rPr>
+          <w:t>12</w:t>
+        </w:r>
+        <w:r>
+          <w:rPr>
+            <w:noProof/>
+            <w:webHidden/>
+          </w:rPr>
+          <w:fldChar w:fldCharType="end"/>
+        </w:r>
+      </w:hyperlink>
+    </w:p>
+    <w:p>
+      <w:pPr>
+        <w:pStyle w:val="22"/>
+        <w:tabs>
+          <w:tab w:val="right" w:leader="dot" w:pos="9345"/>
+        </w:tabs>
+        <w:rPr>
+          <w:noProof/>
+        </w:rPr>
+      </w:pPr>
+      <w:hyperlink w:anchor="_Toc241938598" w:history="1">
         <w:r>
           <w:rPr>
             <w:rStyle w:val="af"/>
@@ -861,76 +881,7 @@
             <w:noProof/>
             <w:webHidden/>
           </w:rPr>
-          <w:instrText xml:space="preserve"> PAGEREF _Toc241937916 \h </w:instrText>
-        </w:r>
-        <w:r>
-          <w:rPr>
-            <w:noProof/>
-            <w:webHidden/>
-          </w:rPr>
-        </w:r>
-        <w:r>
-          <w:rPr>
-            <w:noProof/>
-            <w:webHidden/>
-          </w:rPr>
-          <w:fldChar w:fldCharType="separate"/>
-        </w:r>
-        <w:r>
-          <w:rPr>
-            <w:noProof/>
-            <w:webHidden/>
-          </w:rPr>
-          <w:t>12</w:t>
-        </w:r>
-        <w:r>
-          <w:rPr>
-            <w:noProof/>
-            <w:webHidden/>
-          </w:rPr>
-          <w:fldChar w:fldCharType="end"/>
-        </w:r>
-      </w:hyperlink>
-    </w:p>
-    <w:p>
-      <w:pPr>
-        <w:pStyle w:val="22"/>
-        <w:tabs>
-          <w:tab w:val="right" w:leader="dot" w:pos="9345"/>
-        </w:tabs>
-        <w:rPr>
-          <w:noProof/>
-        </w:rPr>
-      </w:pPr>
-      <w:hyperlink w:anchor="_Toc241937917" w:history="1">
-        <w:r>
-          <w:rPr>
-            <w:rStyle w:val="af"/>
-            <w:b/>
-            <w:noProof/>
-          </w:rPr>
-          <w:t>2.8 Поисковый спрос: контрольный русскоязычный сегмент</w:t>
-        </w:r>
-        <w:r>
-          <w:rPr>
-            <w:noProof/>
-            <w:webHidden/>
-          </w:rPr>
-          <w:tab/>
-        </w:r>
-        <w:r>
-          <w:rPr>
-            <w:noProof/>
-            <w:webHidden/>
-          </w:rPr>
-          <w:fldChar w:fldCharType="begin"/>
-        </w:r>
-        <w:r>
-          <w:rPr>
-            <w:noProof/>
-            <w:webHidden/>
-          </w:rPr>
-          <w:instrText xml:space="preserve"> PAGEREF _Toc241937917 \h </w:instrText>
+          <w:instrText xml:space="preserve"> PAGEREF _Toc241938598 \h </w:instrText>
         </w:r>
         <w:r>
           <w:rPr>
@@ -971,14 +922,14 @@
           <w:noProof/>
         </w:rPr>
       </w:pPr>
-      <w:hyperlink w:anchor="_Toc241937918" w:history="1">
+      <w:hyperlink w:anchor="_Toc241938599" w:history="1">
         <w:r>
           <w:rPr>
             <w:rStyle w:val="af"/>
             <w:b/>
             <w:noProof/>
           </w:rPr>
-          <w:t>2.9 Проверка платежеспособности</w:t>
+          <w:t>2.8 Поисковый спрос: контрольный русскоязычный сегмент</w:t>
         </w:r>
         <w:r>
           <w:rPr>
@@ -999,7 +950,7 @@
             <w:noProof/>
             <w:webHidden/>
           </w:rPr>
-          <w:instrText xml:space="preserve"> PAGEREF _Toc241937918 \h </w:instrText>
+          <w:instrText xml:space="preserve"> PAGEREF _Toc241938599 \h </w:instrText>
         </w:r>
         <w:r>
           <w:rPr>
@@ -1040,7 +991,76 @@
           <w:noProof/>
         </w:rPr>
       </w:pPr>
-      <w:hyperlink w:anchor="_Toc241937919" w:history="1">
+      <w:hyperlink w:anchor="_Toc241938600" w:history="1">
+        <w:r>
+          <w:rPr>
+            <w:rStyle w:val="af"/>
+            <w:b/>
+            <w:noProof/>
+          </w:rPr>
+          <w:t>2.9 Проверка платежеспособности</w:t>
+        </w:r>
+        <w:r>
+          <w:rPr>
+            <w:noProof/>
+            <w:webHidden/>
+          </w:rPr>
+          <w:tab/>
+        </w:r>
+        <w:r>
+          <w:rPr>
+            <w:noProof/>
+            <w:webHidden/>
+          </w:rPr>
+          <w:fldChar w:fldCharType="begin"/>
+        </w:r>
+        <w:r>
+          <w:rPr>
+            <w:noProof/>
+            <w:webHidden/>
+          </w:rPr>
+          <w:instrText xml:space="preserve"> PAGEREF _Toc241938600 \h </w:instrText>
+        </w:r>
+        <w:r>
+          <w:rPr>
+            <w:noProof/>
+            <w:webHidden/>
+          </w:rPr>
+        </w:r>
+        <w:r>
+          <w:rPr>
+            <w:noProof/>
+            <w:webHidden/>
+          </w:rPr>
+          <w:fldChar w:fldCharType="separate"/>
+        </w:r>
+        <w:r>
+          <w:rPr>
+            <w:noProof/>
+            <w:webHidden/>
+          </w:rPr>
+          <w:t>15</w:t>
+        </w:r>
+        <w:r>
+          <w:rPr>
+            <w:noProof/>
+            <w:webHidden/>
+          </w:rPr>
+          <w:fldChar w:fldCharType="end"/>
+        </w:r>
+      </w:hyperlink>
+    </w:p>
+    <w:p>
+      <w:pPr>
+        <w:pStyle w:val="22"/>
+        <w:tabs>
+          <w:tab w:val="right" w:leader="dot" w:pos="9345"/>
+        </w:tabs>
+        <w:rPr>
+          <w:noProof/>
+        </w:rPr>
+      </w:pPr>
+      <w:hyperlink w:anchor="_Toc241938601" w:history="1">
         <w:r>
           <w:rPr>
             <w:rStyle w:val="af"/>
@@ -1068,7 +1088,7 @@
             <w:noProof/>
             <w:webHidden/>
           </w:rPr>
-          <w:instrText xml:space="preserve"> PAGEREF _Toc241937919 \h </w:instrText>
+          <w:instrText xml:space="preserve"> PAGEREF _Toc241938601 \h </w:instrText>
         </w:r>
         <w:r>
           <w:rPr>
@@ -1088,7 +1108,7 @@
             <w:noProof/>
             <w:webHidden/>
           </w:rPr>
-          <w:t>16</w:t>
+          <w:t>17</w:t>
         </w:r>
         <w:r>
           <w:rPr>
@@ -1109,7 +1129,7 @@
           <w:noProof/>
         </w:rPr>
       </w:pPr>
-      <w:hyperlink w:anchor="_Toc241937920" w:history="1">
+      <w:hyperlink w:anchor="_Toc241938602" w:history="1">
         <w:r>
           <w:rPr>
             <w:rStyle w:val="af"/>
@@ -1137,76 +1157,7 @@
             <w:noProof/>
             <w:webHidden/>
           </w:rPr>
-          <w:instrText xml:space="preserve"> PAGEREF _Toc241937920 \h </w:instrText>
-        </w:r>
-        <w:r>
-          <w:rPr>
-            <w:noProof/>
-            <w:webHidden/>
-          </w:rPr>
-        </w:r>
-        <w:r>
-          <w:rPr>
-            <w:noProof/>
-            <w:webHidden/>
-          </w:rPr>
-          <w:fldChar w:fldCharType="separate"/>
-        </w:r>
-        <w:r>
-          <w:rPr>
-            <w:noProof/>
-            <w:webHidden/>
-          </w:rPr>
-          <w:t>19</w:t>
-        </w:r>
-        <w:r>
-          <w:rPr>
-            <w:noProof/>
-            <w:webHidden/>
-          </w:rPr>
-          <w:fldChar w:fldCharType="end"/>
-        </w:r>
-      </w:hyperlink>
-    </w:p>
-    <w:p>
-      <w:pPr>
-        <w:pStyle w:val="22"/>
-        <w:tabs>
-          <w:tab w:val="right" w:leader="dot" w:pos="9345"/>
-        </w:tabs>
-        <w:rPr>
-          <w:noProof/>
-        </w:rPr>
-      </w:pPr>
-      <w:hyperlink w:anchor="_Toc241937921" w:history="1">
-        <w:r>
-          <w:rPr>
-            <w:rStyle w:val="af"/>
-            <w:b/>
-            <w:noProof/>
-          </w:rPr>
-          <w:t>2.12 Чувствительность и проверка расчетов</w:t>
-        </w:r>
-        <w:r>
-          <w:rPr>
-            <w:noProof/>
-            <w:webHidden/>
-          </w:rPr>
-          <w:tab/>
-        </w:r>
-        <w:r>
-          <w:rPr>
-            <w:noProof/>
-            <w:webHidden/>
-          </w:rPr>
-          <w:fldChar w:fldCharType="begin"/>
-        </w:r>
-        <w:r>
-          <w:rPr>
-            <w:noProof/>
-            <w:webHidden/>
-          </w:rPr>
-          <w:instrText xml:space="preserve"> PAGEREF _Toc241937921 \h </w:instrText>
+          <w:instrText xml:space="preserve"> PAGEREF _Toc241938602 \h </w:instrText>
         </w:r>
         <w:r>
           <w:rPr>
@@ -1247,14 +1198,14 @@
           <w:noProof/>
         </w:rPr>
       </w:pPr>
-      <w:hyperlink w:anchor="_Toc241937922" w:history="1">
+      <w:hyperlink w:anchor="_Toc241938603" w:history="1">
         <w:r>
           <w:rPr>
             <w:rStyle w:val="af"/>
             <w:b/>
             <w:noProof/>
           </w:rPr>
-          <w:t>2.13 Ограничения оценки</w:t>
+          <w:t>2.12 Чувствительность и проверка расчетов</w:t>
         </w:r>
         <w:r>
           <w:rPr>
@@ -1275,7 +1226,7 @@
             <w:noProof/>
             <w:webHidden/>
           </w:rPr>
-          <w:instrText xml:space="preserve"> PAGEREF _Toc241937922 \h </w:instrText>
+          <w:instrText xml:space="preserve"> PAGEREF _Toc241938603 \h </w:instrText>
         </w:r>
         <w:r>
           <w:rPr>
@@ -1308,7 +1259,7 @@
     </w:p>
     <w:p>
       <w:pPr>
-        <w:pStyle w:val="12"/>
+        <w:pStyle w:val="22"/>
         <w:tabs>
           <w:tab w:val="right" w:leader="dot" w:pos="9345"/>
         </w:tabs>
@@ -1316,14 +1267,14 @@
           <w:noProof/>
         </w:rPr>
       </w:pPr>
-      <w:hyperlink w:anchor="_Toc241937923" w:history="1">
+      <w:hyperlink w:anchor="_Toc241938604" w:history="1">
         <w:r>
           <w:rPr>
             <w:rStyle w:val="af"/>
             <w:b/>
             <w:noProof/>
           </w:rPr>
-          <w:t>3 ОТВЕТЫ НА КОНТРОЛЬНЫЕ ВОПРОСЫ</w:t>
+          <w:t>2.13 Ограничения оценки</w:t>
         </w:r>
         <w:r>
           <w:rPr>
@@ -1344,7 +1295,7 @@
             <w:noProof/>
             <w:webHidden/>
           </w:rPr>
-          <w:instrText xml:space="preserve"> PAGEREF _Toc241937923 \h </w:instrText>
+          <w:instrText xml:space="preserve"> PAGEREF _Toc241938604 \h </w:instrText>
         </w:r>
         <w:r>
           <w:rPr>
@@ -1385,7 +1336,76 @@
           <w:noProof/>
         </w:rPr>
       </w:pPr>
-      <w:hyperlink w:anchor="_Toc241937924" w:history="1">
+      <w:hyperlink w:anchor="_Toc241938605" w:history="1">
+        <w:r>
+          <w:rPr>
+            <w:rStyle w:val="af"/>
+            <w:b/>
+            <w:noProof/>
+          </w:rPr>
+          <w:t>3 ОТВЕТЫ НА КОНТРОЛЬНЫЕ ВОПРОСЫ</w:t>
+        </w:r>
+        <w:r>
+          <w:rPr>
+            <w:noProof/>
+            <w:webHidden/>
+          </w:rPr>
+          <w:tab/>
+        </w:r>
+        <w:r>
+          <w:rPr>
+            <w:noProof/>
+            <w:webHidden/>
+          </w:rPr>
+          <w:fldChar w:fldCharType="begin"/>
+        </w:r>
+        <w:r>
+          <w:rPr>
+            <w:noProof/>
+            <w:webHidden/>
+          </w:rPr>
+          <w:instrText xml:space="preserve"> PAGEREF _Toc241938605 \h </w:instrText>
+        </w:r>
+        <w:r>
+          <w:rPr>
+            <w:noProof/>
+            <w:webHidden/>
+          </w:rPr>
+        </w:r>
+        <w:r>
+          <w:rPr>
+            <w:noProof/>
+            <w:webHidden/>
+          </w:rPr>
+          <w:fldChar w:fldCharType="separate"/>
+        </w:r>
+        <w:r>
+          <w:rPr>
+            <w:noProof/>
+            <w:webHidden/>
+          </w:rPr>
+          <w:t>23</w:t>
+        </w:r>
+        <w:r>
+          <w:rPr>
+            <w:noProof/>
+            <w:webHidden/>
+          </w:rPr>
+          <w:fldChar w:fldCharType="end"/>
+        </w:r>
+      </w:hyperlink>
+    </w:p>
+    <w:p>
+      <w:pPr>
+        <w:pStyle w:val="12"/>
+        <w:tabs>
+          <w:tab w:val="right" w:leader="dot" w:pos="9345"/>
+        </w:tabs>
+        <w:rPr>
+          <w:noProof/>
+        </w:rPr>
+      </w:pPr>
+      <w:hyperlink w:anchor="_Toc241938606" w:history="1">
         <w:r>
           <w:rPr>
             <w:rStyle w:val="af"/>
@@ -1413,76 +1433,7 @@
             <w:noProof/>
             <w:webHidden/>
           </w:rPr>
-          <w:instrText xml:space="preserve"> PAGEREF _Toc241937924 \h </w:instrText>
-        </w:r>
-        <w:r>
-          <w:rPr>
-            <w:noProof/>
-            <w:webHidden/>
-          </w:rPr>
-        </w:r>
-        <w:r>
-          <w:rPr>
-            <w:noProof/>
-            <w:webHidden/>
-          </w:rPr>
-          <w:fldChar w:fldCharType="separate"/>
-        </w:r>
-        <w:r>
-          <w:rPr>
-            <w:noProof/>
-            <w:webHidden/>
-          </w:rPr>
-          <w:t>24</w:t>
-        </w:r>
-        <w:r>
-          <w:rPr>
-            <w:noProof/>
-            <w:webHidden/>
-          </w:rPr>
-          <w:fldChar w:fldCharType="end"/>
-        </w:r>
-      </w:hyperlink>
-    </w:p>
-    <w:p>
-      <w:pPr>
-        <w:pStyle w:val="12"/>
-        <w:tabs>
-          <w:tab w:val="right" w:leader="dot" w:pos="9345"/>
-        </w:tabs>
-        <w:rPr>
-          <w:noProof/>
-        </w:rPr>
-      </w:pPr>
-      <w:hyperlink w:anchor="_Toc241937925" w:history="1">
-        <w:r>
-          <w:rPr>
-            <w:rStyle w:val="af"/>
-            <w:b/>
-            <w:noProof/>
-          </w:rPr>
-          <w:t>СПИСОК ИСПОЛЬЗОВАННЫХ ИСТОЧНИКОВ</w:t>
-        </w:r>
-        <w:r>
-          <w:rPr>
-            <w:noProof/>
-            <w:webHidden/>
-          </w:rPr>
-          <w:tab/>
-        </w:r>
-        <w:r>
-          <w:rPr>
-            <w:noProof/>
-            <w:webHidden/>
-          </w:rPr>
-          <w:fldChar w:fldCharType="begin"/>
-        </w:r>
-        <w:r>
-          <w:rPr>
-            <w:noProof/>
-            <w:webHidden/>
-          </w:rPr>
-          <w:instrText xml:space="preserve"> PAGEREF _Toc241937925 \h </w:instrText>
+          <w:instrText xml:space="preserve"> PAGEREF _Toc241938606 \h </w:instrText>
         </w:r>
         <w:r>
           <w:rPr>
@@ -1523,7 +1474,76 @@
           <w:noProof/>
         </w:rPr>
       </w:pPr>
-      <w:hyperlink w:anchor="_Toc241937926" w:history="1">
+      <w:hyperlink w:anchor="_Toc241938607" w:history="1">
+        <w:r>
+          <w:rPr>
+            <w:rStyle w:val="af"/>
+            <w:b/>
+            <w:noProof/>
+          </w:rPr>
+          <w:t>СПИСОК ИСПОЛЬЗОВАННЫХ ИСТОЧНИКОВ</w:t>
+        </w:r>
+        <w:r>
+          <w:rPr>
+            <w:noProof/>
+            <w:webHidden/>
+          </w:rPr>
+          <w:tab/>
+        </w:r>
+        <w:r>
+          <w:rPr>
+            <w:noProof/>
+            <w:webHidden/>
+          </w:rPr>
+          <w:fldChar w:fldCharType="begin"/>
+        </w:r>
+        <w:r>
+          <w:rPr>
+            <w:noProof/>
+            <w:webHidden/>
+          </w:rPr>
+          <w:instrText xml:space="preserve"> PAGEREF _Toc241938607 \h </w:instrText>
+        </w:r>
+        <w:r>
+          <w:rPr>
+            <w:noProof/>
+            <w:webHidden/>
+          </w:rPr>
+        </w:r>
+        <w:r>
+          <w:rPr>
+            <w:noProof/>
+            <w:webHidden/>
+          </w:rPr>
+          <w:fldChar w:fldCharType="separate"/>
+        </w:r>
+        <w:r>
+          <w:rPr>
+            <w:noProof/>
+            <w:webHidden/>
+          </w:rPr>
+          <w:t>26</w:t>
+        </w:r>
+        <w:r>
+          <w:rPr>
+            <w:noProof/>
+            <w:webHidden/>
+          </w:rPr>
+          <w:fldChar w:fldCharType="end"/>
+        </w:r>
+      </w:hyperlink>
+    </w:p>
+    <w:p>
+      <w:pPr>
+        <w:pStyle w:val="12"/>
+        <w:tabs>
+          <w:tab w:val="right" w:leader="dot" w:pos="9345"/>
+        </w:tabs>
+        <w:rPr>
+          <w:noProof/>
+        </w:rPr>
+      </w:pPr>
+      <w:hyperlink w:anchor="_Toc241938608" w:history="1">
         <w:r>
           <w:rPr>
             <w:rStyle w:val="af"/>
@@ -1551,7 +1571,7 @@
             <w:noProof/>
             <w:webHidden/>
           </w:rPr>
-          <w:instrText xml:space="preserve"> PAGEREF _Toc241937926 \h </w:instrText>
+          <w:instrText xml:space="preserve"> PAGEREF _Toc241938608 \h </w:instrText>
         </w:r>
         <w:r>
           <w:rPr>
@@ -1571,7 +1591,7 @@
             <w:noProof/>
             <w:webHidden/>
           </w:rPr>
-          <w:t>27</w:t>
+          <w:t>28</w:t>
         </w:r>
         <w:r>
           <w:rPr>
@@ -1592,7 +1612,7 @@
           <w:noProof/>
         </w:rPr>
       </w:pPr>
-      <w:hyperlink w:anchor="_Toc241937927" w:history="1">
+      <w:hyperlink w:anchor="_Toc241938609" w:history="1">
         <w:r>
           <w:rPr>
             <w:rStyle w:val="af"/>
@@ -1620,7 +1640,7 @@
             <w:noProof/>
             <w:webHidden/>
           </w:rPr>
-          <w:instrText xml:space="preserve"> PAGEREF _Toc241937927 \h </w:instrText>
+          <w:instrText xml:space="preserve"> PAGEREF _Toc241938609 \h </w:instrText>
         </w:r>
         <w:r>
           <w:rPr>
@@ -1640,7 +1660,7 @@
             <w:noProof/>
             <w:webHidden/>
           </w:rPr>
-          <w:t>29</w:t>
+          <w:t>30</w:t>
         </w:r>
         <w:r>
           <w:rPr>
@@ -1661,7 +1681,7 @@
           <w:noProof/>
         </w:rPr>
       </w:pPr>
-      <w:hyperlink w:anchor="_Toc241937928" w:history="1">
+      <w:hyperlink w:anchor="_Toc241938610" w:history="1">
         <w:r>
           <w:rPr>
             <w:rStyle w:val="af"/>
@@ -1689,76 +1709,7 @@
             <w:noProof/>
             <w:webHidden/>
           </w:rPr>
-          <w:instrText xml:space="preserve"> PAGEREF _Toc241937928 \h </w:instrText>
-        </w:r>
-        <w:r>
-          <w:rPr>
-            <w:noProof/>
-            <w:webHidden/>
-          </w:rPr>
-        </w:r>
-        <w:r>
-          <w:rPr>
-            <w:noProof/>
-            <w:webHidden/>
-          </w:rPr>
-          <w:fldChar w:fldCharType="separate"/>
-        </w:r>
-        <w:r>
-          <w:rPr>
-            <w:noProof/>
-            <w:webHidden/>
-          </w:rPr>
-          <w:t>31</w:t>
-        </w:r>
-        <w:r>
-          <w:rPr>
-            <w:noProof/>
-            <w:webHidden/>
-          </w:rPr>
-          <w:fldChar w:fldCharType="end"/>
-        </w:r>
-      </w:hyperlink>
-    </w:p>
-    <w:p>
-      <w:pPr>
-        <w:pStyle w:val="12"/>
-        <w:tabs>
-          <w:tab w:val="right" w:leader="dot" w:pos="9345"/>
-        </w:tabs>
-        <w:rPr>
-          <w:noProof/>
-        </w:rPr>
-      </w:pPr>
-      <w:hyperlink w:anchor="_Toc241937929" w:history="1">
-        <w:r>
-          <w:rPr>
-            <w:rStyle w:val="af"/>
-            <w:b/>
-            <w:noProof/>
-          </w:rPr>
-          <w:t>ПРИЛОЖЕНИЕ Г</w:t>
-        </w:r>
-        <w:r>
-          <w:rPr>
-            <w:noProof/>
-            <w:webHidden/>
-          </w:rPr>
-          <w:tab/>
-        </w:r>
-        <w:r>
-          <w:rPr>
-            <w:noProof/>
-            <w:webHidden/>
-          </w:rPr>
-          <w:fldChar w:fldCharType="begin"/>
-        </w:r>
-        <w:r>
-          <w:rPr>
-            <w:noProof/>
-            <w:webHidden/>
-          </w:rPr>
-          <w:instrText xml:space="preserve"> PAGEREF _Toc241937929 \h </w:instrText>
+          <w:instrText xml:space="preserve"> PAGEREF _Toc241938610 \h </w:instrText>
         </w:r>
         <w:r>
           <w:rPr>
@@ -1799,7 +1750,76 @@
           <w:noProof/>
         </w:rPr>
       </w:pPr>
-      <w:hyperlink w:anchor="_Toc241937930" w:history="1">
+      <w:hyperlink w:anchor="_Toc241938611" w:history="1">
+        <w:r>
+          <w:rPr>
+            <w:rStyle w:val="af"/>
+            <w:b/>
+            <w:noProof/>
+          </w:rPr>
+          <w:t>ПРИЛОЖЕНИЕ Г</w:t>
+        </w:r>
+        <w:r>
+          <w:rPr>
+            <w:noProof/>
+            <w:webHidden/>
+          </w:rPr>
+          <w:tab/>
+        </w:r>
+        <w:r>
+          <w:rPr>
+            <w:noProof/>
+            <w:webHidden/>
+          </w:rPr>
+          <w:fldChar w:fldCharType="begin"/>
+        </w:r>
+        <w:r>
+          <w:rPr>
+            <w:noProof/>
+            <w:webHidden/>
+          </w:rPr>
+          <w:instrText xml:space="preserve"> PAGEREF _Toc241938611 \h </w:instrText>
+        </w:r>
+        <w:r>
+          <w:rPr>
+            <w:noProof/>
+            <w:webHidden/>
+          </w:rPr>
+        </w:r>
+        <w:r>
+          <w:rPr>
+            <w:noProof/>
+            <w:webHidden/>
+          </w:rPr>
+          <w:fldChar w:fldCharType="separate"/>
+        </w:r>
+        <w:r>
+          <w:rPr>
+            <w:noProof/>
+            <w:webHidden/>
+          </w:rPr>
+          <w:t>33</w:t>
+        </w:r>
+        <w:r>
+          <w:rPr>
+            <w:noProof/>
+            <w:webHidden/>
+          </w:rPr>
+          <w:fldChar w:fldCharType="end"/>
+        </w:r>
+      </w:hyperlink>
+    </w:p>
+    <w:p>
+      <w:pPr>
+        <w:pStyle w:val="12"/>
+        <w:tabs>
+          <w:tab w:val="right" w:leader="dot" w:pos="9345"/>
+        </w:tabs>
+        <w:rPr>
+          <w:noProof/>
+        </w:rPr>
+      </w:pPr>
+      <w:hyperlink w:anchor="_Toc241938612" w:history="1">
         <w:r>
           <w:rPr>
             <w:rStyle w:val="af"/>
@@ -1827,7 +1847,7 @@
             <w:noProof/>
             <w:webHidden/>
           </w:rPr>
-          <w:instrText xml:space="preserve"> PAGEREF _Toc241937930 \h </w:instrText>
+          <w:instrText xml:space="preserve"> PAGEREF _Toc241938612 \h </w:instrText>
         </w:r>
         <w:r>
           <w:rPr>
@@ -1847,7 +1867,7 @@
             <w:noProof/>
             <w:webHidden/>
           </w:rPr>
-          <w:t>34</w:t>
+          <w:t>35</w:t>
         </w:r>
         <w:r>
           <w:rPr>
@@ -1873,7 +1893,7 @@
         <w:spacing w:before="0" w:after="360" w:line="360" w:lineRule="exact"/>
         <w:ind w:firstLine="709"/>
       </w:pPr>
-      <w:bookmarkStart w:id="1" w:name="_Toc241937908"/>
+      <w:bookmarkStart w:id="1" w:name="_Toc241938590"/>
       <w:r>
         <w:rPr>
           <w:b/>
@@ -1960,7 +1980,13 @@
         <w:rPr>
           <w:sz w:val="28"/>
         </w:rPr>
-        <w:t>, пригодный для сопоставления с целями проекта (300 регистраций и 50 платящих пользователей к 30.09.2027) и с его бюджетом (517 000 </w:t>
+        <w:t>, пригодный для сопоставления с целями проекта (300 р</w:t>
+      </w:r>
+      <w:r>
+        <w:rPr>
+          <w:sz w:val="28"/>
+        </w:rPr>
+        <w:t>егистраций и 50 платящих пользователей к 30.09.2027) и с его бюджетом (517 000 </w:t>
       </w:r>
       <w:r>
         <w:rPr>
@@ -1973,13 +1999,7 @@
         <w:rPr>
           <w:sz w:val="28"/>
         </w:rPr>
-        <w:t>).</w:t>
-      </w:r>
-      <w:r>
-        <w:rPr>
-          <w:sz w:val="28"/>
-        </w:rPr>
-        <w:t xml:space="preserve"> Работа продолжает ЛР1, где зафиксированы границы рынка и подтвержден частичный поисковый интерес [1].</w:t>
+        <w:t>). Работа продолжает ЛР1, где зафиксированы границы рынка и подтвержден частичный поисковый интерес [1].</w:t>
       </w:r>
     </w:p>
     <w:p>
@@ -2179,7 +2199,7 @@
         <w:ind w:firstLine="709"/>
       </w:pPr>
       <w:bookmarkStart w:id="2" w:name="_b608aa976fc82a0faaf3b83f58c735968afd03b"/>
-      <w:bookmarkStart w:id="3" w:name="_Toc241937909"/>
+      <w:bookmarkStart w:id="3" w:name="_Toc241938591"/>
       <w:bookmarkEnd w:id="0"/>
       <w:r>
         <w:rPr>
@@ -2257,7 +2277,7 @@
         <w:ind w:firstLine="709"/>
       </w:pPr>
       <w:bookmarkStart w:id="4" w:name="_6ea6bf0a5ec92c733c53e44899cf0806bdc5e39"/>
-      <w:bookmarkStart w:id="5" w:name="_Toc241937910"/>
+      <w:bookmarkStart w:id="5" w:name="_Toc241938592"/>
       <w:r>
         <w:rPr>
           <w:b/>
@@ -3213,7 +3233,7 @@
         <w:ind w:firstLine="709"/>
       </w:pPr>
       <w:bookmarkStart w:id="6" w:name="_7a0c967539b5ef143597c37b0951dae8b296890"/>
-      <w:bookmarkStart w:id="7" w:name="_Toc241937911"/>
+      <w:bookmarkStart w:id="7" w:name="_Toc241938593"/>
       <w:bookmarkEnd w:id="4"/>
       <w:r>
         <w:rPr>
@@ -5552,13 +5572,13 @@
         <w:rPr>
           <w:sz w:val="28"/>
         </w:rPr>
-        <w:t xml:space="preserve">) на один-два порядка меньше. Доля целевых </w:t>
-      </w:r>
-      <w:r>
-        <w:rPr>
-          <w:sz w:val="28"/>
-        </w:rPr>
-        <w:t>стран посчитана только по пяти крупнейшим странам каждого сайта, поэтому это нижняя оценка. Наименьшие сайты (</w:t>
+        <w:t>) на один-два порядка меньше. Доля целевых стран по</w:t>
+      </w:r>
+      <w:r>
+        <w:rPr>
+          <w:sz w:val="28"/>
+        </w:rPr>
+        <w:t>считана только по пяти крупнейшим странам каждого сайта, поэтому это нижняя оценка. Наименьшие сайты (</w:t>
       </w:r>
       <w:r>
         <w:rPr>
@@ -5624,13 +5644,13 @@
         <w:rPr>
           <w:sz w:val="28"/>
         </w:rPr>
-        <w:t>На рисунке 1 показано: среднемесячные визиты сайтов, июнь - август 2026 (логарифмич</w:t>
-      </w:r>
-      <w:r>
-        <w:rPr>
-          <w:sz w:val="28"/>
-        </w:rPr>
-        <w:t>еская шкала).</w:t>
+        <w:t>На рисунке 1 показано: среднемесячные визиты сайтов, июнь - август 2026 (логарифмическая шк</w:t>
+      </w:r>
+      <w:r>
+        <w:rPr>
+          <w:sz w:val="28"/>
+        </w:rPr>
+        <w:t>ала).</w:t>
       </w:r>
     </w:p>
     <w:p>
@@ -5646,7 +5666,7 @@
           <w:sz w:val="28"/>
         </w:rPr>
         <w:drawing>
-          <wp:inline distT="0" distB="0" distL="0" distR="0" wp14:anchorId="090B348F" wp14:editId="0DEBFA44">
+          <wp:inline distT="0" distB="0" distL="0" distR="0" wp14:anchorId="7006F96E" wp14:editId="569BF1E9">
             <wp:extent cx="5334000" cy="3122341"/>
             <wp:effectExtent l="0" t="0" r="0" b="0"/>
             <wp:docPr id="12" name="Picture"/>
@@ -5712,13 +5732,13 @@
         <w:rPr>
           <w:sz w:val="28"/>
         </w:rPr>
-        <w:t>Разброс визитов - от 2 тысяч до 700 тысяч в месяц. Специализированные инструменты проверки таблиц собирают в сумме около 75 тысяч визитов в месяц против пр</w:t>
-      </w:r>
-      <w:r>
-        <w:rPr>
-          <w:sz w:val="28"/>
-        </w:rPr>
-        <w:t xml:space="preserve">имерно 1,9 миллиона у заменителей, что показывает, что внимание аудитории сосредоточено на </w:t>
+        <w:t>Разброс визитов - от 2 тысяч до 700 тысяч в месяц. Специализированные инструменты проверки таблиц собирают в сумме около 75 тысяч визитов в месяц против примерно 1</w:t>
+      </w:r>
+      <w:r>
+        <w:rPr>
+          <w:sz w:val="28"/>
+        </w:rPr>
+        <w:t xml:space="preserve">,9 миллиона у заменителей, что показывает, что внимание аудитории сосредоточено на </w:t>
       </w:r>
       <w:r>
         <w:rPr>
@@ -6457,7 +6477,7 @@
           <w:sz w:val="28"/>
         </w:rPr>
         <w:drawing>
-          <wp:inline distT="0" distB="0" distL="0" distR="0" wp14:anchorId="30ECAB8A" wp14:editId="027DA6C0">
+          <wp:inline distT="0" distB="0" distL="0" distR="0" wp14:anchorId="379C68B6" wp14:editId="0669EBA2">
             <wp:extent cx="5334000" cy="3252439"/>
             <wp:effectExtent l="0" t="0" r="0" b="0"/>
             <wp:docPr id="15" name="Picture"/>
@@ -6618,7 +6638,7 @@
         <w:ind w:firstLine="709"/>
       </w:pPr>
       <w:bookmarkStart w:id="8" w:name="_da959056159f19dff160d665d57702b18af1ddd"/>
-      <w:bookmarkStart w:id="9" w:name="_Toc241937912"/>
+      <w:bookmarkStart w:id="9" w:name="_Toc241938594"/>
       <w:bookmarkEnd w:id="6"/>
       <w:r>
         <w:rPr>
@@ -6687,7 +6707,14 @@
           <w:i/>
           <w:sz w:val="28"/>
         </w:rPr>
-        <w:t>AI</w:t>
+        <w:t>A</w:t>
+      </w:r>
+      <w:r>
+        <w:rPr>
+          <w:i/>
+          <w:sz w:val="28"/>
+        </w:rPr>
+        <w:t>I</w:t>
       </w:r>
       <w:r>
         <w:rPr>
@@ -6811,34 +6838,34 @@
                 <w:b/>
                 <w:sz w:val="24"/>
               </w:rPr>
-              <w:t>Д</w:t>
-            </w:r>
+              <w:t>Доля целевых стран</w:t>
+            </w:r>
+          </w:p>
+        </w:tc>
+        <w:tc>
+          <w:tcPr>
+            <w:tcW w:w="1941" w:type="dxa"/>
+            <w:vAlign w:val="center"/>
+          </w:tcPr>
+          <w:p>
+            <w:pPr>
+              <w:pStyle w:val="Compact"/>
+              <w:spacing w:before="0" w:after="0" w:line="280" w:lineRule="exact"/>
+              <w:jc w:val="center"/>
+            </w:pPr>
             <w:r>
               <w:rPr>
                 <w:b/>
                 <w:sz w:val="24"/>
               </w:rPr>
-              <w:t>оля целевых стран</w:t>
-            </w:r>
-          </w:p>
-        </w:tc>
-        <w:tc>
-          <w:tcPr>
-            <w:tcW w:w="1941" w:type="dxa"/>
-            <w:vAlign w:val="center"/>
-          </w:tcPr>
-          <w:p>
-            <w:pPr>
-              <w:pStyle w:val="Compact"/>
-              <w:spacing w:before="0" w:after="0" w:line="280" w:lineRule="exact"/>
-              <w:jc w:val="center"/>
-            </w:pPr>
+              <w:t>Доля реле</w:t>
+            </w:r>
             <w:r>
               <w:rPr>
                 <w:b/>
                 <w:sz w:val="24"/>
               </w:rPr>
-              <w:t>Доля релевантного содержания</w:t>
+              <w:t>вантного содержания</w:t>
             </w:r>
           </w:p>
         </w:tc>
@@ -9183,7 +9210,14 @@
                 <w:b/>
                 <w:sz w:val="24"/>
               </w:rPr>
-              <w:t>Оценка трафика, визитов в месяц</w:t>
+              <w:t>Оценка трафика, визитов</w:t>
+            </w:r>
+            <w:r>
+              <w:rPr>
+                <w:b/>
+                <w:sz w:val="24"/>
+              </w:rPr>
+              <w:t xml:space="preserve"> в месяц</w:t>
             </w:r>
           </w:p>
         </w:tc>
@@ -9732,7 +9766,7 @@
         <w:ind w:firstLine="709"/>
       </w:pPr>
       <w:bookmarkStart w:id="10" w:name="_06e2001e7574ebc77f8406bc11ca3db76d00c2a"/>
-      <w:bookmarkStart w:id="11" w:name="_Toc241937913"/>
+      <w:bookmarkStart w:id="11" w:name="_Toc241938595"/>
       <w:bookmarkEnd w:id="8"/>
       <w:r>
         <w:rPr>
@@ -10448,13 +10482,13 @@
           <w:sz w:val="28"/>
         </w:rPr>
         <w:lastRenderedPageBreak/>
-        <w:t xml:space="preserve">Размах от осторожного до оптимистичного сценария - почти три порядка, что типично для рынка, где основной параметр </w:t>
-      </w:r>
-      <w:r>
-        <w:rPr>
-          <w:sz w:val="28"/>
-        </w:rPr>
-        <w:t>(конверсия) пока не измерен на собственном продукте.</w:t>
+        <w:t>Размах от осторожного до оптимистичного сценария - почти три порядка, что типично для рынка, где основной параметр (конверсия</w:t>
+      </w:r>
+      <w:r>
+        <w:rPr>
+          <w:sz w:val="28"/>
+        </w:rPr>
+        <w:t>) пока не измерен на собственном продукте.</w:t>
       </w:r>
     </w:p>
     <w:p>
@@ -10507,13 +10541,13 @@
         <w:rPr>
           <w:sz w:val="28"/>
         </w:rPr>
-        <w:t xml:space="preserve"> в год</w:t>
-      </w:r>
-      <w:r>
-        <w:rPr>
-          <w:sz w:val="28"/>
-        </w:rPr>
-        <w:t>, комиссия - 26 942 </w:t>
+        <w:t xml:space="preserve"> в год, комиссия</w:t>
+      </w:r>
+      <w:r>
+        <w:rPr>
+          <w:sz w:val="28"/>
+        </w:rPr>
+        <w:t xml:space="preserve"> - 26 942 </w:t>
       </w:r>
       <w:r>
         <w:rPr>
@@ -10536,7 +10570,7 @@
         <w:ind w:firstLine="709"/>
       </w:pPr>
       <w:bookmarkStart w:id="12" w:name="_606fa79e4d4f49d8da929021c2a978685b741ea"/>
-      <w:bookmarkStart w:id="13" w:name="_Toc241937914"/>
+      <w:bookmarkStart w:id="13" w:name="_Toc241938596"/>
       <w:bookmarkEnd w:id="10"/>
       <w:r>
         <w:rPr>
@@ -10558,13 +10592,13 @@
         <w:rPr>
           <w:sz w:val="28"/>
         </w:rPr>
-        <w:t>Клиентская база строится по профессиональным сегментам и по малому бизнесу. Для США и</w:t>
-      </w:r>
-      <w:r>
-        <w:rPr>
-          <w:sz w:val="28"/>
-        </w:rPr>
-        <w:t>спользованы данные Бюро статистики труда (</w:t>
+        <w:t>Клиентская база строится по профессиональным сегментам и по малому бизнесу. Для США использован</w:t>
+      </w:r>
+      <w:r>
+        <w:rPr>
+          <w:sz w:val="28"/>
+        </w:rPr>
+        <w:t>ы данные Бюро статистики труда (</w:t>
       </w:r>
       <w:r>
         <w:rPr>
@@ -10590,13 +10624,13 @@
         <w:rPr>
           <w:sz w:val="28"/>
         </w:rPr>
-        <w:t>, 2</w:t>
-      </w:r>
-      <w:r>
-        <w:rPr>
-          <w:sz w:val="28"/>
-        </w:rPr>
-        <w:t>025) [7], около 1,42 миллиона британских работодателей [8] и около 34 миллионов МСП ЕС по отчету Европейской комиссии 2025/2026 [9].</w:t>
+        <w:t xml:space="preserve">, 2025) [7], </w:t>
+      </w:r>
+      <w:r>
+        <w:rPr>
+          <w:sz w:val="28"/>
+        </w:rPr>
+        <w:t>около 1,42 миллиона британских работодателей [8] и около 34 миллионов МСП ЕС по отчету Европейской комиссии 2025/2026 [9].</w:t>
       </w:r>
     </w:p>
     <w:p>
@@ -10623,13 +10657,13 @@
         <w:rPr>
           <w:sz w:val="28"/>
         </w:rPr>
-        <w:t xml:space="preserve"> по профессиям в открытом виде получить не удалось, поэтому занятость за пределами США оценена масштабом по </w:t>
-      </w:r>
-      <w:r>
-        <w:rPr>
-          <w:sz w:val="28"/>
-        </w:rPr>
-        <w:t xml:space="preserve">числу занятых: 0,45 для Великобритании, Канады, Австралии и Ирландии и 1,30 для ЕС-27 (допущение Д-10, ДОСНЯТЬ: </w:t>
+        <w:t xml:space="preserve"> по профессиям в открытом виде получить не удалось, поэтому занятость за пределами США оценена масштабом по числу заня</w:t>
+      </w:r>
+      <w:r>
+        <w:rPr>
+          <w:sz w:val="28"/>
+        </w:rPr>
+        <w:t xml:space="preserve">тых: 0,45 для Великобритании, Канады, Австралии и Ирландии и 1,30 для ЕС-27 (допущение Д-10, ДОСНЯТЬ: </w:t>
       </w:r>
       <w:r>
         <w:rPr>
@@ -12970,7 +13004,7 @@
         <w:ind w:firstLine="709"/>
       </w:pPr>
       <w:bookmarkStart w:id="14" w:name="_2314d5998da626860a70184e0b470b0b8504694"/>
-      <w:bookmarkStart w:id="15" w:name="_Toc241937915"/>
+      <w:bookmarkStart w:id="15" w:name="_Toc241938597"/>
       <w:bookmarkEnd w:id="12"/>
       <w:r>
         <w:rPr>
@@ -13598,7 +13632,7 @@
         <w:ind w:firstLine="709"/>
       </w:pPr>
       <w:bookmarkStart w:id="16" w:name="_42bac9f10c820a94a4112d44417ea6b5d14bf7d"/>
-      <w:bookmarkStart w:id="17" w:name="_Toc241937916"/>
+      <w:bookmarkStart w:id="17" w:name="_Toc241938598"/>
       <w:bookmarkEnd w:id="14"/>
       <w:r>
         <w:rPr>
@@ -15505,7 +15539,7 @@
         <w:ind w:firstLine="709"/>
       </w:pPr>
       <w:bookmarkStart w:id="18" w:name="_62882a27ae1c57302eff280b02701a311900947"/>
-      <w:bookmarkStart w:id="19" w:name="_Toc241937917"/>
+      <w:bookmarkStart w:id="19" w:name="_Toc241938599"/>
       <w:bookmarkEnd w:id="16"/>
       <w:r>
         <w:rPr>
@@ -16894,7 +16928,7 @@
         <w:ind w:firstLine="709"/>
       </w:pPr>
       <w:bookmarkStart w:id="20" w:name="_2c7ec3ecf17663584d0d27e07e31cbd2a0948cf"/>
-      <w:bookmarkStart w:id="21" w:name="_Toc241937918"/>
+      <w:bookmarkStart w:id="21" w:name="_Toc241938600"/>
       <w:bookmarkEnd w:id="18"/>
       <w:r>
         <w:rPr>
@@ -19229,7 +19263,7 @@
         <w:ind w:firstLine="709"/>
       </w:pPr>
       <w:bookmarkStart w:id="22" w:name="_8d34778965163a5752bc27698d1f7e786ff5c87"/>
-      <w:bookmarkStart w:id="23" w:name="_Toc241937919"/>
+      <w:bookmarkStart w:id="23" w:name="_Toc241938601"/>
       <w:bookmarkEnd w:id="20"/>
       <w:r>
         <w:rPr>
@@ -20384,7 +20418,7 @@
           <w:sz w:val="28"/>
         </w:rPr>
         <w:drawing>
-          <wp:inline distT="0" distB="0" distL="0" distR="0" wp14:anchorId="2972D085" wp14:editId="34B63DB6">
+          <wp:inline distT="0" distB="0" distL="0" distR="0" wp14:anchorId="28814D57" wp14:editId="0380D1E2">
             <wp:extent cx="5334000" cy="2992243"/>
             <wp:effectExtent l="0" t="0" r="0" b="0"/>
             <wp:docPr id="26" name="Picture"/>
@@ -21230,7 +21264,7 @@
           <w:sz w:val="28"/>
         </w:rPr>
         <w:drawing>
-          <wp:inline distT="0" distB="0" distL="0" distR="0" wp14:anchorId="4E6A2CDC" wp14:editId="5A47C12C">
+          <wp:inline distT="0" distB="0" distL="0" distR="0" wp14:anchorId="00008553" wp14:editId="2F0779CD">
             <wp:extent cx="5334000" cy="2471853"/>
             <wp:effectExtent l="0" t="0" r="0" b="0"/>
             <wp:docPr id="29" name="Picture"/>
@@ -21728,7 +21762,7 @@
         <w:ind w:firstLine="709"/>
       </w:pPr>
       <w:bookmarkStart w:id="24" w:name="_e6e1aac57bb528344b9009e4599364161f48047"/>
-      <w:bookmarkStart w:id="25" w:name="_Toc241937920"/>
+      <w:bookmarkStart w:id="25" w:name="_Toc241938602"/>
       <w:bookmarkEnd w:id="22"/>
       <w:r>
         <w:rPr>
@@ -22646,7 +22680,7 @@
         </w:rPr>
         <w:lastRenderedPageBreak/>
         <w:drawing>
-          <wp:inline distT="0" distB="0" distL="0" distR="0" wp14:anchorId="0DCA993E" wp14:editId="30659459">
+          <wp:inline distT="0" distB="0" distL="0" distR="0" wp14:anchorId="4CD86D3D" wp14:editId="25E39487">
             <wp:extent cx="5334000" cy="2341756"/>
             <wp:effectExtent l="0" t="0" r="0" b="0"/>
             <wp:docPr id="33" name="Picture"/>
@@ -22877,7 +22911,7 @@
         <w:ind w:firstLine="709"/>
       </w:pPr>
       <w:bookmarkStart w:id="26" w:name="_6a64c25cd48aeb5a2bf3dc411d56d805a6b5d7e"/>
-      <w:bookmarkStart w:id="27" w:name="_Toc241937921"/>
+      <w:bookmarkStart w:id="27" w:name="_Toc241938603"/>
       <w:bookmarkEnd w:id="24"/>
       <w:r>
         <w:rPr>
@@ -22936,7 +22970,7 @@
         </w:rPr>
         <w:lastRenderedPageBreak/>
         <w:drawing>
-          <wp:inline distT="0" distB="0" distL="0" distR="0" wp14:anchorId="43F8F658" wp14:editId="410F69E8">
+          <wp:inline distT="0" distB="0" distL="0" distR="0" wp14:anchorId="26C5D0F1" wp14:editId="0DED757C">
             <wp:extent cx="5334000" cy="2471853"/>
             <wp:effectExtent l="0" t="0" r="0" b="0"/>
             <wp:docPr id="37" name="Picture"/>
@@ -23161,7 +23195,7 @@
         <w:ind w:firstLine="709"/>
       </w:pPr>
       <w:bookmarkStart w:id="28" w:name="_8cdf61ec50cc46d2aaeadce1b560fea28ea116e"/>
-      <w:bookmarkStart w:id="29" w:name="_Toc241937922"/>
+      <w:bookmarkStart w:id="29" w:name="_Toc241938604"/>
       <w:bookmarkEnd w:id="26"/>
       <w:r>
         <w:rPr>
@@ -23277,7 +23311,7 @@
         <w:ind w:firstLine="709"/>
       </w:pPr>
       <w:bookmarkStart w:id="30" w:name="_1bfdad9d2d88ddb6ca16c31c1d4d4943679f32f"/>
-      <w:bookmarkStart w:id="31" w:name="_Toc241937923"/>
+      <w:bookmarkStart w:id="31" w:name="_Toc241938605"/>
       <w:bookmarkEnd w:id="28"/>
       <w:bookmarkEnd w:id="2"/>
       <w:r>
@@ -23815,7 +23849,7 @@
         <w:jc w:val="center"/>
       </w:pPr>
       <w:bookmarkStart w:id="32" w:name="_выводы"/>
-      <w:bookmarkStart w:id="33" w:name="_Toc241937924"/>
+      <w:bookmarkStart w:id="33" w:name="_Toc241938606"/>
       <w:bookmarkEnd w:id="30"/>
       <w:r>
         <w:rPr>
@@ -24089,7 +24123,7 @@
         <w:jc w:val="center"/>
       </w:pPr>
       <w:bookmarkStart w:id="34" w:name="_274f6a444530ef90b0479dabf3d210f01e97699"/>
-      <w:bookmarkStart w:id="35" w:name="_Toc241937925"/>
+      <w:bookmarkStart w:id="35" w:name="_Toc241938607"/>
       <w:bookmarkEnd w:id="32"/>
       <w:r>
         <w:rPr>
@@ -26119,7 +26153,7 @@
         <w:jc w:val="center"/>
       </w:pPr>
       <w:bookmarkStart w:id="36" w:name="_3d74faf1500c1b2a4a8bfa8e0e37c74206ce73d"/>
-      <w:bookmarkStart w:id="37" w:name="_Toc241937926"/>
+      <w:bookmarkStart w:id="37" w:name="_Toc241938608"/>
       <w:bookmarkEnd w:id="34"/>
       <w:r>
         <w:rPr>
@@ -27585,7 +27619,7 @@
         <w:jc w:val="center"/>
       </w:pPr>
       <w:bookmarkStart w:id="38" w:name="_d684f183eb868ee4ace295916bed2e6be64d16e"/>
-      <w:bookmarkStart w:id="39" w:name="_Toc241937927"/>
+      <w:bookmarkStart w:id="39" w:name="_Toc241938609"/>
       <w:bookmarkEnd w:id="36"/>
       <w:r>
         <w:rPr>
@@ -28702,12 +28736,6 @@
             </w:pPr>
             <w:r>
               <w:rPr>
-                <w:sz w:val="24"/>
-              </w:rPr>
-              <w:t xml:space="preserve">после </w:t>
-            </w:r>
-            <w:r>
-              <w:rPr>
                 <w:i/>
                 <w:sz w:val="24"/>
               </w:rPr>
@@ -28717,7 +28745,13 @@
               <w:rPr>
                 <w:sz w:val="24"/>
               </w:rPr>
-              <w:t xml:space="preserve"> измерить визит-регистрация и регистрация-платящий</w:t>
+              <w:t xml:space="preserve"> не</w:t>
+            </w:r>
+            <w:r>
+              <w:rPr>
+                <w:sz w:val="24"/>
+              </w:rPr>
+              <w:t xml:space="preserve"> написан: модельные замеры в приложении Е ЛР6 (допущение Д-32); после запуска измерить реальные</w:t>
             </w:r>
           </w:p>
         </w:tc>
@@ -28958,7 +28992,7 @@
         <w:jc w:val="center"/>
       </w:pPr>
       <w:bookmarkStart w:id="40" w:name="_cb59224a7032ef66ab429e7df9b4e4c597bc187"/>
-      <w:bookmarkStart w:id="41" w:name="_Toc241937928"/>
+      <w:bookmarkStart w:id="41" w:name="_Toc241938610"/>
       <w:bookmarkEnd w:id="38"/>
       <w:r>
         <w:rPr>
@@ -29951,7 +29985,7 @@
         <w:jc w:val="center"/>
       </w:pPr>
       <w:bookmarkStart w:id="42" w:name="_48e9587881bbc300b26702bd6584ff263e735cf"/>
-      <w:bookmarkStart w:id="43" w:name="_Toc241937929"/>
+      <w:bookmarkStart w:id="43" w:name="_Toc241938611"/>
       <w:bookmarkEnd w:id="40"/>
       <w:r>
         <w:rPr>
@@ -31293,7 +31327,7 @@
         <w:jc w:val="center"/>
       </w:pPr>
       <w:bookmarkStart w:id="44" w:name="_494653d134221fdc43c135127d450c9af0a7c7d"/>
-      <w:bookmarkStart w:id="45" w:name="_Toc241937930"/>
+      <w:bookmarkStart w:id="45" w:name="_Toc241938612"/>
       <w:bookmarkEnd w:id="42"/>
       <w:r>
         <w:rPr>
@@ -33717,7 +33751,7 @@
   <w:abstractNum w:abstractNumId="0" w15:restartNumberingAfterBreak="0">
     <w:nsid w:val="0000A990"/>
     <w:multiLevelType w:val="multilevel"/>
-    <w:tmpl w:val="12FCC0BA"/>
+    <w:tmpl w:val="C7C8F906"/>
     <w:lvl w:ilvl="0">
       <w:numFmt w:val="bullet"/>
       <w:lvlText w:val=" "/>
@@ -33794,7 +33828,7 @@
   <w:abstractNum w:abstractNumId="1" w15:restartNumberingAfterBreak="0">
     <w:nsid w:val="00A99411"/>
     <w:multiLevelType w:val="multilevel"/>
-    <w:tmpl w:val="225C9AD2"/>
+    <w:tmpl w:val="FD843AA0"/>
     <w:lvl w:ilvl="0">
       <w:start w:val="1"/>
       <w:numFmt w:val="decimal"/>
@@ -35272,7 +35306,7 @@
     <w:autoRedefine/>
     <w:uiPriority w:val="39"/>
     <w:unhideWhenUsed/>
-    <w:rsid w:val="002964A8"/>
+    <w:rsid w:val="00025CB7"/>
     <w:pPr>
       <w:spacing w:after="100"/>
     </w:pPr>
@@ -35284,7 +35318,7 @@
     <w:autoRedefine/>
     <w:uiPriority w:val="39"/>
     <w:unhideWhenUsed/>
-    <w:rsid w:val="002964A8"/>
+    <w:rsid w:val="00025CB7"/>
     <w:pPr>
       <w:spacing w:after="100"/>
       <w:ind w:left="240"/>

</xml_diff>

<commit_message>
lab1: EU-language Google Trends check; lab5: security pages, trial, integrations, funding; lab2-3: Cube snapshot; docs rebuilt
</commit_message>
<xml_diff>
--- a/ЛР2-3_Объем_рынка/ОТЧЕТ_ЛР2-3_TableMind.docx
+++ b/ЛР2-3_Объем_рынка/ОТЧЕТ_ЛР2-3_TableMind.docx
@@ -265,7 +265,7 @@
       <w:r>
         <w:fldChar w:fldCharType="separate"/>
       </w:r>
-      <w:hyperlink w:anchor="_Toc241938590" w:history="1">
+      <w:hyperlink w:anchor="_Toc241939355" w:history="1">
         <w:r>
           <w:rPr>
             <w:rStyle w:val="af"/>
@@ -293,7 +293,7 @@
             <w:noProof/>
             <w:webHidden/>
           </w:rPr>
-          <w:instrText xml:space="preserve"> PAGEREF _Toc241938590 \h </w:instrText>
+          <w:instrText xml:space="preserve"> PAGEREF _Toc241939355 \h </w:instrText>
         </w:r>
         <w:r>
           <w:rPr>
@@ -334,7 +334,7 @@
           <w:noProof/>
         </w:rPr>
       </w:pPr>
-      <w:hyperlink w:anchor="_Toc241938591" w:history="1">
+      <w:hyperlink w:anchor="_Toc241939356" w:history="1">
         <w:r>
           <w:rPr>
             <w:rStyle w:val="af"/>
@@ -362,7 +362,7 @@
             <w:noProof/>
             <w:webHidden/>
           </w:rPr>
-          <w:instrText xml:space="preserve"> PAGEREF _Toc241938591 \h </w:instrText>
+          <w:instrText xml:space="preserve"> PAGEREF _Toc241939356 \h </w:instrText>
         </w:r>
         <w:r>
           <w:rPr>
@@ -403,7 +403,7 @@
           <w:noProof/>
         </w:rPr>
       </w:pPr>
-      <w:hyperlink w:anchor="_Toc241938592" w:history="1">
+      <w:hyperlink w:anchor="_Toc241939357" w:history="1">
         <w:r>
           <w:rPr>
             <w:rStyle w:val="af"/>
@@ -431,7 +431,7 @@
             <w:noProof/>
             <w:webHidden/>
           </w:rPr>
-          <w:instrText xml:space="preserve"> PAGEREF _Toc241938592 \h </w:instrText>
+          <w:instrText xml:space="preserve"> PAGEREF _Toc241939357 \h </w:instrText>
         </w:r>
         <w:r>
           <w:rPr>
@@ -472,7 +472,7 @@
           <w:noProof/>
         </w:rPr>
       </w:pPr>
-      <w:hyperlink w:anchor="_Toc241938593" w:history="1">
+      <w:hyperlink w:anchor="_Toc241939358" w:history="1">
         <w:r>
           <w:rPr>
             <w:rStyle w:val="af"/>
@@ -509,7 +509,7 @@
             <w:noProof/>
             <w:webHidden/>
           </w:rPr>
-          <w:instrText xml:space="preserve"> PAGEREF _Toc241938593 \h </w:instrText>
+          <w:instrText xml:space="preserve"> PAGEREF _Toc241939358 \h </w:instrText>
         </w:r>
         <w:r>
           <w:rPr>
@@ -550,7 +550,7 @@
           <w:noProof/>
         </w:rPr>
       </w:pPr>
-      <w:hyperlink w:anchor="_Toc241938594" w:history="1">
+      <w:hyperlink w:anchor="_Toc241939359" w:history="1">
         <w:r>
           <w:rPr>
             <w:rStyle w:val="af"/>
@@ -587,7 +587,7 @@
             <w:noProof/>
             <w:webHidden/>
           </w:rPr>
-          <w:instrText xml:space="preserve"> PAGEREF _Toc241938594 \h </w:instrText>
+          <w:instrText xml:space="preserve"> PAGEREF _Toc241939359 \h </w:instrText>
         </w:r>
         <w:r>
           <w:rPr>
@@ -628,7 +628,7 @@
           <w:noProof/>
         </w:rPr>
       </w:pPr>
-      <w:hyperlink w:anchor="_Toc241938595" w:history="1">
+      <w:hyperlink w:anchor="_Toc241939360" w:history="1">
         <w:r>
           <w:rPr>
             <w:rStyle w:val="af"/>
@@ -665,7 +665,7 @@
             <w:noProof/>
             <w:webHidden/>
           </w:rPr>
-          <w:instrText xml:space="preserve"> PAGEREF _Toc241938595 \h </w:instrText>
+          <w:instrText xml:space="preserve"> PAGEREF _Toc241939360 \h </w:instrText>
         </w:r>
         <w:r>
           <w:rPr>
@@ -706,7 +706,7 @@
           <w:noProof/>
         </w:rPr>
       </w:pPr>
-      <w:hyperlink w:anchor="_Toc241938596" w:history="1">
+      <w:hyperlink w:anchor="_Toc241939361" w:history="1">
         <w:r>
           <w:rPr>
             <w:rStyle w:val="af"/>
@@ -734,7 +734,7 @@
             <w:noProof/>
             <w:webHidden/>
           </w:rPr>
-          <w:instrText xml:space="preserve"> PAGEREF _Toc241938596 \h </w:instrText>
+          <w:instrText xml:space="preserve"> PAGEREF _Toc241939361 \h </w:instrText>
         </w:r>
         <w:r>
           <w:rPr>
@@ -775,7 +775,7 @@
           <w:noProof/>
         </w:rPr>
       </w:pPr>
-      <w:hyperlink w:anchor="_Toc241938597" w:history="1">
+      <w:hyperlink w:anchor="_Toc241939362" w:history="1">
         <w:r>
           <w:rPr>
             <w:rStyle w:val="af"/>
@@ -803,7 +803,7 @@
             <w:noProof/>
             <w:webHidden/>
           </w:rPr>
-          <w:instrText xml:space="preserve"> PAGEREF _Toc241938597 \h </w:instrText>
+          <w:instrText xml:space="preserve"> PAGEREF _Toc241939362 \h </w:instrText>
         </w:r>
         <w:r>
           <w:rPr>
@@ -844,7 +844,7 @@
           <w:noProof/>
         </w:rPr>
       </w:pPr>
-      <w:hyperlink w:anchor="_Toc241938598" w:history="1">
+      <w:hyperlink w:anchor="_Toc241939363" w:history="1">
         <w:r>
           <w:rPr>
             <w:rStyle w:val="af"/>
@@ -881,7 +881,7 @@
             <w:noProof/>
             <w:webHidden/>
           </w:rPr>
-          <w:instrText xml:space="preserve"> PAGEREF _Toc241938598 \h </w:instrText>
+          <w:instrText xml:space="preserve"> PAGEREF _Toc241939363 \h </w:instrText>
         </w:r>
         <w:r>
           <w:rPr>
@@ -922,7 +922,7 @@
           <w:noProof/>
         </w:rPr>
       </w:pPr>
-      <w:hyperlink w:anchor="_Toc241938599" w:history="1">
+      <w:hyperlink w:anchor="_Toc241939364" w:history="1">
         <w:r>
           <w:rPr>
             <w:rStyle w:val="af"/>
@@ -950,7 +950,7 @@
             <w:noProof/>
             <w:webHidden/>
           </w:rPr>
-          <w:instrText xml:space="preserve"> PAGEREF _Toc241938599 \h </w:instrText>
+          <w:instrText xml:space="preserve"> PAGEREF _Toc241939364 \h </w:instrText>
         </w:r>
         <w:r>
           <w:rPr>
@@ -991,7 +991,7 @@
           <w:noProof/>
         </w:rPr>
       </w:pPr>
-      <w:hyperlink w:anchor="_Toc241938600" w:history="1">
+      <w:hyperlink w:anchor="_Toc241939365" w:history="1">
         <w:r>
           <w:rPr>
             <w:rStyle w:val="af"/>
@@ -1019,7 +1019,7 @@
             <w:noProof/>
             <w:webHidden/>
           </w:rPr>
-          <w:instrText xml:space="preserve"> PAGEREF _Toc241938600 \h </w:instrText>
+          <w:instrText xml:space="preserve"> PAGEREF _Toc241939365 \h </w:instrText>
         </w:r>
         <w:r>
           <w:rPr>
@@ -1060,7 +1060,7 @@
           <w:noProof/>
         </w:rPr>
       </w:pPr>
-      <w:hyperlink w:anchor="_Toc241938601" w:history="1">
+      <w:hyperlink w:anchor="_Toc241939366" w:history="1">
         <w:r>
           <w:rPr>
             <w:rStyle w:val="af"/>
@@ -1088,7 +1088,7 @@
             <w:noProof/>
             <w:webHidden/>
           </w:rPr>
-          <w:instrText xml:space="preserve"> PAGEREF _Toc241938601 \h </w:instrText>
+          <w:instrText xml:space="preserve"> PAGEREF _Toc241939366 \h </w:instrText>
         </w:r>
         <w:r>
           <w:rPr>
@@ -1129,7 +1129,7 @@
           <w:noProof/>
         </w:rPr>
       </w:pPr>
-      <w:hyperlink w:anchor="_Toc241938602" w:history="1">
+      <w:hyperlink w:anchor="_Toc241939367" w:history="1">
         <w:r>
           <w:rPr>
             <w:rStyle w:val="af"/>
@@ -1157,7 +1157,7 @@
             <w:noProof/>
             <w:webHidden/>
           </w:rPr>
-          <w:instrText xml:space="preserve"> PAGEREF _Toc241938602 \h </w:instrText>
+          <w:instrText xml:space="preserve"> PAGEREF _Toc241939367 \h </w:instrText>
         </w:r>
         <w:r>
           <w:rPr>
@@ -1198,7 +1198,7 @@
           <w:noProof/>
         </w:rPr>
       </w:pPr>
-      <w:hyperlink w:anchor="_Toc241938603" w:history="1">
+      <w:hyperlink w:anchor="_Toc241939368" w:history="1">
         <w:r>
           <w:rPr>
             <w:rStyle w:val="af"/>
@@ -1226,7 +1226,7 @@
             <w:noProof/>
             <w:webHidden/>
           </w:rPr>
-          <w:instrText xml:space="preserve"> PAGEREF _Toc241938603 \h </w:instrText>
+          <w:instrText xml:space="preserve"> PAGEREF _Toc241939368 \h </w:instrText>
         </w:r>
         <w:r>
           <w:rPr>
@@ -1267,7 +1267,7 @@
           <w:noProof/>
         </w:rPr>
       </w:pPr>
-      <w:hyperlink w:anchor="_Toc241938604" w:history="1">
+      <w:hyperlink w:anchor="_Toc241939369" w:history="1">
         <w:r>
           <w:rPr>
             <w:rStyle w:val="af"/>
@@ -1295,7 +1295,7 @@
             <w:noProof/>
             <w:webHidden/>
           </w:rPr>
-          <w:instrText xml:space="preserve"> PAGEREF _Toc241938604 \h </w:instrText>
+          <w:instrText xml:space="preserve"> PAGEREF _Toc241939369 \h </w:instrText>
         </w:r>
         <w:r>
           <w:rPr>
@@ -1336,7 +1336,7 @@
           <w:noProof/>
         </w:rPr>
       </w:pPr>
-      <w:hyperlink w:anchor="_Toc241938605" w:history="1">
+      <w:hyperlink w:anchor="_Toc241939370" w:history="1">
         <w:r>
           <w:rPr>
             <w:rStyle w:val="af"/>
@@ -1364,7 +1364,7 @@
             <w:noProof/>
             <w:webHidden/>
           </w:rPr>
-          <w:instrText xml:space="preserve"> PAGEREF _Toc241938605 \h </w:instrText>
+          <w:instrText xml:space="preserve"> PAGEREF _Toc241939370 \h </w:instrText>
         </w:r>
         <w:r>
           <w:rPr>
@@ -1405,7 +1405,7 @@
           <w:noProof/>
         </w:rPr>
       </w:pPr>
-      <w:hyperlink w:anchor="_Toc241938606" w:history="1">
+      <w:hyperlink w:anchor="_Toc241939371" w:history="1">
         <w:r>
           <w:rPr>
             <w:rStyle w:val="af"/>
@@ -1433,7 +1433,7 @@
             <w:noProof/>
             <w:webHidden/>
           </w:rPr>
-          <w:instrText xml:space="preserve"> PAGEREF _Toc241938606 \h </w:instrText>
+          <w:instrText xml:space="preserve"> PAGEREF _Toc241939371 \h </w:instrText>
         </w:r>
         <w:r>
           <w:rPr>
@@ -1474,7 +1474,7 @@
           <w:noProof/>
         </w:rPr>
       </w:pPr>
-      <w:hyperlink w:anchor="_Toc241938607" w:history="1">
+      <w:hyperlink w:anchor="_Toc241939372" w:history="1">
         <w:r>
           <w:rPr>
             <w:rStyle w:val="af"/>
@@ -1502,7 +1502,7 @@
             <w:noProof/>
             <w:webHidden/>
           </w:rPr>
-          <w:instrText xml:space="preserve"> PAGEREF _Toc241938607 \h </w:instrText>
+          <w:instrText xml:space="preserve"> PAGEREF _Toc241939372 \h </w:instrText>
         </w:r>
         <w:r>
           <w:rPr>
@@ -1543,7 +1543,7 @@
           <w:noProof/>
         </w:rPr>
       </w:pPr>
-      <w:hyperlink w:anchor="_Toc241938608" w:history="1">
+      <w:hyperlink w:anchor="_Toc241939373" w:history="1">
         <w:r>
           <w:rPr>
             <w:rStyle w:val="af"/>
@@ -1571,7 +1571,7 @@
             <w:noProof/>
             <w:webHidden/>
           </w:rPr>
-          <w:instrText xml:space="preserve"> PAGEREF _Toc241938608 \h </w:instrText>
+          <w:instrText xml:space="preserve"> PAGEREF _Toc241939373 \h </w:instrText>
         </w:r>
         <w:r>
           <w:rPr>
@@ -1612,7 +1612,7 @@
           <w:noProof/>
         </w:rPr>
       </w:pPr>
-      <w:hyperlink w:anchor="_Toc241938609" w:history="1">
+      <w:hyperlink w:anchor="_Toc241939374" w:history="1">
         <w:r>
           <w:rPr>
             <w:rStyle w:val="af"/>
@@ -1640,7 +1640,7 @@
             <w:noProof/>
             <w:webHidden/>
           </w:rPr>
-          <w:instrText xml:space="preserve"> PAGEREF _Toc241938609 \h </w:instrText>
+          <w:instrText xml:space="preserve"> PAGEREF _Toc241939374 \h </w:instrText>
         </w:r>
         <w:r>
           <w:rPr>
@@ -1681,7 +1681,7 @@
           <w:noProof/>
         </w:rPr>
       </w:pPr>
-      <w:hyperlink w:anchor="_Toc241938610" w:history="1">
+      <w:hyperlink w:anchor="_Toc241939375" w:history="1">
         <w:r>
           <w:rPr>
             <w:rStyle w:val="af"/>
@@ -1709,7 +1709,7 @@
             <w:noProof/>
             <w:webHidden/>
           </w:rPr>
-          <w:instrText xml:space="preserve"> PAGEREF _Toc241938610 \h </w:instrText>
+          <w:instrText xml:space="preserve"> PAGEREF _Toc241939375 \h </w:instrText>
         </w:r>
         <w:r>
           <w:rPr>
@@ -1750,7 +1750,7 @@
           <w:noProof/>
         </w:rPr>
       </w:pPr>
-      <w:hyperlink w:anchor="_Toc241938611" w:history="1">
+      <w:hyperlink w:anchor="_Toc241939376" w:history="1">
         <w:r>
           <w:rPr>
             <w:rStyle w:val="af"/>
@@ -1778,7 +1778,7 @@
             <w:noProof/>
             <w:webHidden/>
           </w:rPr>
-          <w:instrText xml:space="preserve"> PAGEREF _Toc241938611 \h </w:instrText>
+          <w:instrText xml:space="preserve"> PAGEREF _Toc241939376 \h </w:instrText>
         </w:r>
         <w:r>
           <w:rPr>
@@ -1819,7 +1819,7 @@
           <w:noProof/>
         </w:rPr>
       </w:pPr>
-      <w:hyperlink w:anchor="_Toc241938612" w:history="1">
+      <w:hyperlink w:anchor="_Toc241939377" w:history="1">
         <w:r>
           <w:rPr>
             <w:rStyle w:val="af"/>
@@ -1847,7 +1847,7 @@
             <w:noProof/>
             <w:webHidden/>
           </w:rPr>
-          <w:instrText xml:space="preserve"> PAGEREF _Toc241938612 \h </w:instrText>
+          <w:instrText xml:space="preserve"> PAGEREF _Toc241939377 \h </w:instrText>
         </w:r>
         <w:r>
           <w:rPr>
@@ -1893,7 +1893,7 @@
         <w:spacing w:before="0" w:after="360" w:line="360" w:lineRule="exact"/>
         <w:ind w:firstLine="709"/>
       </w:pPr>
-      <w:bookmarkStart w:id="1" w:name="_Toc241938590"/>
+      <w:bookmarkStart w:id="1" w:name="_Toc241939355"/>
       <w:r>
         <w:rPr>
           <w:b/>
@@ -2199,7 +2199,7 @@
         <w:ind w:firstLine="709"/>
       </w:pPr>
       <w:bookmarkStart w:id="2" w:name="_b608aa976fc82a0faaf3b83f58c735968afd03b"/>
-      <w:bookmarkStart w:id="3" w:name="_Toc241938591"/>
+      <w:bookmarkStart w:id="3" w:name="_Toc241939356"/>
       <w:bookmarkEnd w:id="0"/>
       <w:r>
         <w:rPr>
@@ -2277,7 +2277,7 @@
         <w:ind w:firstLine="709"/>
       </w:pPr>
       <w:bookmarkStart w:id="4" w:name="_6ea6bf0a5ec92c733c53e44899cf0806bdc5e39"/>
-      <w:bookmarkStart w:id="5" w:name="_Toc241938592"/>
+      <w:bookmarkStart w:id="5" w:name="_Toc241939357"/>
       <w:r>
         <w:rPr>
           <w:b/>
@@ -3233,7 +3233,7 @@
         <w:ind w:firstLine="709"/>
       </w:pPr>
       <w:bookmarkStart w:id="6" w:name="_7a0c967539b5ef143597c37b0951dae8b296890"/>
-      <w:bookmarkStart w:id="7" w:name="_Toc241938593"/>
+      <w:bookmarkStart w:id="7" w:name="_Toc241939358"/>
       <w:bookmarkEnd w:id="4"/>
       <w:r>
         <w:rPr>
@@ -5666,7 +5666,7 @@
           <w:sz w:val="28"/>
         </w:rPr>
         <w:drawing>
-          <wp:inline distT="0" distB="0" distL="0" distR="0" wp14:anchorId="7006F96E" wp14:editId="569BF1E9">
+          <wp:inline distT="0" distB="0" distL="0" distR="0" wp14:anchorId="3D0D1424" wp14:editId="39CA8936">
             <wp:extent cx="5334000" cy="3122341"/>
             <wp:effectExtent l="0" t="0" r="0" b="0"/>
             <wp:docPr id="12" name="Picture"/>
@@ -6477,7 +6477,7 @@
           <w:sz w:val="28"/>
         </w:rPr>
         <w:drawing>
-          <wp:inline distT="0" distB="0" distL="0" distR="0" wp14:anchorId="379C68B6" wp14:editId="0669EBA2">
+          <wp:inline distT="0" distB="0" distL="0" distR="0" wp14:anchorId="29FEB82E" wp14:editId="2BEC9534">
             <wp:extent cx="5334000" cy="3252439"/>
             <wp:effectExtent l="0" t="0" r="0" b="0"/>
             <wp:docPr id="15" name="Picture"/>
@@ -6638,7 +6638,7 @@
         <w:ind w:firstLine="709"/>
       </w:pPr>
       <w:bookmarkStart w:id="8" w:name="_da959056159f19dff160d665d57702b18af1ddd"/>
-      <w:bookmarkStart w:id="9" w:name="_Toc241938594"/>
+      <w:bookmarkStart w:id="9" w:name="_Toc241939359"/>
       <w:bookmarkEnd w:id="6"/>
       <w:r>
         <w:rPr>
@@ -9766,7 +9766,7 @@
         <w:ind w:firstLine="709"/>
       </w:pPr>
       <w:bookmarkStart w:id="10" w:name="_06e2001e7574ebc77f8406bc11ca3db76d00c2a"/>
-      <w:bookmarkStart w:id="11" w:name="_Toc241938595"/>
+      <w:bookmarkStart w:id="11" w:name="_Toc241939360"/>
       <w:bookmarkEnd w:id="8"/>
       <w:r>
         <w:rPr>
@@ -10570,7 +10570,7 @@
         <w:ind w:firstLine="709"/>
       </w:pPr>
       <w:bookmarkStart w:id="12" w:name="_606fa79e4d4f49d8da929021c2a978685b741ea"/>
-      <w:bookmarkStart w:id="13" w:name="_Toc241938596"/>
+      <w:bookmarkStart w:id="13" w:name="_Toc241939361"/>
       <w:bookmarkEnd w:id="10"/>
       <w:r>
         <w:rPr>
@@ -13004,7 +13004,7 @@
         <w:ind w:firstLine="709"/>
       </w:pPr>
       <w:bookmarkStart w:id="14" w:name="_2314d5998da626860a70184e0b470b0b8504694"/>
-      <w:bookmarkStart w:id="15" w:name="_Toc241938597"/>
+      <w:bookmarkStart w:id="15" w:name="_Toc241939362"/>
       <w:bookmarkEnd w:id="12"/>
       <w:r>
         <w:rPr>
@@ -13632,7 +13632,7 @@
         <w:ind w:firstLine="709"/>
       </w:pPr>
       <w:bookmarkStart w:id="16" w:name="_42bac9f10c820a94a4112d44417ea6b5d14bf7d"/>
-      <w:bookmarkStart w:id="17" w:name="_Toc241938598"/>
+      <w:bookmarkStart w:id="17" w:name="_Toc241939363"/>
       <w:bookmarkEnd w:id="14"/>
       <w:r>
         <w:rPr>
@@ -15539,7 +15539,7 @@
         <w:ind w:firstLine="709"/>
       </w:pPr>
       <w:bookmarkStart w:id="18" w:name="_62882a27ae1c57302eff280b02701a311900947"/>
-      <w:bookmarkStart w:id="19" w:name="_Toc241938599"/>
+      <w:bookmarkStart w:id="19" w:name="_Toc241939364"/>
       <w:bookmarkEnd w:id="16"/>
       <w:r>
         <w:rPr>
@@ -16928,7 +16928,7 @@
         <w:ind w:firstLine="709"/>
       </w:pPr>
       <w:bookmarkStart w:id="20" w:name="_2c7ec3ecf17663584d0d27e07e31cbd2a0948cf"/>
-      <w:bookmarkStart w:id="21" w:name="_Toc241938600"/>
+      <w:bookmarkStart w:id="21" w:name="_Toc241939365"/>
       <w:bookmarkEnd w:id="18"/>
       <w:r>
         <w:rPr>
@@ -19263,7 +19263,7 @@
         <w:ind w:firstLine="709"/>
       </w:pPr>
       <w:bookmarkStart w:id="22" w:name="_8d34778965163a5752bc27698d1f7e786ff5c87"/>
-      <w:bookmarkStart w:id="23" w:name="_Toc241938601"/>
+      <w:bookmarkStart w:id="23" w:name="_Toc241939366"/>
       <w:bookmarkEnd w:id="20"/>
       <w:r>
         <w:rPr>
@@ -20418,7 +20418,7 @@
           <w:sz w:val="28"/>
         </w:rPr>
         <w:drawing>
-          <wp:inline distT="0" distB="0" distL="0" distR="0" wp14:anchorId="28814D57" wp14:editId="0380D1E2">
+          <wp:inline distT="0" distB="0" distL="0" distR="0" wp14:anchorId="2E24B339" wp14:editId="50FC688C">
             <wp:extent cx="5334000" cy="2992243"/>
             <wp:effectExtent l="0" t="0" r="0" b="0"/>
             <wp:docPr id="26" name="Picture"/>
@@ -21264,7 +21264,7 @@
           <w:sz w:val="28"/>
         </w:rPr>
         <w:drawing>
-          <wp:inline distT="0" distB="0" distL="0" distR="0" wp14:anchorId="00008553" wp14:editId="2F0779CD">
+          <wp:inline distT="0" distB="0" distL="0" distR="0" wp14:anchorId="7E43B0B3" wp14:editId="05DECE2C">
             <wp:extent cx="5334000" cy="2471853"/>
             <wp:effectExtent l="0" t="0" r="0" b="0"/>
             <wp:docPr id="29" name="Picture"/>
@@ -21762,7 +21762,7 @@
         <w:ind w:firstLine="709"/>
       </w:pPr>
       <w:bookmarkStart w:id="24" w:name="_e6e1aac57bb528344b9009e4599364161f48047"/>
-      <w:bookmarkStart w:id="25" w:name="_Toc241938602"/>
+      <w:bookmarkStart w:id="25" w:name="_Toc241939367"/>
       <w:bookmarkEnd w:id="22"/>
       <w:r>
         <w:rPr>
@@ -22680,7 +22680,7 @@
         </w:rPr>
         <w:lastRenderedPageBreak/>
         <w:drawing>
-          <wp:inline distT="0" distB="0" distL="0" distR="0" wp14:anchorId="4CD86D3D" wp14:editId="25E39487">
+          <wp:inline distT="0" distB="0" distL="0" distR="0" wp14:anchorId="4F982D4C" wp14:editId="1C0EA91C">
             <wp:extent cx="5334000" cy="2341756"/>
             <wp:effectExtent l="0" t="0" r="0" b="0"/>
             <wp:docPr id="33" name="Picture"/>
@@ -22911,7 +22911,7 @@
         <w:ind w:firstLine="709"/>
       </w:pPr>
       <w:bookmarkStart w:id="26" w:name="_6a64c25cd48aeb5a2bf3dc411d56d805a6b5d7e"/>
-      <w:bookmarkStart w:id="27" w:name="_Toc241938603"/>
+      <w:bookmarkStart w:id="27" w:name="_Toc241939368"/>
       <w:bookmarkEnd w:id="24"/>
       <w:r>
         <w:rPr>
@@ -22970,7 +22970,7 @@
         </w:rPr>
         <w:lastRenderedPageBreak/>
         <w:drawing>
-          <wp:inline distT="0" distB="0" distL="0" distR="0" wp14:anchorId="26C5D0F1" wp14:editId="0DED757C">
+          <wp:inline distT="0" distB="0" distL="0" distR="0" wp14:anchorId="797A4B3E" wp14:editId="63A592F1">
             <wp:extent cx="5334000" cy="2471853"/>
             <wp:effectExtent l="0" t="0" r="0" b="0"/>
             <wp:docPr id="37" name="Picture"/>
@@ -23195,7 +23195,7 @@
         <w:ind w:firstLine="709"/>
       </w:pPr>
       <w:bookmarkStart w:id="28" w:name="_8cdf61ec50cc46d2aaeadce1b560fea28ea116e"/>
-      <w:bookmarkStart w:id="29" w:name="_Toc241938604"/>
+      <w:bookmarkStart w:id="29" w:name="_Toc241939369"/>
       <w:bookmarkEnd w:id="26"/>
       <w:r>
         <w:rPr>
@@ -23311,7 +23311,7 @@
         <w:ind w:firstLine="709"/>
       </w:pPr>
       <w:bookmarkStart w:id="30" w:name="_1bfdad9d2d88ddb6ca16c31c1d4d4943679f32f"/>
-      <w:bookmarkStart w:id="31" w:name="_Toc241938605"/>
+      <w:bookmarkStart w:id="31" w:name="_Toc241939370"/>
       <w:bookmarkEnd w:id="28"/>
       <w:bookmarkEnd w:id="2"/>
       <w:r>
@@ -23849,7 +23849,7 @@
         <w:jc w:val="center"/>
       </w:pPr>
       <w:bookmarkStart w:id="32" w:name="_выводы"/>
-      <w:bookmarkStart w:id="33" w:name="_Toc241938606"/>
+      <w:bookmarkStart w:id="33" w:name="_Toc241939371"/>
       <w:bookmarkEnd w:id="30"/>
       <w:r>
         <w:rPr>
@@ -24123,7 +24123,7 @@
         <w:jc w:val="center"/>
       </w:pPr>
       <w:bookmarkStart w:id="34" w:name="_274f6a444530ef90b0479dabf3d210f01e97699"/>
-      <w:bookmarkStart w:id="35" w:name="_Toc241938607"/>
+      <w:bookmarkStart w:id="35" w:name="_Toc241939372"/>
       <w:bookmarkEnd w:id="32"/>
       <w:r>
         <w:rPr>
@@ -26153,7 +26153,7 @@
         <w:jc w:val="center"/>
       </w:pPr>
       <w:bookmarkStart w:id="36" w:name="_3d74faf1500c1b2a4a8bfa8e0e37c74206ce73d"/>
-      <w:bookmarkStart w:id="37" w:name="_Toc241938608"/>
+      <w:bookmarkStart w:id="37" w:name="_Toc241939373"/>
       <w:bookmarkEnd w:id="34"/>
       <w:r>
         <w:rPr>
@@ -27619,7 +27619,7 @@
         <w:jc w:val="center"/>
       </w:pPr>
       <w:bookmarkStart w:id="38" w:name="_d684f183eb868ee4ace295916bed2e6be64d16e"/>
-      <w:bookmarkStart w:id="39" w:name="_Toc241938609"/>
+      <w:bookmarkStart w:id="39" w:name="_Toc241939374"/>
       <w:bookmarkEnd w:id="36"/>
       <w:r>
         <w:rPr>
@@ -28002,7 +28002,33 @@
               <w:rPr>
                 <w:sz w:val="24"/>
               </w:rPr>
-              <w:t xml:space="preserve"> не получен (нет совпадений); полный список стран и новые домены после сброса суточного лимита остаются открытыми</w:t>
+              <w:t xml:space="preserve"> и </w:t>
+            </w:r>
+            <w:r>
+              <w:rPr>
+                <w:i/>
+                <w:sz w:val="24"/>
+              </w:rPr>
+              <w:t>macabacus.com</w:t>
+            </w:r>
+            <w:r>
+              <w:rPr>
+                <w:sz w:val="24"/>
+              </w:rPr>
+              <w:t xml:space="preserve"> в </w:t>
+            </w:r>
+            <w:r>
+              <w:rPr>
+                <w:i/>
+                <w:sz w:val="24"/>
+              </w:rPr>
+              <w:t>Similarweb</w:t>
+            </w:r>
+            <w:r>
+              <w:rPr>
+                <w:sz w:val="24"/>
+              </w:rPr>
+              <w:t xml:space="preserve"> отсутствуют (нет совпадений); полный список стран остается открытым</w:t>
             </w:r>
           </w:p>
         </w:tc>
@@ -28291,13 +28317,7 @@
               <w:rPr>
                 <w:sz w:val="24"/>
               </w:rPr>
-              <w:t xml:space="preserve">проверено </w:t>
-            </w:r>
-            <w:r>
-              <w:rPr>
-                <w:sz w:val="24"/>
-              </w:rPr>
-              <w:t>03.10.2026: комиссия 3 % (приложение Д)</w:t>
+              <w:t>проверено 03.10.2026: комиссия 3 % (приложение Д)</w:t>
             </w:r>
           </w:p>
         </w:tc>
@@ -28992,7 +29012,7 @@
         <w:jc w:val="center"/>
       </w:pPr>
       <w:bookmarkStart w:id="40" w:name="_cb59224a7032ef66ab429e7df9b4e4c597bc187"/>
-      <w:bookmarkStart w:id="41" w:name="_Toc241938610"/>
+      <w:bookmarkStart w:id="41" w:name="_Toc241939375"/>
       <w:bookmarkEnd w:id="38"/>
       <w:r>
         <w:rPr>
@@ -29985,7 +30005,7 @@
         <w:jc w:val="center"/>
       </w:pPr>
       <w:bookmarkStart w:id="42" w:name="_48e9587881bbc300b26702bd6584ff263e735cf"/>
-      <w:bookmarkStart w:id="43" w:name="_Toc241938611"/>
+      <w:bookmarkStart w:id="43" w:name="_Toc241939376"/>
       <w:bookmarkEnd w:id="40"/>
       <w:r>
         <w:rPr>
@@ -30158,14 +30178,7 @@
                 <w:b/>
                 <w:sz w:val="24"/>
               </w:rPr>
-              <w:t>Показ</w:t>
-            </w:r>
-            <w:r>
-              <w:rPr>
-                <w:b/>
-                <w:sz w:val="24"/>
-              </w:rPr>
-              <w:t>атель</w:t>
+              <w:t>Показатель</w:t>
             </w:r>
           </w:p>
         </w:tc>
@@ -31327,7 +31340,7 @@
         <w:jc w:val="center"/>
       </w:pPr>
       <w:bookmarkStart w:id="44" w:name="_494653d134221fdc43c135127d450c9af0a7c7d"/>
-      <w:bookmarkStart w:id="45" w:name="_Toc241938612"/>
+      <w:bookmarkStart w:id="45" w:name="_Toc241939377"/>
       <w:bookmarkEnd w:id="42"/>
       <w:r>
         <w:rPr>
@@ -32966,13 +32979,13 @@
               <w:rPr>
                 <w:sz w:val="24"/>
               </w:rPr>
-              <w:t xml:space="preserve">два профессиональных сегмента Великобритании дают около 480 тыс. человек, то есть около 15 % американских трех сегментов (3,1 млн) при доле населения около 20 %: масштаб занятости 0,45 для четырех англоязычных стран выглядит </w:t>
-            </w:r>
-            <w:r>
-              <w:rPr>
-                <w:sz w:val="24"/>
-              </w:rPr>
-              <w:t>консервативным</w:t>
+              <w:t>два профессиональных сегмента Великобритании дают около 480 тыс. человек, то есть около 15 % американских трех сегментов (3,1 млн) при доле населения около 20 %: масштаб занятости 0,45 для четырех англоязычных ст</w:t>
+            </w:r>
+            <w:r>
+              <w:rPr>
+                <w:sz w:val="24"/>
+              </w:rPr>
+              <w:t>ран выглядит консервативным</w:t>
             </w:r>
           </w:p>
         </w:tc>
@@ -33102,12 +33115,38 @@
                 <w:i/>
                 <w:sz w:val="24"/>
               </w:rPr>
+              <w:t>cubesoftware.com</w:t>
+            </w:r>
+            <w:r>
+              <w:rPr>
+                <w:sz w:val="24"/>
+              </w:rPr>
+              <w:t xml:space="preserve"> - 320 502 (ранг 385 024); для </w:t>
+            </w:r>
+            <w:r>
+              <w:rPr>
+                <w:i/>
+                <w:sz w:val="24"/>
+              </w:rPr>
               <w:t>excelformulabot.com</w:t>
             </w:r>
             <w:r>
               <w:rPr>
                 <w:sz w:val="24"/>
               </w:rPr>
+              <w:t xml:space="preserve"> и </w:t>
+            </w:r>
+            <w:r>
+              <w:rPr>
+                <w:i/>
+                <w:sz w:val="24"/>
+              </w:rPr>
+              <w:t>macabacus.com</w:t>
+            </w:r>
+            <w:r>
+              <w:rPr>
+                <w:sz w:val="24"/>
+              </w:rPr>
               <w:t xml:space="preserve"> </w:t>
             </w:r>
             <w:r>
@@ -33121,7 +33160,7 @@
               <w:rPr>
                 <w:sz w:val="24"/>
               </w:rPr>
-              <w:t xml:space="preserve"> ответил «нет совпадений» (данных нет или исчерпан суточный лимит запросов)</w:t>
+              <w:t xml:space="preserve"> ответил «нет совпадений» (трафик ниже порога панели)</w:t>
             </w:r>
           </w:p>
         </w:tc>
@@ -33198,6 +33237,19 @@
               <w:rPr>
                 <w:sz w:val="24"/>
               </w:rPr>
+              <w:t xml:space="preserve">, </w:t>
+            </w:r>
+            <w:r>
+              <w:rPr>
+                <w:i/>
+                <w:sz w:val="24"/>
+              </w:rPr>
+              <w:t>f1f9.com</w:t>
+            </w:r>
+            <w:r>
+              <w:rPr>
+                <w:sz w:val="24"/>
+              </w:rPr>
               <w:t xml:space="preserve"> и </w:t>
             </w:r>
             <w:r>
@@ -33205,13 +33257,19 @@
                 <w:i/>
                 <w:sz w:val="24"/>
               </w:rPr>
-              <w:t>f1f9.com</w:t>
-            </w:r>
-            <w:r>
-              <w:rPr>
-                <w:sz w:val="24"/>
-              </w:rPr>
-              <w:t xml:space="preserve"> добавляют 3,6 % к трафику 12 доменов основного снимка (6,02 млн визитов) и на итоговый диапазон не влияют; </w:t>
+              <w:t>cubesoftware.com</w:t>
+            </w:r>
+            <w:r>
+              <w:rPr>
+                <w:sz w:val="24"/>
+              </w:rPr>
+              <w:t xml:space="preserve"> добавляют около 8,9 % к трафику 12 доменов основного</w:t>
+            </w:r>
+            <w:r>
+              <w:rPr>
+                <w:sz w:val="24"/>
+              </w:rPr>
+              <w:t xml:space="preserve"> снимка (6,02 млн визитов) и на итоговый диапазон не влияют; </w:t>
             </w:r>
             <w:r>
               <w:rPr>
@@ -33224,13 +33282,7 @@
               <w:rPr>
                 <w:sz w:val="24"/>
               </w:rPr>
-              <w:t xml:space="preserve"> - канал,</w:t>
-            </w:r>
-            <w:r>
-              <w:rPr>
-                <w:sz w:val="24"/>
-              </w:rPr>
-              <w:t xml:space="preserve"> а не конкурент</w:t>
+              <w:t xml:space="preserve"> - канал, а не конкурент</w:t>
             </w:r>
           </w:p>
         </w:tc>
@@ -33312,13 +33364,13 @@
         <w:rPr>
           <w:sz w:val="28"/>
         </w:rPr>
-        <w:t xml:space="preserve"> остаются оценками третьих сторон. Для ценового коридора это означает, что опубликованные цены специализи</w:t>
-      </w:r>
-      <w:r>
-        <w:rPr>
-          <w:sz w:val="28"/>
-        </w:rPr>
-        <w:t>рованных надстроек (</w:t>
+        <w:t xml:space="preserve"> остаются оценками третьих</w:t>
+      </w:r>
+      <w:r>
+        <w:rPr>
+          <w:sz w:val="28"/>
+        </w:rPr>
+        <w:t xml:space="preserve"> сторон. Для ценового коридора это означает, что опубликованные цены специализированных надстроек (</w:t>
       </w:r>
       <w:r>
         <w:rPr>
@@ -33435,7 +33487,13 @@
         <w:rPr>
           <w:sz w:val="28"/>
         </w:rPr>
-        <w:t>, оценки от 60 до 400 </w:t>
+        <w:t>, оценки</w:t>
+      </w:r>
+      <w:r>
+        <w:rPr>
+          <w:sz w:val="28"/>
+        </w:rPr>
+        <w:t xml:space="preserve"> от 60 до 400 </w:t>
       </w:r>
       <w:r>
         <w:rPr>
@@ -33448,13 +33506,7 @@
         <w:rPr>
           <w:sz w:val="28"/>
         </w:rPr>
-        <w:t xml:space="preserve"> в месяц) заметно дороже; точные цены последних можно получить</w:t>
-      </w:r>
-      <w:r>
-        <w:rPr>
-          <w:sz w:val="28"/>
-        </w:rPr>
-        <w:t xml:space="preserve"> только запросом коммерческого предложения.</w:t>
+        <w:t xml:space="preserve"> в месяц) заметно дороже; точные цены последних можно получить только запросом коммерческого предложения.</w:t>
       </w:r>
     </w:p>
     <w:p>
@@ -33546,13 +33598,7 @@
         <w:rPr>
           <w:sz w:val="28"/>
         </w:rPr>
-        <w:t>, для которых нужен рекламный кабинет или платный доступ; взамен для англоязычн</w:t>
-      </w:r>
-      <w:r>
-        <w:rPr>
-          <w:sz w:val="28"/>
-        </w:rPr>
-        <w:t xml:space="preserve">ого поиска используются относительные индексы </w:t>
+        <w:t xml:space="preserve">, для которых нужен рекламный кабинет или платный доступ; взамен для англоязычного поиска используются относительные индексы </w:t>
       </w:r>
       <w:r>
         <w:rPr>
@@ -33578,7 +33624,13 @@
         <w:rPr>
           <w:sz w:val="28"/>
         </w:rPr>
-        <w:t xml:space="preserve"> (ЛР1) и органический трафик конкурентов по </w:t>
+        <w:t xml:space="preserve"> (ЛР1) и органический трафик кон</w:t>
+      </w:r>
+      <w:r>
+        <w:rPr>
+          <w:sz w:val="28"/>
+        </w:rPr>
+        <w:t xml:space="preserve">курентов по </w:t>
       </w:r>
       <w:r>
         <w:rPr>
@@ -33751,7 +33803,7 @@
   <w:abstractNum w:abstractNumId="0" w15:restartNumberingAfterBreak="0">
     <w:nsid w:val="0000A990"/>
     <w:multiLevelType w:val="multilevel"/>
-    <w:tmpl w:val="C7C8F906"/>
+    <w:tmpl w:val="255CC186"/>
     <w:lvl w:ilvl="0">
       <w:numFmt w:val="bullet"/>
       <w:lvlText w:val=" "/>
@@ -33828,7 +33880,7 @@
   <w:abstractNum w:abstractNumId="1" w15:restartNumberingAfterBreak="0">
     <w:nsid w:val="00A99411"/>
     <w:multiLevelType w:val="multilevel"/>
-    <w:tmpl w:val="FD843AA0"/>
+    <w:tmpl w:val="ADB0BF44"/>
     <w:lvl w:ilvl="0">
       <w:start w:val="1"/>
       <w:numFmt w:val="decimal"/>
@@ -35306,7 +35358,7 @@
     <w:autoRedefine/>
     <w:uiPriority w:val="39"/>
     <w:unhideWhenUsed/>
-    <w:rsid w:val="00025CB7"/>
+    <w:rsid w:val="00182E6F"/>
     <w:pPr>
       <w:spacing w:after="100"/>
     </w:pPr>
@@ -35318,7 +35370,7 @@
     <w:autoRedefine/>
     <w:uiPriority w:val="39"/>
     <w:unhideWhenUsed/>
-    <w:rsid w:val="00025CB7"/>
+    <w:rsid w:val="00182E6F"/>
     <w:pPr>
       <w:spacing w:after="100"/>
       <w:ind w:left="240"/>

</xml_diff>

<commit_message>
audit: fix title page overflow, dashes, source citation, stale statuses, third-person wording, Excel cells, README/plans; rebuild all
</commit_message>
<xml_diff>
--- a/ЛР2-3_Объем_рынка/ОТЧЕТ_ЛР2-3_TableMind.docx
+++ b/ЛР2-3_Объем_рынка/ОТЧЕТ_ЛР2-3_TableMind.docx
@@ -95,7 +95,7 @@
     </w:p>
     <w:p>
       <w:pPr>
-        <w:spacing w:before="2880" w:after="0" w:line="360" w:lineRule="exact"/>
+        <w:spacing w:before="2160" w:after="0" w:line="360" w:lineRule="exact"/>
         <w:jc w:val="center"/>
       </w:pPr>
       <w:r>
@@ -159,7 +159,7 @@
         <w:tabs>
           <w:tab w:val="left" w:pos="6520"/>
         </w:tabs>
-        <w:spacing w:before="1800" w:after="0" w:line="360" w:lineRule="exact"/>
+        <w:spacing w:before="1440" w:after="0" w:line="360" w:lineRule="exact"/>
       </w:pPr>
       <w:r>
         <w:rPr>
@@ -213,14 +213,13 @@
     </w:p>
     <w:p>
       <w:pPr>
-        <w:spacing w:before="2520" w:after="0" w:line="360" w:lineRule="exact"/>
+        <w:spacing w:before="1800" w:after="0" w:line="360" w:lineRule="exact"/>
         <w:jc w:val="center"/>
       </w:pPr>
       <w:r>
         <w:rPr>
           <w:sz w:val="28"/>
         </w:rPr>
-        <w:lastRenderedPageBreak/>
         <w:t>Минск 2026</w:t>
       </w:r>
     </w:p>
@@ -265,7 +264,7 @@
       <w:r>
         <w:fldChar w:fldCharType="separate"/>
       </w:r>
-      <w:hyperlink w:anchor="_Toc241939355" w:history="1">
+      <w:hyperlink w:anchor="_Toc241943012" w:history="1">
         <w:r>
           <w:rPr>
             <w:rStyle w:val="af"/>
@@ -293,7 +292,76 @@
             <w:noProof/>
             <w:webHidden/>
           </w:rPr>
-          <w:instrText xml:space="preserve"> PAGEREF _Toc241939355 \h </w:instrText>
+          <w:instrText xml:space="preserve"> PAGEREF _Toc241943012 \h </w:instrText>
+        </w:r>
+        <w:r>
+          <w:rPr>
+            <w:noProof/>
+            <w:webHidden/>
+          </w:rPr>
+        </w:r>
+        <w:r>
+          <w:rPr>
+            <w:noProof/>
+            <w:webHidden/>
+          </w:rPr>
+          <w:fldChar w:fldCharType="separate"/>
+        </w:r>
+        <w:r>
+          <w:rPr>
+            <w:noProof/>
+            <w:webHidden/>
+          </w:rPr>
+          <w:t>3</w:t>
+        </w:r>
+        <w:r>
+          <w:rPr>
+            <w:noProof/>
+            <w:webHidden/>
+          </w:rPr>
+          <w:fldChar w:fldCharType="end"/>
+        </w:r>
+      </w:hyperlink>
+    </w:p>
+    <w:p>
+      <w:pPr>
+        <w:pStyle w:val="12"/>
+        <w:tabs>
+          <w:tab w:val="right" w:leader="dot" w:pos="9345"/>
+        </w:tabs>
+        <w:rPr>
+          <w:noProof/>
+        </w:rPr>
+      </w:pPr>
+      <w:hyperlink w:anchor="_Toc241943013" w:history="1">
+        <w:r>
+          <w:rPr>
+            <w:rStyle w:val="af"/>
+            <w:b/>
+            <w:noProof/>
+          </w:rPr>
+          <w:t>2 ХОД РАБОТЫ</w:t>
+        </w:r>
+        <w:r>
+          <w:rPr>
+            <w:noProof/>
+            <w:webHidden/>
+          </w:rPr>
+          <w:tab/>
+        </w:r>
+        <w:r>
+          <w:rPr>
+            <w:noProof/>
+            <w:webHidden/>
+          </w:rPr>
+          <w:fldChar w:fldCharType="begin"/>
+        </w:r>
+        <w:r>
+          <w:rPr>
+            <w:noProof/>
+            <w:webHidden/>
+          </w:rPr>
+          <w:instrText xml:space="preserve"> PAGEREF _Toc241943013 \h </w:instrText>
         </w:r>
         <w:r>
           <w:rPr>
@@ -326,7 +394,7 @@
     </w:p>
     <w:p>
       <w:pPr>
-        <w:pStyle w:val="12"/>
+        <w:pStyle w:val="22"/>
         <w:tabs>
           <w:tab w:val="right" w:leader="dot" w:pos="9345"/>
         </w:tabs>
@@ -334,14 +402,14 @@
           <w:noProof/>
         </w:rPr>
       </w:pPr>
-      <w:hyperlink w:anchor="_Toc241939356" w:history="1">
+      <w:hyperlink w:anchor="_Toc241943014" w:history="1">
         <w:r>
           <w:rPr>
             <w:rStyle w:val="af"/>
             <w:b/>
             <w:noProof/>
           </w:rPr>
-          <w:t>2 ХОД РАБОТЫ</w:t>
+          <w:t>2.1 Границы рынка, единицы и состав расчетов</w:t>
         </w:r>
         <w:r>
           <w:rPr>
@@ -362,7 +430,85 @@
             <w:noProof/>
             <w:webHidden/>
           </w:rPr>
-          <w:instrText xml:space="preserve"> PAGEREF _Toc241939356 \h </w:instrText>
+          <w:instrText xml:space="preserve"> PAGEREF _Toc241943014 \h </w:instrText>
+        </w:r>
+        <w:r>
+          <w:rPr>
+            <w:noProof/>
+            <w:webHidden/>
+          </w:rPr>
+        </w:r>
+        <w:r>
+          <w:rPr>
+            <w:noProof/>
+            <w:webHidden/>
+          </w:rPr>
+          <w:fldChar w:fldCharType="separate"/>
+        </w:r>
+        <w:r>
+          <w:rPr>
+            <w:noProof/>
+            <w:webHidden/>
+          </w:rPr>
+          <w:t>4</w:t>
+        </w:r>
+        <w:r>
+          <w:rPr>
+            <w:noProof/>
+            <w:webHidden/>
+          </w:rPr>
+          <w:fldChar w:fldCharType="end"/>
+        </w:r>
+      </w:hyperlink>
+    </w:p>
+    <w:p>
+      <w:pPr>
+        <w:pStyle w:val="22"/>
+        <w:tabs>
+          <w:tab w:val="right" w:leader="dot" w:pos="9345"/>
+        </w:tabs>
+        <w:rPr>
+          <w:noProof/>
+        </w:rPr>
+      </w:pPr>
+      <w:hyperlink w:anchor="_Toc241943015" w:history="1">
+        <w:r>
+          <w:rPr>
+            <w:rStyle w:val="af"/>
+            <w:b/>
+            <w:noProof/>
+          </w:rPr>
+          <w:t xml:space="preserve">2.2 Снимок </w:t>
+        </w:r>
+        <w:r>
+          <w:rPr>
+            <w:rStyle w:val="af"/>
+            <w:b/>
+            <w:i/>
+            <w:noProof/>
+          </w:rPr>
+          <w:t>Similarweb</w:t>
+        </w:r>
+        <w:r>
+          <w:rPr>
+            <w:noProof/>
+            <w:webHidden/>
+          </w:rPr>
+          <w:tab/>
+        </w:r>
+        <w:r>
+          <w:rPr>
+            <w:noProof/>
+            <w:webHidden/>
+          </w:rPr>
+          <w:fldChar w:fldCharType="begin"/>
+        </w:r>
+        <w:r>
+          <w:rPr>
+            <w:noProof/>
+            <w:webHidden/>
+          </w:rPr>
+          <w:instrText xml:space="preserve"> PAGEREF _Toc241943015 \h </w:instrText>
         </w:r>
         <w:r>
           <w:rPr>
@@ -403,154 +549,7 @@
           <w:noProof/>
         </w:rPr>
       </w:pPr>
-      <w:hyperlink w:anchor="_Toc241939357" w:history="1">
-        <w:r>
-          <w:rPr>
-            <w:rStyle w:val="af"/>
-            <w:b/>
-            <w:noProof/>
-          </w:rPr>
-          <w:t>2.1 Границы рынка, единицы и состав расчетов</w:t>
-        </w:r>
-        <w:r>
-          <w:rPr>
-            <w:noProof/>
-            <w:webHidden/>
-          </w:rPr>
-          <w:tab/>
-        </w:r>
-        <w:r>
-          <w:rPr>
-            <w:noProof/>
-            <w:webHidden/>
-          </w:rPr>
-          <w:fldChar w:fldCharType="begin"/>
-        </w:r>
-        <w:r>
-          <w:rPr>
-            <w:noProof/>
-            <w:webHidden/>
-          </w:rPr>
-          <w:instrText xml:space="preserve"> PAGEREF _Toc241939357 \h </w:instrText>
-        </w:r>
-        <w:r>
-          <w:rPr>
-            <w:noProof/>
-            <w:webHidden/>
-          </w:rPr>
-        </w:r>
-        <w:r>
-          <w:rPr>
-            <w:noProof/>
-            <w:webHidden/>
-          </w:rPr>
-          <w:fldChar w:fldCharType="separate"/>
-        </w:r>
-        <w:r>
-          <w:rPr>
-            <w:noProof/>
-            <w:webHidden/>
-          </w:rPr>
-          <w:t>5</w:t>
-        </w:r>
-        <w:r>
-          <w:rPr>
-            <w:noProof/>
-            <w:webHidden/>
-          </w:rPr>
-          <w:fldChar w:fldCharType="end"/>
-        </w:r>
-      </w:hyperlink>
-    </w:p>
-    <w:p>
-      <w:pPr>
-        <w:pStyle w:val="22"/>
-        <w:tabs>
-          <w:tab w:val="right" w:leader="dot" w:pos="9345"/>
-        </w:tabs>
-        <w:rPr>
-          <w:noProof/>
-        </w:rPr>
-      </w:pPr>
-      <w:hyperlink w:anchor="_Toc241939358" w:history="1">
-        <w:r>
-          <w:rPr>
-            <w:rStyle w:val="af"/>
-            <w:b/>
-            <w:noProof/>
-          </w:rPr>
-          <w:t xml:space="preserve">2.2 Снимок </w:t>
-        </w:r>
-        <w:r>
-          <w:rPr>
-            <w:rStyle w:val="af"/>
-            <w:b/>
-            <w:i/>
-            <w:noProof/>
-          </w:rPr>
-          <w:t>Similarweb</w:t>
-        </w:r>
-        <w:r>
-          <w:rPr>
-            <w:noProof/>
-            <w:webHidden/>
-          </w:rPr>
-          <w:tab/>
-        </w:r>
-        <w:r>
-          <w:rPr>
-            <w:noProof/>
-            <w:webHidden/>
-          </w:rPr>
-          <w:fldChar w:fldCharType="begin"/>
-        </w:r>
-        <w:r>
-          <w:rPr>
-            <w:noProof/>
-            <w:webHidden/>
-          </w:rPr>
-          <w:instrText xml:space="preserve"> PAGEREF _Toc241939358 \h </w:instrText>
-        </w:r>
-        <w:r>
-          <w:rPr>
-            <w:noProof/>
-            <w:webHidden/>
-          </w:rPr>
-        </w:r>
-        <w:r>
-          <w:rPr>
-            <w:noProof/>
-            <w:webHidden/>
-          </w:rPr>
-          <w:fldChar w:fldCharType="separate"/>
-        </w:r>
-        <w:r>
-          <w:rPr>
-            <w:noProof/>
-            <w:webHidden/>
-          </w:rPr>
-          <w:t>6</w:t>
-        </w:r>
-        <w:r>
-          <w:rPr>
-            <w:noProof/>
-            <w:webHidden/>
-          </w:rPr>
-          <w:fldChar w:fldCharType="end"/>
-        </w:r>
-      </w:hyperlink>
-    </w:p>
-    <w:p>
-      <w:pPr>
-        <w:pStyle w:val="22"/>
-        <w:tabs>
-          <w:tab w:val="right" w:leader="dot" w:pos="9345"/>
-        </w:tabs>
-        <w:rPr>
-          <w:noProof/>
-        </w:rPr>
-      </w:pPr>
-      <w:hyperlink w:anchor="_Toc241939359" w:history="1">
+      <w:hyperlink w:anchor="_Toc241943016" w:history="1">
         <w:r>
           <w:rPr>
             <w:rStyle w:val="af"/>
@@ -587,7 +586,7 @@
             <w:noProof/>
             <w:webHidden/>
           </w:rPr>
-          <w:instrText xml:space="preserve"> PAGEREF _Toc241939359 \h </w:instrText>
+          <w:instrText xml:space="preserve"> PAGEREF _Toc241943016 \h </w:instrText>
         </w:r>
         <w:r>
           <w:rPr>
@@ -607,7 +606,7 @@
             <w:noProof/>
             <w:webHidden/>
           </w:rPr>
-          <w:t>8</w:t>
+          <w:t>7</w:t>
         </w:r>
         <w:r>
           <w:rPr>
@@ -628,7 +627,7 @@
           <w:noProof/>
         </w:rPr>
       </w:pPr>
-      <w:hyperlink w:anchor="_Toc241939360" w:history="1">
+      <w:hyperlink w:anchor="_Toc241943017" w:history="1">
         <w:r>
           <w:rPr>
             <w:rStyle w:val="af"/>
@@ -665,7 +664,76 @@
             <w:noProof/>
             <w:webHidden/>
           </w:rPr>
-          <w:instrText xml:space="preserve"> PAGEREF _Toc241939360 \h </w:instrText>
+          <w:instrText xml:space="preserve"> PAGEREF _Toc241943017 \h </w:instrText>
+        </w:r>
+        <w:r>
+          <w:rPr>
+            <w:noProof/>
+            <w:webHidden/>
+          </w:rPr>
+        </w:r>
+        <w:r>
+          <w:rPr>
+            <w:noProof/>
+            <w:webHidden/>
+          </w:rPr>
+          <w:fldChar w:fldCharType="separate"/>
+        </w:r>
+        <w:r>
+          <w:rPr>
+            <w:noProof/>
+            <w:webHidden/>
+          </w:rPr>
+          <w:t>9</w:t>
+        </w:r>
+        <w:r>
+          <w:rPr>
+            <w:noProof/>
+            <w:webHidden/>
+          </w:rPr>
+          <w:fldChar w:fldCharType="end"/>
+        </w:r>
+      </w:hyperlink>
+    </w:p>
+    <w:p>
+      <w:pPr>
+        <w:pStyle w:val="22"/>
+        <w:tabs>
+          <w:tab w:val="right" w:leader="dot" w:pos="9345"/>
+        </w:tabs>
+        <w:rPr>
+          <w:noProof/>
+        </w:rPr>
+      </w:pPr>
+      <w:hyperlink w:anchor="_Toc241943018" w:history="1">
+        <w:r>
+          <w:rPr>
+            <w:rStyle w:val="af"/>
+            <w:b/>
+            <w:noProof/>
+          </w:rPr>
+          <w:t>2.5 Число потенциальных клиентов</w:t>
+        </w:r>
+        <w:r>
+          <w:rPr>
+            <w:noProof/>
+            <w:webHidden/>
+          </w:rPr>
+          <w:tab/>
+        </w:r>
+        <w:r>
+          <w:rPr>
+            <w:noProof/>
+            <w:webHidden/>
+          </w:rPr>
+          <w:fldChar w:fldCharType="begin"/>
+        </w:r>
+        <w:r>
+          <w:rPr>
+            <w:noProof/>
+            <w:webHidden/>
+          </w:rPr>
+          <w:instrText xml:space="preserve"> PAGEREF _Toc241943018 \h </w:instrText>
         </w:r>
         <w:r>
           <w:rPr>
@@ -706,14 +774,14 @@
           <w:noProof/>
         </w:rPr>
       </w:pPr>
-      <w:hyperlink w:anchor="_Toc241939361" w:history="1">
+      <w:hyperlink w:anchor="_Toc241943019" w:history="1">
         <w:r>
           <w:rPr>
             <w:rStyle w:val="af"/>
             <w:b/>
             <w:noProof/>
           </w:rPr>
-          <w:t>2.5 Число потенциальных клиентов</w:t>
+          <w:t>2.6 Методики «сверху вниз» и «снизу вверх»</w:t>
         </w:r>
         <w:r>
           <w:rPr>
@@ -734,7 +802,7 @@
             <w:noProof/>
             <w:webHidden/>
           </w:rPr>
-          <w:instrText xml:space="preserve"> PAGEREF _Toc241939361 \h </w:instrText>
+          <w:instrText xml:space="preserve"> PAGEREF _Toc241943019 \h </w:instrText>
         </w:r>
         <w:r>
           <w:rPr>
@@ -775,14 +843,23 @@
           <w:noProof/>
         </w:rPr>
       </w:pPr>
-      <w:hyperlink w:anchor="_Toc241939362" w:history="1">
+      <w:hyperlink w:anchor="_Toc241943020" w:history="1">
         <w:r>
           <w:rPr>
             <w:rStyle w:val="af"/>
             <w:b/>
             <w:noProof/>
           </w:rPr>
-          <w:t>2.6 Методики «сверху вниз» и «снизу вверх»</w:t>
+          <w:t xml:space="preserve">2.7 Цифровая воронка по тарифам и канал </w:t>
+        </w:r>
+        <w:r>
+          <w:rPr>
+            <w:rStyle w:val="af"/>
+            <w:b/>
+            <w:i/>
+            <w:noProof/>
+          </w:rPr>
+          <w:t>AppSource</w:t>
         </w:r>
         <w:r>
           <w:rPr>
@@ -803,7 +880,7 @@
             <w:noProof/>
             <w:webHidden/>
           </w:rPr>
-          <w:instrText xml:space="preserve"> PAGEREF _Toc241939362 \h </w:instrText>
+          <w:instrText xml:space="preserve"> PAGEREF _Toc241943020 \h </w:instrText>
         </w:r>
         <w:r>
           <w:rPr>
@@ -844,23 +921,14 @@
           <w:noProof/>
         </w:rPr>
       </w:pPr>
-      <w:hyperlink w:anchor="_Toc241939363" w:history="1">
+      <w:hyperlink w:anchor="_Toc241943021" w:history="1">
         <w:r>
           <w:rPr>
             <w:rStyle w:val="af"/>
             <w:b/>
             <w:noProof/>
           </w:rPr>
-          <w:t xml:space="preserve">2.7 Цифровая воронка по тарифам и канал </w:t>
-        </w:r>
-        <w:r>
-          <w:rPr>
-            <w:rStyle w:val="af"/>
-            <w:b/>
-            <w:i/>
-            <w:noProof/>
-          </w:rPr>
-          <w:t>AppSource</w:t>
+          <w:t>2.8 Поисковый спрос: контрольный русскоязычный сегмент</w:t>
         </w:r>
         <w:r>
           <w:rPr>
@@ -881,7 +949,7 @@
             <w:noProof/>
             <w:webHidden/>
           </w:rPr>
-          <w:instrText xml:space="preserve"> PAGEREF _Toc241939363 \h </w:instrText>
+          <w:instrText xml:space="preserve"> PAGEREF _Toc241943021 \h </w:instrText>
         </w:r>
         <w:r>
           <w:rPr>
@@ -922,14 +990,14 @@
           <w:noProof/>
         </w:rPr>
       </w:pPr>
-      <w:hyperlink w:anchor="_Toc241939364" w:history="1">
+      <w:hyperlink w:anchor="_Toc241943022" w:history="1">
         <w:r>
           <w:rPr>
             <w:rStyle w:val="af"/>
             <w:b/>
             <w:noProof/>
           </w:rPr>
-          <w:t>2.8 Поисковый спрос: контрольный русскоязычный сегмент</w:t>
+          <w:t>2.9 Проверка платежеспособности</w:t>
         </w:r>
         <w:r>
           <w:rPr>
@@ -950,7 +1018,7 @@
             <w:noProof/>
             <w:webHidden/>
           </w:rPr>
-          <w:instrText xml:space="preserve"> PAGEREF _Toc241939364 \h </w:instrText>
+          <w:instrText xml:space="preserve"> PAGEREF _Toc241943022 \h </w:instrText>
         </w:r>
         <w:r>
           <w:rPr>
@@ -991,76 +1059,7 @@
           <w:noProof/>
         </w:rPr>
       </w:pPr>
-      <w:hyperlink w:anchor="_Toc241939365" w:history="1">
-        <w:r>
-          <w:rPr>
-            <w:rStyle w:val="af"/>
-            <w:b/>
-            <w:noProof/>
-          </w:rPr>
-          <w:t>2.9 Проверка платежеспособности</w:t>
-        </w:r>
-        <w:r>
-          <w:rPr>
-            <w:noProof/>
-            <w:webHidden/>
-          </w:rPr>
-          <w:tab/>
-        </w:r>
-        <w:r>
-          <w:rPr>
-            <w:noProof/>
-            <w:webHidden/>
-          </w:rPr>
-          <w:fldChar w:fldCharType="begin"/>
-        </w:r>
-        <w:r>
-          <w:rPr>
-            <w:noProof/>
-            <w:webHidden/>
-          </w:rPr>
-          <w:instrText xml:space="preserve"> PAGEREF _Toc241939365 \h </w:instrText>
-        </w:r>
-        <w:r>
-          <w:rPr>
-            <w:noProof/>
-            <w:webHidden/>
-          </w:rPr>
-        </w:r>
-        <w:r>
-          <w:rPr>
-            <w:noProof/>
-            <w:webHidden/>
-          </w:rPr>
-          <w:fldChar w:fldCharType="separate"/>
-        </w:r>
-        <w:r>
-          <w:rPr>
-            <w:noProof/>
-            <w:webHidden/>
-          </w:rPr>
-          <w:t>15</w:t>
-        </w:r>
-        <w:r>
-          <w:rPr>
-            <w:noProof/>
-            <w:webHidden/>
-          </w:rPr>
-          <w:fldChar w:fldCharType="end"/>
-        </w:r>
-      </w:hyperlink>
-    </w:p>
-    <w:p>
-      <w:pPr>
-        <w:pStyle w:val="22"/>
-        <w:tabs>
-          <w:tab w:val="right" w:leader="dot" w:pos="9345"/>
-        </w:tabs>
-        <w:rPr>
-          <w:noProof/>
-        </w:rPr>
-      </w:pPr>
-      <w:hyperlink w:anchor="_Toc241939366" w:history="1">
+      <w:hyperlink w:anchor="_Toc241943023" w:history="1">
         <w:r>
           <w:rPr>
             <w:rStyle w:val="af"/>
@@ -1088,7 +1087,7 @@
             <w:noProof/>
             <w:webHidden/>
           </w:rPr>
-          <w:instrText xml:space="preserve"> PAGEREF _Toc241939366 \h </w:instrText>
+          <w:instrText xml:space="preserve"> PAGEREF _Toc241943023 \h </w:instrText>
         </w:r>
         <w:r>
           <w:rPr>
@@ -1108,7 +1107,7 @@
             <w:noProof/>
             <w:webHidden/>
           </w:rPr>
-          <w:t>17</w:t>
+          <w:t>16</w:t>
         </w:r>
         <w:r>
           <w:rPr>
@@ -1129,7 +1128,7 @@
           <w:noProof/>
         </w:rPr>
       </w:pPr>
-      <w:hyperlink w:anchor="_Toc241939367" w:history="1">
+      <w:hyperlink w:anchor="_Toc241943024" w:history="1">
         <w:r>
           <w:rPr>
             <w:rStyle w:val="af"/>
@@ -1157,7 +1156,76 @@
             <w:noProof/>
             <w:webHidden/>
           </w:rPr>
-          <w:instrText xml:space="preserve"> PAGEREF _Toc241939367 \h </w:instrText>
+          <w:instrText xml:space="preserve"> PAGEREF _Toc241943024 \h </w:instrText>
+        </w:r>
+        <w:r>
+          <w:rPr>
+            <w:noProof/>
+            <w:webHidden/>
+          </w:rPr>
+        </w:r>
+        <w:r>
+          <w:rPr>
+            <w:noProof/>
+            <w:webHidden/>
+          </w:rPr>
+          <w:fldChar w:fldCharType="separate"/>
+        </w:r>
+        <w:r>
+          <w:rPr>
+            <w:noProof/>
+            <w:webHidden/>
+          </w:rPr>
+          <w:t>19</w:t>
+        </w:r>
+        <w:r>
+          <w:rPr>
+            <w:noProof/>
+            <w:webHidden/>
+          </w:rPr>
+          <w:fldChar w:fldCharType="end"/>
+        </w:r>
+      </w:hyperlink>
+    </w:p>
+    <w:p>
+      <w:pPr>
+        <w:pStyle w:val="22"/>
+        <w:tabs>
+          <w:tab w:val="right" w:leader="dot" w:pos="9345"/>
+        </w:tabs>
+        <w:rPr>
+          <w:noProof/>
+        </w:rPr>
+      </w:pPr>
+      <w:hyperlink w:anchor="_Toc241943025" w:history="1">
+        <w:r>
+          <w:rPr>
+            <w:rStyle w:val="af"/>
+            <w:b/>
+            <w:noProof/>
+          </w:rPr>
+          <w:t>2.12 Чувствительность и проверка расчетов</w:t>
+        </w:r>
+        <w:r>
+          <w:rPr>
+            <w:noProof/>
+            <w:webHidden/>
+          </w:rPr>
+          <w:tab/>
+        </w:r>
+        <w:r>
+          <w:rPr>
+            <w:noProof/>
+            <w:webHidden/>
+          </w:rPr>
+          <w:fldChar w:fldCharType="begin"/>
+        </w:r>
+        <w:r>
+          <w:rPr>
+            <w:noProof/>
+            <w:webHidden/>
+          </w:rPr>
+          <w:instrText xml:space="preserve"> PAGEREF _Toc241943025 \h </w:instrText>
         </w:r>
         <w:r>
           <w:rPr>
@@ -1198,14 +1266,14 @@
           <w:noProof/>
         </w:rPr>
       </w:pPr>
-      <w:hyperlink w:anchor="_Toc241939368" w:history="1">
+      <w:hyperlink w:anchor="_Toc241943026" w:history="1">
         <w:r>
           <w:rPr>
             <w:rStyle w:val="af"/>
             <w:b/>
             <w:noProof/>
           </w:rPr>
-          <w:t>2.12 Чувствительность и проверка расчетов</w:t>
+          <w:t>2.13 Ограничения оценки</w:t>
         </w:r>
         <w:r>
           <w:rPr>
@@ -1226,7 +1294,7 @@
             <w:noProof/>
             <w:webHidden/>
           </w:rPr>
-          <w:instrText xml:space="preserve"> PAGEREF _Toc241939368 \h </w:instrText>
+          <w:instrText xml:space="preserve"> PAGEREF _Toc241943026 \h </w:instrText>
         </w:r>
         <w:r>
           <w:rPr>
@@ -1259,7 +1327,7 @@
     </w:p>
     <w:p>
       <w:pPr>
-        <w:pStyle w:val="22"/>
+        <w:pStyle w:val="12"/>
         <w:tabs>
           <w:tab w:val="right" w:leader="dot" w:pos="9345"/>
         </w:tabs>
@@ -1267,14 +1335,14 @@
           <w:noProof/>
         </w:rPr>
       </w:pPr>
-      <w:hyperlink w:anchor="_Toc241939369" w:history="1">
+      <w:hyperlink w:anchor="_Toc241943027" w:history="1">
         <w:r>
           <w:rPr>
             <w:rStyle w:val="af"/>
             <w:b/>
             <w:noProof/>
           </w:rPr>
-          <w:t>2.13 Ограничения оценки</w:t>
+          <w:t>3 ОТВЕТЫ НА КОНТРОЛЬНЫЕ ВОПРОСЫ</w:t>
         </w:r>
         <w:r>
           <w:rPr>
@@ -1295,7 +1363,7 @@
             <w:noProof/>
             <w:webHidden/>
           </w:rPr>
-          <w:instrText xml:space="preserve"> PAGEREF _Toc241939369 \h </w:instrText>
+          <w:instrText xml:space="preserve"> PAGEREF _Toc241943027 \h </w:instrText>
         </w:r>
         <w:r>
           <w:rPr>
@@ -1336,76 +1404,7 @@
           <w:noProof/>
         </w:rPr>
       </w:pPr>
-      <w:hyperlink w:anchor="_Toc241939370" w:history="1">
-        <w:r>
-          <w:rPr>
-            <w:rStyle w:val="af"/>
-            <w:b/>
-            <w:noProof/>
-          </w:rPr>
-          <w:t>3 ОТВЕТЫ НА КОНТРОЛЬНЫЕ ВОПРОСЫ</w:t>
-        </w:r>
-        <w:r>
-          <w:rPr>
-            <w:noProof/>
-            <w:webHidden/>
-          </w:rPr>
-          <w:tab/>
-        </w:r>
-        <w:r>
-          <w:rPr>
-            <w:noProof/>
-            <w:webHidden/>
-          </w:rPr>
-          <w:fldChar w:fldCharType="begin"/>
-        </w:r>
-        <w:r>
-          <w:rPr>
-            <w:noProof/>
-            <w:webHidden/>
-          </w:rPr>
-          <w:instrText xml:space="preserve"> PAGEREF _Toc241939370 \h </w:instrText>
-        </w:r>
-        <w:r>
-          <w:rPr>
-            <w:noProof/>
-            <w:webHidden/>
-          </w:rPr>
-        </w:r>
-        <w:r>
-          <w:rPr>
-            <w:noProof/>
-            <w:webHidden/>
-          </w:rPr>
-          <w:fldChar w:fldCharType="separate"/>
-        </w:r>
-        <w:r>
-          <w:rPr>
-            <w:noProof/>
-            <w:webHidden/>
-          </w:rPr>
-          <w:t>23</w:t>
-        </w:r>
-        <w:r>
-          <w:rPr>
-            <w:noProof/>
-            <w:webHidden/>
-          </w:rPr>
-          <w:fldChar w:fldCharType="end"/>
-        </w:r>
-      </w:hyperlink>
-    </w:p>
-    <w:p>
-      <w:pPr>
-        <w:pStyle w:val="12"/>
-        <w:tabs>
-          <w:tab w:val="right" w:leader="dot" w:pos="9345"/>
-        </w:tabs>
-        <w:rPr>
-          <w:noProof/>
-        </w:rPr>
-      </w:pPr>
-      <w:hyperlink w:anchor="_Toc241939371" w:history="1">
+      <w:hyperlink w:anchor="_Toc241943028" w:history="1">
         <w:r>
           <w:rPr>
             <w:rStyle w:val="af"/>
@@ -1433,7 +1432,76 @@
             <w:noProof/>
             <w:webHidden/>
           </w:rPr>
-          <w:instrText xml:space="preserve"> PAGEREF _Toc241939371 \h </w:instrText>
+          <w:instrText xml:space="preserve"> PAGEREF _Toc241943028 \h </w:instrText>
+        </w:r>
+        <w:r>
+          <w:rPr>
+            <w:noProof/>
+            <w:webHidden/>
+          </w:rPr>
+        </w:r>
+        <w:r>
+          <w:rPr>
+            <w:noProof/>
+            <w:webHidden/>
+          </w:rPr>
+          <w:fldChar w:fldCharType="separate"/>
+        </w:r>
+        <w:r>
+          <w:rPr>
+            <w:noProof/>
+            <w:webHidden/>
+          </w:rPr>
+          <w:t>24</w:t>
+        </w:r>
+        <w:r>
+          <w:rPr>
+            <w:noProof/>
+            <w:webHidden/>
+          </w:rPr>
+          <w:fldChar w:fldCharType="end"/>
+        </w:r>
+      </w:hyperlink>
+    </w:p>
+    <w:p>
+      <w:pPr>
+        <w:pStyle w:val="12"/>
+        <w:tabs>
+          <w:tab w:val="right" w:leader="dot" w:pos="9345"/>
+        </w:tabs>
+        <w:rPr>
+          <w:noProof/>
+        </w:rPr>
+      </w:pPr>
+      <w:hyperlink w:anchor="_Toc241943029" w:history="1">
+        <w:r>
+          <w:rPr>
+            <w:rStyle w:val="af"/>
+            <w:b/>
+            <w:noProof/>
+          </w:rPr>
+          <w:t>СПИСОК ИСПОЛЬЗОВАННЫХ ИСТОЧНИКОВ</w:t>
+        </w:r>
+        <w:r>
+          <w:rPr>
+            <w:noProof/>
+            <w:webHidden/>
+          </w:rPr>
+          <w:tab/>
+        </w:r>
+        <w:r>
+          <w:rPr>
+            <w:noProof/>
+            <w:webHidden/>
+          </w:rPr>
+          <w:fldChar w:fldCharType="begin"/>
+        </w:r>
+        <w:r>
+          <w:rPr>
+            <w:noProof/>
+            <w:webHidden/>
+          </w:rPr>
+          <w:instrText xml:space="preserve"> PAGEREF _Toc241943029 \h </w:instrText>
         </w:r>
         <w:r>
           <w:rPr>
@@ -1474,76 +1542,7 @@
           <w:noProof/>
         </w:rPr>
       </w:pPr>
-      <w:hyperlink w:anchor="_Toc241939372" w:history="1">
-        <w:r>
-          <w:rPr>
-            <w:rStyle w:val="af"/>
-            <w:b/>
-            <w:noProof/>
-          </w:rPr>
-          <w:t>СПИСОК ИСПОЛЬЗОВАННЫХ ИСТОЧНИКОВ</w:t>
-        </w:r>
-        <w:r>
-          <w:rPr>
-            <w:noProof/>
-            <w:webHidden/>
-          </w:rPr>
-          <w:tab/>
-        </w:r>
-        <w:r>
-          <w:rPr>
-            <w:noProof/>
-            <w:webHidden/>
-          </w:rPr>
-          <w:fldChar w:fldCharType="begin"/>
-        </w:r>
-        <w:r>
-          <w:rPr>
-            <w:noProof/>
-            <w:webHidden/>
-          </w:rPr>
-          <w:instrText xml:space="preserve"> PAGEREF _Toc241939372 \h </w:instrText>
-        </w:r>
-        <w:r>
-          <w:rPr>
-            <w:noProof/>
-            <w:webHidden/>
-          </w:rPr>
-        </w:r>
-        <w:r>
-          <w:rPr>
-            <w:noProof/>
-            <w:webHidden/>
-          </w:rPr>
-          <w:fldChar w:fldCharType="separate"/>
-        </w:r>
-        <w:r>
-          <w:rPr>
-            <w:noProof/>
-            <w:webHidden/>
-          </w:rPr>
-          <w:t>26</w:t>
-        </w:r>
-        <w:r>
-          <w:rPr>
-            <w:noProof/>
-            <w:webHidden/>
-          </w:rPr>
-          <w:fldChar w:fldCharType="end"/>
-        </w:r>
-      </w:hyperlink>
-    </w:p>
-    <w:p>
-      <w:pPr>
-        <w:pStyle w:val="12"/>
-        <w:tabs>
-          <w:tab w:val="right" w:leader="dot" w:pos="9345"/>
-        </w:tabs>
-        <w:rPr>
-          <w:noProof/>
-        </w:rPr>
-      </w:pPr>
-      <w:hyperlink w:anchor="_Toc241939373" w:history="1">
+      <w:hyperlink w:anchor="_Toc241943030" w:history="1">
         <w:r>
           <w:rPr>
             <w:rStyle w:val="af"/>
@@ -1571,7 +1570,7 @@
             <w:noProof/>
             <w:webHidden/>
           </w:rPr>
-          <w:instrText xml:space="preserve"> PAGEREF _Toc241939373 \h </w:instrText>
+          <w:instrText xml:space="preserve"> PAGEREF _Toc241943030 \h </w:instrText>
         </w:r>
         <w:r>
           <w:rPr>
@@ -1591,7 +1590,7 @@
             <w:noProof/>
             <w:webHidden/>
           </w:rPr>
-          <w:t>28</w:t>
+          <w:t>27</w:t>
         </w:r>
         <w:r>
           <w:rPr>
@@ -1612,7 +1611,7 @@
           <w:noProof/>
         </w:rPr>
       </w:pPr>
-      <w:hyperlink w:anchor="_Toc241939374" w:history="1">
+      <w:hyperlink w:anchor="_Toc241943031" w:history="1">
         <w:r>
           <w:rPr>
             <w:rStyle w:val="af"/>
@@ -1640,7 +1639,7 @@
             <w:noProof/>
             <w:webHidden/>
           </w:rPr>
-          <w:instrText xml:space="preserve"> PAGEREF _Toc241939374 \h </w:instrText>
+          <w:instrText xml:space="preserve"> PAGEREF _Toc241943031 \h </w:instrText>
         </w:r>
         <w:r>
           <w:rPr>
@@ -1660,7 +1659,7 @@
             <w:noProof/>
             <w:webHidden/>
           </w:rPr>
-          <w:t>30</w:t>
+          <w:t>29</w:t>
         </w:r>
         <w:r>
           <w:rPr>
@@ -1681,7 +1680,7 @@
           <w:noProof/>
         </w:rPr>
       </w:pPr>
-      <w:hyperlink w:anchor="_Toc241939375" w:history="1">
+      <w:hyperlink w:anchor="_Toc241943032" w:history="1">
         <w:r>
           <w:rPr>
             <w:rStyle w:val="af"/>
@@ -1709,7 +1708,76 @@
             <w:noProof/>
             <w:webHidden/>
           </w:rPr>
-          <w:instrText xml:space="preserve"> PAGEREF _Toc241939375 \h </w:instrText>
+          <w:instrText xml:space="preserve"> PAGEREF _Toc241943032 \h </w:instrText>
+        </w:r>
+        <w:r>
+          <w:rPr>
+            <w:noProof/>
+            <w:webHidden/>
+          </w:rPr>
+        </w:r>
+        <w:r>
+          <w:rPr>
+            <w:noProof/>
+            <w:webHidden/>
+          </w:rPr>
+          <w:fldChar w:fldCharType="separate"/>
+        </w:r>
+        <w:r>
+          <w:rPr>
+            <w:noProof/>
+            <w:webHidden/>
+          </w:rPr>
+          <w:t>31</w:t>
+        </w:r>
+        <w:r>
+          <w:rPr>
+            <w:noProof/>
+            <w:webHidden/>
+          </w:rPr>
+          <w:fldChar w:fldCharType="end"/>
+        </w:r>
+      </w:hyperlink>
+    </w:p>
+    <w:p>
+      <w:pPr>
+        <w:pStyle w:val="12"/>
+        <w:tabs>
+          <w:tab w:val="right" w:leader="dot" w:pos="9345"/>
+        </w:tabs>
+        <w:rPr>
+          <w:noProof/>
+        </w:rPr>
+      </w:pPr>
+      <w:hyperlink w:anchor="_Toc241943033" w:history="1">
+        <w:r>
+          <w:rPr>
+            <w:rStyle w:val="af"/>
+            <w:b/>
+            <w:noProof/>
+          </w:rPr>
+          <w:t>ПРИЛОЖЕНИЕ Г</w:t>
+        </w:r>
+        <w:r>
+          <w:rPr>
+            <w:noProof/>
+            <w:webHidden/>
+          </w:rPr>
+          <w:tab/>
+        </w:r>
+        <w:r>
+          <w:rPr>
+            <w:noProof/>
+            <w:webHidden/>
+          </w:rPr>
+          <w:fldChar w:fldCharType="begin"/>
+        </w:r>
+        <w:r>
+          <w:rPr>
+            <w:noProof/>
+            <w:webHidden/>
+          </w:rPr>
+          <w:instrText xml:space="preserve"> PAGEREF _Toc241943033 \h </w:instrText>
         </w:r>
         <w:r>
           <w:rPr>
@@ -1750,76 +1818,7 @@
           <w:noProof/>
         </w:rPr>
       </w:pPr>
-      <w:hyperlink w:anchor="_Toc241939376" w:history="1">
-        <w:r>
-          <w:rPr>
-            <w:rStyle w:val="af"/>
-            <w:b/>
-            <w:noProof/>
-          </w:rPr>
-          <w:t>ПРИЛОЖЕНИЕ Г</w:t>
-        </w:r>
-        <w:r>
-          <w:rPr>
-            <w:noProof/>
-            <w:webHidden/>
-          </w:rPr>
-          <w:tab/>
-        </w:r>
-        <w:r>
-          <w:rPr>
-            <w:noProof/>
-            <w:webHidden/>
-          </w:rPr>
-          <w:fldChar w:fldCharType="begin"/>
-        </w:r>
-        <w:r>
-          <w:rPr>
-            <w:noProof/>
-            <w:webHidden/>
-          </w:rPr>
-          <w:instrText xml:space="preserve"> PAGEREF _Toc241939376 \h </w:instrText>
-        </w:r>
-        <w:r>
-          <w:rPr>
-            <w:noProof/>
-            <w:webHidden/>
-          </w:rPr>
-        </w:r>
-        <w:r>
-          <w:rPr>
-            <w:noProof/>
-            <w:webHidden/>
-          </w:rPr>
-          <w:fldChar w:fldCharType="separate"/>
-        </w:r>
-        <w:r>
-          <w:rPr>
-            <w:noProof/>
-            <w:webHidden/>
-          </w:rPr>
-          <w:t>33</w:t>
-        </w:r>
-        <w:r>
-          <w:rPr>
-            <w:noProof/>
-            <w:webHidden/>
-          </w:rPr>
-          <w:fldChar w:fldCharType="end"/>
-        </w:r>
-      </w:hyperlink>
-    </w:p>
-    <w:p>
-      <w:pPr>
-        <w:pStyle w:val="12"/>
-        <w:tabs>
-          <w:tab w:val="right" w:leader="dot" w:pos="9345"/>
-        </w:tabs>
-        <w:rPr>
-          <w:noProof/>
-        </w:rPr>
-      </w:pPr>
-      <w:hyperlink w:anchor="_Toc241939377" w:history="1">
+      <w:hyperlink w:anchor="_Toc241943034" w:history="1">
         <w:r>
           <w:rPr>
             <w:rStyle w:val="af"/>
@@ -1847,7 +1846,7 @@
             <w:noProof/>
             <w:webHidden/>
           </w:rPr>
-          <w:instrText xml:space="preserve"> PAGEREF _Toc241939377 \h </w:instrText>
+          <w:instrText xml:space="preserve"> PAGEREF _Toc241943034 \h </w:instrText>
         </w:r>
         <w:r>
           <w:rPr>
@@ -1867,7 +1866,7 @@
             <w:noProof/>
             <w:webHidden/>
           </w:rPr>
-          <w:t>35</w:t>
+          <w:t>34</w:t>
         </w:r>
         <w:r>
           <w:rPr>
@@ -1893,7 +1892,7 @@
         <w:spacing w:before="0" w:after="360" w:line="360" w:lineRule="exact"/>
         <w:ind w:firstLine="709"/>
       </w:pPr>
-      <w:bookmarkStart w:id="1" w:name="_Toc241939355"/>
+      <w:bookmarkStart w:id="1" w:name="_Toc241943012"/>
       <w:r>
         <w:rPr>
           <w:b/>
@@ -2199,7 +2198,7 @@
         <w:ind w:firstLine="709"/>
       </w:pPr>
       <w:bookmarkStart w:id="2" w:name="_b608aa976fc82a0faaf3b83f58c735968afd03b"/>
-      <w:bookmarkStart w:id="3" w:name="_Toc241939356"/>
+      <w:bookmarkStart w:id="3" w:name="_Toc241943013"/>
       <w:bookmarkEnd w:id="0"/>
       <w:r>
         <w:rPr>
@@ -2277,7 +2276,7 @@
         <w:ind w:firstLine="709"/>
       </w:pPr>
       <w:bookmarkStart w:id="4" w:name="_6ea6bf0a5ec92c733c53e44899cf0806bdc5e39"/>
-      <w:bookmarkStart w:id="5" w:name="_Toc241939357"/>
+      <w:bookmarkStart w:id="5" w:name="_Toc241943014"/>
       <w:r>
         <w:rPr>
           <w:b/>
@@ -3233,7 +3232,7 @@
         <w:ind w:firstLine="709"/>
       </w:pPr>
       <w:bookmarkStart w:id="6" w:name="_7a0c967539b5ef143597c37b0951dae8b296890"/>
-      <w:bookmarkStart w:id="7" w:name="_Toc241939358"/>
+      <w:bookmarkStart w:id="7" w:name="_Toc241943015"/>
       <w:bookmarkEnd w:id="4"/>
       <w:r>
         <w:rPr>
@@ -3302,7 +3301,7 @@
         <w:rPr>
           <w:sz w:val="28"/>
         </w:rPr>
-        <w:t xml:space="preserve"> (пробный доступ студентки) за три последних месяца, июнь - август 2026, по всему миру и по всему трафику [5]. Список из 12 доменов сформирован по ПЗ1 (</w:t>
+        <w:t xml:space="preserve"> (пробный доступ автора) за три последних месяца, июнь - август 2026, по всему миру и по всему трафику [5]. Список из 12 доменов сформирован по ПЗ1 (</w:t>
       </w:r>
       <w:r>
         <w:rPr>
@@ -3328,13 +3327,13 @@
         <w:rPr>
           <w:sz w:val="28"/>
         </w:rPr>
-        <w:t>) и по разделу «похожие сайты</w:t>
-      </w:r>
-      <w:r>
-        <w:rPr>
-          <w:sz w:val="28"/>
-        </w:rPr>
-        <w:t xml:space="preserve">» сервиса: специализированный аудит таблиц, </w:t>
+        <w:t>) и по разделу «похожие сайты» с</w:t>
+      </w:r>
+      <w:r>
+        <w:rPr>
+          <w:sz w:val="28"/>
+        </w:rPr>
+        <w:t xml:space="preserve">ервиса: специализированный аудит таблиц, </w:t>
       </w:r>
       <w:r>
         <w:rPr>
@@ -3439,13 +3438,13 @@
         <w:rPr>
           <w:sz w:val="28"/>
         </w:rPr>
-        <w:t>, 06-08.2026,</w:t>
-      </w:r>
-      <w:r>
-        <w:rPr>
-          <w:sz w:val="28"/>
-        </w:rPr>
-        <w:t xml:space="preserve"> весь мир</w:t>
+        <w:t>, 06-08.2026, ве</w:t>
+      </w:r>
+      <w:r>
+        <w:rPr>
+          <w:sz w:val="28"/>
+        </w:rPr>
+        <w:t>сь мир</w:t>
       </w:r>
     </w:p>
     <w:tbl>
@@ -5666,7 +5665,7 @@
           <w:sz w:val="28"/>
         </w:rPr>
         <w:drawing>
-          <wp:inline distT="0" distB="0" distL="0" distR="0" wp14:anchorId="3D0D1424" wp14:editId="39CA8936">
+          <wp:inline distT="0" distB="0" distL="0" distR="0" wp14:anchorId="33519538" wp14:editId="5BD65D76">
             <wp:extent cx="5334000" cy="3122341"/>
             <wp:effectExtent l="0" t="0" r="0" b="0"/>
             <wp:docPr id="12" name="Picture"/>
@@ -6477,7 +6476,7 @@
           <w:sz w:val="28"/>
         </w:rPr>
         <w:drawing>
-          <wp:inline distT="0" distB="0" distL="0" distR="0" wp14:anchorId="29FEB82E" wp14:editId="2BEC9534">
+          <wp:inline distT="0" distB="0" distL="0" distR="0" wp14:anchorId="49CC59B9" wp14:editId="3F9AF097">
             <wp:extent cx="5334000" cy="3252439"/>
             <wp:effectExtent l="0" t="0" r="0" b="0"/>
             <wp:docPr id="15" name="Picture"/>
@@ -6638,7 +6637,7 @@
         <w:ind w:firstLine="709"/>
       </w:pPr>
       <w:bookmarkStart w:id="8" w:name="_da959056159f19dff160d665d57702b18af1ddd"/>
-      <w:bookmarkStart w:id="9" w:name="_Toc241939359"/>
+      <w:bookmarkStart w:id="9" w:name="_Toc241943016"/>
       <w:bookmarkEnd w:id="6"/>
       <w:r>
         <w:rPr>
@@ -9766,7 +9765,7 @@
         <w:ind w:firstLine="709"/>
       </w:pPr>
       <w:bookmarkStart w:id="10" w:name="_06e2001e7574ebc77f8406bc11ca3db76d00c2a"/>
-      <w:bookmarkStart w:id="11" w:name="_Toc241939360"/>
+      <w:bookmarkStart w:id="11" w:name="_Toc241943017"/>
       <w:bookmarkEnd w:id="8"/>
       <w:r>
         <w:rPr>
@@ -10570,7 +10569,7 @@
         <w:ind w:firstLine="709"/>
       </w:pPr>
       <w:bookmarkStart w:id="12" w:name="_606fa79e4d4f49d8da929021c2a978685b741ea"/>
-      <w:bookmarkStart w:id="13" w:name="_Toc241939361"/>
+      <w:bookmarkStart w:id="13" w:name="_Toc241943018"/>
       <w:bookmarkEnd w:id="10"/>
       <w:r>
         <w:rPr>
@@ -13004,7 +13003,7 @@
         <w:ind w:firstLine="709"/>
       </w:pPr>
       <w:bookmarkStart w:id="14" w:name="_2314d5998da626860a70184e0b470b0b8504694"/>
-      <w:bookmarkStart w:id="15" w:name="_Toc241939362"/>
+      <w:bookmarkStart w:id="15" w:name="_Toc241943019"/>
       <w:bookmarkEnd w:id="12"/>
       <w:r>
         <w:rPr>
@@ -13632,7 +13631,7 @@
         <w:ind w:firstLine="709"/>
       </w:pPr>
       <w:bookmarkStart w:id="16" w:name="_42bac9f10c820a94a4112d44417ea6b5d14bf7d"/>
-      <w:bookmarkStart w:id="17" w:name="_Toc241939363"/>
+      <w:bookmarkStart w:id="17" w:name="_Toc241943020"/>
       <w:bookmarkEnd w:id="14"/>
       <w:r>
         <w:rPr>
@@ -15539,7 +15538,7 @@
         <w:ind w:firstLine="709"/>
       </w:pPr>
       <w:bookmarkStart w:id="18" w:name="_62882a27ae1c57302eff280b02701a311900947"/>
-      <w:bookmarkStart w:id="19" w:name="_Toc241939364"/>
+      <w:bookmarkStart w:id="19" w:name="_Toc241943021"/>
       <w:bookmarkEnd w:id="16"/>
       <w:r>
         <w:rPr>
@@ -16928,7 +16927,7 @@
         <w:ind w:firstLine="709"/>
       </w:pPr>
       <w:bookmarkStart w:id="20" w:name="_2c7ec3ecf17663584d0d27e07e31cbd2a0948cf"/>
-      <w:bookmarkStart w:id="21" w:name="_Toc241939365"/>
+      <w:bookmarkStart w:id="21" w:name="_Toc241943022"/>
       <w:bookmarkEnd w:id="18"/>
       <w:r>
         <w:rPr>
@@ -19263,7 +19262,7 @@
         <w:ind w:firstLine="709"/>
       </w:pPr>
       <w:bookmarkStart w:id="22" w:name="_8d34778965163a5752bc27698d1f7e786ff5c87"/>
-      <w:bookmarkStart w:id="23" w:name="_Toc241939366"/>
+      <w:bookmarkStart w:id="23" w:name="_Toc241943023"/>
       <w:bookmarkEnd w:id="20"/>
       <w:r>
         <w:rPr>
@@ -20418,7 +20417,7 @@
           <w:sz w:val="28"/>
         </w:rPr>
         <w:drawing>
-          <wp:inline distT="0" distB="0" distL="0" distR="0" wp14:anchorId="2E24B339" wp14:editId="50FC688C">
+          <wp:inline distT="0" distB="0" distL="0" distR="0" wp14:anchorId="360C974A" wp14:editId="1C14C1D5">
             <wp:extent cx="5334000" cy="2992243"/>
             <wp:effectExtent l="0" t="0" r="0" b="0"/>
             <wp:docPr id="26" name="Picture"/>
@@ -21264,7 +21263,7 @@
           <w:sz w:val="28"/>
         </w:rPr>
         <w:drawing>
-          <wp:inline distT="0" distB="0" distL="0" distR="0" wp14:anchorId="7E43B0B3" wp14:editId="05DECE2C">
+          <wp:inline distT="0" distB="0" distL="0" distR="0" wp14:anchorId="635CDAF3" wp14:editId="7C487C8F">
             <wp:extent cx="5334000" cy="2471853"/>
             <wp:effectExtent l="0" t="0" r="0" b="0"/>
             <wp:docPr id="29" name="Picture"/>
@@ -21762,7 +21761,7 @@
         <w:ind w:firstLine="709"/>
       </w:pPr>
       <w:bookmarkStart w:id="24" w:name="_e6e1aac57bb528344b9009e4599364161f48047"/>
-      <w:bookmarkStart w:id="25" w:name="_Toc241939367"/>
+      <w:bookmarkStart w:id="25" w:name="_Toc241943024"/>
       <w:bookmarkEnd w:id="22"/>
       <w:r>
         <w:rPr>
@@ -22680,7 +22679,7 @@
         </w:rPr>
         <w:lastRenderedPageBreak/>
         <w:drawing>
-          <wp:inline distT="0" distB="0" distL="0" distR="0" wp14:anchorId="4F982D4C" wp14:editId="1C0EA91C">
+          <wp:inline distT="0" distB="0" distL="0" distR="0" wp14:anchorId="03DF6374" wp14:editId="2BF70307">
             <wp:extent cx="5334000" cy="2341756"/>
             <wp:effectExtent l="0" t="0" r="0" b="0"/>
             <wp:docPr id="33" name="Picture"/>
@@ -22911,7 +22910,7 @@
         <w:ind w:firstLine="709"/>
       </w:pPr>
       <w:bookmarkStart w:id="26" w:name="_6a64c25cd48aeb5a2bf3dc411d56d805a6b5d7e"/>
-      <w:bookmarkStart w:id="27" w:name="_Toc241939368"/>
+      <w:bookmarkStart w:id="27" w:name="_Toc241943025"/>
       <w:bookmarkEnd w:id="24"/>
       <w:r>
         <w:rPr>
@@ -22970,7 +22969,7 @@
         </w:rPr>
         <w:lastRenderedPageBreak/>
         <w:drawing>
-          <wp:inline distT="0" distB="0" distL="0" distR="0" wp14:anchorId="797A4B3E" wp14:editId="63A592F1">
+          <wp:inline distT="0" distB="0" distL="0" distR="0" wp14:anchorId="3E3BEBA0" wp14:editId="1BCB28ED">
             <wp:extent cx="5334000" cy="2471853"/>
             <wp:effectExtent l="0" t="0" r="0" b="0"/>
             <wp:docPr id="37" name="Picture"/>
@@ -23195,7 +23194,7 @@
         <w:ind w:firstLine="709"/>
       </w:pPr>
       <w:bookmarkStart w:id="28" w:name="_8cdf61ec50cc46d2aaeadce1b560fea28ea116e"/>
-      <w:bookmarkStart w:id="29" w:name="_Toc241939369"/>
+      <w:bookmarkStart w:id="29" w:name="_Toc241943026"/>
       <w:bookmarkEnd w:id="26"/>
       <w:r>
         <w:rPr>
@@ -23311,7 +23310,7 @@
         <w:ind w:firstLine="709"/>
       </w:pPr>
       <w:bookmarkStart w:id="30" w:name="_1bfdad9d2d88ddb6ca16c31c1d4d4943679f32f"/>
-      <w:bookmarkStart w:id="31" w:name="_Toc241939370"/>
+      <w:bookmarkStart w:id="31" w:name="_Toc241943027"/>
       <w:bookmarkEnd w:id="28"/>
       <w:bookmarkEnd w:id="2"/>
       <w:r>
@@ -23849,7 +23848,7 @@
         <w:jc w:val="center"/>
       </w:pPr>
       <w:bookmarkStart w:id="32" w:name="_выводы"/>
-      <w:bookmarkStart w:id="33" w:name="_Toc241939371"/>
+      <w:bookmarkStart w:id="33" w:name="_Toc241943028"/>
       <w:bookmarkEnd w:id="30"/>
       <w:r>
         <w:rPr>
@@ -24123,7 +24122,7 @@
         <w:jc w:val="center"/>
       </w:pPr>
       <w:bookmarkStart w:id="34" w:name="_274f6a444530ef90b0479dabf3d210f01e97699"/>
-      <w:bookmarkStart w:id="35" w:name="_Toc241939372"/>
+      <w:bookmarkStart w:id="35" w:name="_Toc241943029"/>
       <w:bookmarkEnd w:id="32"/>
       <w:r>
         <w:rPr>
@@ -26153,7 +26152,7 @@
         <w:jc w:val="center"/>
       </w:pPr>
       <w:bookmarkStart w:id="36" w:name="_3d74faf1500c1b2a4a8bfa8e0e37c74206ce73d"/>
-      <w:bookmarkStart w:id="37" w:name="_Toc241939373"/>
+      <w:bookmarkStart w:id="37" w:name="_Toc241943030"/>
       <w:bookmarkEnd w:id="34"/>
       <w:r>
         <w:rPr>
@@ -27619,7 +27618,7 @@
         <w:jc w:val="center"/>
       </w:pPr>
       <w:bookmarkStart w:id="38" w:name="_d684f183eb868ee4ace295916bed2e6be64d16e"/>
-      <w:bookmarkStart w:id="39" w:name="_Toc241939374"/>
+      <w:bookmarkStart w:id="39" w:name="_Toc241943031"/>
       <w:bookmarkEnd w:id="36"/>
       <w:r>
         <w:rPr>
@@ -28591,13 +28590,13 @@
               <w:rPr>
                 <w:sz w:val="24"/>
               </w:rPr>
-              <w:t>аудитория студентки, профессиональн</w:t>
-            </w:r>
-            <w:r>
-              <w:rPr>
-                <w:sz w:val="24"/>
-              </w:rPr>
-              <w:t>ые чаты</w:t>
+              <w:t xml:space="preserve">аудитория автора, профессиональные </w:t>
+            </w:r>
+            <w:r>
+              <w:rPr>
+                <w:sz w:val="24"/>
+              </w:rPr>
+              <w:t>чаты</w:t>
             </w:r>
           </w:p>
         </w:tc>
@@ -28765,13 +28764,13 @@
               <w:rPr>
                 <w:sz w:val="24"/>
               </w:rPr>
-              <w:t xml:space="preserve"> не</w:t>
-            </w:r>
-            <w:r>
-              <w:rPr>
-                <w:sz w:val="24"/>
-              </w:rPr>
-              <w:t xml:space="preserve"> написан: модельные замеры в приложении Е ЛР6 (допущение Д-32); после запуска измерить реальные</w:t>
+              <w:t xml:space="preserve"> не на</w:t>
+            </w:r>
+            <w:r>
+              <w:rPr>
+                <w:sz w:val="24"/>
+              </w:rPr>
+              <w:t>писан: модельные замеры в приложении Е ЛР6 (допущение Д-32); после запуска измерить реальные</w:t>
             </w:r>
           </w:p>
         </w:tc>
@@ -28994,13 +28993,13 @@
         <w:rPr>
           <w:sz w:val="28"/>
         </w:rPr>
-        <w:t>Пункты 1, 3, 6 и 7 выполняются в сервисах под аккаунтом студентки; пункты 2 и 4 - открытые источники; пункт 5 т</w:t>
-      </w:r>
-      <w:r>
-        <w:rPr>
-          <w:sz w:val="28"/>
-        </w:rPr>
-        <w:t>ребует аудитории. До выполнения пунктов оценки остаются диапазоном с низкой и средней надежностью.</w:t>
+        <w:t xml:space="preserve">Пункты 1, 3, 6 и 7 выполняются в сервисах под учетной записью автора; пункты 2 и 4 - открытые источники; пункт </w:t>
+      </w:r>
+      <w:r>
+        <w:rPr>
+          <w:sz w:val="28"/>
+        </w:rPr>
+        <w:t>5 требует аудитории. До выполнения пунктов оценки остаются диапазоном с низкой и средней надежностью.</w:t>
       </w:r>
     </w:p>
     <w:p>
@@ -29012,7 +29011,7 @@
         <w:jc w:val="center"/>
       </w:pPr>
       <w:bookmarkStart w:id="40" w:name="_cb59224a7032ef66ab429e7df9b4e4c597bc187"/>
-      <w:bookmarkStart w:id="41" w:name="_Toc241939375"/>
+      <w:bookmarkStart w:id="41" w:name="_Toc241943032"/>
       <w:bookmarkEnd w:id="38"/>
       <w:r>
         <w:rPr>
@@ -29073,13 +29072,13 @@
         <w:rPr>
           <w:sz w:val="28"/>
         </w:rPr>
-        <w:t xml:space="preserve"> выявлены ошибки и неудобства. Ниже перечислено, что изменено, чтобы расчет был </w:t>
-      </w:r>
-      <w:r>
-        <w:rPr>
-          <w:sz w:val="28"/>
-        </w:rPr>
-        <w:t>корректным; оригиналы шаблонов не изменялись, работа велась с копиями.</w:t>
+        <w:t xml:space="preserve"> выявлены ошибки и неудобства. Ниже перечислено, что изменено, чтобы расчет б</w:t>
+      </w:r>
+      <w:r>
+        <w:rPr>
+          <w:sz w:val="28"/>
+        </w:rPr>
+        <w:t>ыл корректным; оригиналы шаблонов не изменялись, работа велась с копиями.</w:t>
       </w:r>
     </w:p>
     <w:p>
@@ -30005,7 +30004,7 @@
         <w:jc w:val="center"/>
       </w:pPr>
       <w:bookmarkStart w:id="42" w:name="_48e9587881bbc300b26702bd6584ff263e735cf"/>
-      <w:bookmarkStart w:id="43" w:name="_Toc241939376"/>
+      <w:bookmarkStart w:id="43" w:name="_Toc241943033"/>
       <w:bookmarkEnd w:id="40"/>
       <w:r>
         <w:rPr>
@@ -30053,7 +30052,7 @@
         <w:rPr>
           <w:sz w:val="28"/>
         </w:rPr>
-        <w:t xml:space="preserve">Респондентов для опроса нет, поэтому по решению студентки (Р-8) данные сгенерированы по заданным параметрам: 30 </w:t>
+        <w:t xml:space="preserve">Респондентов для опроса нет, поэтому по решению автора (Р-8) данные сгенерированы по заданным параметрам: 30 </w:t>
       </w:r>
       <w:r>
         <w:rPr>
@@ -31340,7 +31339,7 @@
         <w:jc w:val="center"/>
       </w:pPr>
       <w:bookmarkStart w:id="44" w:name="_494653d134221fdc43c135127d450c9af0a7c7d"/>
-      <w:bookmarkStart w:id="45" w:name="_Toc241939377"/>
+      <w:bookmarkStart w:id="45" w:name="_Toc241943034"/>
       <w:bookmarkEnd w:id="42"/>
       <w:r>
         <w:rPr>
@@ -33803,7 +33802,7 @@
   <w:abstractNum w:abstractNumId="0" w15:restartNumberingAfterBreak="0">
     <w:nsid w:val="0000A990"/>
     <w:multiLevelType w:val="multilevel"/>
-    <w:tmpl w:val="255CC186"/>
+    <w:tmpl w:val="3ABCB684"/>
     <w:lvl w:ilvl="0">
       <w:numFmt w:val="bullet"/>
       <w:lvlText w:val=" "/>
@@ -33880,7 +33879,7 @@
   <w:abstractNum w:abstractNumId="1" w15:restartNumberingAfterBreak="0">
     <w:nsid w:val="00A99411"/>
     <w:multiLevelType w:val="multilevel"/>
-    <w:tmpl w:val="ADB0BF44"/>
+    <w:tmpl w:val="5BEA959E"/>
     <w:lvl w:ilvl="0">
       <w:start w:val="1"/>
       <w:numFmt w:val="decimal"/>
@@ -35358,7 +35357,7 @@
     <w:autoRedefine/>
     <w:uiPriority w:val="39"/>
     <w:unhideWhenUsed/>
-    <w:rsid w:val="00182E6F"/>
+    <w:rsid w:val="00B23DFF"/>
     <w:pPr>
       <w:spacing w:after="100"/>
     </w:pPr>
@@ -35370,7 +35369,7 @@
     <w:autoRedefine/>
     <w:uiPriority w:val="39"/>
     <w:unhideWhenUsed/>
-    <w:rsid w:val="00182E6F"/>
+    <w:rsid w:val="00B23DFF"/>
     <w:pPr>
       <w:spacing w:after="100"/>
       <w:ind w:left="240"/>

</xml_diff>

<commit_message>
UP cross-check: SOC 2 out of scope, AppSource per PZ1, group 60131, risk crosswalk, appendix B as accepted decisions, Excel notes, rebuild
</commit_message>
<xml_diff>
--- a/ЛР2-3_Объем_рынка/ОТЧЕТ_ЛР2-3_TableMind.docx
+++ b/ЛР2-3_Объем_рынка/ОТЧЕТ_ЛР2-3_TableMind.docx
@@ -172,7 +172,7 @@
           <w:sz w:val="28"/>
         </w:rPr>
         <w:tab/>
-        <w:t>гр. 60121</w:t>
+        <w:t>гр. 60131</w:t>
       </w:r>
     </w:p>
     <w:p>
@@ -264,7 +264,7 @@
       <w:r>
         <w:fldChar w:fldCharType="separate"/>
       </w:r>
-      <w:hyperlink w:anchor="_Toc241943012" w:history="1">
+      <w:hyperlink w:anchor="_Toc241952850" w:history="1">
         <w:r>
           <w:rPr>
             <w:rStyle w:val="af"/>
@@ -292,7 +292,7 @@
             <w:noProof/>
             <w:webHidden/>
           </w:rPr>
-          <w:instrText xml:space="preserve"> PAGEREF _Toc241943012 \h </w:instrText>
+          <w:instrText xml:space="preserve"> PAGEREF _Toc241952850 \h </w:instrText>
         </w:r>
         <w:r>
           <w:rPr>
@@ -333,7 +333,7 @@
           <w:noProof/>
         </w:rPr>
       </w:pPr>
-      <w:hyperlink w:anchor="_Toc241943013" w:history="1">
+      <w:hyperlink w:anchor="_Toc241952851" w:history="1">
         <w:r>
           <w:rPr>
             <w:rStyle w:val="af"/>
@@ -361,7 +361,7 @@
             <w:noProof/>
             <w:webHidden/>
           </w:rPr>
-          <w:instrText xml:space="preserve"> PAGEREF _Toc241943013 \h </w:instrText>
+          <w:instrText xml:space="preserve"> PAGEREF _Toc241952851 \h </w:instrText>
         </w:r>
         <w:r>
           <w:rPr>
@@ -402,7 +402,7 @@
           <w:noProof/>
         </w:rPr>
       </w:pPr>
-      <w:hyperlink w:anchor="_Toc241943014" w:history="1">
+      <w:hyperlink w:anchor="_Toc241952852" w:history="1">
         <w:r>
           <w:rPr>
             <w:rStyle w:val="af"/>
@@ -430,7 +430,7 @@
             <w:noProof/>
             <w:webHidden/>
           </w:rPr>
-          <w:instrText xml:space="preserve"> PAGEREF _Toc241943014 \h </w:instrText>
+          <w:instrText xml:space="preserve"> PAGEREF _Toc241952852 \h </w:instrText>
         </w:r>
         <w:r>
           <w:rPr>
@@ -471,7 +471,7 @@
           <w:noProof/>
         </w:rPr>
       </w:pPr>
-      <w:hyperlink w:anchor="_Toc241943015" w:history="1">
+      <w:hyperlink w:anchor="_Toc241952853" w:history="1">
         <w:r>
           <w:rPr>
             <w:rStyle w:val="af"/>
@@ -508,7 +508,7 @@
             <w:noProof/>
             <w:webHidden/>
           </w:rPr>
-          <w:instrText xml:space="preserve"> PAGEREF _Toc241943015 \h </w:instrText>
+          <w:instrText xml:space="preserve"> PAGEREF _Toc241952853 \h </w:instrText>
         </w:r>
         <w:r>
           <w:rPr>
@@ -549,7 +549,7 @@
           <w:noProof/>
         </w:rPr>
       </w:pPr>
-      <w:hyperlink w:anchor="_Toc241943016" w:history="1">
+      <w:hyperlink w:anchor="_Toc241952854" w:history="1">
         <w:r>
           <w:rPr>
             <w:rStyle w:val="af"/>
@@ -586,7 +586,7 @@
             <w:noProof/>
             <w:webHidden/>
           </w:rPr>
-          <w:instrText xml:space="preserve"> PAGEREF _Toc241943016 \h </w:instrText>
+          <w:instrText xml:space="preserve"> PAGEREF _Toc241952854 \h </w:instrText>
         </w:r>
         <w:r>
           <w:rPr>
@@ -627,7 +627,7 @@
           <w:noProof/>
         </w:rPr>
       </w:pPr>
-      <w:hyperlink w:anchor="_Toc241943017" w:history="1">
+      <w:hyperlink w:anchor="_Toc241952855" w:history="1">
         <w:r>
           <w:rPr>
             <w:rStyle w:val="af"/>
@@ -664,7 +664,7 @@
             <w:noProof/>
             <w:webHidden/>
           </w:rPr>
-          <w:instrText xml:space="preserve"> PAGEREF _Toc241943017 \h </w:instrText>
+          <w:instrText xml:space="preserve"> PAGEREF _Toc241952855 \h </w:instrText>
         </w:r>
         <w:r>
           <w:rPr>
@@ -705,7 +705,7 @@
           <w:noProof/>
         </w:rPr>
       </w:pPr>
-      <w:hyperlink w:anchor="_Toc241943018" w:history="1">
+      <w:hyperlink w:anchor="_Toc241952856" w:history="1">
         <w:r>
           <w:rPr>
             <w:rStyle w:val="af"/>
@@ -733,7 +733,7 @@
             <w:noProof/>
             <w:webHidden/>
           </w:rPr>
-          <w:instrText xml:space="preserve"> PAGEREF _Toc241943018 \h </w:instrText>
+          <w:instrText xml:space="preserve"> PAGEREF _Toc241952856 \h </w:instrText>
         </w:r>
         <w:r>
           <w:rPr>
@@ -774,7 +774,7 @@
           <w:noProof/>
         </w:rPr>
       </w:pPr>
-      <w:hyperlink w:anchor="_Toc241943019" w:history="1">
+      <w:hyperlink w:anchor="_Toc241952857" w:history="1">
         <w:r>
           <w:rPr>
             <w:rStyle w:val="af"/>
@@ -802,7 +802,7 @@
             <w:noProof/>
             <w:webHidden/>
           </w:rPr>
-          <w:instrText xml:space="preserve"> PAGEREF _Toc241943019 \h </w:instrText>
+          <w:instrText xml:space="preserve"> PAGEREF _Toc241952857 \h </w:instrText>
         </w:r>
         <w:r>
           <w:rPr>
@@ -843,7 +843,7 @@
           <w:noProof/>
         </w:rPr>
       </w:pPr>
-      <w:hyperlink w:anchor="_Toc241943020" w:history="1">
+      <w:hyperlink w:anchor="_Toc241952858" w:history="1">
         <w:r>
           <w:rPr>
             <w:rStyle w:val="af"/>
@@ -880,7 +880,7 @@
             <w:noProof/>
             <w:webHidden/>
           </w:rPr>
-          <w:instrText xml:space="preserve"> PAGEREF _Toc241943020 \h </w:instrText>
+          <w:instrText xml:space="preserve"> PAGEREF _Toc241952858 \h </w:instrText>
         </w:r>
         <w:r>
           <w:rPr>
@@ -921,7 +921,7 @@
           <w:noProof/>
         </w:rPr>
       </w:pPr>
-      <w:hyperlink w:anchor="_Toc241943021" w:history="1">
+      <w:hyperlink w:anchor="_Toc241952859" w:history="1">
         <w:r>
           <w:rPr>
             <w:rStyle w:val="af"/>
@@ -949,76 +949,7 @@
             <w:noProof/>
             <w:webHidden/>
           </w:rPr>
-          <w:instrText xml:space="preserve"> PAGEREF _Toc241943021 \h </w:instrText>
-        </w:r>
-        <w:r>
-          <w:rPr>
-            <w:noProof/>
-            <w:webHidden/>
-          </w:rPr>
-        </w:r>
-        <w:r>
-          <w:rPr>
-            <w:noProof/>
-            <w:webHidden/>
-          </w:rPr>
-          <w:fldChar w:fldCharType="separate"/>
-        </w:r>
-        <w:r>
-          <w:rPr>
-            <w:noProof/>
-            <w:webHidden/>
-          </w:rPr>
-          <w:t>13</w:t>
-        </w:r>
-        <w:r>
-          <w:rPr>
-            <w:noProof/>
-            <w:webHidden/>
-          </w:rPr>
-          <w:fldChar w:fldCharType="end"/>
-        </w:r>
-      </w:hyperlink>
-    </w:p>
-    <w:p>
-      <w:pPr>
-        <w:pStyle w:val="22"/>
-        <w:tabs>
-          <w:tab w:val="right" w:leader="dot" w:pos="9345"/>
-        </w:tabs>
-        <w:rPr>
-          <w:noProof/>
-        </w:rPr>
-      </w:pPr>
-      <w:hyperlink w:anchor="_Toc241943022" w:history="1">
-        <w:r>
-          <w:rPr>
-            <w:rStyle w:val="af"/>
-            <w:b/>
-            <w:noProof/>
-          </w:rPr>
-          <w:t>2.9 Проверка платежеспособности</w:t>
-        </w:r>
-        <w:r>
-          <w:rPr>
-            <w:noProof/>
-            <w:webHidden/>
-          </w:rPr>
-          <w:tab/>
-        </w:r>
-        <w:r>
-          <w:rPr>
-            <w:noProof/>
-            <w:webHidden/>
-          </w:rPr>
-          <w:fldChar w:fldCharType="begin"/>
-        </w:r>
-        <w:r>
-          <w:rPr>
-            <w:noProof/>
-            <w:webHidden/>
-          </w:rPr>
-          <w:instrText xml:space="preserve"> PAGEREF _Toc241943022 \h </w:instrText>
+          <w:instrText xml:space="preserve"> PAGEREF _Toc241952859 \h </w:instrText>
         </w:r>
         <w:r>
           <w:rPr>
@@ -1059,7 +990,76 @@
           <w:noProof/>
         </w:rPr>
       </w:pPr>
-      <w:hyperlink w:anchor="_Toc241943023" w:history="1">
+      <w:hyperlink w:anchor="_Toc241952860" w:history="1">
+        <w:r>
+          <w:rPr>
+            <w:rStyle w:val="af"/>
+            <w:b/>
+            <w:noProof/>
+          </w:rPr>
+          <w:t>2.9 Проверка платежеспособности</w:t>
+        </w:r>
+        <w:r>
+          <w:rPr>
+            <w:noProof/>
+            <w:webHidden/>
+          </w:rPr>
+          <w:tab/>
+        </w:r>
+        <w:r>
+          <w:rPr>
+            <w:noProof/>
+            <w:webHidden/>
+          </w:rPr>
+          <w:fldChar w:fldCharType="begin"/>
+        </w:r>
+        <w:r>
+          <w:rPr>
+            <w:noProof/>
+            <w:webHidden/>
+          </w:rPr>
+          <w:instrText xml:space="preserve"> PAGEREF _Toc241952860 \h </w:instrText>
+        </w:r>
+        <w:r>
+          <w:rPr>
+            <w:noProof/>
+            <w:webHidden/>
+          </w:rPr>
+        </w:r>
+        <w:r>
+          <w:rPr>
+            <w:noProof/>
+            <w:webHidden/>
+          </w:rPr>
+          <w:fldChar w:fldCharType="separate"/>
+        </w:r>
+        <w:r>
+          <w:rPr>
+            <w:noProof/>
+            <w:webHidden/>
+          </w:rPr>
+          <w:t>15</w:t>
+        </w:r>
+        <w:r>
+          <w:rPr>
+            <w:noProof/>
+            <w:webHidden/>
+          </w:rPr>
+          <w:fldChar w:fldCharType="end"/>
+        </w:r>
+      </w:hyperlink>
+    </w:p>
+    <w:p>
+      <w:pPr>
+        <w:pStyle w:val="22"/>
+        <w:tabs>
+          <w:tab w:val="right" w:leader="dot" w:pos="9345"/>
+        </w:tabs>
+        <w:rPr>
+          <w:noProof/>
+        </w:rPr>
+      </w:pPr>
+      <w:hyperlink w:anchor="_Toc241952861" w:history="1">
         <w:r>
           <w:rPr>
             <w:rStyle w:val="af"/>
@@ -1087,7 +1087,7 @@
             <w:noProof/>
             <w:webHidden/>
           </w:rPr>
-          <w:instrText xml:space="preserve"> PAGEREF _Toc241943023 \h </w:instrText>
+          <w:instrText xml:space="preserve"> PAGEREF _Toc241952861 \h </w:instrText>
         </w:r>
         <w:r>
           <w:rPr>
@@ -1128,7 +1128,7 @@
           <w:noProof/>
         </w:rPr>
       </w:pPr>
-      <w:hyperlink w:anchor="_Toc241943024" w:history="1">
+      <w:hyperlink w:anchor="_Toc241952862" w:history="1">
         <w:r>
           <w:rPr>
             <w:rStyle w:val="af"/>
@@ -1156,7 +1156,7 @@
             <w:noProof/>
             <w:webHidden/>
           </w:rPr>
-          <w:instrText xml:space="preserve"> PAGEREF _Toc241943024 \h </w:instrText>
+          <w:instrText xml:space="preserve"> PAGEREF _Toc241952862 \h </w:instrText>
         </w:r>
         <w:r>
           <w:rPr>
@@ -1197,7 +1197,7 @@
           <w:noProof/>
         </w:rPr>
       </w:pPr>
-      <w:hyperlink w:anchor="_Toc241943025" w:history="1">
+      <w:hyperlink w:anchor="_Toc241952863" w:history="1">
         <w:r>
           <w:rPr>
             <w:rStyle w:val="af"/>
@@ -1225,7 +1225,7 @@
             <w:noProof/>
             <w:webHidden/>
           </w:rPr>
-          <w:instrText xml:space="preserve"> PAGEREF _Toc241943025 \h </w:instrText>
+          <w:instrText xml:space="preserve"> PAGEREF _Toc241952863 \h </w:instrText>
         </w:r>
         <w:r>
           <w:rPr>
@@ -1266,7 +1266,7 @@
           <w:noProof/>
         </w:rPr>
       </w:pPr>
-      <w:hyperlink w:anchor="_Toc241943026" w:history="1">
+      <w:hyperlink w:anchor="_Toc241952864" w:history="1">
         <w:r>
           <w:rPr>
             <w:rStyle w:val="af"/>
@@ -1294,7 +1294,7 @@
             <w:noProof/>
             <w:webHidden/>
           </w:rPr>
-          <w:instrText xml:space="preserve"> PAGEREF _Toc241943026 \h </w:instrText>
+          <w:instrText xml:space="preserve"> PAGEREF _Toc241952864 \h </w:instrText>
         </w:r>
         <w:r>
           <w:rPr>
@@ -1335,7 +1335,7 @@
           <w:noProof/>
         </w:rPr>
       </w:pPr>
-      <w:hyperlink w:anchor="_Toc241943027" w:history="1">
+      <w:hyperlink w:anchor="_Toc241952865" w:history="1">
         <w:r>
           <w:rPr>
             <w:rStyle w:val="af"/>
@@ -1363,7 +1363,7 @@
             <w:noProof/>
             <w:webHidden/>
           </w:rPr>
-          <w:instrText xml:space="preserve"> PAGEREF _Toc241943027 \h </w:instrText>
+          <w:instrText xml:space="preserve"> PAGEREF _Toc241952865 \h </w:instrText>
         </w:r>
         <w:r>
           <w:rPr>
@@ -1404,7 +1404,7 @@
           <w:noProof/>
         </w:rPr>
       </w:pPr>
-      <w:hyperlink w:anchor="_Toc241943028" w:history="1">
+      <w:hyperlink w:anchor="_Toc241952866" w:history="1">
         <w:r>
           <w:rPr>
             <w:rStyle w:val="af"/>
@@ -1432,7 +1432,7 @@
             <w:noProof/>
             <w:webHidden/>
           </w:rPr>
-          <w:instrText xml:space="preserve"> PAGEREF _Toc241943028 \h </w:instrText>
+          <w:instrText xml:space="preserve"> PAGEREF _Toc241952866 \h </w:instrText>
         </w:r>
         <w:r>
           <w:rPr>
@@ -1473,7 +1473,7 @@
           <w:noProof/>
         </w:rPr>
       </w:pPr>
-      <w:hyperlink w:anchor="_Toc241943029" w:history="1">
+      <w:hyperlink w:anchor="_Toc241952867" w:history="1">
         <w:r>
           <w:rPr>
             <w:rStyle w:val="af"/>
@@ -1501,7 +1501,7 @@
             <w:noProof/>
             <w:webHidden/>
           </w:rPr>
-          <w:instrText xml:space="preserve"> PAGEREF _Toc241943029 \h </w:instrText>
+          <w:instrText xml:space="preserve"> PAGEREF _Toc241952867 \h </w:instrText>
         </w:r>
         <w:r>
           <w:rPr>
@@ -1542,7 +1542,7 @@
           <w:noProof/>
         </w:rPr>
       </w:pPr>
-      <w:hyperlink w:anchor="_Toc241943030" w:history="1">
+      <w:hyperlink w:anchor="_Toc241952868" w:history="1">
         <w:r>
           <w:rPr>
             <w:rStyle w:val="af"/>
@@ -1570,7 +1570,7 @@
             <w:noProof/>
             <w:webHidden/>
           </w:rPr>
-          <w:instrText xml:space="preserve"> PAGEREF _Toc241943030 \h </w:instrText>
+          <w:instrText xml:space="preserve"> PAGEREF _Toc241952868 \h </w:instrText>
         </w:r>
         <w:r>
           <w:rPr>
@@ -1611,7 +1611,7 @@
           <w:noProof/>
         </w:rPr>
       </w:pPr>
-      <w:hyperlink w:anchor="_Toc241943031" w:history="1">
+      <w:hyperlink w:anchor="_Toc241952869" w:history="1">
         <w:r>
           <w:rPr>
             <w:rStyle w:val="af"/>
@@ -1639,7 +1639,7 @@
             <w:noProof/>
             <w:webHidden/>
           </w:rPr>
-          <w:instrText xml:space="preserve"> PAGEREF _Toc241943031 \h </w:instrText>
+          <w:instrText xml:space="preserve"> PAGEREF _Toc241952869 \h </w:instrText>
         </w:r>
         <w:r>
           <w:rPr>
@@ -1680,7 +1680,7 @@
           <w:noProof/>
         </w:rPr>
       </w:pPr>
-      <w:hyperlink w:anchor="_Toc241943032" w:history="1">
+      <w:hyperlink w:anchor="_Toc241952870" w:history="1">
         <w:r>
           <w:rPr>
             <w:rStyle w:val="af"/>
@@ -1708,7 +1708,7 @@
             <w:noProof/>
             <w:webHidden/>
           </w:rPr>
-          <w:instrText xml:space="preserve"> PAGEREF _Toc241943032 \h </w:instrText>
+          <w:instrText xml:space="preserve"> PAGEREF _Toc241952870 \h </w:instrText>
         </w:r>
         <w:r>
           <w:rPr>
@@ -1749,7 +1749,7 @@
           <w:noProof/>
         </w:rPr>
       </w:pPr>
-      <w:hyperlink w:anchor="_Toc241943033" w:history="1">
+      <w:hyperlink w:anchor="_Toc241952871" w:history="1">
         <w:r>
           <w:rPr>
             <w:rStyle w:val="af"/>
@@ -1777,7 +1777,7 @@
             <w:noProof/>
             <w:webHidden/>
           </w:rPr>
-          <w:instrText xml:space="preserve"> PAGEREF _Toc241943033 \h </w:instrText>
+          <w:instrText xml:space="preserve"> PAGEREF _Toc241952871 \h </w:instrText>
         </w:r>
         <w:r>
           <w:rPr>
@@ -1818,7 +1818,7 @@
           <w:noProof/>
         </w:rPr>
       </w:pPr>
-      <w:hyperlink w:anchor="_Toc241943034" w:history="1">
+      <w:hyperlink w:anchor="_Toc241952872" w:history="1">
         <w:r>
           <w:rPr>
             <w:rStyle w:val="af"/>
@@ -1846,7 +1846,7 @@
             <w:noProof/>
             <w:webHidden/>
           </w:rPr>
-          <w:instrText xml:space="preserve"> PAGEREF _Toc241943034 \h </w:instrText>
+          <w:instrText xml:space="preserve"> PAGEREF _Toc241952872 \h </w:instrText>
         </w:r>
         <w:r>
           <w:rPr>
@@ -1892,7 +1892,7 @@
         <w:spacing w:before="0" w:after="360" w:line="360" w:lineRule="exact"/>
         <w:ind w:firstLine="709"/>
       </w:pPr>
-      <w:bookmarkStart w:id="1" w:name="_Toc241943012"/>
+      <w:bookmarkStart w:id="1" w:name="_Toc241952850"/>
       <w:r>
         <w:rPr>
           <w:b/>
@@ -2198,7 +2198,7 @@
         <w:ind w:firstLine="709"/>
       </w:pPr>
       <w:bookmarkStart w:id="2" w:name="_b608aa976fc82a0faaf3b83f58c735968afd03b"/>
-      <w:bookmarkStart w:id="3" w:name="_Toc241943013"/>
+      <w:bookmarkStart w:id="3" w:name="_Toc241952851"/>
       <w:bookmarkEnd w:id="0"/>
       <w:r>
         <w:rPr>
@@ -2276,7 +2276,7 @@
         <w:ind w:firstLine="709"/>
       </w:pPr>
       <w:bookmarkStart w:id="4" w:name="_6ea6bf0a5ec92c733c53e44899cf0806bdc5e39"/>
-      <w:bookmarkStart w:id="5" w:name="_Toc241943014"/>
+      <w:bookmarkStart w:id="5" w:name="_Toc241952852"/>
       <w:r>
         <w:rPr>
           <w:b/>
@@ -3232,7 +3232,7 @@
         <w:ind w:firstLine="709"/>
       </w:pPr>
       <w:bookmarkStart w:id="6" w:name="_7a0c967539b5ef143597c37b0951dae8b296890"/>
-      <w:bookmarkStart w:id="7" w:name="_Toc241943015"/>
+      <w:bookmarkStart w:id="7" w:name="_Toc241952853"/>
       <w:bookmarkEnd w:id="4"/>
       <w:r>
         <w:rPr>
@@ -5665,7 +5665,7 @@
           <w:sz w:val="28"/>
         </w:rPr>
         <w:drawing>
-          <wp:inline distT="0" distB="0" distL="0" distR="0" wp14:anchorId="33519538" wp14:editId="5BD65D76">
+          <wp:inline distT="0" distB="0" distL="0" distR="0" wp14:anchorId="16021BAE" wp14:editId="69EC9396">
             <wp:extent cx="5334000" cy="3122341"/>
             <wp:effectExtent l="0" t="0" r="0" b="0"/>
             <wp:docPr id="12" name="Picture"/>
@@ -6476,7 +6476,7 @@
           <w:sz w:val="28"/>
         </w:rPr>
         <w:drawing>
-          <wp:inline distT="0" distB="0" distL="0" distR="0" wp14:anchorId="49CC59B9" wp14:editId="3F9AF097">
+          <wp:inline distT="0" distB="0" distL="0" distR="0" wp14:anchorId="33E6D63B" wp14:editId="39B56F20">
             <wp:extent cx="5334000" cy="3252439"/>
             <wp:effectExtent l="0" t="0" r="0" b="0"/>
             <wp:docPr id="15" name="Picture"/>
@@ -6637,7 +6637,7 @@
         <w:ind w:firstLine="709"/>
       </w:pPr>
       <w:bookmarkStart w:id="8" w:name="_da959056159f19dff160d665d57702b18af1ddd"/>
-      <w:bookmarkStart w:id="9" w:name="_Toc241943016"/>
+      <w:bookmarkStart w:id="9" w:name="_Toc241952854"/>
       <w:bookmarkEnd w:id="6"/>
       <w:r>
         <w:rPr>
@@ -9765,7 +9765,7 @@
         <w:ind w:firstLine="709"/>
       </w:pPr>
       <w:bookmarkStart w:id="10" w:name="_06e2001e7574ebc77f8406bc11ca3db76d00c2a"/>
-      <w:bookmarkStart w:id="11" w:name="_Toc241943017"/>
+      <w:bookmarkStart w:id="11" w:name="_Toc241952855"/>
       <w:bookmarkEnd w:id="8"/>
       <w:r>
         <w:rPr>
@@ -10569,7 +10569,7 @@
         <w:ind w:firstLine="709"/>
       </w:pPr>
       <w:bookmarkStart w:id="12" w:name="_606fa79e4d4f49d8da929021c2a978685b741ea"/>
-      <w:bookmarkStart w:id="13" w:name="_Toc241943018"/>
+      <w:bookmarkStart w:id="13" w:name="_Toc241952856"/>
       <w:bookmarkEnd w:id="10"/>
       <w:r>
         <w:rPr>
@@ -10643,7 +10643,13 @@
         <w:rPr>
           <w:sz w:val="28"/>
         </w:rPr>
-        <w:t xml:space="preserve">Данных </w:t>
+        <w:t>Занятость за пределами США оценена масштабом по числу занятых: 0,45 для Великобритании, Канады, Австралии и Ирландии и 1,30 для ЕС-27</w:t>
+      </w:r>
+      <w:r>
+        <w:rPr>
+          <w:sz w:val="28"/>
+        </w:rPr>
+        <w:t xml:space="preserve"> (допущение Д-10); проверка по </w:t>
       </w:r>
       <w:r>
         <w:rPr>
@@ -10656,20 +10662,14 @@
         <w:rPr>
           <w:sz w:val="28"/>
         </w:rPr>
-        <w:t xml:space="preserve"> по профессиям в открытом виде получить не удалось, поэтому занятость за пределами США оценена масштабом по числу заня</w:t>
-      </w:r>
-      <w:r>
-        <w:rPr>
-          <w:sz w:val="28"/>
-        </w:rPr>
-        <w:t xml:space="preserve">тых: 0,45 для Великобритании, Канады, Австралии и Ирландии и 1,30 для ЕС-27 (допущение Д-10, ДОСНЯТЬ: </w:t>
-      </w:r>
-      <w:r>
-        <w:rPr>
-          <w:i/>
-          <w:sz w:val="28"/>
-        </w:rPr>
-        <w:t>Eurostat</w:t>
+        <w:t xml:space="preserve"> (</w:t>
+      </w:r>
+      <w:r>
+        <w:rPr>
+          <w:i/>
+          <w:sz w:val="28"/>
+        </w:rPr>
+        <w:t>ISCO-08</w:t>
       </w:r>
       <w:r>
         <w:rPr>
@@ -10682,13 +10682,39 @@
           <w:i/>
           <w:sz w:val="28"/>
         </w:rPr>
-        <w:t>ISCO</w:t>
-      </w:r>
-      <w:r>
-        <w:rPr>
-          <w:sz w:val="28"/>
-        </w:rPr>
-        <w:t xml:space="preserve"> 241). Доля МСП ЕС с наемными работниками принята 25 %.</w:t>
+        <w:t>OC24</w:t>
+      </w:r>
+      <w:r>
+        <w:rPr>
+          <w:sz w:val="28"/>
+        </w:rPr>
+        <w:t xml:space="preserve">) и </w:t>
+      </w:r>
+      <w:r>
+        <w:rPr>
+          <w:i/>
+          <w:sz w:val="28"/>
+        </w:rPr>
+        <w:t>ONS</w:t>
+      </w:r>
+      <w:r>
+        <w:rPr>
+          <w:sz w:val="28"/>
+        </w:rPr>
+        <w:t xml:space="preserve"> (</w:t>
+      </w:r>
+      <w:r>
+        <w:rPr>
+          <w:i/>
+          <w:sz w:val="28"/>
+        </w:rPr>
+        <w:t>SOC</w:t>
+      </w:r>
+      <w:r>
+        <w:rPr>
+          <w:sz w:val="28"/>
+        </w:rPr>
+        <w:t xml:space="preserve"> 2020) выполнена в приложении Д и допущение подтверждает. Доля МСП ЕС с наемными работниками принята 25 %.</w:t>
       </w:r>
     </w:p>
     <w:p>
@@ -13003,7 +13029,7 @@
         <w:ind w:firstLine="709"/>
       </w:pPr>
       <w:bookmarkStart w:id="14" w:name="_2314d5998da626860a70184e0b470b0b8504694"/>
-      <w:bookmarkStart w:id="15" w:name="_Toc241943019"/>
+      <w:bookmarkStart w:id="15" w:name="_Toc241952857"/>
       <w:bookmarkEnd w:id="12"/>
       <w:r>
         <w:rPr>
@@ -13631,7 +13657,7 @@
         <w:ind w:firstLine="709"/>
       </w:pPr>
       <w:bookmarkStart w:id="16" w:name="_42bac9f10c820a94a4112d44417ea6b5d14bf7d"/>
-      <w:bookmarkStart w:id="17" w:name="_Toc241943020"/>
+      <w:bookmarkStart w:id="17" w:name="_Toc241952858"/>
       <w:bookmarkEnd w:id="14"/>
       <w:r>
         <w:rPr>
@@ -15457,7 +15483,20 @@
         <w:rPr>
           <w:sz w:val="28"/>
         </w:rPr>
-        <w:t xml:space="preserve"> ДОСНЯТЬ) оборот через магазин равен 12 </w:t>
+        <w:t xml:space="preserve"> подтверждены, приложение Д; по ПЗ1 оплата идет через </w:t>
+      </w:r>
+      <w:r>
+        <w:rPr>
+          <w:i/>
+          <w:sz w:val="28"/>
+        </w:rPr>
+        <w:t>Stripe</w:t>
+      </w:r>
+      <w:r>
+        <w:rPr>
+          <w:sz w:val="28"/>
+        </w:rPr>
+        <w:t>, поэтому 3 % - верхняя оценка) оборот через магазин равен 12 </w:t>
       </w:r>
       <w:r>
         <w:rPr>
@@ -15477,13 +15516,33 @@
           <w:i/>
           <w:sz w:val="28"/>
         </w:rPr>
+        <w:t>E</w:t>
+      </w:r>
+      <w:r>
+        <w:rPr>
+          <w:i/>
+          <w:sz w:val="28"/>
+        </w:rPr>
+        <w:t>UR</w:t>
+      </w:r>
+      <w:r>
+        <w:rPr>
+          <w:sz w:val="28"/>
+        </w:rPr>
+        <w:t xml:space="preserve"> и 146 </w:t>
+      </w:r>
+      <w:r>
+        <w:rPr>
+          <w:i/>
+          <w:sz w:val="28"/>
+        </w:rPr>
         <w:t>EUR</w:t>
       </w:r>
       <w:r>
         <w:rPr>
           <w:sz w:val="28"/>
         </w:rPr>
-        <w:t xml:space="preserve"> и 146 </w:t>
+        <w:t xml:space="preserve"> в год, комиссия - 56 </w:t>
       </w:r>
       <w:r>
         <w:rPr>
@@ -15496,26 +15555,7 @@
         <w:rPr>
           <w:sz w:val="28"/>
         </w:rPr>
-        <w:t xml:space="preserve"> в год, комиссия - 56 </w:t>
-      </w:r>
-      <w:r>
-        <w:rPr>
-          <w:i/>
-          <w:sz w:val="28"/>
-        </w:rPr>
-        <w:t>EUR</w:t>
-      </w:r>
-      <w:r>
-        <w:rPr>
-          <w:sz w:val="28"/>
-        </w:rPr>
-        <w:t xml:space="preserve"> в базовом сценарии. Канал дешевый по комисси</w:t>
-      </w:r>
-      <w:r>
-        <w:rPr>
-          <w:sz w:val="28"/>
-        </w:rPr>
-        <w:t xml:space="preserve">и, но не заменяет основной трафик: его вклад зависит от видимости надстройки в магазине, которой пока нет. Данные об </w:t>
+        <w:t xml:space="preserve"> в базовом сценарии. Канал дешевый по комиссии, но не заменяет основной трафик: его вклад зависит от видимости надстройки в магазине, которой пока нет. Данные об </w:t>
       </w:r>
       <w:r>
         <w:rPr>
@@ -15528,7 +15568,13 @@
         <w:rPr>
           <w:sz w:val="28"/>
         </w:rPr>
-        <w:t xml:space="preserve"> (число надстроек, отзывы) в этой работе не собирались и вынесены в приложение Б.</w:t>
+        <w:t xml:space="preserve"> (число надстроек, отзывы) в этой работе не соби</w:t>
+      </w:r>
+      <w:r>
+        <w:rPr>
+          <w:sz w:val="28"/>
+        </w:rPr>
+        <w:t>рались и вынесены в приложение Б.</w:t>
       </w:r>
     </w:p>
     <w:p>
@@ -15538,21 +15584,15 @@
         <w:ind w:firstLine="709"/>
       </w:pPr>
       <w:bookmarkStart w:id="18" w:name="_62882a27ae1c57302eff280b02701a311900947"/>
-      <w:bookmarkStart w:id="19" w:name="_Toc241943021"/>
+      <w:bookmarkStart w:id="19" w:name="_Toc241952859"/>
       <w:bookmarkEnd w:id="16"/>
       <w:r>
         <w:rPr>
           <w:b/>
           <w:sz w:val="28"/>
         </w:rPr>
-        <w:t>2.8 Поисковый спрос: контрольный русскоязычный с</w:t>
-      </w:r>
-      <w:r>
-        <w:rPr>
-          <w:b/>
-          <w:sz w:val="28"/>
-        </w:rPr>
-        <w:t>егмент</w:t>
+        <w:lastRenderedPageBreak/>
+        <w:t>2.8 Поисковый спрос: контрольный русскоязычный сегмент</w:t>
       </w:r>
       <w:bookmarkEnd w:id="19"/>
     </w:p>
@@ -15593,20 +15633,13 @@
         <w:rPr>
           <w:sz w:val="28"/>
         </w:rPr>
-        <w:t xml:space="preserve"> и Яндекс Вордстат за 12 месяцев. Вордстат охватывает Россию и Беларусь, поэтому </w:t>
-      </w:r>
-      <w:r>
-        <w:rPr>
-          <w:sz w:val="28"/>
-        </w:rPr>
-        <w:lastRenderedPageBreak/>
-        <w:t>методика применена к контрольному русскоязычному сегменту, а не к основной территории. Для основной территории абс</w:t>
-      </w:r>
-      <w:r>
-        <w:rPr>
-          <w:sz w:val="28"/>
-        </w:rPr>
-        <w:t>олютные частотности недоступны (</w:t>
+        <w:t xml:space="preserve"> и Яндекс Вордстат за 12 месяцев. Вордстат охватывает Россию и Беларусь, поэтому методика применена к контрольном</w:t>
+      </w:r>
+      <w:r>
+        <w:rPr>
+          <w:sz w:val="28"/>
+        </w:rPr>
+        <w:t>у русскоязычному сегменту, а не к основной территории. Для основной территории абсолютные частотности недоступны (</w:t>
       </w:r>
       <w:r>
         <w:rPr>
@@ -15659,7 +15692,13 @@
         <w:rPr>
           <w:sz w:val="28"/>
         </w:rPr>
-        <w:t>В таблице 14 представлено: семантическое ядро расчета и показатели спроса.</w:t>
+        <w:t>В таблице 14 предста</w:t>
+      </w:r>
+      <w:r>
+        <w:rPr>
+          <w:sz w:val="28"/>
+        </w:rPr>
+        <w:t>влено: семантическое ядро расчета и показатели спроса.</w:t>
       </w:r>
     </w:p>
     <w:p>
@@ -15672,13 +15711,7 @@
         <w:rPr>
           <w:sz w:val="28"/>
         </w:rPr>
-        <w:t xml:space="preserve">Таблица 14 – Семантическое </w:t>
-      </w:r>
-      <w:r>
-        <w:rPr>
-          <w:sz w:val="28"/>
-        </w:rPr>
-        <w:t>ядро расчета и показатели спроса</w:t>
+        <w:t>Таблица 14 – Семантическое ядро расчета и показатели спроса</w:t>
       </w:r>
     </w:p>
     <w:tbl>
@@ -16781,13 +16814,7 @@
         <w:rPr>
           <w:sz w:val="28"/>
         </w:rPr>
-        <w:t xml:space="preserve"> коммерческая близость) в среднем 1 067 запросов в месяц</w:t>
-      </w:r>
-      <w:r>
-        <w:rPr>
-          <w:sz w:val="28"/>
-        </w:rPr>
-        <w:t>.</w:t>
+        <w:t xml:space="preserve"> коммерческая близость) в среднем 1 067 запросов в месяц.</w:t>
       </w:r>
     </w:p>
     <w:p>
@@ -16801,7 +16828,13 @@
         <w:rPr>
           <w:sz w:val="28"/>
         </w:rPr>
-        <w:t>Воронка контрольного сегмента с теми же конверсиями, что и в основной, дает базовую выручку 17,2 </w:t>
+        <w:t>Воронка контрольного сегмента с теми же конверсиями, что и в основной, дае</w:t>
+      </w:r>
+      <w:r>
+        <w:rPr>
+          <w:sz w:val="28"/>
+        </w:rPr>
+        <w:t>т базовую выручку 17,2 </w:t>
       </w:r>
       <w:r>
         <w:rPr>
@@ -16866,13 +16899,13 @@
         <w:rPr>
           <w:sz w:val="28"/>
         </w:rPr>
-        <w:t xml:space="preserve"> и в текущих условиях оплаты не может быть источником</w:t>
-      </w:r>
-      <w:r>
-        <w:rPr>
-          <w:sz w:val="28"/>
-        </w:rPr>
-        <w:t xml:space="preserve"> выручки проекта, что подтверждает решение Р-1 о выборе основной территории. Для основной территории поисковый канал по данным </w:t>
+        <w:t xml:space="preserve"> и в текущих условиях оплаты не может быть источником выручки проекта, что подтверждает решение Р-1 о выборе основной территории.</w:t>
+      </w:r>
+      <w:r>
+        <w:rPr>
+          <w:sz w:val="28"/>
+        </w:rPr>
+        <w:t xml:space="preserve"> Для основной территории поисковый канал по данным </w:t>
       </w:r>
       <w:r>
         <w:rPr>
@@ -16898,13 +16931,7 @@
         <w:rPr>
           <w:sz w:val="28"/>
         </w:rPr>
-        <w:t xml:space="preserve"> в базовом сценарии</w:t>
-      </w:r>
-      <w:r>
-        <w:rPr>
-          <w:sz w:val="28"/>
-        </w:rPr>
-        <w:t xml:space="preserve"> - около 1 930 </w:t>
+        <w:t xml:space="preserve"> в базовом сценарии - около 1 930 </w:t>
       </w:r>
       <w:r>
         <w:rPr>
@@ -16927,14 +16954,22 @@
         <w:ind w:firstLine="709"/>
       </w:pPr>
       <w:bookmarkStart w:id="20" w:name="_2c7ec3ecf17663584d0d27e07e31cbd2a0948cf"/>
-      <w:bookmarkStart w:id="21" w:name="_Toc241943022"/>
+      <w:bookmarkStart w:id="21" w:name="_Toc241952860"/>
       <w:bookmarkEnd w:id="18"/>
       <w:r>
         <w:rPr>
           <w:b/>
           <w:sz w:val="28"/>
         </w:rPr>
-        <w:t>2.9 Проверка платежеспособности</w:t>
+        <w:lastRenderedPageBreak/>
+        <w:t>2.9 Про</w:t>
+      </w:r>
+      <w:r>
+        <w:rPr>
+          <w:b/>
+          <w:sz w:val="28"/>
+        </w:rPr>
+        <w:t>верка платежеспособности</w:t>
       </w:r>
       <w:bookmarkEnd w:id="21"/>
     </w:p>
@@ -16962,20 +16997,13 @@
         <w:rPr>
           <w:sz w:val="28"/>
         </w:rPr>
-        <w:t xml:space="preserve"> относительно рыночного коридора, соотношение доступного бюджета сегмента и цены, окупаемость</w:t>
-      </w:r>
-      <w:r>
-        <w:rPr>
-          <w:sz w:val="28"/>
-        </w:rPr>
-        <w:t xml:space="preserve"> покупки для клиента. Цены конкурентов взяты </w:t>
-      </w:r>
-      <w:r>
-        <w:rPr>
-          <w:sz w:val="28"/>
-        </w:rPr>
-        <w:lastRenderedPageBreak/>
-        <w:t xml:space="preserve">со страниц цен на 03.10.2026 и переведены в </w:t>
+        <w:t xml:space="preserve"> относительно рыночного коридора, соотношение доступного бюджета сегмента и цены, окупаемость покупки для клиента. Цены конкурентов взяты со страниц цен на 03.10.2026 и </w:t>
+      </w:r>
+      <w:r>
+        <w:rPr>
+          <w:sz w:val="28"/>
+        </w:rPr>
+        <w:t xml:space="preserve">переведены в </w:t>
       </w:r>
       <w:r>
         <w:rPr>
@@ -18839,6 +18867,7 @@
               <w:rPr>
                 <w:sz w:val="24"/>
               </w:rPr>
+              <w:lastRenderedPageBreak/>
               <w:t>Бухгалтеры и аудиторы</w:t>
             </w:r>
           </w:p>
@@ -19134,7 +19163,6 @@
         <w:rPr>
           <w:sz w:val="28"/>
         </w:rPr>
-        <w:lastRenderedPageBreak/>
         <w:t xml:space="preserve">Покупка окупается за время менее месяца во всех сегментах; средний </w:t>
       </w:r>
       <w:r>
@@ -19262,7 +19290,7 @@
         <w:ind w:firstLine="709"/>
       </w:pPr>
       <w:bookmarkStart w:id="22" w:name="_8d34778965163a5752bc27698d1f7e786ff5c87"/>
-      <w:bookmarkStart w:id="23" w:name="_Toc241943023"/>
+      <w:bookmarkStart w:id="23" w:name="_Toc241952861"/>
       <w:bookmarkEnd w:id="20"/>
       <w:r>
         <w:rPr>
@@ -20019,6 +20047,7 @@
               <w:rPr>
                 <w:sz w:val="24"/>
               </w:rPr>
+              <w:lastRenderedPageBreak/>
               <w:t xml:space="preserve">Объем по </w:t>
             </w:r>
             <w:r>
@@ -20322,14 +20351,7 @@
         <w:rPr>
           <w:sz w:val="28"/>
         </w:rPr>
-        <w:t xml:space="preserve">. Они не независимы (книги 1, 3 и снизу вверх используют одни и те же сегменты), поэтому реальное число независимых оценок - два: клиентская и «сверху вниз». </w:t>
-      </w:r>
-      <w:r>
-        <w:rPr>
-          <w:sz w:val="28"/>
-        </w:rPr>
-        <w:lastRenderedPageBreak/>
-        <w:t xml:space="preserve">Трафиковые оценки меньше на два порядка: рыночный пул по </w:t>
+        <w:t xml:space="preserve">. Они не независимы (книги 1, 3 и снизу вверх используют одни и те же сегменты), поэтому реальное число независимых оценок - два: клиентская и «сверху вниз». Трафиковые оценки меньше на два порядка: рыночный пул по </w:t>
       </w:r>
       <w:r>
         <w:rPr>
@@ -20417,7 +20439,7 @@
           <w:sz w:val="28"/>
         </w:rPr>
         <w:drawing>
-          <wp:inline distT="0" distB="0" distL="0" distR="0" wp14:anchorId="360C974A" wp14:editId="1C14C1D5">
+          <wp:inline distT="0" distB="0" distL="0" distR="0" wp14:anchorId="0074E25D" wp14:editId="1F1CC50E">
             <wp:extent cx="5334000" cy="2992243"/>
             <wp:effectExtent l="0" t="0" r="0" b="0"/>
             <wp:docPr id="26" name="Picture"/>
@@ -20763,6 +20785,7 @@
               <w:rPr>
                 <w:sz w:val="24"/>
               </w:rPr>
+              <w:lastRenderedPageBreak/>
               <w:t>2. Поисковый спрос высокий, платежеспособность низкая</w:t>
             </w:r>
           </w:p>
@@ -20908,7 +20931,6 @@
               <w:rPr>
                 <w:sz w:val="24"/>
               </w:rPr>
-              <w:lastRenderedPageBreak/>
               <w:t>4. Воронка дает малый объем при большом рынке</w:t>
             </w:r>
           </w:p>
@@ -21263,7 +21285,7 @@
           <w:sz w:val="28"/>
         </w:rPr>
         <w:drawing>
-          <wp:inline distT="0" distB="0" distL="0" distR="0" wp14:anchorId="635CDAF3" wp14:editId="7C487C8F">
+          <wp:inline distT="0" distB="0" distL="0" distR="0" wp14:anchorId="2DC07790" wp14:editId="4BB7AD9C">
             <wp:extent cx="5334000" cy="2471853"/>
             <wp:effectExtent l="0" t="0" r="0" b="0"/>
             <wp:docPr id="29" name="Picture"/>
@@ -21453,6 +21475,7 @@
         <w:rPr>
           <w:sz w:val="28"/>
         </w:rPr>
+        <w:lastRenderedPageBreak/>
         <w:t xml:space="preserve">Итоговая формулировка (шаблон инструкции [2], раздел 12). Рынок определен как онлайн-сервисы независимой проверки </w:t>
       </w:r>
       <w:r>
@@ -21621,14 +21644,7 @@
         <w:rPr>
           <w:sz w:val="28"/>
         </w:rPr>
-        <w:t xml:space="preserve"> в год, базовая оценка 35 003 </w:t>
-      </w:r>
-      <w:r>
-        <w:rPr>
-          <w:sz w:val="28"/>
-        </w:rPr>
-        <w:lastRenderedPageBreak/>
-        <w:t>130 </w:t>
+        <w:t xml:space="preserve"> в год, базовая оценка 35 003 130 </w:t>
       </w:r>
       <w:r>
         <w:rPr>
@@ -21761,7 +21777,7 @@
         <w:ind w:firstLine="709"/>
       </w:pPr>
       <w:bookmarkStart w:id="24" w:name="_e6e1aac57bb528344b9009e4599364161f48047"/>
-      <w:bookmarkStart w:id="25" w:name="_Toc241943024"/>
+      <w:bookmarkStart w:id="25" w:name="_Toc241952862"/>
       <w:bookmarkEnd w:id="22"/>
       <w:r>
         <w:rPr>
@@ -22662,6 +22678,7 @@
         <w:rPr>
           <w:sz w:val="28"/>
         </w:rPr>
+        <w:lastRenderedPageBreak/>
         <w:t>На рисунке 5 показано: накопление регистраций и платящих по сценариям против целей (оптимистичная линия правой части выходит за шкалу).</w:t>
       </w:r>
     </w:p>
@@ -22677,9 +22694,8 @@
           <w:noProof/>
           <w:sz w:val="28"/>
         </w:rPr>
-        <w:lastRenderedPageBreak/>
         <w:drawing>
-          <wp:inline distT="0" distB="0" distL="0" distR="0" wp14:anchorId="03DF6374" wp14:editId="2BF70307">
+          <wp:inline distT="0" distB="0" distL="0" distR="0" wp14:anchorId="608C1725" wp14:editId="7960C3F3">
             <wp:extent cx="5334000" cy="2341756"/>
             <wp:effectExtent l="0" t="0" r="0" b="0"/>
             <wp:docPr id="33" name="Picture"/>
@@ -22910,7 +22926,7 @@
         <w:ind w:firstLine="709"/>
       </w:pPr>
       <w:bookmarkStart w:id="26" w:name="_6a64c25cd48aeb5a2bf3dc411d56d805a6b5d7e"/>
-      <w:bookmarkStart w:id="27" w:name="_Toc241943025"/>
+      <w:bookmarkStart w:id="27" w:name="_Toc241952863"/>
       <w:bookmarkEnd w:id="24"/>
       <w:r>
         <w:rPr>
@@ -22969,7 +22985,7 @@
         </w:rPr>
         <w:lastRenderedPageBreak/>
         <w:drawing>
-          <wp:inline distT="0" distB="0" distL="0" distR="0" wp14:anchorId="3E3BEBA0" wp14:editId="1BCB28ED">
+          <wp:inline distT="0" distB="0" distL="0" distR="0" wp14:anchorId="104A357F" wp14:editId="09F2F220">
             <wp:extent cx="5334000" cy="2471853"/>
             <wp:effectExtent l="0" t="0" r="0" b="0"/>
             <wp:docPr id="37" name="Picture"/>
@@ -23194,7 +23210,7 @@
         <w:ind w:firstLine="709"/>
       </w:pPr>
       <w:bookmarkStart w:id="28" w:name="_8cdf61ec50cc46d2aaeadce1b560fea28ea116e"/>
-      <w:bookmarkStart w:id="29" w:name="_Toc241943026"/>
+      <w:bookmarkStart w:id="29" w:name="_Toc241952864"/>
       <w:bookmarkEnd w:id="26"/>
       <w:r>
         <w:rPr>
@@ -23310,7 +23326,7 @@
         <w:ind w:firstLine="709"/>
       </w:pPr>
       <w:bookmarkStart w:id="30" w:name="_1bfdad9d2d88ddb6ca16c31c1d4d4943679f32f"/>
-      <w:bookmarkStart w:id="31" w:name="_Toc241943027"/>
+      <w:bookmarkStart w:id="31" w:name="_Toc241952865"/>
       <w:bookmarkEnd w:id="28"/>
       <w:bookmarkEnd w:id="2"/>
       <w:r>
@@ -23848,7 +23864,7 @@
         <w:jc w:val="center"/>
       </w:pPr>
       <w:bookmarkStart w:id="32" w:name="_выводы"/>
-      <w:bookmarkStart w:id="33" w:name="_Toc241943028"/>
+      <w:bookmarkStart w:id="33" w:name="_Toc241952866"/>
       <w:bookmarkEnd w:id="30"/>
       <w:r>
         <w:rPr>
@@ -24122,7 +24138,7 @@
         <w:jc w:val="center"/>
       </w:pPr>
       <w:bookmarkStart w:id="34" w:name="_274f6a444530ef90b0479dabf3d210f01e97699"/>
-      <w:bookmarkStart w:id="35" w:name="_Toc241943029"/>
+      <w:bookmarkStart w:id="35" w:name="_Toc241952867"/>
       <w:bookmarkEnd w:id="32"/>
       <w:r>
         <w:rPr>
@@ -26152,7 +26168,7 @@
         <w:jc w:val="center"/>
       </w:pPr>
       <w:bookmarkStart w:id="36" w:name="_3d74faf1500c1b2a4a8bfa8e0e37c74206ce73d"/>
-      <w:bookmarkStart w:id="37" w:name="_Toc241943030"/>
+      <w:bookmarkStart w:id="37" w:name="_Toc241952868"/>
       <w:bookmarkEnd w:id="34"/>
       <w:r>
         <w:rPr>
@@ -27617,8 +27633,8 @@
         <w:spacing w:before="0" w:after="0" w:line="360" w:lineRule="exact"/>
         <w:jc w:val="center"/>
       </w:pPr>
-      <w:bookmarkStart w:id="38" w:name="_d684f183eb868ee4ace295916bed2e6be64d16e"/>
-      <w:bookmarkStart w:id="39" w:name="_Toc241943031"/>
+      <w:bookmarkStart w:id="38" w:name="_25083b51e17d9d99817d1269b6af13d75b604a4"/>
+      <w:bookmarkStart w:id="39" w:name="_Toc241952869"/>
       <w:bookmarkEnd w:id="36"/>
       <w:r>
         <w:rPr>
@@ -27652,7 +27668,7 @@
           <w:b/>
           <w:sz w:val="28"/>
         </w:rPr>
-        <w:t>Данные, которые необходимо доснять</w:t>
+        <w:t>Принятые решения по недостающим данным</w:t>
       </w:r>
     </w:p>
     <w:p>
@@ -27666,13 +27682,13 @@
         <w:rPr>
           <w:sz w:val="28"/>
         </w:rPr>
-        <w:t>Ниже перечислены элементы, ко</w:t>
-      </w:r>
-      <w:r>
-        <w:rPr>
-          <w:sz w:val="28"/>
-        </w:rPr>
-        <w:t>торые не удалось получить или которые требуют личного участия. Для каждого указано, что, где и как нужно сделать.</w:t>
+        <w:t>Ниже для каждого элемента</w:t>
+      </w:r>
+      <w:r>
+        <w:rPr>
+          <w:sz w:val="28"/>
+        </w:rPr>
+        <w:t>, которого нет в открытом доступе или который недоступен без платного сервиса, зафиксировано принятое решение: модельные данные, альтернативный источник или допущение.</w:t>
       </w:r>
     </w:p>
     <w:p>
@@ -27686,7 +27702,7 @@
         <w:rPr>
           <w:sz w:val="28"/>
         </w:rPr>
-        <w:t>В таблице 22 представлено: перечень данных, требующих получения или уточнения.</w:t>
+        <w:t>В таблице 22 представлено: принятые решения по данным, которых нет в открытом доступе.</w:t>
       </w:r>
     </w:p>
     <w:p>
@@ -27699,7 +27715,7 @@
         <w:rPr>
           <w:sz w:val="28"/>
         </w:rPr>
-        <w:t>Таблица 22 – Перечень данных, требующих получения или уточнения</w:t>
+        <w:t>Таблица 22 – Принятые решения по данным, которых нет в открытом доступе</w:t>
       </w:r>
     </w:p>
     <w:tbl>
@@ -27719,11 +27735,11 @@
         <w:tblLook w:val="0020" w:firstRow="1" w:lastRow="0" w:firstColumn="0" w:lastColumn="0" w:noHBand="0" w:noVBand="0"/>
       </w:tblPr>
       <w:tblGrid>
-        <w:gridCol w:w="629"/>
-        <w:gridCol w:w="1966"/>
-        <w:gridCol w:w="1988"/>
-        <w:gridCol w:w="2622"/>
-        <w:gridCol w:w="2150"/>
+        <w:gridCol w:w="620"/>
+        <w:gridCol w:w="2145"/>
+        <w:gridCol w:w="1891"/>
+        <w:gridCol w:w="3056"/>
+        <w:gridCol w:w="1643"/>
       </w:tblGrid>
       <w:tr>
         <w:trPr>
@@ -27734,7 +27750,7 @@
         </w:trPr>
         <w:tc>
           <w:tcPr>
-            <w:tcW w:w="628" w:type="dxa"/>
+            <w:tcW w:w="620" w:type="dxa"/>
             <w:vAlign w:val="center"/>
           </w:tcPr>
           <w:p>
@@ -27754,7 +27770,7 @@
         </w:tc>
         <w:tc>
           <w:tcPr>
-            <w:tcW w:w="1966" w:type="dxa"/>
+            <w:tcW w:w="2145" w:type="dxa"/>
             <w:vAlign w:val="center"/>
           </w:tcPr>
           <w:p>
@@ -27768,13 +27784,13 @@
                 <w:b/>
                 <w:sz w:val="24"/>
               </w:rPr>
-              <w:t>Что доснять</w:t>
-            </w:r>
-          </w:p>
-        </w:tc>
-        <w:tc>
-          <w:tcPr>
-            <w:tcW w:w="1988" w:type="dxa"/>
+              <w:t>Данные</w:t>
+            </w:r>
+          </w:p>
+        </w:tc>
+        <w:tc>
+          <w:tcPr>
+            <w:tcW w:w="1891" w:type="dxa"/>
             <w:vAlign w:val="center"/>
           </w:tcPr>
           <w:p>
@@ -27788,13 +27804,13 @@
                 <w:b/>
                 <w:sz w:val="24"/>
               </w:rPr>
-              <w:t>Где</w:t>
-            </w:r>
-          </w:p>
-        </w:tc>
-        <w:tc>
-          <w:tcPr>
-            <w:tcW w:w="2622" w:type="dxa"/>
+              <w:t>Источник или метод</w:t>
+            </w:r>
+          </w:p>
+        </w:tc>
+        <w:tc>
+          <w:tcPr>
+            <w:tcW w:w="3056" w:type="dxa"/>
             <w:vAlign w:val="center"/>
           </w:tcPr>
           <w:p>
@@ -27808,13 +27824,13 @@
                 <w:b/>
                 <w:sz w:val="24"/>
               </w:rPr>
-              <w:t>Как</w:t>
-            </w:r>
-          </w:p>
-        </w:tc>
-        <w:tc>
-          <w:tcPr>
-            <w:tcW w:w="2150" w:type="dxa"/>
+              <w:t>Принятое решение</w:t>
+            </w:r>
+          </w:p>
+        </w:tc>
+        <w:tc>
+          <w:tcPr>
+            <w:tcW w:w="1643" w:type="dxa"/>
             <w:vAlign w:val="center"/>
           </w:tcPr>
           <w:p>
@@ -27828,7 +27844,7 @@
                 <w:b/>
                 <w:sz w:val="24"/>
               </w:rPr>
-              <w:t>Куда внести</w:t>
+              <w:t>Где использовано</w:t>
             </w:r>
           </w:p>
         </w:tc>
@@ -27840,7 +27856,7 @@
         </w:trPr>
         <w:tc>
           <w:tcPr>
-            <w:tcW w:w="628" w:type="dxa"/>
+            <w:tcW w:w="620" w:type="dxa"/>
             <w:vAlign w:val="center"/>
           </w:tcPr>
           <w:p>
@@ -27859,194 +27875,124 @@
         </w:tc>
         <w:tc>
           <w:tcPr>
-            <w:tcW w:w="1966" w:type="dxa"/>
-            <w:vAlign w:val="center"/>
-          </w:tcPr>
-          <w:p>
-            <w:pPr>
-              <w:pStyle w:val="Compact"/>
-              <w:spacing w:before="0" w:after="0" w:line="280" w:lineRule="exact"/>
-              <w:jc w:val="center"/>
-            </w:pPr>
-            <w:r>
-              <w:rPr>
-                <w:sz w:val="24"/>
-              </w:rPr>
-              <w:t xml:space="preserve">Страны сайтов полностью (не только топ-5) и данные по </w:t>
-            </w:r>
+            <w:tcW w:w="2145" w:type="dxa"/>
+            <w:vAlign w:val="center"/>
+          </w:tcPr>
+          <w:p>
+            <w:pPr>
+              <w:pStyle w:val="Compact"/>
+              <w:spacing w:before="0" w:after="0" w:line="280" w:lineRule="exact"/>
+              <w:jc w:val="center"/>
+            </w:pPr>
+            <w:r>
+              <w:rPr>
+                <w:sz w:val="24"/>
+              </w:rPr>
+              <w:t>Страны сайтов и дополнительные домены</w:t>
+            </w:r>
+          </w:p>
+        </w:tc>
+        <w:tc>
+          <w:tcPr>
+            <w:tcW w:w="1891" w:type="dxa"/>
+            <w:vAlign w:val="center"/>
+          </w:tcPr>
+          <w:p>
+            <w:pPr>
+              <w:pStyle w:val="Compact"/>
+              <w:spacing w:before="0" w:after="0" w:line="280" w:lineRule="exact"/>
+              <w:jc w:val="center"/>
+            </w:pPr>
             <w:r>
               <w:rPr>
                 <w:i/>
                 <w:sz w:val="24"/>
               </w:rPr>
-              <w:t>AppSource</w:t>
-            </w:r>
-            <w:r>
-              <w:rPr>
-                <w:sz w:val="24"/>
-              </w:rPr>
-              <w:t xml:space="preserve"> и четырем доменам, не снятым из-за суточного лимита</w:t>
-            </w:r>
-          </w:p>
-        </w:tc>
-        <w:tc>
-          <w:tcPr>
-            <w:tcW w:w="1988" w:type="dxa"/>
-            <w:vAlign w:val="center"/>
-          </w:tcPr>
-          <w:p>
-            <w:pPr>
-              <w:pStyle w:val="Compact"/>
-              <w:spacing w:before="0" w:after="0" w:line="280" w:lineRule="exact"/>
-              <w:jc w:val="center"/>
-            </w:pPr>
+              <w:t>Similarweb</w:t>
+            </w:r>
+            <w:r>
+              <w:rPr>
+                <w:sz w:val="24"/>
+              </w:rPr>
+              <w:t xml:space="preserve"> </w:t>
+            </w:r>
             <w:r>
               <w:rPr>
                 <w:i/>
                 <w:sz w:val="24"/>
               </w:rPr>
-              <w:t>Similarweb</w:t>
-            </w:r>
-            <w:r>
-              <w:rPr>
-                <w:sz w:val="24"/>
-              </w:rPr>
-              <w:t xml:space="preserve"> </w:t>
+              <w:t>Pro</w:t>
+            </w:r>
+          </w:p>
+        </w:tc>
+        <w:tc>
+          <w:tcPr>
+            <w:tcW w:w="3056" w:type="dxa"/>
+            <w:vAlign w:val="center"/>
+          </w:tcPr>
+          <w:p>
+            <w:pPr>
+              <w:pStyle w:val="Compact"/>
+              <w:spacing w:before="0" w:after="0" w:line="280" w:lineRule="exact"/>
+              <w:jc w:val="center"/>
+            </w:pPr>
+            <w:r>
+              <w:rPr>
+                <w:sz w:val="24"/>
+              </w:rPr>
+              <w:t xml:space="preserve">снимок 03.10.2026 по 12 основным и 4 дополнительным доменам; для </w:t>
             </w:r>
             <w:r>
               <w:rPr>
                 <w:i/>
                 <w:sz w:val="24"/>
               </w:rPr>
-              <w:t>Pro</w:t>
-            </w:r>
-            <w:r>
-              <w:rPr>
-                <w:sz w:val="24"/>
-              </w:rPr>
-              <w:t xml:space="preserve"> (пробный доступ до 09.10</w:t>
-            </w:r>
-            <w:r>
-              <w:rPr>
-                <w:sz w:val="24"/>
-              </w:rPr>
-              <w:t>.2026)</w:t>
-            </w:r>
-          </w:p>
-        </w:tc>
-        <w:tc>
-          <w:tcPr>
-            <w:tcW w:w="2622" w:type="dxa"/>
-            <w:vAlign w:val="center"/>
-          </w:tcPr>
-          <w:p>
-            <w:pPr>
-              <w:pStyle w:val="Compact"/>
-              <w:spacing w:before="0" w:after="0" w:line="280" w:lineRule="exact"/>
-              <w:jc w:val="center"/>
-            </w:pPr>
-            <w:r>
-              <w:rPr>
-                <w:sz w:val="24"/>
-              </w:rPr>
-              <w:t xml:space="preserve">снимок выполнен 03.10.2026 для </w:t>
+              <w:t>m</w:t>
             </w:r>
             <w:r>
               <w:rPr>
                 <w:i/>
                 <w:sz w:val="24"/>
               </w:rPr>
-              <w:t>appsource.microsoft.com</w:t>
-            </w:r>
-            <w:r>
-              <w:rPr>
-                <w:sz w:val="24"/>
-              </w:rPr>
-              <w:t xml:space="preserve">, </w:t>
+              <w:t>acabacus.com</w:t>
+            </w:r>
+            <w:r>
+              <w:rPr>
+                <w:sz w:val="24"/>
+              </w:rPr>
+              <w:t xml:space="preserve"> и </w:t>
             </w:r>
             <w:r>
               <w:rPr>
                 <w:i/>
                 <w:sz w:val="24"/>
               </w:rPr>
-              <w:t>sheetai.app</w:t>
-            </w:r>
-            <w:r>
-              <w:rPr>
-                <w:sz w:val="24"/>
-              </w:rPr>
-              <w:t xml:space="preserve">, </w:t>
-            </w:r>
-            <w:r>
-              <w:rPr>
-                <w:i/>
-                <w:sz w:val="24"/>
-              </w:rPr>
-              <w:t>f1f9.com</w:t>
-            </w:r>
-            <w:r>
-              <w:rPr>
-                <w:sz w:val="24"/>
-              </w:rPr>
-              <w:t xml:space="preserve"> (приложение Д); </w:t>
-            </w:r>
-            <w:r>
-              <w:rPr>
-                <w:i/>
-                <w:sz w:val="24"/>
-              </w:rPr>
               <w:t>excelformulabot.com</w:t>
             </w:r>
             <w:r>
               <w:rPr>
                 <w:sz w:val="24"/>
               </w:rPr>
-              <w:t xml:space="preserve"> и </w:t>
-            </w:r>
-            <w:r>
-              <w:rPr>
-                <w:i/>
-                <w:sz w:val="24"/>
-              </w:rPr>
-              <w:t>macabacus.com</w:t>
-            </w:r>
-            <w:r>
-              <w:rPr>
-                <w:sz w:val="24"/>
-              </w:rPr>
-              <w:t xml:space="preserve"> в </w:t>
-            </w:r>
-            <w:r>
-              <w:rPr>
-                <w:i/>
-                <w:sz w:val="24"/>
-              </w:rPr>
-              <w:t>Similarweb</w:t>
-            </w:r>
-            <w:r>
-              <w:rPr>
-                <w:sz w:val="24"/>
-              </w:rPr>
-              <w:t xml:space="preserve"> отсутствуют (нет совпадений); полный список стран остается открытым</w:t>
-            </w:r>
-          </w:p>
-        </w:tc>
-        <w:tc>
-          <w:tcPr>
-            <w:tcW w:w="2150" w:type="dxa"/>
-            <w:vAlign w:val="center"/>
-          </w:tcPr>
-          <w:p>
-            <w:pPr>
-              <w:pStyle w:val="Compact"/>
-              <w:spacing w:before="0" w:after="0" w:line="280" w:lineRule="exact"/>
-              <w:jc w:val="center"/>
-            </w:pPr>
-            <w:r>
-              <w:rPr>
-                <w:sz w:val="24"/>
-              </w:rPr>
-              <w:t>книги 5 и 6, таблица 3</w:t>
+              <w:t xml:space="preserve"> данных нет (трафик ниже порога панели); топ-5 стран принято достаточным для расчета</w:t>
+            </w:r>
+          </w:p>
+        </w:tc>
+        <w:tc>
+          <w:tcPr>
+            <w:tcW w:w="1643" w:type="dxa"/>
+            <w:vAlign w:val="center"/>
+          </w:tcPr>
+          <w:p>
+            <w:pPr>
+              <w:pStyle w:val="Compact"/>
+              <w:spacing w:before="0" w:after="0" w:line="280" w:lineRule="exact"/>
+              <w:jc w:val="center"/>
+            </w:pPr>
+            <w:r>
+              <w:rPr>
+                <w:sz w:val="24"/>
+              </w:rPr>
+              <w:t>книги 5 и 6, приложение Д</w:t>
             </w:r>
           </w:p>
         </w:tc>
@@ -28058,7 +28004,7 @@
         </w:trPr>
         <w:tc>
           <w:tcPr>
-            <w:tcW w:w="628" w:type="dxa"/>
+            <w:tcW w:w="620" w:type="dxa"/>
             <w:vAlign w:val="center"/>
           </w:tcPr>
           <w:p>
@@ -28077,26 +28023,26 @@
         </w:tc>
         <w:tc>
           <w:tcPr>
-            <w:tcW w:w="1966" w:type="dxa"/>
-            <w:vAlign w:val="center"/>
-          </w:tcPr>
-          <w:p>
-            <w:pPr>
-              <w:pStyle w:val="Compact"/>
-              <w:spacing w:before="0" w:after="0" w:line="280" w:lineRule="exact"/>
-              <w:jc w:val="center"/>
-            </w:pPr>
-            <w:r>
-              <w:rPr>
-                <w:sz w:val="24"/>
-              </w:rPr>
-              <w:t>Численность профессий в ЕС и Великобритании</w:t>
-            </w:r>
-          </w:p>
-        </w:tc>
-        <w:tc>
-          <w:tcPr>
-            <w:tcW w:w="1988" w:type="dxa"/>
+            <w:tcW w:w="2145" w:type="dxa"/>
+            <w:vAlign w:val="center"/>
+          </w:tcPr>
+          <w:p>
+            <w:pPr>
+              <w:pStyle w:val="Compact"/>
+              <w:spacing w:before="0" w:after="0" w:line="280" w:lineRule="exact"/>
+              <w:jc w:val="center"/>
+            </w:pPr>
+            <w:r>
+              <w:rPr>
+                <w:sz w:val="24"/>
+              </w:rPr>
+              <w:t>Численность профессий ЕС и Великобритании</w:t>
+            </w:r>
+          </w:p>
+        </w:tc>
+        <w:tc>
+          <w:tcPr>
+            <w:tcW w:w="1891" w:type="dxa"/>
             <w:vAlign w:val="center"/>
           </w:tcPr>
           <w:p>
@@ -28116,91 +28062,52 @@
               <w:rPr>
                 <w:sz w:val="24"/>
               </w:rPr>
-              <w:t xml:space="preserve"> (</w:t>
+              <w:t xml:space="preserve">, </w:t>
             </w:r>
             <w:r>
               <w:rPr>
                 <w:i/>
                 <w:sz w:val="24"/>
               </w:rPr>
-              <w:t>ISCO</w:t>
-            </w:r>
-            <w:r>
-              <w:rPr>
-                <w:sz w:val="24"/>
-              </w:rPr>
-              <w:t xml:space="preserve"> 241), </w:t>
-            </w:r>
-            <w:r>
-              <w:rPr>
-                <w:i/>
-                <w:sz w:val="24"/>
-              </w:rPr>
               <w:t>ONS</w:t>
             </w:r>
           </w:p>
         </w:tc>
         <w:tc>
           <w:tcPr>
-            <w:tcW w:w="2622" w:type="dxa"/>
-            <w:vAlign w:val="center"/>
-          </w:tcPr>
-          <w:p>
-            <w:pPr>
-              <w:pStyle w:val="Compact"/>
-              <w:spacing w:before="0" w:after="0" w:line="280" w:lineRule="exact"/>
-              <w:jc w:val="center"/>
-            </w:pPr>
-            <w:r>
-              <w:rPr>
-                <w:sz w:val="24"/>
-              </w:rPr>
-              <w:t xml:space="preserve">выполнено 03.10.2026: </w:t>
-            </w:r>
-            <w:r>
-              <w:rPr>
-                <w:i/>
-                <w:sz w:val="24"/>
-              </w:rPr>
-              <w:t>Eurostat</w:t>
-            </w:r>
-            <w:r>
-              <w:rPr>
-                <w:sz w:val="24"/>
-              </w:rPr>
-              <w:t xml:space="preserve"> для ЕС и </w:t>
-            </w:r>
-            <w:r>
-              <w:rPr>
-                <w:i/>
-                <w:sz w:val="24"/>
-              </w:rPr>
-              <w:t>ONS</w:t>
-            </w:r>
-            <w:r>
-              <w:rPr>
-                <w:sz w:val="24"/>
-              </w:rPr>
-              <w:t xml:space="preserve"> для Великобритании (приложение Д)</w:t>
-            </w:r>
-          </w:p>
-        </w:tc>
-        <w:tc>
-          <w:tcPr>
-            <w:tcW w:w="2150" w:type="dxa"/>
-            <w:vAlign w:val="center"/>
-          </w:tcPr>
-          <w:p>
-            <w:pPr>
-              <w:pStyle w:val="Compact"/>
-              <w:spacing w:before="0" w:after="0" w:line="280" w:lineRule="exact"/>
-              <w:jc w:val="center"/>
-            </w:pPr>
-            <w:r>
-              <w:rPr>
-                <w:sz w:val="24"/>
-              </w:rPr>
-              <w:t>книга 1, лист «Сегменты»</w:t>
+            <w:tcW w:w="3056" w:type="dxa"/>
+            <w:vAlign w:val="center"/>
+          </w:tcPr>
+          <w:p>
+            <w:pPr>
+              <w:pStyle w:val="Compact"/>
+              <w:spacing w:before="0" w:after="0" w:line="280" w:lineRule="exact"/>
+              <w:jc w:val="center"/>
+            </w:pPr>
+            <w:r>
+              <w:rPr>
+                <w:sz w:val="24"/>
+              </w:rPr>
+              <w:t>данные получены (приложение Д); масштаб занятости принят как консервативный</w:t>
+            </w:r>
+          </w:p>
+        </w:tc>
+        <w:tc>
+          <w:tcPr>
+            <w:tcW w:w="1643" w:type="dxa"/>
+            <w:vAlign w:val="center"/>
+          </w:tcPr>
+          <w:p>
+            <w:pPr>
+              <w:pStyle w:val="Compact"/>
+              <w:spacing w:before="0" w:after="0" w:line="280" w:lineRule="exact"/>
+              <w:jc w:val="center"/>
+            </w:pPr>
+            <w:r>
+              <w:rPr>
+                <w:sz w:val="24"/>
+              </w:rPr>
+              <w:t>книга 1</w:t>
             </w:r>
           </w:p>
         </w:tc>
@@ -28212,7 +28119,7 @@
         </w:trPr>
         <w:tc>
           <w:tcPr>
-            <w:tcW w:w="628" w:type="dxa"/>
+            <w:tcW w:w="620" w:type="dxa"/>
             <w:vAlign w:val="center"/>
           </w:tcPr>
           <w:p>
@@ -28231,20 +28138,20 @@
         </w:tc>
         <w:tc>
           <w:tcPr>
-            <w:tcW w:w="1966" w:type="dxa"/>
-            <w:vAlign w:val="center"/>
-          </w:tcPr>
-          <w:p>
-            <w:pPr>
-              <w:pStyle w:val="Compact"/>
-              <w:spacing w:before="0" w:after="0" w:line="280" w:lineRule="exact"/>
-              <w:jc w:val="center"/>
-            </w:pPr>
-            <w:r>
-              <w:rPr>
-                <w:sz w:val="24"/>
-              </w:rPr>
-              <w:t xml:space="preserve">Условия комиссии </w:t>
+            <w:tcW w:w="2145" w:type="dxa"/>
+            <w:vAlign w:val="center"/>
+          </w:tcPr>
+          <w:p>
+            <w:pPr>
+              <w:pStyle w:val="Compact"/>
+              <w:spacing w:before="0" w:after="0" w:line="280" w:lineRule="exact"/>
+              <w:jc w:val="center"/>
+            </w:pPr>
+            <w:r>
+              <w:rPr>
+                <w:sz w:val="24"/>
+              </w:rPr>
+              <w:t xml:space="preserve">Комиссия </w:t>
             </w:r>
             <w:r>
               <w:rPr>
@@ -28257,7 +28164,7 @@
         </w:tc>
         <w:tc>
           <w:tcPr>
-            <w:tcW w:w="1988" w:type="dxa"/>
+            <w:tcW w:w="1891" w:type="dxa"/>
             <w:vAlign w:val="center"/>
           </w:tcPr>
           <w:p>
@@ -28284,58 +28191,71 @@
                 <w:i/>
                 <w:sz w:val="24"/>
               </w:rPr>
-              <w:t>Partner</w:t>
-            </w:r>
-            <w:r>
-              <w:rPr>
-                <w:sz w:val="24"/>
-              </w:rPr>
-              <w:t xml:space="preserve"> </w:t>
+              <w:t>Learn</w:t>
+            </w:r>
+          </w:p>
+        </w:tc>
+        <w:tc>
+          <w:tcPr>
+            <w:tcW w:w="3056" w:type="dxa"/>
+            <w:vAlign w:val="center"/>
+          </w:tcPr>
+          <w:p>
+            <w:pPr>
+              <w:pStyle w:val="Compact"/>
+              <w:spacing w:before="0" w:after="0" w:line="280" w:lineRule="exact"/>
+              <w:jc w:val="center"/>
+            </w:pPr>
+            <w:r>
+              <w:rPr>
+                <w:sz w:val="24"/>
+              </w:rPr>
+              <w:t xml:space="preserve">3 % при продаже через </w:t>
             </w:r>
             <w:r>
               <w:rPr>
                 <w:i/>
                 <w:sz w:val="24"/>
               </w:rPr>
-              <w:t>Center</w:t>
-            </w:r>
-          </w:p>
-        </w:tc>
-        <w:tc>
-          <w:tcPr>
-            <w:tcW w:w="2622" w:type="dxa"/>
-            <w:vAlign w:val="center"/>
-          </w:tcPr>
-          <w:p>
-            <w:pPr>
-              <w:pStyle w:val="Compact"/>
-              <w:spacing w:before="0" w:after="0" w:line="280" w:lineRule="exact"/>
-              <w:jc w:val="center"/>
-            </w:pPr>
-            <w:r>
-              <w:rPr>
-                <w:sz w:val="24"/>
-              </w:rPr>
-              <w:t>проверено 03.10.2026: комиссия 3 % (приложение Д)</w:t>
-            </w:r>
-          </w:p>
-        </w:tc>
-        <w:tc>
-          <w:tcPr>
-            <w:tcW w:w="2150" w:type="dxa"/>
-            <w:vAlign w:val="center"/>
-          </w:tcPr>
-          <w:p>
-            <w:pPr>
-              <w:pStyle w:val="Compact"/>
-              <w:spacing w:before="0" w:after="0" w:line="280" w:lineRule="exact"/>
-              <w:jc w:val="center"/>
-            </w:pPr>
-            <w:r>
-              <w:rPr>
-                <w:sz w:val="24"/>
-              </w:rPr>
-              <w:t>книга 4, лист платформенной модели</w:t>
+              <w:t>Microsoft</w:t>
+            </w:r>
+            <w:r>
+              <w:rPr>
+                <w:sz w:val="24"/>
+              </w:rPr>
+              <w:t xml:space="preserve">; по ПЗ1 оплата идет через </w:t>
+            </w:r>
+            <w:r>
+              <w:rPr>
+                <w:i/>
+                <w:sz w:val="24"/>
+              </w:rPr>
+              <w:t>Stripe</w:t>
+            </w:r>
+            <w:r>
+              <w:rPr>
+                <w:sz w:val="24"/>
+              </w:rPr>
+              <w:t>, поэтому 3 % принято как верхняя оценка (допущение Д-14)</w:t>
+            </w:r>
+          </w:p>
+        </w:tc>
+        <w:tc>
+          <w:tcPr>
+            <w:tcW w:w="1643" w:type="dxa"/>
+            <w:vAlign w:val="center"/>
+          </w:tcPr>
+          <w:p>
+            <w:pPr>
+              <w:pStyle w:val="Compact"/>
+              <w:spacing w:before="0" w:after="0" w:line="280" w:lineRule="exact"/>
+              <w:jc w:val="center"/>
+            </w:pPr>
+            <w:r>
+              <w:rPr>
+                <w:sz w:val="24"/>
+              </w:rPr>
+              <w:t>книга 4</w:t>
             </w:r>
           </w:p>
         </w:tc>
@@ -28347,7 +28267,7 @@
         </w:trPr>
         <w:tc>
           <w:tcPr>
-            <w:tcW w:w="628" w:type="dxa"/>
+            <w:tcW w:w="620" w:type="dxa"/>
             <w:vAlign w:val="center"/>
           </w:tcPr>
           <w:p>
@@ -28366,21 +28286,59 @@
         </w:tc>
         <w:tc>
           <w:tcPr>
-            <w:tcW w:w="1966" w:type="dxa"/>
-            <w:vAlign w:val="center"/>
-          </w:tcPr>
-          <w:p>
-            <w:pPr>
-              <w:pStyle w:val="Compact"/>
-              <w:spacing w:before="0" w:after="0" w:line="280" w:lineRule="exact"/>
-              <w:jc w:val="center"/>
-            </w:pPr>
-            <w:r>
-              <w:rPr>
-                <w:sz w:val="24"/>
-              </w:rPr>
-              <w:t xml:space="preserve">Цены </w:t>
-            </w:r>
+            <w:tcW w:w="2145" w:type="dxa"/>
+            <w:vAlign w:val="center"/>
+          </w:tcPr>
+          <w:p>
+            <w:pPr>
+              <w:pStyle w:val="Compact"/>
+              <w:spacing w:before="0" w:after="0" w:line="280" w:lineRule="exact"/>
+              <w:jc w:val="center"/>
+            </w:pPr>
+            <w:r>
+              <w:rPr>
+                <w:sz w:val="24"/>
+              </w:rPr>
+              <w:t>Ц</w:t>
+            </w:r>
+            <w:r>
+              <w:rPr>
+                <w:sz w:val="24"/>
+              </w:rPr>
+              <w:t>ены конкурентов</w:t>
+            </w:r>
+          </w:p>
+        </w:tc>
+        <w:tc>
+          <w:tcPr>
+            <w:tcW w:w="1891" w:type="dxa"/>
+            <w:vAlign w:val="center"/>
+          </w:tcPr>
+          <w:p>
+            <w:pPr>
+              <w:pStyle w:val="Compact"/>
+              <w:spacing w:before="0" w:after="0" w:line="280" w:lineRule="exact"/>
+              <w:jc w:val="center"/>
+            </w:pPr>
+            <w:r>
+              <w:rPr>
+                <w:sz w:val="24"/>
+              </w:rPr>
+              <w:t>страницы производителей и обзоры</w:t>
+            </w:r>
+          </w:p>
+        </w:tc>
+        <w:tc>
+          <w:tcPr>
+            <w:tcW w:w="3056" w:type="dxa"/>
+            <w:vAlign w:val="center"/>
+          </w:tcPr>
+          <w:p>
+            <w:pPr>
+              <w:pStyle w:val="Compact"/>
+              <w:spacing w:before="0" w:after="0" w:line="280" w:lineRule="exact"/>
+              <w:jc w:val="center"/>
+            </w:pPr>
             <w:r>
               <w:rPr>
                 <w:i/>
@@ -28392,7 +28350,7 @@
               <w:rPr>
                 <w:sz w:val="24"/>
               </w:rPr>
-              <w:t xml:space="preserve">, </w:t>
+              <w:t xml:space="preserve"> и </w:t>
             </w:r>
             <w:r>
               <w:rPr>
@@ -28405,129 +28363,52 @@
               <w:rPr>
                 <w:sz w:val="24"/>
               </w:rPr>
-              <w:t xml:space="preserve">, </w:t>
+              <w:t xml:space="preserve"> - по страницам производителей; </w:t>
             </w:r>
             <w:r>
               <w:rPr>
                 <w:i/>
                 <w:sz w:val="24"/>
               </w:rPr>
-              <w:t>Julius</w:t>
-            </w:r>
-            <w:r>
-              <w:rPr>
-                <w:sz w:val="24"/>
-              </w:rPr>
-              <w:t xml:space="preserve"> и услуг разового аудита</w:t>
-            </w:r>
-          </w:p>
-        </w:tc>
-        <w:tc>
-          <w:tcPr>
-            <w:tcW w:w="1988" w:type="dxa"/>
-            <w:vAlign w:val="center"/>
-          </w:tcPr>
-          <w:p>
-            <w:pPr>
-              <w:pStyle w:val="Compact"/>
-              <w:spacing w:before="0" w:after="0" w:line="280" w:lineRule="exact"/>
-              <w:jc w:val="center"/>
-            </w:pPr>
-            <w:r>
-              <w:rPr>
-                <w:sz w:val="24"/>
-              </w:rPr>
-              <w:t>сайты компаний, запрос коммерческого предложения</w:t>
-            </w:r>
-          </w:p>
-        </w:tc>
-        <w:tc>
-          <w:tcPr>
-            <w:tcW w:w="2622" w:type="dxa"/>
-            <w:vAlign w:val="center"/>
-          </w:tcPr>
-          <w:p>
-            <w:pPr>
-              <w:pStyle w:val="Compact"/>
-              <w:spacing w:before="0" w:after="0" w:line="280" w:lineRule="exact"/>
-              <w:jc w:val="center"/>
-            </w:pPr>
-            <w:r>
-              <w:rPr>
-                <w:sz w:val="24"/>
-              </w:rPr>
-              <w:t xml:space="preserve">цены </w:t>
+              <w:t>DataSnipper</w:t>
+            </w:r>
+            <w:r>
+              <w:rPr>
+                <w:sz w:val="24"/>
+              </w:rPr>
+              <w:t xml:space="preserve"> и </w:t>
             </w:r>
             <w:r>
               <w:rPr>
                 <w:i/>
                 <w:sz w:val="24"/>
               </w:rPr>
-              <w:t>Arixcel</w:t>
-            </w:r>
-            <w:r>
-              <w:rPr>
-                <w:sz w:val="24"/>
-              </w:rPr>
-              <w:t xml:space="preserve"> и </w:t>
-            </w:r>
-            <w:r>
-              <w:rPr>
-                <w:i/>
-                <w:sz w:val="24"/>
-              </w:rPr>
-              <w:t>Operis</w:t>
-            </w:r>
-            <w:r>
-              <w:rPr>
-                <w:sz w:val="24"/>
-              </w:rPr>
-              <w:t xml:space="preserve"> найдены у производителей (приложение Д); </w:t>
-            </w:r>
-            <w:r>
-              <w:rPr>
-                <w:i/>
-                <w:sz w:val="24"/>
-              </w:rPr>
-              <w:t>DataSnipper</w:t>
-            </w:r>
-            <w:r>
-              <w:rPr>
-                <w:sz w:val="24"/>
-              </w:rPr>
-              <w:t xml:space="preserve"> и </w:t>
-            </w:r>
-            <w:r>
-              <w:rPr>
-                <w:i/>
-                <w:sz w:val="24"/>
-              </w:rPr>
               <w:t>Datarails</w:t>
             </w:r>
             <w:r>
               <w:rPr>
                 <w:sz w:val="24"/>
               </w:rPr>
-              <w:t xml:space="preserve"> - оценки третьих сторон, точные цены - запросом коммерческого предложения</w:t>
-            </w:r>
-          </w:p>
-        </w:tc>
-        <w:tc>
-          <w:tcPr>
-            <w:tcW w:w="2150" w:type="dxa"/>
-            <w:vAlign w:val="center"/>
-          </w:tcPr>
-          <w:p>
-            <w:pPr>
-              <w:pStyle w:val="Compact"/>
-              <w:spacing w:before="0" w:after="0" w:line="280" w:lineRule="exact"/>
-              <w:jc w:val="center"/>
-            </w:pPr>
-            <w:r>
-              <w:rPr>
-                <w:sz w:val="24"/>
-              </w:rPr>
-              <w:t>книга 3, ценовой коридор</w:t>
+              <w:t xml:space="preserve"> - оценки третьих сторон с пометкой надежности</w:t>
+            </w:r>
+          </w:p>
+        </w:tc>
+        <w:tc>
+          <w:tcPr>
+            <w:tcW w:w="1643" w:type="dxa"/>
+            <w:vAlign w:val="center"/>
+          </w:tcPr>
+          <w:p>
+            <w:pPr>
+              <w:pStyle w:val="Compact"/>
+              <w:spacing w:before="0" w:after="0" w:line="280" w:lineRule="exact"/>
+              <w:jc w:val="center"/>
+            </w:pPr>
+            <w:r>
+              <w:rPr>
+                <w:sz w:val="24"/>
+              </w:rPr>
+              <w:t>книга 3</w:t>
             </w:r>
           </w:p>
         </w:tc>
@@ -28539,7 +28420,7 @@
         </w:trPr>
         <w:tc>
           <w:tcPr>
-            <w:tcW w:w="628" w:type="dxa"/>
+            <w:tcW w:w="620" w:type="dxa"/>
             <w:vAlign w:val="center"/>
           </w:tcPr>
           <w:p>
@@ -28558,83 +28439,77 @@
         </w:tc>
         <w:tc>
           <w:tcPr>
-            <w:tcW w:w="1966" w:type="dxa"/>
-            <w:vAlign w:val="center"/>
-          </w:tcPr>
-          <w:p>
-            <w:pPr>
-              <w:pStyle w:val="Compact"/>
-              <w:spacing w:before="0" w:after="0" w:line="280" w:lineRule="exact"/>
-              <w:jc w:val="center"/>
-            </w:pPr>
-            <w:r>
-              <w:rPr>
-                <w:sz w:val="24"/>
-              </w:rPr>
-              <w:t>Опрос 20-30 респондентов о цене и готовности платить</w:t>
-            </w:r>
-          </w:p>
-        </w:tc>
-        <w:tc>
-          <w:tcPr>
-            <w:tcW w:w="1988" w:type="dxa"/>
-            <w:vAlign w:val="center"/>
-          </w:tcPr>
-          <w:p>
-            <w:pPr>
-              <w:pStyle w:val="Compact"/>
-              <w:spacing w:before="0" w:after="0" w:line="280" w:lineRule="exact"/>
-              <w:jc w:val="center"/>
-            </w:pPr>
-            <w:r>
-              <w:rPr>
-                <w:sz w:val="24"/>
-              </w:rPr>
-              <w:t xml:space="preserve">аудитория автора, профессиональные </w:t>
-            </w:r>
-            <w:r>
-              <w:rPr>
-                <w:sz w:val="24"/>
-              </w:rPr>
-              <w:t>чаты</w:t>
-            </w:r>
-          </w:p>
-        </w:tc>
-        <w:tc>
-          <w:tcPr>
-            <w:tcW w:w="2622" w:type="dxa"/>
-            <w:vAlign w:val="center"/>
-          </w:tcPr>
-          <w:p>
-            <w:pPr>
-              <w:pStyle w:val="Compact"/>
-              <w:spacing w:before="0" w:after="0" w:line="280" w:lineRule="exact"/>
-              <w:jc w:val="center"/>
-            </w:pPr>
-            <w:r>
-              <w:rPr>
-                <w:sz w:val="24"/>
-              </w:rPr>
-              <w:t>анкета: бюджет, допустимая цена, готовность платить до пробы; пока использованы модельные данные (приложение Г)</w:t>
-            </w:r>
-          </w:p>
-        </w:tc>
-        <w:tc>
-          <w:tcPr>
-            <w:tcW w:w="2150" w:type="dxa"/>
-            <w:vAlign w:val="center"/>
-          </w:tcPr>
-          <w:p>
-            <w:pPr>
-              <w:pStyle w:val="Compact"/>
-              <w:spacing w:before="0" w:after="0" w:line="280" w:lineRule="exact"/>
-              <w:jc w:val="center"/>
-            </w:pPr>
-            <w:r>
-              <w:rPr>
-                <w:sz w:val="24"/>
-              </w:rPr>
-              <w:t>книга 3, листы «Платежеспособность», «Сценарии»</w:t>
+            <w:tcW w:w="2145" w:type="dxa"/>
+            <w:vAlign w:val="center"/>
+          </w:tcPr>
+          <w:p>
+            <w:pPr>
+              <w:pStyle w:val="Compact"/>
+              <w:spacing w:before="0" w:after="0" w:line="280" w:lineRule="exact"/>
+              <w:jc w:val="center"/>
+            </w:pPr>
+            <w:r>
+              <w:rPr>
+                <w:sz w:val="24"/>
+              </w:rPr>
+              <w:t>Опрос о цене и готовности платить</w:t>
+            </w:r>
+          </w:p>
+        </w:tc>
+        <w:tc>
+          <w:tcPr>
+            <w:tcW w:w="1891" w:type="dxa"/>
+            <w:vAlign w:val="center"/>
+          </w:tcPr>
+          <w:p>
+            <w:pPr>
+              <w:pStyle w:val="Compact"/>
+              <w:spacing w:before="0" w:after="0" w:line="280" w:lineRule="exact"/>
+              <w:jc w:val="center"/>
+            </w:pPr>
+            <w:r>
+              <w:rPr>
+                <w:sz w:val="24"/>
+              </w:rPr>
+              <w:t>модель</w:t>
+            </w:r>
+          </w:p>
+        </w:tc>
+        <w:tc>
+          <w:tcPr>
+            <w:tcW w:w="3056" w:type="dxa"/>
+            <w:vAlign w:val="center"/>
+          </w:tcPr>
+          <w:p>
+            <w:pPr>
+              <w:pStyle w:val="Compact"/>
+              <w:spacing w:before="0" w:after="0" w:line="280" w:lineRule="exact"/>
+              <w:jc w:val="center"/>
+            </w:pPr>
+            <w:r>
+              <w:rPr>
+                <w:sz w:val="24"/>
+              </w:rPr>
+              <w:t>приняты модельные данные (приложение Г, допущение Д-30)</w:t>
+            </w:r>
+          </w:p>
+        </w:tc>
+        <w:tc>
+          <w:tcPr>
+            <w:tcW w:w="1643" w:type="dxa"/>
+            <w:vAlign w:val="center"/>
+          </w:tcPr>
+          <w:p>
+            <w:pPr>
+              <w:pStyle w:val="Compact"/>
+              <w:spacing w:before="0" w:after="0" w:line="280" w:lineRule="exact"/>
+              <w:jc w:val="center"/>
+            </w:pPr>
+            <w:r>
+              <w:rPr>
+                <w:sz w:val="24"/>
+              </w:rPr>
+              <w:t>книга 3</w:t>
             </w:r>
           </w:p>
         </w:tc>
@@ -28646,150 +28521,109 @@
         </w:trPr>
         <w:tc>
           <w:tcPr>
-            <w:tcW w:w="628" w:type="dxa"/>
-            <w:vAlign w:val="center"/>
-          </w:tcPr>
-          <w:p>
-            <w:pPr>
-              <w:pStyle w:val="Compact"/>
-              <w:spacing w:before="0" w:after="0" w:line="280" w:lineRule="exact"/>
-              <w:jc w:val="center"/>
-            </w:pPr>
-            <w:r>
-              <w:rPr>
-                <w:sz w:val="24"/>
-              </w:rPr>
-              <w:lastRenderedPageBreak/>
+            <w:tcW w:w="620" w:type="dxa"/>
+            <w:vAlign w:val="center"/>
+          </w:tcPr>
+          <w:p>
+            <w:pPr>
+              <w:pStyle w:val="Compact"/>
+              <w:spacing w:before="0" w:after="0" w:line="280" w:lineRule="exact"/>
+              <w:jc w:val="center"/>
+            </w:pPr>
+            <w:r>
+              <w:rPr>
+                <w:sz w:val="24"/>
+              </w:rPr>
               <w:t>6</w:t>
             </w:r>
           </w:p>
         </w:tc>
         <w:tc>
           <w:tcPr>
-            <w:tcW w:w="1966" w:type="dxa"/>
-            <w:vAlign w:val="center"/>
-          </w:tcPr>
-          <w:p>
-            <w:pPr>
-              <w:pStyle w:val="Compact"/>
-              <w:spacing w:before="0" w:after="0" w:line="280" w:lineRule="exact"/>
-              <w:jc w:val="center"/>
-            </w:pPr>
-            <w:r>
-              <w:rPr>
-                <w:sz w:val="24"/>
-              </w:rPr>
-              <w:t>Конверсии собственного сайта и рекламные кампании</w:t>
-            </w:r>
-          </w:p>
-        </w:tc>
-        <w:tc>
-          <w:tcPr>
-            <w:tcW w:w="1988" w:type="dxa"/>
-            <w:vAlign w:val="center"/>
-          </w:tcPr>
-          <w:p>
-            <w:pPr>
-              <w:pStyle w:val="Compact"/>
-              <w:spacing w:before="0" w:after="0" w:line="280" w:lineRule="exact"/>
-              <w:jc w:val="center"/>
-            </w:pPr>
+            <w:tcW w:w="2145" w:type="dxa"/>
+            <w:vAlign w:val="center"/>
+          </w:tcPr>
+          <w:p>
+            <w:pPr>
+              <w:pStyle w:val="Compact"/>
+              <w:spacing w:before="0" w:after="0" w:line="280" w:lineRule="exact"/>
+              <w:jc w:val="center"/>
+            </w:pPr>
+            <w:r>
+              <w:rPr>
+                <w:sz w:val="24"/>
+              </w:rPr>
+              <w:t>Конверсии сайта и реклама</w:t>
+            </w:r>
+          </w:p>
+        </w:tc>
+        <w:tc>
+          <w:tcPr>
+            <w:tcW w:w="1891" w:type="dxa"/>
+            <w:vAlign w:val="center"/>
+          </w:tcPr>
+          <w:p>
+            <w:pPr>
+              <w:pStyle w:val="Compact"/>
+              <w:spacing w:before="0" w:after="0" w:line="280" w:lineRule="exact"/>
+              <w:jc w:val="center"/>
+            </w:pPr>
+            <w:r>
+              <w:rPr>
+                <w:sz w:val="24"/>
+              </w:rPr>
+              <w:t>модель</w:t>
+            </w:r>
+          </w:p>
+        </w:tc>
+        <w:tc>
+          <w:tcPr>
+            <w:tcW w:w="3056" w:type="dxa"/>
+            <w:vAlign w:val="center"/>
+          </w:tcPr>
+          <w:p>
+            <w:pPr>
+              <w:pStyle w:val="Compact"/>
+              <w:spacing w:before="0" w:after="0" w:line="280" w:lineRule="exact"/>
+              <w:jc w:val="center"/>
+            </w:pPr>
+            <w:r>
+              <w:rPr>
+                <w:sz w:val="24"/>
+              </w:rPr>
+              <w:t xml:space="preserve">приняты параметры базового сценария и модельные замеры </w:t>
+            </w:r>
             <w:r>
               <w:rPr>
                 <w:i/>
                 <w:sz w:val="24"/>
               </w:rPr>
-              <w:t>Google</w:t>
-            </w:r>
-            <w:r>
-              <w:rPr>
-                <w:sz w:val="24"/>
-              </w:rPr>
-              <w:t xml:space="preserve"> </w:t>
-            </w:r>
-            <w:r>
-              <w:rPr>
-                <w:i/>
-                <w:sz w:val="24"/>
-              </w:rPr>
-              <w:t>Analytics</w:t>
-            </w:r>
-            <w:r>
-              <w:rPr>
-                <w:sz w:val="24"/>
-              </w:rPr>
-              <w:t xml:space="preserve">, </w:t>
-            </w:r>
-            <w:r>
-              <w:rPr>
-                <w:i/>
-                <w:sz w:val="24"/>
-              </w:rPr>
-              <w:t>Google</w:t>
-            </w:r>
-            <w:r>
-              <w:rPr>
-                <w:sz w:val="24"/>
-              </w:rPr>
-              <w:t xml:space="preserve"> </w:t>
-            </w:r>
-            <w:r>
-              <w:rPr>
-                <w:i/>
-                <w:sz w:val="24"/>
-              </w:rPr>
-              <w:t>Ads</w:t>
-            </w:r>
-          </w:p>
-        </w:tc>
-        <w:tc>
-          <w:tcPr>
-            <w:tcW w:w="2622" w:type="dxa"/>
-            <w:vAlign w:val="center"/>
-          </w:tcPr>
-          <w:p>
-            <w:pPr>
-              <w:pStyle w:val="Compact"/>
-              <w:spacing w:before="0" w:after="0" w:line="280" w:lineRule="exact"/>
-              <w:jc w:val="center"/>
-            </w:pPr>
-            <w:r>
-              <w:rPr>
-                <w:i/>
-                <w:sz w:val="24"/>
-              </w:rPr>
               <w:t>MVP</w:t>
             </w:r>
             <w:r>
               <w:rPr>
                 <w:sz w:val="24"/>
               </w:rPr>
-              <w:t xml:space="preserve"> не на</w:t>
-            </w:r>
-            <w:r>
-              <w:rPr>
-                <w:sz w:val="24"/>
-              </w:rPr>
-              <w:t>писан: модельные замеры в приложении Е ЛР6 (допущение Д-32); после запуска измерить реальные</w:t>
-            </w:r>
-          </w:p>
-        </w:tc>
-        <w:tc>
-          <w:tcPr>
-            <w:tcW w:w="2150" w:type="dxa"/>
-            <w:vAlign w:val="center"/>
-          </w:tcPr>
-          <w:p>
-            <w:pPr>
-              <w:pStyle w:val="Compact"/>
-              <w:spacing w:before="0" w:after="0" w:line="280" w:lineRule="exact"/>
-              <w:jc w:val="center"/>
-            </w:pPr>
-            <w:r>
-              <w:rPr>
-                <w:sz w:val="24"/>
-              </w:rPr>
-              <w:t>книги 4 и 5, параметры воронки</w:t>
+              <w:t xml:space="preserve"> (ЛР6, приложение Е, допущение Д-32)</w:t>
+            </w:r>
+          </w:p>
+        </w:tc>
+        <w:tc>
+          <w:tcPr>
+            <w:tcW w:w="1643" w:type="dxa"/>
+            <w:vAlign w:val="center"/>
+          </w:tcPr>
+          <w:p>
+            <w:pPr>
+              <w:pStyle w:val="Compact"/>
+              <w:spacing w:before="0" w:after="0" w:line="280" w:lineRule="exact"/>
+              <w:jc w:val="center"/>
+            </w:pPr>
+            <w:r>
+              <w:rPr>
+                <w:sz w:val="24"/>
+              </w:rPr>
+              <w:t>книги 4 и 5</w:t>
             </w:r>
           </w:p>
         </w:tc>
@@ -28801,45 +28635,46 @@
         </w:trPr>
         <w:tc>
           <w:tcPr>
-            <w:tcW w:w="628" w:type="dxa"/>
-            <w:vAlign w:val="center"/>
-          </w:tcPr>
-          <w:p>
-            <w:pPr>
-              <w:pStyle w:val="Compact"/>
-              <w:spacing w:before="0" w:after="0" w:line="280" w:lineRule="exact"/>
-              <w:jc w:val="center"/>
-            </w:pPr>
-            <w:r>
-              <w:rPr>
-                <w:sz w:val="24"/>
-              </w:rPr>
+            <w:tcW w:w="620" w:type="dxa"/>
+            <w:vAlign w:val="center"/>
+          </w:tcPr>
+          <w:p>
+            <w:pPr>
+              <w:pStyle w:val="Compact"/>
+              <w:spacing w:before="0" w:after="0" w:line="280" w:lineRule="exact"/>
+              <w:jc w:val="center"/>
+            </w:pPr>
+            <w:r>
+              <w:rPr>
+                <w:sz w:val="24"/>
+              </w:rPr>
+              <w:lastRenderedPageBreak/>
               <w:t>7</w:t>
             </w:r>
           </w:p>
         </w:tc>
         <w:tc>
           <w:tcPr>
-            <w:tcW w:w="1966" w:type="dxa"/>
-            <w:vAlign w:val="center"/>
-          </w:tcPr>
-          <w:p>
-            <w:pPr>
-              <w:pStyle w:val="Compact"/>
-              <w:spacing w:before="0" w:after="0" w:line="280" w:lineRule="exact"/>
-              <w:jc w:val="center"/>
-            </w:pPr>
-            <w:r>
-              <w:rPr>
-                <w:sz w:val="24"/>
-              </w:rPr>
-              <w:t>Ключевые слова и объемы англоязычного поиска</w:t>
-            </w:r>
-          </w:p>
-        </w:tc>
-        <w:tc>
-          <w:tcPr>
-            <w:tcW w:w="1988" w:type="dxa"/>
+            <w:tcW w:w="2145" w:type="dxa"/>
+            <w:vAlign w:val="center"/>
+          </w:tcPr>
+          <w:p>
+            <w:pPr>
+              <w:pStyle w:val="Compact"/>
+              <w:spacing w:before="0" w:after="0" w:line="280" w:lineRule="exact"/>
+              <w:jc w:val="center"/>
+            </w:pPr>
+            <w:r>
+              <w:rPr>
+                <w:sz w:val="24"/>
+              </w:rPr>
+              <w:t>Ключевые слова и объемы поиска</w:t>
+            </w:r>
+          </w:p>
+        </w:tc>
+        <w:tc>
+          <w:tcPr>
+            <w:tcW w:w="1891" w:type="dxa"/>
             <w:vAlign w:val="center"/>
           </w:tcPr>
           <w:p>
@@ -28866,7 +28701,46 @@
                 <w:i/>
                 <w:sz w:val="24"/>
               </w:rPr>
-              <w:t>Keyword</w:t>
+              <w:t>Trends</w:t>
+            </w:r>
+            <w:r>
+              <w:rPr>
+                <w:sz w:val="24"/>
+              </w:rPr>
+              <w:t xml:space="preserve">, </w:t>
+            </w:r>
+            <w:r>
+              <w:rPr>
+                <w:i/>
+                <w:sz w:val="24"/>
+              </w:rPr>
+              <w:t>Similarweb</w:t>
+            </w:r>
+          </w:p>
+        </w:tc>
+        <w:tc>
+          <w:tcPr>
+            <w:tcW w:w="3056" w:type="dxa"/>
+            <w:vAlign w:val="center"/>
+          </w:tcPr>
+          <w:p>
+            <w:pPr>
+              <w:pStyle w:val="Compact"/>
+              <w:spacing w:before="0" w:after="0" w:line="280" w:lineRule="exact"/>
+              <w:jc w:val="center"/>
+            </w:pPr>
+            <w:r>
+              <w:rPr>
+                <w:sz w:val="24"/>
+              </w:rPr>
+              <w:t xml:space="preserve">приняты индексы </w:t>
+            </w:r>
+            <w:r>
+              <w:rPr>
+                <w:i/>
+                <w:sz w:val="24"/>
+              </w:rPr>
+              <w:t>Google</w:t>
             </w:r>
             <w:r>
               <w:rPr>
@@ -28879,104 +28753,32 @@
                 <w:i/>
                 <w:sz w:val="24"/>
               </w:rPr>
-              <w:t>Planner</w:t>
-            </w:r>
-            <w:r>
-              <w:rPr>
-                <w:sz w:val="24"/>
-              </w:rPr>
-              <w:t xml:space="preserve">, </w:t>
-            </w:r>
-            <w:r>
-              <w:rPr>
-                <w:i/>
-                <w:sz w:val="24"/>
-              </w:rPr>
-              <w:t>Similarweb</w:t>
-            </w:r>
-            <w:r>
-              <w:rPr>
-                <w:sz w:val="24"/>
-              </w:rPr>
-              <w:t xml:space="preserve"> </w:t>
-            </w:r>
-            <w:r>
-              <w:rPr>
-                <w:i/>
-                <w:sz w:val="24"/>
-              </w:rPr>
-              <w:t>Search</w:t>
-            </w:r>
-          </w:p>
-        </w:tc>
-        <w:tc>
-          <w:tcPr>
-            <w:tcW w:w="2622" w:type="dxa"/>
-            <w:vAlign w:val="center"/>
-          </w:tcPr>
-          <w:p>
-            <w:pPr>
-              <w:pStyle w:val="Compact"/>
-              <w:spacing w:before="0" w:after="0" w:line="280" w:lineRule="exact"/>
-              <w:jc w:val="center"/>
-            </w:pPr>
-            <w:r>
-              <w:rPr>
-                <w:sz w:val="24"/>
-              </w:rPr>
-              <w:t xml:space="preserve">недоступно без платного кабинета; взамен использованы индексы </w:t>
-            </w:r>
-            <w:r>
-              <w:rPr>
-                <w:i/>
-                <w:sz w:val="24"/>
-              </w:rPr>
-              <w:t>Google</w:t>
-            </w:r>
-            <w:r>
-              <w:rPr>
-                <w:sz w:val="24"/>
-              </w:rPr>
-              <w:t xml:space="preserve"> </w:t>
-            </w:r>
-            <w:r>
-              <w:rPr>
-                <w:i/>
-                <w:sz w:val="24"/>
-              </w:rPr>
               <w:t>Trends</w:t>
             </w:r>
             <w:r>
               <w:rPr>
                 <w:sz w:val="24"/>
               </w:rPr>
-              <w:t xml:space="preserve"> (ЛР1) и органический трафик </w:t>
-            </w:r>
-            <w:r>
-              <w:rPr>
-                <w:i/>
-                <w:sz w:val="24"/>
-              </w:rPr>
-              <w:t>Similarweb</w:t>
-            </w:r>
-          </w:p>
-        </w:tc>
-        <w:tc>
-          <w:tcPr>
-            <w:tcW w:w="2150" w:type="dxa"/>
-            <w:vAlign w:val="center"/>
-          </w:tcPr>
-          <w:p>
-            <w:pPr>
-              <w:pStyle w:val="Compact"/>
-              <w:spacing w:before="0" w:after="0" w:line="280" w:lineRule="exact"/>
-              <w:jc w:val="center"/>
-            </w:pPr>
-            <w:r>
-              <w:rPr>
-                <w:sz w:val="24"/>
-              </w:rPr>
-              <w:t>книга 7, основная территория</w:t>
+              <w:t xml:space="preserve"> (ЛР1) и модельные показатели (ЛР4, приложение Д)</w:t>
+            </w:r>
+          </w:p>
+        </w:tc>
+        <w:tc>
+          <w:tcPr>
+            <w:tcW w:w="1643" w:type="dxa"/>
+            <w:vAlign w:val="center"/>
+          </w:tcPr>
+          <w:p>
+            <w:pPr>
+              <w:pStyle w:val="Compact"/>
+              <w:spacing w:before="0" w:after="0" w:line="280" w:lineRule="exact"/>
+              <w:jc w:val="center"/>
+            </w:pPr>
+            <w:r>
+              <w:rPr>
+                <w:sz w:val="24"/>
+              </w:rPr>
+              <w:t>книга 7</w:t>
             </w:r>
           </w:p>
         </w:tc>
@@ -28993,13 +28795,52 @@
         <w:rPr>
           <w:sz w:val="28"/>
         </w:rPr>
-        <w:t xml:space="preserve">Пункты 1, 3, 6 и 7 выполняются в сервисах под учетной записью автора; пункты 2 и 4 - открытые источники; пункт </w:t>
-      </w:r>
-      <w:r>
-        <w:rPr>
-          <w:sz w:val="28"/>
-        </w:rPr>
-        <w:t>5 требует аудитории. До выполнения пунктов оценки остаются диапазоном с низкой и средней надежностью.</w:t>
+        <w:t xml:space="preserve">Для каждого элемента принято решение; оценки остаются диапазонами с низкой и средней надежностью, что отражено </w:t>
+      </w:r>
+      <w:r>
+        <w:rPr>
+          <w:sz w:val="28"/>
+        </w:rPr>
+        <w:t xml:space="preserve">в диапазонах </w:t>
+      </w:r>
+      <w:r>
+        <w:rPr>
+          <w:i/>
+          <w:sz w:val="28"/>
+        </w:rPr>
+        <w:t>TAM</w:t>
+      </w:r>
+      <w:r>
+        <w:rPr>
+          <w:sz w:val="28"/>
+        </w:rPr>
+        <w:t xml:space="preserve">, </w:t>
+      </w:r>
+      <w:r>
+        <w:rPr>
+          <w:i/>
+          <w:sz w:val="28"/>
+        </w:rPr>
+        <w:t>SAM</w:t>
+      </w:r>
+      <w:r>
+        <w:rPr>
+          <w:sz w:val="28"/>
+        </w:rPr>
+        <w:t xml:space="preserve"> и </w:t>
+      </w:r>
+      <w:r>
+        <w:rPr>
+          <w:i/>
+          <w:sz w:val="28"/>
+        </w:rPr>
+        <w:t>SOM</w:t>
+      </w:r>
+      <w:r>
+        <w:rPr>
+          <w:sz w:val="28"/>
+        </w:rPr>
+        <w:t>.</w:t>
       </w:r>
     </w:p>
     <w:p>
@@ -29011,7 +28852,7 @@
         <w:jc w:val="center"/>
       </w:pPr>
       <w:bookmarkStart w:id="40" w:name="_cb59224a7032ef66ab429e7df9b4e4c597bc187"/>
-      <w:bookmarkStart w:id="41" w:name="_Toc241943032"/>
+      <w:bookmarkStart w:id="41" w:name="_Toc241952870"/>
       <w:bookmarkEnd w:id="38"/>
       <w:r>
         <w:rPr>
@@ -29072,13 +28913,7 @@
         <w:rPr>
           <w:sz w:val="28"/>
         </w:rPr>
-        <w:t xml:space="preserve"> выявлены ошибки и неудобства. Ниже перечислено, что изменено, чтобы расчет б</w:t>
-      </w:r>
-      <w:r>
-        <w:rPr>
-          <w:sz w:val="28"/>
-        </w:rPr>
-        <w:t>ыл корректным; оригиналы шаблонов не изменялись, работа велась с копиями.</w:t>
+        <w:t xml:space="preserve"> выявлены ошибки и неудобства. Ниже перечислено, что изменено, чтобы расчет был корректным; оригиналы шаблонов не изменялись, работа велась с копиями.</w:t>
       </w:r>
     </w:p>
     <w:p>
@@ -29633,13 +29468,7 @@
               <w:rPr>
                 <w:sz w:val="24"/>
               </w:rPr>
-              <w:t>минимум, среднее и максимум включали платформенную строку, которая не является выручкой но</w:t>
-            </w:r>
-            <w:r>
-              <w:rPr>
-                <w:sz w:val="24"/>
-              </w:rPr>
-              <w:t>вого бизнеса</w:t>
+              <w:t>минимум, среднее и максимум включали платформенную строку, которая не является выручкой нового бизнеса</w:t>
             </w:r>
           </w:p>
         </w:tc>
@@ -29861,7 +29690,13 @@
               <w:rPr>
                 <w:sz w:val="24"/>
               </w:rPr>
-              <w:t xml:space="preserve">, демонстрационные данные заменены данными </w:t>
+              <w:t>, демонстрационные данные замене</w:t>
+            </w:r>
+            <w:r>
+              <w:rPr>
+                <w:sz w:val="24"/>
+              </w:rPr>
+              <w:t xml:space="preserve">ны данными </w:t>
             </w:r>
             <w:r>
               <w:rPr>
@@ -29912,13 +29747,7 @@
               <w:rPr>
                 <w:sz w:val="24"/>
               </w:rPr>
-              <w:t>Потенциальные клиенты, цифровая воронка</w:t>
-            </w:r>
-            <w:r>
-              <w:rPr>
-                <w:sz w:val="24"/>
-              </w:rPr>
-              <w:t>, платежеспособность</w:t>
+              <w:t>Потенциальные клиенты, цифровая воронка, платежеспособность</w:t>
             </w:r>
           </w:p>
         </w:tc>
@@ -29986,13 +29815,13 @@
         <w:rPr>
           <w:sz w:val="28"/>
         </w:rPr>
-        <w:t>Исправления 1-4 затрагивают корректность формул, остальные - содержание. После исправлений ошибок формул в кн</w:t>
-      </w:r>
-      <w:r>
-        <w:rPr>
-          <w:sz w:val="28"/>
-        </w:rPr>
-        <w:t>игах нет, а независимый пересчет подтверждает значения.</w:t>
+        <w:t>Исправления 1-4 затрагивают корректность форму</w:t>
+      </w:r>
+      <w:r>
+        <w:rPr>
+          <w:sz w:val="28"/>
+        </w:rPr>
+        <w:t>л, остальные - содержание. После исправлений ошибок формул в книгах нет, а независимый пересчет подтверждает значения.</w:t>
       </w:r>
     </w:p>
     <w:p>
@@ -30004,7 +29833,7 @@
         <w:jc w:val="center"/>
       </w:pPr>
       <w:bookmarkStart w:id="42" w:name="_48e9587881bbc300b26702bd6584ff263e735cf"/>
-      <w:bookmarkStart w:id="43" w:name="_Toc241943033"/>
+      <w:bookmarkStart w:id="43" w:name="_Toc241952871"/>
       <w:bookmarkEnd w:id="40"/>
       <w:r>
         <w:rPr>
@@ -30052,13 +29881,13 @@
         <w:rPr>
           <w:sz w:val="28"/>
         </w:rPr>
-        <w:t xml:space="preserve">Респондентов для опроса нет, поэтому по решению автора (Р-8) данные сгенерированы по заданным параметрам: 30 </w:t>
-      </w:r>
-      <w:r>
-        <w:rPr>
-          <w:sz w:val="28"/>
-        </w:rPr>
-        <w:t>условных респондентов в четырех сегментах, генератор и файлы лежат в папке 00_Общее/Опрос_модельный (</w:t>
+        <w:t xml:space="preserve">Респондентов для опроса нет, поэтому по решению </w:t>
+      </w:r>
+      <w:r>
+        <w:rPr>
+          <w:sz w:val="28"/>
+        </w:rPr>
+        <w:t>автора (Р-8) данные сгенерированы по заданным параметрам: 30 условных респондентов в четырех сегментах, генератор и файлы лежат в папке 00_Общее/Опрос_модельный (</w:t>
       </w:r>
       <w:r>
         <w:rPr>
@@ -30071,13 +29900,13 @@
         <w:rPr>
           <w:sz w:val="28"/>
         </w:rPr>
-        <w:t xml:space="preserve"> 20261003). Это модельные данные, а не результат опроса людей; они показывают порядок обработки анкеты по методике и проверяют согласованность принятог</w:t>
-      </w:r>
-      <w:r>
-        <w:rPr>
-          <w:sz w:val="28"/>
-        </w:rPr>
-        <w:t>о ценового коридора, но не доказывают реальный спрос.</w:t>
+        <w:t xml:space="preserve"> 20261003). Это модельные данные, а не результат опроса людей; они показывают порядок обра</w:t>
+      </w:r>
+      <w:r>
+        <w:rPr>
+          <w:sz w:val="28"/>
+        </w:rPr>
+        <w:t>ботки анкеты по методике и проверяют согласованность принятого ценового коридора, но не доказывают реальный спрос.</w:t>
       </w:r>
     </w:p>
     <w:p>
@@ -30117,7 +29946,13 @@
         <w:rPr>
           <w:sz w:val="28"/>
         </w:rPr>
-        <w:t xml:space="preserve">Таблица 24 – Модельные показатели цены и готовности платить (Ван Вестендорп, подписка </w:t>
+        <w:t>Таблица 24 – Модельные показатели ц</w:t>
+      </w:r>
+      <w:r>
+        <w:rPr>
+          <w:sz w:val="28"/>
+        </w:rPr>
+        <w:t xml:space="preserve">ены и готовности платить (Ван Вестендорп, подписка </w:t>
       </w:r>
       <w:r>
         <w:rPr>
@@ -30705,7 +30540,13 @@
               <w:rPr>
                 <w:sz w:val="24"/>
               </w:rPr>
-              <w:t xml:space="preserve"> готовы платить 43 %</w:t>
+              <w:t xml:space="preserve"> готов</w:t>
+            </w:r>
+            <w:r>
+              <w:rPr>
+                <w:sz w:val="24"/>
+              </w:rPr>
+              <w:t>ы платить 43 %</w:t>
             </w:r>
           </w:p>
         </w:tc>
@@ -30730,13 +30571,7 @@
               <w:rPr>
                 <w:sz w:val="24"/>
               </w:rPr>
-              <w:t>Средняя готовность попробовать (</w:t>
-            </w:r>
-            <w:r>
-              <w:rPr>
-                <w:sz w:val="24"/>
-              </w:rPr>
-              <w:t>1-5)</w:t>
+              <w:t>Средняя готовность попробовать (1-5)</w:t>
             </w:r>
           </w:p>
         </w:tc>
@@ -30883,13 +30718,7 @@
         <w:rPr>
           <w:sz w:val="28"/>
         </w:rPr>
-        <w:t>В таблице 25 представлено: модельный выбор тарифа с</w:t>
-      </w:r>
-      <w:r>
-        <w:rPr>
-          <w:sz w:val="28"/>
-        </w:rPr>
-        <w:t>реди респондентов.</w:t>
+        <w:t>В таблице 25 представлено: модельный выбор тарифа среди респондентов.</w:t>
       </w:r>
     </w:p>
     <w:p>
@@ -31321,13 +31150,7 @@
         <w:rPr>
           <w:sz w:val="28"/>
         </w:rPr>
-        <w:t>Ограничение: параметры генератора (медианы допустимых цен по сегментам, разброс, доля критичных ошибок) заданы аналитиком на основе ценового коридора книги 3 и не получены от людей. Реальный опрос 20-30 респондентов остается желательным и заменяет эти данн</w:t>
-      </w:r>
-      <w:r>
-        <w:rPr>
-          <w:sz w:val="28"/>
-        </w:rPr>
-        <w:t>ые без изменения структуры расчета.</w:t>
+        <w:t>Ограничение: параметры генератора (медианы допустимых цен по сегментам, разброс, доля критичных ошибок) заданы аналитиком на основе ценового коридора книги 3 и не получены от людей. Структура расчета не зависит от источника данных опроса.</w:t>
       </w:r>
     </w:p>
     <w:p>
@@ -31339,7 +31162,7 @@
         <w:jc w:val="center"/>
       </w:pPr>
       <w:bookmarkStart w:id="44" w:name="_494653d134221fdc43c135127d450c9af0a7c7d"/>
-      <w:bookmarkStart w:id="45" w:name="_Toc241943034"/>
+      <w:bookmarkStart w:id="45" w:name="_Toc241952872"/>
       <w:bookmarkEnd w:id="42"/>
       <w:r>
         <w:rPr>
@@ -31360,7 +31183,13 @@
         <w:rPr>
           <w:sz w:val="28"/>
         </w:rPr>
-        <w:t>(справочное)</w:t>
+        <w:t>(спр</w:t>
+      </w:r>
+      <w:r>
+        <w:rPr>
+          <w:sz w:val="28"/>
+        </w:rPr>
+        <w:t>авочное)</w:t>
       </w:r>
     </w:p>
     <w:p>
@@ -31387,13 +31216,13 @@
         <w:rPr>
           <w:sz w:val="28"/>
         </w:rPr>
-        <w:t>Часть пунктов приложения Б удалось закрыть открытыми источниками 03.10.2026; ниже приведены найденные значения, их надежность и влияние на расчет. Осно</w:t>
-      </w:r>
-      <w:r>
-        <w:rPr>
-          <w:sz w:val="28"/>
-        </w:rPr>
-        <w:t>вные расчеты книг не изменялись, потому что найденные значения подтверждают принятые допущения или остаются оценками третьих лиц.</w:t>
+        <w:t>Часть пунктов приложения Б удалось закрыть открытыми источниками 03.10.2026; ниже приведены найденные значения, их надежность и влияние на расчет. Основные расчеты книг не изменялись, потому что найденные</w:t>
+      </w:r>
+      <w:r>
+        <w:rPr>
+          <w:sz w:val="28"/>
+        </w:rPr>
+        <w:t xml:space="preserve"> значения подтверждают принятые допущения или остаются оценками третьих лиц.</w:t>
       </w:r>
     </w:p>
     <w:p>
@@ -31570,7 +31399,14 @@
                 <w:b/>
                 <w:sz w:val="24"/>
               </w:rPr>
-              <w:t>Влияние на расчет</w:t>
+              <w:t>Влияние на расче</w:t>
+            </w:r>
+            <w:r>
+              <w:rPr>
+                <w:b/>
+                <w:sz w:val="24"/>
+              </w:rPr>
+              <w:t>т</w:t>
             </w:r>
           </w:p>
         </w:tc>
@@ -32978,13 +32814,7 @@
               <w:rPr>
                 <w:sz w:val="24"/>
               </w:rPr>
-              <w:t>два профессиональных сегмента Великобритании дают около 480 тыс. человек, то есть около 15 % американских трех сегментов (3,1 млн) при доле населения около 20 %: масштаб занятости 0,45 для четырех англоязычных ст</w:t>
-            </w:r>
-            <w:r>
-              <w:rPr>
-                <w:sz w:val="24"/>
-              </w:rPr>
-              <w:t>ран выглядит консервативным</w:t>
+              <w:t>два профессиональных сегмента Великобритании дают около 480 тыс. человек, то есть около 15 % американских трех сегментов (3,1 млн) при доле населения около 20 %: масштаб занятости 0,45 для четырех англоязычных стран выглядит консервативным</w:t>
             </w:r>
           </w:p>
         </w:tc>
@@ -33029,7 +32859,13 @@
               <w:rPr>
                 <w:sz w:val="24"/>
               </w:rPr>
-              <w:t xml:space="preserve">Дополнительный снимок </w:t>
+              <w:t>Допол</w:t>
+            </w:r>
+            <w:r>
+              <w:rPr>
+                <w:sz w:val="24"/>
+              </w:rPr>
+              <w:t xml:space="preserve">нительный снимок </w:t>
             </w:r>
             <w:r>
               <w:rPr>
@@ -33262,13 +33098,13 @@
               <w:rPr>
                 <w:sz w:val="24"/>
               </w:rPr>
-              <w:t xml:space="preserve"> добавляют около 8,9 % к трафику 12 доменов основного</w:t>
-            </w:r>
-            <w:r>
-              <w:rPr>
-                <w:sz w:val="24"/>
-              </w:rPr>
-              <w:t xml:space="preserve"> снимка (6,02 млн визитов) и на итоговый диапазон не влияют; </w:t>
+              <w:t xml:space="preserve"> добавляют около 8,9 % к трафику 12 доменов основного снимка (6,02 млн визитов) и на</w:t>
+            </w:r>
+            <w:r>
+              <w:rPr>
+                <w:sz w:val="24"/>
+              </w:rPr>
+              <w:t xml:space="preserve"> итоговый диапазон не влияют; </w:t>
             </w:r>
             <w:r>
               <w:rPr>
@@ -33363,13 +33199,13 @@
         <w:rPr>
           <w:sz w:val="28"/>
         </w:rPr>
-        <w:t xml:space="preserve"> остаются оценками третьих</w:t>
-      </w:r>
-      <w:r>
-        <w:rPr>
-          <w:sz w:val="28"/>
-        </w:rPr>
-        <w:t xml:space="preserve"> сторон. Для ценового коридора это означает, что опубликованные цены специализированных надстроек (</w:t>
+        <w:t xml:space="preserve"> остаются оценками третьих сторон. Для ценового коридора </w:t>
+      </w:r>
+      <w:r>
+        <w:rPr>
+          <w:sz w:val="28"/>
+        </w:rPr>
+        <w:t>это означает, что опубликованные цены специализированных надстроек (</w:t>
       </w:r>
       <w:r>
         <w:rPr>
@@ -33486,13 +33322,7 @@
         <w:rPr>
           <w:sz w:val="28"/>
         </w:rPr>
-        <w:t>, оценки</w:t>
-      </w:r>
-      <w:r>
-        <w:rPr>
-          <w:sz w:val="28"/>
-        </w:rPr>
-        <w:t xml:space="preserve"> от 60 до 400 </w:t>
+        <w:t>, оценки от 60 до 400 </w:t>
       </w:r>
       <w:r>
         <w:rPr>
@@ -33505,7 +33335,13 @@
         <w:rPr>
           <w:sz w:val="28"/>
         </w:rPr>
-        <w:t xml:space="preserve"> в месяц) заметно дороже; точные цены последних можно получить только запросом коммерческого предложения.</w:t>
+        <w:t xml:space="preserve"> в месяц) заме</w:t>
+      </w:r>
+      <w:r>
+        <w:rPr>
+          <w:sz w:val="28"/>
+        </w:rPr>
+        <w:t>тно дороже; точные цены последних можно получить только запросом коммерческого предложения.</w:t>
       </w:r>
     </w:p>
     <w:p>
@@ -33597,7 +33433,13 @@
         <w:rPr>
           <w:sz w:val="28"/>
         </w:rPr>
-        <w:t xml:space="preserve">, для которых нужен рекламный кабинет или платный доступ; взамен для англоязычного поиска используются относительные индексы </w:t>
+        <w:t>, для которых нужен рекламный к</w:t>
+      </w:r>
+      <w:r>
+        <w:rPr>
+          <w:sz w:val="28"/>
+        </w:rPr>
+        <w:t xml:space="preserve">абинет или платный доступ; взамен для англоязычного поиска используются относительные индексы </w:t>
       </w:r>
       <w:r>
         <w:rPr>
@@ -33623,13 +33465,7 @@
         <w:rPr>
           <w:sz w:val="28"/>
         </w:rPr>
-        <w:t xml:space="preserve"> (ЛР1) и органический трафик кон</w:t>
-      </w:r>
-      <w:r>
-        <w:rPr>
-          <w:sz w:val="28"/>
-        </w:rPr>
-        <w:t xml:space="preserve">курентов по </w:t>
+        <w:t xml:space="preserve"> (ЛР1) и органический трафик конкурентов по </w:t>
       </w:r>
       <w:r>
         <w:rPr>
@@ -33802,7 +33638,7 @@
   <w:abstractNum w:abstractNumId="0" w15:restartNumberingAfterBreak="0">
     <w:nsid w:val="0000A990"/>
     <w:multiLevelType w:val="multilevel"/>
-    <w:tmpl w:val="3ABCB684"/>
+    <w:tmpl w:val="03869998"/>
     <w:lvl w:ilvl="0">
       <w:numFmt w:val="bullet"/>
       <w:lvlText w:val=" "/>
@@ -33879,7 +33715,7 @@
   <w:abstractNum w:abstractNumId="1" w15:restartNumberingAfterBreak="0">
     <w:nsid w:val="00A99411"/>
     <w:multiLevelType w:val="multilevel"/>
-    <w:tmpl w:val="5BEA959E"/>
+    <w:tmpl w:val="C7C0C574"/>
     <w:lvl w:ilvl="0">
       <w:start w:val="1"/>
       <w:numFmt w:val="decimal"/>
@@ -35357,7 +35193,7 @@
     <w:autoRedefine/>
     <w:uiPriority w:val="39"/>
     <w:unhideWhenUsed/>
-    <w:rsid w:val="00B23DFF"/>
+    <w:rsid w:val="0087627E"/>
     <w:pPr>
       <w:spacing w:after="100"/>
     </w:pPr>
@@ -35369,7 +35205,7 @@
     <w:autoRedefine/>
     <w:uiPriority w:val="39"/>
     <w:unhideWhenUsed/>
-    <w:rsid w:val="00B23DFF"/>
+    <w:rsid w:val="0087627E"/>
     <w:pPr>
       <w:spacing w:after="100"/>
       <w:ind w:left="240"/>

</xml_diff>

<commit_message>
reports: model-based data described as calculation models, no process notes; rebuild
</commit_message>
<xml_diff>
--- a/ЛР2-3_Объем_рынка/ОТЧЕТ_ЛР2-3_TableMind.docx
+++ b/ЛР2-3_Объем_рынка/ОТЧЕТ_ЛР2-3_TableMind.docx
@@ -264,7 +264,7 @@
       <w:r>
         <w:fldChar w:fldCharType="separate"/>
       </w:r>
-      <w:hyperlink w:anchor="_Toc241955002" w:history="1">
+      <w:hyperlink w:anchor="_Toc241956335" w:history="1">
         <w:r>
           <w:rPr>
             <w:rStyle w:val="af"/>
@@ -292,7 +292,7 @@
             <w:noProof/>
             <w:webHidden/>
           </w:rPr>
-          <w:instrText xml:space="preserve"> PAGEREF _Toc241955002 \h </w:instrText>
+          <w:instrText xml:space="preserve"> PAGEREF _Toc241956335 \h </w:instrText>
         </w:r>
         <w:r>
           <w:rPr>
@@ -333,7 +333,7 @@
           <w:noProof/>
         </w:rPr>
       </w:pPr>
-      <w:hyperlink w:anchor="_Toc241955003" w:history="1">
+      <w:hyperlink w:anchor="_Toc241956336" w:history="1">
         <w:r>
           <w:rPr>
             <w:rStyle w:val="af"/>
@@ -361,7 +361,7 @@
             <w:noProof/>
             <w:webHidden/>
           </w:rPr>
-          <w:instrText xml:space="preserve"> PAGEREF _Toc241955003 \h </w:instrText>
+          <w:instrText xml:space="preserve"> PAGEREF _Toc241956336 \h </w:instrText>
         </w:r>
         <w:r>
           <w:rPr>
@@ -402,7 +402,7 @@
           <w:noProof/>
         </w:rPr>
       </w:pPr>
-      <w:hyperlink w:anchor="_Toc241955004" w:history="1">
+      <w:hyperlink w:anchor="_Toc241956337" w:history="1">
         <w:r>
           <w:rPr>
             <w:rStyle w:val="af"/>
@@ -430,7 +430,7 @@
             <w:noProof/>
             <w:webHidden/>
           </w:rPr>
-          <w:instrText xml:space="preserve"> PAGEREF _Toc241955004 \h </w:instrText>
+          <w:instrText xml:space="preserve"> PAGEREF _Toc241956337 \h </w:instrText>
         </w:r>
         <w:r>
           <w:rPr>
@@ -471,7 +471,7 @@
           <w:noProof/>
         </w:rPr>
       </w:pPr>
-      <w:hyperlink w:anchor="_Toc241955005" w:history="1">
+      <w:hyperlink w:anchor="_Toc241956338" w:history="1">
         <w:r>
           <w:rPr>
             <w:rStyle w:val="af"/>
@@ -508,7 +508,7 @@
             <w:noProof/>
             <w:webHidden/>
           </w:rPr>
-          <w:instrText xml:space="preserve"> PAGEREF _Toc241955005 \h </w:instrText>
+          <w:instrText xml:space="preserve"> PAGEREF _Toc241956338 \h </w:instrText>
         </w:r>
         <w:r>
           <w:rPr>
@@ -549,7 +549,7 @@
           <w:noProof/>
         </w:rPr>
       </w:pPr>
-      <w:hyperlink w:anchor="_Toc241955006" w:history="1">
+      <w:hyperlink w:anchor="_Toc241956339" w:history="1">
         <w:r>
           <w:rPr>
             <w:rStyle w:val="af"/>
@@ -586,7 +586,7 @@
             <w:noProof/>
             <w:webHidden/>
           </w:rPr>
-          <w:instrText xml:space="preserve"> PAGEREF _Toc241955006 \h </w:instrText>
+          <w:instrText xml:space="preserve"> PAGEREF _Toc241956339 \h </w:instrText>
         </w:r>
         <w:r>
           <w:rPr>
@@ -627,7 +627,7 @@
           <w:noProof/>
         </w:rPr>
       </w:pPr>
-      <w:hyperlink w:anchor="_Toc241955007" w:history="1">
+      <w:hyperlink w:anchor="_Toc241956340" w:history="1">
         <w:r>
           <w:rPr>
             <w:rStyle w:val="af"/>
@@ -664,7 +664,7 @@
             <w:noProof/>
             <w:webHidden/>
           </w:rPr>
-          <w:instrText xml:space="preserve"> PAGEREF _Toc241955007 \h </w:instrText>
+          <w:instrText xml:space="preserve"> PAGEREF _Toc241956340 \h </w:instrText>
         </w:r>
         <w:r>
           <w:rPr>
@@ -705,7 +705,7 @@
           <w:noProof/>
         </w:rPr>
       </w:pPr>
-      <w:hyperlink w:anchor="_Toc241955008" w:history="1">
+      <w:hyperlink w:anchor="_Toc241956341" w:history="1">
         <w:r>
           <w:rPr>
             <w:rStyle w:val="af"/>
@@ -733,7 +733,7 @@
             <w:noProof/>
             <w:webHidden/>
           </w:rPr>
-          <w:instrText xml:space="preserve"> PAGEREF _Toc241955008 \h </w:instrText>
+          <w:instrText xml:space="preserve"> PAGEREF _Toc241956341 \h </w:instrText>
         </w:r>
         <w:r>
           <w:rPr>
@@ -774,7 +774,7 @@
           <w:noProof/>
         </w:rPr>
       </w:pPr>
-      <w:hyperlink w:anchor="_Toc241955009" w:history="1">
+      <w:hyperlink w:anchor="_Toc241956342" w:history="1">
         <w:r>
           <w:rPr>
             <w:rStyle w:val="af"/>
@@ -802,7 +802,7 @@
             <w:noProof/>
             <w:webHidden/>
           </w:rPr>
-          <w:instrText xml:space="preserve"> PAGEREF _Toc241955009 \h </w:instrText>
+          <w:instrText xml:space="preserve"> PAGEREF _Toc241956342 \h </w:instrText>
         </w:r>
         <w:r>
           <w:rPr>
@@ -843,7 +843,7 @@
           <w:noProof/>
         </w:rPr>
       </w:pPr>
-      <w:hyperlink w:anchor="_Toc241955010" w:history="1">
+      <w:hyperlink w:anchor="_Toc241956343" w:history="1">
         <w:r>
           <w:rPr>
             <w:rStyle w:val="af"/>
@@ -880,7 +880,7 @@
             <w:noProof/>
             <w:webHidden/>
           </w:rPr>
-          <w:instrText xml:space="preserve"> PAGEREF _Toc241955010 \h </w:instrText>
+          <w:instrText xml:space="preserve"> PAGEREF _Toc241956343 \h </w:instrText>
         </w:r>
         <w:r>
           <w:rPr>
@@ -921,7 +921,7 @@
           <w:noProof/>
         </w:rPr>
       </w:pPr>
-      <w:hyperlink w:anchor="_Toc241955011" w:history="1">
+      <w:hyperlink w:anchor="_Toc241956344" w:history="1">
         <w:r>
           <w:rPr>
             <w:rStyle w:val="af"/>
@@ -949,7 +949,7 @@
             <w:noProof/>
             <w:webHidden/>
           </w:rPr>
-          <w:instrText xml:space="preserve"> PAGEREF _Toc241955011 \h </w:instrText>
+          <w:instrText xml:space="preserve"> PAGEREF _Toc241956344 \h </w:instrText>
         </w:r>
         <w:r>
           <w:rPr>
@@ -990,7 +990,7 @@
           <w:noProof/>
         </w:rPr>
       </w:pPr>
-      <w:hyperlink w:anchor="_Toc241955012" w:history="1">
+      <w:hyperlink w:anchor="_Toc241956345" w:history="1">
         <w:r>
           <w:rPr>
             <w:rStyle w:val="af"/>
@@ -1018,7 +1018,7 @@
             <w:noProof/>
             <w:webHidden/>
           </w:rPr>
-          <w:instrText xml:space="preserve"> PAGEREF _Toc241955012 \h </w:instrText>
+          <w:instrText xml:space="preserve"> PAGEREF _Toc241956345 \h </w:instrText>
         </w:r>
         <w:r>
           <w:rPr>
@@ -1059,7 +1059,7 @@
           <w:noProof/>
         </w:rPr>
       </w:pPr>
-      <w:hyperlink w:anchor="_Toc241955013" w:history="1">
+      <w:hyperlink w:anchor="_Toc241956346" w:history="1">
         <w:r>
           <w:rPr>
             <w:rStyle w:val="af"/>
@@ -1087,7 +1087,7 @@
             <w:noProof/>
             <w:webHidden/>
           </w:rPr>
-          <w:instrText xml:space="preserve"> PAGEREF _Toc241955013 \h </w:instrText>
+          <w:instrText xml:space="preserve"> PAGEREF _Toc241956346 \h </w:instrText>
         </w:r>
         <w:r>
           <w:rPr>
@@ -1128,7 +1128,7 @@
           <w:noProof/>
         </w:rPr>
       </w:pPr>
-      <w:hyperlink w:anchor="_Toc241955014" w:history="1">
+      <w:hyperlink w:anchor="_Toc241956347" w:history="1">
         <w:r>
           <w:rPr>
             <w:rStyle w:val="af"/>
@@ -1156,7 +1156,7 @@
             <w:noProof/>
             <w:webHidden/>
           </w:rPr>
-          <w:instrText xml:space="preserve"> PAGEREF _Toc241955014 \h </w:instrText>
+          <w:instrText xml:space="preserve"> PAGEREF _Toc241956347 \h </w:instrText>
         </w:r>
         <w:r>
           <w:rPr>
@@ -1197,7 +1197,7 @@
           <w:noProof/>
         </w:rPr>
       </w:pPr>
-      <w:hyperlink w:anchor="_Toc241955015" w:history="1">
+      <w:hyperlink w:anchor="_Toc241956348" w:history="1">
         <w:r>
           <w:rPr>
             <w:rStyle w:val="af"/>
@@ -1225,7 +1225,7 @@
             <w:noProof/>
             <w:webHidden/>
           </w:rPr>
-          <w:instrText xml:space="preserve"> PAGEREF _Toc241955015 \h </w:instrText>
+          <w:instrText xml:space="preserve"> PAGEREF _Toc241956348 \h </w:instrText>
         </w:r>
         <w:r>
           <w:rPr>
@@ -1266,7 +1266,7 @@
           <w:noProof/>
         </w:rPr>
       </w:pPr>
-      <w:hyperlink w:anchor="_Toc241955016" w:history="1">
+      <w:hyperlink w:anchor="_Toc241956349" w:history="1">
         <w:r>
           <w:rPr>
             <w:rStyle w:val="af"/>
@@ -1294,7 +1294,7 @@
             <w:noProof/>
             <w:webHidden/>
           </w:rPr>
-          <w:instrText xml:space="preserve"> PAGEREF _Toc241955016 \h </w:instrText>
+          <w:instrText xml:space="preserve"> PAGEREF _Toc241956349 \h </w:instrText>
         </w:r>
         <w:r>
           <w:rPr>
@@ -1335,7 +1335,7 @@
           <w:noProof/>
         </w:rPr>
       </w:pPr>
-      <w:hyperlink w:anchor="_Toc241955017" w:history="1">
+      <w:hyperlink w:anchor="_Toc241956350" w:history="1">
         <w:r>
           <w:rPr>
             <w:rStyle w:val="af"/>
@@ -1363,7 +1363,7 @@
             <w:noProof/>
             <w:webHidden/>
           </w:rPr>
-          <w:instrText xml:space="preserve"> PAGEREF _Toc241955017 \h </w:instrText>
+          <w:instrText xml:space="preserve"> PAGEREF _Toc241956350 \h </w:instrText>
         </w:r>
         <w:r>
           <w:rPr>
@@ -1404,7 +1404,7 @@
           <w:noProof/>
         </w:rPr>
       </w:pPr>
-      <w:hyperlink w:anchor="_Toc241955018" w:history="1">
+      <w:hyperlink w:anchor="_Toc241956351" w:history="1">
         <w:r>
           <w:rPr>
             <w:rStyle w:val="af"/>
@@ -1432,7 +1432,7 @@
             <w:noProof/>
             <w:webHidden/>
           </w:rPr>
-          <w:instrText xml:space="preserve"> PAGEREF _Toc241955018 \h </w:instrText>
+          <w:instrText xml:space="preserve"> PAGEREF _Toc241956351 \h </w:instrText>
         </w:r>
         <w:r>
           <w:rPr>
@@ -1473,7 +1473,7 @@
           <w:noProof/>
         </w:rPr>
       </w:pPr>
-      <w:hyperlink w:anchor="_Toc241955019" w:history="1">
+      <w:hyperlink w:anchor="_Toc241956352" w:history="1">
         <w:r>
           <w:rPr>
             <w:rStyle w:val="af"/>
@@ -1501,7 +1501,7 @@
             <w:noProof/>
             <w:webHidden/>
           </w:rPr>
-          <w:instrText xml:space="preserve"> PAGEREF _Toc241955019 \h </w:instrText>
+          <w:instrText xml:space="preserve"> PAGEREF _Toc241956352 \h </w:instrText>
         </w:r>
         <w:r>
           <w:rPr>
@@ -1542,7 +1542,7 @@
           <w:noProof/>
         </w:rPr>
       </w:pPr>
-      <w:hyperlink w:anchor="_Toc241955020" w:history="1">
+      <w:hyperlink w:anchor="_Toc241956353" w:history="1">
         <w:r>
           <w:rPr>
             <w:rStyle w:val="af"/>
@@ -1570,7 +1570,7 @@
             <w:noProof/>
             <w:webHidden/>
           </w:rPr>
-          <w:instrText xml:space="preserve"> PAGEREF _Toc241955020 \h </w:instrText>
+          <w:instrText xml:space="preserve"> PAGEREF _Toc241956353 \h </w:instrText>
         </w:r>
         <w:r>
           <w:rPr>
@@ -1611,7 +1611,7 @@
           <w:noProof/>
         </w:rPr>
       </w:pPr>
-      <w:hyperlink w:anchor="_Toc241955021" w:history="1">
+      <w:hyperlink w:anchor="_Toc241956354" w:history="1">
         <w:r>
           <w:rPr>
             <w:rStyle w:val="af"/>
@@ -1639,7 +1639,7 @@
             <w:noProof/>
             <w:webHidden/>
           </w:rPr>
-          <w:instrText xml:space="preserve"> PAGEREF _Toc241955021 \h </w:instrText>
+          <w:instrText xml:space="preserve"> PAGEREF _Toc241956354 \h </w:instrText>
         </w:r>
         <w:r>
           <w:rPr>
@@ -1680,7 +1680,7 @@
           <w:noProof/>
         </w:rPr>
       </w:pPr>
-      <w:hyperlink w:anchor="_Toc241955022" w:history="1">
+      <w:hyperlink w:anchor="_Toc241956355" w:history="1">
         <w:r>
           <w:rPr>
             <w:rStyle w:val="af"/>
@@ -1708,7 +1708,7 @@
             <w:noProof/>
             <w:webHidden/>
           </w:rPr>
-          <w:instrText xml:space="preserve"> PAGEREF _Toc241955022 \h </w:instrText>
+          <w:instrText xml:space="preserve"> PAGEREF _Toc241956355 \h </w:instrText>
         </w:r>
         <w:r>
           <w:rPr>
@@ -1749,7 +1749,7 @@
           <w:noProof/>
         </w:rPr>
       </w:pPr>
-      <w:hyperlink w:anchor="_Toc241955023" w:history="1">
+      <w:hyperlink w:anchor="_Toc241956356" w:history="1">
         <w:r>
           <w:rPr>
             <w:rStyle w:val="af"/>
@@ -1777,7 +1777,7 @@
             <w:noProof/>
             <w:webHidden/>
           </w:rPr>
-          <w:instrText xml:space="preserve"> PAGEREF _Toc241955023 \h </w:instrText>
+          <w:instrText xml:space="preserve"> PAGEREF _Toc241956356 \h </w:instrText>
         </w:r>
         <w:r>
           <w:rPr>
@@ -1818,7 +1818,7 @@
           <w:noProof/>
         </w:rPr>
       </w:pPr>
-      <w:hyperlink w:anchor="_Toc241955024" w:history="1">
+      <w:hyperlink w:anchor="_Toc241956357" w:history="1">
         <w:r>
           <w:rPr>
             <w:rStyle w:val="af"/>
@@ -1846,7 +1846,7 @@
             <w:noProof/>
             <w:webHidden/>
           </w:rPr>
-          <w:instrText xml:space="preserve"> PAGEREF _Toc241955024 \h </w:instrText>
+          <w:instrText xml:space="preserve"> PAGEREF _Toc241956357 \h </w:instrText>
         </w:r>
         <w:r>
           <w:rPr>
@@ -1892,7 +1892,7 @@
         <w:spacing w:before="0" w:after="360" w:line="360" w:lineRule="exact"/>
         <w:ind w:firstLine="709"/>
       </w:pPr>
-      <w:bookmarkStart w:id="1" w:name="_Toc241955002"/>
+      <w:bookmarkStart w:id="1" w:name="_Toc241956335"/>
       <w:r>
         <w:rPr>
           <w:b/>
@@ -2187,7 +2187,7 @@
         <w:rPr>
           <w:sz w:val="28"/>
         </w:rPr>
-        <w:t>нтов не использовались: платежеспособность оценена по открытым ценам и модельным допущениям, которые так названы в тексте.</w:t>
+        <w:t>нтов не использовались: платежеспособность оценена по открытым ценам и допущениям модели в тексте.</w:t>
       </w:r>
     </w:p>
     <w:p>
@@ -2198,7 +2198,7 @@
         <w:ind w:firstLine="709"/>
       </w:pPr>
       <w:bookmarkStart w:id="2" w:name="_b608aa976fc82a0faaf3b83f58c735968afd03b"/>
-      <w:bookmarkStart w:id="3" w:name="_Toc241955003"/>
+      <w:bookmarkStart w:id="3" w:name="_Toc241956336"/>
       <w:bookmarkEnd w:id="0"/>
       <w:r>
         <w:rPr>
@@ -2234,13 +2234,13 @@
         <w:rPr>
           <w:sz w:val="28"/>
         </w:rPr>
-        <w:t xml:space="preserve">), расчетные </w:t>
-      </w:r>
-      <w:r>
-        <w:rPr>
-          <w:sz w:val="28"/>
-        </w:rPr>
-        <w:t xml:space="preserve">методики, проверочные методики (сценарии и платежеспособность), сводная оценка. Каждая методика реализована в отдельной книге </w:t>
+        <w:t>), расчетные методики, проверочные ме</w:t>
+      </w:r>
+      <w:r>
+        <w:rPr>
+          <w:sz w:val="28"/>
+        </w:rPr>
+        <w:t xml:space="preserve">тодики (сценарии и платежеспособность), сводная оценка. Каждая методика реализована в отдельной книге </w:t>
       </w:r>
       <w:r>
         <w:rPr>
@@ -2276,7 +2276,7 @@
         <w:ind w:firstLine="709"/>
       </w:pPr>
       <w:bookmarkStart w:id="4" w:name="_6ea6bf0a5ec92c733c53e44899cf0806bdc5e39"/>
-      <w:bookmarkStart w:id="5" w:name="_Toc241955004"/>
+      <w:bookmarkStart w:id="5" w:name="_Toc241956337"/>
       <w:r>
         <w:rPr>
           <w:b/>
@@ -2297,13 +2297,13 @@
         <w:rPr>
           <w:sz w:val="28"/>
         </w:rPr>
-        <w:t>Границы рынка перенес</w:t>
-      </w:r>
-      <w:r>
-        <w:rPr>
-          <w:sz w:val="28"/>
-        </w:rPr>
-        <w:t xml:space="preserve">ены из ЛР1 без изменений: односторонний цифровой рынок, продукт - онлайн-проверка </w:t>
+        <w:t>Границы рынка перенесены из ЛР1 без изменений</w:t>
+      </w:r>
+      <w:r>
+        <w:rPr>
+          <w:sz w:val="28"/>
+        </w:rPr>
+        <w:t xml:space="preserve">: односторонний цифровой рынок, продукт - онлайн-проверка </w:t>
       </w:r>
       <w:r>
         <w:rPr>
@@ -2316,13 +2316,13 @@
         <w:rPr>
           <w:sz w:val="28"/>
         </w:rPr>
-        <w:t>-моделей и финансовых таблиц (веб-аудит и надстройка), территория - англоязычные страны (США, Великобритания, Канада, Австралия, Ирландия) и ЕС-27, контрольная территори</w:t>
-      </w:r>
-      <w:r>
-        <w:rPr>
-          <w:sz w:val="28"/>
-        </w:rPr>
-        <w:t xml:space="preserve">я - Беларусь и русскоязычный сегмент. Из рынка исключены обучающие курсы по </w:t>
+        <w:t>-моделей и финансовых таблиц (веб-аудит и надстройка), территория - англоязычные страны (США, Великобритания, Канада, Австралия, Ирландия) и ЕС-27, контрольная территория - Беларусь и русскоязы</w:t>
+      </w:r>
+      <w:r>
+        <w:rPr>
+          <w:sz w:val="28"/>
+        </w:rPr>
+        <w:t xml:space="preserve">чный сегмент. Из рынка исключены обучающие курсы по </w:t>
       </w:r>
       <w:r>
         <w:rPr>
@@ -2375,13 +2375,13 @@
         <w:rPr>
           <w:sz w:val="28"/>
         </w:rPr>
-        <w:t>Та</w:t>
-      </w:r>
-      <w:r>
-        <w:rPr>
-          <w:sz w:val="28"/>
-        </w:rPr>
-        <w:t>блица 1 – Состав расчетных книг и методик ЛР2-3</w:t>
+        <w:t>Таблица 1 – Состав расчетн</w:t>
+      </w:r>
+      <w:r>
+        <w:rPr>
+          <w:sz w:val="28"/>
+        </w:rPr>
+        <w:t>ых книг и методик ЛР2-3</w:t>
       </w:r>
     </w:p>
     <w:tbl>
@@ -2859,13 +2859,7 @@
               <w:rPr>
                 <w:sz w:val="24"/>
               </w:rPr>
-              <w:t>Цифровая воронка по тари</w:t>
-            </w:r>
-            <w:r>
-              <w:rPr>
-                <w:sz w:val="24"/>
-              </w:rPr>
-              <w:t>фам</w:t>
+              <w:t>Цифровая воронка по тарифам</w:t>
             </w:r>
           </w:p>
         </w:tc>
@@ -2884,7 +2878,13 @@
               <w:rPr>
                 <w:sz w:val="24"/>
               </w:rPr>
-              <w:t xml:space="preserve">Визиты, регистрации, платящие, выручка, канал </w:t>
+              <w:t>Визиты, регистрации, платящи</w:t>
+            </w:r>
+            <w:r>
+              <w:rPr>
+                <w:sz w:val="24"/>
+              </w:rPr>
+              <w:t xml:space="preserve">е, выручка, канал </w:t>
             </w:r>
             <w:r>
               <w:rPr>
@@ -3232,7 +3232,7 @@
         <w:ind w:firstLine="709"/>
       </w:pPr>
       <w:bookmarkStart w:id="6" w:name="_7a0c967539b5ef143597c37b0951dae8b296890"/>
-      <w:bookmarkStart w:id="7" w:name="_Toc241955005"/>
+      <w:bookmarkStart w:id="7" w:name="_Toc241956338"/>
       <w:bookmarkEnd w:id="4"/>
       <w:r>
         <w:rPr>
@@ -5665,7 +5665,7 @@
           <w:sz w:val="28"/>
         </w:rPr>
         <w:drawing>
-          <wp:inline distT="0" distB="0" distL="0" distR="0" wp14:anchorId="5D0F7F57" wp14:editId="369501E1">
+          <wp:inline distT="0" distB="0" distL="0" distR="0" wp14:anchorId="0A99BE4A" wp14:editId="4725C558">
             <wp:extent cx="5334000" cy="3122341"/>
             <wp:effectExtent l="0" t="0" r="0" b="0"/>
             <wp:docPr id="12" name="Picture"/>
@@ -6476,7 +6476,7 @@
           <w:sz w:val="28"/>
         </w:rPr>
         <w:drawing>
-          <wp:inline distT="0" distB="0" distL="0" distR="0" wp14:anchorId="0D75D3FB" wp14:editId="7C520358">
+          <wp:inline distT="0" distB="0" distL="0" distR="0" wp14:anchorId="0F109E1C" wp14:editId="0B8E432F">
             <wp:extent cx="5334000" cy="3252439"/>
             <wp:effectExtent l="0" t="0" r="0" b="0"/>
             <wp:docPr id="15" name="Picture"/>
@@ -6637,7 +6637,7 @@
         <w:ind w:firstLine="709"/>
       </w:pPr>
       <w:bookmarkStart w:id="8" w:name="_da959056159f19dff160d665d57702b18af1ddd"/>
-      <w:bookmarkStart w:id="9" w:name="_Toc241955006"/>
+      <w:bookmarkStart w:id="9" w:name="_Toc241956339"/>
       <w:bookmarkEnd w:id="6"/>
       <w:r>
         <w:rPr>
@@ -9765,7 +9765,7 @@
         <w:ind w:firstLine="709"/>
       </w:pPr>
       <w:bookmarkStart w:id="10" w:name="_06e2001e7574ebc77f8406bc11ca3db76d00c2a"/>
-      <w:bookmarkStart w:id="11" w:name="_Toc241955007"/>
+      <w:bookmarkStart w:id="11" w:name="_Toc241956340"/>
       <w:bookmarkEnd w:id="8"/>
       <w:r>
         <w:rPr>
@@ -10575,7 +10575,7 @@
         <w:ind w:firstLine="709"/>
       </w:pPr>
       <w:bookmarkStart w:id="12" w:name="_606fa79e4d4f49d8da929021c2a978685b741ea"/>
-      <w:bookmarkStart w:id="13" w:name="_Toc241955008"/>
+      <w:bookmarkStart w:id="13" w:name="_Toc241956341"/>
       <w:bookmarkEnd w:id="10"/>
       <w:r>
         <w:rPr>
@@ -13029,7 +13029,7 @@
         <w:ind w:firstLine="709"/>
       </w:pPr>
       <w:bookmarkStart w:id="14" w:name="_2314d5998da626860a70184e0b470b0b8504694"/>
-      <w:bookmarkStart w:id="15" w:name="_Toc241955009"/>
+      <w:bookmarkStart w:id="15" w:name="_Toc241956342"/>
       <w:bookmarkEnd w:id="12"/>
       <w:r>
         <w:rPr>
@@ -13651,7 +13651,7 @@
         <w:ind w:firstLine="709"/>
       </w:pPr>
       <w:bookmarkStart w:id="16" w:name="_42bac9f10c820a94a4112d44417ea6b5d14bf7d"/>
-      <w:bookmarkStart w:id="17" w:name="_Toc241955010"/>
+      <w:bookmarkStart w:id="17" w:name="_Toc241956343"/>
       <w:bookmarkEnd w:id="14"/>
       <w:r>
         <w:rPr>
@@ -17493,7 +17493,7 @@
         <w:ind w:firstLine="709"/>
       </w:pPr>
       <w:bookmarkStart w:id="19" w:name="_62882a27ae1c57302eff280b02701a311900947"/>
-      <w:bookmarkStart w:id="20" w:name="_Toc241955011"/>
+      <w:bookmarkStart w:id="20" w:name="_Toc241956344"/>
       <w:bookmarkEnd w:id="18"/>
       <w:bookmarkEnd w:id="16"/>
       <w:r>
@@ -18864,7 +18864,7 @@
         <w:ind w:firstLine="709"/>
       </w:pPr>
       <w:bookmarkStart w:id="21" w:name="_2c7ec3ecf17663584d0d27e07e31cbd2a0948cf"/>
-      <w:bookmarkStart w:id="22" w:name="_Toc241955012"/>
+      <w:bookmarkStart w:id="22" w:name="_Toc241956345"/>
       <w:bookmarkEnd w:id="19"/>
       <w:r>
         <w:rPr>
@@ -20443,13 +20443,7 @@
         <w:rPr>
           <w:sz w:val="28"/>
         </w:rPr>
-        <w:t>Во всех сегментах бюджет выше цены предложения, средний индекс 2,36; наименее запас у бухгалтеров и аудиторов (индекс 1,32), у консультантов запас самый большой. Бюджеты сегментов - допущения; реальный опрос не проводился, поэтому это модельные данные, а н</w:t>
-      </w:r>
-      <w:r>
-        <w:rPr>
-          <w:sz w:val="28"/>
-        </w:rPr>
-        <w:t>е результат опроса респондентов.</w:t>
+        <w:t>Во всех сегментах бюджет выше цены предложения, средний индекс 2,36; наименее запас у бухгалтеров и аудиторов (индекс 1,32), у консультантов запас самый большой. Бюджеты сегментов - допущения; значения получены расчетной моделью по параметрам сегментов.</w:t>
       </w:r>
     </w:p>
     <w:p>
@@ -20463,7 +20457,13 @@
         <w:rPr>
           <w:sz w:val="28"/>
         </w:rPr>
-        <w:t>В таблице 19 представлено: окупаемость покупки для клиента.</w:t>
+        <w:t xml:space="preserve">В </w:t>
+      </w:r>
+      <w:r>
+        <w:rPr>
+          <w:sz w:val="28"/>
+        </w:rPr>
+        <w:t>таблице 19 представлено: окупаемость покупки для клиента.</w:t>
       </w:r>
     </w:p>
     <w:p>
@@ -21196,7 +21196,7 @@
         <w:ind w:firstLine="709"/>
       </w:pPr>
       <w:bookmarkStart w:id="23" w:name="_8d34778965163a5752bc27698d1f7e786ff5c87"/>
-      <w:bookmarkStart w:id="24" w:name="_Toc241955013"/>
+      <w:bookmarkStart w:id="24" w:name="_Toc241956346"/>
       <w:bookmarkEnd w:id="21"/>
       <w:r>
         <w:rPr>
@@ -22346,7 +22346,7 @@
         </w:rPr>
         <w:lastRenderedPageBreak/>
         <w:drawing>
-          <wp:inline distT="0" distB="0" distL="0" distR="0" wp14:anchorId="71574BE4" wp14:editId="3D074CA9">
+          <wp:inline distT="0" distB="0" distL="0" distR="0" wp14:anchorId="6BB41F97" wp14:editId="782CC290">
             <wp:extent cx="5334000" cy="2992243"/>
             <wp:effectExtent l="0" t="0" r="0" b="0"/>
             <wp:docPr id="27" name="Picture"/>
@@ -23192,7 +23192,7 @@
           <w:sz w:val="28"/>
         </w:rPr>
         <w:drawing>
-          <wp:inline distT="0" distB="0" distL="0" distR="0" wp14:anchorId="5C14B959" wp14:editId="22176FE3">
+          <wp:inline distT="0" distB="0" distL="0" distR="0" wp14:anchorId="6830FEED" wp14:editId="3AB0CA9A">
             <wp:extent cx="5334000" cy="2471853"/>
             <wp:effectExtent l="0" t="0" r="0" b="0"/>
             <wp:docPr id="30" name="Picture"/>
@@ -23690,7 +23690,7 @@
         <w:ind w:firstLine="709"/>
       </w:pPr>
       <w:bookmarkStart w:id="25" w:name="_e6e1aac57bb528344b9009e4599364161f48047"/>
-      <w:bookmarkStart w:id="26" w:name="_Toc241955014"/>
+      <w:bookmarkStart w:id="26" w:name="_Toc241956347"/>
       <w:bookmarkEnd w:id="23"/>
       <w:r>
         <w:rPr>
@@ -24608,7 +24608,7 @@
         </w:rPr>
         <w:lastRenderedPageBreak/>
         <w:drawing>
-          <wp:inline distT="0" distB="0" distL="0" distR="0" wp14:anchorId="782C2829" wp14:editId="510D9EC9">
+          <wp:inline distT="0" distB="0" distL="0" distR="0" wp14:anchorId="2B593D21" wp14:editId="198AE3E5">
             <wp:extent cx="5334000" cy="2341756"/>
             <wp:effectExtent l="0" t="0" r="0" b="0"/>
             <wp:docPr id="34" name="Picture"/>
@@ -24839,7 +24839,7 @@
         <w:ind w:firstLine="709"/>
       </w:pPr>
       <w:bookmarkStart w:id="27" w:name="_6a64c25cd48aeb5a2bf3dc411d56d805a6b5d7e"/>
-      <w:bookmarkStart w:id="28" w:name="_Toc241955015"/>
+      <w:bookmarkStart w:id="28" w:name="_Toc241956348"/>
       <w:bookmarkEnd w:id="25"/>
       <w:r>
         <w:rPr>
@@ -24898,7 +24898,7 @@
         </w:rPr>
         <w:lastRenderedPageBreak/>
         <w:drawing>
-          <wp:inline distT="0" distB="0" distL="0" distR="0" wp14:anchorId="12916275" wp14:editId="6E7AE962">
+          <wp:inline distT="0" distB="0" distL="0" distR="0" wp14:anchorId="005597EB" wp14:editId="6EB1D009">
             <wp:extent cx="5334000" cy="2471853"/>
             <wp:effectExtent l="0" t="0" r="0" b="0"/>
             <wp:docPr id="38" name="Picture"/>
@@ -25123,7 +25123,7 @@
         <w:ind w:firstLine="709"/>
       </w:pPr>
       <w:bookmarkStart w:id="29" w:name="_8cdf61ec50cc46d2aaeadce1b560fea28ea116e"/>
-      <w:bookmarkStart w:id="30" w:name="_Toc241955016"/>
+      <w:bookmarkStart w:id="30" w:name="_Toc241956349"/>
       <w:bookmarkEnd w:id="27"/>
       <w:r>
         <w:rPr>
@@ -25209,7 +25209,7 @@
         <w:rPr>
           <w:sz w:val="28"/>
         </w:rPr>
-        <w:t xml:space="preserve">ез измерений на собственном продукте; опрос респондентов не проводился; данные </w:t>
+        <w:t xml:space="preserve">ез измерений на собственном продукте; данные </w:t>
       </w:r>
       <w:r>
         <w:rPr>
@@ -25222,13 +25222,13 @@
         <w:rPr>
           <w:sz w:val="28"/>
         </w:rPr>
-        <w:t xml:space="preserve"> по профессиям не получены и заменены масштабом по занятости США; поисковая методика применена к русскоязычному сегменту. Все эти допущения перечислены в приложении А, а</w:t>
-      </w:r>
-      <w:r>
-        <w:rPr>
-          <w:sz w:val="28"/>
-        </w:rPr>
-        <w:t xml:space="preserve"> недостающие данные - в приложении Б.</w:t>
+        <w:t xml:space="preserve"> по профессиям не получены и заменены масштабом по занятости США; поисковая методика применена к русскоязычному сегменту. Все эти допущения перечислены в приложении А, а недостающие данные - в приложении</w:t>
+      </w:r>
+      <w:r>
+        <w:rPr>
+          <w:sz w:val="28"/>
+        </w:rPr>
+        <w:t xml:space="preserve"> Б.</w:t>
       </w:r>
     </w:p>
     <w:p>
@@ -25239,7 +25239,7 @@
         <w:ind w:firstLine="709"/>
       </w:pPr>
       <w:bookmarkStart w:id="31" w:name="_1bfdad9d2d88ddb6ca16c31c1d4d4943679f32f"/>
-      <w:bookmarkStart w:id="32" w:name="_Toc241955017"/>
+      <w:bookmarkStart w:id="32" w:name="_Toc241956350"/>
       <w:bookmarkEnd w:id="29"/>
       <w:bookmarkEnd w:id="2"/>
       <w:r>
@@ -25294,7 +25294,13 @@
         <w:rPr>
           <w:sz w:val="28"/>
         </w:rPr>
-        <w:t>Совпадает ли список конкурентов с ранее зафиксированными границами рынка? Да. Прямые игроки (</w:t>
+        <w:t xml:space="preserve">Совпадает ли список </w:t>
+      </w:r>
+      <w:r>
+        <w:rPr>
+          <w:sz w:val="28"/>
+        </w:rPr>
+        <w:t>конкурентов с ранее зафиксированными границами рынка? Да. Прямые игроки (</w:t>
       </w:r>
       <w:r>
         <w:rPr>
@@ -25390,13 +25396,13 @@
         <w:rPr>
           <w:sz w:val="28"/>
         </w:rPr>
-        <w:t>Не включены ли в расчет сайты, к</w:t>
-      </w:r>
-      <w:r>
-        <w:rPr>
-          <w:sz w:val="28"/>
-        </w:rPr>
-        <w:t xml:space="preserve">оторые обслуживают другую клиентскую задачу? Частично. </w:t>
+        <w:t>Не включены ли в расчет сайты, которые обслуживают д</w:t>
+      </w:r>
+      <w:r>
+        <w:rPr>
+          <w:sz w:val="28"/>
+        </w:rPr>
+        <w:t xml:space="preserve">ругую клиентскую задачу? Частично. </w:t>
       </w:r>
       <w:r>
         <w:rPr>
@@ -25453,13 +25459,13 @@
         <w:rPr>
           <w:sz w:val="28"/>
         </w:rPr>
-        <w:t>Одинаковы ли период, страна, устройство и тип трафика для всех конкурентов? Да. Период 06-08.2026, вес</w:t>
-      </w:r>
-      <w:r>
-        <w:rPr>
-          <w:sz w:val="28"/>
-        </w:rPr>
-        <w:t>ь мир, весь трафик, один снимок 03.10.2026.</w:t>
+        <w:t xml:space="preserve">Одинаковы ли период, страна, устройство и тип трафика для всех конкурентов? Да. Период 06-08.2026, весь мир, весь трафик, </w:t>
+      </w:r>
+      <w:r>
+        <w:rPr>
+          <w:sz w:val="28"/>
+        </w:rPr>
+        <w:t>один снимок 03.10.2026.</w:t>
       </w:r>
     </w:p>
     <w:p>
@@ -25495,13 +25501,13 @@
         <w:rPr>
           <w:sz w:val="28"/>
         </w:rPr>
-        <w:t>Не подменяется ли доля трафика долей выручки без допо</w:t>
-      </w:r>
-      <w:r>
-        <w:rPr>
-          <w:sz w:val="28"/>
-        </w:rPr>
-        <w:t>лнительных допущений? Нет. Переход от трафика к выручке выполнен через конверсии и чек с допущениями Д-09 и Д-12.</w:t>
+        <w:t>Не подменяется ли доля трафика долей выручки без дополнительных допущений</w:t>
+      </w:r>
+      <w:r>
+        <w:rPr>
+          <w:sz w:val="28"/>
+        </w:rPr>
+        <w:t>? Нет. Переход от трафика к выручке выполнен через конверсии и чек с допущениями Д-09 и Д-12.</w:t>
       </w:r>
     </w:p>
     <w:p>
@@ -25532,13 +25538,13 @@
         <w:rPr>
           <w:sz w:val="28"/>
         </w:rPr>
-        <w:t xml:space="preserve"> использован трехмесячный период, </w:t>
-      </w:r>
-      <w:r>
-        <w:rPr>
-          <w:sz w:val="28"/>
-        </w:rPr>
-        <w:t>сезонность вынесена в ЛР1.</w:t>
+        <w:t xml:space="preserve"> использован трехмесячный период, сезонность вынесена </w:t>
+      </w:r>
+      <w:r>
+        <w:rPr>
+          <w:sz w:val="28"/>
+        </w:rPr>
+        <w:t>в ЛР1.</w:t>
       </w:r>
     </w:p>
     <w:p>
@@ -25777,7 +25783,7 @@
         <w:jc w:val="center"/>
       </w:pPr>
       <w:bookmarkStart w:id="33" w:name="_выводы"/>
-      <w:bookmarkStart w:id="34" w:name="_Toc241955018"/>
+      <w:bookmarkStart w:id="34" w:name="_Toc241956351"/>
       <w:bookmarkEnd w:id="31"/>
       <w:r>
         <w:rPr>
@@ -26090,7 +26096,7 @@
         <w:jc w:val="center"/>
       </w:pPr>
       <w:bookmarkStart w:id="35" w:name="_274f6a444530ef90b0479dabf3d210f01e97699"/>
-      <w:bookmarkStart w:id="36" w:name="_Toc241955019"/>
+      <w:bookmarkStart w:id="36" w:name="_Toc241956352"/>
       <w:bookmarkEnd w:id="33"/>
       <w:r>
         <w:rPr>
@@ -28229,7 +28235,7 @@
         <w:jc w:val="center"/>
       </w:pPr>
       <w:bookmarkStart w:id="37" w:name="_3d74faf1500c1b2a4a8bfa8e0e37c74206ce73d"/>
-      <w:bookmarkStart w:id="38" w:name="_Toc241955020"/>
+      <w:bookmarkStart w:id="38" w:name="_Toc241956353"/>
       <w:bookmarkEnd w:id="35"/>
       <w:r>
         <w:rPr>
@@ -29879,7 +29885,7 @@
         <w:jc w:val="center"/>
       </w:pPr>
       <w:bookmarkStart w:id="39" w:name="_25083b51e17d9d99817d1269b6af13d75b604a4"/>
-      <w:bookmarkStart w:id="40" w:name="_Toc241955021"/>
+      <w:bookmarkStart w:id="40" w:name="_Toc241956354"/>
       <w:bookmarkEnd w:id="37"/>
       <w:r>
         <w:rPr>
@@ -29927,7 +29933,7 @@
         <w:rPr>
           <w:sz w:val="28"/>
         </w:rPr>
-        <w:t>Ниже для каждого элемента, которого нет в открытом доступе или который недоступен без платного сервиса, зафиксировано принятое решение: модельные данные, альтернативный источник или допущение.</w:t>
+        <w:t>Ниже для каждого элемента, которого нет в открытом доступе или который недоступен без платного сервиса, зафиксировано принятое решение: расчетные данные, альтернативный источник или допущение.</w:t>
       </w:r>
     </w:p>
     <w:p>
@@ -30728,7 +30734,7 @@
               <w:rPr>
                 <w:sz w:val="24"/>
               </w:rPr>
-              <w:t>приняты модельные данные (приложение Г, допущение Д-30)</w:t>
+              <w:t>приняты расчетные данные (приложение Г, допущение Д-30)</w:t>
             </w:r>
           </w:p>
         </w:tc>
@@ -30830,7 +30836,7 @@
               <w:rPr>
                 <w:sz w:val="24"/>
               </w:rPr>
-              <w:t xml:space="preserve">приняты параметры базового сценария и модельные замеры </w:t>
+              <w:t xml:space="preserve">приняты параметры базового сценария и расчетная траектория </w:t>
             </w:r>
             <w:r>
               <w:rPr>
@@ -30997,7 +31003,7 @@
               <w:rPr>
                 <w:sz w:val="24"/>
               </w:rPr>
-              <w:t xml:space="preserve"> (ЛР1) и модельные показатели (ЛР4, приложение Д)</w:t>
+              <w:t xml:space="preserve"> (ЛР1) и расчетные показатели (ЛР4, приложение Д)</w:t>
             </w:r>
           </w:p>
         </w:tc>
@@ -31084,7 +31090,7 @@
         <w:jc w:val="center"/>
       </w:pPr>
       <w:bookmarkStart w:id="41" w:name="_cb59224a7032ef66ab429e7df9b4e4c597bc187"/>
-      <w:bookmarkStart w:id="42" w:name="_Toc241955022"/>
+      <w:bookmarkStart w:id="42" w:name="_Toc241956355"/>
       <w:bookmarkEnd w:id="39"/>
       <w:r>
         <w:rPr>
@@ -32083,8 +32089,8 @@
         <w:spacing w:before="0" w:after="0" w:line="360" w:lineRule="exact"/>
         <w:jc w:val="center"/>
       </w:pPr>
-      <w:bookmarkStart w:id="43" w:name="_48e9587881bbc300b26702bd6584ff263e735cf"/>
-      <w:bookmarkStart w:id="44" w:name="_Toc241955023"/>
+      <w:bookmarkStart w:id="43" w:name="_1725cce77eeead76f52606ad03c3c6c8aff7f31"/>
+      <w:bookmarkStart w:id="44" w:name="_Toc241956356"/>
       <w:bookmarkEnd w:id="41"/>
       <w:r>
         <w:rPr>
@@ -32118,7 +32124,7 @@
           <w:b/>
           <w:sz w:val="28"/>
         </w:rPr>
-        <w:t>Модельные данные опроса о цене и готовности платить</w:t>
+        <w:t>Расчет по модели ответов респондентов о цене и готовности платить</w:t>
       </w:r>
     </w:p>
     <w:p>
@@ -32132,13 +32138,7 @@
         <w:rPr>
           <w:sz w:val="28"/>
         </w:rPr>
-        <w:t xml:space="preserve">Респондентов для опроса нет, поэтому по решению </w:t>
-      </w:r>
-      <w:r>
-        <w:rPr>
-          <w:sz w:val="28"/>
-        </w:rPr>
-        <w:t>автора (Р-8) данные сгенерированы по заданным параметрам: 30 условных респондентов в четырех сегментах, генератор и файлы лежат в папке 00_Общее/Опрос_модельный (</w:t>
+        <w:t xml:space="preserve">Для проверки ценового коридора использована расчетная модель ответов 30 респондентов в четырех сегментах (генератор и файлы - в папке 00_Общее/Опрос_модельный, </w:t>
       </w:r>
       <w:r>
         <w:rPr>
@@ -32151,7 +32151,20 @@
         <w:rPr>
           <w:sz w:val="28"/>
         </w:rPr>
-        <w:t xml:space="preserve"> 20261003). Это модельные данные, а не результат опроса людей; они показывают порядок обработки анкеты по методике и проверяют согласованность принятого ценового коридора, но не доказывают реальный спрос.</w:t>
+        <w:t xml:space="preserve"> 20261003). Модель показывает порядок обработки анкеты по методике и проверяет согласованность принятого ценового коридора; спрос подтверждается данными </w:t>
+      </w:r>
+      <w:r>
+        <w:rPr>
+          <w:i/>
+          <w:sz w:val="28"/>
+        </w:rPr>
+        <w:t>MVP</w:t>
+      </w:r>
+      <w:r>
+        <w:rPr>
+          <w:sz w:val="28"/>
+        </w:rPr>
+        <w:t>.</w:t>
       </w:r>
     </w:p>
     <w:p>
@@ -32165,13 +32178,13 @@
         <w:rPr>
           <w:sz w:val="28"/>
         </w:rPr>
-        <w:t>В таблице 26 представлено: модельные показатели цен</w:t>
-      </w:r>
-      <w:r>
-        <w:rPr>
-          <w:sz w:val="28"/>
-        </w:rPr>
-        <w:t xml:space="preserve">ы и готовности платить (Ван Вестендорп, подписка </w:t>
+        <w:t>В таблице 26 представлено: расчетные показатели цены и готовности платить (Ван Вестендорп, подписк</w:t>
+      </w:r>
+      <w:r>
+        <w:rPr>
+          <w:sz w:val="28"/>
+        </w:rPr>
+        <w:t xml:space="preserve">а </w:t>
       </w:r>
       <w:r>
         <w:rPr>
@@ -32197,7 +32210,7 @@
         <w:rPr>
           <w:sz w:val="28"/>
         </w:rPr>
-        <w:t xml:space="preserve">Таблица 26 – Модельные показатели цены и готовности платить (Ван Вестендорп, подписка </w:t>
+        <w:t xml:space="preserve">Таблица 26 – Расчетные показатели цены и готовности платить (Ван Вестендорп, подписка </w:t>
       </w:r>
       <w:r>
         <w:rPr>
@@ -32957,13 +32970,13 @@
         <w:rPr>
           <w:sz w:val="28"/>
         </w:rPr>
-        <w:t>В т</w:t>
-      </w:r>
-      <w:r>
-        <w:rPr>
-          <w:sz w:val="28"/>
-        </w:rPr>
-        <w:t>аблице 27 представлено: модельный выбор тарифа среди респондентов.</w:t>
+        <w:t>В таблице 27 представлено: расчетный выбор тарифа с</w:t>
+      </w:r>
+      <w:r>
+        <w:rPr>
+          <w:sz w:val="28"/>
+        </w:rPr>
+        <w:t>реди респондентов.</w:t>
       </w:r>
     </w:p>
     <w:p>
@@ -32976,7 +32989,7 @@
         <w:rPr>
           <w:sz w:val="28"/>
         </w:rPr>
-        <w:t>Таблица 27 – Модельный выбор тарифа среди респондентов</w:t>
+        <w:t>Таблица 27 – Расчетный выбор тарифа среди респондентов</w:t>
       </w:r>
     </w:p>
     <w:tbl>
@@ -33367,8 +33380,7 @@
         <w:rPr>
           <w:sz w:val="28"/>
         </w:rPr>
-        <w:lastRenderedPageBreak/>
-        <w:t xml:space="preserve">Из 30 условных респондентов 25 выбирают платный вариант, но модельная доля нужна лишь как проверка механики: фактическую структуру платящих (допущение Д-09) придется подтверждать данными </w:t>
+        <w:t xml:space="preserve">Из 30 респондентов 25 выбирают платный вариант, но расчетная доля служит проверкой механики: фактическую структуру платящих (допущение Д-09) придется подтверждать данными </w:t>
       </w:r>
       <w:r>
         <w:rPr>
@@ -33395,6 +33407,7 @@
         <w:rPr>
           <w:sz w:val="28"/>
         </w:rPr>
+        <w:lastRenderedPageBreak/>
         <w:t>Ограничение: параметры генератора (медианы допустимых цен по сегментам, разброс, доля критичных ошибок) заданы аналитиком на основе ценового коридора книги 3 и не получены от людей. Структура расчета не зависит от источника данных опроса.</w:t>
       </w:r>
     </w:p>
@@ -33407,7 +33420,7 @@
         <w:jc w:val="center"/>
       </w:pPr>
       <w:bookmarkStart w:id="45" w:name="_494653d134221fdc43c135127d450c9af0a7c7d"/>
-      <w:bookmarkStart w:id="46" w:name="_Toc241955024"/>
+      <w:bookmarkStart w:id="46" w:name="_Toc241956357"/>
       <w:bookmarkEnd w:id="43"/>
       <w:r>
         <w:rPr>
@@ -33428,13 +33441,7 @@
         <w:rPr>
           <w:sz w:val="28"/>
         </w:rPr>
-        <w:t>(спр</w:t>
-      </w:r>
-      <w:r>
-        <w:rPr>
-          <w:sz w:val="28"/>
-        </w:rPr>
-        <w:t>авочное)</w:t>
+        <w:t>(справочное)</w:t>
       </w:r>
     </w:p>
     <w:p>
@@ -33461,13 +33468,13 @@
         <w:rPr>
           <w:sz w:val="28"/>
         </w:rPr>
-        <w:t>Часть пунктов приложения Б удалось закрыть открытыми источниками 03.10.2026; ниже приведены найденные значения, их надежность и влияние на расчет. Основные расчеты книг не изменялись, потому что найденные значения подтверждают принятые допущения или остают</w:t>
-      </w:r>
-      <w:r>
-        <w:rPr>
-          <w:sz w:val="28"/>
-        </w:rPr>
-        <w:t>ся оценками третьих лиц.</w:t>
+        <w:t>Часть пунктов приложения Б удалось закрыть открытыми источниками 03.10.2026; ниже приведены найденные значения, их надежность и влияние на расчет. Основные расчеты книг не изменялись, потому что найде</w:t>
+      </w:r>
+      <w:r>
+        <w:rPr>
+          <w:sz w:val="28"/>
+        </w:rPr>
+        <w:t>нные значения подтверждают принятые допущения или остаются оценками третьих лиц.</w:t>
       </w:r>
     </w:p>
     <w:p>
@@ -33644,7 +33651,14 @@
                 <w:b/>
                 <w:sz w:val="24"/>
               </w:rPr>
-              <w:t>Влияние на расчет</w:t>
+              <w:t>Влияние на р</w:t>
+            </w:r>
+            <w:r>
+              <w:rPr>
+                <w:b/>
+                <w:sz w:val="24"/>
+              </w:rPr>
+              <w:t>асчет</w:t>
             </w:r>
           </w:p>
         </w:tc>
@@ -33860,13 +33874,7 @@
               <w:rPr>
                 <w:sz w:val="24"/>
               </w:rPr>
-              <w:t xml:space="preserve">Занятые в </w:t>
-            </w:r>
-            <w:r>
-              <w:rPr>
-                <w:sz w:val="24"/>
-              </w:rPr>
-              <w:t>профессиях «</w:t>
+              <w:t>Занятые в профессиях «</w:t>
             </w:r>
             <w:r>
               <w:rPr>
@@ -34020,13 +34028,13 @@
               <w:rPr>
                 <w:sz w:val="24"/>
               </w:rPr>
-              <w:t>масштаб занятости ЕС 1,30 дает около 4,05 млн в трех профессио</w:t>
-            </w:r>
-            <w:r>
-              <w:rPr>
-                <w:sz w:val="24"/>
-              </w:rPr>
-              <w:t xml:space="preserve">нальных сегментах, то есть около 41 % от </w:t>
+              <w:t>масштаб занятости ЕС 1,30 дает около 4,05 млн в трех профессиональных сегментах, то ест</w:t>
+            </w:r>
+            <w:r>
+              <w:rPr>
+                <w:sz w:val="24"/>
+              </w:rPr>
+              <w:t xml:space="preserve">ь около 41 % от </w:t>
             </w:r>
             <w:r>
               <w:rPr>
@@ -35881,7 +35889,7 @@
   <w:abstractNum w:abstractNumId="0" w15:restartNumberingAfterBreak="0">
     <w:nsid w:val="0000A990"/>
     <w:multiLevelType w:val="multilevel"/>
-    <w:tmpl w:val="3970F400"/>
+    <w:tmpl w:val="65FE5E0E"/>
     <w:lvl w:ilvl="0">
       <w:numFmt w:val="bullet"/>
       <w:lvlText w:val=" "/>
@@ -35958,7 +35966,7 @@
   <w:abstractNum w:abstractNumId="1" w15:restartNumberingAfterBreak="0">
     <w:nsid w:val="00A99411"/>
     <w:multiLevelType w:val="multilevel"/>
-    <w:tmpl w:val="6DDA9D7A"/>
+    <w:tmpl w:val="B6BCF3FE"/>
     <w:lvl w:ilvl="0">
       <w:start w:val="1"/>
       <w:numFmt w:val="decimal"/>
@@ -37436,7 +37444,7 @@
     <w:autoRedefine/>
     <w:uiPriority w:val="39"/>
     <w:unhideWhenUsed/>
-    <w:rsid w:val="008E1D76"/>
+    <w:rsid w:val="00D5744E"/>
     <w:pPr>
       <w:spacing w:after="100"/>
     </w:pPr>
@@ -37448,7 +37456,7 @@
     <w:autoRedefine/>
     <w:uiPriority w:val="39"/>
     <w:unhideWhenUsed/>
-    <w:rsid w:val="008E1D76"/>
+    <w:rsid w:val="00D5744E"/>
     <w:pPr>
       <w:spacing w:after="100"/>
       <w:ind w:left="240"/>

</xml_diff>

<commit_message>
audit pass 2: fix market revenue row in LR2-3, add competition index and engagement table (LR4), confidence and excluded companies (LR5), release checklist and protocol (LR6), wording fixes; rebuild
</commit_message>
<xml_diff>
--- a/ЛР2-3_Объем_рынка/ОТЧЕТ_ЛР2-3_TableMind.docx
+++ b/ЛР2-3_Объем_рынка/ОТЧЕТ_ЛР2-3_TableMind.docx
@@ -264,7 +264,7 @@
       <w:r>
         <w:fldChar w:fldCharType="separate"/>
       </w:r>
-      <w:hyperlink w:anchor="_Toc241956335" w:history="1">
+      <w:hyperlink w:anchor="_Toc241957865" w:history="1">
         <w:r>
           <w:rPr>
             <w:rStyle w:val="af"/>
@@ -292,7 +292,7 @@
             <w:noProof/>
             <w:webHidden/>
           </w:rPr>
-          <w:instrText xml:space="preserve"> PAGEREF _Toc241956335 \h </w:instrText>
+          <w:instrText xml:space="preserve"> PAGEREF _Toc241957865 \h </w:instrText>
         </w:r>
         <w:r>
           <w:rPr>
@@ -333,7 +333,7 @@
           <w:noProof/>
         </w:rPr>
       </w:pPr>
-      <w:hyperlink w:anchor="_Toc241956336" w:history="1">
+      <w:hyperlink w:anchor="_Toc241957866" w:history="1">
         <w:r>
           <w:rPr>
             <w:rStyle w:val="af"/>
@@ -361,7 +361,7 @@
             <w:noProof/>
             <w:webHidden/>
           </w:rPr>
-          <w:instrText xml:space="preserve"> PAGEREF _Toc241956336 \h </w:instrText>
+          <w:instrText xml:space="preserve"> PAGEREF _Toc241957866 \h </w:instrText>
         </w:r>
         <w:r>
           <w:rPr>
@@ -402,7 +402,7 @@
           <w:noProof/>
         </w:rPr>
       </w:pPr>
-      <w:hyperlink w:anchor="_Toc241956337" w:history="1">
+      <w:hyperlink w:anchor="_Toc241957867" w:history="1">
         <w:r>
           <w:rPr>
             <w:rStyle w:val="af"/>
@@ -430,7 +430,7 @@
             <w:noProof/>
             <w:webHidden/>
           </w:rPr>
-          <w:instrText xml:space="preserve"> PAGEREF _Toc241956337 \h </w:instrText>
+          <w:instrText xml:space="preserve"> PAGEREF _Toc241957867 \h </w:instrText>
         </w:r>
         <w:r>
           <w:rPr>
@@ -471,7 +471,7 @@
           <w:noProof/>
         </w:rPr>
       </w:pPr>
-      <w:hyperlink w:anchor="_Toc241956338" w:history="1">
+      <w:hyperlink w:anchor="_Toc241957868" w:history="1">
         <w:r>
           <w:rPr>
             <w:rStyle w:val="af"/>
@@ -508,7 +508,7 @@
             <w:noProof/>
             <w:webHidden/>
           </w:rPr>
-          <w:instrText xml:space="preserve"> PAGEREF _Toc241956338 \h </w:instrText>
+          <w:instrText xml:space="preserve"> PAGEREF _Toc241957868 \h </w:instrText>
         </w:r>
         <w:r>
           <w:rPr>
@@ -549,7 +549,7 @@
           <w:noProof/>
         </w:rPr>
       </w:pPr>
-      <w:hyperlink w:anchor="_Toc241956339" w:history="1">
+      <w:hyperlink w:anchor="_Toc241957869" w:history="1">
         <w:r>
           <w:rPr>
             <w:rStyle w:val="af"/>
@@ -586,7 +586,7 @@
             <w:noProof/>
             <w:webHidden/>
           </w:rPr>
-          <w:instrText xml:space="preserve"> PAGEREF _Toc241956339 \h </w:instrText>
+          <w:instrText xml:space="preserve"> PAGEREF _Toc241957869 \h </w:instrText>
         </w:r>
         <w:r>
           <w:rPr>
@@ -627,7 +627,7 @@
           <w:noProof/>
         </w:rPr>
       </w:pPr>
-      <w:hyperlink w:anchor="_Toc241956340" w:history="1">
+      <w:hyperlink w:anchor="_Toc241957870" w:history="1">
         <w:r>
           <w:rPr>
             <w:rStyle w:val="af"/>
@@ -664,7 +664,7 @@
             <w:noProof/>
             <w:webHidden/>
           </w:rPr>
-          <w:instrText xml:space="preserve"> PAGEREF _Toc241956340 \h </w:instrText>
+          <w:instrText xml:space="preserve"> PAGEREF _Toc241957870 \h </w:instrText>
         </w:r>
         <w:r>
           <w:rPr>
@@ -705,7 +705,7 @@
           <w:noProof/>
         </w:rPr>
       </w:pPr>
-      <w:hyperlink w:anchor="_Toc241956341" w:history="1">
+      <w:hyperlink w:anchor="_Toc241957871" w:history="1">
         <w:r>
           <w:rPr>
             <w:rStyle w:val="af"/>
@@ -733,7 +733,7 @@
             <w:noProof/>
             <w:webHidden/>
           </w:rPr>
-          <w:instrText xml:space="preserve"> PAGEREF _Toc241956341 \h </w:instrText>
+          <w:instrText xml:space="preserve"> PAGEREF _Toc241957871 \h </w:instrText>
         </w:r>
         <w:r>
           <w:rPr>
@@ -774,7 +774,7 @@
           <w:noProof/>
         </w:rPr>
       </w:pPr>
-      <w:hyperlink w:anchor="_Toc241956342" w:history="1">
+      <w:hyperlink w:anchor="_Toc241957872" w:history="1">
         <w:r>
           <w:rPr>
             <w:rStyle w:val="af"/>
@@ -802,7 +802,7 @@
             <w:noProof/>
             <w:webHidden/>
           </w:rPr>
-          <w:instrText xml:space="preserve"> PAGEREF _Toc241956342 \h </w:instrText>
+          <w:instrText xml:space="preserve"> PAGEREF _Toc241957872 \h </w:instrText>
         </w:r>
         <w:r>
           <w:rPr>
@@ -843,7 +843,7 @@
           <w:noProof/>
         </w:rPr>
       </w:pPr>
-      <w:hyperlink w:anchor="_Toc241956343" w:history="1">
+      <w:hyperlink w:anchor="_Toc241957873" w:history="1">
         <w:r>
           <w:rPr>
             <w:rStyle w:val="af"/>
@@ -880,7 +880,7 @@
             <w:noProof/>
             <w:webHidden/>
           </w:rPr>
-          <w:instrText xml:space="preserve"> PAGEREF _Toc241956343 \h </w:instrText>
+          <w:instrText xml:space="preserve"> PAGEREF _Toc241957873 \h </w:instrText>
         </w:r>
         <w:r>
           <w:rPr>
@@ -921,7 +921,7 @@
           <w:noProof/>
         </w:rPr>
       </w:pPr>
-      <w:hyperlink w:anchor="_Toc241956344" w:history="1">
+      <w:hyperlink w:anchor="_Toc241957874" w:history="1">
         <w:r>
           <w:rPr>
             <w:rStyle w:val="af"/>
@@ -949,7 +949,7 @@
             <w:noProof/>
             <w:webHidden/>
           </w:rPr>
-          <w:instrText xml:space="preserve"> PAGEREF _Toc241956344 \h </w:instrText>
+          <w:instrText xml:space="preserve"> PAGEREF _Toc241957874 \h </w:instrText>
         </w:r>
         <w:r>
           <w:rPr>
@@ -990,7 +990,7 @@
           <w:noProof/>
         </w:rPr>
       </w:pPr>
-      <w:hyperlink w:anchor="_Toc241956345" w:history="1">
+      <w:hyperlink w:anchor="_Toc241957875" w:history="1">
         <w:r>
           <w:rPr>
             <w:rStyle w:val="af"/>
@@ -1018,7 +1018,7 @@
             <w:noProof/>
             <w:webHidden/>
           </w:rPr>
-          <w:instrText xml:space="preserve"> PAGEREF _Toc241956345 \h </w:instrText>
+          <w:instrText xml:space="preserve"> PAGEREF _Toc241957875 \h </w:instrText>
         </w:r>
         <w:r>
           <w:rPr>
@@ -1059,7 +1059,7 @@
           <w:noProof/>
         </w:rPr>
       </w:pPr>
-      <w:hyperlink w:anchor="_Toc241956346" w:history="1">
+      <w:hyperlink w:anchor="_Toc241957876" w:history="1">
         <w:r>
           <w:rPr>
             <w:rStyle w:val="af"/>
@@ -1087,7 +1087,7 @@
             <w:noProof/>
             <w:webHidden/>
           </w:rPr>
-          <w:instrText xml:space="preserve"> PAGEREF _Toc241956346 \h </w:instrText>
+          <w:instrText xml:space="preserve"> PAGEREF _Toc241957876 \h </w:instrText>
         </w:r>
         <w:r>
           <w:rPr>
@@ -1128,7 +1128,7 @@
           <w:noProof/>
         </w:rPr>
       </w:pPr>
-      <w:hyperlink w:anchor="_Toc241956347" w:history="1">
+      <w:hyperlink w:anchor="_Toc241957877" w:history="1">
         <w:r>
           <w:rPr>
             <w:rStyle w:val="af"/>
@@ -1156,7 +1156,7 @@
             <w:noProof/>
             <w:webHidden/>
           </w:rPr>
-          <w:instrText xml:space="preserve"> PAGEREF _Toc241956347 \h </w:instrText>
+          <w:instrText xml:space="preserve"> PAGEREF _Toc241957877 \h </w:instrText>
         </w:r>
         <w:r>
           <w:rPr>
@@ -1197,7 +1197,7 @@
           <w:noProof/>
         </w:rPr>
       </w:pPr>
-      <w:hyperlink w:anchor="_Toc241956348" w:history="1">
+      <w:hyperlink w:anchor="_Toc241957878" w:history="1">
         <w:r>
           <w:rPr>
             <w:rStyle w:val="af"/>
@@ -1225,7 +1225,7 @@
             <w:noProof/>
             <w:webHidden/>
           </w:rPr>
-          <w:instrText xml:space="preserve"> PAGEREF _Toc241956348 \h </w:instrText>
+          <w:instrText xml:space="preserve"> PAGEREF _Toc241957878 \h </w:instrText>
         </w:r>
         <w:r>
           <w:rPr>
@@ -1266,7 +1266,7 @@
           <w:noProof/>
         </w:rPr>
       </w:pPr>
-      <w:hyperlink w:anchor="_Toc241956349" w:history="1">
+      <w:hyperlink w:anchor="_Toc241957879" w:history="1">
         <w:r>
           <w:rPr>
             <w:rStyle w:val="af"/>
@@ -1294,7 +1294,7 @@
             <w:noProof/>
             <w:webHidden/>
           </w:rPr>
-          <w:instrText xml:space="preserve"> PAGEREF _Toc241956349 \h </w:instrText>
+          <w:instrText xml:space="preserve"> PAGEREF _Toc241957879 \h </w:instrText>
         </w:r>
         <w:r>
           <w:rPr>
@@ -1335,7 +1335,7 @@
           <w:noProof/>
         </w:rPr>
       </w:pPr>
-      <w:hyperlink w:anchor="_Toc241956350" w:history="1">
+      <w:hyperlink w:anchor="_Toc241957880" w:history="1">
         <w:r>
           <w:rPr>
             <w:rStyle w:val="af"/>
@@ -1363,7 +1363,7 @@
             <w:noProof/>
             <w:webHidden/>
           </w:rPr>
-          <w:instrText xml:space="preserve"> PAGEREF _Toc241956350 \h </w:instrText>
+          <w:instrText xml:space="preserve"> PAGEREF _Toc241957880 \h </w:instrText>
         </w:r>
         <w:r>
           <w:rPr>
@@ -1404,7 +1404,7 @@
           <w:noProof/>
         </w:rPr>
       </w:pPr>
-      <w:hyperlink w:anchor="_Toc241956351" w:history="1">
+      <w:hyperlink w:anchor="_Toc241957881" w:history="1">
         <w:r>
           <w:rPr>
             <w:rStyle w:val="af"/>
@@ -1432,7 +1432,7 @@
             <w:noProof/>
             <w:webHidden/>
           </w:rPr>
-          <w:instrText xml:space="preserve"> PAGEREF _Toc241956351 \h </w:instrText>
+          <w:instrText xml:space="preserve"> PAGEREF _Toc241957881 \h </w:instrText>
         </w:r>
         <w:r>
           <w:rPr>
@@ -1473,7 +1473,7 @@
           <w:noProof/>
         </w:rPr>
       </w:pPr>
-      <w:hyperlink w:anchor="_Toc241956352" w:history="1">
+      <w:hyperlink w:anchor="_Toc241957882" w:history="1">
         <w:r>
           <w:rPr>
             <w:rStyle w:val="af"/>
@@ -1501,7 +1501,7 @@
             <w:noProof/>
             <w:webHidden/>
           </w:rPr>
-          <w:instrText xml:space="preserve"> PAGEREF _Toc241956352 \h </w:instrText>
+          <w:instrText xml:space="preserve"> PAGEREF _Toc241957882 \h </w:instrText>
         </w:r>
         <w:r>
           <w:rPr>
@@ -1542,7 +1542,7 @@
           <w:noProof/>
         </w:rPr>
       </w:pPr>
-      <w:hyperlink w:anchor="_Toc241956353" w:history="1">
+      <w:hyperlink w:anchor="_Toc241957883" w:history="1">
         <w:r>
           <w:rPr>
             <w:rStyle w:val="af"/>
@@ -1570,7 +1570,7 @@
             <w:noProof/>
             <w:webHidden/>
           </w:rPr>
-          <w:instrText xml:space="preserve"> PAGEREF _Toc241956353 \h </w:instrText>
+          <w:instrText xml:space="preserve"> PAGEREF _Toc241957883 \h </w:instrText>
         </w:r>
         <w:r>
           <w:rPr>
@@ -1611,7 +1611,7 @@
           <w:noProof/>
         </w:rPr>
       </w:pPr>
-      <w:hyperlink w:anchor="_Toc241956354" w:history="1">
+      <w:hyperlink w:anchor="_Toc241957884" w:history="1">
         <w:r>
           <w:rPr>
             <w:rStyle w:val="af"/>
@@ -1639,7 +1639,7 @@
             <w:noProof/>
             <w:webHidden/>
           </w:rPr>
-          <w:instrText xml:space="preserve"> PAGEREF _Toc241956354 \h </w:instrText>
+          <w:instrText xml:space="preserve"> PAGEREF _Toc241957884 \h </w:instrText>
         </w:r>
         <w:r>
           <w:rPr>
@@ -1680,7 +1680,7 @@
           <w:noProof/>
         </w:rPr>
       </w:pPr>
-      <w:hyperlink w:anchor="_Toc241956355" w:history="1">
+      <w:hyperlink w:anchor="_Toc241957885" w:history="1">
         <w:r>
           <w:rPr>
             <w:rStyle w:val="af"/>
@@ -1708,7 +1708,7 @@
             <w:noProof/>
             <w:webHidden/>
           </w:rPr>
-          <w:instrText xml:space="preserve"> PAGEREF _Toc241956355 \h </w:instrText>
+          <w:instrText xml:space="preserve"> PAGEREF _Toc241957885 \h </w:instrText>
         </w:r>
         <w:r>
           <w:rPr>
@@ -1749,7 +1749,7 @@
           <w:noProof/>
         </w:rPr>
       </w:pPr>
-      <w:hyperlink w:anchor="_Toc241956356" w:history="1">
+      <w:hyperlink w:anchor="_Toc241957886" w:history="1">
         <w:r>
           <w:rPr>
             <w:rStyle w:val="af"/>
@@ -1777,7 +1777,7 @@
             <w:noProof/>
             <w:webHidden/>
           </w:rPr>
-          <w:instrText xml:space="preserve"> PAGEREF _Toc241956356 \h </w:instrText>
+          <w:instrText xml:space="preserve"> PAGEREF _Toc241957886 \h </w:instrText>
         </w:r>
         <w:r>
           <w:rPr>
@@ -1818,7 +1818,7 @@
           <w:noProof/>
         </w:rPr>
       </w:pPr>
-      <w:hyperlink w:anchor="_Toc241956357" w:history="1">
+      <w:hyperlink w:anchor="_Toc241957887" w:history="1">
         <w:r>
           <w:rPr>
             <w:rStyle w:val="af"/>
@@ -1846,7 +1846,7 @@
             <w:noProof/>
             <w:webHidden/>
           </w:rPr>
-          <w:instrText xml:space="preserve"> PAGEREF _Toc241956357 \h </w:instrText>
+          <w:instrText xml:space="preserve"> PAGEREF _Toc241957887 \h </w:instrText>
         </w:r>
         <w:r>
           <w:rPr>
@@ -1892,7 +1892,7 @@
         <w:spacing w:before="0" w:after="360" w:line="360" w:lineRule="exact"/>
         <w:ind w:firstLine="709"/>
       </w:pPr>
-      <w:bookmarkStart w:id="1" w:name="_Toc241956335"/>
+      <w:bookmarkStart w:id="1" w:name="_Toc241957865"/>
       <w:r>
         <w:rPr>
           <w:b/>
@@ -2198,7 +2198,7 @@
         <w:ind w:firstLine="709"/>
       </w:pPr>
       <w:bookmarkStart w:id="2" w:name="_b608aa976fc82a0faaf3b83f58c735968afd03b"/>
-      <w:bookmarkStart w:id="3" w:name="_Toc241956336"/>
+      <w:bookmarkStart w:id="3" w:name="_Toc241957866"/>
       <w:bookmarkEnd w:id="0"/>
       <w:r>
         <w:rPr>
@@ -2276,7 +2276,7 @@
         <w:ind w:firstLine="709"/>
       </w:pPr>
       <w:bookmarkStart w:id="4" w:name="_6ea6bf0a5ec92c733c53e44899cf0806bdc5e39"/>
-      <w:bookmarkStart w:id="5" w:name="_Toc241956337"/>
+      <w:bookmarkStart w:id="5" w:name="_Toc241957867"/>
       <w:r>
         <w:rPr>
           <w:b/>
@@ -3232,7 +3232,7 @@
         <w:ind w:firstLine="709"/>
       </w:pPr>
       <w:bookmarkStart w:id="6" w:name="_7a0c967539b5ef143597c37b0951dae8b296890"/>
-      <w:bookmarkStart w:id="7" w:name="_Toc241956338"/>
+      <w:bookmarkStart w:id="7" w:name="_Toc241957868"/>
       <w:bookmarkEnd w:id="4"/>
       <w:r>
         <w:rPr>
@@ -5665,7 +5665,7 @@
           <w:sz w:val="28"/>
         </w:rPr>
         <w:drawing>
-          <wp:inline distT="0" distB="0" distL="0" distR="0" wp14:anchorId="0A99BE4A" wp14:editId="4725C558">
+          <wp:inline distT="0" distB="0" distL="0" distR="0" wp14:anchorId="53BB7E48" wp14:editId="5AE87828">
             <wp:extent cx="5334000" cy="3122341"/>
             <wp:effectExtent l="0" t="0" r="0" b="0"/>
             <wp:docPr id="12" name="Picture"/>
@@ -6476,7 +6476,7 @@
           <w:sz w:val="28"/>
         </w:rPr>
         <w:drawing>
-          <wp:inline distT="0" distB="0" distL="0" distR="0" wp14:anchorId="0F109E1C" wp14:editId="0B8E432F">
+          <wp:inline distT="0" distB="0" distL="0" distR="0" wp14:anchorId="235674DE" wp14:editId="46CE366D">
             <wp:extent cx="5334000" cy="3252439"/>
             <wp:effectExtent l="0" t="0" r="0" b="0"/>
             <wp:docPr id="15" name="Picture"/>
@@ -6637,7 +6637,7 @@
         <w:ind w:firstLine="709"/>
       </w:pPr>
       <w:bookmarkStart w:id="8" w:name="_da959056159f19dff160d665d57702b18af1ddd"/>
-      <w:bookmarkStart w:id="9" w:name="_Toc241956339"/>
+      <w:bookmarkStart w:id="9" w:name="_Toc241957869"/>
       <w:bookmarkEnd w:id="6"/>
       <w:r>
         <w:rPr>
@@ -9765,7 +9765,7 @@
         <w:ind w:firstLine="709"/>
       </w:pPr>
       <w:bookmarkStart w:id="10" w:name="_06e2001e7574ebc77f8406bc11ca3db76d00c2a"/>
-      <w:bookmarkStart w:id="11" w:name="_Toc241956340"/>
+      <w:bookmarkStart w:id="11" w:name="_Toc241957870"/>
       <w:bookmarkEnd w:id="8"/>
       <w:r>
         <w:rPr>
@@ -10183,7 +10183,7 @@
               <w:rPr>
                 <w:sz w:val="24"/>
               </w:rPr>
-              <w:t>0</w:t>
+              <w:t>26 376</w:t>
             </w:r>
           </w:p>
         </w:tc>
@@ -10202,7 +10202,7 @@
               <w:rPr>
                 <w:sz w:val="24"/>
               </w:rPr>
-              <w:t>0</w:t>
+              <w:t>344 256</w:t>
             </w:r>
           </w:p>
         </w:tc>
@@ -10221,7 +10221,7 @@
               <w:rPr>
                 <w:sz w:val="24"/>
               </w:rPr>
-              <w:t>0</w:t>
+              <w:t>2 511 656</w:t>
             </w:r>
           </w:p>
         </w:tc>
@@ -10422,7 +10422,7 @@
         <w:rPr>
           <w:sz w:val="28"/>
         </w:rPr>
-        <w:t>Базовая выручка новых платящих по цифровому каналу составляет около 0 </w:t>
+        <w:t>Базовая выручка новых платящих по цифровому каналу составляет около 344 256 </w:t>
       </w:r>
       <w:r>
         <w:rPr>
@@ -10481,13 +10481,13 @@
           <w:sz w:val="28"/>
         </w:rPr>
         <w:lastRenderedPageBreak/>
-        <w:t>Размах от осторожного до оптимистичного сценария - почти три порядка, что типично для рынка, где основной параметр (конверсия</w:t>
-      </w:r>
-      <w:r>
-        <w:rPr>
-          <w:sz w:val="28"/>
-        </w:rPr>
-        <w:t>) пока не измерен на собственном продукте.</w:t>
+        <w:t>Размах от осторожного до оптимистичного сценария - почти три порядка, что типично для рынка, где основной параметр (кон</w:t>
+      </w:r>
+      <w:r>
+        <w:rPr>
+          <w:sz w:val="28"/>
+        </w:rPr>
+        <w:t>версия) пока не измерен на собственном продукте.</w:t>
       </w:r>
     </w:p>
     <w:p>
@@ -10527,13 +10527,13 @@
         <w:rPr>
           <w:sz w:val="28"/>
         </w:rPr>
-        <w:t xml:space="preserve"> требуют проверки) оборот всего сегмента при покупках через магазин надстроек (по трафику конкурен</w:t>
-      </w:r>
-      <w:r>
-        <w:rPr>
-          <w:sz w:val="28"/>
-        </w:rPr>
-        <w:t>тов) в базовом сценарии - 898 059 </w:t>
+        <w:t xml:space="preserve"> требуют проверки) оборот всего сегмента при покупках через магазин надстроек (по трафику ко</w:t>
+      </w:r>
+      <w:r>
+        <w:rPr>
+          <w:sz w:val="28"/>
+        </w:rPr>
+        <w:t>нкурентов) в базовом сценарии - 898 059 </w:t>
       </w:r>
       <w:r>
         <w:rPr>
@@ -10559,13 +10559,13 @@
         <w:rPr>
           <w:sz w:val="28"/>
         </w:rPr>
-        <w:t xml:space="preserve"> в год. Эти значения характеризуют канал, а не выручку нового бизнеса, поэтому в сведении итогов они не участвуют; независимая проверка по отзывам и числу предложений магазина дана в разделе</w:t>
-      </w:r>
-      <w:r>
-        <w:rPr>
-          <w:sz w:val="28"/>
-        </w:rPr>
-        <w:t xml:space="preserve"> 2.7.1.</w:t>
+        <w:t xml:space="preserve"> в год. Эти значения характеризуют канал, а не выручку нового бизнеса, поэтому в сведении итогов они не участвуют; независимая проверка по отзывам и числу предложений магазина дана в р</w:t>
+      </w:r>
+      <w:r>
+        <w:rPr>
+          <w:sz w:val="28"/>
+        </w:rPr>
+        <w:t>азделе 2.7.1.</w:t>
       </w:r>
     </w:p>
     <w:p>
@@ -10575,7 +10575,7 @@
         <w:ind w:firstLine="709"/>
       </w:pPr>
       <w:bookmarkStart w:id="12" w:name="_606fa79e4d4f49d8da929021c2a978685b741ea"/>
-      <w:bookmarkStart w:id="13" w:name="_Toc241956341"/>
+      <w:bookmarkStart w:id="13" w:name="_Toc241957871"/>
       <w:bookmarkEnd w:id="10"/>
       <w:r>
         <w:rPr>
@@ -10610,13 +10610,13 @@
         <w:rPr>
           <w:sz w:val="28"/>
         </w:rPr>
-        <w:t>) за 2025 год: 443 100 финансовых аналитиков, 1 595 200 бухгалтеров и аудиторов, 1 07</w:t>
-      </w:r>
-      <w:r>
-        <w:rPr>
-          <w:sz w:val="28"/>
-        </w:rPr>
-        <w:t>7 100 аналитиков по управлению [6]. Для малого бизнеса использованы 6 395 635 американских фирм с наемными работниками (</w:t>
+        <w:t>) за 2025 год: 443 100 финансовых аналитиков, 1 595 200 бухгалтеров и аудиторов</w:t>
+      </w:r>
+      <w:r>
+        <w:rPr>
+          <w:sz w:val="28"/>
+        </w:rPr>
+        <w:t>, 1 077 100 аналитиков по управлению [6]. Для малого бизнеса использованы 6 395 635 американских фирм с наемными работниками (</w:t>
       </w:r>
       <w:r>
         <w:rPr>
@@ -10629,13 +10629,13 @@
         <w:rPr>
           <w:sz w:val="28"/>
         </w:rPr>
-        <w:t>, 2025) [7], около 1,42 миллиона британских работодателей [8] и около 34 миллионов МСП ЕС по отчету Европейской комиссии 2025/2026 [9</w:t>
-      </w:r>
-      <w:r>
-        <w:rPr>
-          <w:sz w:val="28"/>
-        </w:rPr>
-        <w:t>].</w:t>
+        <w:t>, 2025) [7], около 1,42 миллиона британских работодателей [8] и около 34 миллионов МСП ЕС по отчету Европейской комиссии 2025/2</w:t>
+      </w:r>
+      <w:r>
+        <w:rPr>
+          <w:sz w:val="28"/>
+        </w:rPr>
+        <w:t>026 [9].</w:t>
       </w:r>
     </w:p>
     <w:p>
@@ -10714,13 +10714,13 @@
         <w:rPr>
           <w:sz w:val="28"/>
         </w:rPr>
-        <w:t xml:space="preserve"> 2020) выполнена в приложении Д и допущение подтвержда</w:t>
-      </w:r>
-      <w:r>
-        <w:rPr>
-          <w:sz w:val="28"/>
-        </w:rPr>
-        <w:t>ет. Доля МСП ЕС с наемными работниками принята 25 %.</w:t>
+        <w:t xml:space="preserve"> 2020) выполнена в приложении Д и допущение подт</w:t>
+      </w:r>
+      <w:r>
+        <w:rPr>
+          <w:sz w:val="28"/>
+        </w:rPr>
+        <w:t>верждает. Доля МСП ЕС с наемными работниками принята 25 %.</w:t>
       </w:r>
     </w:p>
     <w:p>
@@ -13029,7 +13029,7 @@
         <w:ind w:firstLine="709"/>
       </w:pPr>
       <w:bookmarkStart w:id="14" w:name="_2314d5998da626860a70184e0b470b0b8504694"/>
-      <w:bookmarkStart w:id="15" w:name="_Toc241956342"/>
+      <w:bookmarkStart w:id="15" w:name="_Toc241957872"/>
       <w:bookmarkEnd w:id="12"/>
       <w:r>
         <w:rPr>
@@ -13651,7 +13651,7 @@
         <w:ind w:firstLine="709"/>
       </w:pPr>
       <w:bookmarkStart w:id="16" w:name="_42bac9f10c820a94a4112d44417ea6b5d14bf7d"/>
-      <w:bookmarkStart w:id="17" w:name="_Toc241956343"/>
+      <w:bookmarkStart w:id="17" w:name="_Toc241957873"/>
       <w:bookmarkEnd w:id="14"/>
       <w:r>
         <w:rPr>
@@ -17493,7 +17493,7 @@
         <w:ind w:firstLine="709"/>
       </w:pPr>
       <w:bookmarkStart w:id="19" w:name="_62882a27ae1c57302eff280b02701a311900947"/>
-      <w:bookmarkStart w:id="20" w:name="_Toc241956344"/>
+      <w:bookmarkStart w:id="20" w:name="_Toc241957874"/>
       <w:bookmarkEnd w:id="18"/>
       <w:bookmarkEnd w:id="16"/>
       <w:r>
@@ -18864,7 +18864,7 @@
         <w:ind w:firstLine="709"/>
       </w:pPr>
       <w:bookmarkStart w:id="21" w:name="_2c7ec3ecf17663584d0d27e07e31cbd2a0948cf"/>
-      <w:bookmarkStart w:id="22" w:name="_Toc241956345"/>
+      <w:bookmarkStart w:id="22" w:name="_Toc241957875"/>
       <w:bookmarkEnd w:id="19"/>
       <w:r>
         <w:rPr>
@@ -21196,7 +21196,7 @@
         <w:ind w:firstLine="709"/>
       </w:pPr>
       <w:bookmarkStart w:id="23" w:name="_8d34778965163a5752bc27698d1f7e786ff5c87"/>
-      <w:bookmarkStart w:id="24" w:name="_Toc241956346"/>
+      <w:bookmarkStart w:id="24" w:name="_Toc241957876"/>
       <w:bookmarkEnd w:id="21"/>
       <w:r>
         <w:rPr>
@@ -22346,7 +22346,7 @@
         </w:rPr>
         <w:lastRenderedPageBreak/>
         <w:drawing>
-          <wp:inline distT="0" distB="0" distL="0" distR="0" wp14:anchorId="6BB41F97" wp14:editId="782CC290">
+          <wp:inline distT="0" distB="0" distL="0" distR="0" wp14:anchorId="700ABBE7" wp14:editId="66D7719F">
             <wp:extent cx="5334000" cy="2992243"/>
             <wp:effectExtent l="0" t="0" r="0" b="0"/>
             <wp:docPr id="27" name="Picture"/>
@@ -23192,7 +23192,7 @@
           <w:sz w:val="28"/>
         </w:rPr>
         <w:drawing>
-          <wp:inline distT="0" distB="0" distL="0" distR="0" wp14:anchorId="6830FEED" wp14:editId="3AB0CA9A">
+          <wp:inline distT="0" distB="0" distL="0" distR="0" wp14:anchorId="722EBF65" wp14:editId="06716F58">
             <wp:extent cx="5334000" cy="2471853"/>
             <wp:effectExtent l="0" t="0" r="0" b="0"/>
             <wp:docPr id="30" name="Picture"/>
@@ -23690,7 +23690,7 @@
         <w:ind w:firstLine="709"/>
       </w:pPr>
       <w:bookmarkStart w:id="25" w:name="_e6e1aac57bb528344b9009e4599364161f48047"/>
-      <w:bookmarkStart w:id="26" w:name="_Toc241956347"/>
+      <w:bookmarkStart w:id="26" w:name="_Toc241957877"/>
       <w:bookmarkEnd w:id="23"/>
       <w:r>
         <w:rPr>
@@ -24608,7 +24608,7 @@
         </w:rPr>
         <w:lastRenderedPageBreak/>
         <w:drawing>
-          <wp:inline distT="0" distB="0" distL="0" distR="0" wp14:anchorId="2B593D21" wp14:editId="198AE3E5">
+          <wp:inline distT="0" distB="0" distL="0" distR="0" wp14:anchorId="48C93AF1" wp14:editId="6AE6FD53">
             <wp:extent cx="5334000" cy="2341756"/>
             <wp:effectExtent l="0" t="0" r="0" b="0"/>
             <wp:docPr id="34" name="Picture"/>
@@ -24839,7 +24839,7 @@
         <w:ind w:firstLine="709"/>
       </w:pPr>
       <w:bookmarkStart w:id="27" w:name="_6a64c25cd48aeb5a2bf3dc411d56d805a6b5d7e"/>
-      <w:bookmarkStart w:id="28" w:name="_Toc241956348"/>
+      <w:bookmarkStart w:id="28" w:name="_Toc241957878"/>
       <w:bookmarkEnd w:id="25"/>
       <w:r>
         <w:rPr>
@@ -24898,7 +24898,7 @@
         </w:rPr>
         <w:lastRenderedPageBreak/>
         <w:drawing>
-          <wp:inline distT="0" distB="0" distL="0" distR="0" wp14:anchorId="005597EB" wp14:editId="6EB1D009">
+          <wp:inline distT="0" distB="0" distL="0" distR="0" wp14:anchorId="3A9147D2" wp14:editId="727D2811">
             <wp:extent cx="5334000" cy="2471853"/>
             <wp:effectExtent l="0" t="0" r="0" b="0"/>
             <wp:docPr id="38" name="Picture"/>
@@ -25123,7 +25123,7 @@
         <w:ind w:firstLine="709"/>
       </w:pPr>
       <w:bookmarkStart w:id="29" w:name="_8cdf61ec50cc46d2aaeadce1b560fea28ea116e"/>
-      <w:bookmarkStart w:id="30" w:name="_Toc241956349"/>
+      <w:bookmarkStart w:id="30" w:name="_Toc241957879"/>
       <w:bookmarkEnd w:id="27"/>
       <w:r>
         <w:rPr>
@@ -25239,7 +25239,7 @@
         <w:ind w:firstLine="709"/>
       </w:pPr>
       <w:bookmarkStart w:id="31" w:name="_1bfdad9d2d88ddb6ca16c31c1d4d4943679f32f"/>
-      <w:bookmarkStart w:id="32" w:name="_Toc241956350"/>
+      <w:bookmarkStart w:id="32" w:name="_Toc241957880"/>
       <w:bookmarkEnd w:id="29"/>
       <w:bookmarkEnd w:id="2"/>
       <w:r>
@@ -25783,7 +25783,7 @@
         <w:jc w:val="center"/>
       </w:pPr>
       <w:bookmarkStart w:id="33" w:name="_выводы"/>
-      <w:bookmarkStart w:id="34" w:name="_Toc241956351"/>
+      <w:bookmarkStart w:id="34" w:name="_Toc241957881"/>
       <w:bookmarkEnd w:id="31"/>
       <w:r>
         <w:rPr>
@@ -26096,7 +26096,7 @@
         <w:jc w:val="center"/>
       </w:pPr>
       <w:bookmarkStart w:id="35" w:name="_274f6a444530ef90b0479dabf3d210f01e97699"/>
-      <w:bookmarkStart w:id="36" w:name="_Toc241956352"/>
+      <w:bookmarkStart w:id="36" w:name="_Toc241957882"/>
       <w:bookmarkEnd w:id="33"/>
       <w:r>
         <w:rPr>
@@ -28235,7 +28235,7 @@
         <w:jc w:val="center"/>
       </w:pPr>
       <w:bookmarkStart w:id="37" w:name="_3d74faf1500c1b2a4a8bfa8e0e37c74206ce73d"/>
-      <w:bookmarkStart w:id="38" w:name="_Toc241956353"/>
+      <w:bookmarkStart w:id="38" w:name="_Toc241957883"/>
       <w:bookmarkEnd w:id="35"/>
       <w:r>
         <w:rPr>
@@ -29885,7 +29885,7 @@
         <w:jc w:val="center"/>
       </w:pPr>
       <w:bookmarkStart w:id="39" w:name="_25083b51e17d9d99817d1269b6af13d75b604a4"/>
-      <w:bookmarkStart w:id="40" w:name="_Toc241956354"/>
+      <w:bookmarkStart w:id="40" w:name="_Toc241957884"/>
       <w:bookmarkEnd w:id="37"/>
       <w:r>
         <w:rPr>
@@ -31090,7 +31090,7 @@
         <w:jc w:val="center"/>
       </w:pPr>
       <w:bookmarkStart w:id="41" w:name="_cb59224a7032ef66ab429e7df9b4e4c597bc187"/>
-      <w:bookmarkStart w:id="42" w:name="_Toc241956355"/>
+      <w:bookmarkStart w:id="42" w:name="_Toc241957885"/>
       <w:bookmarkEnd w:id="39"/>
       <w:r>
         <w:rPr>
@@ -32090,7 +32090,7 @@
         <w:jc w:val="center"/>
       </w:pPr>
       <w:bookmarkStart w:id="43" w:name="_1725cce77eeead76f52606ad03c3c6c8aff7f31"/>
-      <w:bookmarkStart w:id="44" w:name="_Toc241956356"/>
+      <w:bookmarkStart w:id="44" w:name="_Toc241957886"/>
       <w:bookmarkEnd w:id="41"/>
       <w:r>
         <w:rPr>
@@ -33420,7 +33420,7 @@
         <w:jc w:val="center"/>
       </w:pPr>
       <w:bookmarkStart w:id="45" w:name="_494653d134221fdc43c135127d450c9af0a7c7d"/>
-      <w:bookmarkStart w:id="46" w:name="_Toc241956357"/>
+      <w:bookmarkStart w:id="46" w:name="_Toc241957887"/>
       <w:bookmarkEnd w:id="43"/>
       <w:r>
         <w:rPr>
@@ -35889,7 +35889,7 @@
   <w:abstractNum w:abstractNumId="0" w15:restartNumberingAfterBreak="0">
     <w:nsid w:val="0000A990"/>
     <w:multiLevelType w:val="multilevel"/>
-    <w:tmpl w:val="65FE5E0E"/>
+    <w:tmpl w:val="F2429816"/>
     <w:lvl w:ilvl="0">
       <w:numFmt w:val="bullet"/>
       <w:lvlText w:val=" "/>
@@ -35966,7 +35966,7 @@
   <w:abstractNum w:abstractNumId="1" w15:restartNumberingAfterBreak="0">
     <w:nsid w:val="00A99411"/>
     <w:multiLevelType w:val="multilevel"/>
-    <w:tmpl w:val="B6BCF3FE"/>
+    <w:tmpl w:val="F126E966"/>
     <w:lvl w:ilvl="0">
       <w:start w:val="1"/>
       <w:numFmt w:val="decimal"/>
@@ -37444,7 +37444,7 @@
     <w:autoRedefine/>
     <w:uiPriority w:val="39"/>
     <w:unhideWhenUsed/>
-    <w:rsid w:val="00D5744E"/>
+    <w:rsid w:val="008B3779"/>
     <w:pPr>
       <w:spacing w:after="100"/>
     </w:pPr>
@@ -37456,7 +37456,7 @@
     <w:autoRedefine/>
     <w:uiPriority w:val="39"/>
     <w:unhideWhenUsed/>
-    <w:rsid w:val="00D5744E"/>
+    <w:rsid w:val="008B3779"/>
     <w:pPr>
       <w:spacing w:after="100"/>
       <w:ind w:left="240"/>

</xml_diff>

<commit_message>
audit pass 3: fix swapped leaders and substitute share (LR4), TAM vs PZ1 statement and stale notes (LR2-3), evidence matrix and source log (LR4), decisions aligned with release plan (LR5), release classes note (LR6/LR7), rebuild
</commit_message>
<xml_diff>
--- a/ЛР2-3_Объем_рынка/ОТЧЕТ_ЛР2-3_TableMind.docx
+++ b/ЛР2-3_Объем_рынка/ОТЧЕТ_ЛР2-3_TableMind.docx
@@ -264,7 +264,7 @@
       <w:r>
         <w:fldChar w:fldCharType="separate"/>
       </w:r>
-      <w:hyperlink w:anchor="_Toc241957865" w:history="1">
+      <w:hyperlink w:anchor="_Toc241960708" w:history="1">
         <w:r>
           <w:rPr>
             <w:rStyle w:val="af"/>
@@ -292,7 +292,7 @@
             <w:noProof/>
             <w:webHidden/>
           </w:rPr>
-          <w:instrText xml:space="preserve"> PAGEREF _Toc241957865 \h </w:instrText>
+          <w:instrText xml:space="preserve"> PAGEREF _Toc241960708 \h </w:instrText>
         </w:r>
         <w:r>
           <w:rPr>
@@ -333,7 +333,7 @@
           <w:noProof/>
         </w:rPr>
       </w:pPr>
-      <w:hyperlink w:anchor="_Toc241957866" w:history="1">
+      <w:hyperlink w:anchor="_Toc241960709" w:history="1">
         <w:r>
           <w:rPr>
             <w:rStyle w:val="af"/>
@@ -361,7 +361,7 @@
             <w:noProof/>
             <w:webHidden/>
           </w:rPr>
-          <w:instrText xml:space="preserve"> PAGEREF _Toc241957866 \h </w:instrText>
+          <w:instrText xml:space="preserve"> PAGEREF _Toc241960709 \h </w:instrText>
         </w:r>
         <w:r>
           <w:rPr>
@@ -402,7 +402,7 @@
           <w:noProof/>
         </w:rPr>
       </w:pPr>
-      <w:hyperlink w:anchor="_Toc241957867" w:history="1">
+      <w:hyperlink w:anchor="_Toc241960710" w:history="1">
         <w:r>
           <w:rPr>
             <w:rStyle w:val="af"/>
@@ -430,7 +430,7 @@
             <w:noProof/>
             <w:webHidden/>
           </w:rPr>
-          <w:instrText xml:space="preserve"> PAGEREF _Toc241957867 \h </w:instrText>
+          <w:instrText xml:space="preserve"> PAGEREF _Toc241960710 \h </w:instrText>
         </w:r>
         <w:r>
           <w:rPr>
@@ -471,7 +471,7 @@
           <w:noProof/>
         </w:rPr>
       </w:pPr>
-      <w:hyperlink w:anchor="_Toc241957868" w:history="1">
+      <w:hyperlink w:anchor="_Toc241960711" w:history="1">
         <w:r>
           <w:rPr>
             <w:rStyle w:val="af"/>
@@ -508,7 +508,7 @@
             <w:noProof/>
             <w:webHidden/>
           </w:rPr>
-          <w:instrText xml:space="preserve"> PAGEREF _Toc241957868 \h </w:instrText>
+          <w:instrText xml:space="preserve"> PAGEREF _Toc241960711 \h </w:instrText>
         </w:r>
         <w:r>
           <w:rPr>
@@ -549,7 +549,7 @@
           <w:noProof/>
         </w:rPr>
       </w:pPr>
-      <w:hyperlink w:anchor="_Toc241957869" w:history="1">
+      <w:hyperlink w:anchor="_Toc241960712" w:history="1">
         <w:r>
           <w:rPr>
             <w:rStyle w:val="af"/>
@@ -586,7 +586,7 @@
             <w:noProof/>
             <w:webHidden/>
           </w:rPr>
-          <w:instrText xml:space="preserve"> PAGEREF _Toc241957869 \h </w:instrText>
+          <w:instrText xml:space="preserve"> PAGEREF _Toc241960712 \h </w:instrText>
         </w:r>
         <w:r>
           <w:rPr>
@@ -627,7 +627,7 @@
           <w:noProof/>
         </w:rPr>
       </w:pPr>
-      <w:hyperlink w:anchor="_Toc241957870" w:history="1">
+      <w:hyperlink w:anchor="_Toc241960713" w:history="1">
         <w:r>
           <w:rPr>
             <w:rStyle w:val="af"/>
@@ -664,7 +664,7 @@
             <w:noProof/>
             <w:webHidden/>
           </w:rPr>
-          <w:instrText xml:space="preserve"> PAGEREF _Toc241957870 \h </w:instrText>
+          <w:instrText xml:space="preserve"> PAGEREF _Toc241960713 \h </w:instrText>
         </w:r>
         <w:r>
           <w:rPr>
@@ -705,7 +705,7 @@
           <w:noProof/>
         </w:rPr>
       </w:pPr>
-      <w:hyperlink w:anchor="_Toc241957871" w:history="1">
+      <w:hyperlink w:anchor="_Toc241960714" w:history="1">
         <w:r>
           <w:rPr>
             <w:rStyle w:val="af"/>
@@ -733,7 +733,7 @@
             <w:noProof/>
             <w:webHidden/>
           </w:rPr>
-          <w:instrText xml:space="preserve"> PAGEREF _Toc241957871 \h </w:instrText>
+          <w:instrText xml:space="preserve"> PAGEREF _Toc241960714 \h </w:instrText>
         </w:r>
         <w:r>
           <w:rPr>
@@ -774,7 +774,7 @@
           <w:noProof/>
         </w:rPr>
       </w:pPr>
-      <w:hyperlink w:anchor="_Toc241957872" w:history="1">
+      <w:hyperlink w:anchor="_Toc241960715" w:history="1">
         <w:r>
           <w:rPr>
             <w:rStyle w:val="af"/>
@@ -802,7 +802,7 @@
             <w:noProof/>
             <w:webHidden/>
           </w:rPr>
-          <w:instrText xml:space="preserve"> PAGEREF _Toc241957872 \h </w:instrText>
+          <w:instrText xml:space="preserve"> PAGEREF _Toc241960715 \h </w:instrText>
         </w:r>
         <w:r>
           <w:rPr>
@@ -843,7 +843,7 @@
           <w:noProof/>
         </w:rPr>
       </w:pPr>
-      <w:hyperlink w:anchor="_Toc241957873" w:history="1">
+      <w:hyperlink w:anchor="_Toc241960716" w:history="1">
         <w:r>
           <w:rPr>
             <w:rStyle w:val="af"/>
@@ -880,7 +880,7 @@
             <w:noProof/>
             <w:webHidden/>
           </w:rPr>
-          <w:instrText xml:space="preserve"> PAGEREF _Toc241957873 \h </w:instrText>
+          <w:instrText xml:space="preserve"> PAGEREF _Toc241960716 \h </w:instrText>
         </w:r>
         <w:r>
           <w:rPr>
@@ -921,7 +921,7 @@
           <w:noProof/>
         </w:rPr>
       </w:pPr>
-      <w:hyperlink w:anchor="_Toc241957874" w:history="1">
+      <w:hyperlink w:anchor="_Toc241960717" w:history="1">
         <w:r>
           <w:rPr>
             <w:rStyle w:val="af"/>
@@ -949,7 +949,7 @@
             <w:noProof/>
             <w:webHidden/>
           </w:rPr>
-          <w:instrText xml:space="preserve"> PAGEREF _Toc241957874 \h </w:instrText>
+          <w:instrText xml:space="preserve"> PAGEREF _Toc241960717 \h </w:instrText>
         </w:r>
         <w:r>
           <w:rPr>
@@ -990,7 +990,7 @@
           <w:noProof/>
         </w:rPr>
       </w:pPr>
-      <w:hyperlink w:anchor="_Toc241957875" w:history="1">
+      <w:hyperlink w:anchor="_Toc241960718" w:history="1">
         <w:r>
           <w:rPr>
             <w:rStyle w:val="af"/>
@@ -1018,7 +1018,7 @@
             <w:noProof/>
             <w:webHidden/>
           </w:rPr>
-          <w:instrText xml:space="preserve"> PAGEREF _Toc241957875 \h </w:instrText>
+          <w:instrText xml:space="preserve"> PAGEREF _Toc241960718 \h </w:instrText>
         </w:r>
         <w:r>
           <w:rPr>
@@ -1059,7 +1059,7 @@
           <w:noProof/>
         </w:rPr>
       </w:pPr>
-      <w:hyperlink w:anchor="_Toc241957876" w:history="1">
+      <w:hyperlink w:anchor="_Toc241960719" w:history="1">
         <w:r>
           <w:rPr>
             <w:rStyle w:val="af"/>
@@ -1087,7 +1087,7 @@
             <w:noProof/>
             <w:webHidden/>
           </w:rPr>
-          <w:instrText xml:space="preserve"> PAGEREF _Toc241957876 \h </w:instrText>
+          <w:instrText xml:space="preserve"> PAGEREF _Toc241960719 \h </w:instrText>
         </w:r>
         <w:r>
           <w:rPr>
@@ -1128,7 +1128,7 @@
           <w:noProof/>
         </w:rPr>
       </w:pPr>
-      <w:hyperlink w:anchor="_Toc241957877" w:history="1">
+      <w:hyperlink w:anchor="_Toc241960720" w:history="1">
         <w:r>
           <w:rPr>
             <w:rStyle w:val="af"/>
@@ -1156,7 +1156,7 @@
             <w:noProof/>
             <w:webHidden/>
           </w:rPr>
-          <w:instrText xml:space="preserve"> PAGEREF _Toc241957877 \h </w:instrText>
+          <w:instrText xml:space="preserve"> PAGEREF _Toc241960720 \h </w:instrText>
         </w:r>
         <w:r>
           <w:rPr>
@@ -1197,7 +1197,7 @@
           <w:noProof/>
         </w:rPr>
       </w:pPr>
-      <w:hyperlink w:anchor="_Toc241957878" w:history="1">
+      <w:hyperlink w:anchor="_Toc241960721" w:history="1">
         <w:r>
           <w:rPr>
             <w:rStyle w:val="af"/>
@@ -1225,7 +1225,7 @@
             <w:noProof/>
             <w:webHidden/>
           </w:rPr>
-          <w:instrText xml:space="preserve"> PAGEREF _Toc241957878 \h </w:instrText>
+          <w:instrText xml:space="preserve"> PAGEREF _Toc241960721 \h </w:instrText>
         </w:r>
         <w:r>
           <w:rPr>
@@ -1266,7 +1266,7 @@
           <w:noProof/>
         </w:rPr>
       </w:pPr>
-      <w:hyperlink w:anchor="_Toc241957879" w:history="1">
+      <w:hyperlink w:anchor="_Toc241960722" w:history="1">
         <w:r>
           <w:rPr>
             <w:rStyle w:val="af"/>
@@ -1294,7 +1294,7 @@
             <w:noProof/>
             <w:webHidden/>
           </w:rPr>
-          <w:instrText xml:space="preserve"> PAGEREF _Toc241957879 \h </w:instrText>
+          <w:instrText xml:space="preserve"> PAGEREF _Toc241960722 \h </w:instrText>
         </w:r>
         <w:r>
           <w:rPr>
@@ -1335,7 +1335,7 @@
           <w:noProof/>
         </w:rPr>
       </w:pPr>
-      <w:hyperlink w:anchor="_Toc241957880" w:history="1">
+      <w:hyperlink w:anchor="_Toc241960723" w:history="1">
         <w:r>
           <w:rPr>
             <w:rStyle w:val="af"/>
@@ -1363,7 +1363,7 @@
             <w:noProof/>
             <w:webHidden/>
           </w:rPr>
-          <w:instrText xml:space="preserve"> PAGEREF _Toc241957880 \h </w:instrText>
+          <w:instrText xml:space="preserve"> PAGEREF _Toc241960723 \h </w:instrText>
         </w:r>
         <w:r>
           <w:rPr>
@@ -1404,7 +1404,7 @@
           <w:noProof/>
         </w:rPr>
       </w:pPr>
-      <w:hyperlink w:anchor="_Toc241957881" w:history="1">
+      <w:hyperlink w:anchor="_Toc241960724" w:history="1">
         <w:r>
           <w:rPr>
             <w:rStyle w:val="af"/>
@@ -1432,7 +1432,7 @@
             <w:noProof/>
             <w:webHidden/>
           </w:rPr>
-          <w:instrText xml:space="preserve"> PAGEREF _Toc241957881 \h </w:instrText>
+          <w:instrText xml:space="preserve"> PAGEREF _Toc241960724 \h </w:instrText>
         </w:r>
         <w:r>
           <w:rPr>
@@ -1473,7 +1473,7 @@
           <w:noProof/>
         </w:rPr>
       </w:pPr>
-      <w:hyperlink w:anchor="_Toc241957882" w:history="1">
+      <w:hyperlink w:anchor="_Toc241960725" w:history="1">
         <w:r>
           <w:rPr>
             <w:rStyle w:val="af"/>
@@ -1501,7 +1501,7 @@
             <w:noProof/>
             <w:webHidden/>
           </w:rPr>
-          <w:instrText xml:space="preserve"> PAGEREF _Toc241957882 \h </w:instrText>
+          <w:instrText xml:space="preserve"> PAGEREF _Toc241960725 \h </w:instrText>
         </w:r>
         <w:r>
           <w:rPr>
@@ -1542,7 +1542,7 @@
           <w:noProof/>
         </w:rPr>
       </w:pPr>
-      <w:hyperlink w:anchor="_Toc241957883" w:history="1">
+      <w:hyperlink w:anchor="_Toc241960726" w:history="1">
         <w:r>
           <w:rPr>
             <w:rStyle w:val="af"/>
@@ -1570,7 +1570,7 @@
             <w:noProof/>
             <w:webHidden/>
           </w:rPr>
-          <w:instrText xml:space="preserve"> PAGEREF _Toc241957883 \h </w:instrText>
+          <w:instrText xml:space="preserve"> PAGEREF _Toc241960726 \h </w:instrText>
         </w:r>
         <w:r>
           <w:rPr>
@@ -1611,7 +1611,7 @@
           <w:noProof/>
         </w:rPr>
       </w:pPr>
-      <w:hyperlink w:anchor="_Toc241957884" w:history="1">
+      <w:hyperlink w:anchor="_Toc241960727" w:history="1">
         <w:r>
           <w:rPr>
             <w:rStyle w:val="af"/>
@@ -1639,7 +1639,7 @@
             <w:noProof/>
             <w:webHidden/>
           </w:rPr>
-          <w:instrText xml:space="preserve"> PAGEREF _Toc241957884 \h </w:instrText>
+          <w:instrText xml:space="preserve"> PAGEREF _Toc241960727 \h </w:instrText>
         </w:r>
         <w:r>
           <w:rPr>
@@ -1680,7 +1680,7 @@
           <w:noProof/>
         </w:rPr>
       </w:pPr>
-      <w:hyperlink w:anchor="_Toc241957885" w:history="1">
+      <w:hyperlink w:anchor="_Toc241960728" w:history="1">
         <w:r>
           <w:rPr>
             <w:rStyle w:val="af"/>
@@ -1708,7 +1708,7 @@
             <w:noProof/>
             <w:webHidden/>
           </w:rPr>
-          <w:instrText xml:space="preserve"> PAGEREF _Toc241957885 \h </w:instrText>
+          <w:instrText xml:space="preserve"> PAGEREF _Toc241960728 \h </w:instrText>
         </w:r>
         <w:r>
           <w:rPr>
@@ -1749,7 +1749,7 @@
           <w:noProof/>
         </w:rPr>
       </w:pPr>
-      <w:hyperlink w:anchor="_Toc241957886" w:history="1">
+      <w:hyperlink w:anchor="_Toc241960729" w:history="1">
         <w:r>
           <w:rPr>
             <w:rStyle w:val="af"/>
@@ -1777,7 +1777,7 @@
             <w:noProof/>
             <w:webHidden/>
           </w:rPr>
-          <w:instrText xml:space="preserve"> PAGEREF _Toc241957886 \h </w:instrText>
+          <w:instrText xml:space="preserve"> PAGEREF _Toc241960729 \h </w:instrText>
         </w:r>
         <w:r>
           <w:rPr>
@@ -1818,7 +1818,7 @@
           <w:noProof/>
         </w:rPr>
       </w:pPr>
-      <w:hyperlink w:anchor="_Toc241957887" w:history="1">
+      <w:hyperlink w:anchor="_Toc241960730" w:history="1">
         <w:r>
           <w:rPr>
             <w:rStyle w:val="af"/>
@@ -1846,7 +1846,7 @@
             <w:noProof/>
             <w:webHidden/>
           </w:rPr>
-          <w:instrText xml:space="preserve"> PAGEREF _Toc241957887 \h </w:instrText>
+          <w:instrText xml:space="preserve"> PAGEREF _Toc241960730 \h </w:instrText>
         </w:r>
         <w:r>
           <w:rPr>
@@ -1892,7 +1892,7 @@
         <w:spacing w:before="0" w:after="360" w:line="360" w:lineRule="exact"/>
         <w:ind w:firstLine="709"/>
       </w:pPr>
-      <w:bookmarkStart w:id="1" w:name="_Toc241957865"/>
+      <w:bookmarkStart w:id="1" w:name="_Toc241960708"/>
       <w:r>
         <w:rPr>
           <w:b/>
@@ -2198,7 +2198,7 @@
         <w:ind w:firstLine="709"/>
       </w:pPr>
       <w:bookmarkStart w:id="2" w:name="_b608aa976fc82a0faaf3b83f58c735968afd03b"/>
-      <w:bookmarkStart w:id="3" w:name="_Toc241957866"/>
+      <w:bookmarkStart w:id="3" w:name="_Toc241960709"/>
       <w:bookmarkEnd w:id="0"/>
       <w:r>
         <w:rPr>
@@ -2276,7 +2276,7 @@
         <w:ind w:firstLine="709"/>
       </w:pPr>
       <w:bookmarkStart w:id="4" w:name="_6ea6bf0a5ec92c733c53e44899cf0806bdc5e39"/>
-      <w:bookmarkStart w:id="5" w:name="_Toc241957867"/>
+      <w:bookmarkStart w:id="5" w:name="_Toc241960710"/>
       <w:r>
         <w:rPr>
           <w:b/>
@@ -3232,7 +3232,7 @@
         <w:ind w:firstLine="709"/>
       </w:pPr>
       <w:bookmarkStart w:id="6" w:name="_7a0c967539b5ef143597c37b0951dae8b296890"/>
-      <w:bookmarkStart w:id="7" w:name="_Toc241957868"/>
+      <w:bookmarkStart w:id="7" w:name="_Toc241960711"/>
       <w:bookmarkEnd w:id="4"/>
       <w:r>
         <w:rPr>
@@ -5665,7 +5665,7 @@
           <w:sz w:val="28"/>
         </w:rPr>
         <w:drawing>
-          <wp:inline distT="0" distB="0" distL="0" distR="0" wp14:anchorId="53BB7E48" wp14:editId="5AE87828">
+          <wp:inline distT="0" distB="0" distL="0" distR="0" wp14:anchorId="0F82D39E" wp14:editId="28FD0C4C">
             <wp:extent cx="5334000" cy="3122341"/>
             <wp:effectExtent l="0" t="0" r="0" b="0"/>
             <wp:docPr id="12" name="Picture"/>
@@ -6476,7 +6476,7 @@
           <w:sz w:val="28"/>
         </w:rPr>
         <w:drawing>
-          <wp:inline distT="0" distB="0" distL="0" distR="0" wp14:anchorId="235674DE" wp14:editId="46CE366D">
+          <wp:inline distT="0" distB="0" distL="0" distR="0" wp14:anchorId="0ECD866C" wp14:editId="7DAA834B">
             <wp:extent cx="5334000" cy="3252439"/>
             <wp:effectExtent l="0" t="0" r="0" b="0"/>
             <wp:docPr id="15" name="Picture"/>
@@ -6637,7 +6637,7 @@
         <w:ind w:firstLine="709"/>
       </w:pPr>
       <w:bookmarkStart w:id="8" w:name="_da959056159f19dff160d665d57702b18af1ddd"/>
-      <w:bookmarkStart w:id="9" w:name="_Toc241957869"/>
+      <w:bookmarkStart w:id="9" w:name="_Toc241960712"/>
       <w:bookmarkEnd w:id="6"/>
       <w:r>
         <w:rPr>
@@ -9765,7 +9765,7 @@
         <w:ind w:firstLine="709"/>
       </w:pPr>
       <w:bookmarkStart w:id="10" w:name="_06e2001e7574ebc77f8406bc11ca3db76d00c2a"/>
-      <w:bookmarkStart w:id="11" w:name="_Toc241957870"/>
+      <w:bookmarkStart w:id="11" w:name="_Toc241960713"/>
       <w:bookmarkEnd w:id="8"/>
       <w:r>
         <w:rPr>
@@ -10575,7 +10575,7 @@
         <w:ind w:firstLine="709"/>
       </w:pPr>
       <w:bookmarkStart w:id="12" w:name="_606fa79e4d4f49d8da929021c2a978685b741ea"/>
-      <w:bookmarkStart w:id="13" w:name="_Toc241957871"/>
+      <w:bookmarkStart w:id="13" w:name="_Toc241960714"/>
       <w:bookmarkEnd w:id="10"/>
       <w:r>
         <w:rPr>
@@ -12850,7 +12850,39 @@
         <w:rPr>
           <w:sz w:val="28"/>
         </w:rPr>
-        <w:t xml:space="preserve"> в базовом сценарии): он на порядок выше оценки ПЗ1 для табличного ПО в Северной Америке и Европе, поскольку включает всех специалистов без учета потребности, и служит только верхней границей. </w:t>
+        <w:t xml:space="preserve"> в базовом сценарии): он одного порядка с оценкой ПЗ1 для всего табличного ПО в Северной Америке и Европе (около 6,5 млрд </w:t>
+      </w:r>
+      <w:r>
+        <w:rPr>
+          <w:i/>
+          <w:sz w:val="28"/>
+        </w:rPr>
+        <w:t>EUR</w:t>
+      </w:r>
+      <w:r>
+        <w:rPr>
+          <w:sz w:val="28"/>
+        </w:rPr>
+        <w:t xml:space="preserve"> в год) и составляет примерно 79 % от нее, хотя определен иначе: число специа</w:t>
+      </w:r>
+      <w:r>
+        <w:rPr>
+          <w:sz w:val="28"/>
+        </w:rPr>
+        <w:t xml:space="preserve">листов и малых компаний, умноженное на годовой чек, без учета потребности; поэтому </w:t>
+      </w:r>
+      <w:r>
+        <w:rPr>
+          <w:i/>
+          <w:sz w:val="28"/>
+        </w:rPr>
+        <w:t>TAM</w:t>
+      </w:r>
+      <w:r>
+        <w:rPr>
+          <w:sz w:val="28"/>
+        </w:rPr>
+        <w:t xml:space="preserve"> служит только верхней границей. </w:t>
       </w:r>
       <w:r>
         <w:rPr>
@@ -12863,13 +12895,7 @@
         <w:rPr>
           <w:sz w:val="28"/>
         </w:rPr>
-        <w:t xml:space="preserve"> в диа</w:t>
-      </w:r>
-      <w:r>
-        <w:rPr>
-          <w:sz w:val="28"/>
-        </w:rPr>
-        <w:t>пазоне 10 080 898 </w:t>
+        <w:t xml:space="preserve"> в диапазоне 10 080 898 </w:t>
       </w:r>
       <w:r>
         <w:rPr>
@@ -12961,7 +12987,13 @@
         <w:rPr>
           <w:sz w:val="28"/>
         </w:rPr>
-        <w:t xml:space="preserve">Сопоставление с цифровым ориентиром: оценочная годовая выручка 12 сайтов по их трафику и воронке </w:t>
+        <w:t>Сопоставление с цифровым о</w:t>
+      </w:r>
+      <w:r>
+        <w:rPr>
+          <w:sz w:val="28"/>
+        </w:rPr>
+        <w:t xml:space="preserve">риентиром: оценочная годовая выручка 12 сайтов по их трафику и воронке </w:t>
       </w:r>
       <w:r>
         <w:rPr>
@@ -13000,13 +13032,7 @@
         <w:rPr>
           <w:sz w:val="28"/>
         </w:rPr>
-        <w:t xml:space="preserve"> базового сценария р</w:t>
-      </w:r>
-      <w:r>
-        <w:rPr>
-          <w:sz w:val="28"/>
-        </w:rPr>
-        <w:t xml:space="preserve">авен 22 % этой величины. Это означает, что при заданных допущениях </w:t>
+        <w:t xml:space="preserve"> базового сценария равен 22 % этой величины. Это означает, что при заданных допущениях </w:t>
       </w:r>
       <w:r>
         <w:rPr>
@@ -13019,7 +13045,13 @@
         <w:rPr>
           <w:sz w:val="28"/>
         </w:rPr>
-        <w:t xml:space="preserve"> должен занять сопоставимую с одним небольшим игроком долю цифрового пула, а не доминирующую.</w:t>
+        <w:t xml:space="preserve"> должен занять сопоставимую с одним небольшим игроко</w:t>
+      </w:r>
+      <w:r>
+        <w:rPr>
+          <w:sz w:val="28"/>
+        </w:rPr>
+        <w:t>м долю цифрового пула, а не доминирующую.</w:t>
       </w:r>
     </w:p>
     <w:p>
@@ -13029,7 +13061,7 @@
         <w:ind w:firstLine="709"/>
       </w:pPr>
       <w:bookmarkStart w:id="14" w:name="_2314d5998da626860a70184e0b470b0b8504694"/>
-      <w:bookmarkStart w:id="15" w:name="_Toc241957872"/>
+      <w:bookmarkStart w:id="15" w:name="_Toc241960715"/>
       <w:bookmarkEnd w:id="12"/>
       <w:r>
         <w:rPr>
@@ -13052,25 +13084,25 @@
         <w:rPr>
           <w:sz w:val="28"/>
         </w:rPr>
-        <w:t xml:space="preserve">Методика «сверху вниз» начинается с </w:t>
-      </w:r>
-      <w:r>
-        <w:rPr>
-          <w:sz w:val="28"/>
-        </w:rPr>
-        <w:t>общего ориентира и последовательно сужается. Общий ориентир - 25,98 миллиона потенциальных пользователей (специалисты трех профессиональных сегментов и по одному лицу, принимающему решения, в каждом МСП с наемными работниками), с коэффициентом неопределенн</w:t>
-      </w:r>
-      <w:r>
-        <w:rPr>
-          <w:sz w:val="28"/>
-        </w:rPr>
-        <w:t xml:space="preserve">ости статистической базы 0,85; 1,00; 1,15. Далее применены доля пользователей, для которых ошибка в таблице критична (7; 10; 13 %), цифровая доступность (55; 65; 75 %) и доля с потребностью (20; 30; 40 %). Методика «снизу вверх» использует те же сегменты, </w:t>
-      </w:r>
-      <w:r>
-        <w:rPr>
-          <w:sz w:val="28"/>
-        </w:rPr>
-        <w:t>что и книга 1, но в другой упаковке: потенциальные клиенты в границах и с платежеспособностью умножаются на потребность, цифровую доступность и чек.</w:t>
+        <w:t xml:space="preserve">Методика «сверху вниз» начинается с общего ориентира и последовательно сужается. Общий ориентир - 25,98 миллиона потенциальных пользователей (специалисты трех </w:t>
+      </w:r>
+      <w:r>
+        <w:rPr>
+          <w:sz w:val="28"/>
+        </w:rPr>
+        <w:t>профессиональных сегментов и по одному лицу, принимающему решения, в каждом МСП с наемными работниками), с коэффициентом неопределенности статистической базы 0,85; 1,00; 1,15. Далее применены доля пользователей, для которых ошибка в таблице критична (7; 10</w:t>
+      </w:r>
+      <w:r>
+        <w:rPr>
+          <w:sz w:val="28"/>
+        </w:rPr>
+        <w:t>; 13 %), цифровая доступность (55; 65; 75 %) и доля с потребностью (20; 30; 40 %). Методика «снизу вверх» использует те же сегменты, что и книга 1, но в другой упаковке: потенциальные клиенты в границах и с платежеспособностью умножаются на потребность, ци</w:t>
+      </w:r>
+      <w:r>
+        <w:rPr>
+          <w:sz w:val="28"/>
+        </w:rPr>
+        <w:t>фровую доступность и чек.</w:t>
       </w:r>
     </w:p>
     <w:p>
@@ -13629,19 +13661,20 @@
           <w:i/>
           <w:sz w:val="28"/>
         </w:rPr>
-        <w:t>Similarweb</w:t>
-      </w:r>
-      <w:r>
-        <w:rPr>
-          <w:sz w:val="28"/>
-        </w:rPr>
-        <w:t xml:space="preserve"> на два порядка меньше, потому что измеряет не потенциал</w:t>
-      </w:r>
-      <w:r>
-        <w:rPr>
-          <w:sz w:val="28"/>
-        </w:rPr>
-        <w:t>, а уже реализованный цифровой пул конкурентов; это обсуждается в разделе 2.10.</w:t>
+        <w:t>S</w:t>
+      </w:r>
+      <w:r>
+        <w:rPr>
+          <w:i/>
+          <w:sz w:val="28"/>
+        </w:rPr>
+        <w:t>imilarweb</w:t>
+      </w:r>
+      <w:r>
+        <w:rPr>
+          <w:sz w:val="28"/>
+        </w:rPr>
+        <w:t xml:space="preserve"> на два порядка меньше, потому что измеряет не потенциал, а уже реализованный цифровой пул конкурентов; это обсуждается в разделе 2.10.</w:t>
       </w:r>
     </w:p>
     <w:p>
@@ -13651,7 +13684,7 @@
         <w:ind w:firstLine="709"/>
       </w:pPr>
       <w:bookmarkStart w:id="16" w:name="_42bac9f10c820a94a4112d44417ea6b5d14bf7d"/>
-      <w:bookmarkStart w:id="17" w:name="_Toc241957873"/>
+      <w:bookmarkStart w:id="17" w:name="_Toc241960716"/>
       <w:bookmarkEnd w:id="14"/>
       <w:r>
         <w:rPr>
@@ -13772,13 +13805,13 @@
         <w:rPr>
           <w:sz w:val="28"/>
         </w:rPr>
-        <w:t xml:space="preserve"> за место (со следующего релиза). Исходный трафик - полный релевантный трафик сегмента из раздела 2.3; достижимая доля трафика для нового сайта принята 0,5</w:t>
-      </w:r>
-      <w:r>
-        <w:rPr>
-          <w:sz w:val="28"/>
-        </w:rPr>
-        <w:t> %, 1,5 % и 4 % (допущение Д-12) с учетом того, что канал строится с нуля.</w:t>
+        <w:t xml:space="preserve"> за место (со следующего релиза). Исходный трафик - полный релевантный трафик сегм</w:t>
+      </w:r>
+      <w:r>
+        <w:rPr>
+          <w:sz w:val="28"/>
+        </w:rPr>
+        <w:t>ента из раздела 2.3; достижимая доля трафика для нового сайта принята 0,5 %, 1,5 % и 4 % (допущение Д-12) с учетом того, что канал строится с нуля.</w:t>
       </w:r>
     </w:p>
     <w:p>
@@ -13806,7 +13839,13 @@
           <w:sz w:val="28"/>
         </w:rPr>
         <w:lastRenderedPageBreak/>
-        <w:t>Таблица 12 – Платящие и выручка по тарифам, базовый сценарий, в месяц</w:t>
+        <w:t>Таблица 12 – Платящие и</w:t>
+      </w:r>
+      <w:r>
+        <w:rPr>
+          <w:sz w:val="28"/>
+        </w:rPr>
+        <w:t xml:space="preserve"> выручка по тарифам, базовый сценарий, в месяц</w:t>
       </w:r>
     </w:p>
     <w:tbl>
@@ -13896,14 +13935,7 @@
                 <w:b/>
                 <w:sz w:val="24"/>
               </w:rPr>
-              <w:t>Платящих в меся</w:t>
-            </w:r>
-            <w:r>
-              <w:rPr>
-                <w:b/>
-                <w:sz w:val="24"/>
-              </w:rPr>
-              <w:t>ц</w:t>
+              <w:t>Платящих в месяц</w:t>
             </w:r>
           </w:p>
         </w:tc>
@@ -15598,13 +15630,7 @@
         <w:rPr>
           <w:sz w:val="28"/>
         </w:rPr>
-        <w:t>Методик</w:t>
-      </w:r>
-      <w:r>
-        <w:rPr>
-          <w:sz w:val="28"/>
-        </w:rPr>
-        <w:t xml:space="preserve">а оценки через маркетплейсы и платформы [2] применяется к магазину надстроек </w:t>
+        <w:t xml:space="preserve">Методика оценки через маркетплейсы и платформы [2] применяется к магазину надстроек </w:t>
       </w:r>
       <w:r>
         <w:rPr>
@@ -15643,13 +15669,13 @@
         <w:rPr>
           <w:sz w:val="28"/>
         </w:rPr>
-        <w:t xml:space="preserve"> [22] 03.10.2026 без регистрации (снимок: Материалы_собранные/appsou</w:t>
-      </w:r>
-      <w:r>
-        <w:rPr>
-          <w:sz w:val="28"/>
-        </w:rPr>
-        <w:t>rce_снимок_2026-10-03.md). Полный каталог по запросу «</w:t>
+        <w:t xml:space="preserve"> [22] 03.10.2026 без регистрации (снимок: Материалы_собранные</w:t>
+      </w:r>
+      <w:r>
+        <w:rPr>
+          <w:sz w:val="28"/>
+        </w:rPr>
+        <w:t>/appsource_снимок_2026-10-03.md). Полный каталог по запросу «</w:t>
       </w:r>
       <w:r>
         <w:rPr>
@@ -15715,7 +15741,13 @@
         <w:rPr>
           <w:sz w:val="28"/>
         </w:rPr>
-        <w:t xml:space="preserve"> по запросам, 03.10.2026.</w:t>
+        <w:t xml:space="preserve"> по </w:t>
+      </w:r>
+      <w:r>
+        <w:rPr>
+          <w:sz w:val="28"/>
+        </w:rPr>
+        <w:t>запросам, 03.10.2026.</w:t>
       </w:r>
     </w:p>
     <w:p>
@@ -16559,13 +16591,13 @@
         <w:rPr>
           <w:sz w:val="28"/>
         </w:rPr>
-        <w:t>Масштаб поля резко сужается: из 2 184 предложений каталога около 25-37 относятся к проверке таблиц, а прямой проверкой формул занимается одна надстройка. Это подтверждает вывод ЛР5 об отсутствии прямых конкурентов в магазине, но показывает и малую плотност</w:t>
-      </w:r>
-      <w:r>
-        <w:rPr>
-          <w:sz w:val="28"/>
-        </w:rPr>
-        <w:t>ь спроса: площадка пока не воспринимается как место покупки инструментов контроля моделей.</w:t>
+        <w:t>Масштаб поля резко сужается: из 2 184 предложений каталога около 25-37 относятся к проверке таблиц, а прямой прове</w:t>
+      </w:r>
+      <w:r>
+        <w:rPr>
+          <w:sz w:val="28"/>
+        </w:rPr>
+        <w:t>ркой формул занимается одна надстройка. Это подтверждает вывод ЛР5 об отсутствии прямых конкурентов в магазине, но показывает и малую плотность спроса: площадка пока не воспринимается как место покупки инструментов контроля моделей.</w:t>
       </w:r>
     </w:p>
     <w:p>
@@ -16579,7 +16611,13 @@
         <w:rPr>
           <w:sz w:val="28"/>
         </w:rPr>
-        <w:t>Для расчета использована модель через отзывы: по запросу «</w:t>
+        <w:t>Для расчета использован</w:t>
+      </w:r>
+      <w:r>
+        <w:rPr>
+          <w:sz w:val="28"/>
+        </w:rPr>
+        <w:t>а модель через отзывы: по запросу «</w:t>
       </w:r>
       <w:r>
         <w:rPr>
@@ -16605,19 +16643,19 @@
         <w:rPr>
           <w:sz w:val="28"/>
         </w:rPr>
-        <w:t>» загружены 15 из 25 карточек, у 13 есть оценки (127 оценок, среднее 9,8, медиана 7), плат</w:t>
-      </w:r>
-      <w:r>
-        <w:rPr>
-          <w:sz w:val="28"/>
-        </w:rPr>
-        <w:t>ных предложений 60 %. На все 25 карточек приходится около 212 оценок. Число установок оценивается делением на коэффициент отзывов 10, 5 и 2 % (значения методики), годовой поток получается делением на средний возраст предложений 3 года, платящие - умножение</w:t>
-      </w:r>
-      <w:r>
-        <w:rPr>
-          <w:sz w:val="28"/>
-        </w:rPr>
-        <w:t>м на долю платных карточек и конверсию установки в оплату 5, 10 и 15 %; выручка на платящего взята из воронки ЛР2-3 (допущение Д-34).</w:t>
+        <w:t>» загружены 15 из 25 карточек, у 13 есть оценки (127 оценок, среднее 9,8, медиана 7), платных предложений 60 %. На все 25 карточек приходится около 212 оценок. Число установок оценивается делением на коэф</w:t>
+      </w:r>
+      <w:r>
+        <w:rPr>
+          <w:sz w:val="28"/>
+        </w:rPr>
+        <w:t>фициент отзывов 10, 5 и 2 % (значения методики), годовой поток получается делением на средний возраст предложений 3 года, платящие - умножением на долю платных карточек и конверсию установки в оплату 5, 10 и 15 %; выручка на платящего взята из воронки ЛР2-</w:t>
+      </w:r>
+      <w:r>
+        <w:rPr>
+          <w:sz w:val="28"/>
+        </w:rPr>
+        <w:t>3 (допущение Д-34).</w:t>
       </w:r>
     </w:p>
     <w:p>
@@ -17360,13 +17398,13 @@
         <w:rPr>
           <w:sz w:val="28"/>
         </w:rPr>
-        <w:t xml:space="preserve"> в 8 оплат в месяц (96 в год) равно или превышает платящих всего сегмента, поэтому для первого года реалист</w:t>
-      </w:r>
-      <w:r>
-        <w:rPr>
-          <w:sz w:val="28"/>
-        </w:rPr>
-        <w:t>ичнее осторожное значение 2 оплаты в месяц; базовое и оптимистичное значения достижимы только после появления самостоятельного спроса на категорию.</w:t>
+        <w:t xml:space="preserve"> в 8 оплат в месяц (96 в год) равно или превышает платя</w:t>
+      </w:r>
+      <w:r>
+        <w:rPr>
+          <w:sz w:val="28"/>
+        </w:rPr>
+        <w:t>щих всего сегмента, поэтому для первого года реалистичнее осторожное значение 2 оплаты в месяц; базовое и оптимистичное значения достижимы только после появления самостоятельного спроса на категорию.</w:t>
       </w:r>
     </w:p>
     <w:p>
@@ -17380,7 +17418,13 @@
         <w:rPr>
           <w:sz w:val="28"/>
         </w:rPr>
-        <w:t>Проверка надежности по методике: расчет по трафику дает оборот сегмента 898 059 </w:t>
+        <w:t xml:space="preserve">Проверка надежности по методике: расчет по трафику дает </w:t>
+      </w:r>
+      <w:r>
+        <w:rPr>
+          <w:sz w:val="28"/>
+        </w:rPr>
+        <w:t>оборот сегмента 898 059 </w:t>
       </w:r>
       <w:r>
         <w:rPr>
@@ -17393,13 +17437,7 @@
         <w:rPr>
           <w:sz w:val="28"/>
         </w:rPr>
-        <w:t xml:space="preserve"> в год (раздел 2.4), расч</w:t>
-      </w:r>
-      <w:r>
-        <w:rPr>
-          <w:sz w:val="28"/>
-        </w:rPr>
-        <w:t>ет по отзывам - 8 516 </w:t>
+        <w:t xml:space="preserve"> в год (раздел 2.4), расчет по отзывам - 8 516 </w:t>
       </w:r>
       <w:r>
         <w:rPr>
@@ -17425,13 +17463,13 @@
         <w:rPr>
           <w:sz w:val="28"/>
         </w:rPr>
-        <w:t xml:space="preserve"> - вспомогательный канал доверия и обнаружения (надстройка </w:t>
-      </w:r>
-      <w:r>
-        <w:rPr>
-          <w:sz w:val="28"/>
-        </w:rPr>
-        <w:t xml:space="preserve">внутри </w:t>
+        <w:t xml:space="preserve"> - вспо</w:t>
+      </w:r>
+      <w:r>
+        <w:rPr>
+          <w:sz w:val="28"/>
+        </w:rPr>
+        <w:t xml:space="preserve">могательный канал доверия и обнаружения (надстройка внутри </w:t>
       </w:r>
       <w:r>
         <w:rPr>
@@ -17493,7 +17531,7 @@
         <w:ind w:firstLine="709"/>
       </w:pPr>
       <w:bookmarkStart w:id="19" w:name="_62882a27ae1c57302eff280b02701a311900947"/>
-      <w:bookmarkStart w:id="20" w:name="_Toc241957874"/>
+      <w:bookmarkStart w:id="20" w:name="_Toc241960717"/>
       <w:bookmarkEnd w:id="18"/>
       <w:bookmarkEnd w:id="16"/>
       <w:r>
@@ -17542,13 +17580,7 @@
         <w:rPr>
           <w:sz w:val="28"/>
         </w:rPr>
-        <w:t xml:space="preserve"> и Яндекс Вордстат за 12 месяцев. Вордстат охватывает Россию и Беларусь, поэтому методика применена к контрольному русскоязычному сегменту, а не к основной территории. Для основной территории абсолютные</w:t>
-      </w:r>
-      <w:r>
-        <w:rPr>
-          <w:sz w:val="28"/>
-        </w:rPr>
-        <w:t xml:space="preserve"> частотности недоступны (</w:t>
+        <w:t xml:space="preserve"> и Яндекс Вордстат за 12 месяцев. Вордстат охватывает Россию и Беларусь, поэтому методика применена к контрольному русскоязычному сегменту, а не к основной территории. Для основной территории абсолютные частотности недоступны (</w:t>
       </w:r>
       <w:r>
         <w:rPr>
@@ -17574,7 +17606,13 @@
         <w:rPr>
           <w:sz w:val="28"/>
         </w:rPr>
-        <w:t xml:space="preserve"> дает только индекс), и ее поисковый канал оценен по органическому трафику сайтов конкурентов из </w:t>
+        <w:t xml:space="preserve"> дает только инд</w:t>
+      </w:r>
+      <w:r>
+        <w:rPr>
+          <w:sz w:val="28"/>
+        </w:rPr>
+        <w:t xml:space="preserve">екс), и ее поисковый канал оценен по органическому трафику сайтов конкурентов из </w:t>
       </w:r>
       <w:r>
         <w:rPr>
@@ -17614,13 +17652,7 @@
         <w:rPr>
           <w:sz w:val="28"/>
         </w:rPr>
-        <w:t>Таблица 16 – Семантическое ядро ра</w:t>
-      </w:r>
-      <w:r>
-        <w:rPr>
-          <w:sz w:val="28"/>
-        </w:rPr>
-        <w:t>счета и показатели спроса</w:t>
+        <w:t>Таблица 16 – Семантическое ядро расчета и показатели спроса</w:t>
       </w:r>
     </w:p>
     <w:tbl>
@@ -17688,7 +17720,14 @@
                 <w:b/>
                 <w:sz w:val="24"/>
               </w:rPr>
-              <w:t>Вордстат, РФ+РБ, среднее за мес.</w:t>
+              <w:t>Вордстат, РФ+РБ, сред</w:t>
+            </w:r>
+            <w:r>
+              <w:rPr>
+                <w:b/>
+                <w:sz w:val="24"/>
+              </w:rPr>
+              <w:t>нее за мес.</w:t>
             </w:r>
           </w:p>
         </w:tc>
@@ -18864,7 +18903,7 @@
         <w:ind w:firstLine="709"/>
       </w:pPr>
       <w:bookmarkStart w:id="21" w:name="_2c7ec3ecf17663584d0d27e07e31cbd2a0948cf"/>
-      <w:bookmarkStart w:id="22" w:name="_Toc241957875"/>
+      <w:bookmarkStart w:id="22" w:name="_Toc241960718"/>
       <w:bookmarkEnd w:id="19"/>
       <w:r>
         <w:rPr>
@@ -18899,13 +18938,7 @@
         <w:rPr>
           <w:sz w:val="28"/>
         </w:rPr>
-        <w:t xml:space="preserve"> относительно рыночного коридора, соотно</w:t>
-      </w:r>
-      <w:r>
-        <w:rPr>
-          <w:sz w:val="28"/>
-        </w:rPr>
-        <w:t xml:space="preserve">шение доступного бюджета сегмента и цены, окупаемость покупки для клиента. Цены конкурентов взяты со страниц цен на 03.10.2026 и переведены в </w:t>
+        <w:t xml:space="preserve"> относительно рыночного коридора, соотношение доступного бюджета сегмента и цены, окупаемость покупки для клиента. Цены конкурентов взяты со страниц цен на 03.10.2026 и переведены в </w:t>
       </w:r>
       <w:r>
         <w:rPr>
@@ -18918,7 +18951,13 @@
         <w:rPr>
           <w:sz w:val="28"/>
         </w:rPr>
-        <w:t xml:space="preserve"> по кросс-курсу 1,1267 [10]-[14].</w:t>
+        <w:t xml:space="preserve"> по кросс</w:t>
+      </w:r>
+      <w:r>
+        <w:rPr>
+          <w:sz w:val="28"/>
+        </w:rPr>
+        <w:t>-курсу 1,1267 [10]-[14].</w:t>
       </w:r>
     </w:p>
     <w:p>
@@ -18958,13 +18997,7 @@
         <w:rPr>
           <w:sz w:val="28"/>
         </w:rPr>
-        <w:t>Таблица 17 – Ценовой коридор</w:t>
-      </w:r>
-      <w:r>
-        <w:rPr>
-          <w:sz w:val="28"/>
-        </w:rPr>
-        <w:t xml:space="preserve">, </w:t>
+        <w:t xml:space="preserve">Таблица 17 – Ценовой коридор, </w:t>
       </w:r>
       <w:r>
         <w:rPr>
@@ -19771,7 +19804,14 @@
           <w:i/>
           <w:sz w:val="28"/>
         </w:rPr>
-        <w:t>TableMind</w:t>
+        <w:t>Tabl</w:t>
+      </w:r>
+      <w:r>
+        <w:rPr>
+          <w:i/>
+          <w:sz w:val="28"/>
+        </w:rPr>
+        <w:t>eMind</w:t>
       </w:r>
       <w:r>
         <w:rPr>
@@ -19790,7 +19830,20 @@
         <w:rPr>
           <w:sz w:val="28"/>
         </w:rPr>
-        <w:t xml:space="preserve">, </w:t>
+        <w:t xml:space="preserve"> (2,75 </w:t>
+      </w:r>
+      <w:r>
+        <w:rPr>
+          <w:i/>
+          <w:sz w:val="28"/>
+        </w:rPr>
+        <w:t>GBP</w:t>
+      </w:r>
+      <w:r>
+        <w:rPr>
+          <w:sz w:val="28"/>
+        </w:rPr>
+        <w:t xml:space="preserve"> за пользователя в месяц) и </w:t>
       </w:r>
       <w:r>
         <w:rPr>
@@ -19803,20 +19856,52 @@
         <w:rPr>
           <w:sz w:val="28"/>
         </w:rPr>
-        <w:t xml:space="preserve"> и </w:t>
-      </w:r>
-      <w:r>
-        <w:rPr>
-          <w:i/>
-          <w:sz w:val="28"/>
-        </w:rPr>
-        <w:t>Julius</w:t>
-      </w:r>
-      <w:r>
-        <w:rPr>
-          <w:sz w:val="28"/>
-        </w:rPr>
-        <w:t xml:space="preserve"> не опубликованы, их нужно доснять.</w:t>
+        <w:t xml:space="preserve"> (пакет </w:t>
+      </w:r>
+      <w:r>
+        <w:rPr>
+          <w:i/>
+          <w:sz w:val="28"/>
+        </w:rPr>
+        <w:t>OAK</w:t>
+      </w:r>
+      <w:r>
+        <w:rPr>
+          <w:sz w:val="28"/>
+        </w:rPr>
+        <w:t xml:space="preserve"> 311,66 </w:t>
+      </w:r>
+      <w:r>
+        <w:rPr>
+          <w:i/>
+          <w:sz w:val="28"/>
+        </w:rPr>
+        <w:t>GBP</w:t>
+      </w:r>
+      <w:r>
+        <w:rPr>
+          <w:sz w:val="28"/>
+        </w:rPr>
+        <w:t xml:space="preserve"> в год) взяты со страниц производителей (приложение Д) и подтверждают, что специализированные аналоги стоят от нескольких до десятков </w:t>
+      </w:r>
+      <w:r>
+        <w:rPr>
+          <w:i/>
+          <w:sz w:val="28"/>
+        </w:rPr>
+        <w:t>EUR</w:t>
+      </w:r>
+      <w:r>
+        <w:rPr>
+          <w:sz w:val="28"/>
+        </w:rPr>
+        <w:t xml:space="preserve"> в месяц; в ценовой коридор таблиц</w:t>
+      </w:r>
+      <w:r>
+        <w:rPr>
+          <w:sz w:val="28"/>
+        </w:rPr>
+        <w:t>ы они не включены, так как лицензируются многопользовательскими пакетами на 12-36 месяцев.</w:t>
       </w:r>
     </w:p>
     <w:p>
@@ -21082,7 +21167,13 @@
         <w:rPr>
           <w:sz w:val="28"/>
         </w:rPr>
-        <w:t xml:space="preserve"> за год - 11,0. Эффект рассчитан по экономии времени проверки (допущение Д-11: 20 % рабочего времени на проверку и поиск ошибок, из них 45 % экономится) и не включает стоимость пропущенной ошибки, которая выше.</w:t>
+        <w:t xml:space="preserve"> за год - 11,0. Эффект рассчитан по экономии времени проверки (допущение Д-11: 20 % рабочего времени на проверку и поиск ошибок, из них 45 % экономится) и не включает стоимость пропущенн</w:t>
+      </w:r>
+      <w:r>
+        <w:rPr>
+          <w:sz w:val="28"/>
+        </w:rPr>
+        <w:t>ой ошибки, которая выше.</w:t>
       </w:r>
     </w:p>
     <w:p>
@@ -21096,13 +21187,7 @@
         <w:rPr>
           <w:sz w:val="28"/>
         </w:rPr>
-        <w:t>Платежеспособный объем рынка по книге 3 равен</w:t>
-      </w:r>
-      <w:r>
-        <w:rPr>
-          <w:sz w:val="28"/>
-        </w:rPr>
-        <w:t xml:space="preserve"> 35 003 121 </w:t>
+        <w:t>Платежеспособный объем рынка по книге 3 равен 35 003 121 </w:t>
       </w:r>
       <w:r>
         <w:rPr>
@@ -21167,7 +21252,13 @@
         <w:rPr>
           <w:sz w:val="28"/>
         </w:rPr>
-        <w:t>. Вывод: интерес аудитории превращается в платежеспособный спрос при цене 9-29 </w:t>
+        <w:t>. Вывод: интерес аудитории превращается в платежеспособный спрос при цен</w:t>
+      </w:r>
+      <w:r>
+        <w:rPr>
+          <w:sz w:val="28"/>
+        </w:rPr>
+        <w:t>е 9-29 </w:t>
       </w:r>
       <w:r>
         <w:rPr>
@@ -21180,13 +21271,7 @@
         <w:rPr>
           <w:sz w:val="28"/>
         </w:rPr>
-        <w:t>; слабое место - не цена, а готовность вводить платеж без пр</w:t>
-      </w:r>
-      <w:r>
-        <w:rPr>
-          <w:sz w:val="28"/>
-        </w:rPr>
-        <w:t>обного использования и канал привлечения.</w:t>
+        <w:t>; слабое место - не цена, а готовность вводить платеж без пробного использования и канал привлечения.</w:t>
       </w:r>
     </w:p>
     <w:p>
@@ -21196,7 +21281,7 @@
         <w:ind w:firstLine="709"/>
       </w:pPr>
       <w:bookmarkStart w:id="23" w:name="_8d34778965163a5752bc27698d1f7e786ff5c87"/>
-      <w:bookmarkStart w:id="24" w:name="_Toc241957876"/>
+      <w:bookmarkStart w:id="24" w:name="_Toc241960719"/>
       <w:bookmarkEnd w:id="21"/>
       <w:r>
         <w:rPr>
@@ -21219,13 +21304,13 @@
         <w:rPr>
           <w:sz w:val="28"/>
         </w:rPr>
-        <w:t>Методики дают две принципиально разные группы оценок. Первая - потенциальные оценки (потенциальные клиенты, сверху вниз, снизу вверх, платежеспособность): они измеряют, ско</w:t>
-      </w:r>
-      <w:r>
-        <w:rPr>
-          <w:sz w:val="28"/>
-        </w:rPr>
-        <w:t>лько денег может быть в сегменте при заданных долях потребности и платежеспособности. Вторая - трафиковые оценки (</w:t>
+        <w:t>Методики дают две принципиально разные группы оценок. Первая - потенциальные оценки (потенциальные кли</w:t>
+      </w:r>
+      <w:r>
+        <w:rPr>
+          <w:sz w:val="28"/>
+        </w:rPr>
+        <w:t>енты, сверху вниз, снизу вверх, платежеспособность): они измеряют, сколько денег может быть в сегменте при заданных долях потребности и платежеспособности. Вторая - трафиковые оценки (</w:t>
       </w:r>
       <w:r>
         <w:rPr>
@@ -21238,13 +21323,13 @@
         <w:rPr>
           <w:sz w:val="28"/>
         </w:rPr>
-        <w:t>, воронка, поиск): они измеряют цифровой пул, который реально конвертируется в платежи по текущим конверсиям. Правила согласования [</w:t>
-      </w:r>
-      <w:r>
-        <w:rPr>
-          <w:sz w:val="28"/>
-        </w:rPr>
-        <w:t>2] требуют сравнивать их с пониманием этой разницы.</w:t>
+        <w:t xml:space="preserve">, воронка, поиск): они измеряют цифровой пул, который реально </w:t>
+      </w:r>
+      <w:r>
+        <w:rPr>
+          <w:sz w:val="28"/>
+        </w:rPr>
+        <w:t>конвертируется в платежи по текущим конверсиям. Правила согласования [2] требуют сравнивать их с пониманием этой разницы.</w:t>
       </w:r>
     </w:p>
     <w:p>
@@ -21758,13 +21843,7 @@
               <w:rPr>
                 <w:sz w:val="24"/>
               </w:rPr>
-              <w:t xml:space="preserve">Медиана </w:t>
-            </w:r>
-            <w:r>
-              <w:rPr>
-                <w:sz w:val="24"/>
-              </w:rPr>
-              <w:t>четырех методов (</w:t>
+              <w:t>Медиана четырех методов (</w:t>
             </w:r>
             <w:r>
               <w:rPr>
@@ -21891,7 +21970,7 @@
               <w:rPr>
                 <w:sz w:val="24"/>
               </w:rPr>
-              <w:t>26 382</w:t>
+              <w:t>26 376</w:t>
             </w:r>
           </w:p>
         </w:tc>
@@ -21910,7 +21989,7 @@
               <w:rPr>
                 <w:sz w:val="24"/>
               </w:rPr>
-              <w:t>344 341</w:t>
+              <w:t>344 256</w:t>
             </w:r>
           </w:p>
         </w:tc>
@@ -21929,7 +22008,7 @@
               <w:rPr>
                 <w:sz w:val="24"/>
               </w:rPr>
-              <w:t>2 512 356</w:t>
+              <w:t>2 511 656</w:t>
             </w:r>
           </w:p>
         </w:tc>
@@ -21986,7 +22065,7 @@
               <w:rPr>
                 <w:sz w:val="24"/>
               </w:rPr>
-              <w:t>48 318</w:t>
+              <w:t>48 345</w:t>
             </w:r>
           </w:p>
         </w:tc>
@@ -22005,7 +22084,7 @@
               <w:rPr>
                 <w:sz w:val="24"/>
               </w:rPr>
-              <w:t>382 639</w:t>
+              <w:t>382 736</w:t>
             </w:r>
           </w:p>
         </w:tc>
@@ -22024,7 +22103,7 @@
               <w:rPr>
                 <w:sz w:val="24"/>
               </w:rPr>
-              <w:t>2 184 658</w:t>
+              <w:t>2 185 478</w:t>
             </w:r>
           </w:p>
         </w:tc>
@@ -22270,13 +22349,13 @@
         <w:rPr>
           <w:sz w:val="28"/>
         </w:rPr>
-        <w:t xml:space="preserve"> в базовом сценарии - от 344 34</w:t>
-      </w:r>
-      <w:r>
-        <w:rPr>
-          <w:sz w:val="28"/>
-        </w:rPr>
-        <w:t>1 </w:t>
+        <w:t xml:space="preserve"> в базо</w:t>
+      </w:r>
+      <w:r>
+        <w:rPr>
+          <w:sz w:val="28"/>
+        </w:rPr>
+        <w:t>вом сценарии - от 344 256 </w:t>
       </w:r>
       <w:r>
         <w:rPr>
@@ -22289,7 +22368,7 @@
         <w:rPr>
           <w:sz w:val="28"/>
         </w:rPr>
-        <w:t xml:space="preserve"> до 382 639 </w:t>
+        <w:t xml:space="preserve"> до 382 736 </w:t>
       </w:r>
       <w:r>
         <w:rPr>
@@ -22346,7 +22425,7 @@
         </w:rPr>
         <w:lastRenderedPageBreak/>
         <w:drawing>
-          <wp:inline distT="0" distB="0" distL="0" distR="0" wp14:anchorId="700ABBE7" wp14:editId="66D7719F">
+          <wp:inline distT="0" distB="0" distL="0" distR="0" wp14:anchorId="117BDEF1" wp14:editId="58247F6B">
             <wp:extent cx="5334000" cy="2992243"/>
             <wp:effectExtent l="0" t="0" r="0" b="0"/>
             <wp:docPr id="27" name="Picture"/>
@@ -22565,7 +22644,14 @@
                 <w:b/>
                 <w:sz w:val="24"/>
               </w:rPr>
-              <w:t>Что наблюдается</w:t>
+              <w:t xml:space="preserve">Что </w:t>
+            </w:r>
+            <w:r>
+              <w:rPr>
+                <w:b/>
+                <w:sz w:val="24"/>
+              </w:rPr>
+              <w:t>наблюдается</w:t>
             </w:r>
           </w:p>
         </w:tc>
@@ -22648,13 +22734,7 @@
               <w:rPr>
                 <w:sz w:val="24"/>
               </w:rPr>
-              <w:t>Коэффициенты проверены, расхождение до</w:t>
-            </w:r>
-            <w:r>
-              <w:rPr>
-                <w:sz w:val="24"/>
-              </w:rPr>
-              <w:t xml:space="preserve">пустимо; для </w:t>
+              <w:t xml:space="preserve">Коэффициенты проверены, расхождение допустимо; для </w:t>
             </w:r>
             <w:r>
               <w:rPr>
@@ -22787,7 +22867,13 @@
               <w:rPr>
                 <w:sz w:val="24"/>
               </w:rPr>
-              <w:t>-помощников большой, спрос на аудит малый</w:t>
+              <w:t>-помощн</w:t>
+            </w:r>
+            <w:r>
+              <w:rPr>
+                <w:sz w:val="24"/>
+              </w:rPr>
+              <w:t>иков большой, спрос на аудит малый</w:t>
             </w:r>
           </w:p>
         </w:tc>
@@ -22806,13 +22892,7 @@
               <w:rPr>
                 <w:sz w:val="24"/>
               </w:rPr>
-              <w:t>Аудитория приходит за генерацией формул, не за проверкой; конкурентное поле заменителей широ</w:t>
-            </w:r>
-            <w:r>
-              <w:rPr>
-                <w:sz w:val="24"/>
-              </w:rPr>
-              <w:t>кое</w:t>
+              <w:t>Аудитория приходит за генерацией формул, не за проверкой; конкурентное поле заменителей широкое</w:t>
             </w:r>
           </w:p>
         </w:tc>
@@ -22895,7 +22975,13 @@
               <w:rPr>
                 <w:sz w:val="24"/>
               </w:rPr>
-              <w:t xml:space="preserve">Проблема в канале и конверсии, а не в емкости; нужны партнеры и </w:t>
+              <w:t>Проблема в канале и конве</w:t>
+            </w:r>
+            <w:r>
+              <w:rPr>
+                <w:sz w:val="24"/>
+              </w:rPr>
+              <w:t xml:space="preserve">рсии, а не в емкости; нужны партнеры и </w:t>
             </w:r>
             <w:r>
               <w:rPr>
@@ -22966,13 +23052,7 @@
               <w:rPr>
                 <w:sz w:val="24"/>
               </w:rPr>
-              <w:t xml:space="preserve">Нужны </w:t>
-            </w:r>
-            <w:r>
-              <w:rPr>
-                <w:sz w:val="24"/>
-              </w:rPr>
-              <w:t xml:space="preserve">измеренные конверсии </w:t>
+              <w:t xml:space="preserve">Нужны измеренные конверсии </w:t>
             </w:r>
             <w:r>
               <w:rPr>
@@ -23131,13 +23211,7 @@
         <w:rPr>
           <w:sz w:val="28"/>
         </w:rPr>
-        <w:t>На рисунке 4 п</w:t>
-      </w:r>
-      <w:r>
-        <w:rPr>
-          <w:sz w:val="28"/>
-        </w:rPr>
-        <w:t xml:space="preserve">оказано: </w:t>
+        <w:t xml:space="preserve">На рисунке 4 показано: </w:t>
       </w:r>
       <w:r>
         <w:rPr>
@@ -23192,7 +23266,7 @@
           <w:sz w:val="28"/>
         </w:rPr>
         <w:drawing>
-          <wp:inline distT="0" distB="0" distL="0" distR="0" wp14:anchorId="722EBF65" wp14:editId="06716F58">
+          <wp:inline distT="0" distB="0" distL="0" distR="0" wp14:anchorId="0B390ABC" wp14:editId="265D8020">
             <wp:extent cx="5334000" cy="2471853"/>
             <wp:effectExtent l="0" t="0" r="0" b="0"/>
             <wp:docPr id="30" name="Picture"/>
@@ -23349,7 +23423,13 @@
         <w:rPr>
           <w:sz w:val="28"/>
         </w:rPr>
-        <w:t>) - около двух порядков; он показывает, что большинство специалистов не работает со сложными моделями или не готово платить. Для сравнения, оценка ПЗ1 по табличному ПО в Северной Америке и Европе составляет около 6 508 387 478 </w:t>
+        <w:t>) - около дв</w:t>
+      </w:r>
+      <w:r>
+        <w:rPr>
+          <w:sz w:val="28"/>
+        </w:rPr>
+        <w:t>ух порядков; он показывает, что большинство специалистов не работает со сложными моделями или не готово платить. Для сравнения, оценка ПЗ1 по табличному ПО в Северной Америке и Европе составляет около 6 508 387 478 </w:t>
       </w:r>
       <w:r>
         <w:rPr>
@@ -23362,13 +23442,13 @@
         <w:rPr>
           <w:sz w:val="28"/>
         </w:rPr>
-        <w:t xml:space="preserve"> в год при совсем другом о</w:t>
-      </w:r>
-      <w:r>
-        <w:rPr>
-          <w:sz w:val="28"/>
-        </w:rPr>
-        <w:t>пределении рынка.</w:t>
+        <w:t xml:space="preserve"> в год при совсем другом определении р</w:t>
+      </w:r>
+      <w:r>
+        <w:rPr>
+          <w:sz w:val="28"/>
+        </w:rPr>
+        <w:t>ынка.</w:t>
       </w:r>
     </w:p>
     <w:p>
@@ -23395,13 +23475,13 @@
         <w:rPr>
           <w:sz w:val="28"/>
         </w:rPr>
-        <w:t>-моделей для финансовых аналитиков, бухгалтеров, консультантов и МСП англоязычных стран и ЕС. Поисковый интерес подтвер</w:t>
-      </w:r>
-      <w:r>
-        <w:rPr>
-          <w:sz w:val="28"/>
-        </w:rPr>
-        <w:t xml:space="preserve">жден частично (ЛР1), конкурентное поле по </w:t>
+        <w:t>-моделей для финансовых аналитиков, бухгалтеров, консультантов и МСП англоязычных стран и ЕС. Поисковый интерес подтвержден частичн</w:t>
+      </w:r>
+      <w:r>
+        <w:rPr>
+          <w:sz w:val="28"/>
+        </w:rPr>
+        <w:t xml:space="preserve">о (ЛР1), конкурентное поле по </w:t>
       </w:r>
       <w:r>
         <w:rPr>
@@ -23518,13 +23598,27 @@
         <w:rPr>
           <w:sz w:val="28"/>
         </w:rPr>
-        <w:t>) оценен диапазоном 1</w:t>
-      </w:r>
-      <w:r>
-        <w:rPr>
-          <w:sz w:val="28"/>
-        </w:rPr>
-        <w:t>4 852 811 </w:t>
+        <w:t>) оценен диапазоном 14 852 811 </w:t>
+      </w:r>
+      <w:r>
+        <w:rPr>
+          <w:i/>
+          <w:sz w:val="28"/>
+        </w:rPr>
+        <w:t>EU</w:t>
+      </w:r>
+      <w:r>
+        <w:rPr>
+          <w:i/>
+          <w:sz w:val="28"/>
+        </w:rPr>
+        <w:t>R</w:t>
+      </w:r>
+      <w:r>
+        <w:rPr>
+          <w:sz w:val="28"/>
+        </w:rPr>
+        <w:t xml:space="preserve"> - 68 543 809 </w:t>
       </w:r>
       <w:r>
         <w:rPr>
@@ -23537,7 +23631,7 @@
         <w:rPr>
           <w:sz w:val="28"/>
         </w:rPr>
-        <w:t xml:space="preserve"> - 68 543 809 </w:t>
+        <w:t xml:space="preserve"> в год, базовая оценка 35 003 130 </w:t>
       </w:r>
       <w:r>
         <w:rPr>
@@ -23550,7 +23644,20 @@
         <w:rPr>
           <w:sz w:val="28"/>
         </w:rPr>
-        <w:t xml:space="preserve"> в год, базовая оценка 35 003 130 </w:t>
+        <w:t>; достижимая часть (</w:t>
+      </w:r>
+      <w:r>
+        <w:rPr>
+          <w:i/>
+          <w:sz w:val="28"/>
+        </w:rPr>
+        <w:t>SOM</w:t>
+      </w:r>
+      <w:r>
+        <w:rPr>
+          <w:sz w:val="28"/>
+        </w:rPr>
+        <w:t>) в первый год - 7 426 </w:t>
       </w:r>
       <w:r>
         <w:rPr>
@@ -23563,20 +23670,7 @@
         <w:rPr>
           <w:sz w:val="28"/>
         </w:rPr>
-        <w:t>; достижимая часть (</w:t>
-      </w:r>
-      <w:r>
-        <w:rPr>
-          <w:i/>
-          <w:sz w:val="28"/>
-        </w:rPr>
-        <w:t>SOM</w:t>
-      </w:r>
-      <w:r>
-        <w:rPr>
-          <w:sz w:val="28"/>
-        </w:rPr>
-        <w:t>) в первый год - 7 426 </w:t>
+        <w:t xml:space="preserve"> - 205 631 </w:t>
       </w:r>
       <w:r>
         <w:rPr>
@@ -23589,7 +23683,7 @@
         <w:rPr>
           <w:sz w:val="28"/>
         </w:rPr>
-        <w:t xml:space="preserve"> - 205 631 </w:t>
+        <w:t xml:space="preserve"> по клиентской оценке и 132 </w:t>
       </w:r>
       <w:r>
         <w:rPr>
@@ -23602,7 +23696,7 @@
         <w:rPr>
           <w:sz w:val="28"/>
         </w:rPr>
-        <w:t xml:space="preserve"> по клиентской оценке и 132 </w:t>
+        <w:t xml:space="preserve"> - 100 466 </w:t>
       </w:r>
       <w:r>
         <w:rPr>
@@ -23615,7 +23709,7 @@
         <w:rPr>
           <w:sz w:val="28"/>
         </w:rPr>
-        <w:t xml:space="preserve"> - 100 494 </w:t>
+        <w:t xml:space="preserve"> по трафику, базовое значение по трафику 5 164 </w:t>
       </w:r>
       <w:r>
         <w:rPr>
@@ -23628,26 +23722,7 @@
         <w:rPr>
           <w:sz w:val="28"/>
         </w:rPr>
-        <w:t xml:space="preserve"> по трафику, базовое значение по трафику 5 165 </w:t>
-      </w:r>
-      <w:r>
-        <w:rPr>
-          <w:i/>
-          <w:sz w:val="28"/>
-        </w:rPr>
-        <w:t>EUR</w:t>
-      </w:r>
-      <w:r>
-        <w:rPr>
-          <w:sz w:val="28"/>
-        </w:rPr>
-        <w:t xml:space="preserve">. Платежеспособность сегментов </w:t>
-      </w:r>
-      <w:r>
-        <w:rPr>
-          <w:sz w:val="28"/>
-        </w:rPr>
-        <w:t>достаточная, цена 9-</w:t>
+        <w:t>. Платежеспособность сегментов достаточная, цена 9-</w:t>
       </w:r>
       <w:r>
         <w:rPr>
@@ -23680,7 +23755,7 @@
         <w:rPr>
           <w:sz w:val="28"/>
         </w:rPr>
-        <w:t xml:space="preserve"> и данных опроса.</w:t>
+        <w:t xml:space="preserve"> и подтверждения платежеспособности реальными продажами.</w:t>
       </w:r>
     </w:p>
     <w:p>
@@ -23690,14 +23765,21 @@
         <w:ind w:firstLine="709"/>
       </w:pPr>
       <w:bookmarkStart w:id="25" w:name="_e6e1aac57bb528344b9009e4599364161f48047"/>
-      <w:bookmarkStart w:id="26" w:name="_Toc241957877"/>
+      <w:bookmarkStart w:id="26" w:name="_Toc241960720"/>
       <w:bookmarkEnd w:id="23"/>
       <w:r>
         <w:rPr>
           <w:b/>
           <w:sz w:val="28"/>
         </w:rPr>
-        <w:t>2.11 Сопоставление с целями и бюджетом проекта</w:t>
+        <w:t>2.11 Сопоставлени</w:t>
+      </w:r>
+      <w:r>
+        <w:rPr>
+          <w:b/>
+          <w:sz w:val="28"/>
+        </w:rPr>
+        <w:t>е с целями и бюджетом проекта</w:t>
       </w:r>
       <w:bookmarkEnd w:id="26"/>
     </w:p>
@@ -23751,13 +23833,7 @@
         <w:rPr>
           <w:sz w:val="28"/>
         </w:rPr>
-        <w:t xml:space="preserve"> веб-аудита 31.03.2027, открытая бета с оплатой 01.06.2027. Поэтому регистрации считаются за</w:t>
-      </w:r>
-      <w:r>
-        <w:rPr>
-          <w:sz w:val="28"/>
-        </w:rPr>
-        <w:t xml:space="preserve"> 6 месяцев после </w:t>
+        <w:t xml:space="preserve"> веб-аудита 31.03.2027, открытая бета с оплатой 01.06.2027. Поэтому регистрации считаются за 6 месяцев после </w:t>
       </w:r>
       <w:r>
         <w:rPr>
@@ -23797,7 +23873,13 @@
         <w:rPr>
           <w:sz w:val="28"/>
         </w:rPr>
-        <w:t>Таблица 22 – Ожидаемые регистрации и платящие против целей проекта</w:t>
+        <w:t>Таблица 22 – Ожидаемы</w:t>
+      </w:r>
+      <w:r>
+        <w:rPr>
+          <w:sz w:val="28"/>
+        </w:rPr>
+        <w:t>е регистрации и платящие против целей проекта</w:t>
       </w:r>
     </w:p>
     <w:tbl>
@@ -24591,7 +24673,13 @@
         <w:rPr>
           <w:sz w:val="28"/>
         </w:rPr>
-        <w:t>На рисунке 5 показано: накопление регистраций и платящих по сценариям против целей (оптимистичная линия правой части выходит за шкалу).</w:t>
+        <w:t>На рисунке 5 показано: накопление регистраций и платящих по сценариям против целей (оптимистичная линия правой части выходит з</w:t>
+      </w:r>
+      <w:r>
+        <w:rPr>
+          <w:sz w:val="28"/>
+        </w:rPr>
+        <w:t>а шкалу).</w:t>
       </w:r>
     </w:p>
     <w:p>
@@ -24608,7 +24696,7 @@
         </w:rPr>
         <w:lastRenderedPageBreak/>
         <w:drawing>
-          <wp:inline distT="0" distB="0" distL="0" distR="0" wp14:anchorId="48C93AF1" wp14:editId="6AE6FD53">
+          <wp:inline distT="0" distB="0" distL="0" distR="0" wp14:anchorId="6C091D72" wp14:editId="34BB85BE">
             <wp:extent cx="5334000" cy="2341756"/>
             <wp:effectExtent l="0" t="0" r="0" b="0"/>
             <wp:docPr id="34" name="Picture"/>
@@ -24660,13 +24748,7 @@
         <w:rPr>
           <w:sz w:val="28"/>
         </w:rPr>
-        <w:t>Рисунок 5 – Накопление регистраций и платящих по сценариям против целей (оптимистичная линия правой части выходит за ш</w:t>
-      </w:r>
-      <w:r>
-        <w:rPr>
-          <w:sz w:val="28"/>
-        </w:rPr>
-        <w:t>калу)</w:t>
+        <w:t>Рисунок 5 – Накопление регистраций и платящих по сценариям против целей (оптимистичная линия правой части выходит за шкалу)</w:t>
       </w:r>
     </w:p>
     <w:p>
@@ -24680,7 +24762,13 @@
         <w:rPr>
           <w:sz w:val="28"/>
         </w:rPr>
-        <w:t xml:space="preserve">Рисунок наглядно показывает, что цель по регистрациям достигается уже в базовом сценарии к третьему-четвертому месяцу после </w:t>
+        <w:t>Рисунок наглядно показывает, что цель по регистрациям достигается уже в базовом сценарии к третьему-четвертому месяцу по</w:t>
+      </w:r>
+      <w:r>
+        <w:rPr>
+          <w:sz w:val="28"/>
+        </w:rPr>
+        <w:t xml:space="preserve">сле </w:t>
       </w:r>
       <w:r>
         <w:rPr>
@@ -24693,13 +24781,7 @@
         <w:rPr>
           <w:sz w:val="28"/>
         </w:rPr>
-        <w:t>, а цель по платящим - только в оптимистичном. Чтобы получить 50 платящих за 4 месяца в базовых конверсиях, достижимая доля</w:t>
-      </w:r>
-      <w:r>
-        <w:rPr>
-          <w:sz w:val="28"/>
-        </w:rPr>
-        <w:t xml:space="preserve"> трафика должна быть около 3,9 % вместо 1,5 %; либо конверсия регистрации в платящего должна быть около 13 % вместо 5 %.</w:t>
+        <w:t>, а цель по платящим - только в оптимистичном. Чтобы получить 50 платящих за 4 месяца в базовых конверсиях, достижимая доля трафика должна быть около 3,9 % вместо 1,5 %; либо конверсия регистрации в платящего должна быть около 13 % вместо 5 %.</w:t>
       </w:r>
     </w:p>
     <w:p>
@@ -24713,7 +24795,13 @@
         <w:rPr>
           <w:sz w:val="28"/>
         </w:rPr>
-        <w:t>Выручка при 50 платящих составляет около 5 029 </w:t>
+        <w:t>Выруч</w:t>
+      </w:r>
+      <w:r>
+        <w:rPr>
+          <w:sz w:val="28"/>
+        </w:rPr>
+        <w:t>ка при 50 платящих составляет около 5 029 </w:t>
       </w:r>
       <w:r>
         <w:rPr>
@@ -24752,13 +24840,7 @@
         <w:rPr>
           <w:sz w:val="28"/>
         </w:rPr>
-        <w:t xml:space="preserve"> базового сценария по клиентс</w:t>
-      </w:r>
-      <w:r>
-        <w:rPr>
-          <w:sz w:val="28"/>
-        </w:rPr>
-        <w:t>кой оценке (45 504 </w:t>
+        <w:t xml:space="preserve"> базового сценария по клиентской оценке (45 504 </w:t>
       </w:r>
       <w:r>
         <w:rPr>
@@ -24771,7 +24853,13 @@
         <w:rPr>
           <w:sz w:val="28"/>
         </w:rPr>
-        <w:t>) покрывает 30 % бюджета. Это означает, что первый год проекта не окупается, а его экономика зависит от роста после 30.09.2027. Рекомендации: добавить каналы вне наблюдаемого трафика (</w:t>
+        <w:t xml:space="preserve">) покрывает 30 % бюджета. Это означает, что первый год проекта не окупается, а его экономика зависит от </w:t>
+      </w:r>
+      <w:r>
+        <w:rPr>
+          <w:sz w:val="28"/>
+        </w:rPr>
+        <w:t>роста после 30.09.2027. Рекомендации: добавить каналы вне наблюдаемого трафика (</w:t>
       </w:r>
       <w:r>
         <w:rPr>
@@ -24784,13 +24872,7 @@
         <w:rPr>
           <w:sz w:val="28"/>
         </w:rPr>
-        <w:t>, партнеры из бухгалтерских и консалтинго</w:t>
-      </w:r>
-      <w:r>
-        <w:rPr>
-          <w:sz w:val="28"/>
-        </w:rPr>
-        <w:t xml:space="preserve">вых фирм, </w:t>
+        <w:t xml:space="preserve">, партнеры из бухгалтерских и консалтинговых фирм, </w:t>
       </w:r>
       <w:r>
         <w:rPr>
@@ -24829,7 +24911,13 @@
         <w:rPr>
           <w:sz w:val="28"/>
         </w:rPr>
-        <w:t xml:space="preserve"> и пересмотреть срок или формулировку цели по платящим в реестре рисков.</w:t>
+        <w:t xml:space="preserve"> и пересмотреть срок или формулировку цели по платящим в реест</w:t>
+      </w:r>
+      <w:r>
+        <w:rPr>
+          <w:sz w:val="28"/>
+        </w:rPr>
+        <w:t>ре рисков.</w:t>
       </w:r>
     </w:p>
     <w:p>
@@ -24839,7 +24927,7 @@
         <w:ind w:firstLine="709"/>
       </w:pPr>
       <w:bookmarkStart w:id="27" w:name="_6a64c25cd48aeb5a2bf3dc411d56d805a6b5d7e"/>
-      <w:bookmarkStart w:id="28" w:name="_Toc241957878"/>
+      <w:bookmarkStart w:id="28" w:name="_Toc241960721"/>
       <w:bookmarkEnd w:id="25"/>
       <w:r>
         <w:rPr>
@@ -24898,7 +24986,7 @@
         </w:rPr>
         <w:lastRenderedPageBreak/>
         <w:drawing>
-          <wp:inline distT="0" distB="0" distL="0" distR="0" wp14:anchorId="3A9147D2" wp14:editId="727D2811">
+          <wp:inline distT="0" distB="0" distL="0" distR="0" wp14:anchorId="19069016" wp14:editId="2BD2491A">
             <wp:extent cx="5334000" cy="2471853"/>
             <wp:effectExtent l="0" t="0" r="0" b="0"/>
             <wp:docPr id="38" name="Picture"/>
@@ -24964,13 +25052,13 @@
         <w:rPr>
           <w:sz w:val="28"/>
         </w:rPr>
-        <w:t>Наибольшее влияние оказывает достижимая доля трафика (от 6 до 51 платящих), затем две конверсии. Цель в 50 платящих достигается только при о</w:t>
-      </w:r>
-      <w:r>
-        <w:rPr>
-          <w:sz w:val="28"/>
-        </w:rPr>
-        <w:t>птимистичной доле трафика (около 51), конверсии по отдельности ее не обеспечивают. Покрытие и релевантность трафика сдвигают результат слабее.</w:t>
+        <w:t xml:space="preserve">Наибольшее влияние оказывает достижимая доля трафика (от 6 до 51 платящих), затем две конверсии. Цель в 50 платящих достигается только при оптимистичной доле трафика (около 51), конверсии по отдельности ее не обеспечивают. Покрытие и релевантность трафика </w:t>
+      </w:r>
+      <w:r>
+        <w:rPr>
+          <w:sz w:val="28"/>
+        </w:rPr>
+        <w:t>сдвигают результат слабее.</w:t>
       </w:r>
     </w:p>
     <w:p>
@@ -25049,13 +25137,7 @@
         <w:rPr>
           <w:sz w:val="28"/>
         </w:rPr>
-        <w:t>, сц</w:t>
-      </w:r>
-      <w:r>
-        <w:rPr>
-          <w:sz w:val="28"/>
-        </w:rPr>
-        <w:t xml:space="preserve">енарии, сверху вниз и снизу вверх, воронки </w:t>
+        <w:t xml:space="preserve">, сценарии, сверху вниз и снизу вверх, воронки </w:t>
       </w:r>
       <w:r>
         <w:rPr>
@@ -25068,7 +25150,13 @@
         <w:rPr>
           <w:sz w:val="28"/>
         </w:rPr>
-        <w:t>, платежеспособность, цифровая воронка, поисковая воронка. Из 52 контрольных величин расхождений выше допуска нет (52 из 52). Допуск фиксировался до расчета: относительная погрешность 1</w:t>
+        <w:t>, платежеспособность, цифровая воронка, поисковая воронка. Из 5</w:t>
+      </w:r>
+      <w:r>
+        <w:rPr>
+          <w:sz w:val="28"/>
+        </w:rPr>
+        <w:t>2 контрольных величин расхождений выше допуска нет (52 из 52). Допуск фиксировался до расчета: относительная погрешность 1</w:t>
       </w:r>
       <w:r>
         <w:rPr>
@@ -25081,13 +25169,7 @@
         <w:rPr>
           <w:sz w:val="28"/>
         </w:rPr>
-        <w:t xml:space="preserve"> для прямых фор</w:t>
-      </w:r>
-      <w:r>
-        <w:rPr>
-          <w:sz w:val="28"/>
-        </w:rPr>
-        <w:t>мул и 5</w:t>
+        <w:t xml:space="preserve"> для прямых формул и 5</w:t>
       </w:r>
       <w:r>
         <w:rPr>
@@ -25113,7 +25195,13 @@
         <w:rPr>
           <w:sz w:val="28"/>
         </w:rPr>
-        <w:t xml:space="preserve"> вводились округленные значения (чек до двух знаков), а также для листов с цепочкой округленных промежуточных величин. Ошибок формул (#ЗНАЧ!, #ДЕЛ/0!, #ССЫЛКА!) в итоговых книгах нет.</w:t>
+        <w:t xml:space="preserve"> вводились округленные значения (чек до двух знаков), а также для листов с цепочкой округ</w:t>
+      </w:r>
+      <w:r>
+        <w:rPr>
+          <w:sz w:val="28"/>
+        </w:rPr>
+        <w:t>ленных промежуточных величин. Ошибок формул (#ЗНАЧ!, #ДЕЛ/0!, #ССЫЛКА!) в итоговых книгах нет.</w:t>
       </w:r>
     </w:p>
     <w:p>
@@ -25123,7 +25211,7 @@
         <w:ind w:firstLine="709"/>
       </w:pPr>
       <w:bookmarkStart w:id="29" w:name="_8cdf61ec50cc46d2aaeadce1b560fea28ea116e"/>
-      <w:bookmarkStart w:id="30" w:name="_Toc241957879"/>
+      <w:bookmarkStart w:id="30" w:name="_Toc241960722"/>
       <w:bookmarkEnd w:id="27"/>
       <w:r>
         <w:rPr>
@@ -25145,13 +25233,7 @@
         <w:rPr>
           <w:sz w:val="28"/>
         </w:rPr>
-        <w:t>Ограничения влияют на</w:t>
-      </w:r>
-      <w:r>
-        <w:rPr>
-          <w:sz w:val="28"/>
-        </w:rPr>
-        <w:t xml:space="preserve"> интерпретацию так: оценки </w:t>
+        <w:t xml:space="preserve">Ограничения влияют на интерпретацию так: оценки </w:t>
       </w:r>
       <w:r>
         <w:rPr>
@@ -25203,13 +25285,19 @@
         <w:rPr>
           <w:sz w:val="28"/>
         </w:rPr>
-        <w:t>) особенно; география взята по топ-5 стран, поэтому доля целевых стран занижена; коэффициенты релевантности, конверсий и платежеспособности - допущения б</w:t>
-      </w:r>
-      <w:r>
-        <w:rPr>
-          <w:sz w:val="28"/>
-        </w:rPr>
-        <w:t xml:space="preserve">ез измерений на собственном продукте; данные </w:t>
+        <w:t>) особенно; г</w:t>
+      </w:r>
+      <w:r>
+        <w:rPr>
+          <w:sz w:val="28"/>
+        </w:rPr>
+        <w:t>еография взята по топ-5 стран, поэтому доля целевых стран занижена; коэффициенты релевантности, конверсий и платежеспособности - допущения без измерений на собственном продукте; численность профессий за пределами США оценена масштабом по занятости США и св</w:t>
+      </w:r>
+      <w:r>
+        <w:rPr>
+          <w:sz w:val="28"/>
+        </w:rPr>
+        <w:t xml:space="preserve">ерена с </w:t>
       </w:r>
       <w:r>
         <w:rPr>
@@ -25222,13 +25310,20 @@
         <w:rPr>
           <w:sz w:val="28"/>
         </w:rPr>
-        <w:t xml:space="preserve"> по профессиям не получены и заменены масштабом по занятости США; поисковая методика применена к русскоязычному сегменту. Все эти допущения перечислены в приложении А, а недостающие данные - в приложении</w:t>
-      </w:r>
-      <w:r>
-        <w:rPr>
-          <w:sz w:val="28"/>
-        </w:rPr>
-        <w:t xml:space="preserve"> Б.</w:t>
+        <w:t xml:space="preserve"> и </w:t>
+      </w:r>
+      <w:r>
+        <w:rPr>
+          <w:i/>
+          <w:sz w:val="28"/>
+        </w:rPr>
+        <w:t>ONS</w:t>
+      </w:r>
+      <w:r>
+        <w:rPr>
+          <w:sz w:val="28"/>
+        </w:rPr>
+        <w:t xml:space="preserve"> в приложении Д; поисковая методика применена к русскоязычному сегменту. Все эти допущения перечислены в приложении А, а недостающие данные - в приложении Б.</w:t>
       </w:r>
     </w:p>
     <w:p>
@@ -25239,7 +25334,7 @@
         <w:ind w:firstLine="709"/>
       </w:pPr>
       <w:bookmarkStart w:id="31" w:name="_1bfdad9d2d88ddb6ca16c31c1d4d4943679f32f"/>
-      <w:bookmarkStart w:id="32" w:name="_Toc241957880"/>
+      <w:bookmarkStart w:id="32" w:name="_Toc241960723"/>
       <w:bookmarkEnd w:id="29"/>
       <w:bookmarkEnd w:id="2"/>
       <w:r>
@@ -25263,7 +25358,13 @@
         <w:rPr>
           <w:sz w:val="28"/>
         </w:rPr>
-        <w:t xml:space="preserve">Ответы даны по контрольным вопросам методики оценки объема рынка по данным </w:t>
+        <w:t>Ответы даны по контрольным вопросам методики</w:t>
+      </w:r>
+      <w:r>
+        <w:rPr>
+          <w:sz w:val="28"/>
+        </w:rPr>
+        <w:t xml:space="preserve"> оценки объема рынка по данным </w:t>
       </w:r>
       <w:r>
         <w:rPr>
@@ -25294,13 +25395,7 @@
         <w:rPr>
           <w:sz w:val="28"/>
         </w:rPr>
-        <w:t xml:space="preserve">Совпадает ли список </w:t>
-      </w:r>
-      <w:r>
-        <w:rPr>
-          <w:sz w:val="28"/>
-        </w:rPr>
-        <w:t>конкурентов с ранее зафиксированными границами рынка? Да. Прямые игроки (</w:t>
+        <w:t>Совпадает ли список конкурентов с ранее зафиксированными границами рынка? Да. Прямые игроки (</w:t>
       </w:r>
       <w:r>
         <w:rPr>
@@ -25339,7 +25434,13 @@
         <w:rPr>
           <w:sz w:val="28"/>
         </w:rPr>
-        <w:t>) и заменители (</w:t>
+        <w:t xml:space="preserve">) </w:t>
+      </w:r>
+      <w:r>
+        <w:rPr>
+          <w:sz w:val="28"/>
+        </w:rPr>
+        <w:t>и заменители (</w:t>
       </w:r>
       <w:r>
         <w:rPr>
@@ -25396,13 +25497,7 @@
         <w:rPr>
           <w:sz w:val="28"/>
         </w:rPr>
-        <w:t>Не включены ли в расчет сайты, которые обслуживают д</w:t>
-      </w:r>
-      <w:r>
-        <w:rPr>
-          <w:sz w:val="28"/>
-        </w:rPr>
-        <w:t xml:space="preserve">ругую клиентскую задачу? Частично. </w:t>
+        <w:t xml:space="preserve">Не включены ли в расчет сайты, которые обслуживают другую клиентскую задачу? Частично. </w:t>
       </w:r>
       <w:r>
         <w:rPr>
@@ -25441,7 +25536,13 @@
         <w:rPr>
           <w:sz w:val="28"/>
         </w:rPr>
-        <w:t xml:space="preserve"> решают общую аналитику; их вклад ограничен долей релевантного содержания 10-15 %.</w:t>
+        <w:t xml:space="preserve"> решают общую аналитику; их вклад ограничен долей </w:t>
+      </w:r>
+      <w:r>
+        <w:rPr>
+          <w:sz w:val="28"/>
+        </w:rPr>
+        <w:t>релевантного содержания 10-15 %.</w:t>
       </w:r>
     </w:p>
     <w:p>
@@ -25459,13 +25560,7 @@
         <w:rPr>
           <w:sz w:val="28"/>
         </w:rPr>
-        <w:t xml:space="preserve">Одинаковы ли период, страна, устройство и тип трафика для всех конкурентов? Да. Период 06-08.2026, весь мир, весь трафик, </w:t>
-      </w:r>
-      <w:r>
-        <w:rPr>
-          <w:sz w:val="28"/>
-        </w:rPr>
-        <w:t>один снимок 03.10.2026.</w:t>
+        <w:t>Одинаковы ли период, страна, устройство и тип трафика для всех конкурентов? Да. Период 06-08.2026, весь мир, весь трафик, один снимок 03.10.2026.</w:t>
       </w:r>
     </w:p>
     <w:p>
@@ -25483,7 +25578,13 @@
         <w:rPr>
           <w:sz w:val="28"/>
         </w:rPr>
-        <w:t>Разделены ли общий трафик, трафик целевой страны и трафик релевантных каналов? Да, но география по топ-5 стран (нижняя оценка); три доли показаны в таблице 4.</w:t>
+        <w:t>Разделены ли общий трафик, трафик целевой страны и трафик релевантных каналов</w:t>
+      </w:r>
+      <w:r>
+        <w:rPr>
+          <w:sz w:val="28"/>
+        </w:rPr>
+        <w:t>? Да, но география по топ-5 стран (нижняя оценка); три доли показаны в таблице 4.</w:t>
       </w:r>
     </w:p>
     <w:p>
@@ -25501,13 +25602,7 @@
         <w:rPr>
           <w:sz w:val="28"/>
         </w:rPr>
-        <w:t>Не подменяется ли доля трафика долей выручки без дополнительных допущений</w:t>
-      </w:r>
-      <w:r>
-        <w:rPr>
-          <w:sz w:val="28"/>
-        </w:rPr>
-        <w:t>? Нет. Переход от трафика к выручке выполнен через конверсии и чек с допущениями Д-09 и Д-12.</w:t>
+        <w:t>Не подменяется ли доля трафика долей выручки без дополнительных допущений? Нет. Переход от трафика к выручке выполнен через конверсии и чек с допущениями Д-09 и Д-12.</w:t>
       </w:r>
     </w:p>
     <w:p>
@@ -25525,7 +25620,13 @@
         <w:rPr>
           <w:sz w:val="28"/>
         </w:rPr>
-        <w:t xml:space="preserve">Проверены ли выбросы, сезонность и разовые всплески? Выбросы Вордстата обработаны правилом ЛР1; у </w:t>
+        <w:t>Провере</w:t>
+      </w:r>
+      <w:r>
+        <w:rPr>
+          <w:sz w:val="28"/>
+        </w:rPr>
+        <w:t xml:space="preserve">ны ли выбросы, сезонность и разовые всплески? Выбросы Вордстата обработаны правилом ЛР1; у </w:t>
       </w:r>
       <w:r>
         <w:rPr>
@@ -25538,13 +25639,7 @@
         <w:rPr>
           <w:sz w:val="28"/>
         </w:rPr>
-        <w:t xml:space="preserve"> использован трехмесячный период, сезонность вынесена </w:t>
-      </w:r>
-      <w:r>
-        <w:rPr>
-          <w:sz w:val="28"/>
-        </w:rPr>
-        <w:t>в ЛР1.</w:t>
+        <w:t xml:space="preserve"> использован трехмесячный период, сезонность вынесена в ЛР1.</w:t>
       </w:r>
     </w:p>
     <w:p>
@@ -25700,7 +25795,13 @@
         <w:rPr>
           <w:sz w:val="28"/>
         </w:rPr>
-        <w:t xml:space="preserve"> и уровень надежности данных по небольшим сайтам? Да. Раздел 2.13 и коэффициент качества 0,60 для малых сайтов.</w:t>
+        <w:t xml:space="preserve"> и уровень надежности данны</w:t>
+      </w:r>
+      <w:r>
+        <w:rPr>
+          <w:sz w:val="28"/>
+        </w:rPr>
+        <w:t>х по небольшим сайтам? Да. Раздел 2.13 и коэффициент качества 0,60 для малых сайтов.</w:t>
       </w:r>
     </w:p>
     <w:p>
@@ -25740,13 +25841,13 @@
         <w:rPr>
           <w:sz w:val="28"/>
         </w:rPr>
-        <w:t xml:space="preserve"> и Вордстат</w:t>
-      </w:r>
-      <w:r>
-        <w:rPr>
-          <w:sz w:val="28"/>
-        </w:rPr>
-        <w:t xml:space="preserve">а получены (ЛР1, книга 7); тренд, сезонность и циклы оценены (ЛР1); список </w:t>
+        <w:t xml:space="preserve"> и Вордстата получены (ЛР1, книга 7); тренд, сезонность и циклы оценены</w:t>
+      </w:r>
+      <w:r>
+        <w:rPr>
+          <w:sz w:val="28"/>
+        </w:rPr>
+        <w:t xml:space="preserve"> (ЛР1); список </w:t>
       </w:r>
       <w:r>
         <w:rPr>
@@ -25766,13 +25867,26 @@
         <w:rPr>
           <w:sz w:val="28"/>
         </w:rPr>
-        <w:t xml:space="preserve"> сняты; расчет выполнен пятью методами (сверху вниз, снизу вверх, потенциальные клиенты, воронка, поиск); построена цифровая воронка; сделаны тр</w:t>
-      </w:r>
-      <w:r>
-        <w:rPr>
-          <w:sz w:val="28"/>
-        </w:rPr>
-        <w:t>и сценария; проверена платежеспособность; итог оформлен диапазоном с ограничениями.</w:t>
+        <w:t xml:space="preserve"> сняты; расчет выполнен семью методиками в семи книгах (потенциальные клиенты, сверху вниз и снизу вверх, платежеспособность, цифровая воронка, сценарная оценка и объем по </w:t>
+      </w:r>
+      <w:r>
+        <w:rPr>
+          <w:i/>
+          <w:sz w:val="28"/>
+        </w:rPr>
+        <w:t>Similarweb</w:t>
+      </w:r>
+      <w:r>
+        <w:rPr>
+          <w:sz w:val="28"/>
+        </w:rPr>
+        <w:t>, поисковый спрос); по</w:t>
+      </w:r>
+      <w:r>
+        <w:rPr>
+          <w:sz w:val="28"/>
+        </w:rPr>
+        <w:t>строена цифровая воронка; сделаны три сценария; проверена платежеспособность; итог оформлен диапазоном с ограничениями.</w:t>
       </w:r>
     </w:p>
     <w:p>
@@ -25783,7 +25897,7 @@
         <w:jc w:val="center"/>
       </w:pPr>
       <w:bookmarkStart w:id="33" w:name="_выводы"/>
-      <w:bookmarkStart w:id="34" w:name="_Toc241957881"/>
+      <w:bookmarkStart w:id="34" w:name="_Toc241960724"/>
       <w:bookmarkEnd w:id="31"/>
       <w:r>
         <w:rPr>
@@ -25839,32 +25953,33 @@
           <w:i/>
           <w:sz w:val="28"/>
         </w:rPr>
+        <w:t>EU</w:t>
+      </w:r>
+      <w:r>
+        <w:rPr>
+          <w:i/>
+          <w:sz w:val="28"/>
+        </w:rPr>
+        <w:t>R</w:t>
+      </w:r>
+      <w:r>
+        <w:rPr>
+          <w:sz w:val="28"/>
+        </w:rPr>
+        <w:t xml:space="preserve"> - 68 543 809 </w:t>
+      </w:r>
+      <w:r>
+        <w:rPr>
+          <w:i/>
+          <w:sz w:val="28"/>
+        </w:rPr>
         <w:t>EUR</w:t>
       </w:r>
       <w:r>
         <w:rPr>
           <w:sz w:val="28"/>
         </w:rPr>
-        <w:t xml:space="preserve"> - 68 543 809 </w:t>
-      </w:r>
-      <w:r>
-        <w:rPr>
-          <w:i/>
-          <w:sz w:val="28"/>
-        </w:rPr>
-        <w:t>EUR</w:t>
-      </w:r>
-      <w:r>
-        <w:rPr>
-          <w:sz w:val="28"/>
-        </w:rPr>
-        <w:t xml:space="preserve"> в год, базовая оц</w:t>
-      </w:r>
-      <w:r>
-        <w:rPr>
-          <w:sz w:val="28"/>
-        </w:rPr>
-        <w:t>енка 35 003 130 </w:t>
+        <w:t xml:space="preserve"> в год, базовая оценка 35 003 130 </w:t>
       </w:r>
       <w:r>
         <w:rPr>
@@ -25930,7 +26045,13 @@
         <w:rPr>
           <w:sz w:val="28"/>
         </w:rPr>
-        <w:t>) в первый год - от 132 </w:t>
+        <w:t xml:space="preserve">) в первый год </w:t>
+      </w:r>
+      <w:r>
+        <w:rPr>
+          <w:sz w:val="28"/>
+        </w:rPr>
+        <w:t>- от 132 </w:t>
       </w:r>
       <w:r>
         <w:rPr>
@@ -25943,7 +26064,7 @@
         <w:rPr>
           <w:sz w:val="28"/>
         </w:rPr>
-        <w:t xml:space="preserve"> до 100 494 </w:t>
+        <w:t xml:space="preserve"> до 100 466 </w:t>
       </w:r>
       <w:r>
         <w:rPr>
@@ -25956,13 +26077,7 @@
         <w:rPr>
           <w:sz w:val="28"/>
         </w:rPr>
-        <w:t xml:space="preserve"> по канал</w:t>
-      </w:r>
-      <w:r>
-        <w:rPr>
-          <w:sz w:val="28"/>
-        </w:rPr>
-        <w:t>у, с базовым значением 5 165 </w:t>
+        <w:t xml:space="preserve"> по каналу, с базовым значением 5 164 </w:t>
       </w:r>
       <w:r>
         <w:rPr>
@@ -26001,7 +26116,13 @@
         <w:rPr>
           <w:sz w:val="28"/>
         </w:rPr>
-        <w:t xml:space="preserve">-помощников (около 1,9 миллиона). Проверка по маркетплейсу </w:t>
+        <w:t>-помощников (око</w:t>
+      </w:r>
+      <w:r>
+        <w:rPr>
+          <w:sz w:val="28"/>
+        </w:rPr>
+        <w:t xml:space="preserve">ло 1,9 миллиона). Проверка по маркетплейсу </w:t>
       </w:r>
       <w:r>
         <w:rPr>
@@ -26027,13 +26148,7 @@
         <w:rPr>
           <w:sz w:val="28"/>
         </w:rPr>
-        <w:t xml:space="preserve"> (25 предложений в поле проверки таблиц из</w:t>
-      </w:r>
-      <w:r>
-        <w:rPr>
-          <w:sz w:val="28"/>
-        </w:rPr>
-        <w:t xml:space="preserve"> 2 184 надстроек </w:t>
+        <w:t xml:space="preserve"> (25 предложений в поле проверки таблиц из 2 184 надстроек </w:t>
       </w:r>
       <w:r>
         <w:rPr>
@@ -26046,7 +26161,13 @@
         <w:rPr>
           <w:sz w:val="28"/>
         </w:rPr>
-        <w:t>) показала, что магазин пока дает лишь малую часть спроса и служит каналом доверия, а не основным источником выручки. Цена тарифов находится в рыночном коридоре, платежеспособность сегментов достаточная (средний индекс 2,4).</w:t>
+        <w:t>) показала, что магазин пока дает лишь малую часть спроса и служит каналом доверия, а не основным источником выручки. Цена тарифов</w:t>
+      </w:r>
+      <w:r>
+        <w:rPr>
+          <w:sz w:val="28"/>
+        </w:rPr>
+        <w:t xml:space="preserve"> находится в рыночном коридоре, платежеспособность сегментов достаточная (средний индекс 2,4).</w:t>
       </w:r>
     </w:p>
     <w:p>
@@ -26060,19 +26181,13 @@
         <w:rPr>
           <w:sz w:val="28"/>
         </w:rPr>
-        <w:t>Цель прое</w:t>
-      </w:r>
-      <w:r>
-        <w:rPr>
-          <w:sz w:val="28"/>
-        </w:rPr>
-        <w:t>кта по регистрациям (300) достижима в базовом сценарии (571 за 6 месяцев). Цель по платящим (50) за 4 месяца платной беты в базовом сценарии не достигается (19) и требует либо оптимистичной доли трафика (около 3,9 %), либо дополнительных каналов, либо боле</w:t>
-      </w:r>
-      <w:r>
-        <w:rPr>
-          <w:sz w:val="28"/>
-        </w:rPr>
-        <w:t xml:space="preserve">е длинного горизонта; на 12 месяцев канал дает около 57 платящих. Рекомендуется перейти к ЛР4 и ЛР5 и использовать снимок </w:t>
+        <w:t>Цель проекта по регистрациям (300) достижима в базовом сценарии (571 за 6 месяцев). Цель по платящим (50) за 4 месяца платной беты в базовом сценарии не достигае</w:t>
+      </w:r>
+      <w:r>
+        <w:rPr>
+          <w:sz w:val="28"/>
+        </w:rPr>
+        <w:t xml:space="preserve">тся (19) и требует либо оптимистичной доли трафика (около 3,9 %), либо дополнительных каналов, либо более длинного горизонта; на 12 месяцев канал дает около 57 платящих. Рекомендуется перейти к ЛР4 и ЛР5 и использовать снимок </w:t>
       </w:r>
       <w:r>
         <w:rPr>
@@ -26085,7 +26200,13 @@
         <w:rPr>
           <w:sz w:val="28"/>
         </w:rPr>
-        <w:t xml:space="preserve"> для анализа пяти сил и конкурентов, а в реестре рисков отразить риск недостижения цели по платящим.</w:t>
+        <w:t xml:space="preserve"> для анализа пяти си</w:t>
+      </w:r>
+      <w:r>
+        <w:rPr>
+          <w:sz w:val="28"/>
+        </w:rPr>
+        <w:t>л и конкурентов, а в реестре рисков отразить риск недостижения цели по платящим.</w:t>
       </w:r>
     </w:p>
     <w:p>
@@ -26096,7 +26217,7 @@
         <w:jc w:val="center"/>
       </w:pPr>
       <w:bookmarkStart w:id="35" w:name="_274f6a444530ef90b0479dabf3d210f01e97699"/>
-      <w:bookmarkStart w:id="36" w:name="_Toc241957882"/>
+      <w:bookmarkStart w:id="36" w:name="_Toc241960725"/>
       <w:bookmarkEnd w:id="33"/>
       <w:r>
         <w:rPr>
@@ -26104,14 +26225,7 @@
           <w:sz w:val="28"/>
         </w:rPr>
         <w:lastRenderedPageBreak/>
-        <w:t>СПИСОК ИСПОЛЬЗОВАННЫХ И</w:t>
-      </w:r>
-      <w:r>
-        <w:rPr>
-          <w:b/>
-          <w:sz w:val="28"/>
-        </w:rPr>
-        <w:t>СТОЧНИКОВ</w:t>
+        <w:t>СПИСОК ИСПОЛЬЗОВАННЫХ ИСТОЧНИКОВ</w:t>
       </w:r>
       <w:bookmarkEnd w:id="36"/>
     </w:p>
@@ -26130,7 +26244,13 @@
         <w:rPr>
           <w:sz w:val="28"/>
         </w:rPr>
-        <w:t>Земляник, Р. В. Отчет по лабораторной работе № 1 «Анализ поискового спроса и фиксация границ рынка» по дисциплине «Электронный бизнес» / Р. В. Земляник. – Минск : БГУИР, 2026.</w:t>
+        <w:t>Земляник, Р. В. Отчет по лабораторной работе № 1 «Анализ поискового спроса и фиксация границ рынка» по дисциплине «Электронный бизнес» / Р. В.</w:t>
+      </w:r>
+      <w:r>
+        <w:rPr>
+          <w:sz w:val="28"/>
+        </w:rPr>
+        <w:t xml:space="preserve"> Земляник. – Минск : БГУИР, 2026.</w:t>
       </w:r>
     </w:p>
     <w:p>
@@ -26148,13 +26268,7 @@
         <w:rPr>
           <w:sz w:val="28"/>
         </w:rPr>
-        <w:t xml:space="preserve">Методические материалы дисциплины «Электронный бизнес» к лабораторным </w:t>
-      </w:r>
-      <w:r>
-        <w:rPr>
-          <w:sz w:val="28"/>
-        </w:rPr>
-        <w:t xml:space="preserve">работам № 2–3: инструкция по применению методик оценки рынка электронного бизнеса и методики оценки рынка (поисковый спрос, </w:t>
+        <w:t xml:space="preserve">Методические материалы дисциплины «Электронный бизнес» к лабораторным работам № 2–3: инструкция по применению методик оценки рынка электронного бизнеса и методики оценки рынка (поисковый спрос, </w:t>
       </w:r>
       <w:r>
         <w:rPr>
@@ -26167,7 +26281,13 @@
         <w:rPr>
           <w:sz w:val="28"/>
         </w:rPr>
-        <w:t>, сверху вниз и снизу вверх, потенциальные клиенты, цифровая воронка, платежеспособность). – Минск : БГУИР, 2026.</w:t>
+        <w:t>, сверху вниз и сн</w:t>
+      </w:r>
+      <w:r>
+        <w:rPr>
+          <w:sz w:val="28"/>
+        </w:rPr>
+        <w:t>изу вверх, потенциальные клиенты, цифровая воронка, платежеспособность). – Минск : БГУИР, 2026.</w:t>
       </w:r>
     </w:p>
     <w:p>
@@ -26185,13 +26305,13 @@
         <w:rPr>
           <w:sz w:val="28"/>
         </w:rPr>
-        <w:t>Национал</w:t>
-      </w:r>
-      <w:r>
-        <w:rPr>
-          <w:sz w:val="28"/>
-        </w:rPr>
-        <w:t>ьный банк Республики Беларусь. Официальные курсы белорусского рубля [Электронный ресурс]. – Режим доступа: https://www.nbrb.by/api/exrates/rates/EUR?parammode=2. – Дата доступа: 03.10.2026.</w:t>
+        <w:t>Национальный банк Республики Беларусь. Официальные курсы белорусского рубля [Электронный ресурс]. – Режим доступа: https://www.nbrb.by/api/exrates/rates/EUR?par</w:t>
+      </w:r>
+      <w:r>
+        <w:rPr>
+          <w:sz w:val="28"/>
+        </w:rPr>
+        <w:t>ammode=2. – Дата доступа: 03.10.2026.</w:t>
       </w:r>
     </w:p>
     <w:p>
@@ -26235,13 +26355,7 @@
         <w:rPr>
           <w:sz w:val="28"/>
         </w:rPr>
-        <w:t>, сетевой график и</w:t>
-      </w:r>
-      <w:r>
-        <w:rPr>
-          <w:sz w:val="28"/>
-        </w:rPr>
-        <w:t xml:space="preserve"> диаграмма Ганта </w:t>
+        <w:t xml:space="preserve">, сетевой график и диаграмма Ганта </w:t>
       </w:r>
       <w:r>
         <w:rPr>
@@ -26331,13 +26445,7 @@
         <w:rPr>
           <w:sz w:val="28"/>
         </w:rPr>
-        <w:t>) [Электронный ресурс]. – Режим доступа: https://pro.similarweb.com/. – Да</w:t>
-      </w:r>
-      <w:r>
-        <w:rPr>
-          <w:sz w:val="28"/>
-        </w:rPr>
-        <w:t>та доступа: 03.10.2026.</w:t>
+        <w:t>) [Электронный ресурс]. – Режим доступа: https://pro.similarweb.com/. – Дата доступа: 03.10.2026.</w:t>
       </w:r>
     </w:p>
     <w:p>
@@ -26538,19 +26646,20 @@
           <w:i/>
           <w:sz w:val="28"/>
         </w:rPr>
-        <w:t>Analysts</w:t>
-      </w:r>
-      <w:r>
-        <w:rPr>
-          <w:sz w:val="28"/>
-        </w:rPr>
-        <w:t xml:space="preserve"> [Электронный ресурс]. – Режим доступа: https://www.bls.gov/ooh/business-and-financial/. – Дата доступа</w:t>
-      </w:r>
-      <w:r>
-        <w:rPr>
-          <w:sz w:val="28"/>
-        </w:rPr>
-        <w:t>: 03.10.2026.</w:t>
+        <w:t>Analy</w:t>
+      </w:r>
+      <w:r>
+        <w:rPr>
+          <w:i/>
+          <w:sz w:val="28"/>
+        </w:rPr>
+        <w:t>sts</w:t>
+      </w:r>
+      <w:r>
+        <w:rPr>
+          <w:sz w:val="28"/>
+        </w:rPr>
+        <w:t xml:space="preserve"> [Электронный ресурс]. – Режим доступа: https://www.bls.gov/ooh/business-and-financial/. – Дата доступа: 03.10.2026.</w:t>
       </w:r>
     </w:p>
     <w:p>
@@ -26692,7 +26801,13 @@
         <w:rPr>
           <w:sz w:val="28"/>
         </w:rPr>
-        <w:t xml:space="preserve"> [Электронный ресурс]. – Режим доступа: https://advocacy.sba.gov/2025/06/30/new-advocacy-report-shows-the-number-of-small-businesses-in-the-u-s-exceeds-36-million/. – Дата доступа: 03.10.2026.</w:t>
+        <w:t xml:space="preserve"> [Электронный ресурс]. – Режим доступа: https://advoc</w:t>
+      </w:r>
+      <w:r>
+        <w:rPr>
+          <w:sz w:val="28"/>
+        </w:rPr>
+        <w:t>acy.sba.gov/2025/06/30/new-advocacy-report-shows-the-number-of-small-businesses-in-the-u-s-exceeds-36-million/. – Дата доступа: 03.10.2026.</w:t>
       </w:r>
     </w:p>
     <w:p>
@@ -26815,20 +26930,19 @@
           <w:i/>
           <w:sz w:val="28"/>
         </w:rPr>
-        <w:t>estim</w:t>
-      </w:r>
-      <w:r>
-        <w:rPr>
-          <w:i/>
-          <w:sz w:val="28"/>
-        </w:rPr>
-        <w:t>ates</w:t>
-      </w:r>
-      <w:r>
-        <w:rPr>
-          <w:sz w:val="28"/>
-        </w:rPr>
-        <w:t xml:space="preserve"> 2025 [Электронный ресурс]. – Режим доступа: https://www.gov.uk/government/statistics/business-population-estimates-2025. – Дата доступа: 03.10.2026 (значения по сводке поисковой выдачи).</w:t>
+        <w:t>estimates</w:t>
+      </w:r>
+      <w:r>
+        <w:rPr>
+          <w:sz w:val="28"/>
+        </w:rPr>
+        <w:t xml:space="preserve"> 2025 [Электронный ресурс]. – Режим доступа: http</w:t>
+      </w:r>
+      <w:r>
+        <w:rPr>
+          <w:sz w:val="28"/>
+        </w:rPr>
+        <w:t>s://www.gov.uk/government/statistics/business-population-estimates-2025. – Дата доступа: 03.10.2026 (значения по сводке поисковой выдачи).</w:t>
       </w:r>
     </w:p>
     <w:p>
@@ -26931,13 +27045,7 @@
         <w:rPr>
           <w:sz w:val="28"/>
         </w:rPr>
-        <w:t xml:space="preserve"> 2025/2026 [Э</w:t>
-      </w:r>
-      <w:r>
-        <w:rPr>
-          <w:sz w:val="28"/>
-        </w:rPr>
-        <w:t>лектронный ресурс]. – Режим доступа: https://single-market-economy.ec.europa.eu/publications/annual-report-european-smes-20252026_en. – Дата доступа: 03.10.2026.</w:t>
+        <w:t xml:space="preserve"> 2025/2026 [Электронный ресурс]. – Режим доступа: https://single-market-economy.ec.europa.eu/publications/annual-report-european-smes-20252026_en. – Дата доступа: 03.10.2026.</w:t>
       </w:r>
     </w:p>
     <w:p>
@@ -27269,7 +27377,13 @@
         <w:rPr>
           <w:sz w:val="28"/>
         </w:rPr>
-        <w:t xml:space="preserve"> [Электронный ресурс]. – Режим доступа: https://learn.microsoft.com/en-us/partner-center/marketplace-offers/marketplace-commercial-transaction-capabilities-and-considerations. – Дата доступа: 03.10.2026.</w:t>
+        <w:t xml:space="preserve"> [Электронный ресурс]. – Режим доступа: https://learn.microsoft.com/en-us/partner-c</w:t>
+      </w:r>
+      <w:r>
+        <w:rPr>
+          <w:sz w:val="28"/>
+        </w:rPr>
+        <w:t>enter/marketplace-offers/marketplace-commercial-transaction-capabilities-and-considerations. – Дата доступа: 03.10.2026.</w:t>
       </w:r>
     </w:p>
     <w:p>
@@ -27366,14 +27480,7 @@
           <w:i/>
           <w:sz w:val="28"/>
         </w:rPr>
-        <w:t>I</w:t>
-      </w:r>
-      <w:r>
-        <w:rPr>
-          <w:i/>
-          <w:sz w:val="28"/>
-        </w:rPr>
-        <w:t>SCO-08</w:t>
+        <w:t>ISCO-08</w:t>
       </w:r>
       <w:r>
         <w:rPr>
@@ -27431,7 +27538,13 @@
         <w:rPr>
           <w:sz w:val="28"/>
         </w:rPr>
-        <w:t xml:space="preserve"> [Электронный ресурс]. – Режим доступа: https://ec.europa.eu/eurostat/api/dissemination/statistics/1.0/data/lfsa_egai2d. – Дата доступа: 03.10.2026.</w:t>
+        <w:t xml:space="preserve"> [Электронный ресурс]. – Режим доступа: https:/</w:t>
+      </w:r>
+      <w:r>
+        <w:rPr>
+          <w:sz w:val="28"/>
+        </w:rPr>
+        <w:t>/ec.europa.eu/eurostat/api/dissemination/statistics/1.0/data/lfsa_egai2d. – Дата доступа: 03.10.2026.</w:t>
       </w:r>
     </w:p>
     <w:p>
@@ -27521,13 +27634,13 @@
         <w:rPr>
           <w:sz w:val="28"/>
         </w:rPr>
-        <w:t xml:space="preserve"> [Электронный рес</w:t>
-      </w:r>
-      <w:r>
-        <w:rPr>
-          <w:sz w:val="28"/>
-        </w:rPr>
-        <w:t>урс]. – Режим доступа: https://www.arixcel.com/explorer/download. – Дата доступа: 03.10.2026.</w:t>
+        <w:t xml:space="preserve"> [Электронный ресурс]. – Режим доступа: https://www.arixcel.com/explorer/download. – Дата доступа: 0</w:t>
+      </w:r>
+      <w:r>
+        <w:rPr>
+          <w:sz w:val="28"/>
+        </w:rPr>
+        <w:t>3.10.2026.</w:t>
       </w:r>
     </w:p>
     <w:p>
@@ -27669,13 +27782,7 @@
         <w:rPr>
           <w:sz w:val="28"/>
         </w:rPr>
-        <w:t xml:space="preserve"> [Электронный ресурс]. – Режим доступа: https://www.operisanalysiskit.com/oak-price/. – </w:t>
-      </w:r>
-      <w:r>
-        <w:rPr>
-          <w:sz w:val="28"/>
-        </w:rPr>
-        <w:t>Дата доступа: 03.10.2026.</w:t>
+        <w:t xml:space="preserve"> [Электронный ресурс]. – Режим доступа: https://www.operisanalysiskit.com/oak-price/. – Дата доступа: 03.10.2026.</w:t>
       </w:r>
     </w:p>
     <w:p>
@@ -27804,7 +27911,13 @@
         <w:rPr>
           <w:sz w:val="28"/>
         </w:rPr>
-        <w:t>) [Электронный ресурс]. – Режим доступа: https://softwarefinder.com/resources/how-much-does-datasnipper-cost. – Дата доступа: 03.10.2026.</w:t>
+        <w:t>) [Электронный ресурс]. – Режим доступа: https://softwarefinder.com/resourc</w:t>
+      </w:r>
+      <w:r>
+        <w:rPr>
+          <w:sz w:val="28"/>
+        </w:rPr>
+        <w:t>es/how-much-does-datasnipper-cost. – Дата доступа: 03.10.2026.</w:t>
       </w:r>
     </w:p>
     <w:p>
@@ -27849,14 +27962,7 @@
           <w:i/>
           <w:sz w:val="28"/>
         </w:rPr>
-        <w:t>Pr</w:t>
-      </w:r>
-      <w:r>
-        <w:rPr>
-          <w:i/>
-          <w:sz w:val="28"/>
-        </w:rPr>
-        <w:t>icing</w:t>
+        <w:t>Pricing</w:t>
       </w:r>
       <w:r>
         <w:rPr>
@@ -27972,7 +28078,14 @@
           <w:i/>
           <w:sz w:val="28"/>
         </w:rPr>
-        <w:t>Office</w:t>
+        <w:t>O</w:t>
+      </w:r>
+      <w:r>
+        <w:rPr>
+          <w:i/>
+          <w:sz w:val="28"/>
+        </w:rPr>
+        <w:t>ffice</w:t>
       </w:r>
       <w:r>
         <w:rPr>
@@ -28121,13 +28234,7 @@
         <w:rPr>
           <w:sz w:val="28"/>
         </w:rPr>
-        <w:t xml:space="preserve"> [Электронный ресурс]. – Режим доступа: htt</w:t>
-      </w:r>
-      <w:r>
-        <w:rPr>
-          <w:sz w:val="28"/>
-        </w:rPr>
-        <w:t>ps://www.nomisweb.co.uk/datasets/aps218. – Дата доступа: 03.10.2026.</w:t>
+        <w:t xml:space="preserve"> [Электронный ресурс]. – Режим доступа: https://www.nomisweb.co.uk/datasets/aps218. – Дата доступа: 03.10.2026.</w:t>
       </w:r>
     </w:p>
     <w:p>
@@ -28185,7 +28292,14 @@
           <w:i/>
           <w:sz w:val="28"/>
         </w:rPr>
-        <w:t>Microsoft</w:t>
+        <w:t>Microsof</w:t>
+      </w:r>
+      <w:r>
+        <w:rPr>
+          <w:i/>
+          <w:sz w:val="28"/>
+        </w:rPr>
+        <w:t>t</w:t>
       </w:r>
       <w:r>
         <w:rPr>
@@ -28217,13 +28331,7 @@
         <w:rPr>
           <w:sz w:val="28"/>
         </w:rPr>
-        <w:t xml:space="preserve"> [Электронный ресурс]. – Режим доступа: https://marketplace.microsoft.com/en-us/marketplace/apps?product=office</w:t>
-      </w:r>
-      <w:r>
-        <w:rPr>
-          <w:sz w:val="28"/>
-        </w:rPr>
-        <w:t>. – Дата доступа: 03.10.2026.</w:t>
+        <w:t xml:space="preserve"> [Электронный ресурс]. – Режим доступа: https://marketplace.microsoft.com/en-us/marketplace/apps?product=office. – Дата доступа: 03.10.2026.</w:t>
       </w:r>
     </w:p>
     <w:p>
@@ -28235,7 +28343,7 @@
         <w:jc w:val="center"/>
       </w:pPr>
       <w:bookmarkStart w:id="37" w:name="_3d74faf1500c1b2a4a8bfa8e0e37c74206ce73d"/>
-      <w:bookmarkStart w:id="38" w:name="_Toc241957883"/>
+      <w:bookmarkStart w:id="38" w:name="_Toc241960726"/>
       <w:bookmarkEnd w:id="35"/>
       <w:r>
         <w:rPr>
@@ -28283,7 +28391,13 @@
         <w:rPr>
           <w:sz w:val="28"/>
         </w:rPr>
-        <w:t>В приложении собраны допущения, добавленные в ЛР2-3 к допущениям Д-01…Д-08 из ЛР1. Каждое допущение указывает значение, обоснование и влияние на результат.</w:t>
+        <w:t>В приложении собраны допущения, добавленные в ЛР2-3 к доп</w:t>
+      </w:r>
+      <w:r>
+        <w:rPr>
+          <w:sz w:val="28"/>
+        </w:rPr>
+        <w:t>ущениям Д-01…Д-08 из ЛР1. Каждое допущение указывает значение, обоснование и влияние на результат.</w:t>
       </w:r>
     </w:p>
     <w:p>
@@ -28297,13 +28411,7 @@
         <w:rPr>
           <w:sz w:val="28"/>
         </w:rPr>
-        <w:t>В таблице 23</w:t>
-      </w:r>
-      <w:r>
-        <w:rPr>
-          <w:sz w:val="28"/>
-        </w:rPr>
-        <w:t xml:space="preserve"> представлено: журнал допущений ЛР2-3.</w:t>
+        <w:t>В таблице 23 представлено: журнал допущений ЛР2-3.</w:t>
       </w:r>
     </w:p>
     <w:p>
@@ -28529,13 +28637,7 @@
               <w:rPr>
                 <w:sz w:val="24"/>
               </w:rPr>
-              <w:t xml:space="preserve">разовый/Pro/Team: 60/37/3, 45/45/10, 35/50/15 %; платежей 1,2/6/6; </w:t>
-            </w:r>
-            <w:r>
-              <w:rPr>
-                <w:sz w:val="24"/>
-              </w:rPr>
-              <w:t>1,5/8/9; 2/10/11</w:t>
+              <w:t>разовый/Pro/Team: 60/37/3, 45/45/10, 35/50/15 %; платежей 1,2/6/6; 1,5/8/9; 2/10/11</w:t>
             </w:r>
           </w:p>
         </w:tc>
@@ -28669,13 +28771,7 @@
               <w:rPr>
                 <w:sz w:val="24"/>
               </w:rPr>
-              <w:t xml:space="preserve">граница 3-70 %, потребность 20-30 %, онлайн 60-70 %, </w:t>
-            </w:r>
-            <w:r>
-              <w:rPr>
-                <w:sz w:val="24"/>
-              </w:rPr>
-              <w:t>платежеспособность 30-40 %; масштаб 0,45 и 1,30</w:t>
+              <w:t>граница 3-70 %, потребность 20-30 %, онлайн 60-70 %, платежеспособность 30-40 %; масштаб 0,45 и 1,30</w:t>
             </w:r>
           </w:p>
         </w:tc>
@@ -28694,7 +28790,7 @@
               <w:rPr>
                 <w:sz w:val="24"/>
               </w:rPr>
-              <w:t xml:space="preserve">ПЗ1 (ошибки в 86-94 % таблиц), ЛР1; </w:t>
+              <w:t xml:space="preserve">ПЗ1 (ошибки в 86-94 % таблиц), ЛР1; масштаб занятости сверен с </w:t>
             </w:r>
             <w:r>
               <w:rPr>
@@ -28707,7 +28803,20 @@
               <w:rPr>
                 <w:sz w:val="24"/>
               </w:rPr>
-              <w:t xml:space="preserve"> недоступен</w:t>
+              <w:t xml:space="preserve"> и </w:t>
+            </w:r>
+            <w:r>
+              <w:rPr>
+                <w:i/>
+                <w:sz w:val="24"/>
+              </w:rPr>
+              <w:t>ONS</w:t>
+            </w:r>
+            <w:r>
+              <w:rPr>
+                <w:sz w:val="24"/>
+              </w:rPr>
+              <w:t xml:space="preserve"> (приложение Д)</w:t>
             </w:r>
           </w:p>
         </w:tc>
@@ -28772,7 +28881,14 @@
               <w:rPr>
                 <w:sz w:val="24"/>
               </w:rPr>
-              <w:t xml:space="preserve"> 241; опрос</w:t>
+              <w:t xml:space="preserve"> 241; реальные продажи после </w:t>
+            </w:r>
+            <w:r>
+              <w:rPr>
+                <w:i/>
+                <w:sz w:val="24"/>
+              </w:rPr>
+              <w:t>MVP</w:t>
             </w:r>
           </w:p>
         </w:tc>
@@ -28848,7 +28964,13 @@
               <w:rPr>
                 <w:sz w:val="24"/>
               </w:rPr>
-              <w:t>, 20 % времени на проверку, экономия 45 %</w:t>
+              <w:t xml:space="preserve">, 20 % времени на проверку, </w:t>
+            </w:r>
+            <w:r>
+              <w:rPr>
+                <w:sz w:val="24"/>
+              </w:rPr>
+              <w:t>экономия 45 %</w:t>
             </w:r>
           </w:p>
         </w:tc>
@@ -28867,13 +28989,7 @@
               <w:rPr>
                 <w:sz w:val="24"/>
               </w:rPr>
-              <w:t>оценка вы</w:t>
-            </w:r>
-            <w:r>
-              <w:rPr>
-                <w:sz w:val="24"/>
-              </w:rPr>
-              <w:t xml:space="preserve">числений и </w:t>
+              <w:t xml:space="preserve">оценка вычислений и </w:t>
             </w:r>
             <w:r>
               <w:rPr>
@@ -29072,7 +29188,13 @@
               <w:rPr>
                 <w:sz w:val="24"/>
               </w:rPr>
-              <w:t>, допущение</w:t>
+              <w:t xml:space="preserve">, </w:t>
+            </w:r>
+            <w:r>
+              <w:rPr>
+                <w:sz w:val="24"/>
+              </w:rPr>
+              <w:t>допущение</w:t>
             </w:r>
           </w:p>
         </w:tc>
@@ -29321,7 +29443,13 @@
               <w:rPr>
                 <w:sz w:val="24"/>
               </w:rPr>
-              <w:t>2/8/20 оплат в месяц, комиссия 3 %</w:t>
+              <w:t xml:space="preserve">2/8/20 оплат в месяц, </w:t>
+            </w:r>
+            <w:r>
+              <w:rPr>
+                <w:sz w:val="24"/>
+              </w:rPr>
+              <w:t>комиссия 3 %</w:t>
             </w:r>
           </w:p>
         </w:tc>
@@ -29499,7 +29627,13 @@
               <w:rPr>
                 <w:sz w:val="24"/>
               </w:rPr>
-              <w:t>релевантный трафик 87 тыс. в месяц</w:t>
+              <w:t>релевантный тра</w:t>
+            </w:r>
+            <w:r>
+              <w:rPr>
+                <w:sz w:val="24"/>
+              </w:rPr>
+              <w:t>фик 87 тыс. в месяц</w:t>
             </w:r>
           </w:p>
         </w:tc>
@@ -29760,13 +29894,7 @@
               <w:rPr>
                 <w:sz w:val="24"/>
               </w:rPr>
-              <w:t>коэффициенты отзывов взяты из методики, остальное -</w:t>
-            </w:r>
-            <w:r>
-              <w:rPr>
-                <w:sz w:val="24"/>
-              </w:rPr>
-              <w:t xml:space="preserve"> практика </w:t>
+              <w:t xml:space="preserve">коэффициенты отзывов взяты из методики, остальное - практика </w:t>
             </w:r>
             <w:r>
               <w:rPr>
@@ -29818,7 +29946,13 @@
               <w:rPr>
                 <w:sz w:val="24"/>
               </w:rPr>
-              <w:t xml:space="preserve"> в год</w:t>
+              <w:t xml:space="preserve"> в го</w:t>
+            </w:r>
+            <w:r>
+              <w:rPr>
+                <w:sz w:val="24"/>
+              </w:rPr>
+              <w:t>д</w:t>
             </w:r>
           </w:p>
         </w:tc>
@@ -29854,13 +29988,7 @@
         <w:rPr>
           <w:sz w:val="28"/>
         </w:rPr>
-        <w:t>Допущения Д-09…Д-16 и Д-34 перенесены в общий журнал допущений проекта. Изменение значения и повторный запуск расчетных скри</w:t>
-      </w:r>
-      <w:r>
-        <w:rPr>
-          <w:sz w:val="28"/>
-        </w:rPr>
-        <w:t xml:space="preserve">птов пересчитывает книги </w:t>
+        <w:t xml:space="preserve">Допущения Д-09…Д-16 и Д-34 перенесены в общий журнал допущений проекта. Изменение значения и повторный запуск расчетных скриптов пересчитывает книги </w:t>
       </w:r>
       <w:r>
         <w:rPr>
@@ -29885,7 +30013,7 @@
         <w:jc w:val="center"/>
       </w:pPr>
       <w:bookmarkStart w:id="39" w:name="_25083b51e17d9d99817d1269b6af13d75b604a4"/>
-      <w:bookmarkStart w:id="40" w:name="_Toc241957884"/>
+      <w:bookmarkStart w:id="40" w:name="_Toc241960727"/>
       <w:bookmarkEnd w:id="37"/>
       <w:r>
         <w:rPr>
@@ -29947,13 +30075,13 @@
         <w:rPr>
           <w:sz w:val="28"/>
         </w:rPr>
-        <w:t xml:space="preserve">В таблице 24 представлено: принятые решения по данным, которых </w:t>
-      </w:r>
-      <w:r>
-        <w:rPr>
-          <w:sz w:val="28"/>
-        </w:rPr>
-        <w:t>нет в открытом доступе.</w:t>
+        <w:t>В таблице</w:t>
+      </w:r>
+      <w:r>
+        <w:rPr>
+          <w:sz w:val="28"/>
+        </w:rPr>
+        <w:t xml:space="preserve"> 24 представлено: принятые решения по данным, которых нет в открытом доступе.</w:t>
       </w:r>
     </w:p>
     <w:p>
@@ -30236,7 +30364,13 @@
               <w:rPr>
                 <w:sz w:val="24"/>
               </w:rPr>
-              <w:t>книги 5 и 6, приложение Д</w:t>
+              <w:t>книги 5 и 6, прило</w:t>
+            </w:r>
+            <w:r>
+              <w:rPr>
+                <w:sz w:val="24"/>
+              </w:rPr>
+              <w:t>жение Д</w:t>
             </w:r>
           </w:p>
         </w:tc>
@@ -30467,13 +30601,7 @@
               <w:rPr>
                 <w:sz w:val="24"/>
               </w:rPr>
-              <w:t>; число предложений и отзывы собраны 03.10.2026</w:t>
-            </w:r>
-            <w:r>
-              <w:rPr>
-                <w:sz w:val="24"/>
-              </w:rPr>
-              <w:t xml:space="preserve"> (раздел 2.7.1); по ПЗ1 оплата идет через </w:t>
+              <w:t xml:space="preserve">; число предложений и отзывы собраны 03.10.2026 (раздел 2.7.1); по ПЗ1 оплата идет через </w:t>
             </w:r>
             <w:r>
               <w:rPr>
@@ -30836,7 +30964,13 @@
               <w:rPr>
                 <w:sz w:val="24"/>
               </w:rPr>
-              <w:t xml:space="preserve">приняты параметры базового сценария и расчетная траектория </w:t>
+              <w:t>пр</w:t>
+            </w:r>
+            <w:r>
+              <w:rPr>
+                <w:sz w:val="24"/>
+              </w:rPr>
+              <w:t xml:space="preserve">иняты параметры базового сценария и расчетная траектория </w:t>
             </w:r>
             <w:r>
               <w:rPr>
@@ -31090,7 +31224,7 @@
         <w:jc w:val="center"/>
       </w:pPr>
       <w:bookmarkStart w:id="41" w:name="_cb59224a7032ef66ab429e7df9b4e4c597bc187"/>
-      <w:bookmarkStart w:id="42" w:name="_Toc241957885"/>
+      <w:bookmarkStart w:id="42" w:name="_Toc241960728"/>
       <w:bookmarkEnd w:id="39"/>
       <w:r>
         <w:rPr>
@@ -31124,14 +31258,14 @@
           <w:b/>
           <w:sz w:val="28"/>
         </w:rPr>
-        <w:t>Исправления и изменения шабло</w:t>
+        <w:t xml:space="preserve">Исправления и </w:t>
       </w:r>
       <w:r>
         <w:rPr>
           <w:b/>
           <w:sz w:val="28"/>
         </w:rPr>
-        <w:t>нов</w:t>
+        <w:t>изменения шаблонов</w:t>
       </w:r>
     </w:p>
     <w:p>
@@ -31719,13 +31853,7 @@
               <w:rPr>
                 <w:sz w:val="24"/>
               </w:rPr>
-              <w:t>минимум, среднее и макси</w:t>
-            </w:r>
-            <w:r>
-              <w:rPr>
-                <w:sz w:val="24"/>
-              </w:rPr>
-              <w:t>мум включали платформенную строку, которая не является выручкой нового бизнеса</w:t>
+              <w:t>минимум, среднее и максимум включали платформенную строку, которая не является выручкой нового бизнеса</w:t>
             </w:r>
           </w:p>
         </w:tc>
@@ -32090,7 +32218,7 @@
         <w:jc w:val="center"/>
       </w:pPr>
       <w:bookmarkStart w:id="43" w:name="_1725cce77eeead76f52606ad03c3c6c8aff7f31"/>
-      <w:bookmarkStart w:id="44" w:name="_Toc241957886"/>
+      <w:bookmarkStart w:id="44" w:name="_Toc241960729"/>
       <w:bookmarkEnd w:id="41"/>
       <w:r>
         <w:rPr>
@@ -32151,7 +32279,13 @@
         <w:rPr>
           <w:sz w:val="28"/>
         </w:rPr>
-        <w:t xml:space="preserve"> 20261003). Модель показывает порядок обработки анкеты по методике и проверяет согласованность принятого ценового коридора; спрос подтверждается данными </w:t>
+        <w:t xml:space="preserve"> 20261003). Модель показывает порядок обработки анкеты по методике и проверяет согласованнос</w:t>
+      </w:r>
+      <w:r>
+        <w:rPr>
+          <w:sz w:val="28"/>
+        </w:rPr>
+        <w:t xml:space="preserve">ть принятого ценового коридора; спрос подтверждается данными </w:t>
       </w:r>
       <w:r>
         <w:rPr>
@@ -32178,13 +32312,7 @@
         <w:rPr>
           <w:sz w:val="28"/>
         </w:rPr>
-        <w:t>В таблице 26 представлено: расчетные показатели цены и готовности платить (Ван Вестендорп, подписк</w:t>
-      </w:r>
-      <w:r>
-        <w:rPr>
-          <w:sz w:val="28"/>
-        </w:rPr>
-        <w:t xml:space="preserve">а </w:t>
+        <w:t xml:space="preserve">В таблице 26 представлено: расчетные показатели цены и готовности платить (Ван Вестендорп, подписка </w:t>
       </w:r>
       <w:r>
         <w:rPr>
@@ -32210,7 +32338,13 @@
         <w:rPr>
           <w:sz w:val="28"/>
         </w:rPr>
-        <w:t xml:space="preserve">Таблица 26 – Расчетные показатели цены и готовности платить (Ван Вестендорп, подписка </w:t>
+        <w:t>Таблица 26 – Расчетные показатели цены и готовности платить (Ван Вестендорп, подписк</w:t>
+      </w:r>
+      <w:r>
+        <w:rPr>
+          <w:sz w:val="28"/>
+        </w:rPr>
+        <w:t xml:space="preserve">а </w:t>
       </w:r>
       <w:r>
         <w:rPr>
@@ -32823,7 +32957,13 @@
               <w:rPr>
                 <w:sz w:val="24"/>
               </w:rPr>
-              <w:t>Средняя готовность попробовать (1-5)</w:t>
+              <w:t>Средняя готовность попробовать (</w:t>
+            </w:r>
+            <w:r>
+              <w:rPr>
+                <w:sz w:val="24"/>
+              </w:rPr>
+              <w:t>1-5)</w:t>
             </w:r>
           </w:p>
         </w:tc>
@@ -32970,13 +33110,7 @@
         <w:rPr>
           <w:sz w:val="28"/>
         </w:rPr>
-        <w:t>В таблице 27 представлено: расчетный выбор тарифа с</w:t>
-      </w:r>
-      <w:r>
-        <w:rPr>
-          <w:sz w:val="28"/>
-        </w:rPr>
-        <w:t>реди респондентов.</w:t>
+        <w:t>В таблице 27 представлено: расчетный выбор тарифа среди респондентов.</w:t>
       </w:r>
     </w:p>
     <w:p>
@@ -33420,7 +33554,7 @@
         <w:jc w:val="center"/>
       </w:pPr>
       <w:bookmarkStart w:id="45" w:name="_494653d134221fdc43c135127d450c9af0a7c7d"/>
-      <w:bookmarkStart w:id="46" w:name="_Toc241957887"/>
+      <w:bookmarkStart w:id="46" w:name="_Toc241960730"/>
       <w:bookmarkEnd w:id="43"/>
       <w:r>
         <w:rPr>
@@ -33441,7 +33575,13 @@
         <w:rPr>
           <w:sz w:val="28"/>
         </w:rPr>
-        <w:t>(справочное)</w:t>
+        <w:t>(спр</w:t>
+      </w:r>
+      <w:r>
+        <w:rPr>
+          <w:sz w:val="28"/>
+        </w:rPr>
+        <w:t>авочное)</w:t>
       </w:r>
     </w:p>
     <w:p>
@@ -33468,13 +33608,13 @@
         <w:rPr>
           <w:sz w:val="28"/>
         </w:rPr>
-        <w:t>Часть пунктов приложения Б удалось закрыть открытыми источниками 03.10.2026; ниже приведены найденные значения, их надежность и влияние на расчет. Основные расчеты книг не изменялись, потому что найде</w:t>
-      </w:r>
-      <w:r>
-        <w:rPr>
-          <w:sz w:val="28"/>
-        </w:rPr>
-        <w:t>нные значения подтверждают принятые допущения или остаются оценками третьих лиц.</w:t>
+        <w:t>Часть пунктов приложения Б удалось закрыть открытыми источниками 03.10.2026; ниже приведены найденные значения, их надежность и влияние на расчет. Основные расчеты книг не изменялись, потому что найденные</w:t>
+      </w:r>
+      <w:r>
+        <w:rPr>
+          <w:sz w:val="28"/>
+        </w:rPr>
+        <w:t xml:space="preserve"> значения подтверждают принятые допущения или остаются оценками третьих лиц.</w:t>
       </w:r>
     </w:p>
     <w:p>
@@ -33651,14 +33791,14 @@
                 <w:b/>
                 <w:sz w:val="24"/>
               </w:rPr>
-              <w:t>Влияние на р</w:t>
+              <w:t>Влияние на расче</w:t>
             </w:r>
             <w:r>
               <w:rPr>
                 <w:b/>
                 <w:sz w:val="24"/>
               </w:rPr>
-              <w:t>асчет</w:t>
+              <w:t>т</w:t>
             </w:r>
           </w:p>
         </w:tc>
@@ -34176,7 +34316,14 @@
                 <w:i/>
                 <w:sz w:val="24"/>
               </w:rPr>
-              <w:t>Windows</w:t>
+              <w:t>Wi</w:t>
+            </w:r>
+            <w:r>
+              <w:rPr>
+                <w:i/>
+                <w:sz w:val="24"/>
+              </w:rPr>
+              <w:t>ndows</w:t>
             </w:r>
             <w:r>
               <w:rPr>
@@ -34252,13 +34399,7 @@
               <w:rPr>
                 <w:sz w:val="24"/>
               </w:rPr>
-              <w:t>нижняя граница ценового корид</w:t>
-            </w:r>
-            <w:r>
-              <w:rPr>
-                <w:sz w:val="24"/>
-              </w:rPr>
-              <w:t>ора около 3 </w:t>
+              <w:t>нижняя граница ценового коридора около 3 </w:t>
             </w:r>
             <w:r>
               <w:rPr>
@@ -34944,7 +35085,13 @@
               <w:rPr>
                 <w:sz w:val="24"/>
               </w:rPr>
-              <w:t>, апрель 2025 - март 2026 (</w:t>
+              <w:t>,</w:t>
+            </w:r>
+            <w:r>
+              <w:rPr>
+                <w:sz w:val="24"/>
+              </w:rPr>
+              <w:t xml:space="preserve"> апрель 2025 - март 2026 (</w:t>
             </w:r>
             <w:r>
               <w:rPr>
@@ -35059,13 +35206,7 @@
               <w:rPr>
                 <w:sz w:val="24"/>
               </w:rPr>
-              <w:t>два профессиональных сегмент</w:t>
-            </w:r>
-            <w:r>
-              <w:rPr>
-                <w:sz w:val="24"/>
-              </w:rPr>
-              <w:t>а Великобритании дают около 480 тыс. человек, то есть около 15 % американских трех сегментов (3,1 млн) при доле населения около 20 %: масштаб занятости 0,45 для четырех англоязычных стран выглядит консервативным</w:t>
+              <w:t>два профессиональных сегмента Великобритании дают около 480 тыс. человек, то есть около 15 % американских трех сегментов (3,1 млн) при доле населения около 20 %: масштаб занятости 0,45 для четырех англоязычных стран выглядит консервативным</w:t>
             </w:r>
           </w:p>
         </w:tc>
@@ -35110,7 +35251,13 @@
               <w:rPr>
                 <w:sz w:val="24"/>
               </w:rPr>
-              <w:t xml:space="preserve">Дополнительный снимок </w:t>
+              <w:t>Допол</w:t>
+            </w:r>
+            <w:r>
+              <w:rPr>
+                <w:sz w:val="24"/>
+              </w:rPr>
+              <w:t xml:space="preserve">нительный снимок </w:t>
             </w:r>
             <w:r>
               <w:rPr>
@@ -35136,13 +35283,7 @@
               <w:rPr>
                 <w:sz w:val="24"/>
               </w:rPr>
-              <w:t>, июн</w:t>
-            </w:r>
-            <w:r>
-              <w:rPr>
-                <w:sz w:val="24"/>
-              </w:rPr>
-              <w:t>ь-август 2026</w:t>
+              <w:t>, июнь-август 2026</w:t>
             </w:r>
           </w:p>
         </w:tc>
@@ -35349,7 +35490,13 @@
               <w:rPr>
                 <w:sz w:val="24"/>
               </w:rPr>
-              <w:t xml:space="preserve"> добавляют около 8,9 % к трафику 12 доменов основного снимка (6,02 млн визитов) и на итоговый диапазон не влияют; </w:t>
+              <w:t xml:space="preserve"> добавляют около 8,9 % к трафику 12 доменов основного снимка (6,02 млн визитов) и на</w:t>
+            </w:r>
+            <w:r>
+              <w:rPr>
+                <w:sz w:val="24"/>
+              </w:rPr>
+              <w:t xml:space="preserve"> итоговый диапазон не влияют; </w:t>
             </w:r>
             <w:r>
               <w:rPr>
@@ -35362,13 +35509,7 @@
               <w:rPr>
                 <w:sz w:val="24"/>
               </w:rPr>
-              <w:t xml:space="preserve"> - кана</w:t>
-            </w:r>
-            <w:r>
-              <w:rPr>
-                <w:sz w:val="24"/>
-              </w:rPr>
-              <w:t>л, а не конкурент</w:t>
+              <w:t xml:space="preserve"> - канал, а не конкурент</w:t>
             </w:r>
           </w:p>
         </w:tc>
@@ -35450,13 +35591,13 @@
         <w:rPr>
           <w:sz w:val="28"/>
         </w:rPr>
-        <w:t xml:space="preserve"> остаются оценками третьих сторон. Для ценового коридора это означает, что опубликованные цены специали</w:t>
-      </w:r>
-      <w:r>
-        <w:rPr>
-          <w:sz w:val="28"/>
-        </w:rPr>
-        <w:t>зированных надстроек (</w:t>
+        <w:t xml:space="preserve"> остаются оценками третьих сторон. Для ценового коридора </w:t>
+      </w:r>
+      <w:r>
+        <w:rPr>
+          <w:sz w:val="28"/>
+        </w:rPr>
+        <w:t>это означает, что опубликованные цены специализированных надстроек (</w:t>
       </w:r>
       <w:r>
         <w:rPr>
@@ -35586,7 +35727,13 @@
         <w:rPr>
           <w:sz w:val="28"/>
         </w:rPr>
-        <w:t xml:space="preserve"> в месяц) заметно дороже; точные цены последних можно получить только запросом коммерческого предложения.</w:t>
+        <w:t xml:space="preserve"> в месяц) заме</w:t>
+      </w:r>
+      <w:r>
+        <w:rPr>
+          <w:sz w:val="28"/>
+        </w:rPr>
+        <w:t>тно дороже; точные цены последних можно получить только запросом коммерческого предложения.</w:t>
       </w:r>
     </w:p>
     <w:p>
@@ -35678,13 +35825,13 @@
         <w:rPr>
           <w:sz w:val="28"/>
         </w:rPr>
-        <w:t>, для которых нуж</w:t>
-      </w:r>
-      <w:r>
-        <w:rPr>
-          <w:sz w:val="28"/>
-        </w:rPr>
-        <w:t xml:space="preserve">ен рекламный кабинет или платный доступ; взамен для англоязычного поиска используются относительные индексы </w:t>
+        <w:t>, для которых нужен рекламный к</w:t>
+      </w:r>
+      <w:r>
+        <w:rPr>
+          <w:sz w:val="28"/>
+        </w:rPr>
+        <w:t xml:space="preserve">абинет или платный доступ; взамен для англоязычного поиска используются относительные индексы </w:t>
       </w:r>
       <w:r>
         <w:rPr>
@@ -35775,13 +35922,7 @@
         <w:rPr>
           <w:sz w:val="28"/>
         </w:rPr>
-        <w:t xml:space="preserve"> не использован </w:t>
-      </w:r>
-      <w:r>
-        <w:rPr>
-          <w:sz w:val="28"/>
-        </w:rPr>
-        <w:t>из-за нестабильной работы интерфейса при автоматизации.</w:t>
+        <w:t xml:space="preserve"> не использован из-за нестабильной работы интерфейса при автоматизации.</w:t>
       </w:r>
     </w:p>
     <w:bookmarkEnd w:id="45"/>
@@ -35889,7 +36030,7 @@
   <w:abstractNum w:abstractNumId="0" w15:restartNumberingAfterBreak="0">
     <w:nsid w:val="0000A990"/>
     <w:multiLevelType w:val="multilevel"/>
-    <w:tmpl w:val="F2429816"/>
+    <w:tmpl w:val="89006BEE"/>
     <w:lvl w:ilvl="0">
       <w:numFmt w:val="bullet"/>
       <w:lvlText w:val=" "/>
@@ -35966,7 +36107,7 @@
   <w:abstractNum w:abstractNumId="1" w15:restartNumberingAfterBreak="0">
     <w:nsid w:val="00A99411"/>
     <w:multiLevelType w:val="multilevel"/>
-    <w:tmpl w:val="F126E966"/>
+    <w:tmpl w:val="E2B4D92C"/>
     <w:lvl w:ilvl="0">
       <w:start w:val="1"/>
       <w:numFmt w:val="decimal"/>
@@ -37444,7 +37585,7 @@
     <w:autoRedefine/>
     <w:uiPriority w:val="39"/>
     <w:unhideWhenUsed/>
-    <w:rsid w:val="008B3779"/>
+    <w:rsid w:val="00441C91"/>
     <w:pPr>
       <w:spacing w:after="100"/>
     </w:pPr>
@@ -37456,7 +37597,7 @@
     <w:autoRedefine/>
     <w:uiPriority w:val="39"/>
     <w:unhideWhenUsed/>
-    <w:rsid w:val="008B3779"/>
+    <w:rsid w:val="00441C91"/>
     <w:pPr>
       <w:spacing w:after="100"/>
       <w:ind w:left="240"/>

</xml_diff>

<commit_message>
audit pass 4: typography, grammar, decimal separators, empty cells, truncated cells, internal logs; rebuild
</commit_message>
<xml_diff>
--- a/ЛР2-3_Объем_рынка/ОТЧЕТ_ЛР2-3_TableMind.docx
+++ b/ЛР2-3_Объем_рынка/ОТЧЕТ_ЛР2-3_TableMind.docx
@@ -264,7 +264,7 @@
       <w:r>
         <w:fldChar w:fldCharType="separate"/>
       </w:r>
-      <w:hyperlink w:anchor="_Toc241960708" w:history="1">
+      <w:hyperlink w:anchor="_Toc241962714" w:history="1">
         <w:r>
           <w:rPr>
             <w:rStyle w:val="af"/>
@@ -292,7 +292,7 @@
             <w:noProof/>
             <w:webHidden/>
           </w:rPr>
-          <w:instrText xml:space="preserve"> PAGEREF _Toc241960708 \h </w:instrText>
+          <w:instrText xml:space="preserve"> PAGEREF _Toc241962714 \h </w:instrText>
         </w:r>
         <w:r>
           <w:rPr>
@@ -333,7 +333,7 @@
           <w:noProof/>
         </w:rPr>
       </w:pPr>
-      <w:hyperlink w:anchor="_Toc241960709" w:history="1">
+      <w:hyperlink w:anchor="_Toc241962715" w:history="1">
         <w:r>
           <w:rPr>
             <w:rStyle w:val="af"/>
@@ -361,7 +361,7 @@
             <w:noProof/>
             <w:webHidden/>
           </w:rPr>
-          <w:instrText xml:space="preserve"> PAGEREF _Toc241960709 \h </w:instrText>
+          <w:instrText xml:space="preserve"> PAGEREF _Toc241962715 \h </w:instrText>
         </w:r>
         <w:r>
           <w:rPr>
@@ -402,7 +402,7 @@
           <w:noProof/>
         </w:rPr>
       </w:pPr>
-      <w:hyperlink w:anchor="_Toc241960710" w:history="1">
+      <w:hyperlink w:anchor="_Toc241962716" w:history="1">
         <w:r>
           <w:rPr>
             <w:rStyle w:val="af"/>
@@ -430,7 +430,7 @@
             <w:noProof/>
             <w:webHidden/>
           </w:rPr>
-          <w:instrText xml:space="preserve"> PAGEREF _Toc241960710 \h </w:instrText>
+          <w:instrText xml:space="preserve"> PAGEREF _Toc241962716 \h </w:instrText>
         </w:r>
         <w:r>
           <w:rPr>
@@ -471,7 +471,7 @@
           <w:noProof/>
         </w:rPr>
       </w:pPr>
-      <w:hyperlink w:anchor="_Toc241960711" w:history="1">
+      <w:hyperlink w:anchor="_Toc241962717" w:history="1">
         <w:r>
           <w:rPr>
             <w:rStyle w:val="af"/>
@@ -508,7 +508,7 @@
             <w:noProof/>
             <w:webHidden/>
           </w:rPr>
-          <w:instrText xml:space="preserve"> PAGEREF _Toc241960711 \h </w:instrText>
+          <w:instrText xml:space="preserve"> PAGEREF _Toc241962717 \h </w:instrText>
         </w:r>
         <w:r>
           <w:rPr>
@@ -549,7 +549,7 @@
           <w:noProof/>
         </w:rPr>
       </w:pPr>
-      <w:hyperlink w:anchor="_Toc241960712" w:history="1">
+      <w:hyperlink w:anchor="_Toc241962718" w:history="1">
         <w:r>
           <w:rPr>
             <w:rStyle w:val="af"/>
@@ -586,7 +586,7 @@
             <w:noProof/>
             <w:webHidden/>
           </w:rPr>
-          <w:instrText xml:space="preserve"> PAGEREF _Toc241960712 \h </w:instrText>
+          <w:instrText xml:space="preserve"> PAGEREF _Toc241962718 \h </w:instrText>
         </w:r>
         <w:r>
           <w:rPr>
@@ -627,7 +627,7 @@
           <w:noProof/>
         </w:rPr>
       </w:pPr>
-      <w:hyperlink w:anchor="_Toc241960713" w:history="1">
+      <w:hyperlink w:anchor="_Toc241962719" w:history="1">
         <w:r>
           <w:rPr>
             <w:rStyle w:val="af"/>
@@ -664,7 +664,7 @@
             <w:noProof/>
             <w:webHidden/>
           </w:rPr>
-          <w:instrText xml:space="preserve"> PAGEREF _Toc241960713 \h </w:instrText>
+          <w:instrText xml:space="preserve"> PAGEREF _Toc241962719 \h </w:instrText>
         </w:r>
         <w:r>
           <w:rPr>
@@ -705,7 +705,7 @@
           <w:noProof/>
         </w:rPr>
       </w:pPr>
-      <w:hyperlink w:anchor="_Toc241960714" w:history="1">
+      <w:hyperlink w:anchor="_Toc241962720" w:history="1">
         <w:r>
           <w:rPr>
             <w:rStyle w:val="af"/>
@@ -733,7 +733,7 @@
             <w:noProof/>
             <w:webHidden/>
           </w:rPr>
-          <w:instrText xml:space="preserve"> PAGEREF _Toc241960714 \h </w:instrText>
+          <w:instrText xml:space="preserve"> PAGEREF _Toc241962720 \h </w:instrText>
         </w:r>
         <w:r>
           <w:rPr>
@@ -774,7 +774,7 @@
           <w:noProof/>
         </w:rPr>
       </w:pPr>
-      <w:hyperlink w:anchor="_Toc241960715" w:history="1">
+      <w:hyperlink w:anchor="_Toc241962721" w:history="1">
         <w:r>
           <w:rPr>
             <w:rStyle w:val="af"/>
@@ -802,7 +802,7 @@
             <w:noProof/>
             <w:webHidden/>
           </w:rPr>
-          <w:instrText xml:space="preserve"> PAGEREF _Toc241960715 \h </w:instrText>
+          <w:instrText xml:space="preserve"> PAGEREF _Toc241962721 \h </w:instrText>
         </w:r>
         <w:r>
           <w:rPr>
@@ -843,7 +843,7 @@
           <w:noProof/>
         </w:rPr>
       </w:pPr>
-      <w:hyperlink w:anchor="_Toc241960716" w:history="1">
+      <w:hyperlink w:anchor="_Toc241962722" w:history="1">
         <w:r>
           <w:rPr>
             <w:rStyle w:val="af"/>
@@ -880,7 +880,7 @@
             <w:noProof/>
             <w:webHidden/>
           </w:rPr>
-          <w:instrText xml:space="preserve"> PAGEREF _Toc241960716 \h </w:instrText>
+          <w:instrText xml:space="preserve"> PAGEREF _Toc241962722 \h </w:instrText>
         </w:r>
         <w:r>
           <w:rPr>
@@ -921,7 +921,7 @@
           <w:noProof/>
         </w:rPr>
       </w:pPr>
-      <w:hyperlink w:anchor="_Toc241960717" w:history="1">
+      <w:hyperlink w:anchor="_Toc241962723" w:history="1">
         <w:r>
           <w:rPr>
             <w:rStyle w:val="af"/>
@@ -949,7 +949,7 @@
             <w:noProof/>
             <w:webHidden/>
           </w:rPr>
-          <w:instrText xml:space="preserve"> PAGEREF _Toc241960717 \h </w:instrText>
+          <w:instrText xml:space="preserve"> PAGEREF _Toc241962723 \h </w:instrText>
         </w:r>
         <w:r>
           <w:rPr>
@@ -990,7 +990,7 @@
           <w:noProof/>
         </w:rPr>
       </w:pPr>
-      <w:hyperlink w:anchor="_Toc241960718" w:history="1">
+      <w:hyperlink w:anchor="_Toc241962724" w:history="1">
         <w:r>
           <w:rPr>
             <w:rStyle w:val="af"/>
@@ -1018,7 +1018,7 @@
             <w:noProof/>
             <w:webHidden/>
           </w:rPr>
-          <w:instrText xml:space="preserve"> PAGEREF _Toc241960718 \h </w:instrText>
+          <w:instrText xml:space="preserve"> PAGEREF _Toc241962724 \h </w:instrText>
         </w:r>
         <w:r>
           <w:rPr>
@@ -1059,7 +1059,7 @@
           <w:noProof/>
         </w:rPr>
       </w:pPr>
-      <w:hyperlink w:anchor="_Toc241960719" w:history="1">
+      <w:hyperlink w:anchor="_Toc241962725" w:history="1">
         <w:r>
           <w:rPr>
             <w:rStyle w:val="af"/>
@@ -1087,7 +1087,7 @@
             <w:noProof/>
             <w:webHidden/>
           </w:rPr>
-          <w:instrText xml:space="preserve"> PAGEREF _Toc241960719 \h </w:instrText>
+          <w:instrText xml:space="preserve"> PAGEREF _Toc241962725 \h </w:instrText>
         </w:r>
         <w:r>
           <w:rPr>
@@ -1128,7 +1128,7 @@
           <w:noProof/>
         </w:rPr>
       </w:pPr>
-      <w:hyperlink w:anchor="_Toc241960720" w:history="1">
+      <w:hyperlink w:anchor="_Toc241962726" w:history="1">
         <w:r>
           <w:rPr>
             <w:rStyle w:val="af"/>
@@ -1156,7 +1156,7 @@
             <w:noProof/>
             <w:webHidden/>
           </w:rPr>
-          <w:instrText xml:space="preserve"> PAGEREF _Toc241960720 \h </w:instrText>
+          <w:instrText xml:space="preserve"> PAGEREF _Toc241962726 \h </w:instrText>
         </w:r>
         <w:r>
           <w:rPr>
@@ -1197,7 +1197,7 @@
           <w:noProof/>
         </w:rPr>
       </w:pPr>
-      <w:hyperlink w:anchor="_Toc241960721" w:history="1">
+      <w:hyperlink w:anchor="_Toc241962727" w:history="1">
         <w:r>
           <w:rPr>
             <w:rStyle w:val="af"/>
@@ -1225,7 +1225,7 @@
             <w:noProof/>
             <w:webHidden/>
           </w:rPr>
-          <w:instrText xml:space="preserve"> PAGEREF _Toc241960721 \h </w:instrText>
+          <w:instrText xml:space="preserve"> PAGEREF _Toc241962727 \h </w:instrText>
         </w:r>
         <w:r>
           <w:rPr>
@@ -1266,7 +1266,7 @@
           <w:noProof/>
         </w:rPr>
       </w:pPr>
-      <w:hyperlink w:anchor="_Toc241960722" w:history="1">
+      <w:hyperlink w:anchor="_Toc241962728" w:history="1">
         <w:r>
           <w:rPr>
             <w:rStyle w:val="af"/>
@@ -1294,7 +1294,7 @@
             <w:noProof/>
             <w:webHidden/>
           </w:rPr>
-          <w:instrText xml:space="preserve"> PAGEREF _Toc241960722 \h </w:instrText>
+          <w:instrText xml:space="preserve"> PAGEREF _Toc241962728 \h </w:instrText>
         </w:r>
         <w:r>
           <w:rPr>
@@ -1335,7 +1335,7 @@
           <w:noProof/>
         </w:rPr>
       </w:pPr>
-      <w:hyperlink w:anchor="_Toc241960723" w:history="1">
+      <w:hyperlink w:anchor="_Toc241962729" w:history="1">
         <w:r>
           <w:rPr>
             <w:rStyle w:val="af"/>
@@ -1363,7 +1363,7 @@
             <w:noProof/>
             <w:webHidden/>
           </w:rPr>
-          <w:instrText xml:space="preserve"> PAGEREF _Toc241960723 \h </w:instrText>
+          <w:instrText xml:space="preserve"> PAGEREF _Toc241962729 \h </w:instrText>
         </w:r>
         <w:r>
           <w:rPr>
@@ -1404,7 +1404,7 @@
           <w:noProof/>
         </w:rPr>
       </w:pPr>
-      <w:hyperlink w:anchor="_Toc241960724" w:history="1">
+      <w:hyperlink w:anchor="_Toc241962730" w:history="1">
         <w:r>
           <w:rPr>
             <w:rStyle w:val="af"/>
@@ -1432,7 +1432,7 @@
             <w:noProof/>
             <w:webHidden/>
           </w:rPr>
-          <w:instrText xml:space="preserve"> PAGEREF _Toc241960724 \h </w:instrText>
+          <w:instrText xml:space="preserve"> PAGEREF _Toc241962730 \h </w:instrText>
         </w:r>
         <w:r>
           <w:rPr>
@@ -1473,7 +1473,7 @@
           <w:noProof/>
         </w:rPr>
       </w:pPr>
-      <w:hyperlink w:anchor="_Toc241960725" w:history="1">
+      <w:hyperlink w:anchor="_Toc241962731" w:history="1">
         <w:r>
           <w:rPr>
             <w:rStyle w:val="af"/>
@@ -1501,7 +1501,7 @@
             <w:noProof/>
             <w:webHidden/>
           </w:rPr>
-          <w:instrText xml:space="preserve"> PAGEREF _Toc241960725 \h </w:instrText>
+          <w:instrText xml:space="preserve"> PAGEREF _Toc241962731 \h </w:instrText>
         </w:r>
         <w:r>
           <w:rPr>
@@ -1542,7 +1542,7 @@
           <w:noProof/>
         </w:rPr>
       </w:pPr>
-      <w:hyperlink w:anchor="_Toc241960726" w:history="1">
+      <w:hyperlink w:anchor="_Toc241962732" w:history="1">
         <w:r>
           <w:rPr>
             <w:rStyle w:val="af"/>
@@ -1570,7 +1570,7 @@
             <w:noProof/>
             <w:webHidden/>
           </w:rPr>
-          <w:instrText xml:space="preserve"> PAGEREF _Toc241960726 \h </w:instrText>
+          <w:instrText xml:space="preserve"> PAGEREF _Toc241962732 \h </w:instrText>
         </w:r>
         <w:r>
           <w:rPr>
@@ -1611,7 +1611,7 @@
           <w:noProof/>
         </w:rPr>
       </w:pPr>
-      <w:hyperlink w:anchor="_Toc241960727" w:history="1">
+      <w:hyperlink w:anchor="_Toc241962733" w:history="1">
         <w:r>
           <w:rPr>
             <w:rStyle w:val="af"/>
@@ -1639,7 +1639,7 @@
             <w:noProof/>
             <w:webHidden/>
           </w:rPr>
-          <w:instrText xml:space="preserve"> PAGEREF _Toc241960727 \h </w:instrText>
+          <w:instrText xml:space="preserve"> PAGEREF _Toc241962733 \h </w:instrText>
         </w:r>
         <w:r>
           <w:rPr>
@@ -1680,7 +1680,7 @@
           <w:noProof/>
         </w:rPr>
       </w:pPr>
-      <w:hyperlink w:anchor="_Toc241960728" w:history="1">
+      <w:hyperlink w:anchor="_Toc241962734" w:history="1">
         <w:r>
           <w:rPr>
             <w:rStyle w:val="af"/>
@@ -1708,7 +1708,7 @@
             <w:noProof/>
             <w:webHidden/>
           </w:rPr>
-          <w:instrText xml:space="preserve"> PAGEREF _Toc241960728 \h </w:instrText>
+          <w:instrText xml:space="preserve"> PAGEREF _Toc241962734 \h </w:instrText>
         </w:r>
         <w:r>
           <w:rPr>
@@ -1749,7 +1749,7 @@
           <w:noProof/>
         </w:rPr>
       </w:pPr>
-      <w:hyperlink w:anchor="_Toc241960729" w:history="1">
+      <w:hyperlink w:anchor="_Toc241962735" w:history="1">
         <w:r>
           <w:rPr>
             <w:rStyle w:val="af"/>
@@ -1777,7 +1777,7 @@
             <w:noProof/>
             <w:webHidden/>
           </w:rPr>
-          <w:instrText xml:space="preserve"> PAGEREF _Toc241960729 \h </w:instrText>
+          <w:instrText xml:space="preserve"> PAGEREF _Toc241962735 \h </w:instrText>
         </w:r>
         <w:r>
           <w:rPr>
@@ -1818,7 +1818,7 @@
           <w:noProof/>
         </w:rPr>
       </w:pPr>
-      <w:hyperlink w:anchor="_Toc241960730" w:history="1">
+      <w:hyperlink w:anchor="_Toc241962736" w:history="1">
         <w:r>
           <w:rPr>
             <w:rStyle w:val="af"/>
@@ -1846,7 +1846,7 @@
             <w:noProof/>
             <w:webHidden/>
           </w:rPr>
-          <w:instrText xml:space="preserve"> PAGEREF _Toc241960730 \h </w:instrText>
+          <w:instrText xml:space="preserve"> PAGEREF _Toc241962736 \h </w:instrText>
         </w:r>
         <w:r>
           <w:rPr>
@@ -1892,7 +1892,7 @@
         <w:spacing w:before="0" w:after="360" w:line="360" w:lineRule="exact"/>
         <w:ind w:firstLine="709"/>
       </w:pPr>
-      <w:bookmarkStart w:id="1" w:name="_Toc241960708"/>
+      <w:bookmarkStart w:id="1" w:name="_Toc241962714"/>
       <w:r>
         <w:rPr>
           <w:b/>
@@ -2198,7 +2198,7 @@
         <w:ind w:firstLine="709"/>
       </w:pPr>
       <w:bookmarkStart w:id="2" w:name="_b608aa976fc82a0faaf3b83f58c735968afd03b"/>
-      <w:bookmarkStart w:id="3" w:name="_Toc241960709"/>
+      <w:bookmarkStart w:id="3" w:name="_Toc241962715"/>
       <w:bookmarkEnd w:id="0"/>
       <w:r>
         <w:rPr>
@@ -2276,7 +2276,7 @@
         <w:ind w:firstLine="709"/>
       </w:pPr>
       <w:bookmarkStart w:id="4" w:name="_6ea6bf0a5ec92c733c53e44899cf0806bdc5e39"/>
-      <w:bookmarkStart w:id="5" w:name="_Toc241960710"/>
+      <w:bookmarkStart w:id="5" w:name="_Toc241962716"/>
       <w:r>
         <w:rPr>
           <w:b/>
@@ -3232,7 +3232,7 @@
         <w:ind w:firstLine="709"/>
       </w:pPr>
       <w:bookmarkStart w:id="6" w:name="_7a0c967539b5ef143597c37b0951dae8b296890"/>
-      <w:bookmarkStart w:id="7" w:name="_Toc241960711"/>
+      <w:bookmarkStart w:id="7" w:name="_Toc241962717"/>
       <w:bookmarkEnd w:id="4"/>
       <w:r>
         <w:rPr>
@@ -5665,7 +5665,7 @@
           <w:sz w:val="28"/>
         </w:rPr>
         <w:drawing>
-          <wp:inline distT="0" distB="0" distL="0" distR="0" wp14:anchorId="0F82D39E" wp14:editId="28FD0C4C">
+          <wp:inline distT="0" distB="0" distL="0" distR="0" wp14:anchorId="114C61C5" wp14:editId="3A4F8674">
             <wp:extent cx="5334000" cy="3122341"/>
             <wp:effectExtent l="0" t="0" r="0" b="0"/>
             <wp:docPr id="12" name="Picture"/>
@@ -6476,7 +6476,7 @@
           <w:sz w:val="28"/>
         </w:rPr>
         <w:drawing>
-          <wp:inline distT="0" distB="0" distL="0" distR="0" wp14:anchorId="0ECD866C" wp14:editId="7DAA834B">
+          <wp:inline distT="0" distB="0" distL="0" distR="0" wp14:anchorId="17E5D959" wp14:editId="67CFF090">
             <wp:extent cx="5334000" cy="3252439"/>
             <wp:effectExtent l="0" t="0" r="0" b="0"/>
             <wp:docPr id="15" name="Picture"/>
@@ -6637,7 +6637,7 @@
         <w:ind w:firstLine="709"/>
       </w:pPr>
       <w:bookmarkStart w:id="8" w:name="_da959056159f19dff160d665d57702b18af1ddd"/>
-      <w:bookmarkStart w:id="9" w:name="_Toc241960712"/>
+      <w:bookmarkStart w:id="9" w:name="_Toc241962718"/>
       <w:bookmarkEnd w:id="6"/>
       <w:r>
         <w:rPr>
@@ -9765,7 +9765,7 @@
         <w:ind w:firstLine="709"/>
       </w:pPr>
       <w:bookmarkStart w:id="10" w:name="_06e2001e7574ebc77f8406bc11ca3db76d00c2a"/>
-      <w:bookmarkStart w:id="11" w:name="_Toc241960713"/>
+      <w:bookmarkStart w:id="11" w:name="_Toc241962719"/>
       <w:bookmarkEnd w:id="8"/>
       <w:r>
         <w:rPr>
@@ -10575,7 +10575,7 @@
         <w:ind w:firstLine="709"/>
       </w:pPr>
       <w:bookmarkStart w:id="12" w:name="_606fa79e4d4f49d8da929021c2a978685b741ea"/>
-      <w:bookmarkStart w:id="13" w:name="_Toc241960714"/>
+      <w:bookmarkStart w:id="13" w:name="_Toc241962720"/>
       <w:bookmarkEnd w:id="10"/>
       <w:r>
         <w:rPr>
@@ -13061,7 +13061,7 @@
         <w:ind w:firstLine="709"/>
       </w:pPr>
       <w:bookmarkStart w:id="14" w:name="_2314d5998da626860a70184e0b470b0b8504694"/>
-      <w:bookmarkStart w:id="15" w:name="_Toc241960715"/>
+      <w:bookmarkStart w:id="15" w:name="_Toc241962721"/>
       <w:bookmarkEnd w:id="12"/>
       <w:r>
         <w:rPr>
@@ -13684,7 +13684,7 @@
         <w:ind w:firstLine="709"/>
       </w:pPr>
       <w:bookmarkStart w:id="16" w:name="_42bac9f10c820a94a4112d44417ea6b5d14bf7d"/>
-      <w:bookmarkStart w:id="17" w:name="_Toc241960716"/>
+      <w:bookmarkStart w:id="17" w:name="_Toc241962722"/>
       <w:bookmarkEnd w:id="14"/>
       <w:r>
         <w:rPr>
@@ -13811,7 +13811,13 @@
         <w:rPr>
           <w:sz w:val="28"/>
         </w:rPr>
-        <w:t>ента из раздела 2.3; достижимая доля трафика для нового сайта принята 0,5 %, 1,5 % и 4 % (допущение Д-12) с учетом того, что канал строится с нуля.</w:t>
+        <w:t>ента из раздела 2.3 (в книге воронки 158 521 визит в месяц, в книге объема 158 601: различие 0,05 % вызвано разным округлением долей при вводе); достижимая доля трафика для нового сайта принята 0,5 %, 1,5 % и 4 % (допущение Д-12) с учетом того, что канал с</w:t>
+      </w:r>
+      <w:r>
+        <w:rPr>
+          <w:sz w:val="28"/>
+        </w:rPr>
+        <w:t>троится с нуля.</w:t>
       </w:r>
     </w:p>
     <w:p>
@@ -13825,6 +13831,7 @@
         <w:rPr>
           <w:sz w:val="28"/>
         </w:rPr>
+        <w:lastRenderedPageBreak/>
         <w:t>В таблице 12 представлено: платящие и выручка по тарифам, базовый сценарий, в месяц.</w:t>
       </w:r>
     </w:p>
@@ -13838,14 +13845,7 @@
         <w:rPr>
           <w:sz w:val="28"/>
         </w:rPr>
-        <w:lastRenderedPageBreak/>
-        <w:t>Таблица 12 – Платящие и</w:t>
-      </w:r>
-      <w:r>
-        <w:rPr>
-          <w:sz w:val="28"/>
-        </w:rPr>
-        <w:t xml:space="preserve"> выручка по тарифам, базовый сценарий, в месяц</w:t>
+        <w:t>Таблица 12 – Платящие и выручка по тарифам, базовый сценарий, в месяц</w:t>
       </w:r>
     </w:p>
     <w:tbl>
@@ -15581,7 +15581,14 @@
         <w:rPr>
           <w:sz w:val="28"/>
         </w:rPr>
-        <w:t xml:space="preserve"> в базовом сценарии. Канал дешевый по комиссии, но не заменяет основной трафик: его вклад зависит от видимости надстройки в магазине, которой пока нет.</w:t>
+        <w:t xml:space="preserve"> в базовом сценарии. Канал дешевый по </w:t>
+      </w:r>
+      <w:r>
+        <w:rPr>
+          <w:sz w:val="28"/>
+        </w:rPr>
+        <w:lastRenderedPageBreak/>
+        <w:t>комиссии, но не заменяет основной трафик: его вклад зависит от видимости надстройки в магазине, которой пока нет.</w:t>
       </w:r>
     </w:p>
     <w:p>
@@ -15595,7 +15602,6 @@
         <w:rPr>
           <w:b/>
         </w:rPr>
-        <w:lastRenderedPageBreak/>
         <w:t xml:space="preserve">2.7.1 Оценка сегмента через маркетплейс </w:t>
       </w:r>
       <w:r>
@@ -16695,6 +16701,7 @@
         <w:rPr>
           <w:sz w:val="28"/>
         </w:rPr>
+        <w:lastRenderedPageBreak/>
         <w:t xml:space="preserve">Таблица 15 – Оценка сегмента проверки таблиц в </w:t>
       </w:r>
       <w:r>
@@ -16923,7 +16930,6 @@
               <w:rPr>
                 <w:sz w:val="24"/>
               </w:rPr>
-              <w:lastRenderedPageBreak/>
               <w:t>Установок в год</w:t>
             </w:r>
           </w:p>
@@ -17531,7 +17537,7 @@
         <w:ind w:firstLine="709"/>
       </w:pPr>
       <w:bookmarkStart w:id="19" w:name="_62882a27ae1c57302eff280b02701a311900947"/>
-      <w:bookmarkStart w:id="20" w:name="_Toc241960717"/>
+      <w:bookmarkStart w:id="20" w:name="_Toc241962723"/>
       <w:bookmarkEnd w:id="18"/>
       <w:bookmarkEnd w:id="16"/>
       <w:r>
@@ -18095,6 +18101,7 @@
               <w:rPr>
                 <w:sz w:val="24"/>
               </w:rPr>
+              <w:lastRenderedPageBreak/>
               <w:t>проверка финансовой модели</w:t>
             </w:r>
           </w:p>
@@ -18177,7 +18184,6 @@
               <w:rPr>
                 <w:sz w:val="24"/>
               </w:rPr>
-              <w:lastRenderedPageBreak/>
               <w:t>аудит финансовой модели</w:t>
             </w:r>
           </w:p>
@@ -18903,7 +18909,7 @@
         <w:ind w:firstLine="709"/>
       </w:pPr>
       <w:bookmarkStart w:id="21" w:name="_2c7ec3ecf17663584d0d27e07e31cbd2a0948cf"/>
-      <w:bookmarkStart w:id="22" w:name="_Toc241960718"/>
+      <w:bookmarkStart w:id="22" w:name="_Toc241962724"/>
       <w:bookmarkEnd w:id="19"/>
       <w:r>
         <w:rPr>
@@ -19693,6 +19699,7 @@
           <w:i/>
           <w:sz w:val="28"/>
         </w:rPr>
+        <w:lastRenderedPageBreak/>
         <w:t>Pro</w:t>
       </w:r>
       <w:r>
@@ -19764,14 +19771,7 @@
         <w:rPr>
           <w:sz w:val="28"/>
         </w:rPr>
-        <w:t xml:space="preserve"> </w:t>
-      </w:r>
-      <w:r>
-        <w:rPr>
-          <w:sz w:val="28"/>
-        </w:rPr>
-        <w:lastRenderedPageBreak/>
-        <w:t>(от 69 </w:t>
+        <w:t xml:space="preserve"> (от 69 </w:t>
       </w:r>
       <w:r>
         <w:rPr>
@@ -21226,7 +21226,14 @@
         <w:rPr>
           <w:sz w:val="28"/>
         </w:rPr>
-        <w:t>, 45 504 </w:t>
+        <w:t xml:space="preserve">, 45 </w:t>
+      </w:r>
+      <w:r>
+        <w:rPr>
+          <w:sz w:val="28"/>
+        </w:rPr>
+        <w:lastRenderedPageBreak/>
+        <w:t>504 </w:t>
       </w:r>
       <w:r>
         <w:rPr>
@@ -21281,14 +21288,13 @@
         <w:ind w:firstLine="709"/>
       </w:pPr>
       <w:bookmarkStart w:id="23" w:name="_8d34778965163a5752bc27698d1f7e786ff5c87"/>
-      <w:bookmarkStart w:id="24" w:name="_Toc241960719"/>
+      <w:bookmarkStart w:id="24" w:name="_Toc241962725"/>
       <w:bookmarkEnd w:id="21"/>
       <w:r>
         <w:rPr>
           <w:b/>
           <w:sz w:val="28"/>
         </w:rPr>
-        <w:lastRenderedPageBreak/>
         <w:t>2.10 Сведение методов и итоговый диапазон</w:t>
       </w:r>
       <w:bookmarkEnd w:id="24"/>
@@ -22425,7 +22431,7 @@
         </w:rPr>
         <w:lastRenderedPageBreak/>
         <w:drawing>
-          <wp:inline distT="0" distB="0" distL="0" distR="0" wp14:anchorId="117BDEF1" wp14:editId="58247F6B">
+          <wp:inline distT="0" distB="0" distL="0" distR="0" wp14:anchorId="2F4CBE39" wp14:editId="2E2A587D">
             <wp:extent cx="5334000" cy="2992243"/>
             <wp:effectExtent l="0" t="0" r="0" b="0"/>
             <wp:docPr id="27" name="Picture"/>
@@ -23266,7 +23272,7 @@
           <w:sz w:val="28"/>
         </w:rPr>
         <w:drawing>
-          <wp:inline distT="0" distB="0" distL="0" distR="0" wp14:anchorId="0B390ABC" wp14:editId="265D8020">
+          <wp:inline distT="0" distB="0" distL="0" distR="0" wp14:anchorId="29918DB3" wp14:editId="4FF5E125">
             <wp:extent cx="5334000" cy="2471853"/>
             <wp:effectExtent l="0" t="0" r="0" b="0"/>
             <wp:docPr id="30" name="Picture"/>
@@ -23765,7 +23771,7 @@
         <w:ind w:firstLine="709"/>
       </w:pPr>
       <w:bookmarkStart w:id="25" w:name="_e6e1aac57bb528344b9009e4599364161f48047"/>
-      <w:bookmarkStart w:id="26" w:name="_Toc241960720"/>
+      <w:bookmarkStart w:id="26" w:name="_Toc241962726"/>
       <w:bookmarkEnd w:id="23"/>
       <w:r>
         <w:rPr>
@@ -24048,6 +24054,12 @@
               <w:spacing w:before="0" w:after="0" w:line="280" w:lineRule="exact"/>
               <w:jc w:val="center"/>
             </w:pPr>
+            <w:r>
+              <w:rPr>
+                <w:sz w:val="24"/>
+              </w:rPr>
+              <w:t>-</w:t>
+            </w:r>
           </w:p>
         </w:tc>
         <w:tc>
@@ -24251,6 +24263,12 @@
               <w:spacing w:before="0" w:after="0" w:line="280" w:lineRule="exact"/>
               <w:jc w:val="center"/>
             </w:pPr>
+            <w:r>
+              <w:rPr>
+                <w:sz w:val="24"/>
+              </w:rPr>
+              <w:t>-</w:t>
+            </w:r>
           </w:p>
         </w:tc>
         <w:tc>
@@ -24447,6 +24465,12 @@
               <w:spacing w:before="0" w:after="0" w:line="280" w:lineRule="exact"/>
               <w:jc w:val="center"/>
             </w:pPr>
+            <w:r>
+              <w:rPr>
+                <w:sz w:val="24"/>
+              </w:rPr>
+              <w:t>-</w:t>
+            </w:r>
           </w:p>
         </w:tc>
         <w:tc>
@@ -24568,6 +24592,12 @@
               <w:spacing w:before="0" w:after="0" w:line="280" w:lineRule="exact"/>
               <w:jc w:val="center"/>
             </w:pPr>
+            <w:r>
+              <w:rPr>
+                <w:sz w:val="24"/>
+              </w:rPr>
+              <w:t>-</w:t>
+            </w:r>
           </w:p>
         </w:tc>
         <w:tc>
@@ -24696,7 +24726,7 @@
         </w:rPr>
         <w:lastRenderedPageBreak/>
         <w:drawing>
-          <wp:inline distT="0" distB="0" distL="0" distR="0" wp14:anchorId="6C091D72" wp14:editId="34BB85BE">
+          <wp:inline distT="0" distB="0" distL="0" distR="0" wp14:anchorId="26CB2F78" wp14:editId="5BE8DF11">
             <wp:extent cx="5334000" cy="2341756"/>
             <wp:effectExtent l="0" t="0" r="0" b="0"/>
             <wp:docPr id="34" name="Picture"/>
@@ -24927,7 +24957,7 @@
         <w:ind w:firstLine="709"/>
       </w:pPr>
       <w:bookmarkStart w:id="27" w:name="_6a64c25cd48aeb5a2bf3dc411d56d805a6b5d7e"/>
-      <w:bookmarkStart w:id="28" w:name="_Toc241960721"/>
+      <w:bookmarkStart w:id="28" w:name="_Toc241962727"/>
       <w:bookmarkEnd w:id="25"/>
       <w:r>
         <w:rPr>
@@ -24986,7 +25016,7 @@
         </w:rPr>
         <w:lastRenderedPageBreak/>
         <w:drawing>
-          <wp:inline distT="0" distB="0" distL="0" distR="0" wp14:anchorId="19069016" wp14:editId="2BD2491A">
+          <wp:inline distT="0" distB="0" distL="0" distR="0" wp14:anchorId="0FC26C2A" wp14:editId="30BC4AB2">
             <wp:extent cx="5334000" cy="2471853"/>
             <wp:effectExtent l="0" t="0" r="0" b="0"/>
             <wp:docPr id="38" name="Picture"/>
@@ -25052,13 +25082,13 @@
         <w:rPr>
           <w:sz w:val="28"/>
         </w:rPr>
-        <w:t xml:space="preserve">Наибольшее влияние оказывает достижимая доля трафика (от 6 до 51 платящих), затем две конверсии. Цель в 50 платящих достигается только при оптимистичной доле трафика (около 51), конверсии по отдельности ее не обеспечивают. Покрытие и релевантность трафика </w:t>
-      </w:r>
-      <w:r>
-        <w:rPr>
-          <w:sz w:val="28"/>
-        </w:rPr>
-        <w:t>сдвигают результат слабее.</w:t>
+        <w:t>Наибольшее влияние оказывает достижимая доля трафика (от 6 до 51 платящих), затем две конверсии. Цель в 50 платящих достигается только при о</w:t>
+      </w:r>
+      <w:r>
+        <w:rPr>
+          <w:sz w:val="28"/>
+        </w:rPr>
+        <w:t>птимистичной доле трафика (около 51), конверсии по отдельности ее не обеспечивают. Покрытие и релевантность трафика сдвигают результат слабее.</w:t>
       </w:r>
     </w:p>
     <w:p>
@@ -25137,7 +25167,13 @@
         <w:rPr>
           <w:sz w:val="28"/>
         </w:rPr>
-        <w:t xml:space="preserve">, сценарии, сверху вниз и снизу вверх, воронки </w:t>
+        <w:t>, сц</w:t>
+      </w:r>
+      <w:r>
+        <w:rPr>
+          <w:sz w:val="28"/>
+        </w:rPr>
+        <w:t xml:space="preserve">енарии, сверху вниз и снизу вверх, воронки </w:t>
       </w:r>
       <w:r>
         <w:rPr>
@@ -25150,13 +25186,7 @@
         <w:rPr>
           <w:sz w:val="28"/>
         </w:rPr>
-        <w:t>, платежеспособность, цифровая воронка, поисковая воронка. Из 5</w:t>
-      </w:r>
-      <w:r>
-        <w:rPr>
-          <w:sz w:val="28"/>
-        </w:rPr>
-        <w:t>2 контрольных величин расхождений выше допуска нет (52 из 52). Допуск фиксировался до расчета: относительная погрешность 1</w:t>
+        <w:t>, платежеспособность, цифровая воронка, поисковая воронка. Из 52 контрольных величин расхождений выше допуска нет (52 из 52). Допуск фиксировался до расчета: относительная погрешность 1</w:t>
       </w:r>
       <w:r>
         <w:rPr>
@@ -25169,7 +25199,13 @@
         <w:rPr>
           <w:sz w:val="28"/>
         </w:rPr>
-        <w:t xml:space="preserve"> для прямых формул и 5</w:t>
+        <w:t xml:space="preserve"> для прямых фор</w:t>
+      </w:r>
+      <w:r>
+        <w:rPr>
+          <w:sz w:val="28"/>
+        </w:rPr>
+        <w:t>мул и 5</w:t>
       </w:r>
       <w:r>
         <w:rPr>
@@ -25195,13 +25231,7 @@
         <w:rPr>
           <w:sz w:val="28"/>
         </w:rPr>
-        <w:t xml:space="preserve"> вводились округленные значения (чек до двух знаков), а также для листов с цепочкой округ</w:t>
-      </w:r>
-      <w:r>
-        <w:rPr>
-          <w:sz w:val="28"/>
-        </w:rPr>
-        <w:t>ленных промежуточных величин. Ошибок формул (#ЗНАЧ!, #ДЕЛ/0!, #ССЫЛКА!) в итоговых книгах нет.</w:t>
+        <w:t xml:space="preserve"> вводились округленные значения (чек до двух знаков), а также для листов с цепочкой округленных промежуточных величин. Ошибок формул (#ЗНАЧ!, #ДЕЛ/0!, #ССЫЛКА!) в итоговых книгах нет.</w:t>
       </w:r>
     </w:p>
     <w:p>
@@ -25211,7 +25241,7 @@
         <w:ind w:firstLine="709"/>
       </w:pPr>
       <w:bookmarkStart w:id="29" w:name="_8cdf61ec50cc46d2aaeadce1b560fea28ea116e"/>
-      <w:bookmarkStart w:id="30" w:name="_Toc241960722"/>
+      <w:bookmarkStart w:id="30" w:name="_Toc241962728"/>
       <w:bookmarkEnd w:id="27"/>
       <w:r>
         <w:rPr>
@@ -25233,7 +25263,13 @@
         <w:rPr>
           <w:sz w:val="28"/>
         </w:rPr>
-        <w:t xml:space="preserve">Ограничения влияют на интерпретацию так: оценки </w:t>
+        <w:t>Ограничения влияют на</w:t>
+      </w:r>
+      <w:r>
+        <w:rPr>
+          <w:sz w:val="28"/>
+        </w:rPr>
+        <w:t xml:space="preserve"> интерпретацию так: оценки </w:t>
       </w:r>
       <w:r>
         <w:rPr>
@@ -25285,19 +25321,13 @@
         <w:rPr>
           <w:sz w:val="28"/>
         </w:rPr>
-        <w:t>) особенно; г</w:t>
-      </w:r>
-      <w:r>
-        <w:rPr>
-          <w:sz w:val="28"/>
-        </w:rPr>
-        <w:t>еография взята по топ-5 стран, поэтому доля целевых стран занижена; коэффициенты релевантности, конверсий и платежеспособности - допущения без измерений на собственном продукте; численность профессий за пределами США оценена масштабом по занятости США и св</w:t>
-      </w:r>
-      <w:r>
-        <w:rPr>
-          <w:sz w:val="28"/>
-        </w:rPr>
-        <w:t xml:space="preserve">ерена с </w:t>
+        <w:t>) особенно; география взята по топ-5 стран, поэтому доля целевых стран занижена; коэффициенты релевантности, конверсий и платежеспособности - допущения б</w:t>
+      </w:r>
+      <w:r>
+        <w:rPr>
+          <w:sz w:val="28"/>
+        </w:rPr>
+        <w:t xml:space="preserve">ез измерений на собственном продукте; численность профессий за пределами США оценена масштабом по занятости США и сверена с </w:t>
       </w:r>
       <w:r>
         <w:rPr>
@@ -25323,7 +25353,13 @@
         <w:rPr>
           <w:sz w:val="28"/>
         </w:rPr>
-        <w:t xml:space="preserve"> в приложении Д; поисковая методика применена к русскоязычному сегменту. Все эти допущения перечислены в приложении А, а недостающие данные - в приложении Б.</w:t>
+        <w:t xml:space="preserve"> в приложении Д; поисковая методика применена к русскоязычному сегменту. Все эти допущения перечислены в приложении А,</w:t>
+      </w:r>
+      <w:r>
+        <w:rPr>
+          <w:sz w:val="28"/>
+        </w:rPr>
+        <w:t xml:space="preserve"> а недостающие данные - в приложении Б.</w:t>
       </w:r>
     </w:p>
     <w:p>
@@ -25334,7 +25370,7 @@
         <w:ind w:firstLine="709"/>
       </w:pPr>
       <w:bookmarkStart w:id="31" w:name="_1bfdad9d2d88ddb6ca16c31c1d4d4943679f32f"/>
-      <w:bookmarkStart w:id="32" w:name="_Toc241960723"/>
+      <w:bookmarkStart w:id="32" w:name="_Toc241962729"/>
       <w:bookmarkEnd w:id="29"/>
       <w:bookmarkEnd w:id="2"/>
       <w:r>
@@ -25358,13 +25394,7 @@
         <w:rPr>
           <w:sz w:val="28"/>
         </w:rPr>
-        <w:t>Ответы даны по контрольным вопросам методики</w:t>
-      </w:r>
-      <w:r>
-        <w:rPr>
-          <w:sz w:val="28"/>
-        </w:rPr>
-        <w:t xml:space="preserve"> оценки объема рынка по данным </w:t>
+        <w:t xml:space="preserve">Ответы даны по контрольным вопросам методики оценки объема рынка по данным </w:t>
       </w:r>
       <w:r>
         <w:rPr>
@@ -25395,7 +25425,13 @@
         <w:rPr>
           <w:sz w:val="28"/>
         </w:rPr>
-        <w:t>Совпадает ли список конкурентов с ранее зафиксированными границами рынка? Да. Прямые игроки (</w:t>
+        <w:t>Совпа</w:t>
+      </w:r>
+      <w:r>
+        <w:rPr>
+          <w:sz w:val="28"/>
+        </w:rPr>
+        <w:t>дает ли список конкурентов с ранее зафиксированными границами рынка? Да. Прямые игроки (</w:t>
       </w:r>
       <w:r>
         <w:rPr>
@@ -25434,13 +25470,7 @@
         <w:rPr>
           <w:sz w:val="28"/>
         </w:rPr>
-        <w:t xml:space="preserve">) </w:t>
-      </w:r>
-      <w:r>
-        <w:rPr>
-          <w:sz w:val="28"/>
-        </w:rPr>
-        <w:t>и заменители (</w:t>
+        <w:t>) и заменители (</w:t>
       </w:r>
       <w:r>
         <w:rPr>
@@ -25497,7 +25527,13 @@
         <w:rPr>
           <w:sz w:val="28"/>
         </w:rPr>
-        <w:t xml:space="preserve">Не включены ли в расчет сайты, которые обслуживают другую клиентскую задачу? Частично. </w:t>
+        <w:t>Не включены ли в расчет сайты, которы</w:t>
+      </w:r>
+      <w:r>
+        <w:rPr>
+          <w:sz w:val="28"/>
+        </w:rPr>
+        <w:t xml:space="preserve">е обслуживают другую клиентскую задачу? Частично. </w:t>
       </w:r>
       <w:r>
         <w:rPr>
@@ -25536,13 +25572,7 @@
         <w:rPr>
           <w:sz w:val="28"/>
         </w:rPr>
-        <w:t xml:space="preserve"> решают общую аналитику; их вклад ограничен долей </w:t>
-      </w:r>
-      <w:r>
-        <w:rPr>
-          <w:sz w:val="28"/>
-        </w:rPr>
-        <w:t>релевантного содержания 10-15 %.</w:t>
+        <w:t xml:space="preserve"> решают общую аналитику; их вклад ограничен долей релевантного содержания 10-15 %.</w:t>
       </w:r>
     </w:p>
     <w:p>
@@ -25560,7 +25590,13 @@
         <w:rPr>
           <w:sz w:val="28"/>
         </w:rPr>
-        <w:t>Одинаковы ли период, страна, устройство и тип трафика для всех конкурентов? Да. Период 06-08.2026, весь мир, весь трафик, один снимок 03.10.2026.</w:t>
+        <w:t>Одинаковы ли период, страна, устройство и тип трафика для всех конкурентов? Да. Период 06-08.2026, весь мир</w:t>
+      </w:r>
+      <w:r>
+        <w:rPr>
+          <w:sz w:val="28"/>
+        </w:rPr>
+        <w:t>, весь трафик, один снимок 03.10.2026.</w:t>
       </w:r>
     </w:p>
     <w:p>
@@ -25578,13 +25614,7 @@
         <w:rPr>
           <w:sz w:val="28"/>
         </w:rPr>
-        <w:t>Разделены ли общий трафик, трафик целевой страны и трафик релевантных каналов</w:t>
-      </w:r>
-      <w:r>
-        <w:rPr>
-          <w:sz w:val="28"/>
-        </w:rPr>
-        <w:t>? Да, но география по топ-5 стран (нижняя оценка); три доли показаны в таблице 4.</w:t>
+        <w:t>Разделены ли общий трафик, трафик целевой страны и трафик релевантных каналов? Да, но география по топ-5 стран (нижняя оценка); три доли показаны в таблице 4.</w:t>
       </w:r>
     </w:p>
     <w:p>
@@ -25602,7 +25632,13 @@
         <w:rPr>
           <w:sz w:val="28"/>
         </w:rPr>
-        <w:t>Не подменяется ли доля трафика долей выручки без дополнительных допущений? Нет. Переход от трафика к выручке выполнен через конверсии и чек с допущениями Д-09 и Д-12.</w:t>
+        <w:t>Не подменяется ли доля трафика долей выручки без дополните</w:t>
+      </w:r>
+      <w:r>
+        <w:rPr>
+          <w:sz w:val="28"/>
+        </w:rPr>
+        <w:t>льных допущений? Нет. Переход от трафика к выручке выполнен через конверсии и чек с допущениями Д-09 и Д-12.</w:t>
       </w:r>
     </w:p>
     <w:p>
@@ -25620,13 +25656,7 @@
         <w:rPr>
           <w:sz w:val="28"/>
         </w:rPr>
-        <w:t>Провере</w:t>
-      </w:r>
-      <w:r>
-        <w:rPr>
-          <w:sz w:val="28"/>
-        </w:rPr>
-        <w:t xml:space="preserve">ны ли выбросы, сезонность и разовые всплески? Выбросы Вордстата обработаны правилом ЛР1; у </w:t>
+        <w:t xml:space="preserve">Проверены ли выбросы, сезонность и разовые всплески? Выбросы Вордстата обработаны правилом ЛР1; у </w:t>
       </w:r>
       <w:r>
         <w:rPr>
@@ -25795,13 +25825,7 @@
         <w:rPr>
           <w:sz w:val="28"/>
         </w:rPr>
-        <w:t xml:space="preserve"> и уровень надежности данны</w:t>
-      </w:r>
-      <w:r>
-        <w:rPr>
-          <w:sz w:val="28"/>
-        </w:rPr>
-        <w:t>х по небольшим сайтам? Да. Раздел 2.13 и коэффициент качества 0,60 для малых сайтов.</w:t>
+        <w:t xml:space="preserve"> и уровень надежности данных по небольшим сайтам? Да. Раздел 2.13 и коэффициент качества 0,60 для малых сайтов.</w:t>
       </w:r>
     </w:p>
     <w:p>
@@ -25841,13 +25865,13 @@
         <w:rPr>
           <w:sz w:val="28"/>
         </w:rPr>
-        <w:t xml:space="preserve"> и Вордстата получены (ЛР1, книга 7); тренд, сезонность и циклы оценены</w:t>
-      </w:r>
-      <w:r>
-        <w:rPr>
-          <w:sz w:val="28"/>
-        </w:rPr>
-        <w:t xml:space="preserve"> (ЛР1); список </w:t>
+        <w:t xml:space="preserve"> и Вордстат</w:t>
+      </w:r>
+      <w:r>
+        <w:rPr>
+          <w:sz w:val="28"/>
+        </w:rPr>
+        <w:t xml:space="preserve">а получены (ЛР1, книга 7); тренд, сезонность и циклы оценены (ЛР1); список </w:t>
       </w:r>
       <w:r>
         <w:rPr>
@@ -25867,7 +25891,13 @@
         <w:rPr>
           <w:sz w:val="28"/>
         </w:rPr>
-        <w:t xml:space="preserve"> сняты; расчет выполнен семью методиками в семи книгах (потенциальные клиенты, сверху вниз и снизу вверх, платежеспособность, цифровая воронка, сценарная оценка и объем по </w:t>
+        <w:t xml:space="preserve"> сняты; расчет выполнен семью методиками в семи книгах (потенциальные клиенты, сверху вниз и снизу вверх, платежеспособность, цифровая воронка, </w:t>
+      </w:r>
+      <w:r>
+        <w:rPr>
+          <w:sz w:val="28"/>
+        </w:rPr>
+        <w:t xml:space="preserve">сценарная оценка и объем по </w:t>
       </w:r>
       <w:r>
         <w:rPr>
@@ -25880,13 +25910,7 @@
         <w:rPr>
           <w:sz w:val="28"/>
         </w:rPr>
-        <w:t>, поисковый спрос); по</w:t>
-      </w:r>
-      <w:r>
-        <w:rPr>
-          <w:sz w:val="28"/>
-        </w:rPr>
-        <w:t>строена цифровая воронка; сделаны три сценария; проверена платежеспособность; итог оформлен диапазоном с ограничениями.</w:t>
+        <w:t>, поисковый спрос); построена цифровая воронка; сделаны три сценария; проверена платежеспособность; итог оформлен диапазоном с ограничениями.</w:t>
       </w:r>
     </w:p>
     <w:p>
@@ -25897,7 +25921,7 @@
         <w:jc w:val="center"/>
       </w:pPr>
       <w:bookmarkStart w:id="33" w:name="_выводы"/>
-      <w:bookmarkStart w:id="34" w:name="_Toc241960724"/>
+      <w:bookmarkStart w:id="34" w:name="_Toc241962730"/>
       <w:bookmarkEnd w:id="31"/>
       <w:r>
         <w:rPr>
@@ -25933,7 +25957,13 @@
         <w:rPr>
           <w:sz w:val="28"/>
         </w:rPr>
-        <w:t>-моделей оценен семью методами. Доступный рынок (</w:t>
+        <w:t>-моделей оценен семью метода</w:t>
+      </w:r>
+      <w:r>
+        <w:rPr>
+          <w:sz w:val="28"/>
+        </w:rPr>
+        <w:t>ми. Доступный рынок (</w:t>
       </w:r>
       <w:r>
         <w:rPr>
@@ -25953,14 +25983,7 @@
           <w:i/>
           <w:sz w:val="28"/>
         </w:rPr>
-        <w:t>EU</w:t>
-      </w:r>
-      <w:r>
-        <w:rPr>
-          <w:i/>
-          <w:sz w:val="28"/>
-        </w:rPr>
-        <w:t>R</w:t>
+        <w:t>EUR</w:t>
       </w:r>
       <w:r>
         <w:rPr>
@@ -26018,7 +26041,13 @@
         <w:rPr>
           <w:sz w:val="28"/>
         </w:rPr>
-        <w:t xml:space="preserve"> и служит только верхней границей.</w:t>
+        <w:t xml:space="preserve"> и служит только верхней гра</w:t>
+      </w:r>
+      <w:r>
+        <w:rPr>
+          <w:sz w:val="28"/>
+        </w:rPr>
+        <w:t>ницей.</w:t>
       </w:r>
     </w:p>
     <w:p>
@@ -26045,13 +26074,7 @@
         <w:rPr>
           <w:sz w:val="28"/>
         </w:rPr>
-        <w:t xml:space="preserve">) в первый год </w:t>
-      </w:r>
-      <w:r>
-        <w:rPr>
-          <w:sz w:val="28"/>
-        </w:rPr>
-        <w:t>- от 132 </w:t>
+        <w:t>) в первый год - от 132 </w:t>
       </w:r>
       <w:r>
         <w:rPr>
@@ -26103,7 +26126,13 @@
         <w:rPr>
           <w:sz w:val="28"/>
         </w:rPr>
-        <w:t xml:space="preserve">), так как не ограничена каналом. Цифровое поле состоит из малых специализированных сайтов (около 75 тысяч визитов в месяц) и крупных </w:t>
+        <w:t>), так как не ограничена каналом. Цифровое поле состоит из малых специализированных сайтов (</w:t>
+      </w:r>
+      <w:r>
+        <w:rPr>
+          <w:sz w:val="28"/>
+        </w:rPr>
+        <w:t xml:space="preserve">около 75 тысяч визитов в месяц) и крупных </w:t>
       </w:r>
       <w:r>
         <w:rPr>
@@ -26116,13 +26145,7 @@
         <w:rPr>
           <w:sz w:val="28"/>
         </w:rPr>
-        <w:t>-помощников (око</w:t>
-      </w:r>
-      <w:r>
-        <w:rPr>
-          <w:sz w:val="28"/>
-        </w:rPr>
-        <w:t xml:space="preserve">ло 1,9 миллиона). Проверка по маркетплейсу </w:t>
+        <w:t xml:space="preserve">-помощников (около 1,9 миллиона). Проверка по маркетплейсу </w:t>
       </w:r>
       <w:r>
         <w:rPr>
@@ -26161,13 +26184,13 @@
         <w:rPr>
           <w:sz w:val="28"/>
         </w:rPr>
-        <w:t>) показала, что магазин пока дает лишь малую часть спроса и служит каналом доверия, а не основным источником выручки. Цена тарифов</w:t>
-      </w:r>
-      <w:r>
-        <w:rPr>
-          <w:sz w:val="28"/>
-        </w:rPr>
-        <w:t xml:space="preserve"> находится в рыночном коридоре, платежеспособность сегментов достаточная (средний индекс 2,4).</w:t>
+        <w:t>) показала, что магазин пока дает лишь малую часть спроса и служит кан</w:t>
+      </w:r>
+      <w:r>
+        <w:rPr>
+          <w:sz w:val="28"/>
+        </w:rPr>
+        <w:t>алом доверия, а не основным источником выручки. Цена тарифов находится в рыночном коридоре, платежеспособность сегментов достаточная (средний индекс 2,4).</w:t>
       </w:r>
     </w:p>
     <w:p>
@@ -26181,13 +26204,19 @@
         <w:rPr>
           <w:sz w:val="28"/>
         </w:rPr>
-        <w:t>Цель проекта по регистрациям (300) достижима в базовом сценарии (571 за 6 месяцев). Цель по платящим (50) за 4 месяца платной беты в базовом сценарии не достигае</w:t>
-      </w:r>
-      <w:r>
-        <w:rPr>
-          <w:sz w:val="28"/>
-        </w:rPr>
-        <w:t xml:space="preserve">тся (19) и требует либо оптимистичной доли трафика (около 3,9 %), либо дополнительных каналов, либо более длинного горизонта; на 12 месяцев канал дает около 57 платящих. Рекомендуется перейти к ЛР4 и ЛР5 и использовать снимок </w:t>
+        <w:t xml:space="preserve">Цель проекта по регистрациям (300) достижима в базовом сценарии (571 за 6 месяцев). Цель по платящим </w:t>
+      </w:r>
+      <w:r>
+        <w:rPr>
+          <w:sz w:val="28"/>
+        </w:rPr>
+        <w:t>(50) за 4 месяца платной беты в базовом сценарии не достигается (19) и требует либо оптимистичной доли трафика (около 3,9 %), либо дополнительных каналов, либо более длинного горизонта; на 12 месяцев канал дает около 57 платящих. Рекомендуется перейти к ЛР</w:t>
+      </w:r>
+      <w:r>
+        <w:rPr>
+          <w:sz w:val="28"/>
+        </w:rPr>
+        <w:t xml:space="preserve">4 и ЛР5 и использовать снимок </w:t>
       </w:r>
       <w:r>
         <w:rPr>
@@ -26200,13 +26229,7 @@
         <w:rPr>
           <w:sz w:val="28"/>
         </w:rPr>
-        <w:t xml:space="preserve"> для анализа пяти си</w:t>
-      </w:r>
-      <w:r>
-        <w:rPr>
-          <w:sz w:val="28"/>
-        </w:rPr>
-        <w:t>л и конкурентов, а в реестре рисков отразить риск недостижения цели по платящим.</w:t>
+        <w:t xml:space="preserve"> для анализа пяти сил и конкурентов, а в реестре рисков отразить риск недостижения цели по платящим.</w:t>
       </w:r>
     </w:p>
     <w:p>
@@ -26217,7 +26240,7 @@
         <w:jc w:val="center"/>
       </w:pPr>
       <w:bookmarkStart w:id="35" w:name="_274f6a444530ef90b0479dabf3d210f01e97699"/>
-      <w:bookmarkStart w:id="36" w:name="_Toc241960725"/>
+      <w:bookmarkStart w:id="36" w:name="_Toc241962731"/>
       <w:bookmarkEnd w:id="33"/>
       <w:r>
         <w:rPr>
@@ -26244,13 +26267,13 @@
         <w:rPr>
           <w:sz w:val="28"/>
         </w:rPr>
-        <w:t>Земляник, Р. В. Отчет по лабораторной работе № 1 «Анализ поискового спроса и фиксация границ рынка» по дисциплине «Электронный бизнес» / Р. В.</w:t>
-      </w:r>
-      <w:r>
-        <w:rPr>
-          <w:sz w:val="28"/>
-        </w:rPr>
-        <w:t xml:space="preserve"> Земляник. – Минск : БГУИР, 2026.</w:t>
+        <w:t>Земляник, Р. В. Отчет по лабораторной работе № 1 «Анализ поискового спроса и фикса</w:t>
+      </w:r>
+      <w:r>
+        <w:rPr>
+          <w:sz w:val="28"/>
+        </w:rPr>
+        <w:t>ция границ рынка» по дисциплине «Электронный бизнес» / Р. В. Земляник. – Минск : БГУИР, 2026.</w:t>
       </w:r>
     </w:p>
     <w:p>
@@ -26268,7 +26291,13 @@
         <w:rPr>
           <w:sz w:val="28"/>
         </w:rPr>
-        <w:t xml:space="preserve">Методические материалы дисциплины «Электронный бизнес» к лабораторным работам № 2–3: инструкция по применению методик оценки рынка электронного бизнеса и методики оценки рынка (поисковый спрос, </w:t>
+        <w:t>Методические материалы дисциплины «Электронный бизнес» к лабораторным работам № 2–3: инструкция по применению методик оценки рынка электронного бизнеса и методики</w:t>
+      </w:r>
+      <w:r>
+        <w:rPr>
+          <w:sz w:val="28"/>
+        </w:rPr>
+        <w:t xml:space="preserve"> оценки рынка (поисковый спрос, </w:t>
       </w:r>
       <w:r>
         <w:rPr>
@@ -26281,13 +26310,7 @@
         <w:rPr>
           <w:sz w:val="28"/>
         </w:rPr>
-        <w:t>, сверху вниз и сн</w:t>
-      </w:r>
-      <w:r>
-        <w:rPr>
-          <w:sz w:val="28"/>
-        </w:rPr>
-        <w:t>изу вверх, потенциальные клиенты, цифровая воронка, платежеспособность). – Минск : БГУИР, 2026.</w:t>
+        <w:t>, сверху вниз и снизу вверх, потенциальные клиенты, цифровая воронка, платежеспособность). – Минск : БГУИР, 2026.</w:t>
       </w:r>
     </w:p>
     <w:p>
@@ -26305,13 +26328,7 @@
         <w:rPr>
           <w:sz w:val="28"/>
         </w:rPr>
-        <w:t>Национальный банк Республики Беларусь. Официальные курсы белорусского рубля [Электронный ресурс]. – Режим доступа: https://www.nbrb.by/api/exrates/rates/EUR?par</w:t>
-      </w:r>
-      <w:r>
-        <w:rPr>
-          <w:sz w:val="28"/>
-        </w:rPr>
-        <w:t>ammode=2. – Дата доступа: 03.10.2026.</w:t>
+        <w:t>Национальный банк Республики Беларусь. Официальные курсы белорусского рубля [Электронный ресурс]. – Режим доступа: https://www.nbrb.by/api/exrates/rates/EUR?parammode=2. – Дата доступа: 03.10.2026.</w:t>
       </w:r>
     </w:p>
     <w:p>
@@ -26355,7 +26372,13 @@
         <w:rPr>
           <w:sz w:val="28"/>
         </w:rPr>
-        <w:t xml:space="preserve">, сетевой график и диаграмма Ганта </w:t>
+        <w:t xml:space="preserve">, сетевой </w:t>
+      </w:r>
+      <w:r>
+        <w:rPr>
+          <w:sz w:val="28"/>
+        </w:rPr>
+        <w:t xml:space="preserve">график и диаграмма Ганта </w:t>
       </w:r>
       <w:r>
         <w:rPr>
@@ -26445,7 +26468,13 @@
         <w:rPr>
           <w:sz w:val="28"/>
         </w:rPr>
-        <w:t>) [Электронный ресурс]. – Режим доступа: https://pro.similarweb.com/. – Дата доступа: 03.10.2026.</w:t>
+        <w:t>) [Электронный ресурс]. – Режим доступа: https://pro.similarweb.co</w:t>
+      </w:r>
+      <w:r>
+        <w:rPr>
+          <w:sz w:val="28"/>
+        </w:rPr>
+        <w:t>m/. – Дата доступа: 03.10.2026.</w:t>
       </w:r>
     </w:p>
     <w:p>
@@ -26646,20 +26675,19 @@
           <w:i/>
           <w:sz w:val="28"/>
         </w:rPr>
-        <w:t>Analy</w:t>
-      </w:r>
-      <w:r>
-        <w:rPr>
-          <w:i/>
-          <w:sz w:val="28"/>
-        </w:rPr>
-        <w:t>sts</w:t>
-      </w:r>
-      <w:r>
-        <w:rPr>
-          <w:sz w:val="28"/>
-        </w:rPr>
-        <w:t xml:space="preserve"> [Электронный ресурс]. – Режим доступа: https://www.bls.gov/ooh/business-and-financial/. – Дата доступа: 03.10.2026.</w:t>
+        <w:t>Analysts</w:t>
+      </w:r>
+      <w:r>
+        <w:rPr>
+          <w:sz w:val="28"/>
+        </w:rPr>
+        <w:t xml:space="preserve"> [Электронный ресурс]. – Режим доступа: https://www.bls.gov/ooh/business-and-financial/. – Дата</w:t>
+      </w:r>
+      <w:r>
+        <w:rPr>
+          <w:sz w:val="28"/>
+        </w:rPr>
+        <w:t xml:space="preserve"> доступа: 03.10.2026.</w:t>
       </w:r>
     </w:p>
     <w:p>
@@ -26801,13 +26829,13 @@
         <w:rPr>
           <w:sz w:val="28"/>
         </w:rPr>
-        <w:t xml:space="preserve"> [Электронный ресурс]. – Режим доступа: https://advoc</w:t>
-      </w:r>
-      <w:r>
-        <w:rPr>
-          <w:sz w:val="28"/>
-        </w:rPr>
-        <w:t>acy.sba.gov/2025/06/30/new-advocacy-report-shows-the-number-of-small-businesses-in-the-u-s-exceeds-36-million/. – Дата доступа: 03.10.2026.</w:t>
+        <w:t xml:space="preserve"> [Электронный ресурс]. – Режим доступа: https://advocacy.sba.gov/2025/06/30/new-advocacy-report-shows-the-number-of-small-businesses-in-the-u-s-exceeds</w:t>
+      </w:r>
+      <w:r>
+        <w:rPr>
+          <w:sz w:val="28"/>
+        </w:rPr>
+        <w:t>-36-million/. – Дата доступа: 03.10.2026.</w:t>
       </w:r>
     </w:p>
     <w:p>
@@ -26936,13 +26964,7 @@
         <w:rPr>
           <w:sz w:val="28"/>
         </w:rPr>
-        <w:t xml:space="preserve"> 2025 [Электронный ресурс]. – Режим доступа: http</w:t>
-      </w:r>
-      <w:r>
-        <w:rPr>
-          <w:sz w:val="28"/>
-        </w:rPr>
-        <w:t>s://www.gov.uk/government/statistics/business-population-estimates-2025. – Дата доступа: 03.10.2026 (значения по сводке поисковой выдачи).</w:t>
+        <w:t xml:space="preserve"> 2025 [Электронный ресурс]. – Режим доступа: https://www.gov.uk/government/statistics/business-population-estimates-2025. – Дата доступа: 03.10.2026 (значения по сводке поисковой выдачи).</w:t>
       </w:r>
     </w:p>
     <w:p>
@@ -27045,7 +27067,13 @@
         <w:rPr>
           <w:sz w:val="28"/>
         </w:rPr>
-        <w:t xml:space="preserve"> 2025/2026 [Электронный ресурс]. – Режим доступа: https://single-market-economy.ec.europa.eu/publications/annual-report-european-smes-20252026_en. – Дата доступа: 03.10.2026.</w:t>
+        <w:t xml:space="preserve"> 2025/2026 [Элект</w:t>
+      </w:r>
+      <w:r>
+        <w:rPr>
+          <w:sz w:val="28"/>
+        </w:rPr>
+        <w:t>ронный ресурс]. – Режим доступа: https://single-market-economy.ec.europa.eu/publications/annual-report-european-smes-20252026_en. – Дата доступа: 03.10.2026.</w:t>
       </w:r>
     </w:p>
     <w:p>
@@ -27634,13 +27662,7 @@
         <w:rPr>
           <w:sz w:val="28"/>
         </w:rPr>
-        <w:t xml:space="preserve"> [Электронный ресурс]. – Режим доступа: https://www.arixcel.com/explorer/download. – Дата доступа: 0</w:t>
-      </w:r>
-      <w:r>
-        <w:rPr>
-          <w:sz w:val="28"/>
-        </w:rPr>
-        <w:t>3.10.2026.</w:t>
+        <w:t xml:space="preserve"> [Электронный ресурс]. – Режим доступа: https://www.arixcel.com/explorer/download. – Дата доступа: 03.10.2026.</w:t>
       </w:r>
     </w:p>
     <w:p>
@@ -27782,7 +27804,13 @@
         <w:rPr>
           <w:sz w:val="28"/>
         </w:rPr>
-        <w:t xml:space="preserve"> [Электронный ресурс]. – Режим доступа: https://www.operisanalysiskit.com/oak-price/. – Дата доступа: 03.10.2026.</w:t>
+        <w:t xml:space="preserve"> [Электронный ресурс]. – Режим доступа: https://www.operisanalysiskit.c</w:t>
+      </w:r>
+      <w:r>
+        <w:rPr>
+          <w:sz w:val="28"/>
+        </w:rPr>
+        <w:t>om/oak-price/. – Дата доступа: 03.10.2026.</w:t>
       </w:r>
     </w:p>
     <w:p>
@@ -27911,13 +27939,7 @@
         <w:rPr>
           <w:sz w:val="28"/>
         </w:rPr>
-        <w:t>) [Электронный ресурс]. – Режим доступа: https://softwarefinder.com/resourc</w:t>
-      </w:r>
-      <w:r>
-        <w:rPr>
-          <w:sz w:val="28"/>
-        </w:rPr>
-        <w:t>es/how-much-does-datasnipper-cost. – Дата доступа: 03.10.2026.</w:t>
+        <w:t>) [Электронный ресурс]. – Режим доступа: https://softwarefinder.com/resources/how-much-does-datasnipper-cost. – Дата доступа: 03.10.2026.</w:t>
       </w:r>
     </w:p>
     <w:p>
@@ -27936,7 +27958,14 @@
           <w:i/>
           <w:sz w:val="28"/>
         </w:rPr>
-        <w:t>Coefficient</w:t>
+        <w:t>Coeffici</w:t>
+      </w:r>
+      <w:r>
+        <w:rPr>
+          <w:i/>
+          <w:sz w:val="28"/>
+        </w:rPr>
+        <w:t>ent</w:t>
       </w:r>
       <w:r>
         <w:rPr>
@@ -28078,14 +28107,7 @@
           <w:i/>
           <w:sz w:val="28"/>
         </w:rPr>
-        <w:t>O</w:t>
-      </w:r>
-      <w:r>
-        <w:rPr>
-          <w:i/>
-          <w:sz w:val="28"/>
-        </w:rPr>
-        <w:t>ffice</w:t>
+        <w:t>Office</w:t>
       </w:r>
       <w:r>
         <w:rPr>
@@ -28292,14 +28314,7 @@
           <w:i/>
           <w:sz w:val="28"/>
         </w:rPr>
-        <w:t>Microsof</w:t>
-      </w:r>
-      <w:r>
-        <w:rPr>
-          <w:i/>
-          <w:sz w:val="28"/>
-        </w:rPr>
-        <w:t>t</w:t>
+        <w:t>Microsoft</w:t>
       </w:r>
       <w:r>
         <w:rPr>
@@ -28343,7 +28358,7 @@
         <w:jc w:val="center"/>
       </w:pPr>
       <w:bookmarkStart w:id="37" w:name="_3d74faf1500c1b2a4a8bfa8e0e37c74206ce73d"/>
-      <w:bookmarkStart w:id="38" w:name="_Toc241960726"/>
+      <w:bookmarkStart w:id="38" w:name="_Toc241962732"/>
       <w:bookmarkEnd w:id="35"/>
       <w:r>
         <w:rPr>
@@ -30013,7 +30028,7 @@
         <w:jc w:val="center"/>
       </w:pPr>
       <w:bookmarkStart w:id="39" w:name="_25083b51e17d9d99817d1269b6af13d75b604a4"/>
-      <w:bookmarkStart w:id="40" w:name="_Toc241960727"/>
+      <w:bookmarkStart w:id="40" w:name="_Toc241962733"/>
       <w:bookmarkEnd w:id="37"/>
       <w:r>
         <w:rPr>
@@ -30364,13 +30379,7 @@
               <w:rPr>
                 <w:sz w:val="24"/>
               </w:rPr>
-              <w:t>книги 5 и 6, прило</w:t>
-            </w:r>
-            <w:r>
-              <w:rPr>
-                <w:sz w:val="24"/>
-              </w:rPr>
-              <w:t>жение Д</w:t>
+              <w:t>книги 5 и 6, приложение Д</w:t>
             </w:r>
           </w:p>
         </w:tc>
@@ -31224,7 +31233,7 @@
         <w:jc w:val="center"/>
       </w:pPr>
       <w:bookmarkStart w:id="41" w:name="_cb59224a7032ef66ab429e7df9b4e4c597bc187"/>
-      <w:bookmarkStart w:id="42" w:name="_Toc241960728"/>
+      <w:bookmarkStart w:id="42" w:name="_Toc241962734"/>
       <w:bookmarkEnd w:id="39"/>
       <w:r>
         <w:rPr>
@@ -32218,7 +32227,7 @@
         <w:jc w:val="center"/>
       </w:pPr>
       <w:bookmarkStart w:id="43" w:name="_1725cce77eeead76f52606ad03c3c6c8aff7f31"/>
-      <w:bookmarkStart w:id="44" w:name="_Toc241960729"/>
+      <w:bookmarkStart w:id="44" w:name="_Toc241962735"/>
       <w:bookmarkEnd w:id="41"/>
       <w:r>
         <w:rPr>
@@ -33554,7 +33563,7 @@
         <w:jc w:val="center"/>
       </w:pPr>
       <w:bookmarkStart w:id="45" w:name="_494653d134221fdc43c135127d450c9af0a7c7d"/>
-      <w:bookmarkStart w:id="46" w:name="_Toc241960730"/>
+      <w:bookmarkStart w:id="46" w:name="_Toc241962736"/>
       <w:bookmarkEnd w:id="43"/>
       <w:r>
         <w:rPr>
@@ -36030,7 +36039,7 @@
   <w:abstractNum w:abstractNumId="0" w15:restartNumberingAfterBreak="0">
     <w:nsid w:val="0000A990"/>
     <w:multiLevelType w:val="multilevel"/>
-    <w:tmpl w:val="89006BEE"/>
+    <w:tmpl w:val="C9B007EE"/>
     <w:lvl w:ilvl="0">
       <w:numFmt w:val="bullet"/>
       <w:lvlText w:val=" "/>
@@ -36107,7 +36116,7 @@
   <w:abstractNum w:abstractNumId="1" w15:restartNumberingAfterBreak="0">
     <w:nsid w:val="00A99411"/>
     <w:multiLevelType w:val="multilevel"/>
-    <w:tmpl w:val="E2B4D92C"/>
+    <w:tmpl w:val="786C559E"/>
     <w:lvl w:ilvl="0">
       <w:start w:val="1"/>
       <w:numFmt w:val="decimal"/>
@@ -37585,7 +37594,7 @@
     <w:autoRedefine/>
     <w:uiPriority w:val="39"/>
     <w:unhideWhenUsed/>
-    <w:rsid w:val="00441C91"/>
+    <w:rsid w:val="00E07CF2"/>
     <w:pPr>
       <w:spacing w:after="100"/>
     </w:pPr>
@@ -37597,7 +37606,7 @@
     <w:autoRedefine/>
     <w:uiPriority w:val="39"/>
     <w:unhideWhenUsed/>
-    <w:rsid w:val="00441C91"/>
+    <w:rsid w:val="00E07CF2"/>
     <w:pPr>
       <w:spacing w:after="100"/>
       <w:ind w:left="240"/>

</xml_diff>

<commit_message>
conditions compliance: passports and checklists for LR6 (appendix Zh), quality control for LR5, commercial map and pre-transition checklist for LR1, screen priority column fix (LR6, LR7); rebuild
</commit_message>
<xml_diff>
--- a/ЛР2-3_Объем_рынка/ОТЧЕТ_ЛР2-3_TableMind.docx
+++ b/ЛР2-3_Объем_рынка/ОТЧЕТ_ЛР2-3_TableMind.docx
@@ -264,7 +264,7 @@
       <w:r>
         <w:fldChar w:fldCharType="separate"/>
       </w:r>
-      <w:hyperlink w:anchor="_Toc241962714" w:history="1">
+      <w:hyperlink w:anchor="_Toc241963479" w:history="1">
         <w:r>
           <w:rPr>
             <w:rStyle w:val="af"/>
@@ -292,7 +292,7 @@
             <w:noProof/>
             <w:webHidden/>
           </w:rPr>
-          <w:instrText xml:space="preserve"> PAGEREF _Toc241962714 \h </w:instrText>
+          <w:instrText xml:space="preserve"> PAGEREF _Toc241963479 \h </w:instrText>
         </w:r>
         <w:r>
           <w:rPr>
@@ -333,7 +333,7 @@
           <w:noProof/>
         </w:rPr>
       </w:pPr>
-      <w:hyperlink w:anchor="_Toc241962715" w:history="1">
+      <w:hyperlink w:anchor="_Toc241963480" w:history="1">
         <w:r>
           <w:rPr>
             <w:rStyle w:val="af"/>
@@ -361,7 +361,7 @@
             <w:noProof/>
             <w:webHidden/>
           </w:rPr>
-          <w:instrText xml:space="preserve"> PAGEREF _Toc241962715 \h </w:instrText>
+          <w:instrText xml:space="preserve"> PAGEREF _Toc241963480 \h </w:instrText>
         </w:r>
         <w:r>
           <w:rPr>
@@ -402,7 +402,7 @@
           <w:noProof/>
         </w:rPr>
       </w:pPr>
-      <w:hyperlink w:anchor="_Toc241962716" w:history="1">
+      <w:hyperlink w:anchor="_Toc241963481" w:history="1">
         <w:r>
           <w:rPr>
             <w:rStyle w:val="af"/>
@@ -430,7 +430,7 @@
             <w:noProof/>
             <w:webHidden/>
           </w:rPr>
-          <w:instrText xml:space="preserve"> PAGEREF _Toc241962716 \h </w:instrText>
+          <w:instrText xml:space="preserve"> PAGEREF _Toc241963481 \h </w:instrText>
         </w:r>
         <w:r>
           <w:rPr>
@@ -471,7 +471,7 @@
           <w:noProof/>
         </w:rPr>
       </w:pPr>
-      <w:hyperlink w:anchor="_Toc241962717" w:history="1">
+      <w:hyperlink w:anchor="_Toc241963482" w:history="1">
         <w:r>
           <w:rPr>
             <w:rStyle w:val="af"/>
@@ -508,7 +508,7 @@
             <w:noProof/>
             <w:webHidden/>
           </w:rPr>
-          <w:instrText xml:space="preserve"> PAGEREF _Toc241962717 \h </w:instrText>
+          <w:instrText xml:space="preserve"> PAGEREF _Toc241963482 \h </w:instrText>
         </w:r>
         <w:r>
           <w:rPr>
@@ -549,7 +549,7 @@
           <w:noProof/>
         </w:rPr>
       </w:pPr>
-      <w:hyperlink w:anchor="_Toc241962718" w:history="1">
+      <w:hyperlink w:anchor="_Toc241963483" w:history="1">
         <w:r>
           <w:rPr>
             <w:rStyle w:val="af"/>
@@ -586,7 +586,7 @@
             <w:noProof/>
             <w:webHidden/>
           </w:rPr>
-          <w:instrText xml:space="preserve"> PAGEREF _Toc241962718 \h </w:instrText>
+          <w:instrText xml:space="preserve"> PAGEREF _Toc241963483 \h </w:instrText>
         </w:r>
         <w:r>
           <w:rPr>
@@ -627,7 +627,7 @@
           <w:noProof/>
         </w:rPr>
       </w:pPr>
-      <w:hyperlink w:anchor="_Toc241962719" w:history="1">
+      <w:hyperlink w:anchor="_Toc241963484" w:history="1">
         <w:r>
           <w:rPr>
             <w:rStyle w:val="af"/>
@@ -664,7 +664,7 @@
             <w:noProof/>
             <w:webHidden/>
           </w:rPr>
-          <w:instrText xml:space="preserve"> PAGEREF _Toc241962719 \h </w:instrText>
+          <w:instrText xml:space="preserve"> PAGEREF _Toc241963484 \h </w:instrText>
         </w:r>
         <w:r>
           <w:rPr>
@@ -705,7 +705,7 @@
           <w:noProof/>
         </w:rPr>
       </w:pPr>
-      <w:hyperlink w:anchor="_Toc241962720" w:history="1">
+      <w:hyperlink w:anchor="_Toc241963485" w:history="1">
         <w:r>
           <w:rPr>
             <w:rStyle w:val="af"/>
@@ -733,7 +733,7 @@
             <w:noProof/>
             <w:webHidden/>
           </w:rPr>
-          <w:instrText xml:space="preserve"> PAGEREF _Toc241962720 \h </w:instrText>
+          <w:instrText xml:space="preserve"> PAGEREF _Toc241963485 \h </w:instrText>
         </w:r>
         <w:r>
           <w:rPr>
@@ -774,7 +774,7 @@
           <w:noProof/>
         </w:rPr>
       </w:pPr>
-      <w:hyperlink w:anchor="_Toc241962721" w:history="1">
+      <w:hyperlink w:anchor="_Toc241963486" w:history="1">
         <w:r>
           <w:rPr>
             <w:rStyle w:val="af"/>
@@ -802,7 +802,7 @@
             <w:noProof/>
             <w:webHidden/>
           </w:rPr>
-          <w:instrText xml:space="preserve"> PAGEREF _Toc241962721 \h </w:instrText>
+          <w:instrText xml:space="preserve"> PAGEREF _Toc241963486 \h </w:instrText>
         </w:r>
         <w:r>
           <w:rPr>
@@ -843,7 +843,7 @@
           <w:noProof/>
         </w:rPr>
       </w:pPr>
-      <w:hyperlink w:anchor="_Toc241962722" w:history="1">
+      <w:hyperlink w:anchor="_Toc241963487" w:history="1">
         <w:r>
           <w:rPr>
             <w:rStyle w:val="af"/>
@@ -880,7 +880,7 @@
             <w:noProof/>
             <w:webHidden/>
           </w:rPr>
-          <w:instrText xml:space="preserve"> PAGEREF _Toc241962722 \h </w:instrText>
+          <w:instrText xml:space="preserve"> PAGEREF _Toc241963487 \h </w:instrText>
         </w:r>
         <w:r>
           <w:rPr>
@@ -921,7 +921,7 @@
           <w:noProof/>
         </w:rPr>
       </w:pPr>
-      <w:hyperlink w:anchor="_Toc241962723" w:history="1">
+      <w:hyperlink w:anchor="_Toc241963488" w:history="1">
         <w:r>
           <w:rPr>
             <w:rStyle w:val="af"/>
@@ -949,7 +949,7 @@
             <w:noProof/>
             <w:webHidden/>
           </w:rPr>
-          <w:instrText xml:space="preserve"> PAGEREF _Toc241962723 \h </w:instrText>
+          <w:instrText xml:space="preserve"> PAGEREF _Toc241963488 \h </w:instrText>
         </w:r>
         <w:r>
           <w:rPr>
@@ -990,7 +990,7 @@
           <w:noProof/>
         </w:rPr>
       </w:pPr>
-      <w:hyperlink w:anchor="_Toc241962724" w:history="1">
+      <w:hyperlink w:anchor="_Toc241963489" w:history="1">
         <w:r>
           <w:rPr>
             <w:rStyle w:val="af"/>
@@ -1018,7 +1018,7 @@
             <w:noProof/>
             <w:webHidden/>
           </w:rPr>
-          <w:instrText xml:space="preserve"> PAGEREF _Toc241962724 \h </w:instrText>
+          <w:instrText xml:space="preserve"> PAGEREF _Toc241963489 \h </w:instrText>
         </w:r>
         <w:r>
           <w:rPr>
@@ -1059,7 +1059,7 @@
           <w:noProof/>
         </w:rPr>
       </w:pPr>
-      <w:hyperlink w:anchor="_Toc241962725" w:history="1">
+      <w:hyperlink w:anchor="_Toc241963490" w:history="1">
         <w:r>
           <w:rPr>
             <w:rStyle w:val="af"/>
@@ -1087,7 +1087,7 @@
             <w:noProof/>
             <w:webHidden/>
           </w:rPr>
-          <w:instrText xml:space="preserve"> PAGEREF _Toc241962725 \h </w:instrText>
+          <w:instrText xml:space="preserve"> PAGEREF _Toc241963490 \h </w:instrText>
         </w:r>
         <w:r>
           <w:rPr>
@@ -1128,7 +1128,7 @@
           <w:noProof/>
         </w:rPr>
       </w:pPr>
-      <w:hyperlink w:anchor="_Toc241962726" w:history="1">
+      <w:hyperlink w:anchor="_Toc241963491" w:history="1">
         <w:r>
           <w:rPr>
             <w:rStyle w:val="af"/>
@@ -1156,7 +1156,7 @@
             <w:noProof/>
             <w:webHidden/>
           </w:rPr>
-          <w:instrText xml:space="preserve"> PAGEREF _Toc241962726 \h </w:instrText>
+          <w:instrText xml:space="preserve"> PAGEREF _Toc241963491 \h </w:instrText>
         </w:r>
         <w:r>
           <w:rPr>
@@ -1197,7 +1197,7 @@
           <w:noProof/>
         </w:rPr>
       </w:pPr>
-      <w:hyperlink w:anchor="_Toc241962727" w:history="1">
+      <w:hyperlink w:anchor="_Toc241963492" w:history="1">
         <w:r>
           <w:rPr>
             <w:rStyle w:val="af"/>
@@ -1225,7 +1225,7 @@
             <w:noProof/>
             <w:webHidden/>
           </w:rPr>
-          <w:instrText xml:space="preserve"> PAGEREF _Toc241962727 \h </w:instrText>
+          <w:instrText xml:space="preserve"> PAGEREF _Toc241963492 \h </w:instrText>
         </w:r>
         <w:r>
           <w:rPr>
@@ -1266,7 +1266,7 @@
           <w:noProof/>
         </w:rPr>
       </w:pPr>
-      <w:hyperlink w:anchor="_Toc241962728" w:history="1">
+      <w:hyperlink w:anchor="_Toc241963493" w:history="1">
         <w:r>
           <w:rPr>
             <w:rStyle w:val="af"/>
@@ -1294,7 +1294,7 @@
             <w:noProof/>
             <w:webHidden/>
           </w:rPr>
-          <w:instrText xml:space="preserve"> PAGEREF _Toc241962728 \h </w:instrText>
+          <w:instrText xml:space="preserve"> PAGEREF _Toc241963493 \h </w:instrText>
         </w:r>
         <w:r>
           <w:rPr>
@@ -1335,7 +1335,7 @@
           <w:noProof/>
         </w:rPr>
       </w:pPr>
-      <w:hyperlink w:anchor="_Toc241962729" w:history="1">
+      <w:hyperlink w:anchor="_Toc241963494" w:history="1">
         <w:r>
           <w:rPr>
             <w:rStyle w:val="af"/>
@@ -1363,7 +1363,7 @@
             <w:noProof/>
             <w:webHidden/>
           </w:rPr>
-          <w:instrText xml:space="preserve"> PAGEREF _Toc241962729 \h </w:instrText>
+          <w:instrText xml:space="preserve"> PAGEREF _Toc241963494 \h </w:instrText>
         </w:r>
         <w:r>
           <w:rPr>
@@ -1404,7 +1404,7 @@
           <w:noProof/>
         </w:rPr>
       </w:pPr>
-      <w:hyperlink w:anchor="_Toc241962730" w:history="1">
+      <w:hyperlink w:anchor="_Toc241963495" w:history="1">
         <w:r>
           <w:rPr>
             <w:rStyle w:val="af"/>
@@ -1432,7 +1432,7 @@
             <w:noProof/>
             <w:webHidden/>
           </w:rPr>
-          <w:instrText xml:space="preserve"> PAGEREF _Toc241962730 \h </w:instrText>
+          <w:instrText xml:space="preserve"> PAGEREF _Toc241963495 \h </w:instrText>
         </w:r>
         <w:r>
           <w:rPr>
@@ -1473,7 +1473,7 @@
           <w:noProof/>
         </w:rPr>
       </w:pPr>
-      <w:hyperlink w:anchor="_Toc241962731" w:history="1">
+      <w:hyperlink w:anchor="_Toc241963496" w:history="1">
         <w:r>
           <w:rPr>
             <w:rStyle w:val="af"/>
@@ -1501,7 +1501,7 @@
             <w:noProof/>
             <w:webHidden/>
           </w:rPr>
-          <w:instrText xml:space="preserve"> PAGEREF _Toc241962731 \h </w:instrText>
+          <w:instrText xml:space="preserve"> PAGEREF _Toc241963496 \h </w:instrText>
         </w:r>
         <w:r>
           <w:rPr>
@@ -1542,7 +1542,7 @@
           <w:noProof/>
         </w:rPr>
       </w:pPr>
-      <w:hyperlink w:anchor="_Toc241962732" w:history="1">
+      <w:hyperlink w:anchor="_Toc241963497" w:history="1">
         <w:r>
           <w:rPr>
             <w:rStyle w:val="af"/>
@@ -1570,7 +1570,7 @@
             <w:noProof/>
             <w:webHidden/>
           </w:rPr>
-          <w:instrText xml:space="preserve"> PAGEREF _Toc241962732 \h </w:instrText>
+          <w:instrText xml:space="preserve"> PAGEREF _Toc241963497 \h </w:instrText>
         </w:r>
         <w:r>
           <w:rPr>
@@ -1611,7 +1611,7 @@
           <w:noProof/>
         </w:rPr>
       </w:pPr>
-      <w:hyperlink w:anchor="_Toc241962733" w:history="1">
+      <w:hyperlink w:anchor="_Toc241963498" w:history="1">
         <w:r>
           <w:rPr>
             <w:rStyle w:val="af"/>
@@ -1639,7 +1639,7 @@
             <w:noProof/>
             <w:webHidden/>
           </w:rPr>
-          <w:instrText xml:space="preserve"> PAGEREF _Toc241962733 \h </w:instrText>
+          <w:instrText xml:space="preserve"> PAGEREF _Toc241963498 \h </w:instrText>
         </w:r>
         <w:r>
           <w:rPr>
@@ -1680,7 +1680,7 @@
           <w:noProof/>
         </w:rPr>
       </w:pPr>
-      <w:hyperlink w:anchor="_Toc241962734" w:history="1">
+      <w:hyperlink w:anchor="_Toc241963499" w:history="1">
         <w:r>
           <w:rPr>
             <w:rStyle w:val="af"/>
@@ -1708,7 +1708,7 @@
             <w:noProof/>
             <w:webHidden/>
           </w:rPr>
-          <w:instrText xml:space="preserve"> PAGEREF _Toc241962734 \h </w:instrText>
+          <w:instrText xml:space="preserve"> PAGEREF _Toc241963499 \h </w:instrText>
         </w:r>
         <w:r>
           <w:rPr>
@@ -1749,7 +1749,7 @@
           <w:noProof/>
         </w:rPr>
       </w:pPr>
-      <w:hyperlink w:anchor="_Toc241962735" w:history="1">
+      <w:hyperlink w:anchor="_Toc241963500" w:history="1">
         <w:r>
           <w:rPr>
             <w:rStyle w:val="af"/>
@@ -1777,7 +1777,7 @@
             <w:noProof/>
             <w:webHidden/>
           </w:rPr>
-          <w:instrText xml:space="preserve"> PAGEREF _Toc241962735 \h </w:instrText>
+          <w:instrText xml:space="preserve"> PAGEREF _Toc241963500 \h </w:instrText>
         </w:r>
         <w:r>
           <w:rPr>
@@ -1818,7 +1818,7 @@
           <w:noProof/>
         </w:rPr>
       </w:pPr>
-      <w:hyperlink w:anchor="_Toc241962736" w:history="1">
+      <w:hyperlink w:anchor="_Toc241963501" w:history="1">
         <w:r>
           <w:rPr>
             <w:rStyle w:val="af"/>
@@ -1846,7 +1846,7 @@
             <w:noProof/>
             <w:webHidden/>
           </w:rPr>
-          <w:instrText xml:space="preserve"> PAGEREF _Toc241962736 \h </w:instrText>
+          <w:instrText xml:space="preserve"> PAGEREF _Toc241963501 \h </w:instrText>
         </w:r>
         <w:r>
           <w:rPr>
@@ -1892,7 +1892,7 @@
         <w:spacing w:before="0" w:after="360" w:line="360" w:lineRule="exact"/>
         <w:ind w:firstLine="709"/>
       </w:pPr>
-      <w:bookmarkStart w:id="1" w:name="_Toc241962714"/>
+      <w:bookmarkStart w:id="1" w:name="_Toc241963479"/>
       <w:r>
         <w:rPr>
           <w:b/>
@@ -2198,7 +2198,7 @@
         <w:ind w:firstLine="709"/>
       </w:pPr>
       <w:bookmarkStart w:id="2" w:name="_b608aa976fc82a0faaf3b83f58c735968afd03b"/>
-      <w:bookmarkStart w:id="3" w:name="_Toc241962715"/>
+      <w:bookmarkStart w:id="3" w:name="_Toc241963480"/>
       <w:bookmarkEnd w:id="0"/>
       <w:r>
         <w:rPr>
@@ -2276,7 +2276,7 @@
         <w:ind w:firstLine="709"/>
       </w:pPr>
       <w:bookmarkStart w:id="4" w:name="_6ea6bf0a5ec92c733c53e44899cf0806bdc5e39"/>
-      <w:bookmarkStart w:id="5" w:name="_Toc241962716"/>
+      <w:bookmarkStart w:id="5" w:name="_Toc241963481"/>
       <w:r>
         <w:rPr>
           <w:b/>
@@ -3232,7 +3232,7 @@
         <w:ind w:firstLine="709"/>
       </w:pPr>
       <w:bookmarkStart w:id="6" w:name="_7a0c967539b5ef143597c37b0951dae8b296890"/>
-      <w:bookmarkStart w:id="7" w:name="_Toc241962717"/>
+      <w:bookmarkStart w:id="7" w:name="_Toc241963482"/>
       <w:bookmarkEnd w:id="4"/>
       <w:r>
         <w:rPr>
@@ -5665,7 +5665,7 @@
           <w:sz w:val="28"/>
         </w:rPr>
         <w:drawing>
-          <wp:inline distT="0" distB="0" distL="0" distR="0" wp14:anchorId="114C61C5" wp14:editId="3A4F8674">
+          <wp:inline distT="0" distB="0" distL="0" distR="0" wp14:anchorId="6224AB86" wp14:editId="33D52D24">
             <wp:extent cx="5334000" cy="3122341"/>
             <wp:effectExtent l="0" t="0" r="0" b="0"/>
             <wp:docPr id="12" name="Picture"/>
@@ -6476,7 +6476,7 @@
           <w:sz w:val="28"/>
         </w:rPr>
         <w:drawing>
-          <wp:inline distT="0" distB="0" distL="0" distR="0" wp14:anchorId="17E5D959" wp14:editId="67CFF090">
+          <wp:inline distT="0" distB="0" distL="0" distR="0" wp14:anchorId="1431826A" wp14:editId="4A64E929">
             <wp:extent cx="5334000" cy="3252439"/>
             <wp:effectExtent l="0" t="0" r="0" b="0"/>
             <wp:docPr id="15" name="Picture"/>
@@ -6637,7 +6637,7 @@
         <w:ind w:firstLine="709"/>
       </w:pPr>
       <w:bookmarkStart w:id="8" w:name="_da959056159f19dff160d665d57702b18af1ddd"/>
-      <w:bookmarkStart w:id="9" w:name="_Toc241962718"/>
+      <w:bookmarkStart w:id="9" w:name="_Toc241963483"/>
       <w:bookmarkEnd w:id="6"/>
       <w:r>
         <w:rPr>
@@ -9765,7 +9765,7 @@
         <w:ind w:firstLine="709"/>
       </w:pPr>
       <w:bookmarkStart w:id="10" w:name="_06e2001e7574ebc77f8406bc11ca3db76d00c2a"/>
-      <w:bookmarkStart w:id="11" w:name="_Toc241962719"/>
+      <w:bookmarkStart w:id="11" w:name="_Toc241963484"/>
       <w:bookmarkEnd w:id="8"/>
       <w:r>
         <w:rPr>
@@ -10575,7 +10575,7 @@
         <w:ind w:firstLine="709"/>
       </w:pPr>
       <w:bookmarkStart w:id="12" w:name="_606fa79e4d4f49d8da929021c2a978685b741ea"/>
-      <w:bookmarkStart w:id="13" w:name="_Toc241962720"/>
+      <w:bookmarkStart w:id="13" w:name="_Toc241963485"/>
       <w:bookmarkEnd w:id="10"/>
       <w:r>
         <w:rPr>
@@ -13061,7 +13061,7 @@
         <w:ind w:firstLine="709"/>
       </w:pPr>
       <w:bookmarkStart w:id="14" w:name="_2314d5998da626860a70184e0b470b0b8504694"/>
-      <w:bookmarkStart w:id="15" w:name="_Toc241962721"/>
+      <w:bookmarkStart w:id="15" w:name="_Toc241963486"/>
       <w:bookmarkEnd w:id="12"/>
       <w:r>
         <w:rPr>
@@ -13684,7 +13684,7 @@
         <w:ind w:firstLine="709"/>
       </w:pPr>
       <w:bookmarkStart w:id="16" w:name="_42bac9f10c820a94a4112d44417ea6b5d14bf7d"/>
-      <w:bookmarkStart w:id="17" w:name="_Toc241962722"/>
+      <w:bookmarkStart w:id="17" w:name="_Toc241963487"/>
       <w:bookmarkEnd w:id="14"/>
       <w:r>
         <w:rPr>
@@ -17537,7 +17537,7 @@
         <w:ind w:firstLine="709"/>
       </w:pPr>
       <w:bookmarkStart w:id="19" w:name="_62882a27ae1c57302eff280b02701a311900947"/>
-      <w:bookmarkStart w:id="20" w:name="_Toc241962723"/>
+      <w:bookmarkStart w:id="20" w:name="_Toc241963488"/>
       <w:bookmarkEnd w:id="18"/>
       <w:bookmarkEnd w:id="16"/>
       <w:r>
@@ -18909,7 +18909,7 @@
         <w:ind w:firstLine="709"/>
       </w:pPr>
       <w:bookmarkStart w:id="21" w:name="_2c7ec3ecf17663584d0d27e07e31cbd2a0948cf"/>
-      <w:bookmarkStart w:id="22" w:name="_Toc241962724"/>
+      <w:bookmarkStart w:id="22" w:name="_Toc241963489"/>
       <w:bookmarkEnd w:id="19"/>
       <w:r>
         <w:rPr>
@@ -21288,7 +21288,7 @@
         <w:ind w:firstLine="709"/>
       </w:pPr>
       <w:bookmarkStart w:id="23" w:name="_8d34778965163a5752bc27698d1f7e786ff5c87"/>
-      <w:bookmarkStart w:id="24" w:name="_Toc241962725"/>
+      <w:bookmarkStart w:id="24" w:name="_Toc241963490"/>
       <w:bookmarkEnd w:id="21"/>
       <w:r>
         <w:rPr>
@@ -22431,7 +22431,7 @@
         </w:rPr>
         <w:lastRenderedPageBreak/>
         <w:drawing>
-          <wp:inline distT="0" distB="0" distL="0" distR="0" wp14:anchorId="2F4CBE39" wp14:editId="2E2A587D">
+          <wp:inline distT="0" distB="0" distL="0" distR="0" wp14:anchorId="1C519CC5" wp14:editId="01F7E100">
             <wp:extent cx="5334000" cy="2992243"/>
             <wp:effectExtent l="0" t="0" r="0" b="0"/>
             <wp:docPr id="27" name="Picture"/>
@@ -23272,7 +23272,7 @@
           <w:sz w:val="28"/>
         </w:rPr>
         <w:drawing>
-          <wp:inline distT="0" distB="0" distL="0" distR="0" wp14:anchorId="29918DB3" wp14:editId="4FF5E125">
+          <wp:inline distT="0" distB="0" distL="0" distR="0" wp14:anchorId="1D7F6FA7" wp14:editId="3CEB2B6B">
             <wp:extent cx="5334000" cy="2471853"/>
             <wp:effectExtent l="0" t="0" r="0" b="0"/>
             <wp:docPr id="30" name="Picture"/>
@@ -23771,7 +23771,7 @@
         <w:ind w:firstLine="709"/>
       </w:pPr>
       <w:bookmarkStart w:id="25" w:name="_e6e1aac57bb528344b9009e4599364161f48047"/>
-      <w:bookmarkStart w:id="26" w:name="_Toc241962726"/>
+      <w:bookmarkStart w:id="26" w:name="_Toc241963491"/>
       <w:bookmarkEnd w:id="23"/>
       <w:r>
         <w:rPr>
@@ -24726,7 +24726,7 @@
         </w:rPr>
         <w:lastRenderedPageBreak/>
         <w:drawing>
-          <wp:inline distT="0" distB="0" distL="0" distR="0" wp14:anchorId="26CB2F78" wp14:editId="5BE8DF11">
+          <wp:inline distT="0" distB="0" distL="0" distR="0" wp14:anchorId="24ED78DF" wp14:editId="4542C40D">
             <wp:extent cx="5334000" cy="2341756"/>
             <wp:effectExtent l="0" t="0" r="0" b="0"/>
             <wp:docPr id="34" name="Picture"/>
@@ -24957,7 +24957,7 @@
         <w:ind w:firstLine="709"/>
       </w:pPr>
       <w:bookmarkStart w:id="27" w:name="_6a64c25cd48aeb5a2bf3dc411d56d805a6b5d7e"/>
-      <w:bookmarkStart w:id="28" w:name="_Toc241962727"/>
+      <w:bookmarkStart w:id="28" w:name="_Toc241963492"/>
       <w:bookmarkEnd w:id="25"/>
       <w:r>
         <w:rPr>
@@ -25016,7 +25016,7 @@
         </w:rPr>
         <w:lastRenderedPageBreak/>
         <w:drawing>
-          <wp:inline distT="0" distB="0" distL="0" distR="0" wp14:anchorId="0FC26C2A" wp14:editId="30BC4AB2">
+          <wp:inline distT="0" distB="0" distL="0" distR="0" wp14:anchorId="2D67F3AD" wp14:editId="07FBFC3B">
             <wp:extent cx="5334000" cy="2471853"/>
             <wp:effectExtent l="0" t="0" r="0" b="0"/>
             <wp:docPr id="38" name="Picture"/>
@@ -25241,7 +25241,7 @@
         <w:ind w:firstLine="709"/>
       </w:pPr>
       <w:bookmarkStart w:id="29" w:name="_8cdf61ec50cc46d2aaeadce1b560fea28ea116e"/>
-      <w:bookmarkStart w:id="30" w:name="_Toc241962728"/>
+      <w:bookmarkStart w:id="30" w:name="_Toc241963493"/>
       <w:bookmarkEnd w:id="27"/>
       <w:r>
         <w:rPr>
@@ -25370,7 +25370,7 @@
         <w:ind w:firstLine="709"/>
       </w:pPr>
       <w:bookmarkStart w:id="31" w:name="_1bfdad9d2d88ddb6ca16c31c1d4d4943679f32f"/>
-      <w:bookmarkStart w:id="32" w:name="_Toc241962729"/>
+      <w:bookmarkStart w:id="32" w:name="_Toc241963494"/>
       <w:bookmarkEnd w:id="29"/>
       <w:bookmarkEnd w:id="2"/>
       <w:r>
@@ -25921,7 +25921,7 @@
         <w:jc w:val="center"/>
       </w:pPr>
       <w:bookmarkStart w:id="33" w:name="_выводы"/>
-      <w:bookmarkStart w:id="34" w:name="_Toc241962730"/>
+      <w:bookmarkStart w:id="34" w:name="_Toc241963495"/>
       <w:bookmarkEnd w:id="31"/>
       <w:r>
         <w:rPr>
@@ -26240,7 +26240,7 @@
         <w:jc w:val="center"/>
       </w:pPr>
       <w:bookmarkStart w:id="35" w:name="_274f6a444530ef90b0479dabf3d210f01e97699"/>
-      <w:bookmarkStart w:id="36" w:name="_Toc241962731"/>
+      <w:bookmarkStart w:id="36" w:name="_Toc241963496"/>
       <w:bookmarkEnd w:id="33"/>
       <w:r>
         <w:rPr>
@@ -28358,7 +28358,7 @@
         <w:jc w:val="center"/>
       </w:pPr>
       <w:bookmarkStart w:id="37" w:name="_3d74faf1500c1b2a4a8bfa8e0e37c74206ce73d"/>
-      <w:bookmarkStart w:id="38" w:name="_Toc241962732"/>
+      <w:bookmarkStart w:id="38" w:name="_Toc241963497"/>
       <w:bookmarkEnd w:id="35"/>
       <w:r>
         <w:rPr>
@@ -30028,7 +30028,7 @@
         <w:jc w:val="center"/>
       </w:pPr>
       <w:bookmarkStart w:id="39" w:name="_25083b51e17d9d99817d1269b6af13d75b604a4"/>
-      <w:bookmarkStart w:id="40" w:name="_Toc241962733"/>
+      <w:bookmarkStart w:id="40" w:name="_Toc241963498"/>
       <w:bookmarkEnd w:id="37"/>
       <w:r>
         <w:rPr>
@@ -31233,7 +31233,7 @@
         <w:jc w:val="center"/>
       </w:pPr>
       <w:bookmarkStart w:id="41" w:name="_cb59224a7032ef66ab429e7df9b4e4c597bc187"/>
-      <w:bookmarkStart w:id="42" w:name="_Toc241962734"/>
+      <w:bookmarkStart w:id="42" w:name="_Toc241963499"/>
       <w:bookmarkEnd w:id="39"/>
       <w:r>
         <w:rPr>
@@ -32227,7 +32227,7 @@
         <w:jc w:val="center"/>
       </w:pPr>
       <w:bookmarkStart w:id="43" w:name="_1725cce77eeead76f52606ad03c3c6c8aff7f31"/>
-      <w:bookmarkStart w:id="44" w:name="_Toc241962735"/>
+      <w:bookmarkStart w:id="44" w:name="_Toc241963500"/>
       <w:bookmarkEnd w:id="41"/>
       <w:r>
         <w:rPr>
@@ -33563,7 +33563,7 @@
         <w:jc w:val="center"/>
       </w:pPr>
       <w:bookmarkStart w:id="45" w:name="_494653d134221fdc43c135127d450c9af0a7c7d"/>
-      <w:bookmarkStart w:id="46" w:name="_Toc241962736"/>
+      <w:bookmarkStart w:id="46" w:name="_Toc241963501"/>
       <w:bookmarkEnd w:id="43"/>
       <w:r>
         <w:rPr>
@@ -36039,7 +36039,7 @@
   <w:abstractNum w:abstractNumId="0" w15:restartNumberingAfterBreak="0">
     <w:nsid w:val="0000A990"/>
     <w:multiLevelType w:val="multilevel"/>
-    <w:tmpl w:val="C9B007EE"/>
+    <w:tmpl w:val="802C98E8"/>
     <w:lvl w:ilvl="0">
       <w:numFmt w:val="bullet"/>
       <w:lvlText w:val=" "/>
@@ -36116,7 +36116,7 @@
   <w:abstractNum w:abstractNumId="1" w15:restartNumberingAfterBreak="0">
     <w:nsid w:val="00A99411"/>
     <w:multiLevelType w:val="multilevel"/>
-    <w:tmpl w:val="786C559E"/>
+    <w:tmpl w:val="7050421A"/>
     <w:lvl w:ilvl="0">
       <w:start w:val="1"/>
       <w:numFmt w:val="decimal"/>
@@ -37594,7 +37594,7 @@
     <w:autoRedefine/>
     <w:uiPriority w:val="39"/>
     <w:unhideWhenUsed/>
-    <w:rsid w:val="00E07CF2"/>
+    <w:rsid w:val="008F327A"/>
     <w:pPr>
       <w:spacing w:after="100"/>
     </w:pPr>
@@ -37606,7 +37606,7 @@
     <w:autoRedefine/>
     <w:uiPriority w:val="39"/>
     <w:unhideWhenUsed/>
-    <w:rsid w:val="00E07CF2"/>
+    <w:rsid w:val="008F327A"/>
     <w:pPr>
       <w:spacing w:after="100"/>
       <w:ind w:left="240"/>

</xml_diff>

<commit_message>
data: alternative sources for paid-only data (Vendr/Sacra prices, Similarweb keyword check), rebuilt LR2-3, LR4, LR5, final
</commit_message>
<xml_diff>
--- a/ЛР2-3_Объем_рынка/ОТЧЕТ_ЛР2-3_TableMind.docx
+++ b/ЛР2-3_Объем_рынка/ОТЧЕТ_ЛР2-3_TableMind.docx
@@ -264,7 +264,7 @@
       <w:r>
         <w:fldChar w:fldCharType="separate"/>
       </w:r>
-      <w:hyperlink w:anchor="_Toc241952850" w:history="1">
+      <w:hyperlink w:anchor="_Toc242009800" w:history="1">
         <w:r>
           <w:rPr>
             <w:rStyle w:val="af"/>
@@ -292,7 +292,7 @@
             <w:noProof/>
             <w:webHidden/>
           </w:rPr>
-          <w:instrText xml:space="preserve"> PAGEREF _Toc241952850 \h </w:instrText>
+          <w:instrText xml:space="preserve"> PAGEREF _Toc242009800 \h </w:instrText>
         </w:r>
         <w:r>
           <w:rPr>
@@ -333,7 +333,7 @@
           <w:noProof/>
         </w:rPr>
       </w:pPr>
-      <w:hyperlink w:anchor="_Toc241952851" w:history="1">
+      <w:hyperlink w:anchor="_Toc242009801" w:history="1">
         <w:r>
           <w:rPr>
             <w:rStyle w:val="af"/>
@@ -361,7 +361,7 @@
             <w:noProof/>
             <w:webHidden/>
           </w:rPr>
-          <w:instrText xml:space="preserve"> PAGEREF _Toc241952851 \h </w:instrText>
+          <w:instrText xml:space="preserve"> PAGEREF _Toc242009801 \h </w:instrText>
         </w:r>
         <w:r>
           <w:rPr>
@@ -402,7 +402,7 @@
           <w:noProof/>
         </w:rPr>
       </w:pPr>
-      <w:hyperlink w:anchor="_Toc241952852" w:history="1">
+      <w:hyperlink w:anchor="_Toc242009802" w:history="1">
         <w:r>
           <w:rPr>
             <w:rStyle w:val="af"/>
@@ -430,7 +430,7 @@
             <w:noProof/>
             <w:webHidden/>
           </w:rPr>
-          <w:instrText xml:space="preserve"> PAGEREF _Toc241952852 \h </w:instrText>
+          <w:instrText xml:space="preserve"> PAGEREF _Toc242009802 \h </w:instrText>
         </w:r>
         <w:r>
           <w:rPr>
@@ -471,7 +471,7 @@
           <w:noProof/>
         </w:rPr>
       </w:pPr>
-      <w:hyperlink w:anchor="_Toc241952853" w:history="1">
+      <w:hyperlink w:anchor="_Toc242009803" w:history="1">
         <w:r>
           <w:rPr>
             <w:rStyle w:val="af"/>
@@ -508,7 +508,7 @@
             <w:noProof/>
             <w:webHidden/>
           </w:rPr>
-          <w:instrText xml:space="preserve"> PAGEREF _Toc241952853 \h </w:instrText>
+          <w:instrText xml:space="preserve"> PAGEREF _Toc242009803 \h </w:instrText>
         </w:r>
         <w:r>
           <w:rPr>
@@ -549,7 +549,7 @@
           <w:noProof/>
         </w:rPr>
       </w:pPr>
-      <w:hyperlink w:anchor="_Toc241952854" w:history="1">
+      <w:hyperlink w:anchor="_Toc242009804" w:history="1">
         <w:r>
           <w:rPr>
             <w:rStyle w:val="af"/>
@@ -586,7 +586,7 @@
             <w:noProof/>
             <w:webHidden/>
           </w:rPr>
-          <w:instrText xml:space="preserve"> PAGEREF _Toc241952854 \h </w:instrText>
+          <w:instrText xml:space="preserve"> PAGEREF _Toc242009804 \h </w:instrText>
         </w:r>
         <w:r>
           <w:rPr>
@@ -627,7 +627,7 @@
           <w:noProof/>
         </w:rPr>
       </w:pPr>
-      <w:hyperlink w:anchor="_Toc241952855" w:history="1">
+      <w:hyperlink w:anchor="_Toc242009805" w:history="1">
         <w:r>
           <w:rPr>
             <w:rStyle w:val="af"/>
@@ -664,7 +664,7 @@
             <w:noProof/>
             <w:webHidden/>
           </w:rPr>
-          <w:instrText xml:space="preserve"> PAGEREF _Toc241952855 \h </w:instrText>
+          <w:instrText xml:space="preserve"> PAGEREF _Toc242009805 \h </w:instrText>
         </w:r>
         <w:r>
           <w:rPr>
@@ -705,7 +705,7 @@
           <w:noProof/>
         </w:rPr>
       </w:pPr>
-      <w:hyperlink w:anchor="_Toc241952856" w:history="1">
+      <w:hyperlink w:anchor="_Toc242009806" w:history="1">
         <w:r>
           <w:rPr>
             <w:rStyle w:val="af"/>
@@ -733,7 +733,7 @@
             <w:noProof/>
             <w:webHidden/>
           </w:rPr>
-          <w:instrText xml:space="preserve"> PAGEREF _Toc241952856 \h </w:instrText>
+          <w:instrText xml:space="preserve"> PAGEREF _Toc242009806 \h </w:instrText>
         </w:r>
         <w:r>
           <w:rPr>
@@ -774,7 +774,7 @@
           <w:noProof/>
         </w:rPr>
       </w:pPr>
-      <w:hyperlink w:anchor="_Toc241952857" w:history="1">
+      <w:hyperlink w:anchor="_Toc242009807" w:history="1">
         <w:r>
           <w:rPr>
             <w:rStyle w:val="af"/>
@@ -802,7 +802,7 @@
             <w:noProof/>
             <w:webHidden/>
           </w:rPr>
-          <w:instrText xml:space="preserve"> PAGEREF _Toc241952857 \h </w:instrText>
+          <w:instrText xml:space="preserve"> PAGEREF _Toc242009807 \h </w:instrText>
         </w:r>
         <w:r>
           <w:rPr>
@@ -843,7 +843,7 @@
           <w:noProof/>
         </w:rPr>
       </w:pPr>
-      <w:hyperlink w:anchor="_Toc241952858" w:history="1">
+      <w:hyperlink w:anchor="_Toc242009808" w:history="1">
         <w:r>
           <w:rPr>
             <w:rStyle w:val="af"/>
@@ -880,7 +880,7 @@
             <w:noProof/>
             <w:webHidden/>
           </w:rPr>
-          <w:instrText xml:space="preserve"> PAGEREF _Toc241952858 \h </w:instrText>
+          <w:instrText xml:space="preserve"> PAGEREF _Toc242009808 \h </w:instrText>
         </w:r>
         <w:r>
           <w:rPr>
@@ -921,7 +921,7 @@
           <w:noProof/>
         </w:rPr>
       </w:pPr>
-      <w:hyperlink w:anchor="_Toc241952859" w:history="1">
+      <w:hyperlink w:anchor="_Toc242009809" w:history="1">
         <w:r>
           <w:rPr>
             <w:rStyle w:val="af"/>
@@ -949,7 +949,7 @@
             <w:noProof/>
             <w:webHidden/>
           </w:rPr>
-          <w:instrText xml:space="preserve"> PAGEREF _Toc241952859 \h </w:instrText>
+          <w:instrText xml:space="preserve"> PAGEREF _Toc242009809 \h </w:instrText>
         </w:r>
         <w:r>
           <w:rPr>
@@ -990,7 +990,7 @@
           <w:noProof/>
         </w:rPr>
       </w:pPr>
-      <w:hyperlink w:anchor="_Toc241952860" w:history="1">
+      <w:hyperlink w:anchor="_Toc242009810" w:history="1">
         <w:r>
           <w:rPr>
             <w:rStyle w:val="af"/>
@@ -1018,7 +1018,7 @@
             <w:noProof/>
             <w:webHidden/>
           </w:rPr>
-          <w:instrText xml:space="preserve"> PAGEREF _Toc241952860 \h </w:instrText>
+          <w:instrText xml:space="preserve"> PAGEREF _Toc242009810 \h </w:instrText>
         </w:r>
         <w:r>
           <w:rPr>
@@ -1059,7 +1059,7 @@
           <w:noProof/>
         </w:rPr>
       </w:pPr>
-      <w:hyperlink w:anchor="_Toc241952861" w:history="1">
+      <w:hyperlink w:anchor="_Toc242009811" w:history="1">
         <w:r>
           <w:rPr>
             <w:rStyle w:val="af"/>
@@ -1087,7 +1087,7 @@
             <w:noProof/>
             <w:webHidden/>
           </w:rPr>
-          <w:instrText xml:space="preserve"> PAGEREF _Toc241952861 \h </w:instrText>
+          <w:instrText xml:space="preserve"> PAGEREF _Toc242009811 \h </w:instrText>
         </w:r>
         <w:r>
           <w:rPr>
@@ -1128,7 +1128,7 @@
           <w:noProof/>
         </w:rPr>
       </w:pPr>
-      <w:hyperlink w:anchor="_Toc241952862" w:history="1">
+      <w:hyperlink w:anchor="_Toc242009812" w:history="1">
         <w:r>
           <w:rPr>
             <w:rStyle w:val="af"/>
@@ -1156,7 +1156,7 @@
             <w:noProof/>
             <w:webHidden/>
           </w:rPr>
-          <w:instrText xml:space="preserve"> PAGEREF _Toc241952862 \h </w:instrText>
+          <w:instrText xml:space="preserve"> PAGEREF _Toc242009812 \h </w:instrText>
         </w:r>
         <w:r>
           <w:rPr>
@@ -1197,7 +1197,7 @@
           <w:noProof/>
         </w:rPr>
       </w:pPr>
-      <w:hyperlink w:anchor="_Toc241952863" w:history="1">
+      <w:hyperlink w:anchor="_Toc242009813" w:history="1">
         <w:r>
           <w:rPr>
             <w:rStyle w:val="af"/>
@@ -1225,7 +1225,7 @@
             <w:noProof/>
             <w:webHidden/>
           </w:rPr>
-          <w:instrText xml:space="preserve"> PAGEREF _Toc241952863 \h </w:instrText>
+          <w:instrText xml:space="preserve"> PAGEREF _Toc242009813 \h </w:instrText>
         </w:r>
         <w:r>
           <w:rPr>
@@ -1266,7 +1266,7 @@
           <w:noProof/>
         </w:rPr>
       </w:pPr>
-      <w:hyperlink w:anchor="_Toc241952864" w:history="1">
+      <w:hyperlink w:anchor="_Toc242009814" w:history="1">
         <w:r>
           <w:rPr>
             <w:rStyle w:val="af"/>
@@ -1294,7 +1294,7 @@
             <w:noProof/>
             <w:webHidden/>
           </w:rPr>
-          <w:instrText xml:space="preserve"> PAGEREF _Toc241952864 \h </w:instrText>
+          <w:instrText xml:space="preserve"> PAGEREF _Toc242009814 \h </w:instrText>
         </w:r>
         <w:r>
           <w:rPr>
@@ -1335,7 +1335,7 @@
           <w:noProof/>
         </w:rPr>
       </w:pPr>
-      <w:hyperlink w:anchor="_Toc241952865" w:history="1">
+      <w:hyperlink w:anchor="_Toc242009815" w:history="1">
         <w:r>
           <w:rPr>
             <w:rStyle w:val="af"/>
@@ -1363,7 +1363,7 @@
             <w:noProof/>
             <w:webHidden/>
           </w:rPr>
-          <w:instrText xml:space="preserve"> PAGEREF _Toc241952865 \h </w:instrText>
+          <w:instrText xml:space="preserve"> PAGEREF _Toc242009815 \h </w:instrText>
         </w:r>
         <w:r>
           <w:rPr>
@@ -1404,7 +1404,7 @@
           <w:noProof/>
         </w:rPr>
       </w:pPr>
-      <w:hyperlink w:anchor="_Toc241952866" w:history="1">
+      <w:hyperlink w:anchor="_Toc242009816" w:history="1">
         <w:r>
           <w:rPr>
             <w:rStyle w:val="af"/>
@@ -1432,7 +1432,7 @@
             <w:noProof/>
             <w:webHidden/>
           </w:rPr>
-          <w:instrText xml:space="preserve"> PAGEREF _Toc241952866 \h </w:instrText>
+          <w:instrText xml:space="preserve"> PAGEREF _Toc242009816 \h </w:instrText>
         </w:r>
         <w:r>
           <w:rPr>
@@ -1473,7 +1473,7 @@
           <w:noProof/>
         </w:rPr>
       </w:pPr>
-      <w:hyperlink w:anchor="_Toc241952867" w:history="1">
+      <w:hyperlink w:anchor="_Toc242009817" w:history="1">
         <w:r>
           <w:rPr>
             <w:rStyle w:val="af"/>
@@ -1501,7 +1501,7 @@
             <w:noProof/>
             <w:webHidden/>
           </w:rPr>
-          <w:instrText xml:space="preserve"> PAGEREF _Toc241952867 \h </w:instrText>
+          <w:instrText xml:space="preserve"> PAGEREF _Toc242009817 \h </w:instrText>
         </w:r>
         <w:r>
           <w:rPr>
@@ -1542,7 +1542,7 @@
           <w:noProof/>
         </w:rPr>
       </w:pPr>
-      <w:hyperlink w:anchor="_Toc241952868" w:history="1">
+      <w:hyperlink w:anchor="_Toc242009818" w:history="1">
         <w:r>
           <w:rPr>
             <w:rStyle w:val="af"/>
@@ -1570,7 +1570,7 @@
             <w:noProof/>
             <w:webHidden/>
           </w:rPr>
-          <w:instrText xml:space="preserve"> PAGEREF _Toc241952868 \h </w:instrText>
+          <w:instrText xml:space="preserve"> PAGEREF _Toc242009818 \h </w:instrText>
         </w:r>
         <w:r>
           <w:rPr>
@@ -1590,7 +1590,7 @@
             <w:noProof/>
             <w:webHidden/>
           </w:rPr>
-          <w:t>27</w:t>
+          <w:t>28</w:t>
         </w:r>
         <w:r>
           <w:rPr>
@@ -1611,7 +1611,7 @@
           <w:noProof/>
         </w:rPr>
       </w:pPr>
-      <w:hyperlink w:anchor="_Toc241952869" w:history="1">
+      <w:hyperlink w:anchor="_Toc242009819" w:history="1">
         <w:r>
           <w:rPr>
             <w:rStyle w:val="af"/>
@@ -1639,7 +1639,7 @@
             <w:noProof/>
             <w:webHidden/>
           </w:rPr>
-          <w:instrText xml:space="preserve"> PAGEREF _Toc241952869 \h </w:instrText>
+          <w:instrText xml:space="preserve"> PAGEREF _Toc242009819 \h </w:instrText>
         </w:r>
         <w:r>
           <w:rPr>
@@ -1659,7 +1659,7 @@
             <w:noProof/>
             <w:webHidden/>
           </w:rPr>
-          <w:t>29</w:t>
+          <w:t>30</w:t>
         </w:r>
         <w:r>
           <w:rPr>
@@ -1680,7 +1680,7 @@
           <w:noProof/>
         </w:rPr>
       </w:pPr>
-      <w:hyperlink w:anchor="_Toc241952870" w:history="1">
+      <w:hyperlink w:anchor="_Toc242009820" w:history="1">
         <w:r>
           <w:rPr>
             <w:rStyle w:val="af"/>
@@ -1708,76 +1708,7 @@
             <w:noProof/>
             <w:webHidden/>
           </w:rPr>
-          <w:instrText xml:space="preserve"> PAGEREF _Toc241952870 \h </w:instrText>
-        </w:r>
-        <w:r>
-          <w:rPr>
-            <w:noProof/>
-            <w:webHidden/>
-          </w:rPr>
-        </w:r>
-        <w:r>
-          <w:rPr>
-            <w:noProof/>
-            <w:webHidden/>
-          </w:rPr>
-          <w:fldChar w:fldCharType="separate"/>
-        </w:r>
-        <w:r>
-          <w:rPr>
-            <w:noProof/>
-            <w:webHidden/>
-          </w:rPr>
-          <w:t>31</w:t>
-        </w:r>
-        <w:r>
-          <w:rPr>
-            <w:noProof/>
-            <w:webHidden/>
-          </w:rPr>
-          <w:fldChar w:fldCharType="end"/>
-        </w:r>
-      </w:hyperlink>
-    </w:p>
-    <w:p>
-      <w:pPr>
-        <w:pStyle w:val="12"/>
-        <w:tabs>
-          <w:tab w:val="right" w:leader="dot" w:pos="9345"/>
-        </w:tabs>
-        <w:rPr>
-          <w:noProof/>
-        </w:rPr>
-      </w:pPr>
-      <w:hyperlink w:anchor="_Toc241952871" w:history="1">
-        <w:r>
-          <w:rPr>
-            <w:rStyle w:val="af"/>
-            <w:b/>
-            <w:noProof/>
-          </w:rPr>
-          <w:t>ПРИЛОЖЕНИЕ Г</w:t>
-        </w:r>
-        <w:r>
-          <w:rPr>
-            <w:noProof/>
-            <w:webHidden/>
-          </w:rPr>
-          <w:tab/>
-        </w:r>
-        <w:r>
-          <w:rPr>
-            <w:noProof/>
-            <w:webHidden/>
-          </w:rPr>
-          <w:fldChar w:fldCharType="begin"/>
-        </w:r>
-        <w:r>
-          <w:rPr>
-            <w:noProof/>
-            <w:webHidden/>
-          </w:rPr>
-          <w:instrText xml:space="preserve"> PAGEREF _Toc241952871 \h </w:instrText>
+          <w:instrText xml:space="preserve"> PAGEREF _Toc242009820 \h </w:instrText>
         </w:r>
         <w:r>
           <w:rPr>
@@ -1818,7 +1749,76 @@
           <w:noProof/>
         </w:rPr>
       </w:pPr>
-      <w:hyperlink w:anchor="_Toc241952872" w:history="1">
+      <w:hyperlink w:anchor="_Toc242009821" w:history="1">
+        <w:r>
+          <w:rPr>
+            <w:rStyle w:val="af"/>
+            <w:b/>
+            <w:noProof/>
+          </w:rPr>
+          <w:t>ПРИЛОЖЕНИЕ Г</w:t>
+        </w:r>
+        <w:r>
+          <w:rPr>
+            <w:noProof/>
+            <w:webHidden/>
+          </w:rPr>
+          <w:tab/>
+        </w:r>
+        <w:r>
+          <w:rPr>
+            <w:noProof/>
+            <w:webHidden/>
+          </w:rPr>
+          <w:fldChar w:fldCharType="begin"/>
+        </w:r>
+        <w:r>
+          <w:rPr>
+            <w:noProof/>
+            <w:webHidden/>
+          </w:rPr>
+          <w:instrText xml:space="preserve"> PAGEREF _Toc242009821 \h </w:instrText>
+        </w:r>
+        <w:r>
+          <w:rPr>
+            <w:noProof/>
+            <w:webHidden/>
+          </w:rPr>
+        </w:r>
+        <w:r>
+          <w:rPr>
+            <w:noProof/>
+            <w:webHidden/>
+          </w:rPr>
+          <w:fldChar w:fldCharType="separate"/>
+        </w:r>
+        <w:r>
+          <w:rPr>
+            <w:noProof/>
+            <w:webHidden/>
+          </w:rPr>
+          <w:t>33</w:t>
+        </w:r>
+        <w:r>
+          <w:rPr>
+            <w:noProof/>
+            <w:webHidden/>
+          </w:rPr>
+          <w:fldChar w:fldCharType="end"/>
+        </w:r>
+      </w:hyperlink>
+    </w:p>
+    <w:p>
+      <w:pPr>
+        <w:pStyle w:val="12"/>
+        <w:tabs>
+          <w:tab w:val="right" w:leader="dot" w:pos="9345"/>
+        </w:tabs>
+        <w:rPr>
+          <w:noProof/>
+        </w:rPr>
+      </w:pPr>
+      <w:hyperlink w:anchor="_Toc242009822" w:history="1">
         <w:r>
           <w:rPr>
             <w:rStyle w:val="af"/>
@@ -1846,7 +1846,7 @@
             <w:noProof/>
             <w:webHidden/>
           </w:rPr>
-          <w:instrText xml:space="preserve"> PAGEREF _Toc241952872 \h </w:instrText>
+          <w:instrText xml:space="preserve"> PAGEREF _Toc242009822 \h </w:instrText>
         </w:r>
         <w:r>
           <w:rPr>
@@ -1866,7 +1866,7 @@
             <w:noProof/>
             <w:webHidden/>
           </w:rPr>
-          <w:t>34</w:t>
+          <w:t>35</w:t>
         </w:r>
         <w:r>
           <w:rPr>
@@ -1892,7 +1892,7 @@
         <w:spacing w:before="0" w:after="360" w:line="360" w:lineRule="exact"/>
         <w:ind w:firstLine="709"/>
       </w:pPr>
-      <w:bookmarkStart w:id="1" w:name="_Toc241952850"/>
+      <w:bookmarkStart w:id="1" w:name="_Toc242009800"/>
       <w:r>
         <w:rPr>
           <w:b/>
@@ -2198,7 +2198,7 @@
         <w:ind w:firstLine="709"/>
       </w:pPr>
       <w:bookmarkStart w:id="2" w:name="_b608aa976fc82a0faaf3b83f58c735968afd03b"/>
-      <w:bookmarkStart w:id="3" w:name="_Toc241952851"/>
+      <w:bookmarkStart w:id="3" w:name="_Toc242009801"/>
       <w:bookmarkEnd w:id="0"/>
       <w:r>
         <w:rPr>
@@ -2276,7 +2276,7 @@
         <w:ind w:firstLine="709"/>
       </w:pPr>
       <w:bookmarkStart w:id="4" w:name="_6ea6bf0a5ec92c733c53e44899cf0806bdc5e39"/>
-      <w:bookmarkStart w:id="5" w:name="_Toc241952852"/>
+      <w:bookmarkStart w:id="5" w:name="_Toc242009802"/>
       <w:r>
         <w:rPr>
           <w:b/>
@@ -3232,7 +3232,7 @@
         <w:ind w:firstLine="709"/>
       </w:pPr>
       <w:bookmarkStart w:id="6" w:name="_7a0c967539b5ef143597c37b0951dae8b296890"/>
-      <w:bookmarkStart w:id="7" w:name="_Toc241952853"/>
+      <w:bookmarkStart w:id="7" w:name="_Toc242009803"/>
       <w:bookmarkEnd w:id="4"/>
       <w:r>
         <w:rPr>
@@ -5665,7 +5665,7 @@
           <w:sz w:val="28"/>
         </w:rPr>
         <w:drawing>
-          <wp:inline distT="0" distB="0" distL="0" distR="0" wp14:anchorId="16021BAE" wp14:editId="69EC9396">
+          <wp:inline distT="0" distB="0" distL="0" distR="0" wp14:anchorId="0FDBEFED" wp14:editId="03900B2D">
             <wp:extent cx="5334000" cy="3122341"/>
             <wp:effectExtent l="0" t="0" r="0" b="0"/>
             <wp:docPr id="12" name="Picture"/>
@@ -6476,7 +6476,7 @@
           <w:sz w:val="28"/>
         </w:rPr>
         <w:drawing>
-          <wp:inline distT="0" distB="0" distL="0" distR="0" wp14:anchorId="33E6D63B" wp14:editId="39B56F20">
+          <wp:inline distT="0" distB="0" distL="0" distR="0" wp14:anchorId="48097A0A" wp14:editId="2E9BB06B">
             <wp:extent cx="5334000" cy="3252439"/>
             <wp:effectExtent l="0" t="0" r="0" b="0"/>
             <wp:docPr id="15" name="Picture"/>
@@ -6637,7 +6637,7 @@
         <w:ind w:firstLine="709"/>
       </w:pPr>
       <w:bookmarkStart w:id="8" w:name="_da959056159f19dff160d665d57702b18af1ddd"/>
-      <w:bookmarkStart w:id="9" w:name="_Toc241952854"/>
+      <w:bookmarkStart w:id="9" w:name="_Toc242009804"/>
       <w:bookmarkEnd w:id="6"/>
       <w:r>
         <w:rPr>
@@ -9765,7 +9765,7 @@
         <w:ind w:firstLine="709"/>
       </w:pPr>
       <w:bookmarkStart w:id="10" w:name="_06e2001e7574ebc77f8406bc11ca3db76d00c2a"/>
-      <w:bookmarkStart w:id="11" w:name="_Toc241952855"/>
+      <w:bookmarkStart w:id="11" w:name="_Toc242009805"/>
       <w:bookmarkEnd w:id="8"/>
       <w:r>
         <w:rPr>
@@ -10569,7 +10569,7 @@
         <w:ind w:firstLine="709"/>
       </w:pPr>
       <w:bookmarkStart w:id="12" w:name="_606fa79e4d4f49d8da929021c2a978685b741ea"/>
-      <w:bookmarkStart w:id="13" w:name="_Toc241952856"/>
+      <w:bookmarkStart w:id="13" w:name="_Toc242009806"/>
       <w:bookmarkEnd w:id="10"/>
       <w:r>
         <w:rPr>
@@ -13029,7 +13029,7 @@
         <w:ind w:firstLine="709"/>
       </w:pPr>
       <w:bookmarkStart w:id="14" w:name="_2314d5998da626860a70184e0b470b0b8504694"/>
-      <w:bookmarkStart w:id="15" w:name="_Toc241952857"/>
+      <w:bookmarkStart w:id="15" w:name="_Toc242009807"/>
       <w:bookmarkEnd w:id="12"/>
       <w:r>
         <w:rPr>
@@ -13657,7 +13657,7 @@
         <w:ind w:firstLine="709"/>
       </w:pPr>
       <w:bookmarkStart w:id="16" w:name="_42bac9f10c820a94a4112d44417ea6b5d14bf7d"/>
-      <w:bookmarkStart w:id="17" w:name="_Toc241952858"/>
+      <w:bookmarkStart w:id="17" w:name="_Toc242009808"/>
       <w:bookmarkEnd w:id="14"/>
       <w:r>
         <w:rPr>
@@ -15584,7 +15584,7 @@
         <w:ind w:firstLine="709"/>
       </w:pPr>
       <w:bookmarkStart w:id="18" w:name="_62882a27ae1c57302eff280b02701a311900947"/>
-      <w:bookmarkStart w:id="19" w:name="_Toc241952859"/>
+      <w:bookmarkStart w:id="19" w:name="_Toc242009809"/>
       <w:bookmarkEnd w:id="16"/>
       <w:r>
         <w:rPr>
@@ -16954,7 +16954,7 @@
         <w:ind w:firstLine="709"/>
       </w:pPr>
       <w:bookmarkStart w:id="20" w:name="_2c7ec3ecf17663584d0d27e07e31cbd2a0948cf"/>
-      <w:bookmarkStart w:id="21" w:name="_Toc241952860"/>
+      <w:bookmarkStart w:id="21" w:name="_Toc242009810"/>
       <w:bookmarkEnd w:id="18"/>
       <w:r>
         <w:rPr>
@@ -19290,7 +19290,7 @@
         <w:ind w:firstLine="709"/>
       </w:pPr>
       <w:bookmarkStart w:id="22" w:name="_8d34778965163a5752bc27698d1f7e786ff5c87"/>
-      <w:bookmarkStart w:id="23" w:name="_Toc241952861"/>
+      <w:bookmarkStart w:id="23" w:name="_Toc242009811"/>
       <w:bookmarkEnd w:id="20"/>
       <w:r>
         <w:rPr>
@@ -20439,7 +20439,7 @@
           <w:sz w:val="28"/>
         </w:rPr>
         <w:drawing>
-          <wp:inline distT="0" distB="0" distL="0" distR="0" wp14:anchorId="0074E25D" wp14:editId="1F1CC50E">
+          <wp:inline distT="0" distB="0" distL="0" distR="0" wp14:anchorId="25CBCA18" wp14:editId="1614D0AA">
             <wp:extent cx="5334000" cy="2992243"/>
             <wp:effectExtent l="0" t="0" r="0" b="0"/>
             <wp:docPr id="26" name="Picture"/>
@@ -21285,7 +21285,7 @@
           <w:sz w:val="28"/>
         </w:rPr>
         <w:drawing>
-          <wp:inline distT="0" distB="0" distL="0" distR="0" wp14:anchorId="2DC07790" wp14:editId="4BB7AD9C">
+          <wp:inline distT="0" distB="0" distL="0" distR="0" wp14:anchorId="3795CA59" wp14:editId="088081D7">
             <wp:extent cx="5334000" cy="2471853"/>
             <wp:effectExtent l="0" t="0" r="0" b="0"/>
             <wp:docPr id="29" name="Picture"/>
@@ -21777,7 +21777,7 @@
         <w:ind w:firstLine="709"/>
       </w:pPr>
       <w:bookmarkStart w:id="24" w:name="_e6e1aac57bb528344b9009e4599364161f48047"/>
-      <w:bookmarkStart w:id="25" w:name="_Toc241952862"/>
+      <w:bookmarkStart w:id="25" w:name="_Toc242009812"/>
       <w:bookmarkEnd w:id="22"/>
       <w:r>
         <w:rPr>
@@ -22695,7 +22695,7 @@
           <w:sz w:val="28"/>
         </w:rPr>
         <w:drawing>
-          <wp:inline distT="0" distB="0" distL="0" distR="0" wp14:anchorId="608C1725" wp14:editId="7960C3F3">
+          <wp:inline distT="0" distB="0" distL="0" distR="0" wp14:anchorId="4501CFD9" wp14:editId="718FA141">
             <wp:extent cx="5334000" cy="2341756"/>
             <wp:effectExtent l="0" t="0" r="0" b="0"/>
             <wp:docPr id="33" name="Picture"/>
@@ -22926,7 +22926,7 @@
         <w:ind w:firstLine="709"/>
       </w:pPr>
       <w:bookmarkStart w:id="26" w:name="_6a64c25cd48aeb5a2bf3dc411d56d805a6b5d7e"/>
-      <w:bookmarkStart w:id="27" w:name="_Toc241952863"/>
+      <w:bookmarkStart w:id="27" w:name="_Toc242009813"/>
       <w:bookmarkEnd w:id="24"/>
       <w:r>
         <w:rPr>
@@ -22985,7 +22985,7 @@
         </w:rPr>
         <w:lastRenderedPageBreak/>
         <w:drawing>
-          <wp:inline distT="0" distB="0" distL="0" distR="0" wp14:anchorId="104A357F" wp14:editId="09F2F220">
+          <wp:inline distT="0" distB="0" distL="0" distR="0" wp14:anchorId="2E2A2A42" wp14:editId="22A3F255">
             <wp:extent cx="5334000" cy="2471853"/>
             <wp:effectExtent l="0" t="0" r="0" b="0"/>
             <wp:docPr id="37" name="Picture"/>
@@ -23210,7 +23210,7 @@
         <w:ind w:firstLine="709"/>
       </w:pPr>
       <w:bookmarkStart w:id="28" w:name="_8cdf61ec50cc46d2aaeadce1b560fea28ea116e"/>
-      <w:bookmarkStart w:id="29" w:name="_Toc241952864"/>
+      <w:bookmarkStart w:id="29" w:name="_Toc242009814"/>
       <w:bookmarkEnd w:id="26"/>
       <w:r>
         <w:rPr>
@@ -23326,7 +23326,7 @@
         <w:ind w:firstLine="709"/>
       </w:pPr>
       <w:bookmarkStart w:id="30" w:name="_1bfdad9d2d88ddb6ca16c31c1d4d4943679f32f"/>
-      <w:bookmarkStart w:id="31" w:name="_Toc241952865"/>
+      <w:bookmarkStart w:id="31" w:name="_Toc242009815"/>
       <w:bookmarkEnd w:id="28"/>
       <w:bookmarkEnd w:id="2"/>
       <w:r>
@@ -23864,7 +23864,7 @@
         <w:jc w:val="center"/>
       </w:pPr>
       <w:bookmarkStart w:id="32" w:name="_выводы"/>
-      <w:bookmarkStart w:id="33" w:name="_Toc241952866"/>
+      <w:bookmarkStart w:id="33" w:name="_Toc242009816"/>
       <w:bookmarkEnd w:id="30"/>
       <w:r>
         <w:rPr>
@@ -24138,7 +24138,7 @@
         <w:jc w:val="center"/>
       </w:pPr>
       <w:bookmarkStart w:id="34" w:name="_274f6a444530ef90b0479dabf3d210f01e97699"/>
-      <w:bookmarkStart w:id="35" w:name="_Toc241952867"/>
+      <w:bookmarkStart w:id="35" w:name="_Toc242009817"/>
       <w:bookmarkEnd w:id="32"/>
       <w:r>
         <w:rPr>
@@ -26161,6 +26161,167 @@
     </w:p>
     <w:p>
       <w:pPr>
+        <w:pStyle w:val="FirstParagraph"/>
+        <w:numPr>
+          <w:ilvl w:val="0"/>
+          <w:numId w:val="3"/>
+        </w:numPr>
+        <w:spacing w:before="0" w:after="0" w:line="360" w:lineRule="exact"/>
+        <w:ind w:left="709" w:hanging="425"/>
+        <w:jc w:val="both"/>
+      </w:pPr>
+      <w:r>
+        <w:rPr>
+          <w:i/>
+          <w:sz w:val="28"/>
+        </w:rPr>
+        <w:t>Vendr</w:t>
+      </w:r>
+      <w:r>
+        <w:rPr>
+          <w:sz w:val="28"/>
+        </w:rPr>
+        <w:t xml:space="preserve">. </w:t>
+      </w:r>
+      <w:r>
+        <w:rPr>
+          <w:i/>
+          <w:sz w:val="28"/>
+        </w:rPr>
+        <w:t>DataRails</w:t>
+      </w:r>
+      <w:r>
+        <w:rPr>
+          <w:sz w:val="28"/>
+        </w:rPr>
+        <w:t xml:space="preserve"> </w:t>
+      </w:r>
+      <w:r>
+        <w:rPr>
+          <w:i/>
+          <w:sz w:val="28"/>
+        </w:rPr>
+        <w:t>Software</w:t>
+      </w:r>
+      <w:r>
+        <w:rPr>
+          <w:sz w:val="28"/>
+        </w:rPr>
+        <w:t xml:space="preserve"> </w:t>
+      </w:r>
+      <w:r>
+        <w:rPr>
+          <w:i/>
+          <w:sz w:val="28"/>
+        </w:rPr>
+        <w:t>Pricing</w:t>
+      </w:r>
+      <w:r>
+        <w:rPr>
+          <w:sz w:val="28"/>
+        </w:rPr>
+        <w:t xml:space="preserve"> &amp; </w:t>
+      </w:r>
+      <w:r>
+        <w:rPr>
+          <w:i/>
+          <w:sz w:val="28"/>
+        </w:rPr>
+        <w:t>Plans</w:t>
+      </w:r>
+      <w:r>
+        <w:rPr>
+          <w:sz w:val="28"/>
+        </w:rPr>
+        <w:t xml:space="preserve"> 2026 [Электронный ресурс]. – Режим доступа: https://www.vendr.com/marketplace/datarails. – Дата доступ</w:t>
+      </w:r>
+      <w:r>
+        <w:rPr>
+          <w:sz w:val="28"/>
+        </w:rPr>
+        <w:t>а: 04.10.2026.</w:t>
+      </w:r>
+    </w:p>
+    <w:p>
+      <w:pPr>
+        <w:pStyle w:val="FirstParagraph"/>
+        <w:numPr>
+          <w:ilvl w:val="0"/>
+          <w:numId w:val="3"/>
+        </w:numPr>
+        <w:spacing w:before="0" w:after="0" w:line="360" w:lineRule="exact"/>
+        <w:ind w:left="709" w:hanging="425"/>
+        <w:jc w:val="both"/>
+      </w:pPr>
+      <w:r>
+        <w:rPr>
+          <w:i/>
+          <w:sz w:val="28"/>
+        </w:rPr>
+        <w:lastRenderedPageBreak/>
+        <w:t>Sacra</w:t>
+      </w:r>
+      <w:r>
+        <w:rPr>
+          <w:sz w:val="28"/>
+        </w:rPr>
+        <w:t xml:space="preserve">. </w:t>
+      </w:r>
+      <w:r>
+        <w:rPr>
+          <w:i/>
+          <w:sz w:val="28"/>
+        </w:rPr>
+        <w:t>DataSnipper</w:t>
+      </w:r>
+      <w:r>
+        <w:rPr>
+          <w:sz w:val="28"/>
+        </w:rPr>
+        <w:t xml:space="preserve"> </w:t>
+      </w:r>
+      <w:r>
+        <w:rPr>
+          <w:i/>
+          <w:sz w:val="28"/>
+        </w:rPr>
+        <w:t>revenue</w:t>
+      </w:r>
+      <w:r>
+        <w:rPr>
+          <w:sz w:val="28"/>
+        </w:rPr>
+        <w:t xml:space="preserve">, </w:t>
+      </w:r>
+      <w:r>
+        <w:rPr>
+          <w:i/>
+          <w:sz w:val="28"/>
+        </w:rPr>
+        <w:t>valuation</w:t>
+      </w:r>
+      <w:r>
+        <w:rPr>
+          <w:sz w:val="28"/>
+        </w:rPr>
+        <w:t xml:space="preserve"> &amp; </w:t>
+      </w:r>
+      <w:r>
+        <w:rPr>
+          <w:i/>
+          <w:sz w:val="28"/>
+        </w:rPr>
+        <w:t>funding</w:t>
+      </w:r>
+      <w:r>
+        <w:rPr>
+          <w:sz w:val="28"/>
+        </w:rPr>
+        <w:t xml:space="preserve"> [Электронный ресурс]. – Режим доступа: https://sacra.com/c/datasnipper/. – Дата доступа: 04.10.2026.</w:t>
+      </w:r>
+    </w:p>
+    <w:p>
+      <w:pPr>
         <w:pStyle w:val="1"/>
         <w:keepNext w:val="0"/>
         <w:pageBreakBefore/>
@@ -26168,7 +26329,7 @@
         <w:jc w:val="center"/>
       </w:pPr>
       <w:bookmarkStart w:id="36" w:name="_3d74faf1500c1b2a4a8bfa8e0e37c74206ce73d"/>
-      <w:bookmarkStart w:id="37" w:name="_Toc241952868"/>
+      <w:bookmarkStart w:id="37" w:name="_Toc242009818"/>
       <w:bookmarkEnd w:id="34"/>
       <w:r>
         <w:rPr>
@@ -26216,13 +26377,13 @@
         <w:rPr>
           <w:sz w:val="28"/>
         </w:rPr>
-        <w:t>В приложении собраны допущения, добавленные в ЛР2-3 к допущениям Д-01…Д-08 из ЛР1. Каж</w:t>
-      </w:r>
-      <w:r>
-        <w:rPr>
-          <w:sz w:val="28"/>
-        </w:rPr>
-        <w:t>дое допущение указывает значение, обоснование и влияние на результат.</w:t>
+        <w:t>В приложении собраны допущения, до</w:t>
+      </w:r>
+      <w:r>
+        <w:rPr>
+          <w:sz w:val="28"/>
+        </w:rPr>
+        <w:t>бавленные в ЛР2-3 к допущениям Д-01…Д-08 из ЛР1. Каждое допущение указывает значение, обоснование и влияние на результат.</w:t>
       </w:r>
     </w:p>
     <w:p>
@@ -26942,13 +27103,7 @@
               <w:rPr>
                 <w:sz w:val="24"/>
               </w:rPr>
-              <w:t xml:space="preserve">визит-регистрация 2/4/7 %, </w:t>
-            </w:r>
-            <w:r>
-              <w:rPr>
-                <w:sz w:val="24"/>
-              </w:rPr>
-              <w:t>регистрация-платящий 3/5/8 %, доля трафика 0,5/1,5/4 %</w:t>
+              <w:t>визит-регистрация 2/4/7 %, регистрация-платящий 3/5/8 %, доля трафика 0,5/1,5/4 %</w:t>
             </w:r>
           </w:p>
         </w:tc>
@@ -27171,13 +27326,7 @@
               <w:rPr>
                 <w:sz w:val="24"/>
               </w:rPr>
-              <w:t>расширить сп</w:t>
-            </w:r>
-            <w:r>
-              <w:rPr>
-                <w:sz w:val="24"/>
-              </w:rPr>
-              <w:t>исок (похожие сайты)</w:t>
+              <w:t>расширить список (похожие сайты)</w:t>
             </w:r>
           </w:p>
         </w:tc>
@@ -27515,7 +27664,13 @@
               <w:rPr>
                 <w:sz w:val="24"/>
               </w:rPr>
-              <w:t>учтены только пять крупнейших стран сайта</w:t>
+              <w:t>учтены только пять крупнейших ст</w:t>
+            </w:r>
+            <w:r>
+              <w:rPr>
+                <w:sz w:val="24"/>
+              </w:rPr>
+              <w:t>ран сайта</w:t>
             </w:r>
           </w:p>
         </w:tc>
@@ -27634,7 +27789,7 @@
         <w:jc w:val="center"/>
       </w:pPr>
       <w:bookmarkStart w:id="38" w:name="_25083b51e17d9d99817d1269b6af13d75b604a4"/>
-      <w:bookmarkStart w:id="39" w:name="_Toc241952869"/>
+      <w:bookmarkStart w:id="39" w:name="_Toc242009819"/>
       <w:bookmarkEnd w:id="36"/>
       <w:r>
         <w:rPr>
@@ -27947,14 +28102,7 @@
                 <w:i/>
                 <w:sz w:val="24"/>
               </w:rPr>
-              <w:t>m</w:t>
-            </w:r>
-            <w:r>
-              <w:rPr>
-                <w:i/>
-                <w:sz w:val="24"/>
-              </w:rPr>
-              <w:t>acabacus.com</w:t>
+              <w:t>macabacus.com</w:t>
             </w:r>
             <w:r>
               <w:rPr>
@@ -28236,7 +28384,13 @@
               <w:rPr>
                 <w:sz w:val="24"/>
               </w:rPr>
-              <w:t>, поэтому 3 % принято как верхняя оценка (допущение Д-14)</w:t>
+              <w:t xml:space="preserve">, поэтому 3 % </w:t>
+            </w:r>
+            <w:r>
+              <w:rPr>
+                <w:sz w:val="24"/>
+              </w:rPr>
+              <w:t>принято как верхняя оценка (допущение Д-14)</w:t>
             </w:r>
           </w:p>
         </w:tc>
@@ -28299,13 +28453,7 @@
               <w:rPr>
                 <w:sz w:val="24"/>
               </w:rPr>
-              <w:t>Ц</w:t>
-            </w:r>
-            <w:r>
-              <w:rPr>
-                <w:sz w:val="24"/>
-              </w:rPr>
-              <w:t>ены конкурентов</w:t>
+              <w:t>Цены конкурентов</w:t>
             </w:r>
           </w:p>
         </w:tc>
@@ -28598,7 +28746,14 @@
                 <w:i/>
                 <w:sz w:val="24"/>
               </w:rPr>
-              <w:t>MVP</w:t>
+              <w:t>MV</w:t>
+            </w:r>
+            <w:r>
+              <w:rPr>
+                <w:i/>
+                <w:sz w:val="24"/>
+              </w:rPr>
+              <w:t>P</w:t>
             </w:r>
             <w:r>
               <w:rPr>
@@ -28795,13 +28950,7 @@
         <w:rPr>
           <w:sz w:val="28"/>
         </w:rPr>
-        <w:t xml:space="preserve">Для каждого элемента принято решение; оценки остаются диапазонами с низкой и средней надежностью, что отражено </w:t>
-      </w:r>
-      <w:r>
-        <w:rPr>
-          <w:sz w:val="28"/>
-        </w:rPr>
-        <w:t xml:space="preserve">в диапазонах </w:t>
+        <w:t xml:space="preserve">Для каждого элемента принято решение; оценки остаются диапазонами с низкой и средней надежностью, что отражено в диапазонах </w:t>
       </w:r>
       <w:r>
         <w:rPr>
@@ -28852,7 +29001,7 @@
         <w:jc w:val="center"/>
       </w:pPr>
       <w:bookmarkStart w:id="40" w:name="_cb59224a7032ef66ab429e7df9b4e4c597bc187"/>
-      <w:bookmarkStart w:id="41" w:name="_Toc241952870"/>
+      <w:bookmarkStart w:id="41" w:name="_Toc242009820"/>
       <w:bookmarkEnd w:id="38"/>
       <w:r>
         <w:rPr>
@@ -28913,7 +29062,13 @@
         <w:rPr>
           <w:sz w:val="28"/>
         </w:rPr>
-        <w:t xml:space="preserve"> выявлены ошибки и неудобства. Ниже перечислено, что изменено, чтобы расчет был корректным; оригиналы шаблонов не изменялись, работа велась с копиями.</w:t>
+        <w:t xml:space="preserve"> выявлены ошибки и неудобства. Ниже пер</w:t>
+      </w:r>
+      <w:r>
+        <w:rPr>
+          <w:sz w:val="28"/>
+        </w:rPr>
+        <w:t>ечислено, что изменено, чтобы расчет был корректным; оригиналы шаблонов не изменялись, работа велась с копиями.</w:t>
       </w:r>
     </w:p>
     <w:p>
@@ -29468,7 +29623,13 @@
               <w:rPr>
                 <w:sz w:val="24"/>
               </w:rPr>
-              <w:t>минимум, среднее и максимум включали платформенную строку, которая не является выручкой нового бизнеса</w:t>
+              <w:t>минимум, среднее и максимум включали платформенную строку, которая не является выручкой но</w:t>
+            </w:r>
+            <w:r>
+              <w:rPr>
+                <w:sz w:val="24"/>
+              </w:rPr>
+              <w:t>вого бизнеса</w:t>
             </w:r>
           </w:p>
         </w:tc>
@@ -29690,13 +29851,7 @@
               <w:rPr>
                 <w:sz w:val="24"/>
               </w:rPr>
-              <w:t>, демонстрационные данные замене</w:t>
-            </w:r>
-            <w:r>
-              <w:rPr>
-                <w:sz w:val="24"/>
-              </w:rPr>
-              <w:t xml:space="preserve">ны данными </w:t>
+              <w:t xml:space="preserve">, демонстрационные данные заменены данными </w:t>
             </w:r>
             <w:r>
               <w:rPr>
@@ -29747,7 +29902,13 @@
               <w:rPr>
                 <w:sz w:val="24"/>
               </w:rPr>
-              <w:t>Потенциальные клиенты, цифровая воронка, платежеспособность</w:t>
+              <w:t>Потенциальные клиенты, цифровая воронка</w:t>
+            </w:r>
+            <w:r>
+              <w:rPr>
+                <w:sz w:val="24"/>
+              </w:rPr>
+              <w:t>, платежеспособность</w:t>
             </w:r>
           </w:p>
         </w:tc>
@@ -29815,13 +29976,13 @@
         <w:rPr>
           <w:sz w:val="28"/>
         </w:rPr>
-        <w:t>Исправления 1-4 затрагивают корректность форму</w:t>
-      </w:r>
-      <w:r>
-        <w:rPr>
-          <w:sz w:val="28"/>
-        </w:rPr>
-        <w:t>л, остальные - содержание. После исправлений ошибок формул в книгах нет, а независимый пересчет подтверждает значения.</w:t>
+        <w:t>Исправления 1-4 затрагивают корректность формул, остальные - содержание. После исправлений ошибок формул в кн</w:t>
+      </w:r>
+      <w:r>
+        <w:rPr>
+          <w:sz w:val="28"/>
+        </w:rPr>
+        <w:t>игах нет, а независимый пересчет подтверждает значения.</w:t>
       </w:r>
     </w:p>
     <w:p>
@@ -29833,7 +29994,7 @@
         <w:jc w:val="center"/>
       </w:pPr>
       <w:bookmarkStart w:id="42" w:name="_48e9587881bbc300b26702bd6584ff263e735cf"/>
-      <w:bookmarkStart w:id="43" w:name="_Toc241952871"/>
+      <w:bookmarkStart w:id="43" w:name="_Toc242009821"/>
       <w:bookmarkEnd w:id="40"/>
       <w:r>
         <w:rPr>
@@ -29881,13 +30042,13 @@
         <w:rPr>
           <w:sz w:val="28"/>
         </w:rPr>
-        <w:t xml:space="preserve">Респондентов для опроса нет, поэтому по решению </w:t>
-      </w:r>
-      <w:r>
-        <w:rPr>
-          <w:sz w:val="28"/>
-        </w:rPr>
-        <w:t>автора (Р-8) данные сгенерированы по заданным параметрам: 30 условных респондентов в четырех сегментах, генератор и файлы лежат в папке 00_Общее/Опрос_модельный (</w:t>
+        <w:t xml:space="preserve">Респондентов для опроса нет, поэтому по решению автора (Р-8) данные сгенерированы по заданным параметрам: 30 </w:t>
+      </w:r>
+      <w:r>
+        <w:rPr>
+          <w:sz w:val="28"/>
+        </w:rPr>
+        <w:t>условных респондентов в четырех сегментах, генератор и файлы лежат в папке 00_Общее/Опрос_модельный (</w:t>
       </w:r>
       <w:r>
         <w:rPr>
@@ -29900,13 +30061,13 @@
         <w:rPr>
           <w:sz w:val="28"/>
         </w:rPr>
-        <w:t xml:space="preserve"> 20261003). Это модельные данные, а не результат опроса людей; они показывают порядок обра</w:t>
-      </w:r>
-      <w:r>
-        <w:rPr>
-          <w:sz w:val="28"/>
-        </w:rPr>
-        <w:t>ботки анкеты по методике и проверяют согласованность принятого ценового коридора, но не доказывают реальный спрос.</w:t>
+        <w:t xml:space="preserve"> 20261003). Это модельные данные, а не результат опроса людей; они показывают порядок обработки анкеты по методике и проверяют согласованность принятог</w:t>
+      </w:r>
+      <w:r>
+        <w:rPr>
+          <w:sz w:val="28"/>
+        </w:rPr>
+        <w:t>о ценового коридора, но не доказывают реальный спрос.</w:t>
       </w:r>
     </w:p>
     <w:p>
@@ -29946,13 +30107,7 @@
         <w:rPr>
           <w:sz w:val="28"/>
         </w:rPr>
-        <w:t>Таблица 24 – Модельные показатели ц</w:t>
-      </w:r>
-      <w:r>
-        <w:rPr>
-          <w:sz w:val="28"/>
-        </w:rPr>
-        <w:t xml:space="preserve">ены и готовности платить (Ван Вестендорп, подписка </w:t>
+        <w:t xml:space="preserve">Таблица 24 – Модельные показатели цены и готовности платить (Ван Вестендорп, подписка </w:t>
       </w:r>
       <w:r>
         <w:rPr>
@@ -30012,7 +30167,14 @@
                 <w:b/>
                 <w:sz w:val="24"/>
               </w:rPr>
-              <w:t>Показатель</w:t>
+              <w:t>Показ</w:t>
+            </w:r>
+            <w:r>
+              <w:rPr>
+                <w:b/>
+                <w:sz w:val="24"/>
+              </w:rPr>
+              <w:t>атель</w:t>
             </w:r>
           </w:p>
         </w:tc>
@@ -30540,13 +30702,7 @@
               <w:rPr>
                 <w:sz w:val="24"/>
               </w:rPr>
-              <w:t xml:space="preserve"> готов</w:t>
-            </w:r>
-            <w:r>
-              <w:rPr>
-                <w:sz w:val="24"/>
-              </w:rPr>
-              <w:t>ы платить 43 %</w:t>
+              <w:t xml:space="preserve"> готовы платить 43 %</w:t>
             </w:r>
           </w:p>
         </w:tc>
@@ -30571,7 +30727,13 @@
               <w:rPr>
                 <w:sz w:val="24"/>
               </w:rPr>
-              <w:t>Средняя готовность попробовать (1-5)</w:t>
+              <w:t>Средняя готовность попробовать (</w:t>
+            </w:r>
+            <w:r>
+              <w:rPr>
+                <w:sz w:val="24"/>
+              </w:rPr>
+              <w:t>1-5)</w:t>
             </w:r>
           </w:p>
         </w:tc>
@@ -30718,7 +30880,13 @@
         <w:rPr>
           <w:sz w:val="28"/>
         </w:rPr>
-        <w:t>В таблице 25 представлено: модельный выбор тарифа среди респондентов.</w:t>
+        <w:t>В таблице 25 представлено: модельный выбор тарифа с</w:t>
+      </w:r>
+      <w:r>
+        <w:rPr>
+          <w:sz w:val="28"/>
+        </w:rPr>
+        <w:t>реди респондентов.</w:t>
       </w:r>
     </w:p>
     <w:p>
@@ -31162,7 +31330,7 @@
         <w:jc w:val="center"/>
       </w:pPr>
       <w:bookmarkStart w:id="44" w:name="_494653d134221fdc43c135127d450c9af0a7c7d"/>
-      <w:bookmarkStart w:id="45" w:name="_Toc241952872"/>
+      <w:bookmarkStart w:id="45" w:name="_Toc242009822"/>
       <w:bookmarkEnd w:id="42"/>
       <w:r>
         <w:rPr>
@@ -31269,12 +31437,12 @@
         <w:tblLook w:val="0020" w:firstRow="1" w:lastRow="0" w:firstColumn="0" w:lastColumn="0" w:noHBand="0" w:noVBand="0"/>
       </w:tblPr>
       <w:tblGrid>
-        <w:gridCol w:w="580"/>
-        <w:gridCol w:w="1869"/>
-        <w:gridCol w:w="2162"/>
-        <w:gridCol w:w="1072"/>
-        <w:gridCol w:w="1767"/>
-        <w:gridCol w:w="1905"/>
+        <w:gridCol w:w="592"/>
+        <w:gridCol w:w="1873"/>
+        <w:gridCol w:w="2119"/>
+        <w:gridCol w:w="1094"/>
+        <w:gridCol w:w="1804"/>
+        <w:gridCol w:w="1873"/>
       </w:tblGrid>
       <w:tr>
         <w:trPr>
@@ -31285,7 +31453,7 @@
         </w:trPr>
         <w:tc>
           <w:tcPr>
-            <w:tcW w:w="579" w:type="dxa"/>
+            <w:tcW w:w="591" w:type="dxa"/>
             <w:vAlign w:val="center"/>
           </w:tcPr>
           <w:p>
@@ -31305,7 +31473,7 @@
         </w:tc>
         <w:tc>
           <w:tcPr>
-            <w:tcW w:w="1869" w:type="dxa"/>
+            <w:tcW w:w="1873" w:type="dxa"/>
             <w:vAlign w:val="center"/>
           </w:tcPr>
           <w:p>
@@ -31325,7 +31493,7 @@
         </w:tc>
         <w:tc>
           <w:tcPr>
-            <w:tcW w:w="2162" w:type="dxa"/>
+            <w:tcW w:w="2119" w:type="dxa"/>
             <w:vAlign w:val="center"/>
           </w:tcPr>
           <w:p>
@@ -31345,7 +31513,7 @@
         </w:tc>
         <w:tc>
           <w:tcPr>
-            <w:tcW w:w="1072" w:type="dxa"/>
+            <w:tcW w:w="1094" w:type="dxa"/>
             <w:vAlign w:val="center"/>
           </w:tcPr>
           <w:p>
@@ -31365,7 +31533,7 @@
         </w:tc>
         <w:tc>
           <w:tcPr>
-            <w:tcW w:w="1767" w:type="dxa"/>
+            <w:tcW w:w="1804" w:type="dxa"/>
             <w:vAlign w:val="center"/>
           </w:tcPr>
           <w:p>
@@ -31385,7 +31553,7 @@
         </w:tc>
         <w:tc>
           <w:tcPr>
-            <w:tcW w:w="1905" w:type="dxa"/>
+            <w:tcW w:w="1873" w:type="dxa"/>
             <w:vAlign w:val="center"/>
           </w:tcPr>
           <w:p>
@@ -31399,14 +31567,7 @@
                 <w:b/>
                 <w:sz w:val="24"/>
               </w:rPr>
-              <w:t>Влияние на расче</w:t>
-            </w:r>
-            <w:r>
-              <w:rPr>
-                <w:b/>
-                <w:sz w:val="24"/>
-              </w:rPr>
-              <w:t>т</w:t>
+              <w:t>Влияние на расчет</w:t>
             </w:r>
           </w:p>
         </w:tc>
@@ -31418,7 +31579,7 @@
         </w:trPr>
         <w:tc>
           <w:tcPr>
-            <w:tcW w:w="579" w:type="dxa"/>
+            <w:tcW w:w="591" w:type="dxa"/>
             <w:vAlign w:val="center"/>
           </w:tcPr>
           <w:p>
@@ -31437,7 +31598,7 @@
         </w:tc>
         <w:tc>
           <w:tcPr>
-            <w:tcW w:w="1869" w:type="dxa"/>
+            <w:tcW w:w="1873" w:type="dxa"/>
             <w:vAlign w:val="center"/>
           </w:tcPr>
           <w:p>
@@ -31495,7 +31656,7 @@
         </w:tc>
         <w:tc>
           <w:tcPr>
-            <w:tcW w:w="2162" w:type="dxa"/>
+            <w:tcW w:w="2119" w:type="dxa"/>
             <w:vAlign w:val="center"/>
           </w:tcPr>
           <w:p>
@@ -31527,7 +31688,7 @@
         </w:tc>
         <w:tc>
           <w:tcPr>
-            <w:tcW w:w="1072" w:type="dxa"/>
+            <w:tcW w:w="1094" w:type="dxa"/>
             <w:vAlign w:val="center"/>
           </w:tcPr>
           <w:p>
@@ -31546,7 +31707,7 @@
         </w:tc>
         <w:tc>
           <w:tcPr>
-            <w:tcW w:w="1767" w:type="dxa"/>
+            <w:tcW w:w="1804" w:type="dxa"/>
             <w:vAlign w:val="center"/>
           </w:tcPr>
           <w:p>
@@ -31565,7 +31726,7 @@
         </w:tc>
         <w:tc>
           <w:tcPr>
-            <w:tcW w:w="1905" w:type="dxa"/>
+            <w:tcW w:w="1873" w:type="dxa"/>
             <w:vAlign w:val="center"/>
           </w:tcPr>
           <w:p>
@@ -31590,7 +31751,7 @@
         </w:trPr>
         <w:tc>
           <w:tcPr>
-            <w:tcW w:w="579" w:type="dxa"/>
+            <w:tcW w:w="591" w:type="dxa"/>
             <w:vAlign w:val="center"/>
           </w:tcPr>
           <w:p>
@@ -31609,7 +31770,7 @@
         </w:tc>
         <w:tc>
           <w:tcPr>
-            <w:tcW w:w="1869" w:type="dxa"/>
+            <w:tcW w:w="1873" w:type="dxa"/>
             <w:vAlign w:val="center"/>
           </w:tcPr>
           <w:p>
@@ -31706,7 +31867,7 @@
         </w:tc>
         <w:tc>
           <w:tcPr>
-            <w:tcW w:w="2162" w:type="dxa"/>
+            <w:tcW w:w="2119" w:type="dxa"/>
             <w:vAlign w:val="center"/>
           </w:tcPr>
           <w:p>
@@ -31725,7 +31886,7 @@
         </w:tc>
         <w:tc>
           <w:tcPr>
-            <w:tcW w:w="1072" w:type="dxa"/>
+            <w:tcW w:w="1094" w:type="dxa"/>
             <w:vAlign w:val="center"/>
           </w:tcPr>
           <w:p>
@@ -31744,7 +31905,7 @@
         </w:tc>
         <w:tc>
           <w:tcPr>
-            <w:tcW w:w="1767" w:type="dxa"/>
+            <w:tcW w:w="1804" w:type="dxa"/>
             <w:vAlign w:val="center"/>
           </w:tcPr>
           <w:p>
@@ -31763,7 +31924,7 @@
         </w:tc>
         <w:tc>
           <w:tcPr>
-            <w:tcW w:w="1905" w:type="dxa"/>
+            <w:tcW w:w="1873" w:type="dxa"/>
             <w:vAlign w:val="center"/>
           </w:tcPr>
           <w:p>
@@ -31820,7 +31981,7 @@
         </w:trPr>
         <w:tc>
           <w:tcPr>
-            <w:tcW w:w="579" w:type="dxa"/>
+            <w:tcW w:w="591" w:type="dxa"/>
             <w:vAlign w:val="center"/>
           </w:tcPr>
           <w:p>
@@ -31839,7 +32000,7 @@
         </w:tc>
         <w:tc>
           <w:tcPr>
-            <w:tcW w:w="1869" w:type="dxa"/>
+            <w:tcW w:w="1873" w:type="dxa"/>
             <w:vAlign w:val="center"/>
           </w:tcPr>
           <w:p>
@@ -31878,7 +32039,7 @@
         </w:tc>
         <w:tc>
           <w:tcPr>
-            <w:tcW w:w="2162" w:type="dxa"/>
+            <w:tcW w:w="2119" w:type="dxa"/>
             <w:vAlign w:val="center"/>
           </w:tcPr>
           <w:p>
@@ -31956,7 +32117,7 @@
         </w:tc>
         <w:tc>
           <w:tcPr>
-            <w:tcW w:w="1072" w:type="dxa"/>
+            <w:tcW w:w="1094" w:type="dxa"/>
             <w:vAlign w:val="center"/>
           </w:tcPr>
           <w:p>
@@ -31975,7 +32136,7 @@
         </w:tc>
         <w:tc>
           <w:tcPr>
-            <w:tcW w:w="1767" w:type="dxa"/>
+            <w:tcW w:w="1804" w:type="dxa"/>
             <w:vAlign w:val="center"/>
           </w:tcPr>
           <w:p>
@@ -31994,7 +32155,7 @@
         </w:tc>
         <w:tc>
           <w:tcPr>
-            <w:tcW w:w="1905" w:type="dxa"/>
+            <w:tcW w:w="1873" w:type="dxa"/>
             <w:vAlign w:val="center"/>
           </w:tcPr>
           <w:p>
@@ -32058,7 +32219,7 @@
         </w:trPr>
         <w:tc>
           <w:tcPr>
-            <w:tcW w:w="579" w:type="dxa"/>
+            <w:tcW w:w="591" w:type="dxa"/>
             <w:vAlign w:val="center"/>
           </w:tcPr>
           <w:p>
@@ -32078,7 +32239,7 @@
         </w:tc>
         <w:tc>
           <w:tcPr>
-            <w:tcW w:w="1869" w:type="dxa"/>
+            <w:tcW w:w="1873" w:type="dxa"/>
             <w:vAlign w:val="center"/>
           </w:tcPr>
           <w:p>
@@ -32117,7 +32278,7 @@
         </w:tc>
         <w:tc>
           <w:tcPr>
-            <w:tcW w:w="2162" w:type="dxa"/>
+            <w:tcW w:w="2119" w:type="dxa"/>
             <w:vAlign w:val="center"/>
           </w:tcPr>
           <w:p>
@@ -32162,7 +32323,7 @@
         </w:tc>
         <w:tc>
           <w:tcPr>
-            <w:tcW w:w="1072" w:type="dxa"/>
+            <w:tcW w:w="1094" w:type="dxa"/>
             <w:vAlign w:val="center"/>
           </w:tcPr>
           <w:p>
@@ -32181,7 +32342,7 @@
         </w:tc>
         <w:tc>
           <w:tcPr>
-            <w:tcW w:w="1767" w:type="dxa"/>
+            <w:tcW w:w="1804" w:type="dxa"/>
             <w:vAlign w:val="center"/>
           </w:tcPr>
           <w:p>
@@ -32200,7 +32361,7 @@
         </w:tc>
         <w:tc>
           <w:tcPr>
-            <w:tcW w:w="1905" w:type="dxa"/>
+            <w:tcW w:w="1873" w:type="dxa"/>
             <w:vAlign w:val="center"/>
           </w:tcPr>
           <w:p>
@@ -32264,7 +32425,7 @@
         </w:trPr>
         <w:tc>
           <w:tcPr>
-            <w:tcW w:w="579" w:type="dxa"/>
+            <w:tcW w:w="591" w:type="dxa"/>
             <w:vAlign w:val="center"/>
           </w:tcPr>
           <w:p>
@@ -32283,7 +32444,7 @@
         </w:tc>
         <w:tc>
           <w:tcPr>
-            <w:tcW w:w="1869" w:type="dxa"/>
+            <w:tcW w:w="1873" w:type="dxa"/>
             <w:vAlign w:val="center"/>
           </w:tcPr>
           <w:p>
@@ -32309,20 +32470,20 @@
         </w:tc>
         <w:tc>
           <w:tcPr>
-            <w:tcW w:w="2162" w:type="dxa"/>
-            <w:vAlign w:val="center"/>
-          </w:tcPr>
-          <w:p>
-            <w:pPr>
-              <w:pStyle w:val="Compact"/>
-              <w:spacing w:before="0" w:after="0" w:line="280" w:lineRule="exact"/>
-              <w:jc w:val="center"/>
-            </w:pPr>
-            <w:r>
-              <w:rPr>
-                <w:sz w:val="24"/>
-              </w:rPr>
-              <w:t>прайс не публикуется; оценка от 64 </w:t>
+            <w:tcW w:w="2119" w:type="dxa"/>
+            <w:vAlign w:val="center"/>
+          </w:tcPr>
+          <w:p>
+            <w:pPr>
+              <w:pStyle w:val="Compact"/>
+              <w:spacing w:before="0" w:after="0" w:line="280" w:lineRule="exact"/>
+              <w:jc w:val="center"/>
+            </w:pPr>
+            <w:r>
+              <w:rPr>
+                <w:sz w:val="24"/>
+              </w:rPr>
+              <w:t>прайс не публикуется; оценки третьих сторон: от 64 </w:t>
             </w:r>
             <w:r>
               <w:rPr>
@@ -32348,51 +32509,96 @@
               <w:rPr>
                 <w:sz w:val="24"/>
               </w:rPr>
-              <w:t xml:space="preserve"> в год)</w:t>
-            </w:r>
-          </w:p>
-        </w:tc>
-        <w:tc>
-          <w:tcPr>
-            <w:tcW w:w="1072" w:type="dxa"/>
-            <w:vAlign w:val="center"/>
-          </w:tcPr>
-          <w:p>
-            <w:pPr>
-              <w:pStyle w:val="Compact"/>
-              <w:spacing w:before="0" w:after="0" w:line="280" w:lineRule="exact"/>
-              <w:jc w:val="center"/>
-            </w:pPr>
-            <w:r>
-              <w:rPr>
-                <w:sz w:val="24"/>
-              </w:rPr>
-              <w:t>[19]</w:t>
-            </w:r>
-          </w:p>
-        </w:tc>
-        <w:tc>
-          <w:tcPr>
-            <w:tcW w:w="1767" w:type="dxa"/>
-            <w:vAlign w:val="center"/>
-          </w:tcPr>
-          <w:p>
-            <w:pPr>
-              <w:pStyle w:val="Compact"/>
-              <w:spacing w:before="0" w:after="0" w:line="280" w:lineRule="exact"/>
-              <w:jc w:val="center"/>
-            </w:pPr>
-            <w:r>
-              <w:rPr>
-                <w:sz w:val="24"/>
-              </w:rPr>
-              <w:t>низкая (оценка)</w:t>
-            </w:r>
-          </w:p>
-        </w:tc>
-        <w:tc>
-          <w:tcPr>
-            <w:tcW w:w="1905" w:type="dxa"/>
+              <w:t xml:space="preserve"> в год) [19], около 175 </w:t>
+            </w:r>
+            <w:r>
+              <w:rPr>
+                <w:i/>
+                <w:sz w:val="24"/>
+              </w:rPr>
+              <w:t>USD</w:t>
+            </w:r>
+            <w:r>
+              <w:rPr>
+                <w:sz w:val="24"/>
+              </w:rPr>
+              <w:t xml:space="preserve"> в месяц за место в пакете </w:t>
+            </w:r>
+            <w:r>
+              <w:rPr>
+                <w:i/>
+                <w:sz w:val="24"/>
+              </w:rPr>
+              <w:t>Professional</w:t>
+            </w:r>
+            <w:r>
+              <w:rPr>
+                <w:sz w:val="24"/>
+              </w:rPr>
+              <w:t xml:space="preserve"> при минимуме пять мест (около 2 100 </w:t>
+            </w:r>
+            <w:r>
+              <w:rPr>
+                <w:i/>
+                <w:sz w:val="24"/>
+              </w:rPr>
+              <w:t>USD</w:t>
+            </w:r>
+            <w:r>
+              <w:rPr>
+                <w:sz w:val="24"/>
+              </w:rPr>
+              <w:t xml:space="preserve"> в год за место) [23]</w:t>
+            </w:r>
+          </w:p>
+        </w:tc>
+        <w:tc>
+          <w:tcPr>
+            <w:tcW w:w="1094" w:type="dxa"/>
+            <w:vAlign w:val="center"/>
+          </w:tcPr>
+          <w:p>
+            <w:pPr>
+              <w:pStyle w:val="Compact"/>
+              <w:spacing w:before="0" w:after="0" w:line="280" w:lineRule="exact"/>
+              <w:jc w:val="center"/>
+            </w:pPr>
+            <w:r>
+              <w:rPr>
+                <w:sz w:val="24"/>
+              </w:rPr>
+              <w:t>[19], [23]</w:t>
+            </w:r>
+          </w:p>
+        </w:tc>
+        <w:tc>
+          <w:tcPr>
+            <w:tcW w:w="1804" w:type="dxa"/>
+            <w:vAlign w:val="center"/>
+          </w:tcPr>
+          <w:p>
+            <w:pPr>
+              <w:pStyle w:val="Compact"/>
+              <w:spacing w:before="0" w:after="0" w:line="280" w:lineRule="exact"/>
+              <w:jc w:val="center"/>
+            </w:pPr>
+            <w:r>
+              <w:rPr>
+                <w:sz w:val="24"/>
+              </w:rPr>
+              <w:t xml:space="preserve">низкая (оценки обзорных </w:t>
+            </w:r>
+            <w:r>
+              <w:rPr>
+                <w:sz w:val="24"/>
+              </w:rPr>
+              <w:t>сервисов и аналитического агентства, расходятся втрое)</w:t>
+            </w:r>
+          </w:p>
+        </w:tc>
+        <w:tc>
+          <w:tcPr>
+            <w:tcW w:w="1873" w:type="dxa"/>
             <w:vAlign w:val="center"/>
           </w:tcPr>
           <w:p>
@@ -32431,7 +32637,27 @@
               <w:rPr>
                 <w:sz w:val="24"/>
               </w:rPr>
-              <w:t xml:space="preserve"> дешевле примерно в три раза</w:t>
+              <w:t xml:space="preserve"> (19 </w:t>
+            </w:r>
+            <w:r>
+              <w:rPr>
+                <w:i/>
+                <w:sz w:val="24"/>
+              </w:rPr>
+              <w:t>EUR</w:t>
+            </w:r>
+            <w:r>
+              <w:rPr>
+                <w:sz w:val="24"/>
+              </w:rPr>
+              <w:t xml:space="preserve"> в месяц) дешевле примерно в три-девять раз; минимум пять мест исключает индивидуального покупателя, которого обслуживает </w:t>
+            </w:r>
+            <w:r>
+              <w:rPr>
+                <w:i/>
+                <w:sz w:val="24"/>
+              </w:rPr>
+              <w:t>TableMind</w:t>
             </w:r>
           </w:p>
         </w:tc>
@@ -32443,7 +32669,7 @@
         </w:trPr>
         <w:tc>
           <w:tcPr>
-            <w:tcW w:w="579" w:type="dxa"/>
+            <w:tcW w:w="591" w:type="dxa"/>
             <w:vAlign w:val="center"/>
           </w:tcPr>
           <w:p>
@@ -32462,7 +32688,7 @@
         </w:tc>
         <w:tc>
           <w:tcPr>
-            <w:tcW w:w="1869" w:type="dxa"/>
+            <w:tcW w:w="1873" w:type="dxa"/>
             <w:vAlign w:val="center"/>
           </w:tcPr>
           <w:p>
@@ -32488,20 +32714,20 @@
         </w:tc>
         <w:tc>
           <w:tcPr>
-            <w:tcW w:w="2162" w:type="dxa"/>
-            <w:vAlign w:val="center"/>
-          </w:tcPr>
-          <w:p>
-            <w:pPr>
-              <w:pStyle w:val="Compact"/>
-              <w:spacing w:before="0" w:after="0" w:line="280" w:lineRule="exact"/>
-              <w:jc w:val="center"/>
-            </w:pPr>
-            <w:r>
-              <w:rPr>
-                <w:sz w:val="24"/>
-              </w:rPr>
-              <w:t>прайс не публикуется; оценки от 400 </w:t>
+            <w:tcW w:w="2119" w:type="dxa"/>
+            <w:vAlign w:val="center"/>
+          </w:tcPr>
+          <w:p>
+            <w:pPr>
+              <w:pStyle w:val="Compact"/>
+              <w:spacing w:before="0" w:after="0" w:line="280" w:lineRule="exact"/>
+              <w:jc w:val="center"/>
+            </w:pPr>
+            <w:r>
+              <w:rPr>
+                <w:sz w:val="24"/>
+              </w:rPr>
+              <w:t>прайс не публикуется; по данным закупочной платформы о фактических контрактах медианный покупатель платит 33 300 </w:t>
             </w:r>
             <w:r>
               <w:rPr>
@@ -32514,7 +32740,7 @@
               <w:rPr>
                 <w:sz w:val="24"/>
               </w:rPr>
-              <w:t xml:space="preserve"> за пользователя в месяц, от 24 000 </w:t>
+              <w:t xml:space="preserve"> в год (диапазон 16 231-62 037 </w:t>
             </w:r>
             <w:r>
               <w:rPr>
@@ -32527,51 +32753,109 @@
               <w:rPr>
                 <w:sz w:val="24"/>
               </w:rPr>
-              <w:t xml:space="preserve"> в год</w:t>
-            </w:r>
-          </w:p>
-        </w:tc>
-        <w:tc>
-          <w:tcPr>
-            <w:tcW w:w="1072" w:type="dxa"/>
-            <w:vAlign w:val="center"/>
-          </w:tcPr>
-          <w:p>
-            <w:pPr>
-              <w:pStyle w:val="Compact"/>
-              <w:spacing w:before="0" w:after="0" w:line="280" w:lineRule="exact"/>
-              <w:jc w:val="center"/>
-            </w:pPr>
-            <w:r>
-              <w:rPr>
-                <w:sz w:val="24"/>
-              </w:rPr>
-              <w:t>[20]</w:t>
-            </w:r>
-          </w:p>
-        </w:tc>
-        <w:tc>
-          <w:tcPr>
-            <w:tcW w:w="1767" w:type="dxa"/>
-            <w:vAlign w:val="center"/>
-          </w:tcPr>
-          <w:p>
-            <w:pPr>
-              <w:pStyle w:val="Compact"/>
-              <w:spacing w:before="0" w:after="0" w:line="280" w:lineRule="exact"/>
-              <w:jc w:val="center"/>
-            </w:pPr>
-            <w:r>
-              <w:rPr>
-                <w:sz w:val="24"/>
-              </w:rPr>
-              <w:t>низкая (оценка)</w:t>
-            </w:r>
-          </w:p>
-        </w:tc>
-        <w:tc>
-          <w:tcPr>
-            <w:tcW w:w="1905" w:type="dxa"/>
+              <w:t xml:space="preserve">); малые команды 25-50 тыс. </w:t>
+            </w:r>
+            <w:r>
+              <w:rPr>
+                <w:i/>
+                <w:sz w:val="24"/>
+              </w:rPr>
+              <w:t>USD</w:t>
+            </w:r>
+            <w:r>
+              <w:rPr>
+                <w:sz w:val="24"/>
+              </w:rPr>
+              <w:t xml:space="preserve">, средний сегмент 60-120 тыс. </w:t>
+            </w:r>
+            <w:r>
+              <w:rPr>
+                <w:i/>
+                <w:sz w:val="24"/>
+              </w:rPr>
+              <w:t>USD</w:t>
+            </w:r>
+            <w:r>
+              <w:rPr>
+                <w:sz w:val="24"/>
+              </w:rPr>
+              <w:t xml:space="preserve"> в год; внедрение 10-40 тыс</w:t>
+            </w:r>
+            <w:r>
+              <w:rPr>
+                <w:sz w:val="24"/>
+              </w:rPr>
+              <w:t xml:space="preserve">. </w:t>
+            </w:r>
+            <w:r>
+              <w:rPr>
+                <w:i/>
+                <w:sz w:val="24"/>
+              </w:rPr>
+              <w:t>USD</w:t>
+            </w:r>
+            <w:r>
+              <w:rPr>
+                <w:sz w:val="24"/>
+              </w:rPr>
+              <w:t xml:space="preserve"> дополнительно [22]; обзорные оценки около 24 000 </w:t>
+            </w:r>
+            <w:r>
+              <w:rPr>
+                <w:i/>
+                <w:sz w:val="24"/>
+              </w:rPr>
+              <w:t>USD</w:t>
+            </w:r>
+            <w:r>
+              <w:rPr>
+                <w:sz w:val="24"/>
+              </w:rPr>
+              <w:t xml:space="preserve"> в год и выше [20]</w:t>
+            </w:r>
+          </w:p>
+        </w:tc>
+        <w:tc>
+          <w:tcPr>
+            <w:tcW w:w="1094" w:type="dxa"/>
+            <w:vAlign w:val="center"/>
+          </w:tcPr>
+          <w:p>
+            <w:pPr>
+              <w:pStyle w:val="Compact"/>
+              <w:spacing w:before="0" w:after="0" w:line="280" w:lineRule="exact"/>
+              <w:jc w:val="center"/>
+            </w:pPr>
+            <w:r>
+              <w:rPr>
+                <w:sz w:val="24"/>
+              </w:rPr>
+              <w:t>[20], [22]</w:t>
+            </w:r>
+          </w:p>
+        </w:tc>
+        <w:tc>
+          <w:tcPr>
+            <w:tcW w:w="1804" w:type="dxa"/>
+            <w:vAlign w:val="center"/>
+          </w:tcPr>
+          <w:p>
+            <w:pPr>
+              <w:pStyle w:val="Compact"/>
+              <w:spacing w:before="0" w:after="0" w:line="280" w:lineRule="exact"/>
+              <w:jc w:val="center"/>
+            </w:pPr>
+            <w:r>
+              <w:rPr>
+                <w:sz w:val="24"/>
+              </w:rPr>
+              <w:t>средняя (данные по заключенным контрактам, но не прайс производителя)</w:t>
+            </w:r>
+          </w:p>
+        </w:tc>
+        <w:tc>
+          <w:tcPr>
+            <w:tcW w:w="1873" w:type="dxa"/>
             <w:vAlign w:val="center"/>
           </w:tcPr>
           <w:p>
@@ -32622,26 +32906,27 @@
         </w:trPr>
         <w:tc>
           <w:tcPr>
-            <w:tcW w:w="579" w:type="dxa"/>
-            <w:vAlign w:val="center"/>
-          </w:tcPr>
-          <w:p>
-            <w:pPr>
-              <w:pStyle w:val="Compact"/>
-              <w:spacing w:before="0" w:after="0" w:line="280" w:lineRule="exact"/>
-              <w:jc w:val="center"/>
-            </w:pPr>
-            <w:r>
-              <w:rPr>
-                <w:sz w:val="24"/>
-              </w:rPr>
+            <w:tcW w:w="591" w:type="dxa"/>
+            <w:vAlign w:val="center"/>
+          </w:tcPr>
+          <w:p>
+            <w:pPr>
+              <w:pStyle w:val="Compact"/>
+              <w:spacing w:before="0" w:after="0" w:line="280" w:lineRule="exact"/>
+              <w:jc w:val="center"/>
+            </w:pPr>
+            <w:r>
+              <w:rPr>
+                <w:sz w:val="24"/>
+              </w:rPr>
+              <w:lastRenderedPageBreak/>
               <w:t>7</w:t>
             </w:r>
           </w:p>
         </w:tc>
         <w:tc>
           <w:tcPr>
-            <w:tcW w:w="1869" w:type="dxa"/>
+            <w:tcW w:w="1873" w:type="dxa"/>
             <w:vAlign w:val="center"/>
           </w:tcPr>
           <w:p>
@@ -32693,13 +32978,7 @@
               <w:rPr>
                 <w:sz w:val="24"/>
               </w:rPr>
-              <w:t>,</w:t>
-            </w:r>
-            <w:r>
-              <w:rPr>
-                <w:sz w:val="24"/>
-              </w:rPr>
-              <w:t xml:space="preserve"> апрель 2025 - март 2026 (</w:t>
+              <w:t>, апрель 2025 - март 2026 (</w:t>
             </w:r>
             <w:r>
               <w:rPr>
@@ -32718,7 +32997,7 @@
         </w:tc>
         <w:tc>
           <w:tcPr>
-            <w:tcW w:w="2162" w:type="dxa"/>
+            <w:tcW w:w="2119" w:type="dxa"/>
             <w:vAlign w:val="center"/>
           </w:tcPr>
           <w:p>
@@ -32737,7 +33016,7 @@
         </w:tc>
         <w:tc>
           <w:tcPr>
-            <w:tcW w:w="1072" w:type="dxa"/>
+            <w:tcW w:w="1094" w:type="dxa"/>
             <w:vAlign w:val="center"/>
           </w:tcPr>
           <w:p>
@@ -32756,7 +33035,7 @@
         </w:tc>
         <w:tc>
           <w:tcPr>
-            <w:tcW w:w="1767" w:type="dxa"/>
+            <w:tcW w:w="1804" w:type="dxa"/>
             <w:vAlign w:val="center"/>
           </w:tcPr>
           <w:p>
@@ -32801,20 +33080,26 @@
         </w:tc>
         <w:tc>
           <w:tcPr>
-            <w:tcW w:w="1905" w:type="dxa"/>
-            <w:vAlign w:val="center"/>
-          </w:tcPr>
-          <w:p>
-            <w:pPr>
-              <w:pStyle w:val="Compact"/>
-              <w:spacing w:before="0" w:after="0" w:line="280" w:lineRule="exact"/>
-              <w:jc w:val="center"/>
-            </w:pPr>
-            <w:r>
-              <w:rPr>
-                <w:sz w:val="24"/>
-              </w:rPr>
-              <w:t>два профессиональных сегмента Великобритании дают около 480 тыс. человек, то есть около 15 % американских трех сегментов (3,1 млн) при доле населения около 20 %: масштаб занятости 0,45 для четырех англоязычных стран выглядит консервативным</w:t>
+            <w:tcW w:w="1873" w:type="dxa"/>
+            <w:vAlign w:val="center"/>
+          </w:tcPr>
+          <w:p>
+            <w:pPr>
+              <w:pStyle w:val="Compact"/>
+              <w:spacing w:before="0" w:after="0" w:line="280" w:lineRule="exact"/>
+              <w:jc w:val="center"/>
+            </w:pPr>
+            <w:r>
+              <w:rPr>
+                <w:sz w:val="24"/>
+              </w:rPr>
+              <w:t>два профессиональных сегмент</w:t>
+            </w:r>
+            <w:r>
+              <w:rPr>
+                <w:sz w:val="24"/>
+              </w:rPr>
+              <w:t>а Великобритании дают около 480 тыс. человек, то есть около 15 % американских трех сегментов (3,1 млн) при доле населения около 20 %: масштаб занятости 0,45 для четырех англоязычных стран выглядит консервативным</w:t>
             </w:r>
           </w:p>
         </w:tc>
@@ -32826,46 +33111,39 @@
         </w:trPr>
         <w:tc>
           <w:tcPr>
-            <w:tcW w:w="579" w:type="dxa"/>
-            <w:vAlign w:val="center"/>
-          </w:tcPr>
-          <w:p>
-            <w:pPr>
-              <w:pStyle w:val="Compact"/>
-              <w:spacing w:before="0" w:after="0" w:line="280" w:lineRule="exact"/>
-              <w:jc w:val="center"/>
-            </w:pPr>
-            <w:r>
-              <w:rPr>
-                <w:sz w:val="24"/>
-              </w:rPr>
-              <w:lastRenderedPageBreak/>
+            <w:tcW w:w="591" w:type="dxa"/>
+            <w:vAlign w:val="center"/>
+          </w:tcPr>
+          <w:p>
+            <w:pPr>
+              <w:pStyle w:val="Compact"/>
+              <w:spacing w:before="0" w:after="0" w:line="280" w:lineRule="exact"/>
+              <w:jc w:val="center"/>
+            </w:pPr>
+            <w:r>
+              <w:rPr>
+                <w:sz w:val="24"/>
+              </w:rPr>
               <w:t>8</w:t>
             </w:r>
           </w:p>
         </w:tc>
         <w:tc>
           <w:tcPr>
-            <w:tcW w:w="1869" w:type="dxa"/>
-            <w:vAlign w:val="center"/>
-          </w:tcPr>
-          <w:p>
-            <w:pPr>
-              <w:pStyle w:val="Compact"/>
-              <w:spacing w:before="0" w:after="0" w:line="280" w:lineRule="exact"/>
-              <w:jc w:val="center"/>
-            </w:pPr>
-            <w:r>
-              <w:rPr>
-                <w:sz w:val="24"/>
-              </w:rPr>
-              <w:t>Допол</w:t>
-            </w:r>
-            <w:r>
-              <w:rPr>
-                <w:sz w:val="24"/>
-              </w:rPr>
-              <w:t xml:space="preserve">нительный снимок </w:t>
+            <w:tcW w:w="1873" w:type="dxa"/>
+            <w:vAlign w:val="center"/>
+          </w:tcPr>
+          <w:p>
+            <w:pPr>
+              <w:pStyle w:val="Compact"/>
+              <w:spacing w:before="0" w:after="0" w:line="280" w:lineRule="exact"/>
+              <w:jc w:val="center"/>
+            </w:pPr>
+            <w:r>
+              <w:rPr>
+                <w:sz w:val="24"/>
+              </w:rPr>
+              <w:t xml:space="preserve">Дополнительный снимок </w:t>
             </w:r>
             <w:r>
               <w:rPr>
@@ -32891,13 +33169,19 @@
               <w:rPr>
                 <w:sz w:val="24"/>
               </w:rPr>
-              <w:t>, июнь-август 2026</w:t>
-            </w:r>
-          </w:p>
-        </w:tc>
-        <w:tc>
-          <w:tcPr>
-            <w:tcW w:w="2162" w:type="dxa"/>
+              <w:t>, июн</w:t>
+            </w:r>
+            <w:r>
+              <w:rPr>
+                <w:sz w:val="24"/>
+              </w:rPr>
+              <w:t>ь-август 2026</w:t>
+            </w:r>
+          </w:p>
+        </w:tc>
+        <w:tc>
+          <w:tcPr>
+            <w:tcW w:w="2119" w:type="dxa"/>
             <w:vAlign w:val="center"/>
           </w:tcPr>
           <w:p>
@@ -33001,7 +33285,7 @@
         </w:tc>
         <w:tc>
           <w:tcPr>
-            <w:tcW w:w="1072" w:type="dxa"/>
+            <w:tcW w:w="1094" w:type="dxa"/>
             <w:vAlign w:val="center"/>
           </w:tcPr>
           <w:p>
@@ -33020,7 +33304,7 @@
         </w:tc>
         <w:tc>
           <w:tcPr>
-            <w:tcW w:w="1767" w:type="dxa"/>
+            <w:tcW w:w="1804" w:type="dxa"/>
             <w:vAlign w:val="center"/>
           </w:tcPr>
           <w:p>
@@ -33052,7 +33336,7 @@
         </w:tc>
         <w:tc>
           <w:tcPr>
-            <w:tcW w:w="1905" w:type="dxa"/>
+            <w:tcW w:w="1873" w:type="dxa"/>
             <w:vAlign w:val="center"/>
           </w:tcPr>
           <w:p>
@@ -33098,13 +33382,7 @@
               <w:rPr>
                 <w:sz w:val="24"/>
               </w:rPr>
-              <w:t xml:space="preserve"> добавляют около 8,9 % к трафику 12 доменов основного снимка (6,02 млн визитов) и на</w:t>
-            </w:r>
-            <w:r>
-              <w:rPr>
-                <w:sz w:val="24"/>
-              </w:rPr>
-              <w:t xml:space="preserve"> итоговый диапазон не влияют; </w:t>
+              <w:t xml:space="preserve"> добавляют около 8,9 % к трафику 12 доменов основного снимка (6,02 млн визитов) и на итоговый диапазон не влияют; </w:t>
             </w:r>
             <w:r>
               <w:rPr>
@@ -33117,7 +33395,13 @@
               <w:rPr>
                 <w:sz w:val="24"/>
               </w:rPr>
-              <w:t xml:space="preserve"> - канал, а не конкурент</w:t>
+              <w:t xml:space="preserve"> - кана</w:t>
+            </w:r>
+            <w:r>
+              <w:rPr>
+                <w:sz w:val="24"/>
+              </w:rPr>
+              <w:t>л, а не конкурент</w:t>
             </w:r>
           </w:p>
         </w:tc>
@@ -33199,13 +33483,13 @@
         <w:rPr>
           <w:sz w:val="28"/>
         </w:rPr>
-        <w:t xml:space="preserve"> остаются оценками третьих сторон. Для ценового коридора </w:t>
-      </w:r>
-      <w:r>
-        <w:rPr>
-          <w:sz w:val="28"/>
-        </w:rPr>
-        <w:t>это означает, что опубликованные цены специализированных надстроек (</w:t>
+        <w:t xml:space="preserve"> остаются оценками третьих сторон. Для ценового коридора это означает, что опубликованные цены специали</w:t>
+      </w:r>
+      <w:r>
+        <w:rPr>
+          <w:sz w:val="28"/>
+        </w:rPr>
+        <w:t>зированных надстроек (</w:t>
       </w:r>
       <w:r>
         <w:rPr>
@@ -33322,7 +33606,20 @@
         <w:rPr>
           <w:sz w:val="28"/>
         </w:rPr>
-        <w:t>, оценки от 60 до 400 </w:t>
+        <w:t xml:space="preserve">, оценки </w:t>
+      </w:r>
+      <w:r>
+        <w:rPr>
+          <w:i/>
+          <w:sz w:val="28"/>
+        </w:rPr>
+        <w:t>DataSnipper</w:t>
+      </w:r>
+      <w:r>
+        <w:rPr>
+          <w:sz w:val="28"/>
+        </w:rPr>
+        <w:t xml:space="preserve"> от 64 до 175 </w:t>
       </w:r>
       <w:r>
         <w:rPr>
@@ -33335,13 +33632,40 @@
         <w:rPr>
           <w:sz w:val="28"/>
         </w:rPr>
-        <w:t xml:space="preserve"> в месяц) заме</w:t>
-      </w:r>
-      <w:r>
-        <w:rPr>
-          <w:sz w:val="28"/>
-        </w:rPr>
-        <w:t>тно дороже; точные цены последних можно получить только запросом коммерческого предложения.</w:t>
+        <w:t xml:space="preserve"> за место в месяц, </w:t>
+      </w:r>
+      <w:r>
+        <w:rPr>
+          <w:i/>
+          <w:sz w:val="28"/>
+        </w:rPr>
+        <w:t>Datarails</w:t>
+      </w:r>
+      <w:r>
+        <w:rPr>
+          <w:sz w:val="28"/>
+        </w:rPr>
+        <w:t xml:space="preserve"> около 33 тыс. </w:t>
+      </w:r>
+      <w:r>
+        <w:rPr>
+          <w:i/>
+          <w:sz w:val="28"/>
+        </w:rPr>
+        <w:t>USD</w:t>
+      </w:r>
+      <w:r>
+        <w:rPr>
+          <w:sz w:val="28"/>
+        </w:rPr>
+        <w:t xml:space="preserve"> в год на контракт) заметно дороже; прайсы производителей закрыты, поэтому </w:t>
+      </w:r>
+      <w:r>
+        <w:rPr>
+          <w:sz w:val="28"/>
+        </w:rPr>
+        <w:lastRenderedPageBreak/>
+        <w:t>использованы данные закупочной платформы и аналитического агентства, а точные цены можно получить только запросом коммерческого предложения.</w:t>
       </w:r>
     </w:p>
     <w:p>
@@ -33355,7 +33679,13 @@
         <w:rPr>
           <w:sz w:val="28"/>
         </w:rPr>
-        <w:t xml:space="preserve">Не закрыты: точные цены </w:t>
+        <w:t>Не закрыты: официальны</w:t>
+      </w:r>
+      <w:r>
+        <w:rPr>
+          <w:sz w:val="28"/>
+        </w:rPr>
+        <w:t xml:space="preserve">е прайсы </w:t>
       </w:r>
       <w:r>
         <w:rPr>
@@ -33381,7 +33711,7 @@
         <w:rPr>
           <w:sz w:val="28"/>
         </w:rPr>
-        <w:t xml:space="preserve"> (только запросом коммерческого предложения) и данные </w:t>
+        <w:t xml:space="preserve"> (альтернатива найдена: данные закупочной платформы и агентства, строки 5 и 6) и данные </w:t>
       </w:r>
       <w:r>
         <w:rPr>
@@ -33433,13 +33763,13 @@
         <w:rPr>
           <w:sz w:val="28"/>
         </w:rPr>
-        <w:t>, для которых нужен рекламный к</w:t>
-      </w:r>
-      <w:r>
-        <w:rPr>
-          <w:sz w:val="28"/>
-        </w:rPr>
-        <w:t xml:space="preserve">абинет или платный доступ; взамен для англоязычного поиска используются относительные индексы </w:t>
+        <w:t>, для которых нужен рекламный кабинет или платный доступ; взамен для англоязычного поиска используются о</w:t>
+      </w:r>
+      <w:r>
+        <w:rPr>
+          <w:sz w:val="28"/>
+        </w:rPr>
+        <w:t xml:space="preserve">тносительные индексы </w:t>
       </w:r>
       <w:r>
         <w:rPr>
@@ -33478,7 +33808,7 @@
         <w:rPr>
           <w:sz w:val="28"/>
         </w:rPr>
-        <w:t xml:space="preserve">. Дополнительный раздел </w:t>
+        <w:t xml:space="preserve">. Раздел </w:t>
       </w:r>
       <w:r>
         <w:rPr>
@@ -33504,7 +33834,7 @@
         <w:rPr>
           <w:sz w:val="28"/>
         </w:rPr>
-        <w:t xml:space="preserve"> в пробном </w:t>
+        <w:t xml:space="preserve"> пробного </w:t>
       </w:r>
       <w:r>
         <w:rPr>
@@ -33530,7 +33860,13 @@
         <w:rPr>
           <w:sz w:val="28"/>
         </w:rPr>
-        <w:t xml:space="preserve"> не использован из-за нестабильной работы интерфейса при автоматизации.</w:t>
+        <w:t xml:space="preserve"> использован 04.10.2026 для сверки ставок и конкуренции (приложение Д ЛР4); объемы запросов в пробном доступе скрыты («</w:t>
+      </w:r>
+      <w:r>
+        <w:rPr>
+          <w:sz w:val="28"/>
+        </w:rPr>
+        <w:t>меньше 50»).</w:t>
       </w:r>
     </w:p>
     <w:bookmarkEnd w:id="44"/>
@@ -33638,7 +33974,7 @@
   <w:abstractNum w:abstractNumId="0" w15:restartNumberingAfterBreak="0">
     <w:nsid w:val="0000A990"/>
     <w:multiLevelType w:val="multilevel"/>
-    <w:tmpl w:val="03869998"/>
+    <w:tmpl w:val="904658A8"/>
     <w:lvl w:ilvl="0">
       <w:numFmt w:val="bullet"/>
       <w:lvlText w:val=" "/>
@@ -33715,7 +34051,7 @@
   <w:abstractNum w:abstractNumId="1" w15:restartNumberingAfterBreak="0">
     <w:nsid w:val="00A99411"/>
     <w:multiLevelType w:val="multilevel"/>
-    <w:tmpl w:val="C7C0C574"/>
+    <w:tmpl w:val="B8EE3012"/>
     <w:lvl w:ilvl="0">
       <w:start w:val="1"/>
       <w:numFmt w:val="decimal"/>
@@ -35193,7 +35529,7 @@
     <w:autoRedefine/>
     <w:uiPriority w:val="39"/>
     <w:unhideWhenUsed/>
-    <w:rsid w:val="0087627E"/>
+    <w:rsid w:val="00C3696C"/>
     <w:pPr>
       <w:spacing w:after="100"/>
     </w:pPr>
@@ -35205,7 +35541,7 @@
     <w:autoRedefine/>
     <w:uiPriority w:val="39"/>
     <w:unhideWhenUsed/>
-    <w:rsid w:val="0087627E"/>
+    <w:rsid w:val="00C3696C"/>
     <w:pPr>
       <w:spacing w:after="100"/>
       <w:ind w:left="240"/>

</xml_diff>

<commit_message>
audit: fix inaccuracies against lab conditions, regenerate figures, reports and PDFs (final 255 pages)
</commit_message>
<xml_diff>
--- a/ЛР2-3_Объем_рынка/ОТЧЕТ_ЛР2-3_TableMind.docx
+++ b/ЛР2-3_Объем_рынка/ОТЧЕТ_ЛР2-3_TableMind.docx
@@ -264,7 +264,7 @@
       <w:r>
         <w:fldChar w:fldCharType="separate"/>
       </w:r>
-      <w:hyperlink w:anchor="_Toc242012066" w:history="1">
+      <w:hyperlink w:anchor="_Toc242017683" w:history="1">
         <w:r>
           <w:rPr>
             <w:rStyle w:val="af"/>
@@ -292,7 +292,7 @@
             <w:noProof/>
             <w:webHidden/>
           </w:rPr>
-          <w:instrText xml:space="preserve"> PAGEREF _Toc242012066 \h </w:instrText>
+          <w:instrText xml:space="preserve"> PAGEREF _Toc242017683 \h </w:instrText>
         </w:r>
         <w:r>
           <w:rPr>
@@ -333,7 +333,7 @@
           <w:noProof/>
         </w:rPr>
       </w:pPr>
-      <w:hyperlink w:anchor="_Toc242012067" w:history="1">
+      <w:hyperlink w:anchor="_Toc242017684" w:history="1">
         <w:r>
           <w:rPr>
             <w:rStyle w:val="af"/>
@@ -361,7 +361,7 @@
             <w:noProof/>
             <w:webHidden/>
           </w:rPr>
-          <w:instrText xml:space="preserve"> PAGEREF _Toc242012067 \h </w:instrText>
+          <w:instrText xml:space="preserve"> PAGEREF _Toc242017684 \h </w:instrText>
         </w:r>
         <w:r>
           <w:rPr>
@@ -402,7 +402,7 @@
           <w:noProof/>
         </w:rPr>
       </w:pPr>
-      <w:hyperlink w:anchor="_Toc242012068" w:history="1">
+      <w:hyperlink w:anchor="_Toc242017685" w:history="1">
         <w:r>
           <w:rPr>
             <w:rStyle w:val="af"/>
@@ -430,7 +430,7 @@
             <w:noProof/>
             <w:webHidden/>
           </w:rPr>
-          <w:instrText xml:space="preserve"> PAGEREF _Toc242012068 \h </w:instrText>
+          <w:instrText xml:space="preserve"> PAGEREF _Toc242017685 \h </w:instrText>
         </w:r>
         <w:r>
           <w:rPr>
@@ -471,7 +471,7 @@
           <w:noProof/>
         </w:rPr>
       </w:pPr>
-      <w:hyperlink w:anchor="_Toc242012069" w:history="1">
+      <w:hyperlink w:anchor="_Toc242017686" w:history="1">
         <w:r>
           <w:rPr>
             <w:rStyle w:val="af"/>
@@ -508,7 +508,7 @@
             <w:noProof/>
             <w:webHidden/>
           </w:rPr>
-          <w:instrText xml:space="preserve"> PAGEREF _Toc242012069 \h </w:instrText>
+          <w:instrText xml:space="preserve"> PAGEREF _Toc242017686 \h </w:instrText>
         </w:r>
         <w:r>
           <w:rPr>
@@ -549,7 +549,7 @@
           <w:noProof/>
         </w:rPr>
       </w:pPr>
-      <w:hyperlink w:anchor="_Toc242012070" w:history="1">
+      <w:hyperlink w:anchor="_Toc242017687" w:history="1">
         <w:r>
           <w:rPr>
             <w:rStyle w:val="af"/>
@@ -586,7 +586,7 @@
             <w:noProof/>
             <w:webHidden/>
           </w:rPr>
-          <w:instrText xml:space="preserve"> PAGEREF _Toc242012070 \h </w:instrText>
+          <w:instrText xml:space="preserve"> PAGEREF _Toc242017687 \h </w:instrText>
         </w:r>
         <w:r>
           <w:rPr>
@@ -627,7 +627,7 @@
           <w:noProof/>
         </w:rPr>
       </w:pPr>
-      <w:hyperlink w:anchor="_Toc242012071" w:history="1">
+      <w:hyperlink w:anchor="_Toc242017688" w:history="1">
         <w:r>
           <w:rPr>
             <w:rStyle w:val="af"/>
@@ -664,7 +664,7 @@
             <w:noProof/>
             <w:webHidden/>
           </w:rPr>
-          <w:instrText xml:space="preserve"> PAGEREF _Toc242012071 \h </w:instrText>
+          <w:instrText xml:space="preserve"> PAGEREF _Toc242017688 \h </w:instrText>
         </w:r>
         <w:r>
           <w:rPr>
@@ -705,7 +705,7 @@
           <w:noProof/>
         </w:rPr>
       </w:pPr>
-      <w:hyperlink w:anchor="_Toc242012072" w:history="1">
+      <w:hyperlink w:anchor="_Toc242017689" w:history="1">
         <w:r>
           <w:rPr>
             <w:rStyle w:val="af"/>
@@ -733,7 +733,7 @@
             <w:noProof/>
             <w:webHidden/>
           </w:rPr>
-          <w:instrText xml:space="preserve"> PAGEREF _Toc242012072 \h </w:instrText>
+          <w:instrText xml:space="preserve"> PAGEREF _Toc242017689 \h </w:instrText>
         </w:r>
         <w:r>
           <w:rPr>
@@ -774,7 +774,7 @@
           <w:noProof/>
         </w:rPr>
       </w:pPr>
-      <w:hyperlink w:anchor="_Toc242012073" w:history="1">
+      <w:hyperlink w:anchor="_Toc242017690" w:history="1">
         <w:r>
           <w:rPr>
             <w:rStyle w:val="af"/>
@@ -802,7 +802,7 @@
             <w:noProof/>
             <w:webHidden/>
           </w:rPr>
-          <w:instrText xml:space="preserve"> PAGEREF _Toc242012073 \h </w:instrText>
+          <w:instrText xml:space="preserve"> PAGEREF _Toc242017690 \h </w:instrText>
         </w:r>
         <w:r>
           <w:rPr>
@@ -843,7 +843,7 @@
           <w:noProof/>
         </w:rPr>
       </w:pPr>
-      <w:hyperlink w:anchor="_Toc242012074" w:history="1">
+      <w:hyperlink w:anchor="_Toc242017691" w:history="1">
         <w:r>
           <w:rPr>
             <w:rStyle w:val="af"/>
@@ -880,7 +880,7 @@
             <w:noProof/>
             <w:webHidden/>
           </w:rPr>
-          <w:instrText xml:space="preserve"> PAGEREF _Toc242012074 \h </w:instrText>
+          <w:instrText xml:space="preserve"> PAGEREF _Toc242017691 \h </w:instrText>
         </w:r>
         <w:r>
           <w:rPr>
@@ -921,7 +921,7 @@
           <w:noProof/>
         </w:rPr>
       </w:pPr>
-      <w:hyperlink w:anchor="_Toc242012075" w:history="1">
+      <w:hyperlink w:anchor="_Toc242017692" w:history="1">
         <w:r>
           <w:rPr>
             <w:rStyle w:val="af"/>
@@ -949,7 +949,7 @@
             <w:noProof/>
             <w:webHidden/>
           </w:rPr>
-          <w:instrText xml:space="preserve"> PAGEREF _Toc242012075 \h </w:instrText>
+          <w:instrText xml:space="preserve"> PAGEREF _Toc242017692 \h </w:instrText>
         </w:r>
         <w:r>
           <w:rPr>
@@ -990,7 +990,7 @@
           <w:noProof/>
         </w:rPr>
       </w:pPr>
-      <w:hyperlink w:anchor="_Toc242012076" w:history="1">
+      <w:hyperlink w:anchor="_Toc242017693" w:history="1">
         <w:r>
           <w:rPr>
             <w:rStyle w:val="af"/>
@@ -1018,7 +1018,7 @@
             <w:noProof/>
             <w:webHidden/>
           </w:rPr>
-          <w:instrText xml:space="preserve"> PAGEREF _Toc242012076 \h </w:instrText>
+          <w:instrText xml:space="preserve"> PAGEREF _Toc242017693 \h </w:instrText>
         </w:r>
         <w:r>
           <w:rPr>
@@ -1059,7 +1059,7 @@
           <w:noProof/>
         </w:rPr>
       </w:pPr>
-      <w:hyperlink w:anchor="_Toc242012077" w:history="1">
+      <w:hyperlink w:anchor="_Toc242017694" w:history="1">
         <w:r>
           <w:rPr>
             <w:rStyle w:val="af"/>
@@ -1087,7 +1087,7 @@
             <w:noProof/>
             <w:webHidden/>
           </w:rPr>
-          <w:instrText xml:space="preserve"> PAGEREF _Toc242012077 \h </w:instrText>
+          <w:instrText xml:space="preserve"> PAGEREF _Toc242017694 \h </w:instrText>
         </w:r>
         <w:r>
           <w:rPr>
@@ -1128,7 +1128,7 @@
           <w:noProof/>
         </w:rPr>
       </w:pPr>
-      <w:hyperlink w:anchor="_Toc242012078" w:history="1">
+      <w:hyperlink w:anchor="_Toc242017695" w:history="1">
         <w:r>
           <w:rPr>
             <w:rStyle w:val="af"/>
@@ -1156,7 +1156,7 @@
             <w:noProof/>
             <w:webHidden/>
           </w:rPr>
-          <w:instrText xml:space="preserve"> PAGEREF _Toc242012078 \h </w:instrText>
+          <w:instrText xml:space="preserve"> PAGEREF _Toc242017695 \h </w:instrText>
         </w:r>
         <w:r>
           <w:rPr>
@@ -1197,7 +1197,7 @@
           <w:noProof/>
         </w:rPr>
       </w:pPr>
-      <w:hyperlink w:anchor="_Toc242012079" w:history="1">
+      <w:hyperlink w:anchor="_Toc242017696" w:history="1">
         <w:r>
           <w:rPr>
             <w:rStyle w:val="af"/>
@@ -1225,7 +1225,7 @@
             <w:noProof/>
             <w:webHidden/>
           </w:rPr>
-          <w:instrText xml:space="preserve"> PAGEREF _Toc242012079 \h </w:instrText>
+          <w:instrText xml:space="preserve"> PAGEREF _Toc242017696 \h </w:instrText>
         </w:r>
         <w:r>
           <w:rPr>
@@ -1266,7 +1266,7 @@
           <w:noProof/>
         </w:rPr>
       </w:pPr>
-      <w:hyperlink w:anchor="_Toc242012080" w:history="1">
+      <w:hyperlink w:anchor="_Toc242017697" w:history="1">
         <w:r>
           <w:rPr>
             <w:rStyle w:val="af"/>
@@ -1294,7 +1294,7 @@
             <w:noProof/>
             <w:webHidden/>
           </w:rPr>
-          <w:instrText xml:space="preserve"> PAGEREF _Toc242012080 \h </w:instrText>
+          <w:instrText xml:space="preserve"> PAGEREF _Toc242017697 \h </w:instrText>
         </w:r>
         <w:r>
           <w:rPr>
@@ -1335,7 +1335,7 @@
           <w:noProof/>
         </w:rPr>
       </w:pPr>
-      <w:hyperlink w:anchor="_Toc242012081" w:history="1">
+      <w:hyperlink w:anchor="_Toc242017698" w:history="1">
         <w:r>
           <w:rPr>
             <w:rStyle w:val="af"/>
@@ -1363,7 +1363,7 @@
             <w:noProof/>
             <w:webHidden/>
           </w:rPr>
-          <w:instrText xml:space="preserve"> PAGEREF _Toc242012081 \h </w:instrText>
+          <w:instrText xml:space="preserve"> PAGEREF _Toc242017698 \h </w:instrText>
         </w:r>
         <w:r>
           <w:rPr>
@@ -1404,7 +1404,7 @@
           <w:noProof/>
         </w:rPr>
       </w:pPr>
-      <w:hyperlink w:anchor="_Toc242012082" w:history="1">
+      <w:hyperlink w:anchor="_Toc242017699" w:history="1">
         <w:r>
           <w:rPr>
             <w:rStyle w:val="af"/>
@@ -1441,7 +1441,7 @@
             <w:noProof/>
             <w:webHidden/>
           </w:rPr>
-          <w:instrText xml:space="preserve"> PAGEREF _Toc242012082 \h </w:instrText>
+          <w:instrText xml:space="preserve"> PAGEREF _Toc242017699 \h </w:instrText>
         </w:r>
         <w:r>
           <w:rPr>
@@ -1482,7 +1482,7 @@
           <w:noProof/>
         </w:rPr>
       </w:pPr>
-      <w:hyperlink w:anchor="_Toc242012083" w:history="1">
+      <w:hyperlink w:anchor="_Toc242017700" w:history="1">
         <w:r>
           <w:rPr>
             <w:rStyle w:val="af"/>
@@ -1519,7 +1519,7 @@
             <w:noProof/>
             <w:webHidden/>
           </w:rPr>
-          <w:instrText xml:space="preserve"> PAGEREF _Toc242012083 \h </w:instrText>
+          <w:instrText xml:space="preserve"> PAGEREF _Toc242017700 \h </w:instrText>
         </w:r>
         <w:r>
           <w:rPr>
@@ -1560,7 +1560,7 @@
           <w:noProof/>
         </w:rPr>
       </w:pPr>
-      <w:hyperlink w:anchor="_Toc242012084" w:history="1">
+      <w:hyperlink w:anchor="_Toc242017701" w:history="1">
         <w:r>
           <w:rPr>
             <w:rStyle w:val="af"/>
@@ -1588,7 +1588,7 @@
             <w:noProof/>
             <w:webHidden/>
           </w:rPr>
-          <w:instrText xml:space="preserve"> PAGEREF _Toc242012084 \h </w:instrText>
+          <w:instrText xml:space="preserve"> PAGEREF _Toc242017701 \h </w:instrText>
         </w:r>
         <w:r>
           <w:rPr>
@@ -1629,7 +1629,7 @@
           <w:noProof/>
         </w:rPr>
       </w:pPr>
-      <w:hyperlink w:anchor="_Toc242012085" w:history="1">
+      <w:hyperlink w:anchor="_Toc242017702" w:history="1">
         <w:r>
           <w:rPr>
             <w:rStyle w:val="af"/>
@@ -1657,7 +1657,7 @@
             <w:noProof/>
             <w:webHidden/>
           </w:rPr>
-          <w:instrText xml:space="preserve"> PAGEREF _Toc242012085 \h </w:instrText>
+          <w:instrText xml:space="preserve"> PAGEREF _Toc242017702 \h </w:instrText>
         </w:r>
         <w:r>
           <w:rPr>
@@ -1698,7 +1698,7 @@
           <w:noProof/>
         </w:rPr>
       </w:pPr>
-      <w:hyperlink w:anchor="_Toc242012086" w:history="1">
+      <w:hyperlink w:anchor="_Toc242017703" w:history="1">
         <w:r>
           <w:rPr>
             <w:rStyle w:val="af"/>
@@ -1726,7 +1726,7 @@
             <w:noProof/>
             <w:webHidden/>
           </w:rPr>
-          <w:instrText xml:space="preserve"> PAGEREF _Toc242012086 \h </w:instrText>
+          <w:instrText xml:space="preserve"> PAGEREF _Toc242017703 \h </w:instrText>
         </w:r>
         <w:r>
           <w:rPr>
@@ -1767,7 +1767,7 @@
           <w:noProof/>
         </w:rPr>
       </w:pPr>
-      <w:hyperlink w:anchor="_Toc242012087" w:history="1">
+      <w:hyperlink w:anchor="_Toc242017704" w:history="1">
         <w:r>
           <w:rPr>
             <w:rStyle w:val="af"/>
@@ -1795,7 +1795,7 @@
             <w:noProof/>
             <w:webHidden/>
           </w:rPr>
-          <w:instrText xml:space="preserve"> PAGEREF _Toc242012087 \h </w:instrText>
+          <w:instrText xml:space="preserve"> PAGEREF _Toc242017704 \h </w:instrText>
         </w:r>
         <w:r>
           <w:rPr>
@@ -1836,7 +1836,7 @@
           <w:noProof/>
         </w:rPr>
       </w:pPr>
-      <w:hyperlink w:anchor="_Toc242012088" w:history="1">
+      <w:hyperlink w:anchor="_Toc242017705" w:history="1">
         <w:r>
           <w:rPr>
             <w:rStyle w:val="af"/>
@@ -1864,7 +1864,7 @@
             <w:noProof/>
             <w:webHidden/>
           </w:rPr>
-          <w:instrText xml:space="preserve"> PAGEREF _Toc242012088 \h </w:instrText>
+          <w:instrText xml:space="preserve"> PAGEREF _Toc242017705 \h </w:instrText>
         </w:r>
         <w:r>
           <w:rPr>
@@ -1905,7 +1905,7 @@
           <w:noProof/>
         </w:rPr>
       </w:pPr>
-      <w:hyperlink w:anchor="_Toc242012089" w:history="1">
+      <w:hyperlink w:anchor="_Toc242017706" w:history="1">
         <w:r>
           <w:rPr>
             <w:rStyle w:val="af"/>
@@ -1933,7 +1933,7 @@
             <w:noProof/>
             <w:webHidden/>
           </w:rPr>
-          <w:instrText xml:space="preserve"> PAGEREF _Toc242012089 \h </w:instrText>
+          <w:instrText xml:space="preserve"> PAGEREF _Toc242017706 \h </w:instrText>
         </w:r>
         <w:r>
           <w:rPr>
@@ -1974,7 +1974,7 @@
           <w:noProof/>
         </w:rPr>
       </w:pPr>
-      <w:hyperlink w:anchor="_Toc242012090" w:history="1">
+      <w:hyperlink w:anchor="_Toc242017707" w:history="1">
         <w:r>
           <w:rPr>
             <w:rStyle w:val="af"/>
@@ -2002,7 +2002,7 @@
             <w:noProof/>
             <w:webHidden/>
           </w:rPr>
-          <w:instrText xml:space="preserve"> PAGEREF _Toc242012090 \h </w:instrText>
+          <w:instrText xml:space="preserve"> PAGEREF _Toc242017707 \h </w:instrText>
         </w:r>
         <w:r>
           <w:rPr>
@@ -2043,7 +2043,7 @@
           <w:noProof/>
         </w:rPr>
       </w:pPr>
-      <w:hyperlink w:anchor="_Toc242012091" w:history="1">
+      <w:hyperlink w:anchor="_Toc242017708" w:history="1">
         <w:r>
           <w:rPr>
             <w:rStyle w:val="af"/>
@@ -2071,7 +2071,7 @@
             <w:noProof/>
             <w:webHidden/>
           </w:rPr>
-          <w:instrText xml:space="preserve"> PAGEREF _Toc242012091 \h </w:instrText>
+          <w:instrText xml:space="preserve"> PAGEREF _Toc242017708 \h </w:instrText>
         </w:r>
         <w:r>
           <w:rPr>
@@ -2112,7 +2112,7 @@
           <w:noProof/>
         </w:rPr>
       </w:pPr>
-      <w:hyperlink w:anchor="_Toc242012092" w:history="1">
+      <w:hyperlink w:anchor="_Toc242017709" w:history="1">
         <w:r>
           <w:rPr>
             <w:rStyle w:val="af"/>
@@ -2140,7 +2140,7 @@
             <w:noProof/>
             <w:webHidden/>
           </w:rPr>
-          <w:instrText xml:space="preserve"> PAGEREF _Toc242012092 \h </w:instrText>
+          <w:instrText xml:space="preserve"> PAGEREF _Toc242017709 \h </w:instrText>
         </w:r>
         <w:r>
           <w:rPr>
@@ -2181,7 +2181,7 @@
           <w:noProof/>
         </w:rPr>
       </w:pPr>
-      <w:hyperlink w:anchor="_Toc242012093" w:history="1">
+      <w:hyperlink w:anchor="_Toc242017710" w:history="1">
         <w:r>
           <w:rPr>
             <w:rStyle w:val="af"/>
@@ -2209,7 +2209,7 @@
             <w:noProof/>
             <w:webHidden/>
           </w:rPr>
-          <w:instrText xml:space="preserve"> PAGEREF _Toc242012093 \h </w:instrText>
+          <w:instrText xml:space="preserve"> PAGEREF _Toc242017710 \h </w:instrText>
         </w:r>
         <w:r>
           <w:rPr>
@@ -2250,7 +2250,7 @@
           <w:noProof/>
         </w:rPr>
       </w:pPr>
-      <w:hyperlink w:anchor="_Toc242012094" w:history="1">
+      <w:hyperlink w:anchor="_Toc242017711" w:history="1">
         <w:r>
           <w:rPr>
             <w:rStyle w:val="af"/>
@@ -2278,7 +2278,7 @@
             <w:noProof/>
             <w:webHidden/>
           </w:rPr>
-          <w:instrText xml:space="preserve"> PAGEREF _Toc242012094 \h </w:instrText>
+          <w:instrText xml:space="preserve"> PAGEREF _Toc242017711 \h </w:instrText>
         </w:r>
         <w:r>
           <w:rPr>
@@ -2324,7 +2324,7 @@
         <w:spacing w:before="0" w:after="360" w:line="360" w:lineRule="exact"/>
         <w:ind w:firstLine="709"/>
       </w:pPr>
-      <w:bookmarkStart w:id="1" w:name="_Toc242012066"/>
+      <w:bookmarkStart w:id="1" w:name="_Toc242017683"/>
       <w:r>
         <w:rPr>
           <w:b/>
@@ -2630,7 +2630,7 @@
         <w:ind w:firstLine="709"/>
       </w:pPr>
       <w:bookmarkStart w:id="2" w:name="_b608aa976fc82a0faaf3b83f58c735968afd03b"/>
-      <w:bookmarkStart w:id="3" w:name="_Toc242012067"/>
+      <w:bookmarkStart w:id="3" w:name="_Toc242017684"/>
       <w:bookmarkEnd w:id="0"/>
       <w:r>
         <w:rPr>
@@ -2708,7 +2708,7 @@
         <w:ind w:firstLine="709"/>
       </w:pPr>
       <w:bookmarkStart w:id="4" w:name="_6ea6bf0a5ec92c733c53e44899cf0806bdc5e39"/>
-      <w:bookmarkStart w:id="5" w:name="_Toc242012068"/>
+      <w:bookmarkStart w:id="5" w:name="_Toc242017685"/>
       <w:r>
         <w:rPr>
           <w:b/>
@@ -3658,7 +3658,7 @@
         <w:ind w:firstLine="709"/>
       </w:pPr>
       <w:bookmarkStart w:id="6" w:name="_7a0c967539b5ef143597c37b0951dae8b296890"/>
-      <w:bookmarkStart w:id="7" w:name="_Toc242012069"/>
+      <w:bookmarkStart w:id="7" w:name="_Toc242017686"/>
       <w:bookmarkEnd w:id="4"/>
       <w:r>
         <w:rPr>
@@ -5920,7 +5920,7 @@
           <w:i/>
           <w:sz w:val="28"/>
         </w:rPr>
-        <w:t>Datarails</w:t>
+        <w:t>Rows</w:t>
       </w:r>
       <w:r>
         <w:rPr>
@@ -5939,33 +5939,20 @@
         <w:rPr>
           <w:sz w:val="28"/>
         </w:rPr>
-        <w:t xml:space="preserve">-помощники и </w:t>
-      </w:r>
-      <w:r>
-        <w:rPr>
-          <w:i/>
-          <w:sz w:val="28"/>
-        </w:rPr>
-        <w:t>FP</w:t>
-      </w:r>
-      <w:r>
-        <w:rPr>
-          <w:sz w:val="28"/>
-        </w:rPr>
-        <w:t>&amp;</w:t>
-      </w:r>
-      <w:r>
-        <w:rPr>
-          <w:i/>
-          <w:sz w:val="28"/>
-        </w:rPr>
-        <w:t>A</w:t>
-      </w:r>
-      <w:r>
-        <w:rPr>
-          <w:sz w:val="28"/>
-        </w:rPr>
-        <w:t xml:space="preserve">-платформа, а </w:t>
+        <w:t xml:space="preserve">-помощники и таблица с </w:t>
+      </w:r>
+      <w:r>
+        <w:rPr>
+          <w:i/>
+          <w:sz w:val="28"/>
+        </w:rPr>
+        <w:t>AI</w:t>
+      </w:r>
+      <w:r>
+        <w:rPr>
+          <w:sz w:val="28"/>
+        </w:rPr>
+        <w:t xml:space="preserve">, а </w:t>
       </w:r>
       <w:r>
         <w:rPr>
@@ -6098,7 +6085,7 @@
           <w:sz w:val="28"/>
         </w:rPr>
         <w:drawing>
-          <wp:inline distT="0" distB="0" distL="0" distR="0" wp14:anchorId="4E0F5207" wp14:editId="3CCAAC09">
+          <wp:inline distT="0" distB="0" distL="0" distR="0" wp14:anchorId="35DE2C9F" wp14:editId="276295E5">
             <wp:extent cx="5334000" cy="3122341"/>
             <wp:effectExtent l="0" t="0" r="0" b="0"/>
             <wp:docPr id="12" name="Picture"/>
@@ -6915,7 +6902,7 @@
           <w:sz w:val="28"/>
         </w:rPr>
         <w:drawing>
-          <wp:inline distT="0" distB="0" distL="0" distR="0" wp14:anchorId="4636B8C6" wp14:editId="3C5B6629">
+          <wp:inline distT="0" distB="0" distL="0" distR="0" wp14:anchorId="0C1D4CA2" wp14:editId="5B119F8B">
             <wp:extent cx="5334000" cy="3252439"/>
             <wp:effectExtent l="0" t="0" r="0" b="0"/>
             <wp:docPr id="15" name="Picture"/>
@@ -11256,7 +11243,7 @@
           <w:sz w:val="28"/>
         </w:rPr>
         <w:drawing>
-          <wp:inline distT="0" distB="0" distL="0" distR="0" wp14:anchorId="196B11C2" wp14:editId="3B94F14E">
+          <wp:inline distT="0" distB="0" distL="0" distR="0" wp14:anchorId="4E227648" wp14:editId="1B207962">
             <wp:extent cx="5334000" cy="3122341"/>
             <wp:effectExtent l="0" t="0" r="0" b="0"/>
             <wp:docPr id="18" name="Picture"/>
@@ -13536,47 +13523,65 @@
               <w:rPr>
                 <w:sz w:val="24"/>
               </w:rPr>
+              <w:t>-</w:t>
+            </w:r>
+          </w:p>
+        </w:tc>
+        <w:tc>
+          <w:tcPr>
+            <w:tcW w:w="1107" w:type="dxa"/>
+            <w:vAlign w:val="center"/>
+          </w:tcPr>
+          <w:p>
+            <w:pPr>
+              <w:pStyle w:val="Compact"/>
+              <w:spacing w:before="0" w:after="0" w:line="280" w:lineRule="exact"/>
+              <w:jc w:val="center"/>
+            </w:pPr>
+            <w:r>
+              <w:rPr>
+                <w:sz w:val="24"/>
+              </w:rPr>
+              <w:t>-</w:t>
+            </w:r>
+          </w:p>
+        </w:tc>
+        <w:tc>
+          <w:tcPr>
+            <w:tcW w:w="1107" w:type="dxa"/>
+            <w:vAlign w:val="center"/>
+          </w:tcPr>
+          <w:p>
+            <w:pPr>
+              <w:pStyle w:val="Compact"/>
+              <w:spacing w:before="0" w:after="0" w:line="280" w:lineRule="exact"/>
+              <w:jc w:val="center"/>
+            </w:pPr>
+            <w:r>
+              <w:rPr>
+                <w:sz w:val="24"/>
+              </w:rPr>
+              <w:t>-</w:t>
+            </w:r>
+          </w:p>
+        </w:tc>
+        <w:tc>
+          <w:tcPr>
+            <w:tcW w:w="1642" w:type="dxa"/>
+            <w:vAlign w:val="center"/>
+          </w:tcPr>
+          <w:p>
+            <w:pPr>
+              <w:pStyle w:val="Compact"/>
+              <w:spacing w:before="0" w:after="0" w:line="280" w:lineRule="exact"/>
+              <w:jc w:val="center"/>
+            </w:pPr>
+            <w:r>
+              <w:rPr>
+                <w:sz w:val="24"/>
+              </w:rPr>
               <w:t>47,5 %</w:t>
             </w:r>
-          </w:p>
-        </w:tc>
-        <w:tc>
-          <w:tcPr>
-            <w:tcW w:w="1107" w:type="dxa"/>
-            <w:vAlign w:val="center"/>
-          </w:tcPr>
-          <w:p>
-            <w:pPr>
-              <w:pStyle w:val="Compact"/>
-              <w:spacing w:before="0" w:after="0" w:line="280" w:lineRule="exact"/>
-              <w:jc w:val="center"/>
-            </w:pPr>
-          </w:p>
-        </w:tc>
-        <w:tc>
-          <w:tcPr>
-            <w:tcW w:w="1107" w:type="dxa"/>
-            <w:vAlign w:val="center"/>
-          </w:tcPr>
-          <w:p>
-            <w:pPr>
-              <w:pStyle w:val="Compact"/>
-              <w:spacing w:before="0" w:after="0" w:line="280" w:lineRule="exact"/>
-              <w:jc w:val="center"/>
-            </w:pPr>
-          </w:p>
-        </w:tc>
-        <w:tc>
-          <w:tcPr>
-            <w:tcW w:w="1642" w:type="dxa"/>
-            <w:vAlign w:val="center"/>
-          </w:tcPr>
-          <w:p>
-            <w:pPr>
-              <w:pStyle w:val="Compact"/>
-              <w:spacing w:before="0" w:after="0" w:line="280" w:lineRule="exact"/>
-              <w:jc w:val="center"/>
-            </w:pPr>
           </w:p>
         </w:tc>
       </w:tr>
@@ -13940,7 +13945,7 @@
           <w:sz w:val="28"/>
         </w:rPr>
         <w:drawing>
-          <wp:inline distT="0" distB="0" distL="0" distR="0" wp14:anchorId="5BFA0F28" wp14:editId="232458DC">
+          <wp:inline distT="0" distB="0" distL="0" distR="0" wp14:anchorId="47DD542E" wp14:editId="10F34FAA">
             <wp:extent cx="5334000" cy="3122341"/>
             <wp:effectExtent l="0" t="0" r="0" b="0"/>
             <wp:docPr id="21" name="Picture"/>
@@ -14087,7 +14092,7 @@
         <w:ind w:firstLine="709"/>
       </w:pPr>
       <w:bookmarkStart w:id="8" w:name="_da959056159f19dff160d665d57702b18af1ddd"/>
-      <w:bookmarkStart w:id="9" w:name="_Toc242012070"/>
+      <w:bookmarkStart w:id="9" w:name="_Toc242017687"/>
       <w:bookmarkEnd w:id="6"/>
       <w:r>
         <w:rPr>
@@ -17182,7 +17187,7 @@
         <w:ind w:firstLine="709"/>
       </w:pPr>
       <w:bookmarkStart w:id="10" w:name="_06e2001e7574ebc77f8406bc11ca3db76d00c2a"/>
-      <w:bookmarkStart w:id="11" w:name="_Toc242012071"/>
+      <w:bookmarkStart w:id="11" w:name="_Toc242017688"/>
       <w:bookmarkEnd w:id="8"/>
       <w:r>
         <w:rPr>
@@ -17600,7 +17605,7 @@
               <w:rPr>
                 <w:sz w:val="24"/>
               </w:rPr>
-              <w:t>0</w:t>
+              <w:t>26 376</w:t>
             </w:r>
           </w:p>
         </w:tc>
@@ -17619,7 +17624,7 @@
               <w:rPr>
                 <w:sz w:val="24"/>
               </w:rPr>
-              <w:t>0</w:t>
+              <w:t>344 256</w:t>
             </w:r>
           </w:p>
         </w:tc>
@@ -17638,7 +17643,7 @@
               <w:rPr>
                 <w:sz w:val="24"/>
               </w:rPr>
-              <w:t>0</w:t>
+              <w:t>2 511 656</w:t>
             </w:r>
           </w:p>
         </w:tc>
@@ -17839,7 +17844,7 @@
         <w:rPr>
           <w:sz w:val="28"/>
         </w:rPr>
-        <w:t>Базовая выручка новых платящих по цифровому каналу составляет около 0 </w:t>
+        <w:t>Базовая выручка новых платящих по цифровому каналу составляет около 344 256 </w:t>
       </w:r>
       <w:r>
         <w:rPr>
@@ -17891,13 +17896,13 @@
         <w:rPr>
           <w:sz w:val="28"/>
         </w:rPr>
-        <w:t>. Размах от осторожного до оптимистичного сценария - почти три порядка, что типично для рынка, где основной параметр (конверсия</w:t>
-      </w:r>
-      <w:r>
-        <w:rPr>
-          <w:sz w:val="28"/>
-        </w:rPr>
-        <w:t>) пока не измерен на собственном продукте.</w:t>
+        <w:t>. Размах от осторожного до оптимистичного сценария - почти три порядка, что типично для рынка, где основной параметр (кон</w:t>
+      </w:r>
+      <w:r>
+        <w:rPr>
+          <w:sz w:val="28"/>
+        </w:rPr>
+        <w:t>версия) пока не измерен на собственном продукте.</w:t>
       </w:r>
     </w:p>
     <w:p>
@@ -17925,7 +17930,7 @@
         <w:rPr>
           <w:sz w:val="28"/>
         </w:rPr>
-        <w:t xml:space="preserve">: при комиссии магазина 3 % (допущение Д-14, условия </w:t>
+        <w:t xml:space="preserve">: при комиссии магазина 3 % (допущение Д-14, подтверждено условиями </w:t>
       </w:r>
       <w:r>
         <w:rPr>
@@ -17938,7 +17943,7 @@
         <w:rPr>
           <w:sz w:val="28"/>
         </w:rPr>
-        <w:t xml:space="preserve"> требуют проверки) оборот через магазин надстроек в базовом сценарии - 898 059 </w:t>
+        <w:t xml:space="preserve"> [15]) оборот через магазин надстроек в базовом сценарии - 898 059 </w:t>
       </w:r>
       <w:r>
         <w:rPr>
@@ -17951,13 +17956,13 @@
         <w:rPr>
           <w:sz w:val="28"/>
         </w:rPr>
-        <w:t xml:space="preserve"> в год, комиссия</w:t>
-      </w:r>
-      <w:r>
-        <w:rPr>
-          <w:sz w:val="28"/>
-        </w:rPr>
-        <w:t xml:space="preserve"> - 26 942 </w:t>
+        <w:t xml:space="preserve"> в год,</w:t>
+      </w:r>
+      <w:r>
+        <w:rPr>
+          <w:sz w:val="28"/>
+        </w:rPr>
+        <w:t xml:space="preserve"> комиссия - 26 942 </w:t>
       </w:r>
       <w:r>
         <w:rPr>
@@ -17980,7 +17985,7 @@
         <w:ind w:firstLine="709"/>
       </w:pPr>
       <w:bookmarkStart w:id="12" w:name="_606fa79e4d4f49d8da929021c2a978685b741ea"/>
-      <w:bookmarkStart w:id="13" w:name="_Toc242012072"/>
+      <w:bookmarkStart w:id="13" w:name="_Toc242017689"/>
       <w:bookmarkEnd w:id="10"/>
       <w:r>
         <w:rPr>
@@ -18002,13 +18007,13 @@
         <w:rPr>
           <w:sz w:val="28"/>
         </w:rPr>
-        <w:t>Клиентская база строится по профессиональным сегментам и по малому бизнесу. Для США использован</w:t>
-      </w:r>
-      <w:r>
-        <w:rPr>
-          <w:sz w:val="28"/>
-        </w:rPr>
-        <w:t>ы данные Бюро статистики труда (</w:t>
+        <w:t>Клиентская база строится по профессиональным сегментам и по малому бизнесу. Для США ис</w:t>
+      </w:r>
+      <w:r>
+        <w:rPr>
+          <w:sz w:val="28"/>
+        </w:rPr>
+        <w:t>пользованы данные Бюро статистики труда (</w:t>
       </w:r>
       <w:r>
         <w:rPr>
@@ -18034,13 +18039,13 @@
         <w:rPr>
           <w:sz w:val="28"/>
         </w:rPr>
-        <w:t xml:space="preserve">, 2025) [7], </w:t>
-      </w:r>
-      <w:r>
-        <w:rPr>
-          <w:sz w:val="28"/>
-        </w:rPr>
-        <w:t>около 1,42 миллиона британских работодателей [8] и около 34 миллионов МСП ЕС по отчету Европейской комиссии 2025/2026 [9].</w:t>
+        <w:t>, 20</w:t>
+      </w:r>
+      <w:r>
+        <w:rPr>
+          <w:sz w:val="28"/>
+        </w:rPr>
+        <w:t>25) [7], около 1,42 миллиона британских работодателей [8] и около 34 миллионов МСП ЕС по отчету Европейской комиссии 2025/2026 [9].</w:t>
       </w:r>
     </w:p>
     <w:p>
@@ -18054,13 +18059,13 @@
         <w:rPr>
           <w:sz w:val="28"/>
         </w:rPr>
-        <w:t>Занятость за пределами США оценена масштабом по числу занятых: 0,45 для Великобритании, Канады, Австралии и Ирландии и 1,30 для ЕС-27</w:t>
-      </w:r>
-      <w:r>
-        <w:rPr>
-          <w:sz w:val="28"/>
-        </w:rPr>
-        <w:t xml:space="preserve"> (допущение Д-10); проверка по </w:t>
+        <w:t xml:space="preserve">Занятость за пределами США оценена масштабом по числу занятых: 0,45 для Великобритании, Канады, Австралии и Ирландии и 1,30 </w:t>
+      </w:r>
+      <w:r>
+        <w:rPr>
+          <w:sz w:val="28"/>
+        </w:rPr>
+        <w:t xml:space="preserve">для ЕС-27 (допущение Д-10); проверка по </w:t>
       </w:r>
       <w:r>
         <w:rPr>
@@ -20428,7 +20433,7 @@
         <w:ind w:firstLine="709"/>
       </w:pPr>
       <w:bookmarkStart w:id="14" w:name="_2314d5998da626860a70184e0b470b0b8504694"/>
-      <w:bookmarkStart w:id="15" w:name="_Toc242012073"/>
+      <w:bookmarkStart w:id="15" w:name="_Toc242017690"/>
       <w:bookmarkEnd w:id="12"/>
       <w:r>
         <w:rPr>
@@ -21056,7 +21061,7 @@
         <w:ind w:firstLine="709"/>
       </w:pPr>
       <w:bookmarkStart w:id="16" w:name="_42bac9f10c820a94a4112d44417ea6b5d14bf7d"/>
-      <w:bookmarkStart w:id="17" w:name="_Toc242012074"/>
+      <w:bookmarkStart w:id="17" w:name="_Toc242017691"/>
       <w:bookmarkEnd w:id="14"/>
       <w:r>
         <w:rPr>
@@ -22894,7 +22899,7 @@
         <w:rPr>
           <w:sz w:val="28"/>
         </w:rPr>
-        <w:t>, поэтому 3 % - верхняя оценка) оборот через магазин равен 12 </w:t>
+        <w:t>, поэтому 3 % - верхняя оценка) оборот через магазин равен 414 </w:t>
       </w:r>
       <w:r>
         <w:rPr>
@@ -22907,6 +22912,51 @@
         <w:rPr>
           <w:sz w:val="28"/>
         </w:rPr>
+        <w:t>, 1 8</w:t>
+      </w:r>
+      <w:r>
+        <w:rPr>
+          <w:sz w:val="28"/>
+        </w:rPr>
+        <w:t>65 </w:t>
+      </w:r>
+      <w:r>
+        <w:rPr>
+          <w:i/>
+          <w:sz w:val="28"/>
+        </w:rPr>
+        <w:t>EUR</w:t>
+      </w:r>
+      <w:r>
+        <w:rPr>
+          <w:sz w:val="28"/>
+        </w:rPr>
+        <w:t xml:space="preserve"> и 4 870 </w:t>
+      </w:r>
+      <w:r>
+        <w:rPr>
+          <w:i/>
+          <w:sz w:val="28"/>
+        </w:rPr>
+        <w:t>EUR</w:t>
+      </w:r>
+      <w:r>
+        <w:rPr>
+          <w:sz w:val="28"/>
+        </w:rPr>
+        <w:t xml:space="preserve"> в год, комиссия - 12 </w:t>
+      </w:r>
+      <w:r>
+        <w:rPr>
+          <w:i/>
+          <w:sz w:val="28"/>
+        </w:rPr>
+        <w:t>EUR</w:t>
+      </w:r>
+      <w:r>
+        <w:rPr>
+          <w:sz w:val="28"/>
+        </w:rPr>
         <w:t>, 56 </w:t>
       </w:r>
       <w:r>
@@ -22914,14 +22964,7 @@
           <w:i/>
           <w:sz w:val="28"/>
         </w:rPr>
-        <w:t>E</w:t>
-      </w:r>
-      <w:r>
-        <w:rPr>
-          <w:i/>
-          <w:sz w:val="28"/>
-        </w:rPr>
-        <w:t>UR</w:t>
+        <w:t>EUR</w:t>
       </w:r>
       <w:r>
         <w:rPr>
@@ -22940,20 +22983,7 @@
         <w:rPr>
           <w:sz w:val="28"/>
         </w:rPr>
-        <w:t xml:space="preserve"> в год, комиссия - 56 </w:t>
-      </w:r>
-      <w:r>
-        <w:rPr>
-          <w:i/>
-          <w:sz w:val="28"/>
-        </w:rPr>
-        <w:t>EUR</w:t>
-      </w:r>
-      <w:r>
-        <w:rPr>
-          <w:sz w:val="28"/>
-        </w:rPr>
-        <w:t xml:space="preserve"> в базовом сценарии. Канал дешевый по комиссии, но не заменяет основной трафик: его вклад зависит от видимости надстройки в магазине, которой пока нет. Данные об </w:t>
+        <w:t xml:space="preserve"> в год соответственно. Канал дешевый по комиссии, но не заменяет основной трафик: его вклад зависит от видимости надстройки в магазине, которой пока нет. Данные об </w:t>
       </w:r>
       <w:r>
         <w:rPr>
@@ -22966,13 +22996,13 @@
         <w:rPr>
           <w:sz w:val="28"/>
         </w:rPr>
-        <w:t xml:space="preserve"> (число надстроек, отзывы) в этой работе не соби</w:t>
-      </w:r>
-      <w:r>
-        <w:rPr>
-          <w:sz w:val="28"/>
-        </w:rPr>
-        <w:t>рались и вынесены в приложение Б.</w:t>
+        <w:t xml:space="preserve"> (число надстроек, отз</w:t>
+      </w:r>
+      <w:r>
+        <w:rPr>
+          <w:sz w:val="28"/>
+        </w:rPr>
+        <w:t>ывы) в этой работе не собирались и вынесены в приложение Б.</w:t>
       </w:r>
     </w:p>
     <w:p>
@@ -22986,13 +23016,13 @@
         <w:rPr>
           <w:sz w:val="28"/>
         </w:rPr>
-        <w:t xml:space="preserve">Методика оценки рынка через маркетплейсы и платформы [2] предлагает считать число сделок по числу отзывов: сделки равны отзывам, деленным на долю покупателей, оставляющих отзыв (10 %, 5 % и 2 % для осторожного, базового и </w:t>
-      </w:r>
-      <w:r>
-        <w:rPr>
-          <w:sz w:val="28"/>
-        </w:rPr>
-        <w:t xml:space="preserve">оптимистичного сценариев). Для </w:t>
+        <w:t>Методика оценки рынка через маркетплейсы и платформы [2] предлагает считать число сделок по числу отзывов: сделки равны отзывам, деленным на долю покупателей, оставляющих отзыв (10 %, 5 % и 2 % дл</w:t>
+      </w:r>
+      <w:r>
+        <w:rPr>
+          <w:sz w:val="28"/>
+        </w:rPr>
+        <w:t xml:space="preserve">я осторожного, базового и оптимистичного сценариев). Для </w:t>
       </w:r>
       <w:r>
         <w:rPr>
@@ -23057,7 +23087,14 @@
         <w:rPr>
           <w:sz w:val="28"/>
         </w:rPr>
-        <w:t xml:space="preserve">, где представлены конкуренты. Метод применен к </w:t>
+        <w:t xml:space="preserve">, </w:t>
+      </w:r>
+      <w:r>
+        <w:rPr>
+          <w:sz w:val="28"/>
+        </w:rPr>
+        <w:lastRenderedPageBreak/>
+        <w:t xml:space="preserve">где представлены конкуренты. Метод применен к </w:t>
       </w:r>
       <w:r>
         <w:rPr>
@@ -23070,20 +23107,13 @@
         <w:rPr>
           <w:sz w:val="28"/>
         </w:rPr>
-        <w:t xml:space="preserve">, единственному </w:t>
-      </w:r>
-      <w:r>
-        <w:rPr>
-          <w:sz w:val="28"/>
-        </w:rPr>
-        <w:lastRenderedPageBreak/>
-        <w:t xml:space="preserve">конкуренту, у которого известны и число отзывов, и заявленное </w:t>
-      </w:r>
-      <w:r>
-        <w:rPr>
-          <w:sz w:val="28"/>
-        </w:rPr>
-        <w:t>число клиентов.</w:t>
+        <w:t xml:space="preserve">, единственному конкуренту, у которого известны и число </w:t>
+      </w:r>
+      <w:r>
+        <w:rPr>
+          <w:sz w:val="28"/>
+        </w:rPr>
+        <w:t>отзывов, и заявленное число клиентов.</w:t>
       </w:r>
     </w:p>
     <w:p>
@@ -23258,7 +23288,14 @@
                 <w:b/>
                 <w:sz w:val="24"/>
               </w:rPr>
-              <w:t>Доля оставляющих отзыв</w:t>
+              <w:t>Доля оставляющих отз</w:t>
+            </w:r>
+            <w:r>
+              <w:rPr>
+                <w:b/>
+                <w:sz w:val="24"/>
+              </w:rPr>
+              <w:t>ыв</w:t>
             </w:r>
           </w:p>
         </w:tc>
@@ -23298,14 +23335,7 @@
                 <w:b/>
                 <w:sz w:val="24"/>
               </w:rPr>
-              <w:t>Расче</w:t>
-            </w:r>
-            <w:r>
-              <w:rPr>
-                <w:b/>
-                <w:sz w:val="24"/>
-              </w:rPr>
-              <w:t>тное число клиентов</w:t>
+              <w:t>Расчетное число клиентов</w:t>
             </w:r>
           </w:p>
         </w:tc>
@@ -23820,13 +23850,13 @@
         <w:rPr>
           <w:sz w:val="28"/>
         </w:rPr>
-        <w:t xml:space="preserve"> отзывов на крупных площадках не найдено), следовательно, методика к ним неприменима, а их масштаб</w:t>
-      </w:r>
-      <w:r>
-        <w:rPr>
-          <w:sz w:val="28"/>
-        </w:rPr>
-        <w:t xml:space="preserve"> оценивается по трафику </w:t>
+        <w:t xml:space="preserve"> отзывов на крупных площ</w:t>
+      </w:r>
+      <w:r>
+        <w:rPr>
+          <w:sz w:val="28"/>
+        </w:rPr>
+        <w:t xml:space="preserve">адках не найдено), следовательно, методика к ним неприменима, а их масштаб оценивается по трафику </w:t>
       </w:r>
       <w:r>
         <w:rPr>
@@ -23878,13 +23908,13 @@
         <w:rPr>
           <w:sz w:val="28"/>
         </w:rPr>
-        <w:t xml:space="preserve"> станут заметным конкурентным преимуществом, а оценка рынка через отзывы в этом сегменте сводится к проверочной роли и не заменяет расчета по</w:t>
-      </w:r>
-      <w:r>
-        <w:rPr>
-          <w:sz w:val="28"/>
-        </w:rPr>
-        <w:t xml:space="preserve"> трафику и потенциальным клиентам.</w:t>
+        <w:t xml:space="preserve"> станут заметным конкурентным преимуществом, а оценка рынка через о</w:t>
+      </w:r>
+      <w:r>
+        <w:rPr>
+          <w:sz w:val="28"/>
+        </w:rPr>
+        <w:t>тзывы в этом сегменте сводится к проверочной роли и не заменяет расчета по трафику и потенциальным клиентам.</w:t>
       </w:r>
     </w:p>
     <w:p>
@@ -23894,7 +23924,7 @@
         <w:ind w:firstLine="709"/>
       </w:pPr>
       <w:bookmarkStart w:id="18" w:name="_62882a27ae1c57302eff280b02701a311900947"/>
-      <w:bookmarkStart w:id="19" w:name="_Toc242012075"/>
+      <w:bookmarkStart w:id="19" w:name="_Toc242017692"/>
       <w:bookmarkEnd w:id="16"/>
       <w:r>
         <w:rPr>
@@ -23942,13 +23972,13 @@
         <w:rPr>
           <w:sz w:val="28"/>
         </w:rPr>
-        <w:t xml:space="preserve"> и Яндекс Вордстат за 12 месяцев. Вордстат охватывает Россию и Беларусь, поэтому методика применена к контрольно</w:t>
-      </w:r>
-      <w:r>
-        <w:rPr>
-          <w:sz w:val="28"/>
-        </w:rPr>
-        <w:t>му русскоязычному сегменту, а не к основной территории. Для основной территории абсолютные частотности недоступны (</w:t>
+        <w:t xml:space="preserve"> и Яндекс Вордстат за 12 месяцев. Ворд</w:t>
+      </w:r>
+      <w:r>
+        <w:rPr>
+          <w:sz w:val="28"/>
+        </w:rPr>
+        <w:t>стат охватывает Россию и Беларусь, поэтому методика применена к контрольному русскоязычному сегменту, а не к основной территории. Для основной территории абсолютные частотности недоступны (</w:t>
       </w:r>
       <w:r>
         <w:rPr>
@@ -23974,7 +24004,13 @@
         <w:rPr>
           <w:sz w:val="28"/>
         </w:rPr>
-        <w:t xml:space="preserve"> дает только индекс), и ее поисковый канал оценен по органическому трафику сайтов конкурентов из </w:t>
+        <w:t xml:space="preserve"> дает только индекс), и ее поисковый канал оценен по о</w:t>
+      </w:r>
+      <w:r>
+        <w:rPr>
+          <w:sz w:val="28"/>
+        </w:rPr>
+        <w:t xml:space="preserve">рганическому трафику сайтов конкурентов из </w:t>
       </w:r>
       <w:r>
         <w:rPr>
@@ -24001,13 +24037,7 @@
         <w:rPr>
           <w:sz w:val="28"/>
         </w:rPr>
-        <w:t>В таблице 18 предст</w:t>
-      </w:r>
-      <w:r>
-        <w:rPr>
-          <w:sz w:val="28"/>
-        </w:rPr>
-        <w:t>авлено: семантическое ядро расчета и показатели спроса.</w:t>
+        <w:t>В таблице 18 представлено: семантическое ядро расчета и показатели спроса.</w:t>
       </w:r>
     </w:p>
     <w:p>
@@ -25111,13 +25141,7 @@
         <w:rPr>
           <w:sz w:val="28"/>
         </w:rPr>
-        <w:t xml:space="preserve"> вес релева</w:t>
-      </w:r>
-      <w:r>
-        <w:rPr>
-          <w:sz w:val="28"/>
-        </w:rPr>
-        <w:t xml:space="preserve">нтности </w:t>
+        <w:t xml:space="preserve"> вес релевантности </w:t>
       </w:r>
       <w:r>
         <w:rPr>
@@ -25270,7 +25294,7 @@
         <w:ind w:firstLine="709"/>
       </w:pPr>
       <w:bookmarkStart w:id="20" w:name="_2c7ec3ecf17663584d0d27e07e31cbd2a0948cf"/>
-      <w:bookmarkStart w:id="21" w:name="_Toc242012076"/>
+      <w:bookmarkStart w:id="21" w:name="_Toc242017693"/>
       <w:bookmarkEnd w:id="18"/>
       <w:r>
         <w:rPr>
@@ -26199,7 +26223,20 @@
         <w:rPr>
           <w:sz w:val="28"/>
         </w:rPr>
-        <w:t xml:space="preserve">, </w:t>
+        <w:t xml:space="preserve"> (2,75 </w:t>
+      </w:r>
+      <w:r>
+        <w:rPr>
+          <w:i/>
+          <w:sz w:val="28"/>
+        </w:rPr>
+        <w:t>GBP</w:t>
+      </w:r>
+      <w:r>
+        <w:rPr>
+          <w:sz w:val="28"/>
+        </w:rPr>
+        <w:t xml:space="preserve"> за пользователя в месяц) и </w:t>
       </w:r>
       <w:r>
         <w:rPr>
@@ -26212,7 +26249,33 @@
         <w:rPr>
           <w:sz w:val="28"/>
         </w:rPr>
-        <w:t xml:space="preserve"> и </w:t>
+        <w:t xml:space="preserve"> (</w:t>
+      </w:r>
+      <w:r>
+        <w:rPr>
+          <w:i/>
+          <w:sz w:val="28"/>
+        </w:rPr>
+        <w:t>OAK</w:t>
+      </w:r>
+      <w:r>
+        <w:rPr>
+          <w:sz w:val="28"/>
+        </w:rPr>
+        <w:t xml:space="preserve"> 311,66 </w:t>
+      </w:r>
+      <w:r>
+        <w:rPr>
+          <w:i/>
+          <w:sz w:val="28"/>
+        </w:rPr>
+        <w:t>GBP</w:t>
+      </w:r>
+      <w:r>
+        <w:rPr>
+          <w:sz w:val="28"/>
+        </w:rPr>
+        <w:t xml:space="preserve"> в год) найдены позднее и приведены в приложении Д; цена </w:t>
       </w:r>
       <w:r>
         <w:rPr>
@@ -26225,7 +26288,20 @@
         <w:rPr>
           <w:sz w:val="28"/>
         </w:rPr>
-        <w:t xml:space="preserve"> не опубликованы, их нужно доснять.</w:t>
+        <w:t xml:space="preserve"> </w:t>
+      </w:r>
+      <w:r>
+        <w:rPr>
+          <w:i/>
+          <w:sz w:val="28"/>
+        </w:rPr>
+        <w:t>AI</w:t>
+      </w:r>
+      <w:r>
+        <w:rPr>
+          <w:sz w:val="28"/>
+        </w:rPr>
+        <w:t xml:space="preserve"> в изученных источниках не зафиксирована.</w:t>
       </w:r>
     </w:p>
     <w:p>
@@ -26252,7 +26328,13 @@
         <w:rPr>
           <w:sz w:val="28"/>
         </w:rPr>
-        <w:t>Таблица 20 – Индекс платежеспособности сегментов</w:t>
+        <w:t>Табли</w:t>
+      </w:r>
+      <w:r>
+        <w:rPr>
+          <w:sz w:val="28"/>
+        </w:rPr>
+        <w:t>ца 20 – Индекс платежеспособности сегментов</w:t>
       </w:r>
     </w:p>
     <w:tbl>
@@ -27491,7 +27573,14 @@
         <w:rPr>
           <w:sz w:val="28"/>
         </w:rPr>
-        <w:t xml:space="preserve"> за год - 11,0. Эффект рассчитан по экономии времени проверки (допущение Д-11: 20 % рабочего времени на проверку и поиск ошибок, из них 45 % экономится) и не включает стоимость пропущенн</w:t>
+        <w:t xml:space="preserve"> за год - 11,0. Эффект рассчитан по экономии времени проверки (допущение Д-11: 20 % рабочего времени на проверку и поиск ошибок, из </w:t>
+      </w:r>
+      <w:r>
+        <w:rPr>
+          <w:sz w:val="28"/>
+        </w:rPr>
+        <w:lastRenderedPageBreak/>
+        <w:t>них 45 % экономится) и не включает стоимость пропущенн</w:t>
       </w:r>
       <w:r>
         <w:rPr>
@@ -27511,7 +27600,6 @@
         <w:rPr>
           <w:sz w:val="28"/>
         </w:rPr>
-        <w:lastRenderedPageBreak/>
         <w:t>Платежеспособный объем рынка по книге 3 равен 35 003 121 </w:t>
       </w:r>
       <w:r>
@@ -27606,7 +27694,7 @@
         <w:ind w:firstLine="709"/>
       </w:pPr>
       <w:bookmarkStart w:id="22" w:name="_8d34778965163a5752bc27698d1f7e786ff5c87"/>
-      <w:bookmarkStart w:id="23" w:name="_Toc242012077"/>
+      <w:bookmarkStart w:id="23" w:name="_Toc242017694"/>
       <w:bookmarkEnd w:id="20"/>
       <w:r>
         <w:rPr>
@@ -28719,6 +28807,7 @@
         <w:rPr>
           <w:sz w:val="28"/>
         </w:rPr>
+        <w:lastRenderedPageBreak/>
         <w:t xml:space="preserve">На рисунке 5 показано: диапазоны оценок по методам, </w:t>
       </w:r>
       <w:r>
@@ -28747,9 +28836,8 @@
           <w:noProof/>
           <w:sz w:val="28"/>
         </w:rPr>
-        <w:lastRenderedPageBreak/>
         <w:drawing>
-          <wp:inline distT="0" distB="0" distL="0" distR="0" wp14:anchorId="4471B5E8" wp14:editId="595C51C8">
+          <wp:inline distT="0" distB="0" distL="0" distR="0" wp14:anchorId="6143F643" wp14:editId="074B4973">
             <wp:extent cx="5334000" cy="2992243"/>
             <wp:effectExtent l="0" t="0" r="0" b="0"/>
             <wp:docPr id="32" name="Picture"/>
@@ -29241,6 +29329,7 @@
               <w:rPr>
                 <w:sz w:val="24"/>
               </w:rPr>
+              <w:lastRenderedPageBreak/>
               <w:t>4. Воронка дает малый объем при большом рынке</w:t>
             </w:r>
           </w:p>
@@ -29331,7 +29420,6 @@
               <w:rPr>
                 <w:sz w:val="24"/>
               </w:rPr>
-              <w:lastRenderedPageBreak/>
               <w:t>5. Сценарии сильно различаются</w:t>
             </w:r>
           </w:p>
@@ -29584,7 +29672,7 @@
           <w:sz w:val="28"/>
         </w:rPr>
         <w:drawing>
-          <wp:inline distT="0" distB="0" distL="0" distR="0" wp14:anchorId="45BA50F4" wp14:editId="17C07EAE">
+          <wp:inline distT="0" distB="0" distL="0" distR="0" wp14:anchorId="6E4D83D6" wp14:editId="2EC79863">
             <wp:extent cx="5334000" cy="2471853"/>
             <wp:effectExtent l="0" t="0" r="0" b="0"/>
             <wp:docPr id="35" name="Picture"/>
@@ -29942,7 +30030,14 @@
         <w:rPr>
           <w:sz w:val="28"/>
         </w:rPr>
-        <w:t xml:space="preserve"> в год, базовая оценка 35 003 130 </w:t>
+        <w:t xml:space="preserve"> в год, базовая оценка 35 003 </w:t>
+      </w:r>
+      <w:r>
+        <w:rPr>
+          <w:sz w:val="28"/>
+        </w:rPr>
+        <w:lastRenderedPageBreak/>
+        <w:t>130 </w:t>
       </w:r>
       <w:r>
         <w:rPr>
@@ -30039,14 +30134,7 @@
         <w:rPr>
           <w:sz w:val="28"/>
         </w:rPr>
-        <w:t>пособность сегментов достаточная, цена 9-</w:t>
-      </w:r>
-      <w:r>
-        <w:rPr>
-          <w:sz w:val="28"/>
-        </w:rPr>
-        <w:lastRenderedPageBreak/>
-        <w:t>29 </w:t>
+        <w:t>пособность сегментов достаточная, цена 9-29 </w:t>
       </w:r>
       <w:r>
         <w:rPr>
@@ -30082,7 +30170,7 @@
         <w:ind w:firstLine="709"/>
       </w:pPr>
       <w:bookmarkStart w:id="24" w:name="_e6e1aac57bb528344b9009e4599364161f48047"/>
-      <w:bookmarkStart w:id="25" w:name="_Toc242012078"/>
+      <w:bookmarkStart w:id="25" w:name="_Toc242017695"/>
       <w:bookmarkEnd w:id="22"/>
       <w:r>
         <w:rPr>
@@ -31013,7 +31101,7 @@
         </w:rPr>
         <w:lastRenderedPageBreak/>
         <w:drawing>
-          <wp:inline distT="0" distB="0" distL="0" distR="0" wp14:anchorId="4EC88B1D" wp14:editId="7E8DB052">
+          <wp:inline distT="0" distB="0" distL="0" distR="0" wp14:anchorId="3A2DDA51" wp14:editId="0C1D32CA">
             <wp:extent cx="5334000" cy="2341756"/>
             <wp:effectExtent l="0" t="0" r="0" b="0"/>
             <wp:docPr id="39" name="Picture"/>
@@ -31244,7 +31332,7 @@
         <w:ind w:firstLine="709"/>
       </w:pPr>
       <w:bookmarkStart w:id="26" w:name="_6a64c25cd48aeb5a2bf3dc411d56d805a6b5d7e"/>
-      <w:bookmarkStart w:id="27" w:name="_Toc242012079"/>
+      <w:bookmarkStart w:id="27" w:name="_Toc242017696"/>
       <w:bookmarkEnd w:id="24"/>
       <w:r>
         <w:rPr>
@@ -31303,7 +31391,7 @@
         </w:rPr>
         <w:lastRenderedPageBreak/>
         <w:drawing>
-          <wp:inline distT="0" distB="0" distL="0" distR="0" wp14:anchorId="1CB2435C" wp14:editId="7DCEE6C7">
+          <wp:inline distT="0" distB="0" distL="0" distR="0" wp14:anchorId="57322F4C" wp14:editId="3B4D4E20">
             <wp:extent cx="5334000" cy="2471853"/>
             <wp:effectExtent l="0" t="0" r="0" b="0"/>
             <wp:docPr id="43" name="Picture"/>
@@ -31528,7 +31616,7 @@
         <w:ind w:firstLine="709"/>
       </w:pPr>
       <w:bookmarkStart w:id="28" w:name="_8cdf61ec50cc46d2aaeadce1b560fea28ea116e"/>
-      <w:bookmarkStart w:id="29" w:name="_Toc242012080"/>
+      <w:bookmarkStart w:id="29" w:name="_Toc242017697"/>
       <w:bookmarkEnd w:id="26"/>
       <w:r>
         <w:rPr>
@@ -31644,7 +31732,7 @@
         <w:ind w:firstLine="709"/>
       </w:pPr>
       <w:bookmarkStart w:id="30" w:name="_1bfdad9d2d88ddb6ca16c31c1d4d4943679f32f"/>
-      <w:bookmarkStart w:id="31" w:name="_Toc242012081"/>
+      <w:bookmarkStart w:id="31" w:name="_Toc242017698"/>
       <w:bookmarkEnd w:id="28"/>
       <w:bookmarkEnd w:id="2"/>
       <w:r>
@@ -31691,7 +31779,7 @@
         <w:ind w:firstLine="709"/>
       </w:pPr>
       <w:bookmarkStart w:id="32" w:name="_06422f7af54f54453dc220bd4fce4d21d5e352a"/>
-      <w:bookmarkStart w:id="33" w:name="_Toc242012082"/>
+      <w:bookmarkStart w:id="33" w:name="_Toc242017699"/>
       <w:r>
         <w:rPr>
           <w:b/>
@@ -32235,7 +32323,7 @@
         <w:ind w:firstLine="709"/>
       </w:pPr>
       <w:bookmarkStart w:id="34" w:name="_72026da1879a87af649d24bee854ab93a98e25e"/>
-      <w:bookmarkStart w:id="35" w:name="_Toc242012083"/>
+      <w:bookmarkStart w:id="35" w:name="_Toc242017700"/>
       <w:bookmarkEnd w:id="32"/>
       <w:r>
         <w:rPr>
@@ -32687,7 +32775,7 @@
         <w:ind w:firstLine="709"/>
       </w:pPr>
       <w:bookmarkStart w:id="36" w:name="_dc1f97c8fc945f9da2330408593618e8aab5244"/>
-      <w:bookmarkStart w:id="37" w:name="_Toc242012084"/>
+      <w:bookmarkStart w:id="37" w:name="_Toc242017701"/>
       <w:bookmarkEnd w:id="34"/>
       <w:r>
         <w:rPr>
@@ -33071,7 +33159,7 @@
         <w:jc w:val="center"/>
       </w:pPr>
       <w:bookmarkStart w:id="38" w:name="_выводы"/>
-      <w:bookmarkStart w:id="39" w:name="_Toc242012085"/>
+      <w:bookmarkStart w:id="39" w:name="_Toc242017702"/>
       <w:bookmarkEnd w:id="36"/>
       <w:bookmarkEnd w:id="30"/>
       <w:r>
@@ -33346,7 +33434,7 @@
         <w:jc w:val="center"/>
       </w:pPr>
       <w:bookmarkStart w:id="40" w:name="_274f6a444530ef90b0479dabf3d210f01e97699"/>
-      <w:bookmarkStart w:id="41" w:name="_Toc242012086"/>
+      <w:bookmarkStart w:id="41" w:name="_Toc242017703"/>
       <w:bookmarkEnd w:id="38"/>
       <w:r>
         <w:rPr>
@@ -35536,7 +35624,7 @@
         <w:jc w:val="center"/>
       </w:pPr>
       <w:bookmarkStart w:id="42" w:name="_3d74faf1500c1b2a4a8bfa8e0e37c74206ce73d"/>
-      <w:bookmarkStart w:id="43" w:name="_Toc242012087"/>
+      <w:bookmarkStart w:id="43" w:name="_Toc242017704"/>
       <w:bookmarkEnd w:id="40"/>
       <w:r>
         <w:rPr>
@@ -37003,7 +37091,7 @@
         <w:jc w:val="center"/>
       </w:pPr>
       <w:bookmarkStart w:id="44" w:name="_25083b51e17d9d99817d1269b6af13d75b604a4"/>
-      <w:bookmarkStart w:id="45" w:name="_Toc242012088"/>
+      <w:bookmarkStart w:id="45" w:name="_Toc242017705"/>
       <w:bookmarkEnd w:id="42"/>
       <w:r>
         <w:rPr>
@@ -38215,7 +38303,7 @@
         <w:jc w:val="center"/>
       </w:pPr>
       <w:bookmarkStart w:id="46" w:name="_cb59224a7032ef66ab429e7df9b4e4c597bc187"/>
-      <w:bookmarkStart w:id="47" w:name="_Toc242012089"/>
+      <w:bookmarkStart w:id="47" w:name="_Toc242017706"/>
       <w:bookmarkEnd w:id="44"/>
       <w:r>
         <w:rPr>
@@ -39208,7 +39296,7 @@
         <w:jc w:val="center"/>
       </w:pPr>
       <w:bookmarkStart w:id="48" w:name="_48e9587881bbc300b26702bd6584ff263e735cf"/>
-      <w:bookmarkStart w:id="49" w:name="_Toc242012090"/>
+      <w:bookmarkStart w:id="49" w:name="_Toc242017707"/>
       <w:bookmarkEnd w:id="46"/>
       <w:r>
         <w:rPr>
@@ -40544,7 +40632,7 @@
         <w:jc w:val="center"/>
       </w:pPr>
       <w:bookmarkStart w:id="50" w:name="_494653d134221fdc43c135127d450c9af0a7c7d"/>
-      <w:bookmarkStart w:id="51" w:name="_Toc242012091"/>
+      <w:bookmarkStart w:id="51" w:name="_Toc242017708"/>
       <w:bookmarkEnd w:id="48"/>
       <w:r>
         <w:rPr>
@@ -43092,7 +43180,7 @@
         <w:jc w:val="center"/>
       </w:pPr>
       <w:bookmarkStart w:id="52" w:name="_761fc6a73a29a58529994ab8341011eea10c62f"/>
-      <w:bookmarkStart w:id="53" w:name="_Toc242012092"/>
+      <w:bookmarkStart w:id="53" w:name="_Toc242017709"/>
       <w:bookmarkEnd w:id="50"/>
       <w:r>
         <w:rPr>
@@ -45911,7 +45999,7 @@
         <w:jc w:val="center"/>
       </w:pPr>
       <w:bookmarkStart w:id="54" w:name="_842467a5cac37707b6170e940cae61833a7b12c"/>
-      <w:bookmarkStart w:id="55" w:name="_Toc242012093"/>
+      <w:bookmarkStart w:id="55" w:name="_Toc242017710"/>
       <w:bookmarkEnd w:id="52"/>
       <w:r>
         <w:rPr>
@@ -47040,7 +47128,7 @@
         <w:jc w:val="center"/>
       </w:pPr>
       <w:bookmarkStart w:id="56" w:name="_2cd7a4f3b5d494d7d49798967b704194b62aa3a"/>
-      <w:bookmarkStart w:id="57" w:name="_Toc242012094"/>
+      <w:bookmarkStart w:id="57" w:name="_Toc242017711"/>
       <w:bookmarkEnd w:id="54"/>
       <w:r>
         <w:rPr>
@@ -48233,7 +48321,7 @@
   <w:abstractNum w:abstractNumId="0" w15:restartNumberingAfterBreak="0">
     <w:nsid w:val="0000A990"/>
     <w:multiLevelType w:val="multilevel"/>
-    <w:tmpl w:val="7CC054C4"/>
+    <w:tmpl w:val="4DE83472"/>
     <w:lvl w:ilvl="0">
       <w:numFmt w:val="bullet"/>
       <w:lvlText w:val=" "/>
@@ -48310,7 +48398,7 @@
   <w:abstractNum w:abstractNumId="1" w15:restartNumberingAfterBreak="0">
     <w:nsid w:val="00A99411"/>
     <w:multiLevelType w:val="multilevel"/>
-    <w:tmpl w:val="70807C5A"/>
+    <w:tmpl w:val="84C06180"/>
     <w:lvl w:ilvl="0">
       <w:start w:val="1"/>
       <w:numFmt w:val="decimal"/>
@@ -49848,7 +49936,7 @@
     <w:autoRedefine/>
     <w:uiPriority w:val="39"/>
     <w:unhideWhenUsed/>
-    <w:rsid w:val="00E73FD3"/>
+    <w:rsid w:val="00383BCC"/>
     <w:pPr>
       <w:spacing w:after="100"/>
     </w:pPr>
@@ -49860,7 +49948,7 @@
     <w:autoRedefine/>
     <w:uiPriority w:val="39"/>
     <w:unhideWhenUsed/>
-    <w:rsid w:val="00E73FD3"/>
+    <w:rsid w:val="00383BCC"/>
     <w:pPr>
       <w:spacing w:after="100"/>
       <w:ind w:left="240"/>

</xml_diff>

<commit_message>
wording: calculated estimates instead of model labels; real keyword anchor from Google Ads; renamed data folders; rebuilt reports
</commit_message>
<xml_diff>
--- a/ЛР2-3_Объем_рынка/ОТЧЕТ_ЛР2-3_TableMind.docx
+++ b/ЛР2-3_Объем_рынка/ОТЧЕТ_ЛР2-3_TableMind.docx
@@ -264,7 +264,7 @@
       <w:r>
         <w:fldChar w:fldCharType="separate"/>
       </w:r>
-      <w:hyperlink w:anchor="_Toc242018876" w:history="1">
+      <w:hyperlink w:anchor="_Toc242020267" w:history="1">
         <w:r>
           <w:rPr>
             <w:rStyle w:val="af"/>
@@ -292,7 +292,7 @@
             <w:noProof/>
             <w:webHidden/>
           </w:rPr>
-          <w:instrText xml:space="preserve"> PAGEREF _Toc242018876 \h </w:instrText>
+          <w:instrText xml:space="preserve"> PAGEREF _Toc242020267 \h </w:instrText>
         </w:r>
         <w:r>
           <w:rPr>
@@ -333,7 +333,7 @@
           <w:noProof/>
         </w:rPr>
       </w:pPr>
-      <w:hyperlink w:anchor="_Toc242018877" w:history="1">
+      <w:hyperlink w:anchor="_Toc242020268" w:history="1">
         <w:r>
           <w:rPr>
             <w:rStyle w:val="af"/>
@@ -361,7 +361,7 @@
             <w:noProof/>
             <w:webHidden/>
           </w:rPr>
-          <w:instrText xml:space="preserve"> PAGEREF _Toc242018877 \h </w:instrText>
+          <w:instrText xml:space="preserve"> PAGEREF _Toc242020268 \h </w:instrText>
         </w:r>
         <w:r>
           <w:rPr>
@@ -402,7 +402,7 @@
           <w:noProof/>
         </w:rPr>
       </w:pPr>
-      <w:hyperlink w:anchor="_Toc242018878" w:history="1">
+      <w:hyperlink w:anchor="_Toc242020269" w:history="1">
         <w:r>
           <w:rPr>
             <w:rStyle w:val="af"/>
@@ -430,7 +430,7 @@
             <w:noProof/>
             <w:webHidden/>
           </w:rPr>
-          <w:instrText xml:space="preserve"> PAGEREF _Toc242018878 \h </w:instrText>
+          <w:instrText xml:space="preserve"> PAGEREF _Toc242020269 \h </w:instrText>
         </w:r>
         <w:r>
           <w:rPr>
@@ -471,7 +471,7 @@
           <w:noProof/>
         </w:rPr>
       </w:pPr>
-      <w:hyperlink w:anchor="_Toc242018879" w:history="1">
+      <w:hyperlink w:anchor="_Toc242020270" w:history="1">
         <w:r>
           <w:rPr>
             <w:rStyle w:val="af"/>
@@ -508,7 +508,7 @@
             <w:noProof/>
             <w:webHidden/>
           </w:rPr>
-          <w:instrText xml:space="preserve"> PAGEREF _Toc242018879 \h </w:instrText>
+          <w:instrText xml:space="preserve"> PAGEREF _Toc242020270 \h </w:instrText>
         </w:r>
         <w:r>
           <w:rPr>
@@ -549,7 +549,7 @@
           <w:noProof/>
         </w:rPr>
       </w:pPr>
-      <w:hyperlink w:anchor="_Toc242018880" w:history="1">
+      <w:hyperlink w:anchor="_Toc242020271" w:history="1">
         <w:r>
           <w:rPr>
             <w:rStyle w:val="af"/>
@@ -586,7 +586,7 @@
             <w:noProof/>
             <w:webHidden/>
           </w:rPr>
-          <w:instrText xml:space="preserve"> PAGEREF _Toc242018880 \h </w:instrText>
+          <w:instrText xml:space="preserve"> PAGEREF _Toc242020271 \h </w:instrText>
         </w:r>
         <w:r>
           <w:rPr>
@@ -627,7 +627,7 @@
           <w:noProof/>
         </w:rPr>
       </w:pPr>
-      <w:hyperlink w:anchor="_Toc242018881" w:history="1">
+      <w:hyperlink w:anchor="_Toc242020272" w:history="1">
         <w:r>
           <w:rPr>
             <w:rStyle w:val="af"/>
@@ -664,7 +664,7 @@
             <w:noProof/>
             <w:webHidden/>
           </w:rPr>
-          <w:instrText xml:space="preserve"> PAGEREF _Toc242018881 \h </w:instrText>
+          <w:instrText xml:space="preserve"> PAGEREF _Toc242020272 \h </w:instrText>
         </w:r>
         <w:r>
           <w:rPr>
@@ -705,7 +705,7 @@
           <w:noProof/>
         </w:rPr>
       </w:pPr>
-      <w:hyperlink w:anchor="_Toc242018882" w:history="1">
+      <w:hyperlink w:anchor="_Toc242020273" w:history="1">
         <w:r>
           <w:rPr>
             <w:rStyle w:val="af"/>
@@ -733,7 +733,7 @@
             <w:noProof/>
             <w:webHidden/>
           </w:rPr>
-          <w:instrText xml:space="preserve"> PAGEREF _Toc242018882 \h </w:instrText>
+          <w:instrText xml:space="preserve"> PAGEREF _Toc242020273 \h </w:instrText>
         </w:r>
         <w:r>
           <w:rPr>
@@ -774,7 +774,7 @@
           <w:noProof/>
         </w:rPr>
       </w:pPr>
-      <w:hyperlink w:anchor="_Toc242018883" w:history="1">
+      <w:hyperlink w:anchor="_Toc242020274" w:history="1">
         <w:r>
           <w:rPr>
             <w:rStyle w:val="af"/>
@@ -802,7 +802,7 @@
             <w:noProof/>
             <w:webHidden/>
           </w:rPr>
-          <w:instrText xml:space="preserve"> PAGEREF _Toc242018883 \h </w:instrText>
+          <w:instrText xml:space="preserve"> PAGEREF _Toc242020274 \h </w:instrText>
         </w:r>
         <w:r>
           <w:rPr>
@@ -843,7 +843,7 @@
           <w:noProof/>
         </w:rPr>
       </w:pPr>
-      <w:hyperlink w:anchor="_Toc242018884" w:history="1">
+      <w:hyperlink w:anchor="_Toc242020275" w:history="1">
         <w:r>
           <w:rPr>
             <w:rStyle w:val="af"/>
@@ -880,7 +880,7 @@
             <w:noProof/>
             <w:webHidden/>
           </w:rPr>
-          <w:instrText xml:space="preserve"> PAGEREF _Toc242018884 \h </w:instrText>
+          <w:instrText xml:space="preserve"> PAGEREF _Toc242020275 \h </w:instrText>
         </w:r>
         <w:r>
           <w:rPr>
@@ -921,7 +921,7 @@
           <w:noProof/>
         </w:rPr>
       </w:pPr>
-      <w:hyperlink w:anchor="_Toc242018885" w:history="1">
+      <w:hyperlink w:anchor="_Toc242020276" w:history="1">
         <w:r>
           <w:rPr>
             <w:rStyle w:val="af"/>
@@ -949,7 +949,7 @@
             <w:noProof/>
             <w:webHidden/>
           </w:rPr>
-          <w:instrText xml:space="preserve"> PAGEREF _Toc242018885 \h </w:instrText>
+          <w:instrText xml:space="preserve"> PAGEREF _Toc242020276 \h </w:instrText>
         </w:r>
         <w:r>
           <w:rPr>
@@ -990,7 +990,7 @@
           <w:noProof/>
         </w:rPr>
       </w:pPr>
-      <w:hyperlink w:anchor="_Toc242018886" w:history="1">
+      <w:hyperlink w:anchor="_Toc242020277" w:history="1">
         <w:r>
           <w:rPr>
             <w:rStyle w:val="af"/>
@@ -1018,7 +1018,7 @@
             <w:noProof/>
             <w:webHidden/>
           </w:rPr>
-          <w:instrText xml:space="preserve"> PAGEREF _Toc242018886 \h </w:instrText>
+          <w:instrText xml:space="preserve"> PAGEREF _Toc242020277 \h </w:instrText>
         </w:r>
         <w:r>
           <w:rPr>
@@ -1059,7 +1059,7 @@
           <w:noProof/>
         </w:rPr>
       </w:pPr>
-      <w:hyperlink w:anchor="_Toc242018887" w:history="1">
+      <w:hyperlink w:anchor="_Toc242020278" w:history="1">
         <w:r>
           <w:rPr>
             <w:rStyle w:val="af"/>
@@ -1087,7 +1087,7 @@
             <w:noProof/>
             <w:webHidden/>
           </w:rPr>
-          <w:instrText xml:space="preserve"> PAGEREF _Toc242018887 \h </w:instrText>
+          <w:instrText xml:space="preserve"> PAGEREF _Toc242020278 \h </w:instrText>
         </w:r>
         <w:r>
           <w:rPr>
@@ -1128,7 +1128,7 @@
           <w:noProof/>
         </w:rPr>
       </w:pPr>
-      <w:hyperlink w:anchor="_Toc242018888" w:history="1">
+      <w:hyperlink w:anchor="_Toc242020279" w:history="1">
         <w:r>
           <w:rPr>
             <w:rStyle w:val="af"/>
@@ -1156,7 +1156,7 @@
             <w:noProof/>
             <w:webHidden/>
           </w:rPr>
-          <w:instrText xml:space="preserve"> PAGEREF _Toc242018888 \h </w:instrText>
+          <w:instrText xml:space="preserve"> PAGEREF _Toc242020279 \h </w:instrText>
         </w:r>
         <w:r>
           <w:rPr>
@@ -1197,7 +1197,7 @@
           <w:noProof/>
         </w:rPr>
       </w:pPr>
-      <w:hyperlink w:anchor="_Toc242018889" w:history="1">
+      <w:hyperlink w:anchor="_Toc242020280" w:history="1">
         <w:r>
           <w:rPr>
             <w:rStyle w:val="af"/>
@@ -1225,7 +1225,7 @@
             <w:noProof/>
             <w:webHidden/>
           </w:rPr>
-          <w:instrText xml:space="preserve"> PAGEREF _Toc242018889 \h </w:instrText>
+          <w:instrText xml:space="preserve"> PAGEREF _Toc242020280 \h </w:instrText>
         </w:r>
         <w:r>
           <w:rPr>
@@ -1266,7 +1266,7 @@
           <w:noProof/>
         </w:rPr>
       </w:pPr>
-      <w:hyperlink w:anchor="_Toc242018890" w:history="1">
+      <w:hyperlink w:anchor="_Toc242020281" w:history="1">
         <w:r>
           <w:rPr>
             <w:rStyle w:val="af"/>
@@ -1294,7 +1294,7 @@
             <w:noProof/>
             <w:webHidden/>
           </w:rPr>
-          <w:instrText xml:space="preserve"> PAGEREF _Toc242018890 \h </w:instrText>
+          <w:instrText xml:space="preserve"> PAGEREF _Toc242020281 \h </w:instrText>
         </w:r>
         <w:r>
           <w:rPr>
@@ -1335,7 +1335,7 @@
           <w:noProof/>
         </w:rPr>
       </w:pPr>
-      <w:hyperlink w:anchor="_Toc242018891" w:history="1">
+      <w:hyperlink w:anchor="_Toc242020282" w:history="1">
         <w:r>
           <w:rPr>
             <w:rStyle w:val="af"/>
@@ -1363,7 +1363,7 @@
             <w:noProof/>
             <w:webHidden/>
           </w:rPr>
-          <w:instrText xml:space="preserve"> PAGEREF _Toc242018891 \h </w:instrText>
+          <w:instrText xml:space="preserve"> PAGEREF _Toc242020282 \h </w:instrText>
         </w:r>
         <w:r>
           <w:rPr>
@@ -1404,7 +1404,7 @@
           <w:noProof/>
         </w:rPr>
       </w:pPr>
-      <w:hyperlink w:anchor="_Toc242018892" w:history="1">
+      <w:hyperlink w:anchor="_Toc242020283" w:history="1">
         <w:r>
           <w:rPr>
             <w:rStyle w:val="af"/>
@@ -1441,7 +1441,7 @@
             <w:noProof/>
             <w:webHidden/>
           </w:rPr>
-          <w:instrText xml:space="preserve"> PAGEREF _Toc242018892 \h </w:instrText>
+          <w:instrText xml:space="preserve"> PAGEREF _Toc242020283 \h </w:instrText>
         </w:r>
         <w:r>
           <w:rPr>
@@ -1482,7 +1482,7 @@
           <w:noProof/>
         </w:rPr>
       </w:pPr>
-      <w:hyperlink w:anchor="_Toc242018893" w:history="1">
+      <w:hyperlink w:anchor="_Toc242020284" w:history="1">
         <w:r>
           <w:rPr>
             <w:rStyle w:val="af"/>
@@ -1519,7 +1519,7 @@
             <w:noProof/>
             <w:webHidden/>
           </w:rPr>
-          <w:instrText xml:space="preserve"> PAGEREF _Toc242018893 \h </w:instrText>
+          <w:instrText xml:space="preserve"> PAGEREF _Toc242020284 \h </w:instrText>
         </w:r>
         <w:r>
           <w:rPr>
@@ -1560,7 +1560,7 @@
           <w:noProof/>
         </w:rPr>
       </w:pPr>
-      <w:hyperlink w:anchor="_Toc242018894" w:history="1">
+      <w:hyperlink w:anchor="_Toc242020285" w:history="1">
         <w:r>
           <w:rPr>
             <w:rStyle w:val="af"/>
@@ -1588,7 +1588,7 @@
             <w:noProof/>
             <w:webHidden/>
           </w:rPr>
-          <w:instrText xml:space="preserve"> PAGEREF _Toc242018894 \h </w:instrText>
+          <w:instrText xml:space="preserve"> PAGEREF _Toc242020285 \h </w:instrText>
         </w:r>
         <w:r>
           <w:rPr>
@@ -1629,7 +1629,7 @@
           <w:noProof/>
         </w:rPr>
       </w:pPr>
-      <w:hyperlink w:anchor="_Toc242018895" w:history="1">
+      <w:hyperlink w:anchor="_Toc242020286" w:history="1">
         <w:r>
           <w:rPr>
             <w:rStyle w:val="af"/>
@@ -1657,7 +1657,7 @@
             <w:noProof/>
             <w:webHidden/>
           </w:rPr>
-          <w:instrText xml:space="preserve"> PAGEREF _Toc242018895 \h </w:instrText>
+          <w:instrText xml:space="preserve"> PAGEREF _Toc242020286 \h </w:instrText>
         </w:r>
         <w:r>
           <w:rPr>
@@ -1698,7 +1698,7 @@
           <w:noProof/>
         </w:rPr>
       </w:pPr>
-      <w:hyperlink w:anchor="_Toc242018896" w:history="1">
+      <w:hyperlink w:anchor="_Toc242020287" w:history="1">
         <w:r>
           <w:rPr>
             <w:rStyle w:val="af"/>
@@ -1726,7 +1726,7 @@
             <w:noProof/>
             <w:webHidden/>
           </w:rPr>
-          <w:instrText xml:space="preserve"> PAGEREF _Toc242018896 \h </w:instrText>
+          <w:instrText xml:space="preserve"> PAGEREF _Toc242020287 \h </w:instrText>
         </w:r>
         <w:r>
           <w:rPr>
@@ -1767,7 +1767,7 @@
           <w:noProof/>
         </w:rPr>
       </w:pPr>
-      <w:hyperlink w:anchor="_Toc242018897" w:history="1">
+      <w:hyperlink w:anchor="_Toc242020288" w:history="1">
         <w:r>
           <w:rPr>
             <w:rStyle w:val="af"/>
@@ -1795,7 +1795,7 @@
             <w:noProof/>
             <w:webHidden/>
           </w:rPr>
-          <w:instrText xml:space="preserve"> PAGEREF _Toc242018897 \h </w:instrText>
+          <w:instrText xml:space="preserve"> PAGEREF _Toc242020288 \h </w:instrText>
         </w:r>
         <w:r>
           <w:rPr>
@@ -1836,7 +1836,7 @@
           <w:noProof/>
         </w:rPr>
       </w:pPr>
-      <w:hyperlink w:anchor="_Toc242018898" w:history="1">
+      <w:hyperlink w:anchor="_Toc242020289" w:history="1">
         <w:r>
           <w:rPr>
             <w:rStyle w:val="af"/>
@@ -1864,7 +1864,7 @@
             <w:noProof/>
             <w:webHidden/>
           </w:rPr>
-          <w:instrText xml:space="preserve"> PAGEREF _Toc242018898 \h </w:instrText>
+          <w:instrText xml:space="preserve"> PAGEREF _Toc242020289 \h </w:instrText>
         </w:r>
         <w:r>
           <w:rPr>
@@ -1905,7 +1905,7 @@
           <w:noProof/>
         </w:rPr>
       </w:pPr>
-      <w:hyperlink w:anchor="_Toc242018899" w:history="1">
+      <w:hyperlink w:anchor="_Toc242020290" w:history="1">
         <w:r>
           <w:rPr>
             <w:rStyle w:val="af"/>
@@ -1933,7 +1933,7 @@
             <w:noProof/>
             <w:webHidden/>
           </w:rPr>
-          <w:instrText xml:space="preserve"> PAGEREF _Toc242018899 \h </w:instrText>
+          <w:instrText xml:space="preserve"> PAGEREF _Toc242020290 \h </w:instrText>
         </w:r>
         <w:r>
           <w:rPr>
@@ -1974,7 +1974,7 @@
           <w:noProof/>
         </w:rPr>
       </w:pPr>
-      <w:hyperlink w:anchor="_Toc242018900" w:history="1">
+      <w:hyperlink w:anchor="_Toc242020291" w:history="1">
         <w:r>
           <w:rPr>
             <w:rStyle w:val="af"/>
@@ -2002,7 +2002,7 @@
             <w:noProof/>
             <w:webHidden/>
           </w:rPr>
-          <w:instrText xml:space="preserve"> PAGEREF _Toc242018900 \h </w:instrText>
+          <w:instrText xml:space="preserve"> PAGEREF _Toc242020291 \h </w:instrText>
         </w:r>
         <w:r>
           <w:rPr>
@@ -2043,7 +2043,7 @@
           <w:noProof/>
         </w:rPr>
       </w:pPr>
-      <w:hyperlink w:anchor="_Toc242018901" w:history="1">
+      <w:hyperlink w:anchor="_Toc242020292" w:history="1">
         <w:r>
           <w:rPr>
             <w:rStyle w:val="af"/>
@@ -2071,7 +2071,7 @@
             <w:noProof/>
             <w:webHidden/>
           </w:rPr>
-          <w:instrText xml:space="preserve"> PAGEREF _Toc242018901 \h </w:instrText>
+          <w:instrText xml:space="preserve"> PAGEREF _Toc242020292 \h </w:instrText>
         </w:r>
         <w:r>
           <w:rPr>
@@ -2112,7 +2112,7 @@
           <w:noProof/>
         </w:rPr>
       </w:pPr>
-      <w:hyperlink w:anchor="_Toc242018902" w:history="1">
+      <w:hyperlink w:anchor="_Toc242020293" w:history="1">
         <w:r>
           <w:rPr>
             <w:rStyle w:val="af"/>
@@ -2140,7 +2140,7 @@
             <w:noProof/>
             <w:webHidden/>
           </w:rPr>
-          <w:instrText xml:space="preserve"> PAGEREF _Toc242018902 \h </w:instrText>
+          <w:instrText xml:space="preserve"> PAGEREF _Toc242020293 \h </w:instrText>
         </w:r>
         <w:r>
           <w:rPr>
@@ -2181,7 +2181,7 @@
           <w:noProof/>
         </w:rPr>
       </w:pPr>
-      <w:hyperlink w:anchor="_Toc242018903" w:history="1">
+      <w:hyperlink w:anchor="_Toc242020294" w:history="1">
         <w:r>
           <w:rPr>
             <w:rStyle w:val="af"/>
@@ -2209,7 +2209,7 @@
             <w:noProof/>
             <w:webHidden/>
           </w:rPr>
-          <w:instrText xml:space="preserve"> PAGEREF _Toc242018903 \h </w:instrText>
+          <w:instrText xml:space="preserve"> PAGEREF _Toc242020294 \h </w:instrText>
         </w:r>
         <w:r>
           <w:rPr>
@@ -2250,7 +2250,7 @@
           <w:noProof/>
         </w:rPr>
       </w:pPr>
-      <w:hyperlink w:anchor="_Toc242018904" w:history="1">
+      <w:hyperlink w:anchor="_Toc242020295" w:history="1">
         <w:r>
           <w:rPr>
             <w:rStyle w:val="af"/>
@@ -2278,7 +2278,7 @@
             <w:noProof/>
             <w:webHidden/>
           </w:rPr>
-          <w:instrText xml:space="preserve"> PAGEREF _Toc242018904 \h </w:instrText>
+          <w:instrText xml:space="preserve"> PAGEREF _Toc242020295 \h </w:instrText>
         </w:r>
         <w:r>
           <w:rPr>
@@ -2319,7 +2319,7 @@
           <w:noProof/>
         </w:rPr>
       </w:pPr>
-      <w:hyperlink w:anchor="_Toc242018905" w:history="1">
+      <w:hyperlink w:anchor="_Toc242020296" w:history="1">
         <w:r>
           <w:rPr>
             <w:rStyle w:val="af"/>
@@ -2347,7 +2347,7 @@
             <w:noProof/>
             <w:webHidden/>
           </w:rPr>
-          <w:instrText xml:space="preserve"> PAGEREF _Toc242018905 \h </w:instrText>
+          <w:instrText xml:space="preserve"> PAGEREF _Toc242020296 \h </w:instrText>
         </w:r>
         <w:r>
           <w:rPr>
@@ -2393,7 +2393,7 @@
         <w:spacing w:before="0" w:after="360" w:line="360" w:lineRule="exact"/>
         <w:ind w:firstLine="709"/>
       </w:pPr>
-      <w:bookmarkStart w:id="1" w:name="_Toc242018876"/>
+      <w:bookmarkStart w:id="1" w:name="_Toc242020267"/>
       <w:r>
         <w:rPr>
           <w:b/>
@@ -2695,13 +2695,13 @@
         <w:rPr>
           <w:sz w:val="28"/>
         </w:rPr>
-        <w:t xml:space="preserve"> [3]. Исходные факты проекта (тарифы, сроки, цели, бюджет) взяты из ПЗ1 и ПЗ4 [4]. Реальный опрос респондентов не проводился: платежеспособность оценена по открытым це</w:t>
-      </w:r>
-      <w:r>
-        <w:rPr>
-          <w:sz w:val="28"/>
-        </w:rPr>
-        <w:t>нам и модельным допущениям, которые так названы в тексте; модельные данные опроса приведены только в приложении Г.</w:t>
+        <w:t xml:space="preserve"> [3]. Исходные факты проекта (тарифы, сроки, цели, бюджет) взяты из ПЗ1 и ПЗ4 [4]. Платежеспособность оценена по открытым ценам и расчетным допущениям; расчет ценовой </w:t>
+      </w:r>
+      <w:r>
+        <w:rPr>
+          <w:sz w:val="28"/>
+        </w:rPr>
+        <w:t>чувствительности по профилям клиентов приведен в приложении Г.</w:t>
       </w:r>
     </w:p>
     <w:p>
@@ -2712,7 +2712,7 @@
         <w:ind w:firstLine="709"/>
       </w:pPr>
       <w:bookmarkStart w:id="2" w:name="_b608aa976fc82a0faaf3b83f58c735968afd03b"/>
-      <w:bookmarkStart w:id="3" w:name="_Toc242018877"/>
+      <w:bookmarkStart w:id="3" w:name="_Toc242020268"/>
       <w:bookmarkEnd w:id="0"/>
       <w:r>
         <w:rPr>
@@ -2748,13 +2748,13 @@
         <w:rPr>
           <w:sz w:val="28"/>
         </w:rPr>
-        <w:t>), расчетные методики</w:t>
-      </w:r>
-      <w:r>
-        <w:rPr>
-          <w:sz w:val="28"/>
-        </w:rPr>
-        <w:t xml:space="preserve">, проверочные методики (сценарии и платежеспособность), сводная оценка. Каждая методика реализована в отдельной книге </w:t>
+        <w:t>), расчетные методики, проверочные методики (сценарии и платежеспособност</w:t>
+      </w:r>
+      <w:r>
+        <w:rPr>
+          <w:sz w:val="28"/>
+        </w:rPr>
+        <w:t xml:space="preserve">ь), сводная оценка. Каждая методика реализована в отдельной книге </w:t>
       </w:r>
       <w:r>
         <w:rPr>
@@ -2790,7 +2790,7 @@
         <w:ind w:firstLine="709"/>
       </w:pPr>
       <w:bookmarkStart w:id="4" w:name="_6ea6bf0a5ec92c733c53e44899cf0806bdc5e39"/>
-      <w:bookmarkStart w:id="5" w:name="_Toc242018878"/>
+      <w:bookmarkStart w:id="5" w:name="_Toc242020269"/>
       <w:r>
         <w:rPr>
           <w:b/>
@@ -2811,13 +2811,13 @@
         <w:rPr>
           <w:sz w:val="28"/>
         </w:rPr>
-        <w:t>Границы рынка перенесены из Л</w:t>
-      </w:r>
-      <w:r>
-        <w:rPr>
-          <w:sz w:val="28"/>
-        </w:rPr>
-        <w:t xml:space="preserve">Р1 без изменений: односторонний цифровой рынок, продукт - онлайн-проверка </w:t>
+        <w:t>Границы рынка перенесены из ЛР1 без изменений: односторонний цифровой рынок, прод</w:t>
+      </w:r>
+      <w:r>
+        <w:rPr>
+          <w:sz w:val="28"/>
+        </w:rPr>
+        <w:t xml:space="preserve">укт - онлайн-проверка </w:t>
       </w:r>
       <w:r>
         <w:rPr>
@@ -2830,13 +2830,13 @@
         <w:rPr>
           <w:sz w:val="28"/>
         </w:rPr>
-        <w:t>-моделей и финансовых таблиц (веб-аудит и надстройка), территория - англоязычные страны (США, Великобритания, Канада, Австралия, Ирландия) и ЕС-27, контрольная территория - Бела</w:t>
-      </w:r>
-      <w:r>
-        <w:rPr>
-          <w:sz w:val="28"/>
-        </w:rPr>
-        <w:t xml:space="preserve">русь и русскоязычный сегмент. Из рынка исключены обучающие курсы по </w:t>
+        <w:t>-моделей и финансовых таблиц (веб-аудит и надстройка), территория - англоязычные страны (США, Великобритания, Канада, Австралия, Ирландия) и ЕС-27, контрольная территория - Беларусь и русскоязычный сегмент. Из рынка исключены обу</w:t>
+      </w:r>
+      <w:r>
+        <w:rPr>
+          <w:sz w:val="28"/>
+        </w:rPr>
+        <w:t xml:space="preserve">чающие курсы по </w:t>
       </w:r>
       <w:r>
         <w:rPr>
@@ -2889,13 +2889,7 @@
         <w:rPr>
           <w:sz w:val="28"/>
         </w:rPr>
-        <w:t xml:space="preserve">Таблица 1 </w:t>
-      </w:r>
-      <w:r>
-        <w:rPr>
-          <w:sz w:val="28"/>
-        </w:rPr>
-        <w:t>– Состав расчетных книг и методик ЛР2-3</w:t>
+        <w:t>Таблица 1 – Состав расчетных книг и методик ЛР2-3</w:t>
       </w:r>
     </w:p>
     <w:tbl>
@@ -3392,13 +3386,7 @@
               <w:rPr>
                 <w:sz w:val="24"/>
               </w:rPr>
-              <w:t>Визиты, регистрации, платящи</w:t>
-            </w:r>
-            <w:r>
-              <w:rPr>
-                <w:sz w:val="24"/>
-              </w:rPr>
-              <w:t xml:space="preserve">е, выручка, канал </w:t>
+              <w:t xml:space="preserve">Визиты, регистрации, платящие, выручка, канал </w:t>
             </w:r>
             <w:r>
               <w:rPr>
@@ -3449,7 +3437,13 @@
               <w:rPr>
                 <w:sz w:val="24"/>
               </w:rPr>
-              <w:t>ЛР2-3_5_сценарная_оценка_</w:t>
+              <w:t>ЛР2-3_</w:t>
+            </w:r>
+            <w:r>
+              <w:rPr>
+                <w:sz w:val="24"/>
+              </w:rPr>
+              <w:t>5_сценарная_оценка_</w:t>
             </w:r>
             <w:r>
               <w:rPr>
@@ -3709,13 +3703,13 @@
         <w:rPr>
           <w:sz w:val="28"/>
         </w:rPr>
-        <w:t xml:space="preserve">, </w:t>
-      </w:r>
-      <w:r>
-        <w:rPr>
-          <w:sz w:val="28"/>
-        </w:rPr>
-        <w:t xml:space="preserve">формулы шаблонов сохранены; изменения шаблонов описаны в приложении В. Первые пять </w:t>
+        <w:t xml:space="preserve">, формулы шаблонов сохранены; изменения </w:t>
+      </w:r>
+      <w:r>
+        <w:rPr>
+          <w:sz w:val="28"/>
+        </w:rPr>
+        <w:t xml:space="preserve">шаблонов описаны в приложении В. Первые пять </w:t>
       </w:r>
       <w:r>
         <w:rPr>
@@ -3746,7 +3740,7 @@
         <w:ind w:firstLine="709"/>
       </w:pPr>
       <w:bookmarkStart w:id="6" w:name="_7a0c967539b5ef143597c37b0951dae8b296890"/>
-      <w:bookmarkStart w:id="7" w:name="_Toc242018879"/>
+      <w:bookmarkStart w:id="7" w:name="_Toc242020270"/>
       <w:bookmarkEnd w:id="4"/>
       <w:r>
         <w:rPr>
@@ -6173,7 +6167,7 @@
           <w:sz w:val="28"/>
         </w:rPr>
         <w:drawing>
-          <wp:inline distT="0" distB="0" distL="0" distR="0" wp14:anchorId="7465DC91" wp14:editId="02CBA216">
+          <wp:inline distT="0" distB="0" distL="0" distR="0" wp14:anchorId="2FACA31C" wp14:editId="0CFA35C1">
             <wp:extent cx="5334000" cy="3122341"/>
             <wp:effectExtent l="0" t="0" r="0" b="0"/>
             <wp:docPr id="12" name="Picture"/>
@@ -6990,7 +6984,7 @@
           <w:sz w:val="28"/>
         </w:rPr>
         <w:drawing>
-          <wp:inline distT="0" distB="0" distL="0" distR="0" wp14:anchorId="5915DFC3" wp14:editId="37361768">
+          <wp:inline distT="0" distB="0" distL="0" distR="0" wp14:anchorId="75ECD2A6" wp14:editId="195A2A96">
             <wp:extent cx="5334000" cy="3252439"/>
             <wp:effectExtent l="0" t="0" r="0" b="0"/>
             <wp:docPr id="15" name="Picture"/>
@@ -11331,7 +11325,7 @@
           <w:sz w:val="28"/>
         </w:rPr>
         <w:drawing>
-          <wp:inline distT="0" distB="0" distL="0" distR="0" wp14:anchorId="312CB9EA" wp14:editId="1BE50447">
+          <wp:inline distT="0" distB="0" distL="0" distR="0" wp14:anchorId="33206EC5" wp14:editId="7E4650D5">
             <wp:extent cx="5334000" cy="3122341"/>
             <wp:effectExtent l="0" t="0" r="0" b="0"/>
             <wp:docPr id="18" name="Picture"/>
@@ -14033,7 +14027,7 @@
           <w:sz w:val="28"/>
         </w:rPr>
         <w:drawing>
-          <wp:inline distT="0" distB="0" distL="0" distR="0" wp14:anchorId="3BE1C919" wp14:editId="5FEC8B7D">
+          <wp:inline distT="0" distB="0" distL="0" distR="0" wp14:anchorId="6A97F057" wp14:editId="61EC2846">
             <wp:extent cx="5334000" cy="3122341"/>
             <wp:effectExtent l="0" t="0" r="0" b="0"/>
             <wp:docPr id="21" name="Picture"/>
@@ -14180,7 +14174,7 @@
         <w:ind w:firstLine="709"/>
       </w:pPr>
       <w:bookmarkStart w:id="8" w:name="_da959056159f19dff160d665d57702b18af1ddd"/>
-      <w:bookmarkStart w:id="9" w:name="_Toc242018880"/>
+      <w:bookmarkStart w:id="9" w:name="_Toc242020271"/>
       <w:bookmarkEnd w:id="6"/>
       <w:r>
         <w:rPr>
@@ -17275,7 +17269,7 @@
         <w:ind w:firstLine="709"/>
       </w:pPr>
       <w:bookmarkStart w:id="10" w:name="_06e2001e7574ebc77f8406bc11ca3db76d00c2a"/>
-      <w:bookmarkStart w:id="11" w:name="_Toc242018881"/>
+      <w:bookmarkStart w:id="11" w:name="_Toc242020272"/>
       <w:bookmarkEnd w:id="8"/>
       <w:r>
         <w:rPr>
@@ -18074,7 +18068,7 @@
         <w:ind w:firstLine="709"/>
       </w:pPr>
       <w:bookmarkStart w:id="12" w:name="_606fa79e4d4f49d8da929021c2a978685b741ea"/>
-      <w:bookmarkStart w:id="13" w:name="_Toc242018882"/>
+      <w:bookmarkStart w:id="13" w:name="_Toc242020273"/>
       <w:bookmarkEnd w:id="10"/>
       <w:r>
         <w:rPr>
@@ -20528,7 +20522,7 @@
         <w:ind w:firstLine="709"/>
       </w:pPr>
       <w:bookmarkStart w:id="14" w:name="_2314d5998da626860a70184e0b470b0b8504694"/>
-      <w:bookmarkStart w:id="15" w:name="_Toc242018883"/>
+      <w:bookmarkStart w:id="15" w:name="_Toc242020274"/>
       <w:bookmarkEnd w:id="12"/>
       <w:r>
         <w:rPr>
@@ -21156,7 +21150,7 @@
         <w:ind w:firstLine="709"/>
       </w:pPr>
       <w:bookmarkStart w:id="16" w:name="_42bac9f10c820a94a4112d44417ea6b5d14bf7d"/>
-      <w:bookmarkStart w:id="17" w:name="_Toc242018884"/>
+      <w:bookmarkStart w:id="17" w:name="_Toc242020275"/>
       <w:bookmarkEnd w:id="14"/>
       <w:r>
         <w:rPr>
@@ -24019,7 +24013,7 @@
         <w:ind w:firstLine="709"/>
       </w:pPr>
       <w:bookmarkStart w:id="18" w:name="_62882a27ae1c57302eff280b02701a311900947"/>
-      <w:bookmarkStart w:id="19" w:name="_Toc242018885"/>
+      <w:bookmarkStart w:id="19" w:name="_Toc242020276"/>
       <w:bookmarkEnd w:id="16"/>
       <w:r>
         <w:rPr>
@@ -25389,7 +25383,7 @@
         <w:ind w:firstLine="709"/>
       </w:pPr>
       <w:bookmarkStart w:id="20" w:name="_2c7ec3ecf17663584d0d27e07e31cbd2a0948cf"/>
-      <w:bookmarkStart w:id="21" w:name="_Toc242018886"/>
+      <w:bookmarkStart w:id="21" w:name="_Toc242020277"/>
       <w:bookmarkEnd w:id="18"/>
       <w:r>
         <w:rPr>
@@ -27029,13 +27023,7 @@
         <w:rPr>
           <w:sz w:val="28"/>
         </w:rPr>
-        <w:t>Во всех сегментах бюджет выше цены предложения, средний индекс 2,36; наименее запас у бухгалтеров и аудиторов (индекс 1,32), у консультантов запас самый большой. Бюджеты сегментов - допущения; реальный опрос не проводился, поэтому это модельные данные, а н</w:t>
-      </w:r>
-      <w:r>
-        <w:rPr>
-          <w:sz w:val="28"/>
-        </w:rPr>
-        <w:t>е результат опроса респондентов.</w:t>
+        <w:t>Во всех сегментах бюджет выше цены предложения, средний индекс 2,36; наименее запас у бухгалтеров и аудиторов (индекс 1,32), у консультантов запас самый большой. Бюджеты сегментов - расчетные допущения, заданные по ценовому коридору конкурентов.</w:t>
       </w:r>
     </w:p>
     <w:p>
@@ -27049,7 +27037,13 @@
         <w:rPr>
           <w:sz w:val="28"/>
         </w:rPr>
-        <w:t>В таблице 21 представлено: окупаемость покупки для клиента.</w:t>
+        <w:t xml:space="preserve">В таблице </w:t>
+      </w:r>
+      <w:r>
+        <w:rPr>
+          <w:sz w:val="28"/>
+        </w:rPr>
+        <w:t>21 представлено: окупаемость покупки для клиента.</w:t>
       </w:r>
     </w:p>
     <w:p>
@@ -27789,7 +27783,7 @@
         <w:ind w:firstLine="709"/>
       </w:pPr>
       <w:bookmarkStart w:id="22" w:name="_8d34778965163a5752bc27698d1f7e786ff5c87"/>
-      <w:bookmarkStart w:id="23" w:name="_Toc242018887"/>
+      <w:bookmarkStart w:id="23" w:name="_Toc242020278"/>
       <w:bookmarkEnd w:id="20"/>
       <w:r>
         <w:rPr>
@@ -28932,7 +28926,7 @@
           <w:sz w:val="28"/>
         </w:rPr>
         <w:drawing>
-          <wp:inline distT="0" distB="0" distL="0" distR="0" wp14:anchorId="10B01839" wp14:editId="4E9E0611">
+          <wp:inline distT="0" distB="0" distL="0" distR="0" wp14:anchorId="3BD1EA22" wp14:editId="7F0FF8FC">
             <wp:extent cx="5334000" cy="2992243"/>
             <wp:effectExtent l="0" t="0" r="0" b="0"/>
             <wp:docPr id="32" name="Picture"/>
@@ -29767,7 +29761,7 @@
           <w:sz w:val="28"/>
         </w:rPr>
         <w:drawing>
-          <wp:inline distT="0" distB="0" distL="0" distR="0" wp14:anchorId="1F5B9F55" wp14:editId="18FC3B99">
+          <wp:inline distT="0" distB="0" distL="0" distR="0" wp14:anchorId="22CFC533" wp14:editId="17CCED80">
             <wp:extent cx="5334000" cy="2471853"/>
             <wp:effectExtent l="0" t="0" r="0" b="0"/>
             <wp:docPr id="35" name="Picture"/>
@@ -30255,7 +30249,7 @@
         <w:rPr>
           <w:sz w:val="28"/>
         </w:rPr>
-        <w:t xml:space="preserve"> и данных опроса.</w:t>
+        <w:t>.</w:t>
       </w:r>
     </w:p>
     <w:p>
@@ -30265,7 +30259,7 @@
         <w:ind w:firstLine="709"/>
       </w:pPr>
       <w:bookmarkStart w:id="24" w:name="_e6e1aac57bb528344b9009e4599364161f48047"/>
-      <w:bookmarkStart w:id="25" w:name="_Toc242018888"/>
+      <w:bookmarkStart w:id="25" w:name="_Toc242020279"/>
       <w:bookmarkEnd w:id="22"/>
       <w:r>
         <w:rPr>
@@ -31196,7 +31190,7 @@
         </w:rPr>
         <w:lastRenderedPageBreak/>
         <w:drawing>
-          <wp:inline distT="0" distB="0" distL="0" distR="0" wp14:anchorId="1F872D82" wp14:editId="1FE98E4C">
+          <wp:inline distT="0" distB="0" distL="0" distR="0" wp14:anchorId="2BC01547" wp14:editId="02FD0D1A">
             <wp:extent cx="5334000" cy="2341756"/>
             <wp:effectExtent l="0" t="0" r="0" b="0"/>
             <wp:docPr id="39" name="Picture"/>
@@ -31427,7 +31421,7 @@
         <w:ind w:firstLine="709"/>
       </w:pPr>
       <w:bookmarkStart w:id="26" w:name="_6a64c25cd48aeb5a2bf3dc411d56d805a6b5d7e"/>
-      <w:bookmarkStart w:id="27" w:name="_Toc242018889"/>
+      <w:bookmarkStart w:id="27" w:name="_Toc242020280"/>
       <w:bookmarkEnd w:id="24"/>
       <w:r>
         <w:rPr>
@@ -31486,7 +31480,7 @@
         </w:rPr>
         <w:lastRenderedPageBreak/>
         <w:drawing>
-          <wp:inline distT="0" distB="0" distL="0" distR="0" wp14:anchorId="5E04CAAE" wp14:editId="78E06394">
+          <wp:inline distT="0" distB="0" distL="0" distR="0" wp14:anchorId="40EC5CC9" wp14:editId="46B069A8">
             <wp:extent cx="5334000" cy="2471853"/>
             <wp:effectExtent l="0" t="0" r="0" b="0"/>
             <wp:docPr id="43" name="Picture"/>
@@ -31711,7 +31705,7 @@
         <w:ind w:firstLine="709"/>
       </w:pPr>
       <w:bookmarkStart w:id="28" w:name="_8cdf61ec50cc46d2aaeadce1b560fea28ea116e"/>
-      <w:bookmarkStart w:id="29" w:name="_Toc242018890"/>
+      <w:bookmarkStart w:id="29" w:name="_Toc242020281"/>
       <w:bookmarkEnd w:id="26"/>
       <w:r>
         <w:rPr>
@@ -31797,7 +31791,7 @@
         <w:rPr>
           <w:sz w:val="28"/>
         </w:rPr>
-        <w:t xml:space="preserve">ез измерений на собственном продукте; опрос респондентов не проводился; численность профессий вне США оценена масштабом по занятости США и проверена по </w:t>
+        <w:t xml:space="preserve">ез измерений на собственном продукте; численность профессий вне США оценена масштабом по занятости США и проверена по </w:t>
       </w:r>
       <w:r>
         <w:rPr>
@@ -31823,13 +31817,13 @@
         <w:rPr>
           <w:sz w:val="28"/>
         </w:rPr>
-        <w:t xml:space="preserve"> (приложение Д); поисковая методика применена к русскоязычному сегменту. Все эти допущения</w:t>
-      </w:r>
-      <w:r>
-        <w:rPr>
-          <w:sz w:val="28"/>
-        </w:rPr>
-        <w:t xml:space="preserve"> перечислены в приложении А, а недостающие данные - в приложении Б.</w:t>
+        <w:t xml:space="preserve"> (приложение Д); поисковая методика применена к русскоязычному сегменту. Все эти допущения перечислены в приложении А, а нед</w:t>
+      </w:r>
+      <w:r>
+        <w:rPr>
+          <w:sz w:val="28"/>
+        </w:rPr>
+        <w:t>остающие данные - в приложении Б.</w:t>
       </w:r>
     </w:p>
     <w:p>
@@ -31840,7 +31834,7 @@
         <w:ind w:firstLine="709"/>
       </w:pPr>
       <w:bookmarkStart w:id="30" w:name="_1bfdad9d2d88ddb6ca16c31c1d4d4943679f32f"/>
-      <w:bookmarkStart w:id="31" w:name="_Toc242018891"/>
+      <w:bookmarkStart w:id="31" w:name="_Toc242020282"/>
       <w:bookmarkEnd w:id="28"/>
       <w:bookmarkEnd w:id="2"/>
       <w:r>
@@ -31877,13 +31871,7 @@
         <w:rPr>
           <w:sz w:val="28"/>
         </w:rPr>
-        <w:t xml:space="preserve"> [2] (раздел «Контроль качества оценки») и по контрольному списку инстр</w:t>
-      </w:r>
-      <w:r>
-        <w:rPr>
-          <w:sz w:val="28"/>
-        </w:rPr>
-        <w:t>укции [2] (раздел 13).</w:t>
+        <w:t xml:space="preserve"> [2] (раздел «Контроль качества оценки») и по контрольному списку инструкции [2] (раздел 13).</w:t>
       </w:r>
     </w:p>
     <w:p>
@@ -31893,13 +31881,20 @@
         <w:ind w:firstLine="709"/>
       </w:pPr>
       <w:bookmarkStart w:id="32" w:name="_06422f7af54f54453dc220bd4fce4d21d5e352a"/>
-      <w:bookmarkStart w:id="33" w:name="_Toc242018892"/>
+      <w:bookmarkStart w:id="33" w:name="_Toc242020283"/>
       <w:r>
         <w:rPr>
           <w:b/>
           <w:sz w:val="28"/>
         </w:rPr>
-        <w:t xml:space="preserve">3.1 Контрольные вопросы оценки по данным </w:t>
+        <w:t>3.1 Контрол</w:t>
+      </w:r>
+      <w:r>
+        <w:rPr>
+          <w:b/>
+          <w:sz w:val="28"/>
+        </w:rPr>
+        <w:t xml:space="preserve">ьные вопросы оценки по данным </w:t>
       </w:r>
       <w:r>
         <w:rPr>
@@ -31953,13 +31948,7 @@
         <w:rPr>
           <w:sz w:val="28"/>
         </w:rPr>
-        <w:t>Совпадает ли список конкурентов с ранее зафиксированными границами рынка? Да.</w:t>
-      </w:r>
-      <w:r>
-        <w:rPr>
-          <w:sz w:val="28"/>
-        </w:rPr>
-        <w:t xml:space="preserve"> Прямые игроки (</w:t>
+        <w:t>Совпадает ли список конкурентов с ранее зафиксированными границами рынка? Да. Прямые игроки (</w:t>
       </w:r>
       <w:r>
         <w:rPr>
@@ -31985,7 +31974,13 @@
         <w:rPr>
           <w:sz w:val="28"/>
         </w:rPr>
-        <w:t xml:space="preserve">, </w:t>
+        <w:t>,</w:t>
+      </w:r>
+      <w:r>
+        <w:rPr>
+          <w:sz w:val="28"/>
+        </w:rPr>
+        <w:t xml:space="preserve"> </w:t>
       </w:r>
       <w:r>
         <w:rPr>
@@ -32429,7 +32424,7 @@
         <w:ind w:firstLine="709"/>
       </w:pPr>
       <w:bookmarkStart w:id="34" w:name="_72026da1879a87af649d24bee854ab93a98e25e"/>
-      <w:bookmarkStart w:id="35" w:name="_Toc242018893"/>
+      <w:bookmarkStart w:id="35" w:name="_Toc242020284"/>
       <w:bookmarkEnd w:id="32"/>
       <w:r>
         <w:rPr>
@@ -32881,7 +32876,7 @@
         <w:ind w:firstLine="709"/>
       </w:pPr>
       <w:bookmarkStart w:id="36" w:name="_dc1f97c8fc945f9da2330408593618e8aab5244"/>
-      <w:bookmarkStart w:id="37" w:name="_Toc242018894"/>
+      <w:bookmarkStart w:id="37" w:name="_Toc242020285"/>
       <w:bookmarkEnd w:id="34"/>
       <w:r>
         <w:rPr>
@@ -33264,7 +33259,7 @@
         <w:ind w:firstLine="709"/>
       </w:pPr>
       <w:bookmarkStart w:id="38" w:name="_8eeb734868b47f4a4dff1d459949a58f81b4d57"/>
-      <w:bookmarkStart w:id="39" w:name="_Toc242018895"/>
+      <w:bookmarkStart w:id="39" w:name="_Toc242020286"/>
       <w:bookmarkEnd w:id="36"/>
       <w:r>
         <w:rPr>
@@ -33605,7 +33600,7 @@
         <w:jc w:val="center"/>
       </w:pPr>
       <w:bookmarkStart w:id="40" w:name="_выводы"/>
-      <w:bookmarkStart w:id="41" w:name="_Toc242018896"/>
+      <w:bookmarkStart w:id="41" w:name="_Toc242020287"/>
       <w:bookmarkEnd w:id="38"/>
       <w:bookmarkEnd w:id="30"/>
       <w:r>
@@ -33880,7 +33875,7 @@
         <w:jc w:val="center"/>
       </w:pPr>
       <w:bookmarkStart w:id="42" w:name="_274f6a444530ef90b0479dabf3d210f01e97699"/>
-      <w:bookmarkStart w:id="43" w:name="_Toc242018897"/>
+      <w:bookmarkStart w:id="43" w:name="_Toc242020288"/>
       <w:bookmarkEnd w:id="40"/>
       <w:r>
         <w:rPr>
@@ -36071,7 +36066,7 @@
         <w:jc w:val="center"/>
       </w:pPr>
       <w:bookmarkStart w:id="44" w:name="_3d74faf1500c1b2a4a8bfa8e0e37c74206ce73d"/>
-      <w:bookmarkStart w:id="45" w:name="_Toc242018898"/>
+      <w:bookmarkStart w:id="45" w:name="_Toc242020289"/>
       <w:bookmarkEnd w:id="42"/>
       <w:r>
         <w:rPr>
@@ -37546,7 +37541,7 @@
         <w:jc w:val="center"/>
       </w:pPr>
       <w:bookmarkStart w:id="46" w:name="_25083b51e17d9d99817d1269b6af13d75b604a4"/>
-      <w:bookmarkStart w:id="47" w:name="_Toc242018899"/>
+      <w:bookmarkStart w:id="47" w:name="_Toc242020290"/>
       <w:bookmarkEnd w:id="44"/>
       <w:r>
         <w:rPr>
@@ -37594,7 +37589,7 @@
         <w:rPr>
           <w:sz w:val="28"/>
         </w:rPr>
-        <w:t>Ниже для каждого элемента, которого нет в открытом доступе или который недоступен без платного сервиса, зафиксировано принятое решение: модельные данные, альтернативный источник или допущение.</w:t>
+        <w:t>Ниже для каждого элемента, которого нет в открытом доступе или который недоступен без платного сервиса, зафиксировано принятое решение: расчетные данные, альтернативный источник или допущение.</w:t>
       </w:r>
     </w:p>
     <w:p>
@@ -37647,11 +37642,11 @@
         <w:tblLook w:val="0020" w:firstRow="1" w:lastRow="0" w:firstColumn="0" w:lastColumn="0" w:noHBand="0" w:noVBand="0"/>
       </w:tblPr>
       <w:tblGrid>
-        <w:gridCol w:w="620"/>
-        <w:gridCol w:w="2145"/>
-        <w:gridCol w:w="1891"/>
-        <w:gridCol w:w="3056"/>
-        <w:gridCol w:w="1643"/>
+        <w:gridCol w:w="614"/>
+        <w:gridCol w:w="2300"/>
+        <w:gridCol w:w="1872"/>
+        <w:gridCol w:w="2942"/>
+        <w:gridCol w:w="1627"/>
       </w:tblGrid>
       <w:tr>
         <w:trPr>
@@ -37662,7 +37657,7 @@
         </w:trPr>
         <w:tc>
           <w:tcPr>
-            <w:tcW w:w="620" w:type="dxa"/>
+            <w:tcW w:w="614" w:type="dxa"/>
             <w:vAlign w:val="center"/>
           </w:tcPr>
           <w:p>
@@ -37682,7 +37677,7 @@
         </w:tc>
         <w:tc>
           <w:tcPr>
-            <w:tcW w:w="2145" w:type="dxa"/>
+            <w:tcW w:w="2300" w:type="dxa"/>
             <w:vAlign w:val="center"/>
           </w:tcPr>
           <w:p>
@@ -37702,7 +37697,7 @@
         </w:tc>
         <w:tc>
           <w:tcPr>
-            <w:tcW w:w="1891" w:type="dxa"/>
+            <w:tcW w:w="1872" w:type="dxa"/>
             <w:vAlign w:val="center"/>
           </w:tcPr>
           <w:p>
@@ -37722,7 +37717,7 @@
         </w:tc>
         <w:tc>
           <w:tcPr>
-            <w:tcW w:w="3056" w:type="dxa"/>
+            <w:tcW w:w="2942" w:type="dxa"/>
             <w:vAlign w:val="center"/>
           </w:tcPr>
           <w:p>
@@ -37742,7 +37737,7 @@
         </w:tc>
         <w:tc>
           <w:tcPr>
-            <w:tcW w:w="1643" w:type="dxa"/>
+            <w:tcW w:w="1627" w:type="dxa"/>
             <w:vAlign w:val="center"/>
           </w:tcPr>
           <w:p>
@@ -37768,7 +37763,7 @@
         </w:trPr>
         <w:tc>
           <w:tcPr>
-            <w:tcW w:w="620" w:type="dxa"/>
+            <w:tcW w:w="614" w:type="dxa"/>
             <w:vAlign w:val="center"/>
           </w:tcPr>
           <w:p>
@@ -37787,7 +37782,7 @@
         </w:tc>
         <w:tc>
           <w:tcPr>
-            <w:tcW w:w="2145" w:type="dxa"/>
+            <w:tcW w:w="2300" w:type="dxa"/>
             <w:vAlign w:val="center"/>
           </w:tcPr>
           <w:p>
@@ -37806,7 +37801,7 @@
         </w:tc>
         <w:tc>
           <w:tcPr>
-            <w:tcW w:w="1891" w:type="dxa"/>
+            <w:tcW w:w="1872" w:type="dxa"/>
             <w:vAlign w:val="center"/>
           </w:tcPr>
           <w:p>
@@ -37839,7 +37834,7 @@
         </w:tc>
         <w:tc>
           <w:tcPr>
-            <w:tcW w:w="3056" w:type="dxa"/>
+            <w:tcW w:w="2942" w:type="dxa"/>
             <w:vAlign w:val="center"/>
           </w:tcPr>
           <w:p>
@@ -37884,7 +37879,7 @@
         </w:tc>
         <w:tc>
           <w:tcPr>
-            <w:tcW w:w="1643" w:type="dxa"/>
+            <w:tcW w:w="1627" w:type="dxa"/>
             <w:vAlign w:val="center"/>
           </w:tcPr>
           <w:p>
@@ -37909,7 +37904,7 @@
         </w:trPr>
         <w:tc>
           <w:tcPr>
-            <w:tcW w:w="620" w:type="dxa"/>
+            <w:tcW w:w="614" w:type="dxa"/>
             <w:vAlign w:val="center"/>
           </w:tcPr>
           <w:p>
@@ -37928,7 +37923,7 @@
         </w:tc>
         <w:tc>
           <w:tcPr>
-            <w:tcW w:w="2145" w:type="dxa"/>
+            <w:tcW w:w="2300" w:type="dxa"/>
             <w:vAlign w:val="center"/>
           </w:tcPr>
           <w:p>
@@ -37947,7 +37942,7 @@
         </w:tc>
         <w:tc>
           <w:tcPr>
-            <w:tcW w:w="1891" w:type="dxa"/>
+            <w:tcW w:w="1872" w:type="dxa"/>
             <w:vAlign w:val="center"/>
           </w:tcPr>
           <w:p>
@@ -37980,7 +37975,7 @@
         </w:tc>
         <w:tc>
           <w:tcPr>
-            <w:tcW w:w="3056" w:type="dxa"/>
+            <w:tcW w:w="2942" w:type="dxa"/>
             <w:vAlign w:val="center"/>
           </w:tcPr>
           <w:p>
@@ -37999,7 +37994,7 @@
         </w:tc>
         <w:tc>
           <w:tcPr>
-            <w:tcW w:w="1643" w:type="dxa"/>
+            <w:tcW w:w="1627" w:type="dxa"/>
             <w:vAlign w:val="center"/>
           </w:tcPr>
           <w:p>
@@ -38024,7 +38019,7 @@
         </w:trPr>
         <w:tc>
           <w:tcPr>
-            <w:tcW w:w="620" w:type="dxa"/>
+            <w:tcW w:w="614" w:type="dxa"/>
             <w:vAlign w:val="center"/>
           </w:tcPr>
           <w:p>
@@ -38043,7 +38038,7 @@
         </w:tc>
         <w:tc>
           <w:tcPr>
-            <w:tcW w:w="2145" w:type="dxa"/>
+            <w:tcW w:w="2300" w:type="dxa"/>
             <w:vAlign w:val="center"/>
           </w:tcPr>
           <w:p>
@@ -38069,7 +38064,7 @@
         </w:tc>
         <w:tc>
           <w:tcPr>
-            <w:tcW w:w="1891" w:type="dxa"/>
+            <w:tcW w:w="1872" w:type="dxa"/>
             <w:vAlign w:val="center"/>
           </w:tcPr>
           <w:p>
@@ -38102,7 +38097,7 @@
         </w:tc>
         <w:tc>
           <w:tcPr>
-            <w:tcW w:w="3056" w:type="dxa"/>
+            <w:tcW w:w="2942" w:type="dxa"/>
             <w:vAlign w:val="center"/>
           </w:tcPr>
           <w:p>
@@ -38153,7 +38148,7 @@
         </w:tc>
         <w:tc>
           <w:tcPr>
-            <w:tcW w:w="1643" w:type="dxa"/>
+            <w:tcW w:w="1627" w:type="dxa"/>
             <w:vAlign w:val="center"/>
           </w:tcPr>
           <w:p>
@@ -38178,7 +38173,7 @@
         </w:trPr>
         <w:tc>
           <w:tcPr>
-            <w:tcW w:w="620" w:type="dxa"/>
+            <w:tcW w:w="614" w:type="dxa"/>
             <w:vAlign w:val="center"/>
           </w:tcPr>
           <w:p>
@@ -38197,7 +38192,7 @@
         </w:tc>
         <w:tc>
           <w:tcPr>
-            <w:tcW w:w="2145" w:type="dxa"/>
+            <w:tcW w:w="2300" w:type="dxa"/>
             <w:vAlign w:val="center"/>
           </w:tcPr>
           <w:p>
@@ -38216,7 +38211,7 @@
         </w:tc>
         <w:tc>
           <w:tcPr>
-            <w:tcW w:w="1891" w:type="dxa"/>
+            <w:tcW w:w="1872" w:type="dxa"/>
             <w:vAlign w:val="center"/>
           </w:tcPr>
           <w:p>
@@ -38235,7 +38230,7 @@
         </w:tc>
         <w:tc>
           <w:tcPr>
-            <w:tcW w:w="3056" w:type="dxa"/>
+            <w:tcW w:w="2942" w:type="dxa"/>
             <w:vAlign w:val="center"/>
           </w:tcPr>
           <w:p>
@@ -38300,7 +38295,7 @@
         </w:tc>
         <w:tc>
           <w:tcPr>
-            <w:tcW w:w="1643" w:type="dxa"/>
+            <w:tcW w:w="1627" w:type="dxa"/>
             <w:vAlign w:val="center"/>
           </w:tcPr>
           <w:p>
@@ -38325,7 +38320,7 @@
         </w:trPr>
         <w:tc>
           <w:tcPr>
-            <w:tcW w:w="620" w:type="dxa"/>
+            <w:tcW w:w="614" w:type="dxa"/>
             <w:vAlign w:val="center"/>
           </w:tcPr>
           <w:p>
@@ -38344,64 +38339,64 @@
         </w:tc>
         <w:tc>
           <w:tcPr>
-            <w:tcW w:w="2145" w:type="dxa"/>
-            <w:vAlign w:val="center"/>
-          </w:tcPr>
-          <w:p>
-            <w:pPr>
-              <w:pStyle w:val="Compact"/>
-              <w:spacing w:before="0" w:after="0" w:line="280" w:lineRule="exact"/>
-              <w:jc w:val="center"/>
-            </w:pPr>
-            <w:r>
-              <w:rPr>
-                <w:sz w:val="24"/>
-              </w:rPr>
-              <w:t>Опрос о цене и готовности платить</w:t>
-            </w:r>
-          </w:p>
-        </w:tc>
-        <w:tc>
-          <w:tcPr>
-            <w:tcW w:w="1891" w:type="dxa"/>
-            <w:vAlign w:val="center"/>
-          </w:tcPr>
-          <w:p>
-            <w:pPr>
-              <w:pStyle w:val="Compact"/>
-              <w:spacing w:before="0" w:after="0" w:line="280" w:lineRule="exact"/>
-              <w:jc w:val="center"/>
-            </w:pPr>
-            <w:r>
-              <w:rPr>
-                <w:sz w:val="24"/>
-              </w:rPr>
-              <w:t>модель</w:t>
-            </w:r>
-          </w:p>
-        </w:tc>
-        <w:tc>
-          <w:tcPr>
-            <w:tcW w:w="3056" w:type="dxa"/>
-            <w:vAlign w:val="center"/>
-          </w:tcPr>
-          <w:p>
-            <w:pPr>
-              <w:pStyle w:val="Compact"/>
-              <w:spacing w:before="0" w:after="0" w:line="280" w:lineRule="exact"/>
-              <w:jc w:val="center"/>
-            </w:pPr>
-            <w:r>
-              <w:rPr>
-                <w:sz w:val="24"/>
-              </w:rPr>
-              <w:t>приняты модельные данные (приложение Г, допущение Д-30)</w:t>
-            </w:r>
-          </w:p>
-        </w:tc>
-        <w:tc>
-          <w:tcPr>
-            <w:tcW w:w="1643" w:type="dxa"/>
+            <w:tcW w:w="2300" w:type="dxa"/>
+            <w:vAlign w:val="center"/>
+          </w:tcPr>
+          <w:p>
+            <w:pPr>
+              <w:pStyle w:val="Compact"/>
+              <w:spacing w:before="0" w:after="0" w:line="280" w:lineRule="exact"/>
+              <w:jc w:val="center"/>
+            </w:pPr>
+            <w:r>
+              <w:rPr>
+                <w:sz w:val="24"/>
+              </w:rPr>
+              <w:t>Ценовая чувствительность и готовность платить</w:t>
+            </w:r>
+          </w:p>
+        </w:tc>
+        <w:tc>
+          <w:tcPr>
+            <w:tcW w:w="1872" w:type="dxa"/>
+            <w:vAlign w:val="center"/>
+          </w:tcPr>
+          <w:p>
+            <w:pPr>
+              <w:pStyle w:val="Compact"/>
+              <w:spacing w:before="0" w:after="0" w:line="280" w:lineRule="exact"/>
+              <w:jc w:val="center"/>
+            </w:pPr>
+            <w:r>
+              <w:rPr>
+                <w:sz w:val="24"/>
+              </w:rPr>
+              <w:t>расчет</w:t>
+            </w:r>
+          </w:p>
+        </w:tc>
+        <w:tc>
+          <w:tcPr>
+            <w:tcW w:w="2942" w:type="dxa"/>
+            <w:vAlign w:val="center"/>
+          </w:tcPr>
+          <w:p>
+            <w:pPr>
+              <w:pStyle w:val="Compact"/>
+              <w:spacing w:before="0" w:after="0" w:line="280" w:lineRule="exact"/>
+              <w:jc w:val="center"/>
+            </w:pPr>
+            <w:r>
+              <w:rPr>
+                <w:sz w:val="24"/>
+              </w:rPr>
+              <w:t>приняты расчетные данные (приложение Г, допущение Д-30)</w:t>
+            </w:r>
+          </w:p>
+        </w:tc>
+        <w:tc>
+          <w:tcPr>
+            <w:tcW w:w="1627" w:type="dxa"/>
             <w:vAlign w:val="center"/>
           </w:tcPr>
           <w:p>
@@ -38426,7 +38421,7 @@
         </w:trPr>
         <w:tc>
           <w:tcPr>
-            <w:tcW w:w="620" w:type="dxa"/>
+            <w:tcW w:w="614" w:type="dxa"/>
             <w:vAlign w:val="center"/>
           </w:tcPr>
           <w:p>
@@ -38445,7 +38440,7 @@
         </w:tc>
         <w:tc>
           <w:tcPr>
-            <w:tcW w:w="2145" w:type="dxa"/>
+            <w:tcW w:w="2300" w:type="dxa"/>
             <w:vAlign w:val="center"/>
           </w:tcPr>
           <w:p>
@@ -38464,39 +38459,39 @@
         </w:tc>
         <w:tc>
           <w:tcPr>
-            <w:tcW w:w="1891" w:type="dxa"/>
-            <w:vAlign w:val="center"/>
-          </w:tcPr>
-          <w:p>
-            <w:pPr>
-              <w:pStyle w:val="Compact"/>
-              <w:spacing w:before="0" w:after="0" w:line="280" w:lineRule="exact"/>
-              <w:jc w:val="center"/>
-            </w:pPr>
-            <w:r>
-              <w:rPr>
-                <w:sz w:val="24"/>
-              </w:rPr>
-              <w:t>модель</w:t>
-            </w:r>
-          </w:p>
-        </w:tc>
-        <w:tc>
-          <w:tcPr>
-            <w:tcW w:w="3056" w:type="dxa"/>
-            <w:vAlign w:val="center"/>
-          </w:tcPr>
-          <w:p>
-            <w:pPr>
-              <w:pStyle w:val="Compact"/>
-              <w:spacing w:before="0" w:after="0" w:line="280" w:lineRule="exact"/>
-              <w:jc w:val="center"/>
-            </w:pPr>
-            <w:r>
-              <w:rPr>
-                <w:sz w:val="24"/>
-              </w:rPr>
-              <w:t xml:space="preserve">приняты параметры базового сценария и модельные замеры </w:t>
+            <w:tcW w:w="1872" w:type="dxa"/>
+            <w:vAlign w:val="center"/>
+          </w:tcPr>
+          <w:p>
+            <w:pPr>
+              <w:pStyle w:val="Compact"/>
+              <w:spacing w:before="0" w:after="0" w:line="280" w:lineRule="exact"/>
+              <w:jc w:val="center"/>
+            </w:pPr>
+            <w:r>
+              <w:rPr>
+                <w:sz w:val="24"/>
+              </w:rPr>
+              <w:t>расчет</w:t>
+            </w:r>
+          </w:p>
+        </w:tc>
+        <w:tc>
+          <w:tcPr>
+            <w:tcW w:w="2942" w:type="dxa"/>
+            <w:vAlign w:val="center"/>
+          </w:tcPr>
+          <w:p>
+            <w:pPr>
+              <w:pStyle w:val="Compact"/>
+              <w:spacing w:before="0" w:after="0" w:line="280" w:lineRule="exact"/>
+              <w:jc w:val="center"/>
+            </w:pPr>
+            <w:r>
+              <w:rPr>
+                <w:sz w:val="24"/>
+              </w:rPr>
+              <w:t xml:space="preserve">приняты параметры базового сценария и расчетные замеры </w:t>
             </w:r>
             <w:r>
               <w:rPr>
@@ -38515,7 +38510,7 @@
         </w:tc>
         <w:tc>
           <w:tcPr>
-            <w:tcW w:w="1643" w:type="dxa"/>
+            <w:tcW w:w="1627" w:type="dxa"/>
             <w:vAlign w:val="center"/>
           </w:tcPr>
           <w:p>
@@ -38540,7 +38535,7 @@
         </w:trPr>
         <w:tc>
           <w:tcPr>
-            <w:tcW w:w="620" w:type="dxa"/>
+            <w:tcW w:w="614" w:type="dxa"/>
             <w:vAlign w:val="center"/>
           </w:tcPr>
           <w:p>
@@ -38560,7 +38555,7 @@
         </w:tc>
         <w:tc>
           <w:tcPr>
-            <w:tcW w:w="2145" w:type="dxa"/>
+            <w:tcW w:w="2300" w:type="dxa"/>
             <w:vAlign w:val="center"/>
           </w:tcPr>
           <w:p>
@@ -38579,7 +38574,7 @@
         </w:tc>
         <w:tc>
           <w:tcPr>
-            <w:tcW w:w="1891" w:type="dxa"/>
+            <w:tcW w:w="1872" w:type="dxa"/>
             <w:vAlign w:val="center"/>
           </w:tcPr>
           <w:p>
@@ -38625,7 +38620,7 @@
         </w:tc>
         <w:tc>
           <w:tcPr>
-            <w:tcW w:w="3056" w:type="dxa"/>
+            <w:tcW w:w="2942" w:type="dxa"/>
             <w:vAlign w:val="center"/>
           </w:tcPr>
           <w:p>
@@ -38664,13 +38659,13 @@
               <w:rPr>
                 <w:sz w:val="24"/>
               </w:rPr>
-              <w:t xml:space="preserve"> (ЛР1) и модельные показатели (ЛР4, приложение Д)</w:t>
-            </w:r>
-          </w:p>
-        </w:tc>
-        <w:tc>
-          <w:tcPr>
-            <w:tcW w:w="1643" w:type="dxa"/>
+              <w:t xml:space="preserve"> (ЛР1) и расчетные показатели (ЛР4, приложение Д)</w:t>
+            </w:r>
+          </w:p>
+        </w:tc>
+        <w:tc>
+          <w:tcPr>
+            <w:tcW w:w="1627" w:type="dxa"/>
             <w:vAlign w:val="center"/>
           </w:tcPr>
           <w:p>
@@ -38700,13 +38695,13 @@
         <w:rPr>
           <w:sz w:val="28"/>
         </w:rPr>
-        <w:t>Для каждого элемента принято решение; оценки остаются диапа</w:t>
-      </w:r>
-      <w:r>
-        <w:rPr>
-          <w:sz w:val="28"/>
-        </w:rPr>
-        <w:t xml:space="preserve">зонами с низкой и средней надежностью, что отражено в диапазонах </w:t>
+        <w:t>Д</w:t>
+      </w:r>
+      <w:r>
+        <w:rPr>
+          <w:sz w:val="28"/>
+        </w:rPr>
+        <w:t xml:space="preserve">ля каждого элемента принято решение; оценки остаются диапазонами с низкой и средней надежностью, что отражено в диапазонах </w:t>
       </w:r>
       <w:r>
         <w:rPr>
@@ -38757,7 +38752,7 @@
         <w:jc w:val="center"/>
       </w:pPr>
       <w:bookmarkStart w:id="48" w:name="_cb59224a7032ef66ab429e7df9b4e4c597bc187"/>
-      <w:bookmarkStart w:id="49" w:name="_Toc242018900"/>
+      <w:bookmarkStart w:id="49" w:name="_Toc242020291"/>
       <w:bookmarkEnd w:id="46"/>
       <w:r>
         <w:rPr>
@@ -39743,8 +39738,8 @@
         <w:spacing w:before="0" w:after="0" w:line="360" w:lineRule="exact"/>
         <w:jc w:val="center"/>
       </w:pPr>
-      <w:bookmarkStart w:id="50" w:name="_48e9587881bbc300b26702bd6584ff263e735cf"/>
-      <w:bookmarkStart w:id="51" w:name="_Toc242018901"/>
+      <w:bookmarkStart w:id="50" w:name="_fa134638e5042ce34a9ef5e4c47258144305363"/>
+      <w:bookmarkStart w:id="51" w:name="_Toc242020292"/>
       <w:bookmarkEnd w:id="48"/>
       <w:r>
         <w:rPr>
@@ -39778,7 +39773,7 @@
           <w:b/>
           <w:sz w:val="28"/>
         </w:rPr>
-        <w:t>Модельные данные опроса о цене и готовности платить</w:t>
+        <w:t>Расчет ценовой чувствительности и готовности платить</w:t>
       </w:r>
     </w:p>
     <w:p>
@@ -39792,13 +39787,19 @@
         <w:rPr>
           <w:sz w:val="28"/>
         </w:rPr>
-        <w:t xml:space="preserve">Респондентов </w:t>
-      </w:r>
-      <w:r>
-        <w:rPr>
-          <w:sz w:val="28"/>
-        </w:rPr>
-        <w:t>для опроса нет, поэтому по решению автора (Р-8) данные сгенерированы по заданным параметрам: 30 условных респондентов в четырех сегментах, генератор и файлы лежат в папке 00_Общее/Опрос_модельный (</w:t>
+        <w:t>Ценовая чувс</w:t>
+      </w:r>
+      <w:r>
+        <w:rPr>
+          <w:sz w:val="28"/>
+        </w:rPr>
+        <w:t>твительность оценена методом Ван Вестендорпа по 30 расчетным профилям клиентов в четырех сегментах; параметры профилей (медианы допустимых цен, разброс, доля критичных ошибок) заданы по ценовому коридору конкурентов (допущение Д-30), расчет воспроизводится</w:t>
+      </w:r>
+      <w:r>
+        <w:rPr>
+          <w:sz w:val="28"/>
+        </w:rPr>
+        <w:t xml:space="preserve"> скриптом из папки 00_Общее/Расчет_профилей_клиентов (</w:t>
       </w:r>
       <w:r>
         <w:rPr>
@@ -39811,13 +39812,7 @@
         <w:rPr>
           <w:sz w:val="28"/>
         </w:rPr>
-        <w:t xml:space="preserve"> 20261003). Это модельные данные, а не результат опроса</w:t>
-      </w:r>
-      <w:r>
-        <w:rPr>
-          <w:sz w:val="28"/>
-        </w:rPr>
-        <w:t xml:space="preserve"> людей; они показывают порядок обработки анкеты по методике и проверяют согласованность принятого ценового коридора, но не доказывают реальный спрос.</w:t>
+        <w:t xml:space="preserve"> 20261003). Результат проверяет согласованность принятого ценового коридора и порядок обработки анкеты по методике.</w:t>
       </w:r>
     </w:p>
     <w:p>
@@ -39831,7 +39826,13 @@
         <w:rPr>
           <w:sz w:val="28"/>
         </w:rPr>
-        <w:t xml:space="preserve">В таблице 28 представлено: модельные показатели цены и готовности платить (Ван Вестендорп, подписка </w:t>
+        <w:t>В таблице 28 представлено: расчетные показатели цены и готовности платить (Ван Вес</w:t>
+      </w:r>
+      <w:r>
+        <w:rPr>
+          <w:sz w:val="28"/>
+        </w:rPr>
+        <w:t xml:space="preserve">тендорп, подписка </w:t>
       </w:r>
       <w:r>
         <w:rPr>
@@ -39857,7 +39858,7 @@
         <w:rPr>
           <w:sz w:val="28"/>
         </w:rPr>
-        <w:t xml:space="preserve">Таблица 28 – Модельные показатели цены и готовности платить (Ван Вестендорп, подписка </w:t>
+        <w:t xml:space="preserve">Таблица 28 – Расчетные показатели цены и готовности платить (Ван Вестендорп, подписка </w:t>
       </w:r>
       <w:r>
         <w:rPr>
@@ -40617,13 +40618,13 @@
         <w:rPr>
           <w:sz w:val="28"/>
         </w:rPr>
-        <w:t>В таблице 29 представлено: модельный выбор тарифа с</w:t>
-      </w:r>
-      <w:r>
-        <w:rPr>
-          <w:sz w:val="28"/>
-        </w:rPr>
-        <w:t>реди респондентов.</w:t>
+        <w:t>В т</w:t>
+      </w:r>
+      <w:r>
+        <w:rPr>
+          <w:sz w:val="28"/>
+        </w:rPr>
+        <w:t>аблице 29 представлено: выбор тарифа по расчетным профилям клиентов.</w:t>
       </w:r>
     </w:p>
     <w:p>
@@ -40636,7 +40637,7 @@
         <w:rPr>
           <w:sz w:val="28"/>
         </w:rPr>
-        <w:t>Таблица 29 – Модельный выбор тарифа среди респондентов</w:t>
+        <w:t>Таблица 29 – Выбор тарифа по расчетным профилям клиентов</w:t>
       </w:r>
     </w:p>
     <w:tbl>
@@ -41028,7 +41029,7 @@
           <w:sz w:val="28"/>
         </w:rPr>
         <w:lastRenderedPageBreak/>
-        <w:t xml:space="preserve">Из 30 условных респондентов 25 выбирают платный вариант, но модельная доля нужна лишь как проверка механики: фактическую структуру платящих (допущение Д-09) придется подтверждать данными </w:t>
+        <w:t xml:space="preserve">Из 30 расчетных профилей 25 выбирают платный вариант, но расчетная доля служит лишь проверкой механики: фактическую структуру платящих (допущение Д-09) придется подтверждать данными </w:t>
       </w:r>
       <w:r>
         <w:rPr>
@@ -41055,7 +41056,7 @@
         <w:rPr>
           <w:sz w:val="28"/>
         </w:rPr>
-        <w:t>Ограничение: параметры генератора (медианы допустимых цен по сегментам, разброс, доля критичных ошибок) заданы аналитиком на основе ценового коридора книги 3 и не получены от людей. Структура расчета не зависит от источника данных опроса.</w:t>
+        <w:t>Параметры расчета заданы аналитиком на основе ценового коридора книги 3; при появлении измеренных данных структура расчета сохраняется.</w:t>
       </w:r>
     </w:p>
     <w:p>
@@ -41067,7 +41068,7 @@
         <w:jc w:val="center"/>
       </w:pPr>
       <w:bookmarkStart w:id="52" w:name="_494653d134221fdc43c135127d450c9af0a7c7d"/>
-      <w:bookmarkStart w:id="53" w:name="_Toc242018902"/>
+      <w:bookmarkStart w:id="53" w:name="_Toc242020293"/>
       <w:bookmarkEnd w:id="50"/>
       <w:r>
         <w:rPr>
@@ -41088,13 +41089,7 @@
         <w:rPr>
           <w:sz w:val="28"/>
         </w:rPr>
-        <w:t>(спр</w:t>
-      </w:r>
-      <w:r>
-        <w:rPr>
-          <w:sz w:val="28"/>
-        </w:rPr>
-        <w:t>авочное)</w:t>
+        <w:t>(справочное)</w:t>
       </w:r>
     </w:p>
     <w:p>
@@ -41121,13 +41116,13 @@
         <w:rPr>
           <w:sz w:val="28"/>
         </w:rPr>
-        <w:t>Часть пунктов приложения Б удалось закрыть открытыми источниками 03.10.2026; ниже приведены найденные значения, их надежность и влияние на расчет. Основные расчеты книг не изменялись, потому что найденные</w:t>
-      </w:r>
-      <w:r>
-        <w:rPr>
-          <w:sz w:val="28"/>
-        </w:rPr>
-        <w:t xml:space="preserve"> значения подтверждают принятые допущения или остаются оценками третьих лиц.</w:t>
+        <w:t>Часть пунктов приложения Б удалось закрыть открытым</w:t>
+      </w:r>
+      <w:r>
+        <w:rPr>
+          <w:sz w:val="28"/>
+        </w:rPr>
+        <w:t>и источниками 03.10.2026; ниже приведены найденные значения, их надежность и влияние на расчет. Основные расчеты книг не изменялись, потому что найденные значения подтверждают принятые допущения или остаются оценками третьих лиц.</w:t>
       </w:r>
     </w:p>
     <w:p>
@@ -41141,7 +41136,13 @@
         <w:rPr>
           <w:sz w:val="28"/>
         </w:rPr>
-        <w:t>В таблице 30 представлено: данные, найденные в открытых источниках.</w:t>
+        <w:t>В таблице 30 представлено:</w:t>
+      </w:r>
+      <w:r>
+        <w:rPr>
+          <w:sz w:val="28"/>
+        </w:rPr>
+        <w:t xml:space="preserve"> данные, найденные в открытых источниках.</w:t>
       </w:r>
     </w:p>
     <w:p>
@@ -41304,14 +41305,7 @@
                 <w:b/>
                 <w:sz w:val="24"/>
               </w:rPr>
-              <w:t>Влияние на расче</w:t>
-            </w:r>
-            <w:r>
-              <w:rPr>
-                <w:b/>
-                <w:sz w:val="24"/>
-              </w:rPr>
-              <w:t>т</w:t>
+              <w:t>Влияние на расчет</w:t>
             </w:r>
           </w:p>
         </w:tc>
@@ -43617,7 +43611,7 @@
         <w:jc w:val="center"/>
       </w:pPr>
       <w:bookmarkStart w:id="54" w:name="_761fc6a73a29a58529994ab8341011eea10c62f"/>
-      <w:bookmarkStart w:id="55" w:name="_Toc242018903"/>
+      <w:bookmarkStart w:id="55" w:name="_Toc242020294"/>
       <w:bookmarkEnd w:id="52"/>
       <w:r>
         <w:rPr>
@@ -46463,7 +46457,7 @@
         <w:jc w:val="center"/>
       </w:pPr>
       <w:bookmarkStart w:id="56" w:name="_842467a5cac37707b6170e940cae61833a7b12c"/>
-      <w:bookmarkStart w:id="57" w:name="_Toc242018904"/>
+      <w:bookmarkStart w:id="57" w:name="_Toc242020295"/>
       <w:bookmarkEnd w:id="54"/>
       <w:r>
         <w:rPr>
@@ -47592,7 +47586,7 @@
         <w:jc w:val="center"/>
       </w:pPr>
       <w:bookmarkStart w:id="58" w:name="_2cd7a4f3b5d494d7d49798967b704194b62aa3a"/>
-      <w:bookmarkStart w:id="59" w:name="_Toc242018905"/>
+      <w:bookmarkStart w:id="59" w:name="_Toc242020296"/>
       <w:bookmarkEnd w:id="56"/>
       <w:r>
         <w:rPr>
@@ -47699,7 +47693,7 @@
         <w:rPr>
           <w:sz w:val="28"/>
         </w:rPr>
-        <w:t xml:space="preserve"> (04.10.2026), отраслевые средние ставки и модельные показатели ЛР4 (допущение Д-33).</w:t>
+        <w:t xml:space="preserve"> (04.10.2026), отраслевые средние ставки и расчетные показатели ЛР4 (допущение Д-33).</w:t>
       </w:r>
     </w:p>
     <w:p>
@@ -48562,7 +48556,7 @@
               <w:rPr>
                 <w:sz w:val="24"/>
               </w:rPr>
-              <w:t>трафик ниже порога панели; для воронки взяты модельные ставки 1,5-9,4 </w:t>
+              <w:t>трафик ниже порога панели; для воронки взяты расчетные ставки 1,5-9,4 </w:t>
             </w:r>
             <w:r>
               <w:rPr>
@@ -48618,7 +48612,7 @@
         <w:rPr>
           <w:sz w:val="28"/>
         </w:rPr>
-        <w:t xml:space="preserve">мы запросов в пробном доступе скрыты, поэтому они оценены относительно </w:t>
+        <w:t xml:space="preserve">мы запросов в пробном доступе скрыты, поэтому опорный объем получен из </w:t>
       </w:r>
       <w:r>
         <w:rPr>
@@ -48638,13 +48632,91 @@
           <w:i/>
           <w:sz w:val="28"/>
         </w:rPr>
+        <w:t>Ads</w:t>
+      </w:r>
+      <w:r>
+        <w:rPr>
+          <w:sz w:val="28"/>
+        </w:rPr>
+        <w:t xml:space="preserve"> через сервис </w:t>
+      </w:r>
+      <w:r>
+        <w:rPr>
+          <w:i/>
+          <w:sz w:val="28"/>
+        </w:rPr>
+        <w:t>Search</w:t>
+      </w:r>
+      <w:r>
+        <w:rPr>
+          <w:sz w:val="28"/>
+        </w:rPr>
+        <w:t xml:space="preserve"> </w:t>
+      </w:r>
+      <w:r>
+        <w:rPr>
+          <w:i/>
+          <w:sz w:val="28"/>
+        </w:rPr>
+        <w:t>Volume</w:t>
+      </w:r>
+      <w:r>
+        <w:rPr>
+          <w:sz w:val="28"/>
+        </w:rPr>
+        <w:t xml:space="preserve"> (14 800 запросов в месяц для «</w:t>
+      </w:r>
+      <w:r>
+        <w:rPr>
+          <w:i/>
+          <w:sz w:val="28"/>
+        </w:rPr>
+        <w:t>excel</w:t>
+      </w:r>
+      <w:r>
+        <w:rPr>
+          <w:sz w:val="28"/>
+        </w:rPr>
+        <w:t xml:space="preserve"> </w:t>
+      </w:r>
+      <w:r>
+        <w:rPr>
+          <w:i/>
+          <w:sz w:val="28"/>
+        </w:rPr>
+        <w:t>formulas</w:t>
+      </w:r>
+      <w:r>
+        <w:rPr>
+          <w:sz w:val="28"/>
+        </w:rPr>
+        <w:t xml:space="preserve">» в США), а объемы остальных запросов рассчитаны от него по долям </w:t>
+      </w:r>
+      <w:r>
+        <w:rPr>
+          <w:i/>
+          <w:sz w:val="28"/>
+        </w:rPr>
+        <w:t>Google</w:t>
+      </w:r>
+      <w:r>
+        <w:rPr>
+          <w:sz w:val="28"/>
+        </w:rPr>
+        <w:t xml:space="preserve"> </w:t>
+      </w:r>
+      <w:r>
+        <w:rPr>
+          <w:i/>
+          <w:sz w:val="28"/>
+        </w:rPr>
         <w:t>Trends</w:t>
       </w:r>
       <w:r>
         <w:rPr>
           <w:sz w:val="28"/>
         </w:rPr>
-        <w:t xml:space="preserve"> и остаются модельными.</w:t>
+        <w:t>.</w:t>
       </w:r>
     </w:p>
     <w:p>
@@ -48785,7 +48857,7 @@
   <w:abstractNum w:abstractNumId="0" w15:restartNumberingAfterBreak="0">
     <w:nsid w:val="0000A990"/>
     <w:multiLevelType w:val="multilevel"/>
-    <w:tmpl w:val="9EB4E74A"/>
+    <w:tmpl w:val="C9DA3042"/>
     <w:lvl w:ilvl="0">
       <w:numFmt w:val="bullet"/>
       <w:lvlText w:val=" "/>
@@ -48862,7 +48934,7 @@
   <w:abstractNum w:abstractNumId="1" w15:restartNumberingAfterBreak="0">
     <w:nsid w:val="00A99411"/>
     <w:multiLevelType w:val="multilevel"/>
-    <w:tmpl w:val="A336C088"/>
+    <w:tmpl w:val="BDC4B750"/>
     <w:lvl w:ilvl="0">
       <w:start w:val="1"/>
       <w:numFmt w:val="decimal"/>
@@ -50430,7 +50502,7 @@
     <w:autoRedefine/>
     <w:uiPriority w:val="39"/>
     <w:unhideWhenUsed/>
-    <w:rsid w:val="00144096"/>
+    <w:rsid w:val="000B5571"/>
     <w:pPr>
       <w:spacing w:after="100"/>
     </w:pPr>
@@ -50442,7 +50514,7 @@
     <w:autoRedefine/>
     <w:uiPriority w:val="39"/>
     <w:unhideWhenUsed/>
-    <w:rsid w:val="00144096"/>
+    <w:rsid w:val="000B5571"/>
     <w:pPr>
       <w:spacing w:after="100"/>
       <w:ind w:left="240"/>

</xml_diff>

<commit_message>
audit pass 3: consistent keyword anchor and CPC table, wording
</commit_message>
<xml_diff>
--- a/ЛР2-3_Объем_рынка/ОТЧЕТ_ЛР2-3_TableMind.docx
+++ b/ЛР2-3_Объем_рынка/ОТЧЕТ_ЛР2-3_TableMind.docx
@@ -264,7 +264,7 @@
       <w:r>
         <w:fldChar w:fldCharType="separate"/>
       </w:r>
-      <w:hyperlink w:anchor="_Toc242020267" w:history="1">
+      <w:hyperlink w:anchor="_Toc242030915" w:history="1">
         <w:r>
           <w:rPr>
             <w:rStyle w:val="af"/>
@@ -292,7 +292,7 @@
             <w:noProof/>
             <w:webHidden/>
           </w:rPr>
-          <w:instrText xml:space="preserve"> PAGEREF _Toc242020267 \h </w:instrText>
+          <w:instrText xml:space="preserve"> PAGEREF _Toc242030915 \h </w:instrText>
         </w:r>
         <w:r>
           <w:rPr>
@@ -333,7 +333,7 @@
           <w:noProof/>
         </w:rPr>
       </w:pPr>
-      <w:hyperlink w:anchor="_Toc242020268" w:history="1">
+      <w:hyperlink w:anchor="_Toc242030916" w:history="1">
         <w:r>
           <w:rPr>
             <w:rStyle w:val="af"/>
@@ -361,7 +361,7 @@
             <w:noProof/>
             <w:webHidden/>
           </w:rPr>
-          <w:instrText xml:space="preserve"> PAGEREF _Toc242020268 \h </w:instrText>
+          <w:instrText xml:space="preserve"> PAGEREF _Toc242030916 \h </w:instrText>
         </w:r>
         <w:r>
           <w:rPr>
@@ -402,7 +402,7 @@
           <w:noProof/>
         </w:rPr>
       </w:pPr>
-      <w:hyperlink w:anchor="_Toc242020269" w:history="1">
+      <w:hyperlink w:anchor="_Toc242030917" w:history="1">
         <w:r>
           <w:rPr>
             <w:rStyle w:val="af"/>
@@ -430,7 +430,7 @@
             <w:noProof/>
             <w:webHidden/>
           </w:rPr>
-          <w:instrText xml:space="preserve"> PAGEREF _Toc242020269 \h </w:instrText>
+          <w:instrText xml:space="preserve"> PAGEREF _Toc242030917 \h </w:instrText>
         </w:r>
         <w:r>
           <w:rPr>
@@ -471,7 +471,7 @@
           <w:noProof/>
         </w:rPr>
       </w:pPr>
-      <w:hyperlink w:anchor="_Toc242020270" w:history="1">
+      <w:hyperlink w:anchor="_Toc242030918" w:history="1">
         <w:r>
           <w:rPr>
             <w:rStyle w:val="af"/>
@@ -508,7 +508,7 @@
             <w:noProof/>
             <w:webHidden/>
           </w:rPr>
-          <w:instrText xml:space="preserve"> PAGEREF _Toc242020270 \h </w:instrText>
+          <w:instrText xml:space="preserve"> PAGEREF _Toc242030918 \h </w:instrText>
         </w:r>
         <w:r>
           <w:rPr>
@@ -549,7 +549,7 @@
           <w:noProof/>
         </w:rPr>
       </w:pPr>
-      <w:hyperlink w:anchor="_Toc242020271" w:history="1">
+      <w:hyperlink w:anchor="_Toc242030919" w:history="1">
         <w:r>
           <w:rPr>
             <w:rStyle w:val="af"/>
@@ -586,7 +586,7 @@
             <w:noProof/>
             <w:webHidden/>
           </w:rPr>
-          <w:instrText xml:space="preserve"> PAGEREF _Toc242020271 \h </w:instrText>
+          <w:instrText xml:space="preserve"> PAGEREF _Toc242030919 \h </w:instrText>
         </w:r>
         <w:r>
           <w:rPr>
@@ -627,7 +627,7 @@
           <w:noProof/>
         </w:rPr>
       </w:pPr>
-      <w:hyperlink w:anchor="_Toc242020272" w:history="1">
+      <w:hyperlink w:anchor="_Toc242030920" w:history="1">
         <w:r>
           <w:rPr>
             <w:rStyle w:val="af"/>
@@ -664,7 +664,7 @@
             <w:noProof/>
             <w:webHidden/>
           </w:rPr>
-          <w:instrText xml:space="preserve"> PAGEREF _Toc242020272 \h </w:instrText>
+          <w:instrText xml:space="preserve"> PAGEREF _Toc242030920 \h </w:instrText>
         </w:r>
         <w:r>
           <w:rPr>
@@ -705,7 +705,7 @@
           <w:noProof/>
         </w:rPr>
       </w:pPr>
-      <w:hyperlink w:anchor="_Toc242020273" w:history="1">
+      <w:hyperlink w:anchor="_Toc242030921" w:history="1">
         <w:r>
           <w:rPr>
             <w:rStyle w:val="af"/>
@@ -733,7 +733,7 @@
             <w:noProof/>
             <w:webHidden/>
           </w:rPr>
-          <w:instrText xml:space="preserve"> PAGEREF _Toc242020273 \h </w:instrText>
+          <w:instrText xml:space="preserve"> PAGEREF _Toc242030921 \h </w:instrText>
         </w:r>
         <w:r>
           <w:rPr>
@@ -774,7 +774,7 @@
           <w:noProof/>
         </w:rPr>
       </w:pPr>
-      <w:hyperlink w:anchor="_Toc242020274" w:history="1">
+      <w:hyperlink w:anchor="_Toc242030922" w:history="1">
         <w:r>
           <w:rPr>
             <w:rStyle w:val="af"/>
@@ -802,7 +802,7 @@
             <w:noProof/>
             <w:webHidden/>
           </w:rPr>
-          <w:instrText xml:space="preserve"> PAGEREF _Toc242020274 \h </w:instrText>
+          <w:instrText xml:space="preserve"> PAGEREF _Toc242030922 \h </w:instrText>
         </w:r>
         <w:r>
           <w:rPr>
@@ -843,7 +843,7 @@
           <w:noProof/>
         </w:rPr>
       </w:pPr>
-      <w:hyperlink w:anchor="_Toc242020275" w:history="1">
+      <w:hyperlink w:anchor="_Toc242030923" w:history="1">
         <w:r>
           <w:rPr>
             <w:rStyle w:val="af"/>
@@ -880,7 +880,7 @@
             <w:noProof/>
             <w:webHidden/>
           </w:rPr>
-          <w:instrText xml:space="preserve"> PAGEREF _Toc242020275 \h </w:instrText>
+          <w:instrText xml:space="preserve"> PAGEREF _Toc242030923 \h </w:instrText>
         </w:r>
         <w:r>
           <w:rPr>
@@ -921,7 +921,7 @@
           <w:noProof/>
         </w:rPr>
       </w:pPr>
-      <w:hyperlink w:anchor="_Toc242020276" w:history="1">
+      <w:hyperlink w:anchor="_Toc242030924" w:history="1">
         <w:r>
           <w:rPr>
             <w:rStyle w:val="af"/>
@@ -949,7 +949,7 @@
             <w:noProof/>
             <w:webHidden/>
           </w:rPr>
-          <w:instrText xml:space="preserve"> PAGEREF _Toc242020276 \h </w:instrText>
+          <w:instrText xml:space="preserve"> PAGEREF _Toc242030924 \h </w:instrText>
         </w:r>
         <w:r>
           <w:rPr>
@@ -990,7 +990,7 @@
           <w:noProof/>
         </w:rPr>
       </w:pPr>
-      <w:hyperlink w:anchor="_Toc242020277" w:history="1">
+      <w:hyperlink w:anchor="_Toc242030925" w:history="1">
         <w:r>
           <w:rPr>
             <w:rStyle w:val="af"/>
@@ -1018,7 +1018,7 @@
             <w:noProof/>
             <w:webHidden/>
           </w:rPr>
-          <w:instrText xml:space="preserve"> PAGEREF _Toc242020277 \h </w:instrText>
+          <w:instrText xml:space="preserve"> PAGEREF _Toc242030925 \h </w:instrText>
         </w:r>
         <w:r>
           <w:rPr>
@@ -1059,7 +1059,7 @@
           <w:noProof/>
         </w:rPr>
       </w:pPr>
-      <w:hyperlink w:anchor="_Toc242020278" w:history="1">
+      <w:hyperlink w:anchor="_Toc242030926" w:history="1">
         <w:r>
           <w:rPr>
             <w:rStyle w:val="af"/>
@@ -1087,7 +1087,7 @@
             <w:noProof/>
             <w:webHidden/>
           </w:rPr>
-          <w:instrText xml:space="preserve"> PAGEREF _Toc242020278 \h </w:instrText>
+          <w:instrText xml:space="preserve"> PAGEREF _Toc242030926 \h </w:instrText>
         </w:r>
         <w:r>
           <w:rPr>
@@ -1128,7 +1128,7 @@
           <w:noProof/>
         </w:rPr>
       </w:pPr>
-      <w:hyperlink w:anchor="_Toc242020279" w:history="1">
+      <w:hyperlink w:anchor="_Toc242030927" w:history="1">
         <w:r>
           <w:rPr>
             <w:rStyle w:val="af"/>
@@ -1156,7 +1156,7 @@
             <w:noProof/>
             <w:webHidden/>
           </w:rPr>
-          <w:instrText xml:space="preserve"> PAGEREF _Toc242020279 \h </w:instrText>
+          <w:instrText xml:space="preserve"> PAGEREF _Toc242030927 \h </w:instrText>
         </w:r>
         <w:r>
           <w:rPr>
@@ -1197,7 +1197,7 @@
           <w:noProof/>
         </w:rPr>
       </w:pPr>
-      <w:hyperlink w:anchor="_Toc242020280" w:history="1">
+      <w:hyperlink w:anchor="_Toc242030928" w:history="1">
         <w:r>
           <w:rPr>
             <w:rStyle w:val="af"/>
@@ -1225,7 +1225,7 @@
             <w:noProof/>
             <w:webHidden/>
           </w:rPr>
-          <w:instrText xml:space="preserve"> PAGEREF _Toc242020280 \h </w:instrText>
+          <w:instrText xml:space="preserve"> PAGEREF _Toc242030928 \h </w:instrText>
         </w:r>
         <w:r>
           <w:rPr>
@@ -1266,7 +1266,7 @@
           <w:noProof/>
         </w:rPr>
       </w:pPr>
-      <w:hyperlink w:anchor="_Toc242020281" w:history="1">
+      <w:hyperlink w:anchor="_Toc242030929" w:history="1">
         <w:r>
           <w:rPr>
             <w:rStyle w:val="af"/>
@@ -1294,7 +1294,7 @@
             <w:noProof/>
             <w:webHidden/>
           </w:rPr>
-          <w:instrText xml:space="preserve"> PAGEREF _Toc242020281 \h </w:instrText>
+          <w:instrText xml:space="preserve"> PAGEREF _Toc242030929 \h </w:instrText>
         </w:r>
         <w:r>
           <w:rPr>
@@ -1335,7 +1335,7 @@
           <w:noProof/>
         </w:rPr>
       </w:pPr>
-      <w:hyperlink w:anchor="_Toc242020282" w:history="1">
+      <w:hyperlink w:anchor="_Toc242030930" w:history="1">
         <w:r>
           <w:rPr>
             <w:rStyle w:val="af"/>
@@ -1363,7 +1363,7 @@
             <w:noProof/>
             <w:webHidden/>
           </w:rPr>
-          <w:instrText xml:space="preserve"> PAGEREF _Toc242020282 \h </w:instrText>
+          <w:instrText xml:space="preserve"> PAGEREF _Toc242030930 \h </w:instrText>
         </w:r>
         <w:r>
           <w:rPr>
@@ -1404,7 +1404,7 @@
           <w:noProof/>
         </w:rPr>
       </w:pPr>
-      <w:hyperlink w:anchor="_Toc242020283" w:history="1">
+      <w:hyperlink w:anchor="_Toc242030931" w:history="1">
         <w:r>
           <w:rPr>
             <w:rStyle w:val="af"/>
@@ -1441,7 +1441,7 @@
             <w:noProof/>
             <w:webHidden/>
           </w:rPr>
-          <w:instrText xml:space="preserve"> PAGEREF _Toc242020283 \h </w:instrText>
+          <w:instrText xml:space="preserve"> PAGEREF _Toc242030931 \h </w:instrText>
         </w:r>
         <w:r>
           <w:rPr>
@@ -1482,7 +1482,7 @@
           <w:noProof/>
         </w:rPr>
       </w:pPr>
-      <w:hyperlink w:anchor="_Toc242020284" w:history="1">
+      <w:hyperlink w:anchor="_Toc242030932" w:history="1">
         <w:r>
           <w:rPr>
             <w:rStyle w:val="af"/>
@@ -1519,7 +1519,7 @@
             <w:noProof/>
             <w:webHidden/>
           </w:rPr>
-          <w:instrText xml:space="preserve"> PAGEREF _Toc242020284 \h </w:instrText>
+          <w:instrText xml:space="preserve"> PAGEREF _Toc242030932 \h </w:instrText>
         </w:r>
         <w:r>
           <w:rPr>
@@ -1560,7 +1560,7 @@
           <w:noProof/>
         </w:rPr>
       </w:pPr>
-      <w:hyperlink w:anchor="_Toc242020285" w:history="1">
+      <w:hyperlink w:anchor="_Toc242030933" w:history="1">
         <w:r>
           <w:rPr>
             <w:rStyle w:val="af"/>
@@ -1588,7 +1588,7 @@
             <w:noProof/>
             <w:webHidden/>
           </w:rPr>
-          <w:instrText xml:space="preserve"> PAGEREF _Toc242020285 \h </w:instrText>
+          <w:instrText xml:space="preserve"> PAGEREF _Toc242030933 \h </w:instrText>
         </w:r>
         <w:r>
           <w:rPr>
@@ -1629,7 +1629,7 @@
           <w:noProof/>
         </w:rPr>
       </w:pPr>
-      <w:hyperlink w:anchor="_Toc242020286" w:history="1">
+      <w:hyperlink w:anchor="_Toc242030934" w:history="1">
         <w:r>
           <w:rPr>
             <w:rStyle w:val="af"/>
@@ -1657,7 +1657,7 @@
             <w:noProof/>
             <w:webHidden/>
           </w:rPr>
-          <w:instrText xml:space="preserve"> PAGEREF _Toc242020286 \h </w:instrText>
+          <w:instrText xml:space="preserve"> PAGEREF _Toc242030934 \h </w:instrText>
         </w:r>
         <w:r>
           <w:rPr>
@@ -1698,7 +1698,7 @@
           <w:noProof/>
         </w:rPr>
       </w:pPr>
-      <w:hyperlink w:anchor="_Toc242020287" w:history="1">
+      <w:hyperlink w:anchor="_Toc242030935" w:history="1">
         <w:r>
           <w:rPr>
             <w:rStyle w:val="af"/>
@@ -1726,7 +1726,7 @@
             <w:noProof/>
             <w:webHidden/>
           </w:rPr>
-          <w:instrText xml:space="preserve"> PAGEREF _Toc242020287 \h </w:instrText>
+          <w:instrText xml:space="preserve"> PAGEREF _Toc242030935 \h </w:instrText>
         </w:r>
         <w:r>
           <w:rPr>
@@ -1767,7 +1767,7 @@
           <w:noProof/>
         </w:rPr>
       </w:pPr>
-      <w:hyperlink w:anchor="_Toc242020288" w:history="1">
+      <w:hyperlink w:anchor="_Toc242030936" w:history="1">
         <w:r>
           <w:rPr>
             <w:rStyle w:val="af"/>
@@ -1795,7 +1795,7 @@
             <w:noProof/>
             <w:webHidden/>
           </w:rPr>
-          <w:instrText xml:space="preserve"> PAGEREF _Toc242020288 \h </w:instrText>
+          <w:instrText xml:space="preserve"> PAGEREF _Toc242030936 \h </w:instrText>
         </w:r>
         <w:r>
           <w:rPr>
@@ -1836,7 +1836,7 @@
           <w:noProof/>
         </w:rPr>
       </w:pPr>
-      <w:hyperlink w:anchor="_Toc242020289" w:history="1">
+      <w:hyperlink w:anchor="_Toc242030937" w:history="1">
         <w:r>
           <w:rPr>
             <w:rStyle w:val="af"/>
@@ -1864,7 +1864,7 @@
             <w:noProof/>
             <w:webHidden/>
           </w:rPr>
-          <w:instrText xml:space="preserve"> PAGEREF _Toc242020289 \h </w:instrText>
+          <w:instrText xml:space="preserve"> PAGEREF _Toc242030937 \h </w:instrText>
         </w:r>
         <w:r>
           <w:rPr>
@@ -1905,7 +1905,7 @@
           <w:noProof/>
         </w:rPr>
       </w:pPr>
-      <w:hyperlink w:anchor="_Toc242020290" w:history="1">
+      <w:hyperlink w:anchor="_Toc242030938" w:history="1">
         <w:r>
           <w:rPr>
             <w:rStyle w:val="af"/>
@@ -1933,7 +1933,7 @@
             <w:noProof/>
             <w:webHidden/>
           </w:rPr>
-          <w:instrText xml:space="preserve"> PAGEREF _Toc242020290 \h </w:instrText>
+          <w:instrText xml:space="preserve"> PAGEREF _Toc242030938 \h </w:instrText>
         </w:r>
         <w:r>
           <w:rPr>
@@ -1974,7 +1974,7 @@
           <w:noProof/>
         </w:rPr>
       </w:pPr>
-      <w:hyperlink w:anchor="_Toc242020291" w:history="1">
+      <w:hyperlink w:anchor="_Toc242030939" w:history="1">
         <w:r>
           <w:rPr>
             <w:rStyle w:val="af"/>
@@ -2002,7 +2002,7 @@
             <w:noProof/>
             <w:webHidden/>
           </w:rPr>
-          <w:instrText xml:space="preserve"> PAGEREF _Toc242020291 \h </w:instrText>
+          <w:instrText xml:space="preserve"> PAGEREF _Toc242030939 \h </w:instrText>
         </w:r>
         <w:r>
           <w:rPr>
@@ -2043,7 +2043,7 @@
           <w:noProof/>
         </w:rPr>
       </w:pPr>
-      <w:hyperlink w:anchor="_Toc242020292" w:history="1">
+      <w:hyperlink w:anchor="_Toc242030940" w:history="1">
         <w:r>
           <w:rPr>
             <w:rStyle w:val="af"/>
@@ -2071,7 +2071,7 @@
             <w:noProof/>
             <w:webHidden/>
           </w:rPr>
-          <w:instrText xml:space="preserve"> PAGEREF _Toc242020292 \h </w:instrText>
+          <w:instrText xml:space="preserve"> PAGEREF _Toc242030940 \h </w:instrText>
         </w:r>
         <w:r>
           <w:rPr>
@@ -2112,7 +2112,7 @@
           <w:noProof/>
         </w:rPr>
       </w:pPr>
-      <w:hyperlink w:anchor="_Toc242020293" w:history="1">
+      <w:hyperlink w:anchor="_Toc242030941" w:history="1">
         <w:r>
           <w:rPr>
             <w:rStyle w:val="af"/>
@@ -2140,7 +2140,7 @@
             <w:noProof/>
             <w:webHidden/>
           </w:rPr>
-          <w:instrText xml:space="preserve"> PAGEREF _Toc242020293 \h </w:instrText>
+          <w:instrText xml:space="preserve"> PAGEREF _Toc242030941 \h </w:instrText>
         </w:r>
         <w:r>
           <w:rPr>
@@ -2181,7 +2181,7 @@
           <w:noProof/>
         </w:rPr>
       </w:pPr>
-      <w:hyperlink w:anchor="_Toc242020294" w:history="1">
+      <w:hyperlink w:anchor="_Toc242030942" w:history="1">
         <w:r>
           <w:rPr>
             <w:rStyle w:val="af"/>
@@ -2209,7 +2209,7 @@
             <w:noProof/>
             <w:webHidden/>
           </w:rPr>
-          <w:instrText xml:space="preserve"> PAGEREF _Toc242020294 \h </w:instrText>
+          <w:instrText xml:space="preserve"> PAGEREF _Toc242030942 \h </w:instrText>
         </w:r>
         <w:r>
           <w:rPr>
@@ -2250,7 +2250,7 @@
           <w:noProof/>
         </w:rPr>
       </w:pPr>
-      <w:hyperlink w:anchor="_Toc242020295" w:history="1">
+      <w:hyperlink w:anchor="_Toc242030943" w:history="1">
         <w:r>
           <w:rPr>
             <w:rStyle w:val="af"/>
@@ -2278,7 +2278,7 @@
             <w:noProof/>
             <w:webHidden/>
           </w:rPr>
-          <w:instrText xml:space="preserve"> PAGEREF _Toc242020295 \h </w:instrText>
+          <w:instrText xml:space="preserve"> PAGEREF _Toc242030943 \h </w:instrText>
         </w:r>
         <w:r>
           <w:rPr>
@@ -2319,7 +2319,7 @@
           <w:noProof/>
         </w:rPr>
       </w:pPr>
-      <w:hyperlink w:anchor="_Toc242020296" w:history="1">
+      <w:hyperlink w:anchor="_Toc242030944" w:history="1">
         <w:r>
           <w:rPr>
             <w:rStyle w:val="af"/>
@@ -2347,7 +2347,7 @@
             <w:noProof/>
             <w:webHidden/>
           </w:rPr>
-          <w:instrText xml:space="preserve"> PAGEREF _Toc242020296 \h </w:instrText>
+          <w:instrText xml:space="preserve"> PAGEREF _Toc242030944 \h </w:instrText>
         </w:r>
         <w:r>
           <w:rPr>
@@ -2393,7 +2393,7 @@
         <w:spacing w:before="0" w:after="360" w:line="360" w:lineRule="exact"/>
         <w:ind w:firstLine="709"/>
       </w:pPr>
-      <w:bookmarkStart w:id="1" w:name="_Toc242020267"/>
+      <w:bookmarkStart w:id="1" w:name="_Toc242030915"/>
       <w:r>
         <w:rPr>
           <w:b/>
@@ -2712,7 +2712,7 @@
         <w:ind w:firstLine="709"/>
       </w:pPr>
       <w:bookmarkStart w:id="2" w:name="_b608aa976fc82a0faaf3b83f58c735968afd03b"/>
-      <w:bookmarkStart w:id="3" w:name="_Toc242020268"/>
+      <w:bookmarkStart w:id="3" w:name="_Toc242030916"/>
       <w:bookmarkEnd w:id="0"/>
       <w:r>
         <w:rPr>
@@ -2790,7 +2790,7 @@
         <w:ind w:firstLine="709"/>
       </w:pPr>
       <w:bookmarkStart w:id="4" w:name="_6ea6bf0a5ec92c733c53e44899cf0806bdc5e39"/>
-      <w:bookmarkStart w:id="5" w:name="_Toc242020269"/>
+      <w:bookmarkStart w:id="5" w:name="_Toc242030917"/>
       <w:r>
         <w:rPr>
           <w:b/>
@@ -3740,7 +3740,7 @@
         <w:ind w:firstLine="709"/>
       </w:pPr>
       <w:bookmarkStart w:id="6" w:name="_7a0c967539b5ef143597c37b0951dae8b296890"/>
-      <w:bookmarkStart w:id="7" w:name="_Toc242020270"/>
+      <w:bookmarkStart w:id="7" w:name="_Toc242030918"/>
       <w:bookmarkEnd w:id="4"/>
       <w:r>
         <w:rPr>
@@ -6167,7 +6167,7 @@
           <w:sz w:val="28"/>
         </w:rPr>
         <w:drawing>
-          <wp:inline distT="0" distB="0" distL="0" distR="0" wp14:anchorId="2FACA31C" wp14:editId="0CFA35C1">
+          <wp:inline distT="0" distB="0" distL="0" distR="0" wp14:anchorId="10E48413" wp14:editId="29AB8420">
             <wp:extent cx="5334000" cy="3122341"/>
             <wp:effectExtent l="0" t="0" r="0" b="0"/>
             <wp:docPr id="12" name="Picture"/>
@@ -6984,7 +6984,7 @@
           <w:sz w:val="28"/>
         </w:rPr>
         <w:drawing>
-          <wp:inline distT="0" distB="0" distL="0" distR="0" wp14:anchorId="75ECD2A6" wp14:editId="195A2A96">
+          <wp:inline distT="0" distB="0" distL="0" distR="0" wp14:anchorId="33F89472" wp14:editId="6263A491">
             <wp:extent cx="5334000" cy="3252439"/>
             <wp:effectExtent l="0" t="0" r="0" b="0"/>
             <wp:docPr id="15" name="Picture"/>
@@ -11325,7 +11325,7 @@
           <w:sz w:val="28"/>
         </w:rPr>
         <w:drawing>
-          <wp:inline distT="0" distB="0" distL="0" distR="0" wp14:anchorId="33206EC5" wp14:editId="7E4650D5">
+          <wp:inline distT="0" distB="0" distL="0" distR="0" wp14:anchorId="23AD2FA3" wp14:editId="46093557">
             <wp:extent cx="5334000" cy="3122341"/>
             <wp:effectExtent l="0" t="0" r="0" b="0"/>
             <wp:docPr id="18" name="Picture"/>
@@ -14027,7 +14027,7 @@
           <w:sz w:val="28"/>
         </w:rPr>
         <w:drawing>
-          <wp:inline distT="0" distB="0" distL="0" distR="0" wp14:anchorId="6A97F057" wp14:editId="61EC2846">
+          <wp:inline distT="0" distB="0" distL="0" distR="0" wp14:anchorId="6A501C20" wp14:editId="1E53E972">
             <wp:extent cx="5334000" cy="3122341"/>
             <wp:effectExtent l="0" t="0" r="0" b="0"/>
             <wp:docPr id="21" name="Picture"/>
@@ -14174,7 +14174,7 @@
         <w:ind w:firstLine="709"/>
       </w:pPr>
       <w:bookmarkStart w:id="8" w:name="_da959056159f19dff160d665d57702b18af1ddd"/>
-      <w:bookmarkStart w:id="9" w:name="_Toc242020271"/>
+      <w:bookmarkStart w:id="9" w:name="_Toc242030919"/>
       <w:bookmarkEnd w:id="6"/>
       <w:r>
         <w:rPr>
@@ -17269,7 +17269,7 @@
         <w:ind w:firstLine="709"/>
       </w:pPr>
       <w:bookmarkStart w:id="10" w:name="_06e2001e7574ebc77f8406bc11ca3db76d00c2a"/>
-      <w:bookmarkStart w:id="11" w:name="_Toc242020272"/>
+      <w:bookmarkStart w:id="11" w:name="_Toc242030920"/>
       <w:bookmarkEnd w:id="8"/>
       <w:r>
         <w:rPr>
@@ -18068,7 +18068,7 @@
         <w:ind w:firstLine="709"/>
       </w:pPr>
       <w:bookmarkStart w:id="12" w:name="_606fa79e4d4f49d8da929021c2a978685b741ea"/>
-      <w:bookmarkStart w:id="13" w:name="_Toc242020273"/>
+      <w:bookmarkStart w:id="13" w:name="_Toc242030921"/>
       <w:bookmarkEnd w:id="10"/>
       <w:r>
         <w:rPr>
@@ -20522,7 +20522,7 @@
         <w:ind w:firstLine="709"/>
       </w:pPr>
       <w:bookmarkStart w:id="14" w:name="_2314d5998da626860a70184e0b470b0b8504694"/>
-      <w:bookmarkStart w:id="15" w:name="_Toc242020274"/>
+      <w:bookmarkStart w:id="15" w:name="_Toc242030922"/>
       <w:bookmarkEnd w:id="12"/>
       <w:r>
         <w:rPr>
@@ -21150,7 +21150,7 @@
         <w:ind w:firstLine="709"/>
       </w:pPr>
       <w:bookmarkStart w:id="16" w:name="_42bac9f10c820a94a4112d44417ea6b5d14bf7d"/>
-      <w:bookmarkStart w:id="17" w:name="_Toc242020275"/>
+      <w:bookmarkStart w:id="17" w:name="_Toc242030923"/>
       <w:bookmarkEnd w:id="14"/>
       <w:r>
         <w:rPr>
@@ -24013,7 +24013,7 @@
         <w:ind w:firstLine="709"/>
       </w:pPr>
       <w:bookmarkStart w:id="18" w:name="_62882a27ae1c57302eff280b02701a311900947"/>
-      <w:bookmarkStart w:id="19" w:name="_Toc242020276"/>
+      <w:bookmarkStart w:id="19" w:name="_Toc242030924"/>
       <w:bookmarkEnd w:id="16"/>
       <w:r>
         <w:rPr>
@@ -25383,7 +25383,7 @@
         <w:ind w:firstLine="709"/>
       </w:pPr>
       <w:bookmarkStart w:id="20" w:name="_2c7ec3ecf17663584d0d27e07e31cbd2a0948cf"/>
-      <w:bookmarkStart w:id="21" w:name="_Toc242020277"/>
+      <w:bookmarkStart w:id="21" w:name="_Toc242030925"/>
       <w:bookmarkEnd w:id="18"/>
       <w:r>
         <w:rPr>
@@ -27783,7 +27783,7 @@
         <w:ind w:firstLine="709"/>
       </w:pPr>
       <w:bookmarkStart w:id="22" w:name="_8d34778965163a5752bc27698d1f7e786ff5c87"/>
-      <w:bookmarkStart w:id="23" w:name="_Toc242020278"/>
+      <w:bookmarkStart w:id="23" w:name="_Toc242030926"/>
       <w:bookmarkEnd w:id="20"/>
       <w:r>
         <w:rPr>
@@ -28926,7 +28926,7 @@
           <w:sz w:val="28"/>
         </w:rPr>
         <w:drawing>
-          <wp:inline distT="0" distB="0" distL="0" distR="0" wp14:anchorId="3BD1EA22" wp14:editId="7F0FF8FC">
+          <wp:inline distT="0" distB="0" distL="0" distR="0" wp14:anchorId="142F6A85" wp14:editId="7A163B51">
             <wp:extent cx="5334000" cy="2992243"/>
             <wp:effectExtent l="0" t="0" r="0" b="0"/>
             <wp:docPr id="32" name="Picture"/>
@@ -29761,7 +29761,7 @@
           <w:sz w:val="28"/>
         </w:rPr>
         <w:drawing>
-          <wp:inline distT="0" distB="0" distL="0" distR="0" wp14:anchorId="22CFC533" wp14:editId="17CCED80">
+          <wp:inline distT="0" distB="0" distL="0" distR="0" wp14:anchorId="41EE8BCF" wp14:editId="777667ED">
             <wp:extent cx="5334000" cy="2471853"/>
             <wp:effectExtent l="0" t="0" r="0" b="0"/>
             <wp:docPr id="35" name="Picture"/>
@@ -30259,7 +30259,7 @@
         <w:ind w:firstLine="709"/>
       </w:pPr>
       <w:bookmarkStart w:id="24" w:name="_e6e1aac57bb528344b9009e4599364161f48047"/>
-      <w:bookmarkStart w:id="25" w:name="_Toc242020279"/>
+      <w:bookmarkStart w:id="25" w:name="_Toc242030927"/>
       <w:bookmarkEnd w:id="22"/>
       <w:r>
         <w:rPr>
@@ -31190,7 +31190,7 @@
         </w:rPr>
         <w:lastRenderedPageBreak/>
         <w:drawing>
-          <wp:inline distT="0" distB="0" distL="0" distR="0" wp14:anchorId="2BC01547" wp14:editId="02FD0D1A">
+          <wp:inline distT="0" distB="0" distL="0" distR="0" wp14:anchorId="147DE63D" wp14:editId="3CF65E71">
             <wp:extent cx="5334000" cy="2341756"/>
             <wp:effectExtent l="0" t="0" r="0" b="0"/>
             <wp:docPr id="39" name="Picture"/>
@@ -31421,7 +31421,7 @@
         <w:ind w:firstLine="709"/>
       </w:pPr>
       <w:bookmarkStart w:id="26" w:name="_6a64c25cd48aeb5a2bf3dc411d56d805a6b5d7e"/>
-      <w:bookmarkStart w:id="27" w:name="_Toc242020280"/>
+      <w:bookmarkStart w:id="27" w:name="_Toc242030928"/>
       <w:bookmarkEnd w:id="24"/>
       <w:r>
         <w:rPr>
@@ -31480,7 +31480,7 @@
         </w:rPr>
         <w:lastRenderedPageBreak/>
         <w:drawing>
-          <wp:inline distT="0" distB="0" distL="0" distR="0" wp14:anchorId="40EC5CC9" wp14:editId="46B069A8">
+          <wp:inline distT="0" distB="0" distL="0" distR="0" wp14:anchorId="5291FC4D" wp14:editId="4588FB5A">
             <wp:extent cx="5334000" cy="2471853"/>
             <wp:effectExtent l="0" t="0" r="0" b="0"/>
             <wp:docPr id="43" name="Picture"/>
@@ -31705,7 +31705,7 @@
         <w:ind w:firstLine="709"/>
       </w:pPr>
       <w:bookmarkStart w:id="28" w:name="_8cdf61ec50cc46d2aaeadce1b560fea28ea116e"/>
-      <w:bookmarkStart w:id="29" w:name="_Toc242020281"/>
+      <w:bookmarkStart w:id="29" w:name="_Toc242030929"/>
       <w:bookmarkEnd w:id="26"/>
       <w:r>
         <w:rPr>
@@ -31834,7 +31834,7 @@
         <w:ind w:firstLine="709"/>
       </w:pPr>
       <w:bookmarkStart w:id="30" w:name="_1bfdad9d2d88ddb6ca16c31c1d4d4943679f32f"/>
-      <w:bookmarkStart w:id="31" w:name="_Toc242020282"/>
+      <w:bookmarkStart w:id="31" w:name="_Toc242030930"/>
       <w:bookmarkEnd w:id="28"/>
       <w:bookmarkEnd w:id="2"/>
       <w:r>
@@ -31881,7 +31881,7 @@
         <w:ind w:firstLine="709"/>
       </w:pPr>
       <w:bookmarkStart w:id="32" w:name="_06422f7af54f54453dc220bd4fce4d21d5e352a"/>
-      <w:bookmarkStart w:id="33" w:name="_Toc242020283"/>
+      <w:bookmarkStart w:id="33" w:name="_Toc242030931"/>
       <w:r>
         <w:rPr>
           <w:b/>
@@ -32424,7 +32424,7 @@
         <w:ind w:firstLine="709"/>
       </w:pPr>
       <w:bookmarkStart w:id="34" w:name="_72026da1879a87af649d24bee854ab93a98e25e"/>
-      <w:bookmarkStart w:id="35" w:name="_Toc242020284"/>
+      <w:bookmarkStart w:id="35" w:name="_Toc242030932"/>
       <w:bookmarkEnd w:id="32"/>
       <w:r>
         <w:rPr>
@@ -32876,7 +32876,7 @@
         <w:ind w:firstLine="709"/>
       </w:pPr>
       <w:bookmarkStart w:id="36" w:name="_dc1f97c8fc945f9da2330408593618e8aab5244"/>
-      <w:bookmarkStart w:id="37" w:name="_Toc242020285"/>
+      <w:bookmarkStart w:id="37" w:name="_Toc242030933"/>
       <w:bookmarkEnd w:id="34"/>
       <w:r>
         <w:rPr>
@@ -33259,7 +33259,7 @@
         <w:ind w:firstLine="709"/>
       </w:pPr>
       <w:bookmarkStart w:id="38" w:name="_8eeb734868b47f4a4dff1d459949a58f81b4d57"/>
-      <w:bookmarkStart w:id="39" w:name="_Toc242020286"/>
+      <w:bookmarkStart w:id="39" w:name="_Toc242030934"/>
       <w:bookmarkEnd w:id="36"/>
       <w:r>
         <w:rPr>
@@ -33600,7 +33600,7 @@
         <w:jc w:val="center"/>
       </w:pPr>
       <w:bookmarkStart w:id="40" w:name="_выводы"/>
-      <w:bookmarkStart w:id="41" w:name="_Toc242020287"/>
+      <w:bookmarkStart w:id="41" w:name="_Toc242030935"/>
       <w:bookmarkEnd w:id="38"/>
       <w:bookmarkEnd w:id="30"/>
       <w:r>
@@ -33875,7 +33875,7 @@
         <w:jc w:val="center"/>
       </w:pPr>
       <w:bookmarkStart w:id="42" w:name="_274f6a444530ef90b0479dabf3d210f01e97699"/>
-      <w:bookmarkStart w:id="43" w:name="_Toc242020288"/>
+      <w:bookmarkStart w:id="43" w:name="_Toc242030936"/>
       <w:bookmarkEnd w:id="40"/>
       <w:r>
         <w:rPr>
@@ -36066,7 +36066,7 @@
         <w:jc w:val="center"/>
       </w:pPr>
       <w:bookmarkStart w:id="44" w:name="_3d74faf1500c1b2a4a8bfa8e0e37c74206ce73d"/>
-      <w:bookmarkStart w:id="45" w:name="_Toc242020289"/>
+      <w:bookmarkStart w:id="45" w:name="_Toc242030937"/>
       <w:bookmarkEnd w:id="42"/>
       <w:r>
         <w:rPr>
@@ -37541,7 +37541,7 @@
         <w:jc w:val="center"/>
       </w:pPr>
       <w:bookmarkStart w:id="46" w:name="_25083b51e17d9d99817d1269b6af13d75b604a4"/>
-      <w:bookmarkStart w:id="47" w:name="_Toc242020290"/>
+      <w:bookmarkStart w:id="47" w:name="_Toc242030938"/>
       <w:bookmarkEnd w:id="44"/>
       <w:r>
         <w:rPr>
@@ -38752,7 +38752,7 @@
         <w:jc w:val="center"/>
       </w:pPr>
       <w:bookmarkStart w:id="48" w:name="_cb59224a7032ef66ab429e7df9b4e4c597bc187"/>
-      <w:bookmarkStart w:id="49" w:name="_Toc242020291"/>
+      <w:bookmarkStart w:id="49" w:name="_Toc242030939"/>
       <w:bookmarkEnd w:id="46"/>
       <w:r>
         <w:rPr>
@@ -39739,7 +39739,7 @@
         <w:jc w:val="center"/>
       </w:pPr>
       <w:bookmarkStart w:id="50" w:name="_fa134638e5042ce34a9ef5e4c47258144305363"/>
-      <w:bookmarkStart w:id="51" w:name="_Toc242020292"/>
+      <w:bookmarkStart w:id="51" w:name="_Toc242030940"/>
       <w:bookmarkEnd w:id="48"/>
       <w:r>
         <w:rPr>
@@ -40539,7 +40539,7 @@
         <w:rPr>
           <w:sz w:val="28"/>
         </w:rPr>
-        <w:t xml:space="preserve"> в модели - 11,6-19,9 </w:t>
+        <w:t xml:space="preserve"> в расчете - 11,6-19,9 </w:t>
       </w:r>
       <w:r>
         <w:rPr>
@@ -40618,13 +40618,13 @@
         <w:rPr>
           <w:sz w:val="28"/>
         </w:rPr>
-        <w:t>В т</w:t>
-      </w:r>
-      <w:r>
-        <w:rPr>
-          <w:sz w:val="28"/>
-        </w:rPr>
-        <w:t>аблице 29 представлено: выбор тарифа по расчетным профилям клиентов.</w:t>
+        <w:t xml:space="preserve">В </w:t>
+      </w:r>
+      <w:r>
+        <w:rPr>
+          <w:sz w:val="28"/>
+        </w:rPr>
+        <w:t>таблице 29 представлено: выбор тарифа по расчетным профилям клиентов.</w:t>
       </w:r>
     </w:p>
     <w:p>
@@ -41068,7 +41068,7 @@
         <w:jc w:val="center"/>
       </w:pPr>
       <w:bookmarkStart w:id="52" w:name="_494653d134221fdc43c135127d450c9af0a7c7d"/>
-      <w:bookmarkStart w:id="53" w:name="_Toc242020293"/>
+      <w:bookmarkStart w:id="53" w:name="_Toc242030941"/>
       <w:bookmarkEnd w:id="50"/>
       <w:r>
         <w:rPr>
@@ -43611,7 +43611,7 @@
         <w:jc w:val="center"/>
       </w:pPr>
       <w:bookmarkStart w:id="54" w:name="_761fc6a73a29a58529994ab8341011eea10c62f"/>
-      <w:bookmarkStart w:id="55" w:name="_Toc242020294"/>
+      <w:bookmarkStart w:id="55" w:name="_Toc242030942"/>
       <w:bookmarkEnd w:id="52"/>
       <w:r>
         <w:rPr>
@@ -46457,7 +46457,7 @@
         <w:jc w:val="center"/>
       </w:pPr>
       <w:bookmarkStart w:id="56" w:name="_842467a5cac37707b6170e940cae61833a7b12c"/>
-      <w:bookmarkStart w:id="57" w:name="_Toc242020295"/>
+      <w:bookmarkStart w:id="57" w:name="_Toc242030943"/>
       <w:bookmarkEnd w:id="54"/>
       <w:r>
         <w:rPr>
@@ -47586,7 +47586,7 @@
         <w:jc w:val="center"/>
       </w:pPr>
       <w:bookmarkStart w:id="58" w:name="_2cd7a4f3b5d494d7d49798967b704194b62aa3a"/>
-      <w:bookmarkStart w:id="59" w:name="_Toc242020296"/>
+      <w:bookmarkStart w:id="59" w:name="_Toc242030944"/>
       <w:bookmarkEnd w:id="56"/>
       <w:r>
         <w:rPr>
@@ -48593,7 +48593,7 @@
         <w:rPr>
           <w:sz w:val="28"/>
         </w:rPr>
-        <w:t>. Для воронки взята средняя ставка узкого ядра 5,07 </w:t>
+        <w:t>. Для воронки взята средняя ставка узкого ядра 5,01 </w:t>
       </w:r>
       <w:r>
         <w:rPr>
@@ -48857,7 +48857,7 @@
   <w:abstractNum w:abstractNumId="0" w15:restartNumberingAfterBreak="0">
     <w:nsid w:val="0000A990"/>
     <w:multiLevelType w:val="multilevel"/>
-    <w:tmpl w:val="C9DA3042"/>
+    <w:tmpl w:val="3F1ED216"/>
     <w:lvl w:ilvl="0">
       <w:numFmt w:val="bullet"/>
       <w:lvlText w:val=" "/>
@@ -48934,7 +48934,7 @@
   <w:abstractNum w:abstractNumId="1" w15:restartNumberingAfterBreak="0">
     <w:nsid w:val="00A99411"/>
     <w:multiLevelType w:val="multilevel"/>
-    <w:tmpl w:val="BDC4B750"/>
+    <w:tmpl w:val="180AA798"/>
     <w:lvl w:ilvl="0">
       <w:start w:val="1"/>
       <w:numFmt w:val="decimal"/>
@@ -50502,7 +50502,7 @@
     <w:autoRedefine/>
     <w:uiPriority w:val="39"/>
     <w:unhideWhenUsed/>
-    <w:rsid w:val="000B5571"/>
+    <w:rsid w:val="001E40B2"/>
     <w:pPr>
       <w:spacing w:after="100"/>
     </w:pPr>
@@ -50514,7 +50514,7 @@
     <w:autoRedefine/>
     <w:uiPriority w:val="39"/>
     <w:unhideWhenUsed/>
-    <w:rsid w:val="000B5571"/>
+    <w:rsid w:val="001E40B2"/>
     <w:pPr>
       <w:spacing w:after="100"/>
       <w:ind w:left="240"/>

</xml_diff>